<commit_message>
design plan overhaul, changes in investigation doc, trying to grasp a better idea of what forms and why. ended up removing some existing forms for a restart
</commit_message>
<xml_diff>
--- a/Investigation.docx
+++ b/Investigation.docx
@@ -7,6 +7,7 @@
         <w:pStyle w:val="Title"/>
         <w:rPr>
           <w:b/>
+          <w:bCs/>
           <w:sz w:val="72"/>
           <w:szCs w:val="72"/>
         </w:rPr>
@@ -21,7 +22,6 @@
         <w:t>Filmtopia Project Investigation</w:t>
       </w:r>
     </w:p>
-    <w:p/>
     <w:p>
       <w:pPr>
         <w:jc w:val="center"/>
@@ -81,10 +81,150 @@
       </w:r>
     </w:p>
     <w:p>
-      <w:r>
-        <w:t xml:space="preserve"> </w:t>
-      </w:r>
-    </w:p>
+      <w:pPr>
+        <w:jc w:val="center"/>
+        <w:rPr>
+          <w:b/>
+          <w:bCs/>
+          <w:sz w:val="36"/>
+          <w:szCs w:val="36"/>
+        </w:rPr>
+      </w:pPr>
+      <w:r>
+        <w:rPr>
+          <w:b/>
+          <w:bCs/>
+          <w:sz w:val="36"/>
+          <w:szCs w:val="36"/>
+        </w:rPr>
+        <w:t>Stakeholder Analysis</w:t>
+      </w:r>
+    </w:p>
+    <w:p>
+      <w:r>
+        <w:t>Before any meaningful investigation can take place it is important to identify all of the stakeholders involved with the existing Filmtopia system and the proposed new solution. A stakeholder is any individual, group or organisation that has an interest in the system, will be affected by changes to it or has the power to influence how the system is developed and used. Identifying stakeholders early in the investigation process helps to ensure that the requirements gathered from interviews, questionnaires and observation cover every perspective rather than focusing on a single group. It also helps to highlight competing or conflicting requirements at an early stage, which can then be balanced or prioritised during the design phase.</w:t>
+      </w:r>
+    </w:p>
+    <w:p>
+      <w:r>
+        <w:t>The stakeholders for the Filmtopia system have been categorised into primary, secondary and tertiary groups. Primary stakeholders are those who will use the system directly on a daily basis. Secondary stakeholders are those who interact with the system indirectly or whose work is affected by the system without them necessarily using it. Tertiary stakeholders are external parties who do not interact with the system directly but whose interests are nonetheless relevant to its design and operation.</w:t>
+      </w:r>
+    </w:p>
+    <w:p>
+      <w:r>
+        <w:rPr>
+          <w:b/>
+          <w:bCs/>
+        </w:rPr>
+        <w:t>Primary Stakeholders</w:t>
+      </w:r>
+    </w:p>
+    <w:p>
+      <w:r>
+        <w:t xml:space="preserve">The first primary stakeholder is the cinema manager, </w:t>
+      </w:r>
+      <w:r>
+        <w:rPr>
+          <w:b/>
+          <w:bCs/>
+        </w:rPr>
+        <w:t>Sarah Henshaw</w:t>
+      </w:r>
+      <w:r>
+        <w:t>. As the person who commissioned this project Sarah has the highest level of influence over the requirements of the system. She will be the main user of the management functions including adding films, scheduling screenings, viewing sales reports and managing access for other users. Sarah's primary interests are in operational efficiency, accurate reporting, reduced customer complaints and the long term reliability of the system. She has indicated in her interview that ease of use is critical because the cinema operates with a small team and cannot afford lengthy training sessions for new staff. Her level of technical confidence is moderate, meaning the system must be intuitive enough that she can use it without specialist knowledge.</w:t>
+      </w:r>
+    </w:p>
+    <w:p>
+      <w:r>
+        <w:t xml:space="preserve">The second primary stakeholder is the box office staff. This group includes </w:t>
+      </w:r>
+      <w:r>
+        <w:rPr>
+          <w:b/>
+          <w:bCs/>
+        </w:rPr>
+        <w:t>Jake Pemberton</w:t>
+      </w:r>
+      <w:r>
+        <w:t xml:space="preserve"> and other members of the team who handle ticket sales and customer enquiries on a day to day basis. Their interests focus on speed of operation during busy periods, clarity of the user interface, accuracy of seat allocation and the elimination of awkward situations caused by double bookings. Staff members have varying levels of </w:t>
+      </w:r>
+      <w:r>
+        <w:lastRenderedPageBreak/>
+        <w:t>technical confidence and the system must therefore cater to the lowest common denominator in terms of usability. The booking interface must be designed so that even a brand new member of staff can complete a transaction quickly with minimal training.</w:t>
+      </w:r>
+    </w:p>
+    <w:p>
+      <w:r>
+        <w:t>The third primary stakeholder is the customer base of Filmtopia. Customers interact with the system either directly through the proposed self service kiosk or indirectly when staff use the system to process their bookings. Customer interests centre on convenience, transparency, accurate seat allocation, short queue times and the ability to combine ticket and food purchases into a single transaction. The questionnaire results discussed later in this investigation confirm that 85% of customers would prefer self service ticketing, 85% find specific seat selection important and 80% would value combined food and ticket ordering. These figures indicate that customer expectations are aligned with the proposed solution but also raise the bar for how polished and reliable the kiosk interface needs to be.</w:t>
+      </w:r>
+    </w:p>
+    <w:p>
+      <w:r>
+        <w:rPr>
+          <w:b/>
+          <w:bCs/>
+        </w:rPr>
+        <w:t>Secondary Stakeholders</w:t>
+      </w:r>
+    </w:p>
+    <w:p>
+      <w:r>
+        <w:t>The first secondary stakeholder is the concessions team. While the concessions staff do not currently use the existing booking system, the proposed Filmtopia system will integrate food and drink orders with ticket bookings. This means orders placed through the kiosk or by box office staff will need to be visible to the concessions team in some way. Their interest is in receiving accurate, legible orders in a timely manner so that they can prepare food correctly and deliver it to the right customer or seat. The current handwritten note system has been criticised by Jake Pemberton as disjointed and prone to error.</w:t>
+      </w:r>
+    </w:p>
+    <w:p>
+      <w:r>
+        <w:t>The second secondary stakeholder is the cleaning and maintenance team. Although they will not use the booking system directly, their schedules are influenced by the cinema's screening times and customer footfall. Accurate sales reports and screening schedules generated by the new system could in future inform their work patterns more efficiently. Their interest in this project is therefore indirect but real.</w:t>
+      </w:r>
+    </w:p>
+    <w:p>
+      <w:r>
+        <w:t>The third secondary stakeholder is the IT support function for the cinema. Filmtopia is a small business and currently has no dedicated IT staff, with technical issues handled by Sarah herself or by an external contractor on an ad hoc basis. The proposed system must therefore be designed in a way that is robust, well documented and easy to maintain without specialist intervention. Backup procedures, error handling and data integrity safeguards must all be considered with this stakeholder in mind.</w:t>
+      </w:r>
+    </w:p>
+    <w:p>
+      <w:r>
+        <w:rPr>
+          <w:b/>
+          <w:bCs/>
+        </w:rPr>
+        <w:t>Tertiary Stakeholders</w:t>
+      </w:r>
+    </w:p>
+    <w:p>
+      <w:r>
+        <w:t>The first tertiary stakeholder is the group of film distributors who supply Filmtopia with the rights to screen particular films. Although distributors do not interact with the cinema management system directly, they are relevant because the system will store information about which films are being shown, on what dates and at what prices. This data may in future be used to fulfil reporting obligations to distributors regarding ticket sales for their films. The system therefore needs to be capable of producing accurate, exportable reports.</w:t>
+      </w:r>
+    </w:p>
+    <w:p>
+      <w:r>
+        <w:t xml:space="preserve">The second tertiary stakeholder is HMRC and other regulatory bodies. As Filmtopia is a registered UK business it is required to keep accurate financial records for tax purposes. The new system, by virtue of recording every booking and food order with a timestamp and price, will form part of that financial record. This places a quiet but important </w:t>
+      </w:r>
+      <w:r>
+        <w:lastRenderedPageBreak/>
+        <w:t>constraint on the system, namely that historical records must not be deletable or alterable after the fact in a way that would compromise audit trails.</w:t>
+      </w:r>
+    </w:p>
+    <w:p>
+      <w:r>
+        <w:t>The third tertiary stakeholder is competing cinemas in the local area, particularly Vue and Odeon at the Trafford Centre. While these cinemas have no direct involvement with Filmtopia, their existing booking systems set customer expectations for what a cinema booking experience should look like. The desk based research conducted later in this investigation directly compares Filmtopia's proposed system against these competitors to ensure the new system meets or exceeds modern industry standards.</w:t>
+      </w:r>
+    </w:p>
+    <w:p>
+      <w:r>
+        <w:rPr>
+          <w:b/>
+          <w:bCs/>
+        </w:rPr>
+        <w:t>Conclusion of Stakeholder Analysis</w:t>
+      </w:r>
+    </w:p>
+    <w:p>
+      <w:r>
+        <w:t>The stakeholder analysis above demonstrates that the Filmtopia system is not simply a tool for the cinema manager but a piece of infrastructure that touches a wide range of internal and external parties. The investigation that follows has been designed with this in mind, drawing primary insights from interviews with the manager and a staff member, supplemented by a customer questionnaire, direct observation and desk based research into competing systems. By approaching the investigation in this layered way the resulting requirements specification reflects the realities of how Filmtopia actually operates rather than just the wishes of any single individual</w:t>
+      </w:r>
+    </w:p>
+    <w:p/>
     <w:p>
       <w:pPr>
         <w:tabs>
@@ -115,10 +255,10 @@
         <w:tblLook w:val="04A0" w:firstRow="1" w:lastRow="0" w:firstColumn="1" w:lastColumn="0" w:noHBand="0" w:noVBand="1"/>
       </w:tblPr>
       <w:tblGrid>
-        <w:gridCol w:w="3487"/>
-        <w:gridCol w:w="3487"/>
-        <w:gridCol w:w="3487"/>
-        <w:gridCol w:w="3487"/>
+        <w:gridCol w:w="2371"/>
+        <w:gridCol w:w="2011"/>
+        <w:gridCol w:w="2317"/>
+        <w:gridCol w:w="2317"/>
       </w:tblGrid>
       <w:tr>
         <w:tc>
@@ -271,7 +411,6 @@
                 <w:b/>
                 <w:bCs/>
               </w:rPr>
-              <w:lastRenderedPageBreak/>
               <w:t xml:space="preserve">Interview with cinema manager (Sarah Henshaw) </w:t>
             </w:r>
           </w:p>
@@ -510,7 +649,11 @@
           </w:tcPr>
           <w:p>
             <w:r>
-              <w:t xml:space="preserve"> Observe box office operations during a live evening screening</w:t>
+              <w:t xml:space="preserve"> Observe box office operations during a </w:t>
+            </w:r>
+            <w:r>
+              <w:lastRenderedPageBreak/>
+              <w:t>live evening screening</w:t>
             </w:r>
           </w:p>
         </w:tc>
@@ -532,6 +675,7 @@
                 <w:b/>
                 <w:bCs/>
               </w:rPr>
+              <w:lastRenderedPageBreak/>
               <w:t xml:space="preserve">Desk based research — Vue Cinema (myvue.com) </w:t>
             </w:r>
           </w:p>
@@ -792,7 +936,6 @@
                 <w:b/>
                 <w:bCs/>
               </w:rPr>
-              <w:lastRenderedPageBreak/>
               <w:t xml:space="preserve">Limitations of proposed solution </w:t>
             </w:r>
           </w:p>
@@ -1020,7 +1163,6 @@
     </w:p>
     <w:p>
       <w:r>
-        <w:lastRenderedPageBreak/>
         <w:t>A: Mainly the box office staff and myself. The staff need something simple that they can use quickly during busy periods. They cannot be spending five minutes trying to figure out how to add a booking. I would need a separate manager view where I can see reports and make changes to the system that staff should not be able to access.</w:t>
       </w:r>
     </w:p>
@@ -1105,31 +1247,31 @@
           <w:b/>
           <w:bCs/>
         </w:rPr>
+        <w:t>Q: What problems do you regularly run into with the current system?</w:t>
+      </w:r>
+    </w:p>
+    <w:p>
+      <w:pPr>
+        <w:tabs>
+          <w:tab w:val="num" w:pos="1440"/>
+        </w:tabs>
+      </w:pPr>
+      <w:r>
+        <w:t>A: The biggest one is not knowing if a seat is already taken. Sometimes a customer picks a specific seat and we say yes, then another member of staff has already given that seat to someone else and we do not know until they both turn up. It causes a lot of awkward situations. Also finding information takes too long. If someone asks what time a film starts or how many seats are left I have to physically look through the diary.</w:t>
+      </w:r>
+    </w:p>
+    <w:p>
+      <w:pPr>
+        <w:tabs>
+          <w:tab w:val="num" w:pos="1440"/>
+        </w:tabs>
+      </w:pPr>
+      <w:r>
+        <w:rPr>
+          <w:b/>
+          <w:bCs/>
+        </w:rPr>
         <w:lastRenderedPageBreak/>
-        <w:t>Q: What problems do you regularly run into with the current system?</w:t>
-      </w:r>
-    </w:p>
-    <w:p>
-      <w:pPr>
-        <w:tabs>
-          <w:tab w:val="num" w:pos="1440"/>
-        </w:tabs>
-      </w:pPr>
-      <w:r>
-        <w:t>A: The biggest one is not knowing if a seat is already taken. Sometimes a customer picks a specific seat and we say yes, then another member of staff has already given that seat to someone else and we do not know until they both turn up. It causes a lot of awkward situations. Also finding information takes too long. If someone asks what time a film starts or how many seats are left I have to physically look through the diary.</w:t>
-      </w:r>
-    </w:p>
-    <w:p>
-      <w:pPr>
-        <w:tabs>
-          <w:tab w:val="num" w:pos="1440"/>
-        </w:tabs>
-      </w:pPr>
-      <w:r>
-        <w:rPr>
-          <w:b/>
-          <w:bCs/>
-        </w:rPr>
         <w:t>Q: How do you currently handle food and drink orders alongside ticketing?</w:t>
       </w:r>
     </w:p>
@@ -1188,7 +1330,6 @@
         </w:tabs>
       </w:pPr>
       <w:r>
-        <w:lastRenderedPageBreak/>
         <w:t>A: As long as it is straightforward to use I am fine with it. I am not very technical so if it is complicated I will struggle during busy periods. It needs to be quick. I cannot be spending ages clicking through menus when there is a queue of people waiting.</w:t>
       </w:r>
     </w:p>
@@ -1379,7 +1520,6 @@
           </w:tcPr>
           <w:p>
             <w:r>
-              <w:lastRenderedPageBreak/>
               <w:t xml:space="preserve">I book in advance by phone </w:t>
             </w:r>
           </w:p>
@@ -1652,7 +1792,14 @@
           </w:tcPr>
           <w:p>
             <w:r>
-              <w:t xml:space="preserve">Seat already taken when I arrived </w:t>
+              <w:lastRenderedPageBreak/>
+              <w:t>Seat already taken when I arrived</w:t>
+            </w:r>
+            <w:r>
+              <w:t>, Other customers given the same seat number.</w:t>
+            </w:r>
+            <w:r>
+              <w:t xml:space="preserve"> </w:t>
             </w:r>
           </w:p>
         </w:tc>
@@ -1799,7 +1946,6 @@
           </w:tcPr>
           <w:p>
             <w:r>
-              <w:lastRenderedPageBreak/>
               <w:t xml:space="preserve">Yes definitely </w:t>
             </w:r>
           </w:p>
@@ -2250,6 +2396,7 @@
         </w:tabs>
       </w:pPr>
       <w:r>
+        <w:lastRenderedPageBreak/>
         <w:t>As part of my investigation</w:t>
       </w:r>
       <w:r>
@@ -2284,7 +2431,9 @@
         </w:tabs>
       </w:pPr>
       <w:r>
-        <w:lastRenderedPageBreak/>
+        <w:rPr>
+          <w:noProof/>
+        </w:rPr>
         <w:drawing>
           <wp:inline distT="0" distB="0" distL="0" distR="0" wp14:anchorId="0F0FFE2C" wp14:editId="7863C73D">
             <wp:extent cx="7549827" cy="3467100"/>
@@ -2347,17 +2496,20 @@
           <w:b/>
           <w:bCs/>
         </w:rPr>
+        <w:t>Screening Times Page</w:t>
+      </w:r>
+    </w:p>
+    <w:p>
+      <w:pPr>
+        <w:tabs>
+          <w:tab w:val="num" w:pos="1440"/>
+        </w:tabs>
+      </w:pPr>
+      <w:r>
+        <w:rPr>
+          <w:noProof/>
+        </w:rPr>
         <w:lastRenderedPageBreak/>
-        <w:t>Screening Times Page</w:t>
-      </w:r>
-    </w:p>
-    <w:p>
-      <w:pPr>
-        <w:tabs>
-          <w:tab w:val="num" w:pos="1440"/>
-        </w:tabs>
-      </w:pPr>
-      <w:r>
         <w:drawing>
           <wp:inline distT="0" distB="0" distL="0" distR="0" wp14:anchorId="36245FF1" wp14:editId="095576EB">
             <wp:extent cx="4743450" cy="4240517"/>
@@ -2402,40 +2554,40 @@
         </w:tabs>
       </w:pPr>
       <w:r>
-        <w:t xml:space="preserve">When a film is selected Vue displays all upcoming showings for that film at the chosen venue, organised by date and time. Each screening card shows the start and end time, the screen number and the ticket price. Accessibility information such as audio </w:t>
-      </w:r>
-      <w:r>
+        <w:t>When a film is selected Vue displays all upcoming showings for that film at the chosen venue, organised by date and time. Each screening card shows the start and end time, the screen number and the ticket price. Accessibility information such as audio description and wheelchair access is also clearly displayed. This level of detail is something I aim to replicate in Filmtopia, where staff and customers should be able to see all relevant information about a screening at a glance without having to search through multiple menus.</w:t>
+      </w:r>
+    </w:p>
+    <w:p>
+      <w:pPr>
+        <w:tabs>
+          <w:tab w:val="num" w:pos="1440"/>
+        </w:tabs>
+        <w:rPr>
+          <w:b/>
+          <w:bCs/>
+        </w:rPr>
+      </w:pPr>
+      <w:r>
+        <w:rPr>
+          <w:b/>
+          <w:bCs/>
+        </w:rPr>
+        <w:t>Seat Selection Screen</w:t>
+      </w:r>
+    </w:p>
+    <w:p>
+      <w:pPr>
+        <w:tabs>
+          <w:tab w:val="num" w:pos="1440"/>
+        </w:tabs>
+      </w:pPr>
+      <w:r>
+        <w:rPr>
+          <w:noProof/>
+        </w:rPr>
         <w:lastRenderedPageBreak/>
-        <w:t>description and wheelchair access is also clearly displayed. This level of detail is something I aim to replicate in Filmtopia, where staff and customers should be able to see all relevant information about a screening at a glance without having to search through multiple menus.</w:t>
-      </w:r>
-    </w:p>
-    <w:p>
-      <w:pPr>
-        <w:tabs>
-          <w:tab w:val="num" w:pos="1440"/>
-        </w:tabs>
-        <w:rPr>
-          <w:b/>
-          <w:bCs/>
-        </w:rPr>
-      </w:pPr>
-      <w:r>
-        <w:rPr>
-          <w:b/>
-          <w:bCs/>
-        </w:rPr>
-        <w:t>Seat Selection Screen</w:t>
-      </w:r>
-    </w:p>
-    <w:p>
-      <w:pPr>
-        <w:tabs>
-          <w:tab w:val="num" w:pos="1440"/>
-        </w:tabs>
-      </w:pPr>
-      <w:r>
         <w:drawing>
-          <wp:inline distT="0" distB="0" distL="0" distR="0" wp14:anchorId="3DB26D46" wp14:editId="663959AE">
+          <wp:inline distT="0" distB="0" distL="0" distR="0" wp14:anchorId="3DB26D46" wp14:editId="3B322940">
             <wp:extent cx="7747481" cy="3933825"/>
             <wp:effectExtent l="0" t="0" r="6350" b="0"/>
             <wp:docPr id="854855114" name="Picture 1"/>
@@ -2478,7 +2630,6 @@
         </w:tabs>
       </w:pPr>
       <w:r>
-        <w:lastRenderedPageBreak/>
         <w:t>Vue's seat selection interface is a standout feature of their system. It displays a graphical layout of the screen showing every seat as a coloured icon, with different colours representing different seat types and prices. VIP seats are shown in orange at £8.49, Regular seats in black at £7.49, Saver seats in green at £6.49 and Super Saver seats in red at £4.99. Occupied seats are shown in grey so customers can immediately see what is available. Rows are labelled alphabetically on the left hand side. This graphical seat selection is a key feature I plan to implement in Filmtopia as it directly addresses the double booking problem identified in the interviews. By showing customers and staff exactly which seats are taken in real time the system eliminates the risk of two people being assigned the same seat.</w:t>
       </w:r>
     </w:p>
@@ -2573,43 +2724,46 @@
         </w:tabs>
       </w:pPr>
       <w:r>
+        <w:t>A quick search function allowing users to find screenings by film, date and time</w:t>
+      </w:r>
+    </w:p>
+    <w:p>
+      <w:pPr>
+        <w:tabs>
+          <w:tab w:val="num" w:pos="1440"/>
+        </w:tabs>
+        <w:rPr>
+          <w:b/>
+          <w:bCs/>
+        </w:rPr>
+      </w:pPr>
+    </w:p>
+    <w:p>
+      <w:pPr>
+        <w:tabs>
+          <w:tab w:val="num" w:pos="1440"/>
+        </w:tabs>
+      </w:pPr>
+      <w:r>
+        <w:rPr>
+          <w:b/>
+          <w:bCs/>
+        </w:rPr>
+        <w:t>Desk Based Research – Odeon Cinema (odeon.co.uk)</w:t>
+      </w:r>
+    </w:p>
+    <w:p>
+      <w:pPr>
+        <w:tabs>
+          <w:tab w:val="num" w:pos="1440"/>
+        </w:tabs>
+      </w:pPr>
+      <w:r>
+        <w:t xml:space="preserve">The second system I researched was Odeon, which is the largest cinema chain in the UK. Odeon operates over 120 cinemas across the UK and Ireland and their online </w:t>
+      </w:r>
+      <w:r>
         <w:lastRenderedPageBreak/>
-        <w:t>A quick search function allowing users to find screenings by film, date and time</w:t>
-      </w:r>
-    </w:p>
-    <w:p>
-      <w:pPr>
-        <w:tabs>
-          <w:tab w:val="num" w:pos="1440"/>
-        </w:tabs>
-        <w:rPr>
-          <w:b/>
-          <w:bCs/>
-        </w:rPr>
-      </w:pPr>
-    </w:p>
-    <w:p>
-      <w:pPr>
-        <w:tabs>
-          <w:tab w:val="num" w:pos="1440"/>
-        </w:tabs>
-      </w:pPr>
-      <w:r>
-        <w:rPr>
-          <w:b/>
-          <w:bCs/>
-        </w:rPr>
-        <w:t>Desk Based Research – Odeon Cinema (odeon.co.uk)</w:t>
-      </w:r>
-    </w:p>
-    <w:p>
-      <w:pPr>
-        <w:tabs>
-          <w:tab w:val="num" w:pos="1440"/>
-        </w:tabs>
-      </w:pPr>
-      <w:r>
-        <w:t>The second system I researched was Odeon, which is the largest cinema chain in the UK. Odeon operates over 120 cinemas across the UK and Ireland and their online booking system offered several useful features to compare against Vue and to inform the design of Filmtopia.</w:t>
+        <w:t>booking system offered several useful features to compare against Vue and to inform the design of Filmtopia.</w:t>
       </w:r>
     </w:p>
     <w:p>
@@ -2637,7 +2791,9 @@
         </w:tabs>
       </w:pPr>
       <w:r>
-        <w:lastRenderedPageBreak/>
+        <w:rPr>
+          <w:noProof/>
+        </w:rPr>
         <w:drawing>
           <wp:inline distT="0" distB="0" distL="0" distR="0" wp14:anchorId="371730D0" wp14:editId="66E01729">
             <wp:extent cx="5731510" cy="5603875"/>
@@ -2682,7 +2838,6 @@
         </w:tabs>
       </w:pPr>
       <w:r>
-        <w:lastRenderedPageBreak/>
         <w:t>Similar to Vue, Odeon presents films using large poster images organised under a Top Films heading. However Odeon includes additional information directly on the film page such as the director, cast, runtime, release date and genre tags. This richer level of detail gives customers more context before making a booking decision. Odeon also includes a quick search bar at the bottom of the page allowing users to filter by cinema, film, date and time. One notable difference from Vue is that Odeon uses a darker navy blue colour scheme throughout which creates a more premium feel. For Filmtopia I will aim to display key film information clearly on the customer kiosk so customers can make informed decisions quickly.</w:t>
       </w:r>
     </w:p>
@@ -2711,6 +2866,9 @@
         </w:tabs>
       </w:pPr>
       <w:r>
+        <w:rPr>
+          <w:noProof/>
+        </w:rPr>
         <w:lastRenderedPageBreak/>
         <w:drawing>
           <wp:inline distT="0" distB="0" distL="0" distR="0" wp14:anchorId="4285E1BF" wp14:editId="29C80826">
@@ -2756,7 +2914,6 @@
         </w:tabs>
       </w:pPr>
       <w:r>
-        <w:lastRenderedPageBreak/>
         <w:t>Odeon's screening times page clearly displays the film title, runtime, release date and genre alongside all available showtimes. Screenings are organised by date across the top of the page and grouped by cinema location below. Each screening card shows the start time, screen number and format such as 3D. A "Book Now" button is displayed prominently on each card making the next action immediately obvious. This clear layout is something I will replicate in Filmtopia where staff should be able to see all screenings for a given film at a glance.</w:t>
       </w:r>
     </w:p>
@@ -2785,6 +2942,9 @@
         </w:tabs>
       </w:pPr>
       <w:r>
+        <w:rPr>
+          <w:noProof/>
+        </w:rPr>
         <w:lastRenderedPageBreak/>
         <w:drawing>
           <wp:inline distT="0" distB="0" distL="0" distR="0" wp14:anchorId="1EB8E141" wp14:editId="745A0419">
@@ -2830,11 +2990,7 @@
         </w:tabs>
       </w:pPr>
       <w:r>
-        <w:t xml:space="preserve">Odeon's seat selection screen is particularly well designed and shows several features worth incorporating into Filmtopia. The screen displays a graphical layout of the entire auditorium with seats colour coded by type and price. Green seats represent Classic Saver at </w:t>
-      </w:r>
-      <w:r>
-        <w:lastRenderedPageBreak/>
-        <w:t>£14.99, cream seats represent Classic at £16.49 and orange seats represent Classic Popular at £17.99. Unavailable seats are shown with an X so it is immediately clear which seats cannot be booked. A seat key at the bottom explains the colour coding including wheelchair and companion seat options. The booking process is also clearly structured using a step by step tab navigation at the top showing Seats, Sign In, Tickets, Food, Summary and Payment. This staged approach guides the user through the process logically and reduces confusion. For Filmtopia I will incorporate a similar colour coded seat map and a clear step by step flow for the customer kiosk booking process.</w:t>
+        <w:t>Odeon's seat selection screen is particularly well designed and shows several features worth incorporating into Filmtopia. The screen displays a graphical layout of the entire auditorium with seats colour coded by type and price. Green seats represent Classic Saver at £14.99, cream seats represent Classic at £16.49 and orange seats represent Classic Popular at £17.99. Unavailable seats are shown with an X so it is immediately clear which seats cannot be booked. A seat key at the bottom explains the colour coding including wheelchair and companion seat options. The booking process is also clearly structured using a step by step tab navigation at the top showing Seats, Sign In, Tickets, Food, Summary and Payment. This staged approach guides the user through the process logically and reduces confusion. For Filmtopia I will incorporate a similar colour coded seat map and a clear step by step flow for the customer kiosk booking process.</w:t>
       </w:r>
     </w:p>
     <w:p>
@@ -2928,6 +3084,7 @@
         </w:tabs>
       </w:pPr>
       <w:r>
+        <w:lastRenderedPageBreak/>
         <w:t>Prominent call to action buttons making the next step always obvious</w:t>
       </w:r>
     </w:p>
@@ -2952,7 +3109,6 @@
           <w:sz w:val="36"/>
           <w:szCs w:val="36"/>
         </w:rPr>
-        <w:lastRenderedPageBreak/>
         <w:t>Data Flow Diagrams</w:t>
       </w:r>
     </w:p>
@@ -2964,6 +3120,9 @@
         <w:jc w:val="center"/>
       </w:pPr>
       <w:r>
+        <w:rPr>
+          <w:noProof/>
+        </w:rPr>
         <w:drawing>
           <wp:inline distT="0" distB="0" distL="0" distR="0" wp14:anchorId="54F16FFC" wp14:editId="47D1E6D0">
             <wp:extent cx="6066867" cy="4791075"/>
@@ -3091,6 +3250,7 @@
         </w:tabs>
       </w:pPr>
       <w:r>
+        <w:lastRenderedPageBreak/>
         <w:t>When a customer purchases food or drinks at the concessions area, a staff member writes the order on a notepad which is then passed to the kitchen or concessions team. No electronic record is made of this transaction at the point of sale.</w:t>
       </w:r>
     </w:p>
@@ -3101,162 +3261,163 @@
         </w:tabs>
       </w:pPr>
       <w:r>
+        <w:t>When a new film is added to the schedule or a screening time changes, the manager manually updates a separate paper schedule that is kept at the box office. There is no automated way of notifying staff of changes to the schedule.</w:t>
+      </w:r>
+    </w:p>
+    <w:p>
+      <w:pPr>
+        <w:tabs>
+          <w:tab w:val="num" w:pos="1440"/>
+        </w:tabs>
+      </w:pPr>
+      <w:r>
+        <w:t>Stock levels for food and drink are updated manually on a spreadsheet by the manager or a designated staff member after stock counts are carried out. This is done periodically rather than in real time.</w:t>
+      </w:r>
+    </w:p>
+    <w:p>
+      <w:pPr>
+        <w:tabs>
+          <w:tab w:val="num" w:pos="1440"/>
+        </w:tabs>
+      </w:pPr>
+      <w:r>
+        <w:rPr>
+          <w:b/>
+          <w:bCs/>
+        </w:rPr>
+        <w:t>Outputs from the Existing System</w:t>
+      </w:r>
+    </w:p>
+    <w:p>
+      <w:pPr>
+        <w:tabs>
+          <w:tab w:val="num" w:pos="1440"/>
+        </w:tabs>
+      </w:pPr>
+      <w:r>
+        <w:t>The outputs from the existing system are limited and largely paper based.</w:t>
+      </w:r>
+    </w:p>
+    <w:p>
+      <w:pPr>
+        <w:tabs>
+          <w:tab w:val="num" w:pos="1440"/>
+        </w:tabs>
+      </w:pPr>
+      <w:r>
+        <w:t>When a customer completes a ticket booking, the staff member prints a ticket stub from a basic template on a computer and hands it to the customer. This ticket stub contains the film name, screening time and seat number but is not linked to any database.</w:t>
+      </w:r>
+    </w:p>
+    <w:p>
+      <w:pPr>
+        <w:tabs>
+          <w:tab w:val="num" w:pos="1440"/>
+        </w:tabs>
+      </w:pPr>
+      <w:r>
+        <w:t>At the end of each day or week the manager manually compiles sales figures by counting through the entries in the paper booking diary and cross referencing with till receipts. This produces a handwritten or basic spreadsheet based sales summary which is used to assess the cinema's performance.</w:t>
+      </w:r>
+    </w:p>
+    <w:p>
+      <w:pPr>
+        <w:tabs>
+          <w:tab w:val="num" w:pos="1440"/>
+        </w:tabs>
+      </w:pPr>
+      <w:r>
+        <w:t>Staff rotas are produced by the manager in a spreadsheet and printed out for staff to view. There is no digital way for staff to check their rota remotely.</w:t>
+      </w:r>
+    </w:p>
+    <w:p>
+      <w:pPr>
+        <w:tabs>
+          <w:tab w:val="num" w:pos="1440"/>
+        </w:tabs>
+      </w:pPr>
+      <w:r>
+        <w:rPr>
+          <w:b/>
+          <w:bCs/>
+        </w:rPr>
+        <w:t>Processing in the Existing System</w:t>
+      </w:r>
+    </w:p>
+    <w:p>
+      <w:pPr>
+        <w:tabs>
+          <w:tab w:val="num" w:pos="1440"/>
+        </w:tabs>
+      </w:pPr>
+      <w:r>
+        <w:t>The processing that takes place in the existing system is entirely manual and carried out by staff members rather than any software.</w:t>
+      </w:r>
+    </w:p>
+    <w:p>
+      <w:pPr>
+        <w:tabs>
+          <w:tab w:val="num" w:pos="1440"/>
+        </w:tabs>
+      </w:pPr>
+      <w:r>
+        <w:t>When a customer requests a specific seat for a screening, a staff member must physically look through the paper booking diary to check whether that seat has already been assigned to another customer. This check is slow and unreliable, particularly during busy periods when multiple staff members may be taking bookings simultaneously.</w:t>
+      </w:r>
+    </w:p>
+    <w:p>
+      <w:pPr>
+        <w:tabs>
+          <w:tab w:val="num" w:pos="1440"/>
+        </w:tabs>
+      </w:pPr>
+      <w:r>
+        <w:t>When a customer books tickets, the staff member must calculate the total cost manually based on the number of tickets and the ticket price for that screening. There is no automated pricing or discount system.</w:t>
+      </w:r>
+    </w:p>
+    <w:p>
+      <w:pPr>
+        <w:tabs>
+          <w:tab w:val="num" w:pos="1440"/>
+        </w:tabs>
+      </w:pPr>
+      <w:r>
+        <w:t>At the end of a trading period the manager must manually count through all bookings recorded in the diary and cross reference with food and drink sales to produce any kind of performance summary. This process can take a significant amount of time and is prone to human error.</w:t>
+      </w:r>
+    </w:p>
+    <w:p>
+      <w:pPr>
+        <w:tabs>
+          <w:tab w:val="num" w:pos="1440"/>
+        </w:tabs>
+      </w:pPr>
+      <w:r>
+        <w:rPr>
+          <w:b/>
+          <w:bCs/>
+        </w:rPr>
+        <w:t>Limitations of the Existing System</w:t>
+      </w:r>
+    </w:p>
+    <w:p>
+      <w:pPr>
+        <w:tabs>
+          <w:tab w:val="num" w:pos="1440"/>
+        </w:tabs>
+      </w:pPr>
+      <w:r>
+        <w:t>The existing system has several significant limitations that have been identified through the investigation.</w:t>
+      </w:r>
+    </w:p>
+    <w:p>
+      <w:pPr>
+        <w:tabs>
+          <w:tab w:val="num" w:pos="1440"/>
+        </w:tabs>
+      </w:pPr>
+      <w:r>
+        <w:t xml:space="preserve">The most serious limitation is the risk of double bookings. Because there is no centralised real time record of seat allocations, two members of staff can independently assign the same seat to two different customers without either being </w:t>
+      </w:r>
+      <w:r>
         <w:lastRenderedPageBreak/>
-        <w:t>When a new film is added to the schedule or a screening time changes, the manager manually updates a separate paper schedule that is kept at the box office. There is no automated way of notifying staff of changes to the schedule.</w:t>
-      </w:r>
-    </w:p>
-    <w:p>
-      <w:pPr>
-        <w:tabs>
-          <w:tab w:val="num" w:pos="1440"/>
-        </w:tabs>
-      </w:pPr>
-      <w:r>
-        <w:t>Stock levels for food and drink are updated manually on a spreadsheet by the manager or a designated staff member after stock counts are carried out. This is done periodically rather than in real time.</w:t>
-      </w:r>
-    </w:p>
-    <w:p>
-      <w:pPr>
-        <w:tabs>
-          <w:tab w:val="num" w:pos="1440"/>
-        </w:tabs>
-      </w:pPr>
-      <w:r>
-        <w:rPr>
-          <w:b/>
-          <w:bCs/>
-        </w:rPr>
-        <w:t>Outputs from the Existing System</w:t>
-      </w:r>
-    </w:p>
-    <w:p>
-      <w:pPr>
-        <w:tabs>
-          <w:tab w:val="num" w:pos="1440"/>
-        </w:tabs>
-      </w:pPr>
-      <w:r>
-        <w:t>The outputs from the existing system are limited and largely paper based.</w:t>
-      </w:r>
-    </w:p>
-    <w:p>
-      <w:pPr>
-        <w:tabs>
-          <w:tab w:val="num" w:pos="1440"/>
-        </w:tabs>
-      </w:pPr>
-      <w:r>
-        <w:t>When a customer completes a ticket booking, the staff member prints a ticket stub from a basic template on a computer and hands it to the customer. This ticket stub contains the film name, screening time and seat number but is not linked to any database.</w:t>
-      </w:r>
-    </w:p>
-    <w:p>
-      <w:pPr>
-        <w:tabs>
-          <w:tab w:val="num" w:pos="1440"/>
-        </w:tabs>
-      </w:pPr>
-      <w:r>
-        <w:t>At the end of each day or week the manager manually compiles sales figures by counting through the entries in the paper booking diary and cross referencing with till receipts. This produces a handwritten or basic spreadsheet based sales summary which is used to assess the cinema's performance.</w:t>
-      </w:r>
-    </w:p>
-    <w:p>
-      <w:pPr>
-        <w:tabs>
-          <w:tab w:val="num" w:pos="1440"/>
-        </w:tabs>
-      </w:pPr>
-      <w:r>
-        <w:t>Staff rotas are produced by the manager in a spreadsheet and printed out for staff to view. There is no digital way for staff to check their rota remotely.</w:t>
-      </w:r>
-    </w:p>
-    <w:p>
-      <w:pPr>
-        <w:tabs>
-          <w:tab w:val="num" w:pos="1440"/>
-        </w:tabs>
-      </w:pPr>
-      <w:r>
-        <w:rPr>
-          <w:b/>
-          <w:bCs/>
-        </w:rPr>
-        <w:lastRenderedPageBreak/>
-        <w:t>Processing in the Existing System</w:t>
-      </w:r>
-    </w:p>
-    <w:p>
-      <w:pPr>
-        <w:tabs>
-          <w:tab w:val="num" w:pos="1440"/>
-        </w:tabs>
-      </w:pPr>
-      <w:r>
-        <w:t>The processing that takes place in the existing system is entirely manual and carried out by staff members rather than any software.</w:t>
-      </w:r>
-    </w:p>
-    <w:p>
-      <w:pPr>
-        <w:tabs>
-          <w:tab w:val="num" w:pos="1440"/>
-        </w:tabs>
-      </w:pPr>
-      <w:r>
-        <w:t>When a customer requests a specific seat for a screening, a staff member must physically look through the paper booking diary to check whether that seat has already been assigned to another customer. This check is slow and unreliable, particularly during busy periods when multiple staff members may be taking bookings simultaneously.</w:t>
-      </w:r>
-    </w:p>
-    <w:p>
-      <w:pPr>
-        <w:tabs>
-          <w:tab w:val="num" w:pos="1440"/>
-        </w:tabs>
-      </w:pPr>
-      <w:r>
-        <w:t>When a customer books tickets, the staff member must calculate the total cost manually based on the number of tickets and the ticket price for that screening. There is no automated pricing or discount system.</w:t>
-      </w:r>
-    </w:p>
-    <w:p>
-      <w:pPr>
-        <w:tabs>
-          <w:tab w:val="num" w:pos="1440"/>
-        </w:tabs>
-      </w:pPr>
-      <w:r>
-        <w:t>At the end of a trading period the manager must manually count through all bookings recorded in the diary and cross reference with food and drink sales to produce any kind of performance summary. This process can take a significant amount of time and is prone to human error.</w:t>
-      </w:r>
-    </w:p>
-    <w:p>
-      <w:pPr>
-        <w:tabs>
-          <w:tab w:val="num" w:pos="1440"/>
-        </w:tabs>
-      </w:pPr>
-      <w:r>
-        <w:rPr>
-          <w:b/>
-          <w:bCs/>
-        </w:rPr>
-        <w:t>Limitations of the Existing System</w:t>
-      </w:r>
-    </w:p>
-    <w:p>
-      <w:pPr>
-        <w:tabs>
-          <w:tab w:val="num" w:pos="1440"/>
-        </w:tabs>
-      </w:pPr>
-      <w:r>
-        <w:t>The existing system has several significant limitations that have been identified through the investigation.</w:t>
-      </w:r>
-    </w:p>
-    <w:p>
-      <w:pPr>
-        <w:tabs>
-          <w:tab w:val="num" w:pos="1440"/>
-        </w:tabs>
-      </w:pPr>
-      <w:r>
-        <w:lastRenderedPageBreak/>
-        <w:t>The most serious limitation is the risk of double bookings. Because there is no centralised real time record of seat allocations, two members of staff can independently assign the same seat to two different customers without either being aware. This was confirmed by both Sarah Henshaw and Jake Pemberton in their interviews and by 65% of customers in the questionnaire.</w:t>
+        <w:t>aware. This was confirmed by both Sarah Henshaw and Jake Pemberton in their interviews and by 65% of customers in the questionnaire.</w:t>
       </w:r>
     </w:p>
     <w:p>
@@ -3336,62 +3497,64 @@
         </w:tabs>
       </w:pPr>
       <w:r>
+        <w:t>Having thoroughly investigated the existing system at Filmtopia through interviews with the cinema manager Sarah Henshaw and box office staff member Jake Pemberton, a customer questionnaire, observation of the current processes and desk based research into similar cinema systems, it is now possible to clearly define the problem that the proposed solution must address.</w:t>
+      </w:r>
+    </w:p>
+    <w:p>
+      <w:pPr>
+        <w:tabs>
+          <w:tab w:val="num" w:pos="1440"/>
+        </w:tabs>
+      </w:pPr>
+      <w:r>
+        <w:t>Filmtopia is a small independent cinema that is currently managing all of its business operations using paper records and disconnected spreadsheets. This approach was adequate when the cinema was first established but has become increasingly problematic as the demands on the system have grown. The core problem is that the existing system is unreliable, slow and disconnected, resulting in a poor experience for both customers and staff.</w:t>
+      </w:r>
+    </w:p>
+    <w:p>
+      <w:pPr>
+        <w:tabs>
+          <w:tab w:val="num" w:pos="1440"/>
+        </w:tabs>
+      </w:pPr>
+      <w:r>
+        <w:t>The most critical issue is the risk of double bookings. Because seat allocations are recorded manually in a paper diary with no real time updating, two members of staff can independently assign the same seat to different customers without either being aware. This directly damages customer satisfaction and the reputation of the cinema. This issue will be addressed by Objective 1 in the following section.</w:t>
+      </w:r>
+    </w:p>
+    <w:p>
+      <w:pPr>
+        <w:tabs>
+          <w:tab w:val="num" w:pos="1440"/>
+        </w:tabs>
+      </w:pPr>
+      <w:r>
+        <w:t>A secondary but equally significant problem is the disconnected nature of the existing system. Ticketing, food and drink ordering, stock management and staff scheduling are all handled through separate paper or spreadsheet based systems that do not communicate with each other. This means that the manager has no way of viewing a complete picture of the cinema's operations without manually compiling data from multiple sources. This will be addressed by Objectives 2 and 3.</w:t>
+      </w:r>
+    </w:p>
+    <w:p>
+      <w:pPr>
+        <w:tabs>
+          <w:tab w:val="num" w:pos="1440"/>
+        </w:tabs>
+      </w:pPr>
+      <w:r>
+        <w:t xml:space="preserve">The customer facing experience is also severely limited by the current system. The touchscreen kiosk installed at the cinema can only handle food and drink orders and cannot sell tickets, which forces customers to queue at both the kiosk and the box office. Research into similar systems such as Vue and Odeon has shown that </w:t>
+      </w:r>
+      <w:r>
         <w:lastRenderedPageBreak/>
-        <w:t>Having thoroughly investigated the existing system at Filmtopia through interviews with the cinema manager Sarah Henshaw and box office staff member Jake Pemberton, a customer questionnaire, observation of the current processes and desk based research into similar cinema systems, it is now possible to clearly define the problem that the proposed solution must address.</w:t>
-      </w:r>
-    </w:p>
-    <w:p>
-      <w:pPr>
-        <w:tabs>
-          <w:tab w:val="num" w:pos="1440"/>
-        </w:tabs>
-      </w:pPr>
-      <w:r>
-        <w:t>Filmtopia is a small independent cinema that is currently managing all of its business operations using paper records and disconnected spreadsheets. This approach was adequate when the cinema was first established but has become increasingly problematic as the demands on the system have grown. The core problem is that the existing system is unreliable, slow and disconnected, resulting in a poor experience for both customers and staff.</w:t>
-      </w:r>
-    </w:p>
-    <w:p>
-      <w:pPr>
-        <w:tabs>
-          <w:tab w:val="num" w:pos="1440"/>
-        </w:tabs>
-      </w:pPr>
-      <w:r>
-        <w:t>The most critical issue is the risk of double bookings. Because seat allocations are recorded manually in a paper diary with no real time updating, two members of staff can independently assign the same seat to different customers without either being aware. This directly damages customer satisfaction and the reputation of the cinema. This issue will be addressed by Objective 1 in the following section.</w:t>
-      </w:r>
-    </w:p>
-    <w:p>
-      <w:pPr>
-        <w:tabs>
-          <w:tab w:val="num" w:pos="1440"/>
-        </w:tabs>
-      </w:pPr>
-      <w:r>
-        <w:t>A secondary but equally significant problem is the disconnected nature of the existing system. Ticketing, food and drink ordering, stock management and staff scheduling are all handled through separate paper or spreadsheet based systems that do not communicate with each other. This means that the manager has no way of viewing a complete picture of the cinema's operations without manually compiling data from multiple sources. This will be addressed by Objectives 2 and 3.</w:t>
-      </w:r>
-    </w:p>
-    <w:p>
-      <w:pPr>
-        <w:tabs>
-          <w:tab w:val="num" w:pos="1440"/>
-        </w:tabs>
-      </w:pPr>
-      <w:r>
-        <w:lastRenderedPageBreak/>
-        <w:t>The customer facing experience is also severely limited by the current system. The touchscreen kiosk installed at the cinema can only handle food and drink orders and cannot sell tickets, which forces customers to queue at both the kiosk and the box office. Research into similar systems such as Vue and Odeon has shown that customers expect to be able to purchase tickets and food through a single self service interface. This will be addressed by Objective 4.</w:t>
-      </w:r>
-    </w:p>
-    <w:p>
-      <w:pPr>
-        <w:tabs>
-          <w:tab w:val="num" w:pos="1440"/>
-        </w:tabs>
-      </w:pPr>
-      <w:r>
-        <w:t>The proposed solution is a Visual Basic .NET Windows Forms application built in Visual Studio, using OleDb to manage the connection between the application and a Microsoft Access database. Visual Basic .NET has been chosen because it allows rapid development of graphical Windows applications with a professional user interface and is the language used throughout this course. OleDb has been chosen as the database connectivity method because it provides a straightforward and reliable way of connecting a Visual Basic .NET application to a Microsoft Access .</w:t>
-      </w:r>
-      <w:r>
-        <w:t>m</w:t>
+        <w:t>customers expect to be able to purchase tickets and food through a single self service interface. This will be addressed by Objective 4.</w:t>
+      </w:r>
+    </w:p>
+    <w:p>
+      <w:pPr>
+        <w:tabs>
+          <w:tab w:val="num" w:pos="1440"/>
+        </w:tabs>
+      </w:pPr>
+      <w:r>
+        <w:t xml:space="preserve">The proposed solution is a Visual Basic .NET Windows Forms application built in Visual Studio, using OleDb to manage the connection between the application and a Microsoft Access database. Visual Basic .NET has been chosen because it allows rapid development of graphical Windows applications with a professional user interface and is the language used throughout this course. OleDb has been chosen as the database connectivity method because it provides a straightforward and reliable way of connecting a Visual Basic .NET application to a Microsoft Access </w:t>
+      </w:r>
+      <w:r>
+        <w:t>.m</w:t>
       </w:r>
       <w:r>
         <w:t>db file, allowing SQL queries to be executed directly from the application code to insert, update, delete and retrieve records. Microsoft Access has been chosen as the database solution because it provides a relational database structure that can enforce data integrity, prevent duplicate records and store all of Filmtopia's data in one centralised location. This combination of technologies directly addresses the core problems identified in the investigation and will allow the development of a fully functioning cinema management system within the scope of this project.</w:t>
@@ -3424,78 +3587,77 @@
           <w:sz w:val="36"/>
           <w:szCs w:val="36"/>
         </w:rPr>
+        <w:t>Limitations of Proposed Solution</w:t>
+      </w:r>
+    </w:p>
+    <w:p>
+      <w:pPr>
+        <w:tabs>
+          <w:tab w:val="num" w:pos="1440"/>
+        </w:tabs>
+      </w:pPr>
+      <w:r>
+        <w:t>Whilst the proposed Filmtopia system will address the core problems identified in the investigation, there are several areas that will not be included in the solution due to constraints of time, scope and available hardware and software. These limitations are outlined below.</w:t>
+      </w:r>
+    </w:p>
+    <w:p>
+      <w:pPr>
+        <w:tabs>
+          <w:tab w:val="num" w:pos="1440"/>
+        </w:tabs>
+      </w:pPr>
+      <w:r>
+        <w:t>The system will not include online booking functionality. Developing a web based booking system that allows customers to purchase tickets remotely would require a web server, a publicly accessible database and a payment processing integration, all of which are beyond the scope of an A Level project. The system will instead focus on in-cinema operations at the box office and customer kiosk.</w:t>
+      </w:r>
+    </w:p>
+    <w:p>
+      <w:pPr>
+        <w:tabs>
+          <w:tab w:val="num" w:pos="1440"/>
+        </w:tabs>
+      </w:pPr>
+      <w:r>
+        <w:t>The system will not include a real payment processing system. Taking card or cash payments involves integration with chip and pin hardware and payment gateway APIs which are not available for this project. Payment will be simulated within the system and the process of actually collecting money from the customer will be assumed to happen separately.</w:t>
+      </w:r>
+    </w:p>
+    <w:p>
+      <w:pPr>
+        <w:tabs>
+          <w:tab w:val="num" w:pos="1440"/>
+        </w:tabs>
+      </w:pPr>
+      <w:r>
+        <w:t>The system will not include a mobile application. Developing iOS or Android applications would require additional software, hardware and significant development time beyond what is available for this project.</w:t>
+      </w:r>
+    </w:p>
+    <w:p>
+      <w:pPr>
+        <w:tabs>
+          <w:tab w:val="num" w:pos="1440"/>
+        </w:tabs>
+      </w:pPr>
+      <w:r>
+        <w:t>The system will not support multiple simultaneous users over a network. Whilst OleDb connections to a Microsoft Access database can technically support multiple users, developing a fully networked multi-user system with appropriate concurrency controls and conflict resolution is beyond the scope of this project. The system will be designed for use on a single machine or a small number of machines accessing the same .</w:t>
+      </w:r>
+      <w:r>
+        <w:t>m</w:t>
+      </w:r>
+      <w:r>
+        <w:t>db database file locally.</w:t>
+      </w:r>
+    </w:p>
+    <w:p>
+      <w:pPr>
+        <w:tabs>
+          <w:tab w:val="num" w:pos="1440"/>
+        </w:tabs>
+      </w:pPr>
+      <w:r>
+        <w:t xml:space="preserve">The system will not include automated staff scheduling or payroll functionality. Managing staff rotas and wages involves complex business logic and legal </w:t>
+      </w:r>
+      <w:r>
         <w:lastRenderedPageBreak/>
-        <w:t>Limitations of Proposed Solution</w:t>
-      </w:r>
-    </w:p>
-    <w:p>
-      <w:pPr>
-        <w:tabs>
-          <w:tab w:val="num" w:pos="1440"/>
-        </w:tabs>
-      </w:pPr>
-      <w:r>
-        <w:t>Whilst the proposed Filmtopia system will address the core problems identified in the investigation, there are several areas that will not be included in the solution due to constraints of time, scope and available hardware and software. These limitations are outlined below.</w:t>
-      </w:r>
-    </w:p>
-    <w:p>
-      <w:pPr>
-        <w:tabs>
-          <w:tab w:val="num" w:pos="1440"/>
-        </w:tabs>
-      </w:pPr>
-      <w:r>
-        <w:t>The system will not include online booking functionality. Developing a web based booking system that allows customers to purchase tickets remotely would require a web server, a publicly accessible database and a payment processing integration, all of which are beyond the scope of an A Level project. The system will instead focus on in-cinema operations at the box office and customer kiosk.</w:t>
-      </w:r>
-    </w:p>
-    <w:p>
-      <w:pPr>
-        <w:tabs>
-          <w:tab w:val="num" w:pos="1440"/>
-        </w:tabs>
-      </w:pPr>
-      <w:r>
-        <w:t>The system will not include a real payment processing system. Taking card or cash payments involves integration with chip and pin hardware and payment gateway APIs which are not available for this project. Payment will be simulated within the system and the process of actually collecting money from the customer will be assumed to happen separately.</w:t>
-      </w:r>
-    </w:p>
-    <w:p>
-      <w:pPr>
-        <w:tabs>
-          <w:tab w:val="num" w:pos="1440"/>
-        </w:tabs>
-      </w:pPr>
-      <w:r>
-        <w:t>The system will not include a mobile application. Developing iOS or Android applications would require additional software, hardware and significant development time beyond what is available for this project.</w:t>
-      </w:r>
-    </w:p>
-    <w:p>
-      <w:pPr>
-        <w:tabs>
-          <w:tab w:val="num" w:pos="1440"/>
-        </w:tabs>
-      </w:pPr>
-      <w:r>
-        <w:t xml:space="preserve">The system will not support multiple simultaneous users over a network. Whilst OleDb connections to a Microsoft Access database can technically support multiple users, developing a fully networked multi-user system with appropriate concurrency controls and conflict </w:t>
-      </w:r>
-      <w:r>
-        <w:lastRenderedPageBreak/>
-        <w:t>resolution is beyond the scope of this project. The system will be designed for use on a single machine or a small number of machines accessing the same .</w:t>
-      </w:r>
-      <w:r>
-        <w:t>m</w:t>
-      </w:r>
-      <w:r>
-        <w:t>db database file locally.</w:t>
-      </w:r>
-    </w:p>
-    <w:p>
-      <w:pPr>
-        <w:tabs>
-          <w:tab w:val="num" w:pos="1440"/>
-        </w:tabs>
-      </w:pPr>
-      <w:r>
-        <w:t>The system will not include automated staff scheduling or payroll functionality. Managing staff rotas and wages involves complex business logic and legal considerations that are outside the scope of this project. Staff management features will be limited to basic record keeping.</w:t>
+        <w:t>considerations that are outside the scope of this project. Staff management features will be limited to basic record keeping.</w:t>
       </w:r>
     </w:p>
     <w:p>
@@ -3559,286 +3721,289 @@
           <w:b/>
           <w:bCs/>
         </w:rPr>
+        <w:t>Objective 1: The system must allow staff to add new customer ticket bookings for a selected screening, recording the customer name, chosen seats and number of tickets.</w:t>
+      </w:r>
+    </w:p>
+    <w:p>
+      <w:pPr>
+        <w:tabs>
+          <w:tab w:val="num" w:pos="1440"/>
+        </w:tabs>
+      </w:pPr>
+      <w:r>
+        <w:t>Success Criteria: A new booking should be added to the Microsoft Access database in under 30 seconds. The booking record should appear immediately in the database with the correct customer name, screening, seat numbers and ticket quantity. Validation should prevent a booking being saved without all required fields completed.</w:t>
+      </w:r>
+    </w:p>
+    <w:p>
+      <w:pPr>
+        <w:tabs>
+          <w:tab w:val="num" w:pos="1440"/>
+        </w:tabs>
+      </w:pPr>
+      <w:r>
+        <w:rPr>
+          <w:b/>
+          <w:bCs/>
+        </w:rPr>
+        <w:t>Objective 2: The system must prevent double bookings by ensuring that a seat which has already been allocated to a customer cannot be selected by another customer for the same screening.</w:t>
+      </w:r>
+    </w:p>
+    <w:p>
+      <w:pPr>
+        <w:tabs>
+          <w:tab w:val="num" w:pos="1440"/>
+        </w:tabs>
+      </w:pPr>
+      <w:r>
+        <w:t>Success Criteria: When a seat is already booked for a screening it should be visually marked as unavailable on the seat selection interface and it should be impossible to select or book it. Attempting to book an already taken seat should display a clear error message.</w:t>
+      </w:r>
+    </w:p>
+    <w:p>
+      <w:pPr>
+        <w:tabs>
+          <w:tab w:val="num" w:pos="1440"/>
+        </w:tabs>
+      </w:pPr>
+      <w:r>
+        <w:rPr>
+          <w:b/>
+          <w:bCs/>
+        </w:rPr>
+        <w:t>Objective 3: The system must display a graphical seat map for each screening showing which seats are available and which are already booked.</w:t>
+      </w:r>
+    </w:p>
+    <w:p>
+      <w:pPr>
+        <w:tabs>
+          <w:tab w:val="num" w:pos="1440"/>
+        </w:tabs>
+      </w:pPr>
+      <w:r>
+        <w:t>Success Criteria: The seat map should load within 3 seconds of a screening being selected. Available seats and booked seats should be displayed in clearly distinguishable colours. The seat map should accurately reflect the current state of the database at the time of loading.</w:t>
+      </w:r>
+    </w:p>
+    <w:p>
+      <w:pPr>
+        <w:tabs>
+          <w:tab w:val="num" w:pos="1440"/>
+        </w:tabs>
+      </w:pPr>
+      <w:r>
+        <w:rPr>
+          <w:b/>
+          <w:bCs/>
+        </w:rPr>
+        <w:t>Objective 4: The system must allow customers to purchase tickets through a self-service kiosk interface, selecting a film, screening time, seats and completing their booking without staff assistance.</w:t>
+      </w:r>
+    </w:p>
+    <w:p>
+      <w:pPr>
+        <w:tabs>
+          <w:tab w:val="num" w:pos="1440"/>
+        </w:tabs>
+      </w:pPr>
+      <w:r>
+        <w:t>Success Criteria: A customer should be able to complete a full ticket booking through the kiosk interface in under 2 minutes. The kiosk should guide the customer through each stage clearly using buttons and on screen instructions. The completed booking should be recorded in the database correctly.</w:t>
+      </w:r>
+    </w:p>
+    <w:p>
+      <w:pPr>
+        <w:tabs>
+          <w:tab w:val="num" w:pos="1440"/>
+        </w:tabs>
+      </w:pPr>
+      <w:r>
+        <w:rPr>
+          <w:b/>
+          <w:bCs/>
+        </w:rPr>
+        <w:t>Objective 5: The system must allow customers to add food and drink items to their order at the same time as booking tickets, with the combined order saved to the database.</w:t>
+      </w:r>
+    </w:p>
+    <w:p>
+      <w:pPr>
+        <w:tabs>
+          <w:tab w:val="num" w:pos="1440"/>
+        </w:tabs>
+      </w:pPr>
+      <w:r>
+        <w:t xml:space="preserve">Success Criteria: Food and drink items should be displayed on a clearly navigable menu during the booking process. A customer should be able to add multiple items to their </w:t>
+      </w:r>
+      <w:r>
         <w:lastRenderedPageBreak/>
-        <w:t>Objective 1: The system must allow staff to add new customer ticket bookings for a selected screening, recording the customer name, chosen seats and number of tickets.</w:t>
-      </w:r>
-    </w:p>
-    <w:p>
-      <w:pPr>
-        <w:tabs>
-          <w:tab w:val="num" w:pos="1440"/>
-        </w:tabs>
-      </w:pPr>
-      <w:r>
-        <w:t>Success Criteria: A new booking should be added to the Microsoft Access database in under 30 seconds. The booking record should appear immediately in the database with the correct customer name, screening, seat numbers and ticket quantity. Validation should prevent a booking being saved without all required fields completed.</w:t>
-      </w:r>
-    </w:p>
-    <w:p>
-      <w:pPr>
-        <w:tabs>
-          <w:tab w:val="num" w:pos="1440"/>
-        </w:tabs>
-      </w:pPr>
-      <w:r>
-        <w:rPr>
-          <w:b/>
-          <w:bCs/>
-        </w:rPr>
-        <w:t>Objective 2: The system must prevent double bookings by ensuring that a seat which has already been allocated to a customer cannot be selected by another customer for the same screening.</w:t>
-      </w:r>
-    </w:p>
-    <w:p>
-      <w:pPr>
-        <w:tabs>
-          <w:tab w:val="num" w:pos="1440"/>
-        </w:tabs>
-      </w:pPr>
-      <w:r>
-        <w:t>Success Criteria: When a seat is already booked for a screening it should be visually marked as unavailable on the seat selection interface and it should be impossible to select or book it. Attempting to book an already taken seat should display a clear error message.</w:t>
-      </w:r>
-    </w:p>
-    <w:p>
-      <w:pPr>
-        <w:tabs>
-          <w:tab w:val="num" w:pos="1440"/>
-        </w:tabs>
-      </w:pPr>
-      <w:r>
-        <w:rPr>
-          <w:b/>
-          <w:bCs/>
-        </w:rPr>
-        <w:t>Objective 3: The system must display a graphical seat map for each screening showing which seats are available and which are already booked.</w:t>
-      </w:r>
-    </w:p>
-    <w:p>
-      <w:pPr>
-        <w:tabs>
-          <w:tab w:val="num" w:pos="1440"/>
-        </w:tabs>
-      </w:pPr>
-      <w:r>
-        <w:t>Success Criteria: The seat map should load within 3 seconds of a screening being selected. Available seats and booked seats should be displayed in clearly distinguishable colours. The seat map should accurately reflect the current state of the database at the time of loading.</w:t>
-      </w:r>
-    </w:p>
-    <w:p>
-      <w:pPr>
-        <w:tabs>
-          <w:tab w:val="num" w:pos="1440"/>
-        </w:tabs>
-      </w:pPr>
-      <w:r>
-        <w:rPr>
-          <w:b/>
-          <w:bCs/>
-        </w:rPr>
+        <w:t>order. The food and drink order should be saved to the database linked to the correct booking record.</w:t>
+      </w:r>
+    </w:p>
+    <w:p>
+      <w:pPr>
+        <w:tabs>
+          <w:tab w:val="num" w:pos="1440"/>
+        </w:tabs>
+      </w:pPr>
+      <w:r>
+        <w:rPr>
+          <w:b/>
+          <w:bCs/>
+        </w:rPr>
+        <w:t>Objective 6: The system must allow staff and managers to add new films to the system, including the film title, age rating, duration and description.</w:t>
+      </w:r>
+    </w:p>
+    <w:p>
+      <w:pPr>
+        <w:tabs>
+          <w:tab w:val="num" w:pos="1440"/>
+        </w:tabs>
+      </w:pPr>
+      <w:r>
+        <w:t>Success Criteria: A new film record should be saved to the database in under 20 seconds with all required fields validated. The film should immediately appear in the list of available films when adding a new screening. Duplicate film titles should be prevented through validation.</w:t>
+      </w:r>
+    </w:p>
+    <w:p>
+      <w:pPr>
+        <w:tabs>
+          <w:tab w:val="num" w:pos="1440"/>
+        </w:tabs>
+      </w:pPr>
+      <w:r>
+        <w:rPr>
+          <w:b/>
+          <w:bCs/>
+        </w:rPr>
+        <w:t>Objective 7: The system must allow staff and managers to add new screenings for existing films, specifying the screen, date, time and ticket price.</w:t>
+      </w:r>
+    </w:p>
+    <w:p>
+      <w:pPr>
+        <w:tabs>
+          <w:tab w:val="num" w:pos="1440"/>
+        </w:tabs>
+      </w:pPr>
+      <w:r>
+        <w:t>Success Criteria: A new screening record should be saved to the database correctly linked to the selected film. The screening should immediately appear in the list of available screenings on the customer kiosk. Validation should prevent a screening being added without a valid date, time, screen and ticket price.</w:t>
+      </w:r>
+    </w:p>
+    <w:p>
+      <w:pPr>
+        <w:tabs>
+          <w:tab w:val="num" w:pos="1440"/>
+        </w:tabs>
+      </w:pPr>
+      <w:r>
+        <w:rPr>
+          <w:b/>
+          <w:bCs/>
+        </w:rPr>
+        <w:t>Objective 8: The system must allow the manager to view a sales report showing total ticket sales and revenue for a selected date range.</w:t>
+      </w:r>
+    </w:p>
+    <w:p>
+      <w:pPr>
+        <w:tabs>
+          <w:tab w:val="num" w:pos="1440"/>
+        </w:tabs>
+      </w:pPr>
+      <w:r>
+        <w:t>Success Criteria: The report should be generated using an SQL query through the OleDb connection and displayed on screen within 5 seconds of the date range being selected. The report should show the correct total number of tickets sold and total revenue for the selected period, calculated directly from the bookings in the database.</w:t>
+      </w:r>
+    </w:p>
+    <w:p>
+      <w:pPr>
+        <w:tabs>
+          <w:tab w:val="num" w:pos="1440"/>
+        </w:tabs>
+      </w:pPr>
+      <w:r>
+        <w:rPr>
+          <w:b/>
+          <w:bCs/>
+        </w:rPr>
+        <w:t>Objective 9: The system must allow the manager to view a list of all bookings for a selected screening, showing customer names, seat numbers and the number of tickets booked.</w:t>
+      </w:r>
+    </w:p>
+    <w:p>
+      <w:pPr>
+        <w:tabs>
+          <w:tab w:val="num" w:pos="1440"/>
+        </w:tabs>
+      </w:pPr>
+      <w:r>
+        <w:t>Success Criteria: The booking list should load within 3 seconds of a screening being selected. All bookings for that screening should be displayed accurately. The list should be printable or exportable for use as a physical register.</w:t>
+      </w:r>
+    </w:p>
+    <w:p>
+      <w:pPr>
+        <w:tabs>
+          <w:tab w:val="num" w:pos="1440"/>
+        </w:tabs>
+      </w:pPr>
+      <w:r>
+        <w:rPr>
+          <w:b/>
+          <w:bCs/>
+        </w:rPr>
+        <w:t>Objective 10: The system must enforce access levels so that customers using the kiosk can only access booking functions, whilst staff can access management functions and managers can access all areas of the system.</w:t>
+      </w:r>
+    </w:p>
+    <w:p>
+      <w:pPr>
+        <w:tabs>
+          <w:tab w:val="num" w:pos="1440"/>
+        </w:tabs>
+      </w:pPr>
+      <w:r>
+        <w:t>Success Criteria: The kiosk interface should not display any staff or manager options. Staff should be able to log in with a username and password and access staff functions only. The manager login should provide access to all areas of the system. Attempting to access a restricted area without the correct login should be prevented.</w:t>
+      </w:r>
+    </w:p>
+    <w:p>
+      <w:pPr>
+        <w:tabs>
+          <w:tab w:val="num" w:pos="1440"/>
+        </w:tabs>
+      </w:pPr>
+      <w:r>
+        <w:rPr>
+          <w:b/>
+          <w:bCs/>
+        </w:rPr>
+        <w:t>Objective 11: The system must allow staff to search for an existing booking by customer name or booking reference.</w:t>
+      </w:r>
+    </w:p>
+    <w:p>
+      <w:pPr>
+        <w:tabs>
+          <w:tab w:val="num" w:pos="1440"/>
+        </w:tabs>
+      </w:pPr>
+      <w:r>
+        <w:t>Success Criteria: A search by customer surname should return all matching bookings within 2 seconds. The search should work with partial name entries. The correct booking record should be displayed with all associated details including film, screening, seats and food order.</w:t>
+      </w:r>
+    </w:p>
+    <w:p>
+      <w:pPr>
+        <w:tabs>
+          <w:tab w:val="num" w:pos="1440"/>
+        </w:tabs>
+      </w:pPr>
+      <w:r>
+        <w:rPr>
+          <w:b/>
+          <w:bCs/>
+        </w:rPr>
+        <w:t>Objective 12: The system must allow staff to cancel an existing booking, removing the seat allocation from the database and making those seats available again.</w:t>
+      </w:r>
+    </w:p>
+    <w:p>
+      <w:pPr>
+        <w:tabs>
+          <w:tab w:val="num" w:pos="1440"/>
+        </w:tabs>
+      </w:pPr>
+      <w:r>
+        <w:t xml:space="preserve">Success Criteria: Cancelling a booking should update the database immediately so the seats become available for other customers. A confirmation prompt should be </w:t>
+      </w:r>
+      <w:r>
         <w:lastRenderedPageBreak/>
-        <w:t>Objective 4: The system must allow customers to purchase tickets through a self-service kiosk interface, selecting a film, screening time, seats and completing their booking without staff assistance.</w:t>
-      </w:r>
-    </w:p>
-    <w:p>
-      <w:pPr>
-        <w:tabs>
-          <w:tab w:val="num" w:pos="1440"/>
-        </w:tabs>
-      </w:pPr>
-      <w:r>
-        <w:t>Success Criteria: A customer should be able to complete a full ticket booking through the kiosk interface in under 2 minutes. The kiosk should guide the customer through each stage clearly using buttons and on screen instructions. The completed booking should be recorded in the database correctly.</w:t>
-      </w:r>
-    </w:p>
-    <w:p>
-      <w:pPr>
-        <w:tabs>
-          <w:tab w:val="num" w:pos="1440"/>
-        </w:tabs>
-      </w:pPr>
-      <w:r>
-        <w:rPr>
-          <w:b/>
-          <w:bCs/>
-        </w:rPr>
-        <w:t>Objective 5: The system must allow customers to add food and drink items to their order at the same time as booking tickets, with the combined order saved to the database.</w:t>
-      </w:r>
-    </w:p>
-    <w:p>
-      <w:pPr>
-        <w:tabs>
-          <w:tab w:val="num" w:pos="1440"/>
-        </w:tabs>
-      </w:pPr>
-      <w:r>
-        <w:t>Success Criteria: Food and drink items should be displayed on a clearly navigable menu during the booking process. A customer should be able to add multiple items to their order. The food and drink order should be saved to the database linked to the correct booking record.</w:t>
-      </w:r>
-    </w:p>
-    <w:p>
-      <w:pPr>
-        <w:tabs>
-          <w:tab w:val="num" w:pos="1440"/>
-        </w:tabs>
-      </w:pPr>
-      <w:r>
-        <w:rPr>
-          <w:b/>
-          <w:bCs/>
-        </w:rPr>
-        <w:t>Objective 6: The system must allow staff and managers to add new films to the system, including the film title, age rating, duration and description.</w:t>
-      </w:r>
-    </w:p>
-    <w:p>
-      <w:pPr>
-        <w:tabs>
-          <w:tab w:val="num" w:pos="1440"/>
-        </w:tabs>
-      </w:pPr>
-      <w:r>
-        <w:lastRenderedPageBreak/>
-        <w:t>Success Criteria: A new film record should be saved to the database in under 20 seconds with all required fields validated. The film should immediately appear in the list of available films when adding a new screening. Duplicate film titles should be prevented through validation.</w:t>
-      </w:r>
-    </w:p>
-    <w:p>
-      <w:pPr>
-        <w:tabs>
-          <w:tab w:val="num" w:pos="1440"/>
-        </w:tabs>
-      </w:pPr>
-      <w:r>
-        <w:rPr>
-          <w:b/>
-          <w:bCs/>
-        </w:rPr>
-        <w:t>Objective 7: The system must allow staff and managers to add new screenings for existing films, specifying the screen, date, time and ticket price.</w:t>
-      </w:r>
-    </w:p>
-    <w:p>
-      <w:pPr>
-        <w:tabs>
-          <w:tab w:val="num" w:pos="1440"/>
-        </w:tabs>
-      </w:pPr>
-      <w:r>
-        <w:t>Success Criteria: A new screening record should be saved to the database correctly linked to the selected film. The screening should immediately appear in the list of available screenings on the customer kiosk. Validation should prevent a screening being added without a valid date, time, screen and ticket price.</w:t>
-      </w:r>
-    </w:p>
-    <w:p>
-      <w:pPr>
-        <w:tabs>
-          <w:tab w:val="num" w:pos="1440"/>
-        </w:tabs>
-      </w:pPr>
-      <w:r>
-        <w:rPr>
-          <w:b/>
-          <w:bCs/>
-        </w:rPr>
-        <w:t>Objective 8: The system must allow the manager to view a sales report showing total ticket sales and revenue for a selected date range.</w:t>
-      </w:r>
-    </w:p>
-    <w:p>
-      <w:pPr>
-        <w:tabs>
-          <w:tab w:val="num" w:pos="1440"/>
-        </w:tabs>
-      </w:pPr>
-      <w:r>
-        <w:t>Success Criteria: The report should be generated using an SQL query through the OleDb connection and displayed on screen within 5 seconds of the date range being selected. The report should show the correct total number of tickets sold and total revenue for the selected period, calculated directly from the bookings in the database.</w:t>
-      </w:r>
-    </w:p>
-    <w:p>
-      <w:pPr>
-        <w:tabs>
-          <w:tab w:val="num" w:pos="1440"/>
-        </w:tabs>
-      </w:pPr>
-      <w:r>
-        <w:rPr>
-          <w:b/>
-          <w:bCs/>
-        </w:rPr>
-        <w:lastRenderedPageBreak/>
-        <w:t>Objective 9: The system must allow the manager to view a list of all bookings for a selected screening, showing customer names, seat numbers and the number of tickets booked.</w:t>
-      </w:r>
-    </w:p>
-    <w:p>
-      <w:pPr>
-        <w:tabs>
-          <w:tab w:val="num" w:pos="1440"/>
-        </w:tabs>
-      </w:pPr>
-      <w:r>
-        <w:t>Success Criteria: The booking list should load within 3 seconds of a screening being selected. All bookings for that screening should be displayed accurately. The list should be printable or exportable for use as a physical register.</w:t>
-      </w:r>
-    </w:p>
-    <w:p>
-      <w:pPr>
-        <w:tabs>
-          <w:tab w:val="num" w:pos="1440"/>
-        </w:tabs>
-      </w:pPr>
-      <w:r>
-        <w:rPr>
-          <w:b/>
-          <w:bCs/>
-        </w:rPr>
-        <w:t>Objective 10: The system must enforce access levels so that customers using the kiosk can only access booking functions, whilst staff can access management functions and managers can access all areas of the system.</w:t>
-      </w:r>
-    </w:p>
-    <w:p>
-      <w:pPr>
-        <w:tabs>
-          <w:tab w:val="num" w:pos="1440"/>
-        </w:tabs>
-      </w:pPr>
-      <w:r>
-        <w:t>Success Criteria: The kiosk interface should not display any staff or manager options. Staff should be able to log in with a username and password and access staff functions only. The manager login should provide access to all areas of the system. Attempting to access a restricted area without the correct login should be prevented.</w:t>
-      </w:r>
-    </w:p>
-    <w:p>
-      <w:pPr>
-        <w:tabs>
-          <w:tab w:val="num" w:pos="1440"/>
-        </w:tabs>
-      </w:pPr>
-      <w:r>
-        <w:rPr>
-          <w:b/>
-          <w:bCs/>
-        </w:rPr>
-        <w:t>Objective 11: The system must allow staff to search for an existing booking by customer name or booking reference.</w:t>
-      </w:r>
-    </w:p>
-    <w:p>
-      <w:pPr>
-        <w:tabs>
-          <w:tab w:val="num" w:pos="1440"/>
-        </w:tabs>
-      </w:pPr>
-      <w:r>
-        <w:t>Success Criteria: A search by customer surname should return all matching bookings within 2 seconds. The search should work with partial name entries. The correct booking record should be displayed with all associated details including film, screening, seats and food order.</w:t>
-      </w:r>
-    </w:p>
-    <w:p>
-      <w:pPr>
-        <w:tabs>
-          <w:tab w:val="num" w:pos="1440"/>
-        </w:tabs>
-      </w:pPr>
-      <w:r>
-        <w:rPr>
-          <w:b/>
-          <w:bCs/>
-        </w:rPr>
-        <w:lastRenderedPageBreak/>
-        <w:t>Objective 12: The system must allow staff to cancel an existing booking, removing the seat allocation from the database and making those seats available again.</w:t>
-      </w:r>
-    </w:p>
-    <w:p>
-      <w:pPr>
-        <w:tabs>
-          <w:tab w:val="num" w:pos="1440"/>
-        </w:tabs>
-      </w:pPr>
-      <w:r>
-        <w:t>Success Criteria: Cancelling a booking should update the database immediately so the seats become available for other customers. A confirmation prompt should be displayed before any booking is deleted. The cancelled booking should no longer appear in the active bookings list.</w:t>
+        <w:t>displayed before any booking is deleted. The cancelled booking should no longer appear in the active bookings list.</w:t>
       </w:r>
     </w:p>
     <w:p>
@@ -3886,7 +4051,6 @@
         </w:tabs>
       </w:pPr>
       <w:r>
-        <w:lastRenderedPageBreak/>
         <w:t>Success Criteria: All forms should use the same colour scheme, font and button placement. Navigation buttons should appear in consistent positions across all forms. The system should look professional and be immediately recognisable as a Filmtopia branded application.</w:t>
       </w:r>
     </w:p>
@@ -3929,7 +4093,7 @@
       <w:footerReference w:type="default" r:id="rId18"/>
       <w:headerReference w:type="first" r:id="rId19"/>
       <w:footerReference w:type="first" r:id="rId20"/>
-      <w:pgSz w:w="16838" w:h="11906" w:orient="landscape"/>
+      <w:pgSz w:w="11906" w:h="16838"/>
       <w:pgMar w:top="1440" w:right="1440" w:bottom="1440" w:left="1440" w:header="708" w:footer="708" w:gutter="0"/>
       <w:cols w:space="708"/>
       <w:docGrid w:linePitch="360"/>
@@ -3943,7 +4107,7 @@
   <w:endnote w:type="separator" w:id="-1">
     <w:p>
       <w:pPr>
-        <w:spacing w:after="0" w:line="240" w:lineRule="auto"/>
+        <w:spacing w:after="0"/>
       </w:pPr>
       <w:r>
         <w:separator/>
@@ -3953,7 +4117,7 @@
   <w:endnote w:type="continuationSeparator" w:id="0">
     <w:p>
       <w:pPr>
-        <w:spacing w:after="0" w:line="240" w:lineRule="auto"/>
+        <w:spacing w:after="0"/>
       </w:pPr>
       <w:r>
         <w:continuationSeparator/>
@@ -3998,7 +4162,7 @@
   <w:footnote w:type="separator" w:id="-1">
     <w:p>
       <w:pPr>
-        <w:spacing w:after="0" w:line="240" w:lineRule="auto"/>
+        <w:spacing w:after="0"/>
       </w:pPr>
       <w:r>
         <w:separator/>
@@ -4008,7 +4172,7 @@
   <w:footnote w:type="continuationSeparator" w:id="0">
     <w:p>
       <w:pPr>
-        <w:spacing w:after="0" w:line="240" w:lineRule="auto"/>
+        <w:spacing w:after="0"/>
       </w:pPr>
       <w:r>
         <w:continuationSeparator/>
@@ -4042,6 +4206,7 @@
           <w:docPartUnique/>
         </w:docPartObj>
       </w:sdtPr>
+      <w:sdtEndPr/>
       <w:sdtContent>
         <w:r>
           <w:pict w14:anchorId="2D6D8023">
@@ -4086,8 +4251,12 @@
           <w:docPartUnique/>
         </w:docPartObj>
       </w:sdtPr>
+      <w:sdtEndPr/>
       <w:sdtContent>
         <w:r>
+          <w:rPr>
+            <w:noProof/>
+          </w:rPr>
           <mc:AlternateContent>
             <mc:Choice Requires="wps">
               <w:drawing>
@@ -4101,7 +4270,7 @@
                     </mc:Choice>
                     <mc:Fallback>
                       <wp:positionH relativeFrom="page">
-                        <wp:posOffset>8004810</wp:posOffset>
+                        <wp:posOffset>5499100</wp:posOffset>
                       </wp:positionH>
                     </mc:Fallback>
                   </mc:AlternateContent>
@@ -4746,7 +4915,7 @@
     </w:rPrDefault>
     <w:pPrDefault>
       <w:pPr>
-        <w:spacing w:after="160" w:line="480" w:lineRule="auto"/>
+        <w:spacing w:after="80"/>
       </w:pPr>
     </w:pPrDefault>
   </w:docDefaults>
@@ -5143,7 +5312,7 @@
     <w:pPr>
       <w:keepNext/>
       <w:keepLines/>
-      <w:spacing w:before="360" w:after="80"/>
+      <w:spacing w:before="360"/>
       <w:outlineLvl w:val="0"/>
     </w:pPr>
     <w:rPr>
@@ -5166,7 +5335,7 @@
     <w:pPr>
       <w:keepNext/>
       <w:keepLines/>
-      <w:spacing w:before="160" w:after="80"/>
+      <w:spacing w:before="160"/>
       <w:outlineLvl w:val="1"/>
     </w:pPr>
     <w:rPr>
@@ -5189,7 +5358,7 @@
     <w:pPr>
       <w:keepNext/>
       <w:keepLines/>
-      <w:spacing w:before="160" w:after="80"/>
+      <w:spacing w:before="160"/>
       <w:outlineLvl w:val="2"/>
     </w:pPr>
     <w:rPr>
@@ -5334,6 +5503,7 @@
   <w:style w:type="character" w:default="1" w:styleId="DefaultParagraphFont">
     <w:name w:val="Default Paragraph Font"/>
     <w:uiPriority w:val="1"/>
+    <w:semiHidden/>
     <w:unhideWhenUsed/>
   </w:style>
   <w:style w:type="table" w:default="1" w:styleId="TableNormal">
@@ -5485,7 +5655,6 @@
     <w:qFormat/>
     <w:rsid w:val="007808C9"/>
     <w:pPr>
-      <w:spacing w:after="80" w:line="240" w:lineRule="auto"/>
       <w:contextualSpacing/>
     </w:pPr>
     <w:rPr>
@@ -5653,7 +5822,7 @@
     <w:uiPriority w:val="39"/>
     <w:rsid w:val="006B6E9E"/>
     <w:pPr>
-      <w:spacing w:after="0" w:line="240" w:lineRule="auto"/>
+      <w:spacing w:after="0"/>
     </w:pPr>
     <w:tblPr>
       <w:tblBorders>
@@ -5671,7 +5840,7 @@
     <w:basedOn w:val="Normal"/>
     <w:rsid w:val="00FD5B77"/>
     <w:pPr>
-      <w:spacing w:before="100" w:beforeAutospacing="1" w:after="100" w:afterAutospacing="1" w:line="240" w:lineRule="auto"/>
+      <w:spacing w:before="100" w:beforeAutospacing="1" w:after="100" w:afterAutospacing="1"/>
     </w:pPr>
     <w:rPr>
       <w:rFonts w:ascii="Times New Roman" w:eastAsia="Times New Roman" w:hAnsi="Times New Roman" w:cs="Times New Roman"/>
@@ -5714,7 +5883,7 @@
         <w:tab w:val="center" w:pos="4680"/>
         <w:tab w:val="right" w:pos="9360"/>
       </w:tabs>
-      <w:spacing w:after="0" w:line="240" w:lineRule="auto"/>
+      <w:spacing w:after="0"/>
     </w:pPr>
   </w:style>
   <w:style w:type="character" w:customStyle="1" w:styleId="HeaderChar">
@@ -5736,7 +5905,7 @@
         <w:tab w:val="center" w:pos="4680"/>
         <w:tab w:val="right" w:pos="9360"/>
       </w:tabs>
-      <w:spacing w:after="0" w:line="240" w:lineRule="auto"/>
+      <w:spacing w:after="0"/>
     </w:pPr>
   </w:style>
   <w:style w:type="character" w:customStyle="1" w:styleId="FooterChar">
@@ -5751,9 +5920,9 @@
     <w:link w:val="NoSpacingChar"/>
     <w:uiPriority w:val="1"/>
     <w:qFormat/>
-    <w:rsid w:val="001354D4"/>
+    <w:rsid w:val="00E36065"/>
     <w:pPr>
-      <w:spacing w:after="0" w:line="240" w:lineRule="auto"/>
+      <w:spacing w:after="0"/>
     </w:pPr>
     <w:rPr>
       <w:rFonts w:eastAsiaTheme="minorEastAsia"/>
@@ -5769,7 +5938,7 @@
     <w:basedOn w:val="DefaultParagraphFont"/>
     <w:link w:val="NoSpacing"/>
     <w:uiPriority w:val="1"/>
-    <w:rsid w:val="001354D4"/>
+    <w:rsid w:val="00E36065"/>
     <w:rPr>
       <w:rFonts w:eastAsiaTheme="minorEastAsia"/>
       <w:kern w:val="0"/>

</xml_diff>

<commit_message>
more stuff added on inv document, may have figured out an idea for how the forms should play out now
</commit_message>
<xml_diff>
--- a/Investigation.docx
+++ b/Investigation.docx
@@ -12,6 +12,7 @@
           <w:szCs w:val="72"/>
         </w:rPr>
       </w:pPr>
+      <w:proofErr w:type="spellStart"/>
       <w:r>
         <w:rPr>
           <w:b/>
@@ -19,7 +20,17 @@
           <w:sz w:val="72"/>
           <w:szCs w:val="72"/>
         </w:rPr>
-        <w:t>Filmtopia Project Investigation</w:t>
+        <w:t>Filmtopia</w:t>
+      </w:r>
+      <w:proofErr w:type="spellEnd"/>
+      <w:r>
+        <w:rPr>
+          <w:b/>
+          <w:bCs/>
+          <w:sz w:val="72"/>
+          <w:szCs w:val="72"/>
+        </w:rPr>
+        <w:t xml:space="preserve"> Project Investigation</w:t>
       </w:r>
     </w:p>
     <w:p>
@@ -43,45 +54,34 @@
       </w:r>
     </w:p>
     <w:p>
-      <w:r>
-        <w:t xml:space="preserve">Filmtopia is a small independent cinema theatre who is currently managing all </w:t>
-      </w:r>
-      <w:r>
-        <w:t xml:space="preserve">business data using spreadsheets and paper. They </w:t>
-      </w:r>
-      <w:r>
-        <w:t xml:space="preserve">sell food drinks and tickets using a variety of means such as a touchscreen kiosk which can only handle food and drinks </w:t>
-      </w:r>
-      <w:r>
-        <w:t>and a concessions area where employees handle the business.</w:t>
-      </w:r>
-      <w:r>
-        <w:t xml:space="preserve"> The management of filmtopia has </w:t>
-      </w:r>
-      <w:r>
-        <w:t>come</w:t>
-      </w:r>
-      <w:r>
-        <w:t xml:space="preserve"> to notice that they are falling back on managing and analysing the cinema, this means keeping track of sales records, </w:t>
-      </w:r>
-      <w:r>
-        <w:t xml:space="preserve">screening analytics and a customer interest evaluation. </w:t>
-      </w:r>
-      <w:r>
-        <w:t xml:space="preserve">I am now going to investigate further on how filmtopia functions </w:t>
-      </w:r>
-      <w:r>
-        <w:t>to</w:t>
-      </w:r>
-      <w:r>
-        <w:t xml:space="preserve"> get a better understanding of how I should </w:t>
-      </w:r>
-      <w:r>
-        <w:t>move with this project.</w:t>
-      </w:r>
-    </w:p>
-    <w:p>
-      <w:pPr>
+      <w:proofErr w:type="spellStart"/>
+      <w:r>
+        <w:t>Filmtopia</w:t>
+      </w:r>
+      <w:proofErr w:type="spellEnd"/>
+      <w:r>
+        <w:t xml:space="preserve"> is a small independent cinema theatre who is currently managing all business data using spreadsheets and paper. They sell food drinks and tickets using a variety of means such as a touchscreen kiosk which can only handle food and drinks and a concessions area where employees handle the business. The management of </w:t>
+      </w:r>
+      <w:proofErr w:type="spellStart"/>
+      <w:r>
+        <w:t>filmtopia</w:t>
+      </w:r>
+      <w:proofErr w:type="spellEnd"/>
+      <w:r>
+        <w:t xml:space="preserve"> has come to notice that they are falling back on managing and analysing the cinema, this means keeping track of sales records, screening analytics and a customer interest evaluation. I am now going to investigate further on how </w:t>
+      </w:r>
+      <w:proofErr w:type="spellStart"/>
+      <w:r>
+        <w:t>filmtopia</w:t>
+      </w:r>
+      <w:proofErr w:type="spellEnd"/>
+      <w:r>
+        <w:t xml:space="preserve"> functions to get a better understanding of how I should move with this project.</w:t>
+      </w:r>
+    </w:p>
+    <w:p>
+      <w:pPr>
+        <w:spacing w:after="80"/>
         <w:jc w:val="center"/>
         <w:rPr>
           <w:b/>
@@ -101,129 +101,131 @@
       </w:r>
     </w:p>
     <w:p>
-      <w:r>
-        <w:t>Before any meaningful investigation can take place it is important to identify all of the stakeholders involved with the existing Filmtopia system and the proposed new solution. A stakeholder is any individual, group or organisation that has an interest in the system, will be affected by changes to it or has the power to influence how the system is developed and used. Identifying stakeholders early in the investigation process helps to ensure that the requirements gathered from interviews, questionnaires and observation cover every perspective rather than focusing on a single group. It also helps to highlight competing or conflicting requirements at an early stage, which can then be balanced or prioritised during the design phase.</w:t>
-      </w:r>
-    </w:p>
-    <w:p>
-      <w:r>
-        <w:t>The stakeholders for the Filmtopia system have been categorised into primary, secondary and tertiary groups. Primary stakeholders are those who will use the system directly on a daily basis. Secondary stakeholders are those who interact with the system indirectly or whose work is affected by the system without them necessarily using it. Tertiary stakeholders are external parties who do not interact with the system directly but whose interests are nonetheless relevant to its design and operation.</w:t>
-      </w:r>
-    </w:p>
-    <w:p>
-      <w:r>
-        <w:rPr>
-          <w:b/>
-          <w:bCs/>
-        </w:rPr>
-        <w:t>Primary Stakeholders</w:t>
-      </w:r>
-    </w:p>
-    <w:p>
-      <w:r>
-        <w:t xml:space="preserve">The first primary stakeholder is the cinema manager, </w:t>
-      </w:r>
-      <w:r>
-        <w:rPr>
-          <w:b/>
-          <w:bCs/>
-        </w:rPr>
-        <w:t>Sarah Henshaw</w:t>
-      </w:r>
-      <w:r>
-        <w:t>. As the person who commissioned this project Sarah has the highest level of influence over the requirements of the system. She will be the main user of the management functions including adding films, scheduling screenings, viewing sales reports and managing access for other users. Sarah's primary interests are in operational efficiency, accurate reporting, reduced customer complaints and the long term reliability of the system. She has indicated in her interview that ease of use is critical because the cinema operates with a small team and cannot afford lengthy training sessions for new staff. Her level of technical confidence is moderate, meaning the system must be intuitive enough that she can use it without specialist knowledge.</w:t>
-      </w:r>
-    </w:p>
-    <w:p>
-      <w:r>
-        <w:t xml:space="preserve">The second primary stakeholder is the box office staff. This group includes </w:t>
-      </w:r>
-      <w:r>
-        <w:rPr>
-          <w:b/>
-          <w:bCs/>
-        </w:rPr>
-        <w:t>Jake Pemberton</w:t>
-      </w:r>
-      <w:r>
-        <w:t xml:space="preserve"> and other members of the team who handle ticket sales and customer enquiries on a day to day basis. Their interests focus on speed of operation during busy periods, clarity of the user interface, accuracy of seat allocation and the elimination of awkward situations caused by double bookings. Staff members have varying levels of </w:t>
+      <w:pPr>
+        <w:spacing w:after="80"/>
+      </w:pPr>
+      <w:r>
+        <w:t>Before beginning the investigation it is important to identify who the stakeholders are for this project. A stakeholder is any individual or group who has an interest in the system, will be affected by it or has the power to influence how it is developed. Identifying stakeholders early on ensures that the requirements gathered throughout the investigation reflect the needs of everyone involved rather than just one person.</w:t>
+      </w:r>
+    </w:p>
+    <w:p>
+      <w:pPr>
+        <w:spacing w:after="80"/>
+      </w:pPr>
+      <w:r>
+        <w:t xml:space="preserve">For the </w:t>
+      </w:r>
+      <w:proofErr w:type="spellStart"/>
+      <w:r>
+        <w:t>Filmtopia</w:t>
+      </w:r>
+      <w:proofErr w:type="spellEnd"/>
+      <w:r>
+        <w:t xml:space="preserve"> system the stakeholders can be split into two groups, primary and secondary. Primary stakeholders are those who will interact with the system directly on a regular basis. Secondary stakeholders are those who are affected by the system indirectly or whose work is influenced by it without them necessarily using it themselves.</w:t>
+      </w:r>
+    </w:p>
+    <w:p>
+      <w:pPr>
+        <w:spacing w:after="80"/>
+      </w:pPr>
+      <w:r>
+        <w:t>Starting with the primary stakeholders, the most important of these is the cinema manager Sarah Henshaw. As the person who commissioned this project she has the highest level of influence over what the system needs to do. She will use the management side of the system on a daily basis, for example adding new films, scheduling screenings and viewing sales reports. Her main priorities are operational efficiency, accurate reporting and a reduction in the customer complaints that are currently caused by the manual booking process. She has described herself as tech aware but not highly technical which means the system needs to be intuitive enough to use without specialist knowledge or extensive training.</w:t>
+      </w:r>
+    </w:p>
+    <w:p>
+      <w:pPr>
+        <w:spacing w:after="80"/>
+      </w:pPr>
+      <w:r>
+        <w:t>The next primary stakeholder group is the box office staff. These are the people who handle ticket sales and customer enquiries on a day to day basis and who will use the booking interface most frequently. Their priorities are speed and simplicity. During busy periods a member of staff cannot afford to spend several minutes navigating a complicated interface to add a single booking. The system therefore needs to be designed with efficiency in mind so that even a brand new member of staff could use it confidently with minimal training.</w:t>
+      </w:r>
+    </w:p>
+    <w:p>
+      <w:pPr>
+        <w:spacing w:after="80"/>
+      </w:pPr>
+      <w:r>
+        <w:t xml:space="preserve">The third primary stakeholder is the customer base of </w:t>
+      </w:r>
+      <w:proofErr w:type="spellStart"/>
+      <w:r>
+        <w:t>Filmtopia</w:t>
+      </w:r>
+      <w:proofErr w:type="spellEnd"/>
+      <w:r>
+        <w:t xml:space="preserve">. Customers interact with the system either directly through the proposed </w:t>
+      </w:r>
+      <w:proofErr w:type="spellStart"/>
+      <w:r>
+        <w:t>self service</w:t>
+      </w:r>
+      <w:proofErr w:type="spellEnd"/>
+      <w:r>
+        <w:t xml:space="preserve"> kiosk or indirectly when staff process their bookings on their behalf. Their main interests are convenience, short queue times and the assurance that the seat they have been allocated will actually be available when they arrive. The questionnaire results discussed later in this investigation show that a large majority of customers would prefer </w:t>
+      </w:r>
+      <w:proofErr w:type="spellStart"/>
+      <w:r>
+        <w:t>self service</w:t>
+      </w:r>
+      <w:proofErr w:type="spellEnd"/>
+      <w:r>
+        <w:t xml:space="preserve"> ticketing and that seat selection is considered important by most respondents. This means the bar for </w:t>
       </w:r>
       <w:r>
         <w:lastRenderedPageBreak/>
-        <w:t>technical confidence and the system must therefore cater to the lowest common denominator in terms of usability. The booking interface must be designed so that even a brand new member of staff can complete a transaction quickly with minimal training.</w:t>
-      </w:r>
-    </w:p>
-    <w:p>
-      <w:r>
-        <w:t>The third primary stakeholder is the customer base of Filmtopia. Customers interact with the system either directly through the proposed self service kiosk or indirectly when staff use the system to process their bookings. Customer interests centre on convenience, transparency, accurate seat allocation, short queue times and the ability to combine ticket and food purchases into a single transaction. The questionnaire results discussed later in this investigation confirm that 85% of customers would prefer self service ticketing, 85% find specific seat selection important and 80% would value combined food and ticket ordering. These figures indicate that customer expectations are aligned with the proposed solution but also raise the bar for how polished and reliable the kiosk interface needs to be.</w:t>
-      </w:r>
-    </w:p>
-    <w:p>
-      <w:r>
-        <w:rPr>
-          <w:b/>
-          <w:bCs/>
-        </w:rPr>
-        <w:t>Secondary Stakeholders</w:t>
-      </w:r>
-    </w:p>
-    <w:p>
-      <w:r>
-        <w:t>The first secondary stakeholder is the concessions team. While the concessions staff do not currently use the existing booking system, the proposed Filmtopia system will integrate food and drink orders with ticket bookings. This means orders placed through the kiosk or by box office staff will need to be visible to the concessions team in some way. Their interest is in receiving accurate, legible orders in a timely manner so that they can prepare food correctly and deliver it to the right customer or seat. The current handwritten note system has been criticised by Jake Pemberton as disjointed and prone to error.</w:t>
-      </w:r>
-    </w:p>
-    <w:p>
-      <w:r>
-        <w:t>The second secondary stakeholder is the cleaning and maintenance team. Although they will not use the booking system directly, their schedules are influenced by the cinema's screening times and customer footfall. Accurate sales reports and screening schedules generated by the new system could in future inform their work patterns more efficiently. Their interest in this project is therefore indirect but real.</w:t>
-      </w:r>
-    </w:p>
-    <w:p>
-      <w:r>
-        <w:t>The third secondary stakeholder is the IT support function for the cinema. Filmtopia is a small business and currently has no dedicated IT staff, with technical issues handled by Sarah herself or by an external contractor on an ad hoc basis. The proposed system must therefore be designed in a way that is robust, well documented and easy to maintain without specialist intervention. Backup procedures, error handling and data integrity safeguards must all be considered with this stakeholder in mind.</w:t>
-      </w:r>
-    </w:p>
-    <w:p>
-      <w:r>
-        <w:rPr>
-          <w:b/>
-          <w:bCs/>
-        </w:rPr>
-        <w:t>Tertiary Stakeholders</w:t>
-      </w:r>
-    </w:p>
-    <w:p>
-      <w:r>
-        <w:t>The first tertiary stakeholder is the group of film distributors who supply Filmtopia with the rights to screen particular films. Although distributors do not interact with the cinema management system directly, they are relevant because the system will store information about which films are being shown, on what dates and at what prices. This data may in future be used to fulfil reporting obligations to distributors regarding ticket sales for their films. The system therefore needs to be capable of producing accurate, exportable reports.</w:t>
-      </w:r>
-    </w:p>
-    <w:p>
-      <w:r>
-        <w:t xml:space="preserve">The second tertiary stakeholder is HMRC and other regulatory bodies. As Filmtopia is a registered UK business it is required to keep accurate financial records for tax purposes. The new system, by virtue of recording every booking and food order with a timestamp and price, will form part of that financial record. This places a quiet but important </w:t>
-      </w:r>
-      <w:r>
-        <w:lastRenderedPageBreak/>
-        <w:t>constraint on the system, namely that historical records must not be deletable or alterable after the fact in a way that would compromise audit trails.</w:t>
-      </w:r>
-    </w:p>
-    <w:p>
-      <w:r>
-        <w:t>The third tertiary stakeholder is competing cinemas in the local area, particularly Vue and Odeon at the Trafford Centre. While these cinemas have no direct involvement with Filmtopia, their existing booking systems set customer expectations for what a cinema booking experience should look like. The desk based research conducted later in this investigation directly compares Filmtopia's proposed system against these competitors to ensure the new system meets or exceeds modern industry standards.</w:t>
-      </w:r>
-    </w:p>
-    <w:p>
-      <w:r>
-        <w:rPr>
-          <w:b/>
-          <w:bCs/>
-        </w:rPr>
-        <w:t>Conclusion of Stakeholder Analysis</w:t>
-      </w:r>
-    </w:p>
-    <w:p>
-      <w:r>
-        <w:t>The stakeholder analysis above demonstrates that the Filmtopia system is not simply a tool for the cinema manager but a piece of infrastructure that touches a wide range of internal and external parties. The investigation that follows has been designed with this in mind, drawing primary insights from interviews with the manager and a staff member, supplemented by a customer questionnaire, direct observation and desk based research into competing systems. By approaching the investigation in this layered way the resulting requirements specification reflects the realities of how Filmtopia actually operates rather than just the wishes of any single individual</w:t>
-      </w:r>
-    </w:p>
+        <w:t>the kiosk interface is high and it needs to be clean and simple enough for any customer to use without assistance.</w:t>
+      </w:r>
+    </w:p>
+    <w:p>
+      <w:pPr>
+        <w:spacing w:after="80"/>
+      </w:pPr>
+      <w:r>
+        <w:t>Moving on to the secondary stakeholders, the concessions team is worth considering here. Although they do not use the booking system directly the proposed solution will integrate food and drink ordering with ticket purchases which means orders placed through the kiosk will need to reach the concessions team accurately and in a timely manner. The current system of passing handwritten notes is described by staff as disjointed and prone to error so the new system needs to address this.</w:t>
+      </w:r>
+    </w:p>
+    <w:p>
+      <w:pPr>
+        <w:spacing w:after="80"/>
+      </w:pPr>
+      <w:r>
+        <w:t xml:space="preserve">Another secondary stakeholder is any external IT support that </w:t>
+      </w:r>
+      <w:proofErr w:type="spellStart"/>
+      <w:r>
+        <w:t>Filmtopia</w:t>
+      </w:r>
+      <w:proofErr w:type="spellEnd"/>
+      <w:r>
+        <w:t xml:space="preserve"> uses. As a small independent cinema there is no dedicated IT department meaning the system must be robust and straightforward to maintain. Complex setups that require specialist knowledge to troubleshoot would be impractical for a business of this size.</w:t>
+      </w:r>
+    </w:p>
+    <w:p>
+      <w:pPr>
+        <w:spacing w:after="80"/>
+      </w:pPr>
+      <w:r>
+        <w:t>Finally it is worth briefly noting the tertiary stakeholders. Film distributors have an indirect interest in the system because accurate sales data for their titles may need to be reported back to them. HMRC and other regulatory bodies also have an indirect interest given that the system will record financial transactions which form part of the cinema's business records. These stakeholders do not influence the day to day design of the system but they do place constraints on it, particularly around data accuracy and record keeping.</w:t>
+      </w:r>
+    </w:p>
+    <w:p>
+      <w:pPr>
+        <w:spacing w:after="80"/>
+      </w:pPr>
+      <w:r>
+        <w:t xml:space="preserve">In summary the stakeholder analysis makes clear that the </w:t>
+      </w:r>
+      <w:proofErr w:type="spellStart"/>
+      <w:r>
+        <w:t>Filmtopia</w:t>
+      </w:r>
+      <w:proofErr w:type="spellEnd"/>
+      <w:r>
+        <w:t xml:space="preserve"> system needs to serve a wide range of users with different levels of technical confidence and different priorities. The investigation that follows has been designed to gather requirements from as many of these stakeholders as possible to ensure the final system genuinely reflects the needs of everyone who will be affected by it.</w:t>
+      </w:r>
+    </w:p>
+    <w:p/>
+    <w:p/>
     <w:p/>
     <w:p>
       <w:pPr>
@@ -255,10 +257,10 @@
         <w:tblLook w:val="04A0" w:firstRow="1" w:lastRow="0" w:firstColumn="1" w:lastColumn="0" w:noHBand="0" w:noVBand="1"/>
       </w:tblPr>
       <w:tblGrid>
-        <w:gridCol w:w="2371"/>
-        <w:gridCol w:w="2011"/>
-        <w:gridCol w:w="2317"/>
-        <w:gridCol w:w="2317"/>
+        <w:gridCol w:w="2696"/>
+        <w:gridCol w:w="2442"/>
+        <w:gridCol w:w="2659"/>
+        <w:gridCol w:w="2659"/>
       </w:tblGrid>
       <w:tr>
         <w:tc>
@@ -567,6 +569,7 @@
                 <w:b/>
                 <w:bCs/>
               </w:rPr>
+              <w:lastRenderedPageBreak/>
               <w:t xml:space="preserve">Customer questionnaire analysis </w:t>
             </w:r>
           </w:p>
@@ -596,9 +599,53 @@
             <w:tcW w:w="3487" w:type="dxa"/>
           </w:tcPr>
           <w:p>
-            <w:r>
-              <w:t xml:space="preserve"> Summarise and interpret questionnaire responses</w:t>
-            </w:r>
+            <w:pPr>
+              <w:rPr>
+                <w:lang w:val="fr-FR"/>
+              </w:rPr>
+            </w:pPr>
+            <w:r>
+              <w:rPr>
+                <w:lang w:val="fr-FR"/>
+              </w:rPr>
+              <w:t xml:space="preserve"> </w:t>
+            </w:r>
+            <w:proofErr w:type="spellStart"/>
+            <w:r>
+              <w:rPr>
+                <w:lang w:val="fr-FR"/>
+              </w:rPr>
+              <w:t>Summarise</w:t>
+            </w:r>
+            <w:proofErr w:type="spellEnd"/>
+            <w:r>
+              <w:rPr>
+                <w:lang w:val="fr-FR"/>
+              </w:rPr>
+              <w:t xml:space="preserve"> and </w:t>
+            </w:r>
+            <w:proofErr w:type="spellStart"/>
+            <w:r>
+              <w:rPr>
+                <w:lang w:val="fr-FR"/>
+              </w:rPr>
+              <w:t>interpret</w:t>
+            </w:r>
+            <w:proofErr w:type="spellEnd"/>
+            <w:r>
+              <w:rPr>
+                <w:lang w:val="fr-FR"/>
+              </w:rPr>
+              <w:t xml:space="preserve"> questionnaire </w:t>
+            </w:r>
+            <w:proofErr w:type="spellStart"/>
+            <w:r>
+              <w:rPr>
+                <w:lang w:val="fr-FR"/>
+              </w:rPr>
+              <w:t>responses</w:t>
+            </w:r>
+            <w:proofErr w:type="spellEnd"/>
           </w:p>
         </w:tc>
       </w:tr>
@@ -649,11 +696,7 @@
           </w:tcPr>
           <w:p>
             <w:r>
-              <w:t xml:space="preserve"> Observe box office operations during a </w:t>
-            </w:r>
-            <w:r>
-              <w:lastRenderedPageBreak/>
-              <w:t>live evening screening</w:t>
+              <w:t xml:space="preserve"> Observe box office operations during a live evening screening</w:t>
             </w:r>
           </w:p>
         </w:tc>
@@ -675,7 +718,6 @@
                 <w:b/>
                 <w:bCs/>
               </w:rPr>
-              <w:lastRenderedPageBreak/>
               <w:t xml:space="preserve">Desk based research — Vue Cinema (myvue.com) </w:t>
             </w:r>
           </w:p>
@@ -1029,6 +1071,7 @@
         <w:tabs>
           <w:tab w:val="num" w:pos="1440"/>
         </w:tabs>
+        <w:spacing w:after="80"/>
         <w:jc w:val="center"/>
         <w:rPr>
           <w:b/>
@@ -1037,79 +1080,166 @@
           <w:szCs w:val="36"/>
         </w:rPr>
       </w:pPr>
-    </w:p>
-    <w:p>
-      <w:pPr>
-        <w:tabs>
-          <w:tab w:val="num" w:pos="1440"/>
-        </w:tabs>
-        <w:jc w:val="center"/>
+      <w:r>
         <w:rPr>
           <w:b/>
           <w:bCs/>
           <w:sz w:val="36"/>
           <w:szCs w:val="36"/>
         </w:rPr>
-      </w:pPr>
-      <w:r>
+        <w:t>Methodology for investigating</w:t>
+      </w:r>
+    </w:p>
+    <w:p>
+      <w:pPr>
+        <w:tabs>
+          <w:tab w:val="num" w:pos="1440"/>
+        </w:tabs>
+        <w:spacing w:after="80"/>
+      </w:pPr>
+      <w:r>
+        <w:t>Before carrying out the investigation it is important to think carefully about which methods to use to gather information. Different methods have different strengths and weaknesses and relying on just one would not give a complete enough picture of the existing system or what the new one needs to do. For this investigation four methods were chosen: face-to-face interviews, a customer questionnaire, direct observation and desk based research.</w:t>
+      </w:r>
+    </w:p>
+    <w:p>
+      <w:pPr>
+        <w:tabs>
+          <w:tab w:val="num" w:pos="1440"/>
+        </w:tabs>
+        <w:spacing w:after="80"/>
+      </w:pPr>
+      <w:r>
+        <w:t xml:space="preserve">Starting with interviews, these were chosen as the main method for gathering requirements from the key stakeholders. The reason for this is that an interview allows open ended questions to be asked and the conversation can naturally go in directions that were not planned in advance. This is important because some of the most useful information gathered during an investigation comes from things that the person being interviewed mentions without being directly asked. A written survey would not allow for this kind of flexibility. The limitation of interviews however is that they are time consuming and the quality of what comes out of them depends heavily on how well the questions are prepared. To address this the questions were written in advance and kept open ended to avoid leading the person being interviewed towards a particular answer. Two interviews were conducted for this </w:t>
+      </w:r>
+      <w:r>
+        <w:lastRenderedPageBreak/>
+        <w:t>investigation, one with the cinema manager and one with a member of the box office staff, as these two stakeholders gave the most complete view of how the existing system operates day to day.</w:t>
+      </w:r>
+    </w:p>
+    <w:p>
+      <w:pPr>
+        <w:tabs>
+          <w:tab w:val="num" w:pos="1440"/>
+        </w:tabs>
+        <w:spacing w:after="80"/>
+      </w:pPr>
+      <w:r>
+        <w:t xml:space="preserve">Moving on to the customer questionnaire, this was chosen because it allowed a much larger group of stakeholders to contribute to the investigation than would have been possible through interviews alone. Interviewing every customer individually would not be realistic, so a questionnaire was the most practical way to gather their views. The key advantage of a questionnaire is that it produces quantitative data which is easier to summarise and use as justification for design decisions. For example knowing that a large majority of customers would prefer a </w:t>
+      </w:r>
+      <w:proofErr w:type="spellStart"/>
+      <w:r>
+        <w:t>self service</w:t>
+      </w:r>
+      <w:proofErr w:type="spellEnd"/>
+      <w:r>
+        <w:t xml:space="preserve"> kiosk is a much stronger argument for including that feature than one person mentioning it in an interview. The limitation of a questionnaire is that the questions are fixed which means there is no opportunity to follow up on responses or ask for more detail. To partially work around this some of the questions included a list of options rather than just a yes or no answer which produced more useful and specific data.</w:t>
+      </w:r>
+    </w:p>
+    <w:p>
+      <w:pPr>
+        <w:tabs>
+          <w:tab w:val="num" w:pos="1440"/>
+        </w:tabs>
+        <w:spacing w:after="80"/>
+      </w:pPr>
+      <w:r>
+        <w:t>Transitioning to direct observation, this was included because interviews and questionnaires rely on people describing the system from memory which is not always accurate. Watching the system being used in real time makes it possible to see problems that the people involved might not even be aware of because they have become used to working around them. The observation was carried out during a busy evening period deliberately, since the existing system's weaknesses are most likely to show up under pressure rather than during a quiet period. The main limitation of observation is the Hawthorne Effect, which is the tendency for people to change their behaviour when they know they are being watched. This was minimised by keeping the observation as low key as possible.</w:t>
+      </w:r>
+    </w:p>
+    <w:p>
+      <w:pPr>
+        <w:tabs>
+          <w:tab w:val="num" w:pos="1440"/>
+        </w:tabs>
+        <w:spacing w:after="80"/>
+      </w:pPr>
+      <w:r>
+        <w:t>Finally, desk based research was used to look at how similar systems are designed in the real world. By researching the booking systems of established cinema chains it is possible to identify features and design patterns that set the standard for what customers already expect. This is useful because stakeholders do not always know what to ask for, particularly if they have not seen what is possible. The limitation of this method is that the systems being researched are built by large commercial teams with significant resources, so not everything observed will be feasible within the scope of this project. The research has therefore been used to inform and inspire the design rather than to copy it directly.</w:t>
+      </w:r>
+    </w:p>
+    <w:p>
+      <w:pPr>
+        <w:tabs>
+          <w:tab w:val="num" w:pos="1440"/>
+        </w:tabs>
+      </w:pPr>
+      <w:r>
+        <w:t>The reason all four methods were used together is that each one compensates for the weaknesses of the others. Interviews provide depth, the questionnaire provides breadth, observation provides real world evidence and desk based research provides industry context. Where the same issue or requirement appears across multiple methods it can be treated with much greater confidence than if it had only come from one source.</w:t>
+      </w:r>
+    </w:p>
+    <w:p>
+      <w:pPr>
+        <w:tabs>
+          <w:tab w:val="num" w:pos="1440"/>
+        </w:tabs>
+      </w:pPr>
+    </w:p>
+    <w:p>
+      <w:pPr>
+        <w:tabs>
+          <w:tab w:val="num" w:pos="1440"/>
+        </w:tabs>
+        <w:jc w:val="center"/>
         <w:rPr>
           <w:b/>
           <w:bCs/>
           <w:sz w:val="36"/>
           <w:szCs w:val="36"/>
         </w:rPr>
+      </w:pPr>
+      <w:r>
+        <w:rPr>
+          <w:b/>
+          <w:bCs/>
+          <w:sz w:val="36"/>
+          <w:szCs w:val="36"/>
+        </w:rPr>
         <w:t>Interviews</w:t>
       </w:r>
     </w:p>
     <w:p>
-      <w:r>
+      <w:pPr>
         <w:rPr>
           <w:rStyle w:val="Strong"/>
+          <w:sz w:val="28"/>
+          <w:szCs w:val="28"/>
+        </w:rPr>
+      </w:pPr>
+      <w:r>
+        <w:rPr>
+          <w:rStyle w:val="Strong"/>
+          <w:sz w:val="28"/>
+          <w:szCs w:val="28"/>
         </w:rPr>
         <w:t>Interview with Sarah Henshaw – Cinema Manager</w:t>
       </w:r>
     </w:p>
-    <w:p>
-      <w:pPr>
-        <w:rPr>
-          <w:i/>
-          <w:iCs/>
-        </w:rPr>
-      </w:pPr>
-      <w:r>
-        <w:rPr>
-          <w:rStyle w:val="Emphasis"/>
-          <w:i w:val="0"/>
-          <w:iCs w:val="0"/>
-        </w:rPr>
-        <w:t>Date of Interview: 14th January 2026</w:t>
-      </w:r>
-      <w:r>
-        <w:rPr>
-          <w:i/>
-          <w:iCs/>
-        </w:rPr>
-        <w:t xml:space="preserve"> </w:t>
-      </w:r>
-      <w:r>
-        <w:rPr>
-          <w:rStyle w:val="Emphasis"/>
-          <w:i w:val="0"/>
-          <w:iCs w:val="0"/>
-        </w:rPr>
-        <w:t>Method: Face-to-face interview conducted at Filmtopia cinema, Bury</w:t>
-      </w:r>
-    </w:p>
+    <w:p/>
     <w:p>
       <w:r>
         <w:rPr>
           <w:rStyle w:val="Strong"/>
         </w:rPr>
-        <w:t>Q: Can you describe how Filmtopia currently manages its ticketing and bookings?</w:t>
-      </w:r>
-    </w:p>
-    <w:p>
-      <w:r>
+        <w:t xml:space="preserve">Q: Can you describe how </w:t>
+      </w:r>
+      <w:proofErr w:type="spellStart"/>
+      <w:r>
+        <w:rPr>
+          <w:rStyle w:val="Strong"/>
+        </w:rPr>
+        <w:t>Filmtopia</w:t>
+      </w:r>
+      <w:proofErr w:type="spellEnd"/>
+      <w:r>
+        <w:rPr>
+          <w:rStyle w:val="Strong"/>
+        </w:rPr>
+        <w:t xml:space="preserve"> currently manages its ticketing and bookings?</w:t>
+      </w:r>
+    </w:p>
+    <w:p>
+      <w:r>
+        <w:lastRenderedPageBreak/>
         <w:t>A: At the moment everything is done manually. When a customer comes in, staff write their booking down in a paper diary. We have a touchscreen kiosk but it can only handle food and drink orders. It cannot sell tickets at all which is a real problem during busy periods because customers have to queue twice.</w:t>
       </w:r>
     </w:p>
@@ -1123,7 +1253,6 @@
     </w:p>
     <w:p>
       <w:r>
-        <w:lastRenderedPageBreak/>
         <w:t>A: Double bookings are a nightmare. Because everything is written on paper, if two members of staff take a booking for the same screening at the same time we do not find out until the customer arrives. We have had some very unhappy customers because of this. Also I have no real way of seeing how well the cinema is doing without physically going through every piece of paper we have.</w:t>
       </w:r>
     </w:p>
@@ -1132,7 +1261,21 @@
         <w:rPr>
           <w:rStyle w:val="Strong"/>
         </w:rPr>
-        <w:t>Q: What data does Filmtopia currently store and how?</w:t>
+        <w:t xml:space="preserve">Q: What data does </w:t>
+      </w:r>
+      <w:proofErr w:type="spellStart"/>
+      <w:r>
+        <w:rPr>
+          <w:rStyle w:val="Strong"/>
+        </w:rPr>
+        <w:t>Filmtopia</w:t>
+      </w:r>
+      <w:proofErr w:type="spellEnd"/>
+      <w:r>
+        <w:rPr>
+          <w:rStyle w:val="Strong"/>
+        </w:rPr>
+        <w:t xml:space="preserve"> currently store and how?</w:t>
       </w:r>
     </w:p>
     <w:p>
@@ -1193,11 +1336,19 @@
         <w:tabs>
           <w:tab w:val="num" w:pos="1440"/>
         </w:tabs>
-      </w:pPr>
-      <w:r>
-        <w:rPr>
-          <w:b/>
-          <w:bCs/>
+        <w:rPr>
+          <w:b/>
+          <w:bCs/>
+          <w:sz w:val="28"/>
+          <w:szCs w:val="28"/>
+        </w:rPr>
+      </w:pPr>
+      <w:r>
+        <w:rPr>
+          <w:b/>
+          <w:bCs/>
+          <w:sz w:val="28"/>
+          <w:szCs w:val="28"/>
         </w:rPr>
         <w:t>Interview with Jake Pemberton – Box Office Staff Member</w:t>
       </w:r>
@@ -1208,9 +1359,6 @@
           <w:tab w:val="num" w:pos="1440"/>
         </w:tabs>
       </w:pPr>
-      <w:r>
-        <w:t>Date of Interview: 14th January 2026 Method: Face-to-face interview conducted at Filmtopia cinema, Bury</w:t>
-      </w:r>
     </w:p>
     <w:p>
       <w:pPr>
@@ -1257,6 +1405,7 @@
         </w:tabs>
       </w:pPr>
       <w:r>
+        <w:lastRenderedPageBreak/>
         <w:t>A: The biggest one is not knowing if a seat is already taken. Sometimes a customer picks a specific seat and we say yes, then another member of staff has already given that seat to someone else and we do not know until they both turn up. It causes a lot of awkward situations. Also finding information takes too long. If someone asks what time a film starts or how many seats are left I have to physically look through the diary.</w:t>
       </w:r>
     </w:p>
@@ -1271,7 +1420,6 @@
           <w:b/>
           <w:bCs/>
         </w:rPr>
-        <w:lastRenderedPageBreak/>
         <w:t>Q: How do you currently handle food and drink orders alongside ticketing?</w:t>
       </w:r>
     </w:p>
@@ -1378,7 +1526,23 @@
           <w:b/>
           <w:bCs/>
         </w:rPr>
-        <w:t>Questionnaire – Filmtopia Customer Survey</w:t>
+        <w:t xml:space="preserve">Questionnaire – </w:t>
+      </w:r>
+      <w:proofErr w:type="spellStart"/>
+      <w:r>
+        <w:rPr>
+          <w:b/>
+          <w:bCs/>
+        </w:rPr>
+        <w:t>Filmtopia</w:t>
+      </w:r>
+      <w:proofErr w:type="spellEnd"/>
+      <w:r>
+        <w:rPr>
+          <w:b/>
+          <w:bCs/>
+        </w:rPr>
+        <w:t xml:space="preserve"> Customer Survey</w:t>
       </w:r>
     </w:p>
     <w:p>
@@ -1418,25 +1582,49 @@
         </w:tabs>
       </w:pPr>
       <w:r>
-        <w:t>A questionnaire was distributed to customers visiting Filmtopia in order to gather feedback on their experience with the current system and to understand what they would want from a new one. The questions and summarised responses are as follows.</w:t>
-      </w:r>
-    </w:p>
-    <w:p>
-      <w:pPr>
-        <w:tabs>
-          <w:tab w:val="num" w:pos="1440"/>
-        </w:tabs>
-        <w:rPr>
-          <w:b/>
-          <w:bCs/>
-        </w:rPr>
-      </w:pPr>
-      <w:r>
-        <w:rPr>
-          <w:b/>
-          <w:bCs/>
-        </w:rPr>
-        <w:t>Q1: How do you currently purchase your tickets at Filmtopia?</w:t>
+        <w:t xml:space="preserve">A questionnaire was distributed to customers visiting </w:t>
+      </w:r>
+      <w:proofErr w:type="spellStart"/>
+      <w:r>
+        <w:t>Filmtopia</w:t>
+      </w:r>
+      <w:proofErr w:type="spellEnd"/>
+      <w:r>
+        <w:t xml:space="preserve"> in order to gather feedback on their experience with the current system and to understand what they would want from a new one. The questions and summarised responses are as follows.</w:t>
+      </w:r>
+    </w:p>
+    <w:p>
+      <w:pPr>
+        <w:tabs>
+          <w:tab w:val="num" w:pos="1440"/>
+        </w:tabs>
+        <w:rPr>
+          <w:b/>
+          <w:bCs/>
+        </w:rPr>
+      </w:pPr>
+      <w:r>
+        <w:rPr>
+          <w:b/>
+          <w:bCs/>
+        </w:rPr>
+        <w:t xml:space="preserve">Q1: How do you currently purchase your tickets at </w:t>
+      </w:r>
+      <w:proofErr w:type="spellStart"/>
+      <w:r>
+        <w:rPr>
+          <w:b/>
+          <w:bCs/>
+        </w:rPr>
+        <w:t>Filmtopia</w:t>
+      </w:r>
+      <w:proofErr w:type="spellEnd"/>
+      <w:r>
+        <w:rPr>
+          <w:b/>
+          <w:bCs/>
+        </w:rPr>
+        <w:t>?</w:t>
       </w:r>
     </w:p>
     <w:tbl>
@@ -1583,7 +1771,23 @@
           <w:b/>
           <w:bCs/>
         </w:rPr>
-        <w:t>Q2: Have you ever experienced a problem when booking tickets at Filmtopia?</w:t>
+        <w:t xml:space="preserve">Q2: Have you ever experienced a problem when booking tickets at </w:t>
+      </w:r>
+      <w:proofErr w:type="spellStart"/>
+      <w:r>
+        <w:rPr>
+          <w:b/>
+          <w:bCs/>
+        </w:rPr>
+        <w:t>Filmtopia</w:t>
+      </w:r>
+      <w:proofErr w:type="spellEnd"/>
+      <w:r>
+        <w:rPr>
+          <w:b/>
+          <w:bCs/>
+        </w:rPr>
+        <w:t>?</w:t>
       </w:r>
     </w:p>
     <w:tbl>
@@ -1613,6 +1817,7 @@
                 <w:b/>
                 <w:bCs/>
               </w:rPr>
+              <w:lastRenderedPageBreak/>
               <w:t xml:space="preserve">Response </w:t>
             </w:r>
           </w:p>
@@ -1792,14 +1997,7 @@
           </w:tcPr>
           <w:p>
             <w:r>
-              <w:lastRenderedPageBreak/>
-              <w:t>Seat already taken when I arrived</w:t>
-            </w:r>
-            <w:r>
-              <w:t>, Other customers given the same seat number.</w:t>
-            </w:r>
-            <w:r>
-              <w:t xml:space="preserve"> </w:t>
+              <w:t xml:space="preserve">Seat already taken when I arrived, Other customers given the same seat number. </w:t>
             </w:r>
           </w:p>
         </w:tc>
@@ -2182,7 +2380,15 @@
         </w:tabs>
       </w:pPr>
       <w:r>
-        <w:t>85% of customers felt seat selection was at least quite important. This supports the planned graphical seat selection feature in the Filmtopia system.</w:t>
+        <w:t xml:space="preserve">85% of customers felt seat selection was at least quite important. This supports the planned graphical seat selection feature in the </w:t>
+      </w:r>
+      <w:proofErr w:type="spellStart"/>
+      <w:r>
+        <w:t>Filmtopia</w:t>
+      </w:r>
+      <w:proofErr w:type="spellEnd"/>
+      <w:r>
+        <w:t xml:space="preserve"> system.</w:t>
       </w:r>
     </w:p>
     <w:p>
@@ -2342,8 +2548,27 @@
         </w:tabs>
       </w:pPr>
       <w:r>
-        <w:t>The questionnaire results clearly show that customers are experiencing real problems with the current system at Filmtopia. The most significant issues are long queues at the box office, errors with seat allocation and the inability to book tickets through the kiosk. The results also show strong demand for a self-service ticketing kiosk, graphical seat selection and combined food and drink ordering. These findings have directly informed the objectives set out later in this investigation.</w:t>
-      </w:r>
+        <w:t xml:space="preserve">The questionnaire results clearly show that customers are experiencing real problems with the current system at </w:t>
+      </w:r>
+      <w:proofErr w:type="spellStart"/>
+      <w:r>
+        <w:t>Filmtopia</w:t>
+      </w:r>
+      <w:proofErr w:type="spellEnd"/>
+      <w:r>
+        <w:t xml:space="preserve">. The most significant issues are long queues at the box office, errors with seat allocation and the inability to book tickets through the kiosk. The results also show strong </w:t>
+      </w:r>
+      <w:r>
+        <w:lastRenderedPageBreak/>
+        <w:t>demand for a self-service ticketing kiosk, graphical seat selection and combined food and drink ordering. These findings have directly informed the objectives set out later in this investigation.</w:t>
+      </w:r>
+    </w:p>
+    <w:p>
+      <w:pPr>
+        <w:tabs>
+          <w:tab w:val="num" w:pos="1440"/>
+        </w:tabs>
+      </w:pPr>
     </w:p>
     <w:p>
       <w:pPr>
@@ -2372,6 +2597,106 @@
           <w:sz w:val="36"/>
           <w:szCs w:val="36"/>
         </w:rPr>
+        <w:t>Direct Observation</w:t>
+      </w:r>
+    </w:p>
+    <w:p>
+      <w:pPr>
+        <w:tabs>
+          <w:tab w:val="num" w:pos="1440"/>
+        </w:tabs>
+        <w:spacing w:after="80"/>
+      </w:pPr>
+      <w:r>
+        <w:t xml:space="preserve">As part of the investigation I visited </w:t>
+      </w:r>
+      <w:proofErr w:type="spellStart"/>
+      <w:r>
+        <w:t>Filmtopia</w:t>
+      </w:r>
+      <w:proofErr w:type="spellEnd"/>
+      <w:r>
+        <w:t xml:space="preserve"> during an evening showing to observe how the current system operates in practice. Rather than asking questions or interrupting the workflow I simply watched how staff handled customers during the pre-screening period when the cinema was at its busiest. The aim was to see the existing system in action and to identify any problems that might not have come up during the interviews or questionnaire.</w:t>
+      </w:r>
+    </w:p>
+    <w:p>
+      <w:pPr>
+        <w:tabs>
+          <w:tab w:val="num" w:pos="1440"/>
+        </w:tabs>
+        <w:spacing w:after="80"/>
+      </w:pPr>
+      <w:r>
+        <w:t>The first thing that stood out was how the paper booking diary was being used by two members of staff at the same time. On more than one occasion both staff members reached for the diary simultaneously to check seat availability for the same screening. This caused a brief but noticeable delay in serving customers and illustrated exactly the kind of risk that the interviews had described, where two staff members could independently assign the same seat without either realising.</w:t>
+      </w:r>
+    </w:p>
+    <w:p>
+      <w:pPr>
+        <w:tabs>
+          <w:tab w:val="num" w:pos="1440"/>
+        </w:tabs>
+        <w:spacing w:after="80"/>
+      </w:pPr>
+      <w:r>
+        <w:t>It was also clear that customers who had already used the kiosk to order food and drinks were then joining the box office queue to buy their tickets separately. This meant some customers were effectively queuing twice before they could take their seat. During the observation period this happened repeatedly and on a couple of occasions customers waiting in the box office queue made comments about having already waited at the kiosk. This confirmed what the staff interviews had suggested about the kiosk and ticketing systems being completely disconnected from each other.</w:t>
+      </w:r>
+    </w:p>
+    <w:p>
+      <w:pPr>
+        <w:tabs>
+          <w:tab w:val="num" w:pos="1440"/>
+        </w:tabs>
+        <w:spacing w:after="80"/>
+      </w:pPr>
+      <w:r>
+        <w:t>Another thing worth noting was how long it took a staff member to answer a simple question about seat availability. When a customer asked which seats were still free for a particular screening the staff member had to manually look through several pages of the diary before being able to give an answer. This took around 90 seconds and caused the queue behind that customer to grow noticeably during that time. In a busier cinema this kind of delay would quickly become a serious problem.</w:t>
+      </w:r>
+    </w:p>
+    <w:p>
+      <w:pPr>
+        <w:tabs>
+          <w:tab w:val="num" w:pos="1440"/>
+        </w:tabs>
+        <w:spacing w:after="80"/>
+      </w:pPr>
+      <w:r>
+        <w:t>Overall the observation confirmed and added detail to the problems that had already been identified through the interviews and questionnaire. Seeing the existing system in action made it clear that the issues are not occasional or minor but are a regular feature of how the cinema operates during busy periods. The findings from this observation have directly informed the objectives set out later in this investigation.</w:t>
+      </w:r>
+    </w:p>
+    <w:p>
+      <w:pPr>
+        <w:tabs>
+          <w:tab w:val="num" w:pos="1440"/>
+        </w:tabs>
+      </w:pPr>
+    </w:p>
+    <w:p>
+      <w:pPr>
+        <w:tabs>
+          <w:tab w:val="num" w:pos="1440"/>
+        </w:tabs>
+      </w:pPr>
+    </w:p>
+    <w:p>
+      <w:pPr>
+        <w:tabs>
+          <w:tab w:val="num" w:pos="1440"/>
+        </w:tabs>
+        <w:jc w:val="center"/>
+        <w:rPr>
+          <w:b/>
+          <w:bCs/>
+          <w:sz w:val="36"/>
+          <w:szCs w:val="36"/>
+        </w:rPr>
+      </w:pPr>
+      <w:r>
+        <w:rPr>
+          <w:b/>
+          <w:bCs/>
+          <w:sz w:val="36"/>
+          <w:szCs w:val="36"/>
+        </w:rPr>
         <w:t>Desk-based Research</w:t>
       </w:r>
     </w:p>
@@ -2396,14 +2721,11 @@
         </w:tabs>
       </w:pPr>
       <w:r>
+        <w:t xml:space="preserve">As part of my investigation, I researched the Vue Cinema booking system, which is one of the largest cinema chains in the UK. Vue operates 94 cinemas across the UK and Ireland and their online booking </w:t>
+      </w:r>
+      <w:r>
         <w:lastRenderedPageBreak/>
-        <w:t>As part of my investigation</w:t>
-      </w:r>
-      <w:r>
-        <w:t>,</w:t>
-      </w:r>
-      <w:r>
-        <w:t xml:space="preserve"> I researched the Vue Cinema booking system, which is one of the largest cinema chains in the UK. Vue operates 94 cinemas across the UK and Ireland and their online booking system provides a useful reference point for what a professional cinema management system should look like.</w:t>
+        <w:t>system provides a useful reference point for what a professional cinema management system should look like.</w:t>
       </w:r>
     </w:p>
     <w:p>
@@ -2431,11 +2753,8 @@
         </w:tabs>
       </w:pPr>
       <w:r>
-        <w:rPr>
-          <w:noProof/>
-        </w:rPr>
         <w:drawing>
-          <wp:inline distT="0" distB="0" distL="0" distR="0" wp14:anchorId="0F0FFE2C" wp14:editId="7863C73D">
+          <wp:inline distT="0" distB="0" distL="0" distR="0" wp14:anchorId="5F3958F4" wp14:editId="3616646E">
             <wp:extent cx="7549827" cy="3467100"/>
             <wp:effectExtent l="0" t="0" r="0" b="0"/>
             <wp:docPr id="1715657347" name="Picture 1"/>
@@ -2450,7 +2769,7 @@
                     <pic:cNvPicPr/>
                   </pic:nvPicPr>
                   <pic:blipFill>
-                    <a:blip r:embed="rId8"/>
+                    <a:blip r:embed="rId5"/>
                     <a:stretch>
                       <a:fillRect/>
                     </a:stretch>
@@ -2478,7 +2797,15 @@
         </w:tabs>
       </w:pPr>
       <w:r>
-        <w:t>The Vue homepage presents films visually using large poster images organised under a "Top Films" heading. Each film is displayed with its title clearly beneath it and the page includes a Quick Book bar at the bottom allowing users to search by venue, film, date and time simultaneously. This is a clean and intuitive way of presenting information that allows customers to find what they want quickly without having to navigate through multiple pages. For the Filmtopia system I will incorporate a similar visual approach to displaying films on the customer kiosk, ensuring that screenings are easy to browse and select.</w:t>
+        <w:t xml:space="preserve">The Vue homepage presents films visually using large poster images organised under a "Top Films" heading. Each film is displayed with its title clearly beneath it and the page includes a Quick Book bar at the bottom allowing users to search by venue, film, date and time simultaneously. This is a clean and intuitive way of presenting information that allows customers to find what they want quickly without having to navigate through multiple pages. For the </w:t>
+      </w:r>
+      <w:proofErr w:type="spellStart"/>
+      <w:r>
+        <w:t>Filmtopia</w:t>
+      </w:r>
+      <w:proofErr w:type="spellEnd"/>
+      <w:r>
+        <w:t xml:space="preserve"> system I will incorporate a similar visual approach to displaying films on the customer kiosk, ensuring that screenings are easy to browse and select.</w:t>
       </w:r>
     </w:p>
     <w:p>
@@ -2506,12 +2833,9 @@
         </w:tabs>
       </w:pPr>
       <w:r>
-        <w:rPr>
-          <w:noProof/>
-        </w:rPr>
         <w:lastRenderedPageBreak/>
         <w:drawing>
-          <wp:inline distT="0" distB="0" distL="0" distR="0" wp14:anchorId="36245FF1" wp14:editId="095576EB">
+          <wp:inline distT="0" distB="0" distL="0" distR="0" wp14:anchorId="141796FF" wp14:editId="68086F9A">
             <wp:extent cx="4743450" cy="4240517"/>
             <wp:effectExtent l="0" t="0" r="0" b="8255"/>
             <wp:docPr id="1579868581" name="Picture 1"/>
@@ -2526,7 +2850,7 @@
                     <pic:cNvPicPr/>
                   </pic:nvPicPr>
                   <pic:blipFill>
-                    <a:blip r:embed="rId9"/>
+                    <a:blip r:embed="rId6"/>
                     <a:stretch>
                       <a:fillRect/>
                     </a:stretch>
@@ -2554,7 +2878,15 @@
         </w:tabs>
       </w:pPr>
       <w:r>
-        <w:t>When a film is selected Vue displays all upcoming showings for that film at the chosen venue, organised by date and time. Each screening card shows the start and end time, the screen number and the ticket price. Accessibility information such as audio description and wheelchair access is also clearly displayed. This level of detail is something I aim to replicate in Filmtopia, where staff and customers should be able to see all relevant information about a screening at a glance without having to search through multiple menus.</w:t>
+        <w:t xml:space="preserve">When a film is selected Vue displays all upcoming showings for that film at the chosen venue, organised by date and time. Each screening card shows the start and end time, the screen number and the ticket price. Accessibility information such as audio description and wheelchair access is also clearly displayed. This level of detail is something I aim to replicate in </w:t>
+      </w:r>
+      <w:proofErr w:type="spellStart"/>
+      <w:r>
+        <w:t>Filmtopia</w:t>
+      </w:r>
+      <w:proofErr w:type="spellEnd"/>
+      <w:r>
+        <w:t>, where staff and customers should be able to see all relevant information about a screening at a glance without having to search through multiple menus.</w:t>
       </w:r>
     </w:p>
     <w:p>
@@ -2582,12 +2914,9 @@
         </w:tabs>
       </w:pPr>
       <w:r>
-        <w:rPr>
-          <w:noProof/>
-        </w:rPr>
         <w:lastRenderedPageBreak/>
         <w:drawing>
-          <wp:inline distT="0" distB="0" distL="0" distR="0" wp14:anchorId="3DB26D46" wp14:editId="3B322940">
+          <wp:inline distT="0" distB="0" distL="0" distR="0" wp14:anchorId="26AE6547" wp14:editId="0B7011B7">
             <wp:extent cx="7747481" cy="3933825"/>
             <wp:effectExtent l="0" t="0" r="6350" b="0"/>
             <wp:docPr id="854855114" name="Picture 1"/>
@@ -2602,7 +2931,7 @@
                     <pic:cNvPicPr/>
                   </pic:nvPicPr>
                   <pic:blipFill>
-                    <a:blip r:embed="rId10"/>
+                    <a:blip r:embed="rId7"/>
                     <a:stretch>
                       <a:fillRect/>
                     </a:stretch>
@@ -2630,38 +2959,63 @@
         </w:tabs>
       </w:pPr>
       <w:r>
-        <w:t>Vue's seat selection interface is a standout feature of their system. It displays a graphical layout of the screen showing every seat as a coloured icon, with different colours representing different seat types and prices. VIP seats are shown in orange at £8.49, Regular seats in black at £7.49, Saver seats in green at £6.49 and Super Saver seats in red at £4.99. Occupied seats are shown in grey so customers can immediately see what is available. Rows are labelled alphabetically on the left hand side. This graphical seat selection is a key feature I plan to implement in Filmtopia as it directly addresses the double booking problem identified in the interviews. By showing customers and staff exactly which seats are taken in real time the system eliminates the risk of two people being assigned the same seat.</w:t>
-      </w:r>
-    </w:p>
-    <w:p>
-      <w:pPr>
-        <w:tabs>
-          <w:tab w:val="num" w:pos="1440"/>
-        </w:tabs>
-      </w:pPr>
-      <w:r>
-        <w:rPr>
-          <w:b/>
-          <w:bCs/>
-        </w:rPr>
-        <w:t>Features Identified for Filmtopia</w:t>
-      </w:r>
-    </w:p>
-    <w:p>
-      <w:pPr>
-        <w:tabs>
-          <w:tab w:val="num" w:pos="1440"/>
-        </w:tabs>
-      </w:pPr>
-      <w:r>
-        <w:t>From researching Vue's system I have identified the following features that I will incorporate into the Filmtopia system:</w:t>
+        <w:t xml:space="preserve">Vue's seat selection interface is a standout feature of their system. It displays a graphical layout of the screen showing every seat as a coloured icon, with different colours representing different seat types and prices. VIP seats are shown in orange at £8.49, Regular seats in black at £7.49, Saver seats in green at £6.49 and Super Saver seats in red at £4.99. Occupied seats are shown in grey so customers can immediately see what is available. Rows are labelled alphabetically on the left hand side. This graphical seat selection is a key feature I plan to implement in </w:t>
+      </w:r>
+      <w:proofErr w:type="spellStart"/>
+      <w:r>
+        <w:t>Filmtopia</w:t>
+      </w:r>
+      <w:proofErr w:type="spellEnd"/>
+      <w:r>
+        <w:t xml:space="preserve"> as it directly addresses the double booking problem identified in the interviews. By showing customers and staff exactly which seats are taken in real time the system eliminates the risk of two people being assigned the same seat.</w:t>
+      </w:r>
+    </w:p>
+    <w:p>
+      <w:pPr>
+        <w:tabs>
+          <w:tab w:val="num" w:pos="1440"/>
+        </w:tabs>
+      </w:pPr>
+      <w:r>
+        <w:rPr>
+          <w:b/>
+          <w:bCs/>
+        </w:rPr>
+        <w:t xml:space="preserve">Features Identified for </w:t>
+      </w:r>
+      <w:proofErr w:type="spellStart"/>
+      <w:r>
+        <w:rPr>
+          <w:b/>
+          <w:bCs/>
+        </w:rPr>
+        <w:t>Filmtopia</w:t>
+      </w:r>
+      <w:proofErr w:type="spellEnd"/>
+    </w:p>
+    <w:p>
+      <w:pPr>
+        <w:tabs>
+          <w:tab w:val="num" w:pos="1440"/>
+        </w:tabs>
+      </w:pPr>
+      <w:r>
+        <w:t xml:space="preserve">From researching Vue's system I have identified the following features that I will incorporate into the </w:t>
+      </w:r>
+      <w:proofErr w:type="spellStart"/>
+      <w:r>
+        <w:t>Filmtopia</w:t>
+      </w:r>
+      <w:proofErr w:type="spellEnd"/>
+      <w:r>
+        <w:t xml:space="preserve"> system:</w:t>
       </w:r>
     </w:p>
     <w:p>
       <w:pPr>
         <w:numPr>
           <w:ilvl w:val="0"/>
-          <w:numId w:val="2"/>
+          <w:numId w:val="1"/>
         </w:numPr>
         <w:tabs>
           <w:tab w:val="num" w:pos="1440"/>
@@ -2675,7 +3029,7 @@
       <w:pPr>
         <w:numPr>
           <w:ilvl w:val="0"/>
-          <w:numId w:val="2"/>
+          <w:numId w:val="1"/>
         </w:numPr>
         <w:tabs>
           <w:tab w:val="num" w:pos="1440"/>
@@ -2689,7 +3043,7 @@
       <w:pPr>
         <w:numPr>
           <w:ilvl w:val="0"/>
-          <w:numId w:val="2"/>
+          <w:numId w:val="1"/>
         </w:numPr>
         <w:tabs>
           <w:tab w:val="num" w:pos="1440"/>
@@ -2703,7 +3057,7 @@
       <w:pPr>
         <w:numPr>
           <w:ilvl w:val="0"/>
-          <w:numId w:val="2"/>
+          <w:numId w:val="1"/>
         </w:numPr>
         <w:tabs>
           <w:tab w:val="num" w:pos="1440"/>
@@ -2717,7 +3071,7 @@
       <w:pPr>
         <w:numPr>
           <w:ilvl w:val="0"/>
-          <w:numId w:val="2"/>
+          <w:numId w:val="1"/>
         </w:numPr>
         <w:tabs>
           <w:tab w:val="num" w:pos="1440"/>
@@ -2759,11 +3113,16 @@
         </w:tabs>
       </w:pPr>
       <w:r>
-        <w:t xml:space="preserve">The second system I researched was Odeon, which is the largest cinema chain in the UK. Odeon operates over 120 cinemas across the UK and Ireland and their online </w:t>
-      </w:r>
-      <w:r>
         <w:lastRenderedPageBreak/>
-        <w:t>booking system offered several useful features to compare against Vue and to inform the design of Filmtopia.</w:t>
+        <w:t xml:space="preserve">The second system I researched was Odeon, which is the largest cinema chain in the UK. Odeon operates over 120 cinemas across the UK and Ireland and their online booking system offered several useful features to compare against Vue and to inform the design of </w:t>
+      </w:r>
+      <w:proofErr w:type="spellStart"/>
+      <w:r>
+        <w:t>Filmtopia</w:t>
+      </w:r>
+      <w:proofErr w:type="spellEnd"/>
+      <w:r>
+        <w:t>.</w:t>
       </w:r>
     </w:p>
     <w:p>
@@ -2791,11 +3150,8 @@
         </w:tabs>
       </w:pPr>
       <w:r>
-        <w:rPr>
-          <w:noProof/>
-        </w:rPr>
         <w:drawing>
-          <wp:inline distT="0" distB="0" distL="0" distR="0" wp14:anchorId="371730D0" wp14:editId="66E01729">
+          <wp:inline distT="0" distB="0" distL="0" distR="0" wp14:anchorId="65644071" wp14:editId="52091A46">
             <wp:extent cx="5731510" cy="5603875"/>
             <wp:effectExtent l="0" t="0" r="2540" b="0"/>
             <wp:docPr id="244003220" name="Picture 1"/>
@@ -2810,7 +3166,7 @@
                     <pic:cNvPicPr/>
                   </pic:nvPicPr>
                   <pic:blipFill>
-                    <a:blip r:embed="rId11"/>
+                    <a:blip r:embed="rId8"/>
                     <a:stretch>
                       <a:fillRect/>
                     </a:stretch>
@@ -2838,7 +3194,15 @@
         </w:tabs>
       </w:pPr>
       <w:r>
-        <w:t>Similar to Vue, Odeon presents films using large poster images organised under a Top Films heading. However Odeon includes additional information directly on the film page such as the director, cast, runtime, release date and genre tags. This richer level of detail gives customers more context before making a booking decision. Odeon also includes a quick search bar at the bottom of the page allowing users to filter by cinema, film, date and time. One notable difference from Vue is that Odeon uses a darker navy blue colour scheme throughout which creates a more premium feel. For Filmtopia I will aim to display key film information clearly on the customer kiosk so customers can make informed decisions quickly.</w:t>
+        <w:t xml:space="preserve">Similar to Vue, Odeon presents films using large poster images organised under a Top Films heading. However Odeon includes additional information directly on the film page such as the director, cast, runtime, release date and genre tags. This richer level of detail gives customers more context before making a booking decision. Odeon also includes a quick search bar at the bottom of the page allowing users to filter by cinema, film, date and time. One notable difference from Vue is that Odeon uses a darker navy blue colour scheme throughout which creates a more premium feel. For </w:t>
+      </w:r>
+      <w:proofErr w:type="spellStart"/>
+      <w:r>
+        <w:t>Filmtopia</w:t>
+      </w:r>
+      <w:proofErr w:type="spellEnd"/>
+      <w:r>
+        <w:t xml:space="preserve"> I will aim to display key film information clearly on the customer kiosk so customers can make informed decisions quickly.</w:t>
       </w:r>
     </w:p>
     <w:p>
@@ -2866,12 +3230,9 @@
         </w:tabs>
       </w:pPr>
       <w:r>
-        <w:rPr>
-          <w:noProof/>
-        </w:rPr>
         <w:lastRenderedPageBreak/>
         <w:drawing>
-          <wp:inline distT="0" distB="0" distL="0" distR="0" wp14:anchorId="4285E1BF" wp14:editId="29C80826">
+          <wp:inline distT="0" distB="0" distL="0" distR="0" wp14:anchorId="4241C67F" wp14:editId="7068D285">
             <wp:extent cx="6017614" cy="6103620"/>
             <wp:effectExtent l="0" t="0" r="2540" b="0"/>
             <wp:docPr id="140139721" name="Picture 1"/>
@@ -2886,7 +3247,7 @@
                     <pic:cNvPicPr/>
                   </pic:nvPicPr>
                   <pic:blipFill>
-                    <a:blip r:embed="rId12"/>
+                    <a:blip r:embed="rId9"/>
                     <a:stretch>
                       <a:fillRect/>
                     </a:stretch>
@@ -2914,7 +3275,15 @@
         </w:tabs>
       </w:pPr>
       <w:r>
-        <w:t>Odeon's screening times page clearly displays the film title, runtime, release date and genre alongside all available showtimes. Screenings are organised by date across the top of the page and grouped by cinema location below. Each screening card shows the start time, screen number and format such as 3D. A "Book Now" button is displayed prominently on each card making the next action immediately obvious. This clear layout is something I will replicate in Filmtopia where staff should be able to see all screenings for a given film at a glance.</w:t>
+        <w:t xml:space="preserve">Odeon's screening times page clearly displays the film title, runtime, release date and genre alongside all available showtimes. Screenings are organised by date across the top of the page and grouped by cinema location below. Each screening card shows the start time, screen number and format such as 3D. A "Book Now" button is displayed prominently on each card making the next action immediately obvious. This clear layout is something I will replicate in </w:t>
+      </w:r>
+      <w:proofErr w:type="spellStart"/>
+      <w:r>
+        <w:t>Filmtopia</w:t>
+      </w:r>
+      <w:proofErr w:type="spellEnd"/>
+      <w:r>
+        <w:t xml:space="preserve"> where staff should be able to see all screenings for a given film at a glance.</w:t>
       </w:r>
     </w:p>
     <w:p>
@@ -2942,12 +3311,9 @@
         </w:tabs>
       </w:pPr>
       <w:r>
-        <w:rPr>
-          <w:noProof/>
-        </w:rPr>
         <w:lastRenderedPageBreak/>
         <w:drawing>
-          <wp:inline distT="0" distB="0" distL="0" distR="0" wp14:anchorId="1EB8E141" wp14:editId="745A0419">
+          <wp:inline distT="0" distB="0" distL="0" distR="0" wp14:anchorId="00613719" wp14:editId="2C8B7A72">
             <wp:extent cx="5882724" cy="4619625"/>
             <wp:effectExtent l="0" t="0" r="3810" b="0"/>
             <wp:docPr id="1531703411" name="Picture 1"/>
@@ -2962,7 +3328,7 @@
                     <pic:cNvPicPr/>
                   </pic:nvPicPr>
                   <pic:blipFill>
-                    <a:blip r:embed="rId13"/>
+                    <a:blip r:embed="rId10"/>
                     <a:stretch>
                       <a:fillRect/>
                     </a:stretch>
@@ -2990,38 +3356,71 @@
         </w:tabs>
       </w:pPr>
       <w:r>
-        <w:t>Odeon's seat selection screen is particularly well designed and shows several features worth incorporating into Filmtopia. The screen displays a graphical layout of the entire auditorium with seats colour coded by type and price. Green seats represent Classic Saver at £14.99, cream seats represent Classic at £16.49 and orange seats represent Classic Popular at £17.99. Unavailable seats are shown with an X so it is immediately clear which seats cannot be booked. A seat key at the bottom explains the colour coding including wheelchair and companion seat options. The booking process is also clearly structured using a step by step tab navigation at the top showing Seats, Sign In, Tickets, Food, Summary and Payment. This staged approach guides the user through the process logically and reduces confusion. For Filmtopia I will incorporate a similar colour coded seat map and a clear step by step flow for the customer kiosk booking process.</w:t>
-      </w:r>
-    </w:p>
-    <w:p>
-      <w:pPr>
-        <w:tabs>
-          <w:tab w:val="num" w:pos="1440"/>
-        </w:tabs>
-      </w:pPr>
-      <w:r>
-        <w:rPr>
-          <w:b/>
-          <w:bCs/>
-        </w:rPr>
-        <w:t>Features Identified for Filmtopia</w:t>
-      </w:r>
-    </w:p>
-    <w:p>
-      <w:pPr>
-        <w:tabs>
-          <w:tab w:val="num" w:pos="1440"/>
-        </w:tabs>
-      </w:pPr>
-      <w:r>
-        <w:t>From researching Odeon's system I have identified the following additional features to incorporate into Filmtopia:</w:t>
+        <w:t xml:space="preserve">Odeon's seat selection screen is particularly well designed and shows several features worth incorporating into </w:t>
+      </w:r>
+      <w:proofErr w:type="spellStart"/>
+      <w:r>
+        <w:t>Filmtopia</w:t>
+      </w:r>
+      <w:proofErr w:type="spellEnd"/>
+      <w:r>
+        <w:t xml:space="preserve">. The screen displays a graphical layout of the entire auditorium with seats colour coded by type and price. Green seats represent Classic Saver at £14.99, cream seats represent Classic at £16.49 and orange seats represent Classic Popular at £17.99. Unavailable seats are shown with an X so it is immediately clear which seats cannot be booked. A seat key at the bottom explains the colour coding including wheelchair and companion seat options. The booking process is also clearly structured using a step by step tab navigation at the top showing Seats, Sign In, Tickets, Food, Summary and Payment. This staged approach guides the user through the process logically and reduces confusion. For </w:t>
+      </w:r>
+      <w:proofErr w:type="spellStart"/>
+      <w:r>
+        <w:t>Filmtopia</w:t>
+      </w:r>
+      <w:proofErr w:type="spellEnd"/>
+      <w:r>
+        <w:t xml:space="preserve"> I will incorporate a similar colour coded seat map and a clear step by step flow for the customer kiosk booking process.</w:t>
+      </w:r>
+    </w:p>
+    <w:p>
+      <w:pPr>
+        <w:tabs>
+          <w:tab w:val="num" w:pos="1440"/>
+        </w:tabs>
+      </w:pPr>
+      <w:r>
+        <w:rPr>
+          <w:b/>
+          <w:bCs/>
+        </w:rPr>
+        <w:t xml:space="preserve">Features Identified for </w:t>
+      </w:r>
+      <w:proofErr w:type="spellStart"/>
+      <w:r>
+        <w:rPr>
+          <w:b/>
+          <w:bCs/>
+        </w:rPr>
+        <w:t>Filmtopia</w:t>
+      </w:r>
+      <w:proofErr w:type="spellEnd"/>
+    </w:p>
+    <w:p>
+      <w:pPr>
+        <w:tabs>
+          <w:tab w:val="num" w:pos="1440"/>
+        </w:tabs>
+      </w:pPr>
+      <w:r>
+        <w:t xml:space="preserve">From researching Odeon's system I have identified the following additional features to incorporate into </w:t>
+      </w:r>
+      <w:proofErr w:type="spellStart"/>
+      <w:r>
+        <w:t>Filmtopia</w:t>
+      </w:r>
+      <w:proofErr w:type="spellEnd"/>
+      <w:r>
+        <w:t>:</w:t>
       </w:r>
     </w:p>
     <w:p>
       <w:pPr>
         <w:numPr>
           <w:ilvl w:val="0"/>
-          <w:numId w:val="3"/>
+          <w:numId w:val="2"/>
         </w:numPr>
         <w:tabs>
           <w:tab w:val="num" w:pos="1440"/>
@@ -3035,7 +3434,7 @@
       <w:pPr>
         <w:numPr>
           <w:ilvl w:val="0"/>
-          <w:numId w:val="3"/>
+          <w:numId w:val="2"/>
         </w:numPr>
         <w:tabs>
           <w:tab w:val="num" w:pos="1440"/>
@@ -3049,7 +3448,7 @@
       <w:pPr>
         <w:numPr>
           <w:ilvl w:val="0"/>
-          <w:numId w:val="3"/>
+          <w:numId w:val="2"/>
         </w:numPr>
         <w:tabs>
           <w:tab w:val="num" w:pos="1440"/>
@@ -3063,7 +3462,7 @@
       <w:pPr>
         <w:numPr>
           <w:ilvl w:val="0"/>
-          <w:numId w:val="3"/>
+          <w:numId w:val="2"/>
         </w:numPr>
         <w:tabs>
           <w:tab w:val="num" w:pos="1440"/>
@@ -3077,14 +3476,13 @@
       <w:pPr>
         <w:numPr>
           <w:ilvl w:val="0"/>
-          <w:numId w:val="3"/>
+          <w:numId w:val="2"/>
         </w:numPr>
         <w:tabs>
           <w:tab w:val="num" w:pos="1440"/>
         </w:tabs>
       </w:pPr>
       <w:r>
-        <w:lastRenderedPageBreak/>
         <w:t>Prominent call to action buttons making the next step always obvious</w:t>
       </w:r>
     </w:p>
@@ -3109,6 +3507,7 @@
           <w:sz w:val="36"/>
           <w:szCs w:val="36"/>
         </w:rPr>
+        <w:lastRenderedPageBreak/>
         <w:t>Data Flow Diagrams</w:t>
       </w:r>
     </w:p>
@@ -3120,11 +3519,8 @@
         <w:jc w:val="center"/>
       </w:pPr>
       <w:r>
-        <w:rPr>
-          <w:noProof/>
-        </w:rPr>
         <w:drawing>
-          <wp:inline distT="0" distB="0" distL="0" distR="0" wp14:anchorId="54F16FFC" wp14:editId="47D1E6D0">
+          <wp:inline distT="0" distB="0" distL="0" distR="0" wp14:anchorId="7DE54260" wp14:editId="5F3058BB">
             <wp:extent cx="6066867" cy="4791075"/>
             <wp:effectExtent l="0" t="0" r="0" b="0"/>
             <wp:docPr id="2123417598" name="Picture 1"/>
@@ -3139,7 +3535,7 @@
                     <pic:cNvPicPr/>
                   </pic:nvPicPr>
                   <pic:blipFill rotWithShape="1">
-                    <a:blip r:embed="rId14"/>
+                    <a:blip r:embed="rId11"/>
                     <a:srcRect b="7067"/>
                     <a:stretch>
                       <a:fillRect/>
@@ -3181,6 +3577,7 @@
         <w:tabs>
           <w:tab w:val="num" w:pos="1440"/>
         </w:tabs>
+        <w:spacing w:after="80"/>
         <w:jc w:val="center"/>
         <w:rPr>
           <w:b/>
@@ -3204,261 +3601,212 @@
         <w:tabs>
           <w:tab w:val="num" w:pos="1440"/>
         </w:tabs>
-      </w:pPr>
-      <w:r>
-        <w:t>Filmtopia is a small independent cinema that currently manages all of its business operations using a combination of paper records and spreadsheets. The system has no centralised database and no integrated software solution. The following sections break down how the existing system functions in terms of its inputs, outputs, processing and limitations.</w:t>
-      </w:r>
-    </w:p>
-    <w:p>
-      <w:pPr>
-        <w:tabs>
-          <w:tab w:val="num" w:pos="1440"/>
-        </w:tabs>
-      </w:pPr>
-      <w:r>
-        <w:rPr>
-          <w:b/>
-          <w:bCs/>
-        </w:rPr>
-        <w:t>Inputs into the Existing System</w:t>
-      </w:r>
-    </w:p>
-    <w:p>
-      <w:pPr>
-        <w:tabs>
-          <w:tab w:val="num" w:pos="1440"/>
-        </w:tabs>
-      </w:pPr>
-      <w:r>
-        <w:t>The existing system receives several types of input, all of which are entered manually by staff members or the manager.</w:t>
-      </w:r>
-    </w:p>
-    <w:p>
-      <w:pPr>
-        <w:tabs>
-          <w:tab w:val="num" w:pos="1440"/>
-        </w:tabs>
-      </w:pPr>
-      <w:r>
-        <w:t>When a customer wishes to book tickets for a screening, a member of staff writes the customer's name, chosen film, screening time, number of tickets and preferred seats into a paper booking diary. This input is entirely manual and relies on staff handwriting being legible and accurate.</w:t>
-      </w:r>
-    </w:p>
-    <w:p>
-      <w:pPr>
-        <w:tabs>
-          <w:tab w:val="num" w:pos="1440"/>
-        </w:tabs>
+        <w:spacing w:after="80"/>
+      </w:pPr>
+      <w:r>
+        <w:t>Before designing and building a new system it is important to fully understand how the existing one works. This includes looking at what data goes into the system, what comes out of it, how that data is processed in between and where the system falls short. Without this understanding there is a risk of building something that solves the wrong problems or misses important requirements entirely.</w:t>
+      </w:r>
+    </w:p>
+    <w:p>
+      <w:pPr>
+        <w:tabs>
+          <w:tab w:val="num" w:pos="1440"/>
+        </w:tabs>
+        <w:spacing w:after="80"/>
+      </w:pPr>
+      <w:r>
+        <w:rPr>
+          <w:b/>
+          <w:bCs/>
+        </w:rPr>
+        <w:t>Inputs</w:t>
+      </w:r>
+    </w:p>
+    <w:p>
+      <w:pPr>
+        <w:tabs>
+          <w:tab w:val="num" w:pos="1440"/>
+        </w:tabs>
+        <w:spacing w:after="80"/>
+      </w:pPr>
+      <w:r>
+        <w:t xml:space="preserve">The existing system at </w:t>
+      </w:r>
+      <w:proofErr w:type="spellStart"/>
+      <w:r>
+        <w:t>Filmtopia</w:t>
+      </w:r>
+      <w:proofErr w:type="spellEnd"/>
+      <w:r>
+        <w:t xml:space="preserve"> receives several types of input, all of which are entered manually by staff or the manager. When a customer arrives to book tickets a member of staff writes the customer's name, chosen film, screening time, number of tickets and preferred seats into a paper booking diary. There is no digital record of this at the point of entry meaning the accuracy of the data depends entirely on the staff member's handwriting and attention to detail.</w:t>
+      </w:r>
+    </w:p>
+    <w:p>
+      <w:pPr>
+        <w:tabs>
+          <w:tab w:val="num" w:pos="1440"/>
+        </w:tabs>
+        <w:spacing w:after="80"/>
+      </w:pPr>
+      <w:r>
+        <w:t>When a customer purchases food or drinks at the concessions area their order is written on a notepad by a staff member and passed to the kitchen team. This is a completely separate process from the ticket booking and the two are never linked together in any way. If a customer wants to book tickets and order food at the same time they have to interact with two different systems and two different members of staff.</w:t>
+      </w:r>
+    </w:p>
+    <w:p>
+      <w:pPr>
+        <w:tabs>
+          <w:tab w:val="num" w:pos="1440"/>
+        </w:tabs>
+        <w:spacing w:after="80"/>
       </w:pPr>
       <w:r>
         <w:lastRenderedPageBreak/>
-        <w:t>When a customer purchases food or drinks at the concessions area, a staff member writes the order on a notepad which is then passed to the kitchen or concessions team. No electronic record is made of this transaction at the point of sale.</w:t>
-      </w:r>
-    </w:p>
-    <w:p>
-      <w:pPr>
-        <w:tabs>
-          <w:tab w:val="num" w:pos="1440"/>
-        </w:tabs>
-      </w:pPr>
-      <w:r>
-        <w:t>When a new film is added to the schedule or a screening time changes, the manager manually updates a separate paper schedule that is kept at the box office. There is no automated way of notifying staff of changes to the schedule.</w:t>
-      </w:r>
-    </w:p>
-    <w:p>
-      <w:pPr>
-        <w:tabs>
-          <w:tab w:val="num" w:pos="1440"/>
-        </w:tabs>
-      </w:pPr>
-      <w:r>
-        <w:t>Stock levels for food and drink are updated manually on a spreadsheet by the manager or a designated staff member after stock counts are carried out. This is done periodically rather than in real time.</w:t>
-      </w:r>
-    </w:p>
-    <w:p>
-      <w:pPr>
-        <w:tabs>
-          <w:tab w:val="num" w:pos="1440"/>
-        </w:tabs>
-      </w:pPr>
-      <w:r>
-        <w:rPr>
-          <w:b/>
-          <w:bCs/>
-        </w:rPr>
-        <w:t>Outputs from the Existing System</w:t>
-      </w:r>
-    </w:p>
-    <w:p>
-      <w:pPr>
-        <w:tabs>
-          <w:tab w:val="num" w:pos="1440"/>
-        </w:tabs>
-      </w:pPr>
-      <w:r>
-        <w:t>The outputs from the existing system are limited and largely paper based.</w:t>
-      </w:r>
-    </w:p>
-    <w:p>
-      <w:pPr>
-        <w:tabs>
-          <w:tab w:val="num" w:pos="1440"/>
-        </w:tabs>
-      </w:pPr>
-      <w:r>
-        <w:t>When a customer completes a ticket booking, the staff member prints a ticket stub from a basic template on a computer and hands it to the customer. This ticket stub contains the film name, screening time and seat number but is not linked to any database.</w:t>
-      </w:r>
-    </w:p>
-    <w:p>
-      <w:pPr>
-        <w:tabs>
-          <w:tab w:val="num" w:pos="1440"/>
-        </w:tabs>
-      </w:pPr>
-      <w:r>
-        <w:t>At the end of each day or week the manager manually compiles sales figures by counting through the entries in the paper booking diary and cross referencing with till receipts. This produces a handwritten or basic spreadsheet based sales summary which is used to assess the cinema's performance.</w:t>
-      </w:r>
-    </w:p>
-    <w:p>
-      <w:pPr>
-        <w:tabs>
-          <w:tab w:val="num" w:pos="1440"/>
-        </w:tabs>
-      </w:pPr>
-      <w:r>
-        <w:t>Staff rotas are produced by the manager in a spreadsheet and printed out for staff to view. There is no digital way for staff to check their rota remotely.</w:t>
-      </w:r>
-    </w:p>
-    <w:p>
-      <w:pPr>
-        <w:tabs>
-          <w:tab w:val="num" w:pos="1440"/>
-        </w:tabs>
-      </w:pPr>
-      <w:r>
-        <w:rPr>
-          <w:b/>
-          <w:bCs/>
-        </w:rPr>
-        <w:t>Processing in the Existing System</w:t>
-      </w:r>
-    </w:p>
-    <w:p>
-      <w:pPr>
-        <w:tabs>
-          <w:tab w:val="num" w:pos="1440"/>
-        </w:tabs>
-      </w:pPr>
-      <w:r>
-        <w:t>The processing that takes place in the existing system is entirely manual and carried out by staff members rather than any software.</w:t>
-      </w:r>
-    </w:p>
-    <w:p>
-      <w:pPr>
-        <w:tabs>
-          <w:tab w:val="num" w:pos="1440"/>
-        </w:tabs>
-      </w:pPr>
-      <w:r>
-        <w:t>When a customer requests a specific seat for a screening, a staff member must physically look through the paper booking diary to check whether that seat has already been assigned to another customer. This check is slow and unreliable, particularly during busy periods when multiple staff members may be taking bookings simultaneously.</w:t>
-      </w:r>
-    </w:p>
-    <w:p>
-      <w:pPr>
-        <w:tabs>
-          <w:tab w:val="num" w:pos="1440"/>
-        </w:tabs>
-      </w:pPr>
-      <w:r>
-        <w:t>When a customer books tickets, the staff member must calculate the total cost manually based on the number of tickets and the ticket price for that screening. There is no automated pricing or discount system.</w:t>
-      </w:r>
-    </w:p>
-    <w:p>
-      <w:pPr>
-        <w:tabs>
-          <w:tab w:val="num" w:pos="1440"/>
-        </w:tabs>
-      </w:pPr>
-      <w:r>
-        <w:t>At the end of a trading period the manager must manually count through all bookings recorded in the diary and cross reference with food and drink sales to produce any kind of performance summary. This process can take a significant amount of time and is prone to human error.</w:t>
-      </w:r>
-    </w:p>
-    <w:p>
-      <w:pPr>
-        <w:tabs>
-          <w:tab w:val="num" w:pos="1440"/>
-        </w:tabs>
-      </w:pPr>
-      <w:r>
-        <w:rPr>
-          <w:b/>
-          <w:bCs/>
-        </w:rPr>
-        <w:t>Limitations of the Existing System</w:t>
-      </w:r>
-    </w:p>
-    <w:p>
-      <w:pPr>
-        <w:tabs>
-          <w:tab w:val="num" w:pos="1440"/>
-        </w:tabs>
-      </w:pPr>
-      <w:r>
-        <w:t>The existing system has several significant limitations that have been identified through the investigation.</w:t>
-      </w:r>
-    </w:p>
-    <w:p>
-      <w:pPr>
-        <w:tabs>
-          <w:tab w:val="num" w:pos="1440"/>
-        </w:tabs>
-      </w:pPr>
-      <w:r>
-        <w:t xml:space="preserve">The most serious limitation is the risk of double bookings. Because there is no centralised real time record of seat allocations, two members of staff can independently assign the same seat to two different customers without either being </w:t>
+        <w:t>When a new film is added to the schedule or a screening time changes the manager updates a paper schedule kept at the box office. There is no automated way of notifying staff of changes which means it is possible for staff to be working from outdated information without realising. Stock levels for food and drink are updated on a spreadsheet periodically by the manager, meaning the data is never truly up to date and relies on manual stock counts being carried out regularly.</w:t>
+      </w:r>
+    </w:p>
+    <w:p>
+      <w:pPr>
+        <w:tabs>
+          <w:tab w:val="num" w:pos="1440"/>
+        </w:tabs>
+        <w:spacing w:after="80"/>
+      </w:pPr>
+      <w:r>
+        <w:rPr>
+          <w:b/>
+          <w:bCs/>
+        </w:rPr>
+        <w:t>Processing</w:t>
+      </w:r>
+    </w:p>
+    <w:p>
+      <w:pPr>
+        <w:tabs>
+          <w:tab w:val="num" w:pos="1440"/>
+        </w:tabs>
+        <w:spacing w:after="80"/>
+      </w:pPr>
+      <w:r>
+        <w:t>The processing that takes place in the existing system is carried out entirely by hand rather than by any software. When a customer asks for a specific seat a staff member must physically look through the paper booking diary to check whether that seat has already been assigned for that screening. This process is slow and becomes increasingly unreliable during busy periods when multiple staff members are taking bookings at the same time. Because there is no central record that updates in real time two members of staff can independently assign the same seat to different customers without either being aware of it until the customers arrive.</w:t>
+      </w:r>
+    </w:p>
+    <w:p>
+      <w:pPr>
+        <w:tabs>
+          <w:tab w:val="num" w:pos="1440"/>
+        </w:tabs>
+        <w:spacing w:after="80"/>
+      </w:pPr>
+      <w:r>
+        <w:t>When a customer books tickets the total cost is calculated manually by the staff member based on the number of tickets and the price for that screening. There is no automated pricing system meaning human error in the calculation is possible. At the end of a trading period the manager must manually count through all entries in the booking diary and cross reference with till receipts to produce any kind of sales summary. This is a time consuming process that the manager has described as unreliable because it depends on the handwritten records being complete and legible.</w:t>
+      </w:r>
+    </w:p>
+    <w:p>
+      <w:pPr>
+        <w:tabs>
+          <w:tab w:val="num" w:pos="1440"/>
+        </w:tabs>
+        <w:spacing w:after="80"/>
+      </w:pPr>
+      <w:r>
+        <w:rPr>
+          <w:b/>
+          <w:bCs/>
+        </w:rPr>
+        <w:t>Outputs</w:t>
+      </w:r>
+    </w:p>
+    <w:p>
+      <w:pPr>
+        <w:tabs>
+          <w:tab w:val="num" w:pos="1440"/>
+        </w:tabs>
+        <w:spacing w:after="80"/>
+      </w:pPr>
+      <w:r>
+        <w:t>The outputs from the existing system are limited and almost entirely paper based. When a customer completes a ticket booking a staff member prints a ticket stub from a basic template on a computer and hands it to the customer. This ticket stub is not linked to any database and contains only the information that the staff member manually entered into the template at the time of printing.</w:t>
+      </w:r>
+    </w:p>
+    <w:p>
+      <w:pPr>
+        <w:tabs>
+          <w:tab w:val="num" w:pos="1440"/>
+        </w:tabs>
+        <w:spacing w:after="80"/>
+      </w:pPr>
+      <w:r>
+        <w:t>At the end of each week the manager produces a handwritten or basic spreadsheet summary of sales figures by counting through the booking diary. This is the only form of reporting available to the manager and it provides no breakdown by film, screening time or seat type. Staff rotas are produced by the manager in a spreadsheet and printed out for staff to view. There is no digital way for staff to check their rota without physically being at the cinema.</w:t>
+      </w:r>
+    </w:p>
+    <w:p>
+      <w:pPr>
+        <w:tabs>
+          <w:tab w:val="num" w:pos="1440"/>
+        </w:tabs>
+        <w:spacing w:after="80"/>
+      </w:pPr>
+      <w:r>
+        <w:rPr>
+          <w:b/>
+          <w:bCs/>
+        </w:rPr>
+        <w:t>Limitations</w:t>
+      </w:r>
+    </w:p>
+    <w:p>
+      <w:pPr>
+        <w:tabs>
+          <w:tab w:val="num" w:pos="1440"/>
+        </w:tabs>
+        <w:spacing w:after="80"/>
+      </w:pPr>
+      <w:r>
+        <w:t>The existing system has several significant limitations that have been clearly identified through the investigation. The most serious of these is the risk of double bookings. Because there is no centralised real time record of seat allocations the same seat can be assigned to two different customers for the same screening. This has happened on multiple occasions and has resulted in customers arriving to find their seat already occupied. Not only is this a poor experience for the customer but it reflects badly on the cinema and undermines trust in the booking process.</w:t>
+      </w:r>
+    </w:p>
+    <w:p>
+      <w:pPr>
+        <w:tabs>
+          <w:tab w:val="num" w:pos="1440"/>
+        </w:tabs>
+        <w:spacing w:after="80"/>
+      </w:pPr>
+      <w:r>
+        <w:t>Another significant limitation is the complete lack of meaningful reporting. The manager currently has no way of knowing how many tickets have been sold for a particular film, which screenings are most popular or what the cinema's total revenue is for a given period without manually processing a large amount of paper records. This makes it very difficult to make informed business decisions.</w:t>
+      </w:r>
+    </w:p>
+    <w:p>
+      <w:pPr>
+        <w:tabs>
+          <w:tab w:val="num" w:pos="1440"/>
+        </w:tabs>
+        <w:spacing w:after="80"/>
+      </w:pPr>
+      <w:r>
+        <w:t xml:space="preserve">The customer facing experience is also heavily limited by the current setup. The touchscreen kiosk that is already installed in the cinema can handle food and drink orders but cannot sell tickets. This </w:t>
       </w:r>
       <w:r>
         <w:lastRenderedPageBreak/>
-        <w:t>aware. This was confirmed by both Sarah Henshaw and Jake Pemberton in their interviews and by 65% of customers in the questionnaire.</w:t>
-      </w:r>
-    </w:p>
-    <w:p>
-      <w:pPr>
-        <w:tabs>
-          <w:tab w:val="num" w:pos="1440"/>
-        </w:tabs>
-      </w:pPr>
-      <w:r>
-        <w:t>The system has no way of generating meaningful reports automatically. Any analysis of sales performance requires the manager to manually process paper records which is time consuming and likely to contain errors.</w:t>
-      </w:r>
-    </w:p>
-    <w:p>
-      <w:pPr>
-        <w:tabs>
-          <w:tab w:val="num" w:pos="1440"/>
-        </w:tabs>
-      </w:pPr>
-      <w:r>
-        <w:t>The current kiosk can only handle food and drink orders and cannot sell tickets. This forces customers to queue twice, once at the kiosk and once at the box office, which creates a poor customer experience and increases wait times during busy periods.</w:t>
-      </w:r>
-    </w:p>
-    <w:p>
-      <w:pPr>
-        <w:tabs>
-          <w:tab w:val="num" w:pos="1440"/>
-        </w:tabs>
-      </w:pPr>
-      <w:r>
-        <w:t>There is no way for customers to book tickets in advance online or through any digital means. All bookings must be made in person at the box office which limits accessibility and convenience.</w:t>
-      </w:r>
-    </w:p>
-    <w:p>
-      <w:pPr>
-        <w:tabs>
-          <w:tab w:val="num" w:pos="1440"/>
-        </w:tabs>
-      </w:pPr>
-      <w:r>
-        <w:t>Data is stored across multiple disconnected systems including the paper booking diary, a food and drink stock spreadsheet and a staff rota spreadsheet. None of these systems communicate with each other making it impossible to get a complete picture of the cinema's operations in one place.</w:t>
-      </w:r>
+        <w:t>forces customers to queue at both the kiosk and the box office which is inefficient and frustrating. Several customers raised this issue in the questionnaire and it was also clearly visible during the observation visit.</w:t>
+      </w:r>
+    </w:p>
+    <w:p>
+      <w:pPr>
+        <w:tabs>
+          <w:tab w:val="num" w:pos="1440"/>
+        </w:tabs>
+        <w:spacing w:after="80"/>
+      </w:pPr>
+      <w:r>
+        <w:t>Finally the data in the existing system is spread across multiple completely disconnected sources including the paper booking diary, a food and drink stock spreadsheet and a staff rota spreadsheet. None of these communicate with each other which makes it impossible to get a complete and accurate picture of the cinema's operations in one place. This disconnection is at the root of many of the other problems identified in the investigation.</w:t>
+      </w:r>
+    </w:p>
+    <w:p>
+      <w:pPr>
+        <w:tabs>
+          <w:tab w:val="num" w:pos="1440"/>
+        </w:tabs>
+      </w:pPr>
     </w:p>
     <w:p>
       <w:pPr>
@@ -3495,70 +3843,345 @@
         <w:tabs>
           <w:tab w:val="num" w:pos="1440"/>
         </w:tabs>
-      </w:pPr>
-      <w:r>
-        <w:t>Having thoroughly investigated the existing system at Filmtopia through interviews with the cinema manager Sarah Henshaw and box office staff member Jake Pemberton, a customer questionnaire, observation of the current processes and desk based research into similar cinema systems, it is now possible to clearly define the problem that the proposed solution must address.</w:t>
-      </w:r>
-    </w:p>
-    <w:p>
-      <w:pPr>
-        <w:tabs>
-          <w:tab w:val="num" w:pos="1440"/>
-        </w:tabs>
-      </w:pPr>
-      <w:r>
-        <w:t>Filmtopia is a small independent cinema that is currently managing all of its business operations using paper records and disconnected spreadsheets. This approach was adequate when the cinema was first established but has become increasingly problematic as the demands on the system have grown. The core problem is that the existing system is unreliable, slow and disconnected, resulting in a poor experience for both customers and staff.</w:t>
-      </w:r>
-    </w:p>
-    <w:p>
-      <w:pPr>
-        <w:tabs>
-          <w:tab w:val="num" w:pos="1440"/>
-        </w:tabs>
-      </w:pPr>
-      <w:r>
-        <w:t>The most critical issue is the risk of double bookings. Because seat allocations are recorded manually in a paper diary with no real time updating, two members of staff can independently assign the same seat to different customers without either being aware. This directly damages customer satisfaction and the reputation of the cinema. This issue will be addressed by Objective 1 in the following section.</w:t>
-      </w:r>
-    </w:p>
-    <w:p>
-      <w:pPr>
-        <w:tabs>
-          <w:tab w:val="num" w:pos="1440"/>
-        </w:tabs>
-      </w:pPr>
-      <w:r>
-        <w:t>A secondary but equally significant problem is the disconnected nature of the existing system. Ticketing, food and drink ordering, stock management and staff scheduling are all handled through separate paper or spreadsheet based systems that do not communicate with each other. This means that the manager has no way of viewing a complete picture of the cinema's operations without manually compiling data from multiple sources. This will be addressed by Objectives 2 and 3.</w:t>
-      </w:r>
-    </w:p>
-    <w:p>
-      <w:pPr>
-        <w:tabs>
-          <w:tab w:val="num" w:pos="1440"/>
-        </w:tabs>
-      </w:pPr>
-      <w:r>
-        <w:t xml:space="preserve">The customer facing experience is also severely limited by the current system. The touchscreen kiosk installed at the cinema can only handle food and drink orders and cannot sell tickets, which forces customers to queue at both the kiosk and the box office. Research into similar systems such as Vue and Odeon has shown that </w:t>
-      </w:r>
-      <w:r>
+        <w:spacing w:after="80"/>
+        <w:rPr>
+          <w:lang w:val="en-US"/>
+        </w:rPr>
+      </w:pPr>
+      <w:r>
+        <w:rPr>
+          <w:lang w:val="en-US"/>
+        </w:rPr>
+        <w:t>Having completed the investigation through interviews, a customer questionnaire, direct observation and desk based research, it is now possible to clearly define the problem that the proposed solution needs to address. The purpose of this section is to bring together the key findings from the investigation and explain precisely what needs to change and why.</w:t>
+      </w:r>
+    </w:p>
+    <w:p>
+      <w:pPr>
+        <w:tabs>
+          <w:tab w:val="num" w:pos="1440"/>
+        </w:tabs>
+        <w:spacing w:after="80"/>
+        <w:rPr>
+          <w:lang w:val="en-US"/>
+        </w:rPr>
+      </w:pPr>
+      <w:proofErr w:type="spellStart"/>
+      <w:r>
+        <w:rPr>
+          <w:lang w:val="en-US"/>
+        </w:rPr>
+        <w:t>Filmtopia</w:t>
+      </w:r>
+      <w:proofErr w:type="spellEnd"/>
+      <w:r>
+        <w:rPr>
+          <w:lang w:val="en-US"/>
+        </w:rPr>
+        <w:t xml:space="preserve"> is a small independent cinema that is currently managing all of its operations using a combination of paper records and disconnected spreadsheets. This approach may have been adequate when the cinema first opened but it has become increasingly problematic as the demands on the system have grown. The core problem is that the existing system is unreliable, slow and disconnected, and this is having a direct negative impact on both staff and customers.</w:t>
+      </w:r>
+    </w:p>
+    <w:p>
+      <w:pPr>
+        <w:tabs>
+          <w:tab w:val="num" w:pos="1440"/>
+        </w:tabs>
+        <w:spacing w:after="80"/>
+        <w:rPr>
+          <w:lang w:val="en-US"/>
+        </w:rPr>
+      </w:pPr>
+      <w:r>
+        <w:rPr>
+          <w:lang w:val="en-US"/>
+        </w:rPr>
+        <w:t xml:space="preserve">The most critical issue identified through the investigation is the risk of double bookings. Because seat allocations are recorded manually in a paper diary with no real time updating, two members of staff can independently assign the same seat to different customers for the same screening without either being aware of it. This was confirmed by both members of staff interviewed and by 65% of customers in the questionnaire who reported having experienced a problem when booking at </w:t>
+      </w:r>
+      <w:proofErr w:type="spellStart"/>
+      <w:r>
+        <w:rPr>
+          <w:lang w:val="en-US"/>
+        </w:rPr>
+        <w:t>Filmtopia</w:t>
+      </w:r>
+      <w:proofErr w:type="spellEnd"/>
+      <w:r>
+        <w:rPr>
+          <w:lang w:val="en-US"/>
+        </w:rPr>
+        <w:t>. It was also directly observed during the site visit. This is not an occasional or minor issue but a fundamental flaw in how the existing system manages booking data. A relational database with referential integrity enforced between the relevant tables will directly address this by ensuring that once a seat is recorded as booked for a particular screening it cannot be booked again.</w:t>
+      </w:r>
+    </w:p>
+    <w:p>
+      <w:pPr>
+        <w:tabs>
+          <w:tab w:val="num" w:pos="1440"/>
+        </w:tabs>
+        <w:spacing w:after="80"/>
+        <w:rPr>
+          <w:lang w:val="en-US"/>
+        </w:rPr>
+      </w:pPr>
+      <w:r>
+        <w:rPr>
+          <w:lang w:val="en-US"/>
+        </w:rPr>
+        <w:t xml:space="preserve">The second major problem is the disconnected nature of the existing system. Ticketing, food and drink ordering, stock management and staff scheduling are all handled through separate paper or spreadsheet based systems that do not communicate with each other in any way. This means the manager has no way of viewing a complete picture of the cinema's operations without manually compiling data from multiple sources which is both time consuming and prone to error. A </w:t>
+      </w:r>
+      <w:proofErr w:type="spellStart"/>
+      <w:r>
+        <w:rPr>
+          <w:lang w:val="en-US"/>
+        </w:rPr>
+        <w:t>centralised</w:t>
+      </w:r>
+      <w:proofErr w:type="spellEnd"/>
+      <w:r>
+        <w:rPr>
+          <w:lang w:val="en-US"/>
+        </w:rPr>
+        <w:t xml:space="preserve"> relational database will resolve this by storing all of the cinema's operational data in one place with clearly defined relationships between tables, making it possible to retrieve and cross reference data quickly and accurately.</w:t>
+      </w:r>
+    </w:p>
+    <w:p>
+      <w:pPr>
+        <w:tabs>
+          <w:tab w:val="num" w:pos="1440"/>
+        </w:tabs>
+        <w:spacing w:after="80"/>
+        <w:rPr>
+          <w:lang w:val="en-US"/>
+        </w:rPr>
+      </w:pPr>
+      <w:r>
+        <w:rPr>
+          <w:lang w:val="en-US"/>
+        </w:rPr>
+        <w:t xml:space="preserve">The third significant problem is the poor customer facing experience. The kiosk currently installed in the cinema can only handle food and drink orders and cannot sell tickets, which forces customers to queue at both the kiosk and the box office. This was raised by multiple customers in the questionnaire and observed directly during the site visit. The proposed solution will address this by providing a </w:t>
+      </w:r>
+      <w:r>
+        <w:rPr>
+          <w:lang w:val="en-US"/>
+        </w:rPr>
         <w:lastRenderedPageBreak/>
-        <w:t>customers expect to be able to purchase tickets and food through a single self service interface. This will be addressed by Objective 4.</w:t>
-      </w:r>
-    </w:p>
-    <w:p>
-      <w:pPr>
-        <w:tabs>
-          <w:tab w:val="num" w:pos="1440"/>
-        </w:tabs>
-      </w:pPr>
-      <w:r>
-        <w:t xml:space="preserve">The proposed solution is a Visual Basic .NET Windows Forms application built in Visual Studio, using OleDb to manage the connection between the application and a Microsoft Access database. Visual Basic .NET has been chosen because it allows rapid development of graphical Windows applications with a professional user interface and is the language used throughout this course. OleDb has been chosen as the database connectivity method because it provides a straightforward and reliable way of connecting a Visual Basic .NET application to a Microsoft Access </w:t>
-      </w:r>
-      <w:r>
-        <w:t>.m</w:t>
-      </w:r>
-      <w:r>
-        <w:t>db file, allowing SQL queries to be executed directly from the application code to insert, update, delete and retrieve records. Microsoft Access has been chosen as the database solution because it provides a relational database structure that can enforce data integrity, prevent duplicate records and store all of Filmtopia's data in one centralised location. This combination of technologies directly addresses the core problems identified in the investigation and will allow the development of a fully functioning cinema management system within the scope of this project.</w:t>
-      </w:r>
+        <w:t>customer kiosk interface through which customers can browse films, select a screening, choose their seats and add food and drink items to their order in a single joined up process.</w:t>
+      </w:r>
+    </w:p>
+    <w:p>
+      <w:pPr>
+        <w:tabs>
+          <w:tab w:val="num" w:pos="1440"/>
+        </w:tabs>
+        <w:spacing w:after="80"/>
+        <w:rPr>
+          <w:lang w:val="en-US"/>
+        </w:rPr>
+      </w:pPr>
+      <w:r>
+        <w:rPr>
+          <w:b/>
+          <w:bCs/>
+          <w:lang w:val="en-US"/>
+        </w:rPr>
+        <w:t>Requirements Analysis</w:t>
+      </w:r>
+    </w:p>
+    <w:p>
+      <w:pPr>
+        <w:tabs>
+          <w:tab w:val="num" w:pos="1440"/>
+        </w:tabs>
+        <w:spacing w:after="80"/>
+        <w:rPr>
+          <w:lang w:val="en-US"/>
+        </w:rPr>
+      </w:pPr>
+      <w:r>
+        <w:rPr>
+          <w:lang w:val="en-US"/>
+        </w:rPr>
+        <w:t>To ensure the proposed solution fully addresses the problems identified above it is helpful to break the requirements down into two categories: functional requirements and non-functional requirements.</w:t>
+      </w:r>
+    </w:p>
+    <w:p>
+      <w:pPr>
+        <w:tabs>
+          <w:tab w:val="num" w:pos="1440"/>
+        </w:tabs>
+        <w:spacing w:after="80"/>
+        <w:rPr>
+          <w:lang w:val="en-US"/>
+        </w:rPr>
+      </w:pPr>
+      <w:r>
+        <w:rPr>
+          <w:lang w:val="en-US"/>
+        </w:rPr>
+        <w:t xml:space="preserve">Functional requirements are the specific things the system must be able to do. For </w:t>
+      </w:r>
+      <w:proofErr w:type="spellStart"/>
+      <w:r>
+        <w:rPr>
+          <w:lang w:val="en-US"/>
+        </w:rPr>
+        <w:t>Filmtopia</w:t>
+      </w:r>
+      <w:proofErr w:type="spellEnd"/>
+      <w:r>
+        <w:rPr>
+          <w:lang w:val="en-US"/>
+        </w:rPr>
+        <w:t xml:space="preserve"> these include the ability to add and manage films and screenings, to display a graphical seat map showing which seats are available and which are already booked, to process customer bookings and link them to specific seats and screenings, to allow food and drink orders to be added to a booking and to generate sales reports for the manager. These requirements map directly to the objectives set out later in this investigation.</w:t>
+      </w:r>
+    </w:p>
+    <w:p>
+      <w:pPr>
+        <w:tabs>
+          <w:tab w:val="num" w:pos="1440"/>
+        </w:tabs>
+        <w:spacing w:after="80"/>
+        <w:rPr>
+          <w:lang w:val="en-US"/>
+        </w:rPr>
+      </w:pPr>
+      <w:r>
+        <w:rPr>
+          <w:lang w:val="en-US"/>
+        </w:rPr>
+        <w:t xml:space="preserve">Non-functional requirements are the qualities the system must have rather than the specific things it must do. For </w:t>
+      </w:r>
+      <w:proofErr w:type="spellStart"/>
+      <w:r>
+        <w:rPr>
+          <w:lang w:val="en-US"/>
+        </w:rPr>
+        <w:t>Filmtopia</w:t>
+      </w:r>
+      <w:proofErr w:type="spellEnd"/>
+      <w:r>
+        <w:rPr>
+          <w:lang w:val="en-US"/>
+        </w:rPr>
+        <w:t xml:space="preserve"> the most important non-functional requirements are reliability, usability and data integrity. The system must be reliable enough to be used continuously during opening hours without crashing or producing errors. It must be usable by staff with varying levels of technical confidence without extensive training. And it must maintain data integrity at all times, meaning it should never be possible for the database to reach a state where bookings are duplicated, records are incomplete or data is inconsistent between tables.</w:t>
+      </w:r>
+    </w:p>
+    <w:p>
+      <w:pPr>
+        <w:tabs>
+          <w:tab w:val="num" w:pos="1440"/>
+        </w:tabs>
+        <w:spacing w:after="80"/>
+        <w:rPr>
+          <w:lang w:val="en-US"/>
+        </w:rPr>
+      </w:pPr>
+      <w:r>
+        <w:rPr>
+          <w:b/>
+          <w:bCs/>
+          <w:lang w:val="en-US"/>
+        </w:rPr>
+        <w:t>Proposed Solution</w:t>
+      </w:r>
+    </w:p>
+    <w:p>
+      <w:pPr>
+        <w:tabs>
+          <w:tab w:val="num" w:pos="1440"/>
+        </w:tabs>
+        <w:spacing w:after="80"/>
+        <w:rPr>
+          <w:lang w:val="en-US"/>
+        </w:rPr>
+      </w:pPr>
+      <w:r>
+        <w:rPr>
+          <w:lang w:val="en-US"/>
+        </w:rPr>
+        <w:t xml:space="preserve">The proposed solution is a Visual Basic .NET Windows Forms application built in Visual Studio, using </w:t>
+      </w:r>
+      <w:proofErr w:type="spellStart"/>
+      <w:r>
+        <w:rPr>
+          <w:lang w:val="en-US"/>
+        </w:rPr>
+        <w:t>OleDb</w:t>
+      </w:r>
+      <w:proofErr w:type="spellEnd"/>
+      <w:r>
+        <w:rPr>
+          <w:lang w:val="en-US"/>
+        </w:rPr>
+        <w:t xml:space="preserve"> to manage the connection between the application and a Microsoft Access database stored in the Access 2002 to 2003 .</w:t>
+      </w:r>
+      <w:proofErr w:type="spellStart"/>
+      <w:r>
+        <w:rPr>
+          <w:lang w:val="en-US"/>
+        </w:rPr>
+        <w:t>mdb</w:t>
+      </w:r>
+      <w:proofErr w:type="spellEnd"/>
+      <w:r>
+        <w:rPr>
+          <w:lang w:val="en-US"/>
+        </w:rPr>
+        <w:t xml:space="preserve"> format. Visual Basic .NET has been chosen because it is the language used throughout this course and it allows the rapid development of graphical Windows applications with a professional user interface. </w:t>
+      </w:r>
+      <w:proofErr w:type="spellStart"/>
+      <w:r>
+        <w:rPr>
+          <w:lang w:val="en-US"/>
+        </w:rPr>
+        <w:t>OleDb</w:t>
+      </w:r>
+      <w:proofErr w:type="spellEnd"/>
+      <w:r>
+        <w:rPr>
+          <w:lang w:val="en-US"/>
+        </w:rPr>
+        <w:t xml:space="preserve"> has been chosen as the database connectivity method because it provides a straightforward and reliable way of connecting a Visual Basic .NET application to a Microsoft Access database, allowing SQL queries to be executed directly from the application code to insert, update, delete and retrieve records. Microsoft Access has been chosen as the database because it supports a full relational structure with primary keys, foreign keys and referential integrity which directly addresses the data management problems identified in the investigation.</w:t>
+      </w:r>
+    </w:p>
+    <w:p>
+      <w:pPr>
+        <w:tabs>
+          <w:tab w:val="num" w:pos="1440"/>
+        </w:tabs>
+        <w:spacing w:after="80"/>
+        <w:rPr>
+          <w:lang w:val="en-US"/>
+        </w:rPr>
+      </w:pPr>
+      <w:r>
+        <w:rPr>
+          <w:lang w:val="en-US"/>
+        </w:rPr>
+        <w:t xml:space="preserve">The system will support three distinct user types each with their own interface and access level. Customers will access the system through a </w:t>
+      </w:r>
+      <w:proofErr w:type="spellStart"/>
+      <w:r>
+        <w:rPr>
+          <w:lang w:val="en-US"/>
+        </w:rPr>
+        <w:t>self service</w:t>
+      </w:r>
+      <w:proofErr w:type="spellEnd"/>
+      <w:r>
+        <w:rPr>
+          <w:lang w:val="en-US"/>
+        </w:rPr>
+        <w:t xml:space="preserve"> kiosk interface. Staff will be able to log in to manage bookings and screenings. The manager will have full access to all areas of the system including film management and sales reporting. Access levels will be enforced through the login system to ensure that users can only access the parts of the system that are relevant to their role.</w:t>
+      </w:r>
+    </w:p>
+    <w:p>
+      <w:pPr>
+        <w:tabs>
+          <w:tab w:val="num" w:pos="1440"/>
+        </w:tabs>
+        <w:rPr>
+          <w:lang w:val="en-US"/>
+        </w:rPr>
+      </w:pPr>
     </w:p>
     <w:p>
       <w:pPr>
@@ -3597,7 +4220,16 @@
         </w:tabs>
       </w:pPr>
       <w:r>
-        <w:t>Whilst the proposed Filmtopia system will address the core problems identified in the investigation, there are several areas that will not be included in the solution due to constraints of time, scope and available hardware and software. These limitations are outlined below.</w:t>
+        <w:lastRenderedPageBreak/>
+        <w:t xml:space="preserve">Whilst the proposed </w:t>
+      </w:r>
+      <w:proofErr w:type="spellStart"/>
+      <w:r>
+        <w:t>Filmtopia</w:t>
+      </w:r>
+      <w:proofErr w:type="spellEnd"/>
+      <w:r>
+        <w:t xml:space="preserve"> system will address the core problems identified in the investigation, there are several areas that will not be included in the solution due to constraints of time, scope and available hardware and software. These limitations are outlined below.</w:t>
       </w:r>
     </w:p>
     <w:p>
@@ -3637,27 +4269,33 @@
         </w:tabs>
       </w:pPr>
       <w:r>
-        <w:t>The system will not support multiple simultaneous users over a network. Whilst OleDb connections to a Microsoft Access database can technically support multiple users, developing a fully networked multi-user system with appropriate concurrency controls and conflict resolution is beyond the scope of this project. The system will be designed for use on a single machine or a small number of machines accessing the same .</w:t>
-      </w:r>
-      <w:r>
-        <w:t>m</w:t>
-      </w:r>
-      <w:r>
-        <w:t>db database file locally.</w:t>
-      </w:r>
-    </w:p>
-    <w:p>
-      <w:pPr>
-        <w:tabs>
-          <w:tab w:val="num" w:pos="1440"/>
-        </w:tabs>
-      </w:pPr>
-      <w:r>
-        <w:t xml:space="preserve">The system will not include automated staff scheduling or payroll functionality. Managing staff rotas and wages involves complex business logic and legal </w:t>
-      </w:r>
-      <w:r>
-        <w:lastRenderedPageBreak/>
-        <w:t>considerations that are outside the scope of this project. Staff management features will be limited to basic record keeping.</w:t>
+        <w:t xml:space="preserve">The system will not support multiple simultaneous users over a network. Whilst </w:t>
+      </w:r>
+      <w:proofErr w:type="spellStart"/>
+      <w:r>
+        <w:t>OleDb</w:t>
+      </w:r>
+      <w:proofErr w:type="spellEnd"/>
+      <w:r>
+        <w:t xml:space="preserve"> connections to a Microsoft Access database can technically support multiple users, developing a fully networked multi-user system with appropriate concurrency controls and conflict resolution is beyond the scope of this project. The system will be designed for use on a single machine or a small number of machines accessing the same .</w:t>
+      </w:r>
+      <w:proofErr w:type="spellStart"/>
+      <w:r>
+        <w:t>mdb</w:t>
+      </w:r>
+      <w:proofErr w:type="spellEnd"/>
+      <w:r>
+        <w:t xml:space="preserve"> database file locally.</w:t>
+      </w:r>
+    </w:p>
+    <w:p>
+      <w:pPr>
+        <w:tabs>
+          <w:tab w:val="num" w:pos="1440"/>
+        </w:tabs>
+      </w:pPr>
+      <w:r>
+        <w:t>The system will not include automated staff scheduling or payroll functionality. Managing staff rotas and wages involves complex business logic and legal considerations that are outside the scope of this project. Staff management features will be limited to basic record keeping.</w:t>
       </w:r>
     </w:p>
     <w:p>
@@ -3745,6 +4383,7 @@
           <w:b/>
           <w:bCs/>
         </w:rPr>
+        <w:lastRenderedPageBreak/>
         <w:t>Objective 2: The system must prevent double bookings by ensuring that a seat which has already been allocated to a customer cannot be selected by another customer for the same screening.</w:t>
       </w:r>
     </w:p>
@@ -3827,83 +4466,91 @@
         </w:tabs>
       </w:pPr>
       <w:r>
-        <w:t xml:space="preserve">Success Criteria: Food and drink items should be displayed on a clearly navigable menu during the booking process. A customer should be able to add multiple items to their </w:t>
+        <w:t>Success Criteria: Food and drink items should be displayed on a clearly navigable menu during the booking process. A customer should be able to add multiple items to their order. The food and drink order should be saved to the database linked to the correct booking record.</w:t>
+      </w:r>
+    </w:p>
+    <w:p>
+      <w:pPr>
+        <w:tabs>
+          <w:tab w:val="num" w:pos="1440"/>
+        </w:tabs>
+      </w:pPr>
+      <w:r>
+        <w:rPr>
+          <w:b/>
+          <w:bCs/>
+        </w:rPr>
+        <w:t>Objective 6: The system must allow staff and managers to add new films to the system, including the film title, age rating, duration and description.</w:t>
+      </w:r>
+    </w:p>
+    <w:p>
+      <w:pPr>
+        <w:tabs>
+          <w:tab w:val="num" w:pos="1440"/>
+        </w:tabs>
+      </w:pPr>
+      <w:r>
+        <w:t>Success Criteria: A new film record should be saved to the database in under 20 seconds with all required fields validated. The film should immediately appear in the list of available films when adding a new screening. Duplicate film titles should be prevented through validation.</w:t>
+      </w:r>
+    </w:p>
+    <w:p>
+      <w:pPr>
+        <w:tabs>
+          <w:tab w:val="num" w:pos="1440"/>
+        </w:tabs>
+      </w:pPr>
+      <w:r>
+        <w:rPr>
+          <w:b/>
+          <w:bCs/>
+        </w:rPr>
+        <w:t>Objective 7: The system must allow staff and managers to add new screenings for existing films, specifying the screen, date, time and ticket price.</w:t>
+      </w:r>
+    </w:p>
+    <w:p>
+      <w:pPr>
+        <w:tabs>
+          <w:tab w:val="num" w:pos="1440"/>
+        </w:tabs>
+      </w:pPr>
+      <w:r>
+        <w:t>Success Criteria: A new screening record should be saved to the database correctly linked to the selected film. The screening should immediately appear in the list of available screenings on the customer kiosk. Validation should prevent a screening being added without a valid date, time, screen and ticket price.</w:t>
+      </w:r>
+    </w:p>
+    <w:p>
+      <w:pPr>
+        <w:tabs>
+          <w:tab w:val="num" w:pos="1440"/>
+        </w:tabs>
+      </w:pPr>
+      <w:r>
+        <w:rPr>
+          <w:b/>
+          <w:bCs/>
+        </w:rPr>
+        <w:t>Objective 8: The system must allow the manager to view a sales report showing total ticket sales and revenue for a selected date range.</w:t>
+      </w:r>
+    </w:p>
+    <w:p>
+      <w:pPr>
+        <w:tabs>
+          <w:tab w:val="num" w:pos="1440"/>
+        </w:tabs>
+      </w:pPr>
+      <w:r>
+        <w:t xml:space="preserve">Success Criteria: The report should be generated using an SQL query through the </w:t>
+      </w:r>
+      <w:proofErr w:type="spellStart"/>
+      <w:r>
+        <w:t>OleDb</w:t>
+      </w:r>
+      <w:proofErr w:type="spellEnd"/>
+      <w:r>
+        <w:t xml:space="preserve"> connection and displayed on screen within 5 seconds of the date range being selected. The report should show </w:t>
       </w:r>
       <w:r>
         <w:lastRenderedPageBreak/>
-        <w:t>order. The food and drink order should be saved to the database linked to the correct booking record.</w:t>
-      </w:r>
-    </w:p>
-    <w:p>
-      <w:pPr>
-        <w:tabs>
-          <w:tab w:val="num" w:pos="1440"/>
-        </w:tabs>
-      </w:pPr>
-      <w:r>
-        <w:rPr>
-          <w:b/>
-          <w:bCs/>
-        </w:rPr>
-        <w:t>Objective 6: The system must allow staff and managers to add new films to the system, including the film title, age rating, duration and description.</w:t>
-      </w:r>
-    </w:p>
-    <w:p>
-      <w:pPr>
-        <w:tabs>
-          <w:tab w:val="num" w:pos="1440"/>
-        </w:tabs>
-      </w:pPr>
-      <w:r>
-        <w:t>Success Criteria: A new film record should be saved to the database in under 20 seconds with all required fields validated. The film should immediately appear in the list of available films when adding a new screening. Duplicate film titles should be prevented through validation.</w:t>
-      </w:r>
-    </w:p>
-    <w:p>
-      <w:pPr>
-        <w:tabs>
-          <w:tab w:val="num" w:pos="1440"/>
-        </w:tabs>
-      </w:pPr>
-      <w:r>
-        <w:rPr>
-          <w:b/>
-          <w:bCs/>
-        </w:rPr>
-        <w:t>Objective 7: The system must allow staff and managers to add new screenings for existing films, specifying the screen, date, time and ticket price.</w:t>
-      </w:r>
-    </w:p>
-    <w:p>
-      <w:pPr>
-        <w:tabs>
-          <w:tab w:val="num" w:pos="1440"/>
-        </w:tabs>
-      </w:pPr>
-      <w:r>
-        <w:t>Success Criteria: A new screening record should be saved to the database correctly linked to the selected film. The screening should immediately appear in the list of available screenings on the customer kiosk. Validation should prevent a screening being added without a valid date, time, screen and ticket price.</w:t>
-      </w:r>
-    </w:p>
-    <w:p>
-      <w:pPr>
-        <w:tabs>
-          <w:tab w:val="num" w:pos="1440"/>
-        </w:tabs>
-      </w:pPr>
-      <w:r>
-        <w:rPr>
-          <w:b/>
-          <w:bCs/>
-        </w:rPr>
-        <w:t>Objective 8: The system must allow the manager to view a sales report showing total ticket sales and revenue for a selected date range.</w:t>
-      </w:r>
-    </w:p>
-    <w:p>
-      <w:pPr>
-        <w:tabs>
-          <w:tab w:val="num" w:pos="1440"/>
-        </w:tabs>
-      </w:pPr>
-      <w:r>
-        <w:t>Success Criteria: The report should be generated using an SQL query through the OleDb connection and displayed on screen within 5 seconds of the date range being selected. The report should show the correct total number of tickets sold and total revenue for the selected period, calculated directly from the bookings in the database.</w:t>
+        <w:t>the correct total number of tickets sold and total revenue for the selected period, calculated directly from the bookings in the database.</w:t>
       </w:r>
     </w:p>
     <w:p>
@@ -3999,82 +4646,87 @@
         </w:tabs>
       </w:pPr>
       <w:r>
-        <w:t xml:space="preserve">Success Criteria: Cancelling a booking should update the database immediately so the seats become available for other customers. A confirmation prompt should be </w:t>
-      </w:r>
+        <w:t>Success Criteria: Cancelling a booking should update the database immediately so the seats become available for other customers. A confirmation prompt should be displayed before any booking is deleted. The cancelled booking should no longer appear in the active bookings list.</w:t>
+      </w:r>
+    </w:p>
+    <w:p>
+      <w:pPr>
+        <w:tabs>
+          <w:tab w:val="num" w:pos="1440"/>
+        </w:tabs>
+      </w:pPr>
+      <w:r>
+        <w:rPr>
+          <w:b/>
+          <w:bCs/>
+        </w:rPr>
+        <w:t>Objective 13: The system must validate all data entered by users to prevent invalid or incomplete records being saved to the database.</w:t>
+      </w:r>
+    </w:p>
+    <w:p>
+      <w:pPr>
+        <w:tabs>
+          <w:tab w:val="num" w:pos="1440"/>
+        </w:tabs>
+      </w:pPr>
+      <w:r>
+        <w:t>Success Criteria: All required fields should be validated before a record is saved. Numeric fields should only accept numbers. Date fields should only accept valid dates. Text fields should have appropriate maximum lengths enforced. An informative error message should be displayed for each validation failure explaining what needs to be corrected.</w:t>
+      </w:r>
+    </w:p>
+    <w:p>
+      <w:pPr>
+        <w:tabs>
+          <w:tab w:val="num" w:pos="1440"/>
+        </w:tabs>
+      </w:pPr>
+      <w:r>
+        <w:rPr>
+          <w:b/>
+          <w:bCs/>
+        </w:rPr>
+        <w:t>Objective 14: The system must have a consistent and professional user interface across all forms, using a uniform colour scheme, layout and naming convention throughout.</w:t>
+      </w:r>
+    </w:p>
+    <w:p>
+      <w:pPr>
+        <w:tabs>
+          <w:tab w:val="num" w:pos="1440"/>
+        </w:tabs>
+      </w:pPr>
+      <w:r>
+        <w:t xml:space="preserve">Success Criteria: All forms should use the same colour scheme, font and button placement. Navigation buttons should appear in consistent positions across all forms. The system should look professional and be immediately recognisable as a </w:t>
+      </w:r>
+      <w:proofErr w:type="spellStart"/>
+      <w:r>
+        <w:t>Filmtopia</w:t>
+      </w:r>
+      <w:proofErr w:type="spellEnd"/>
+      <w:r>
+        <w:t xml:space="preserve"> branded application.</w:t>
+      </w:r>
+    </w:p>
+    <w:p>
+      <w:pPr>
+        <w:tabs>
+          <w:tab w:val="num" w:pos="1440"/>
+        </w:tabs>
+      </w:pPr>
+      <w:r>
+        <w:rPr>
+          <w:b/>
+          <w:bCs/>
+        </w:rPr>
+        <w:t>Objective 15: The system must be easy to navigate, with clearly labelled menus and buttons that allow staff and customers to find the function they need without requiring technical knowledge.</w:t>
+      </w:r>
+    </w:p>
+    <w:p>
+      <w:pPr>
+        <w:tabs>
+          <w:tab w:val="num" w:pos="1440"/>
+        </w:tabs>
+      </w:pPr>
       <w:r>
         <w:lastRenderedPageBreak/>
-        <w:t>displayed before any booking is deleted. The cancelled booking should no longer appear in the active bookings list.</w:t>
-      </w:r>
-    </w:p>
-    <w:p>
-      <w:pPr>
-        <w:tabs>
-          <w:tab w:val="num" w:pos="1440"/>
-        </w:tabs>
-      </w:pPr>
-      <w:r>
-        <w:rPr>
-          <w:b/>
-          <w:bCs/>
-        </w:rPr>
-        <w:t>Objective 13: The system must validate all data entered by users to prevent invalid or incomplete records being saved to the database.</w:t>
-      </w:r>
-    </w:p>
-    <w:p>
-      <w:pPr>
-        <w:tabs>
-          <w:tab w:val="num" w:pos="1440"/>
-        </w:tabs>
-      </w:pPr>
-      <w:r>
-        <w:t>Success Criteria: All required fields should be validated before a record is saved. Numeric fields should only accept numbers. Date fields should only accept valid dates. Text fields should have appropriate maximum lengths enforced. An informative error message should be displayed for each validation failure explaining what needs to be corrected.</w:t>
-      </w:r>
-    </w:p>
-    <w:p>
-      <w:pPr>
-        <w:tabs>
-          <w:tab w:val="num" w:pos="1440"/>
-        </w:tabs>
-      </w:pPr>
-      <w:r>
-        <w:rPr>
-          <w:b/>
-          <w:bCs/>
-        </w:rPr>
-        <w:t>Objective 14: The system must have a consistent and professional user interface across all forms, using a uniform colour scheme, layout and naming convention throughout.</w:t>
-      </w:r>
-    </w:p>
-    <w:p>
-      <w:pPr>
-        <w:tabs>
-          <w:tab w:val="num" w:pos="1440"/>
-        </w:tabs>
-      </w:pPr>
-      <w:r>
-        <w:t>Success Criteria: All forms should use the same colour scheme, font and button placement. Navigation buttons should appear in consistent positions across all forms. The system should look professional and be immediately recognisable as a Filmtopia branded application.</w:t>
-      </w:r>
-    </w:p>
-    <w:p>
-      <w:pPr>
-        <w:tabs>
-          <w:tab w:val="num" w:pos="1440"/>
-        </w:tabs>
-      </w:pPr>
-      <w:r>
-        <w:rPr>
-          <w:b/>
-          <w:bCs/>
-        </w:rPr>
-        <w:t>Objective 15: The system must be easy to navigate, with clearly labelled menus and buttons that allow staff and customers to find the function they need without requiring technical knowledge.</w:t>
-      </w:r>
-    </w:p>
-    <w:p>
-      <w:pPr>
-        <w:tabs>
-          <w:tab w:val="num" w:pos="1440"/>
-        </w:tabs>
-      </w:pPr>
-      <w:r>
         <w:t>Success Criteria: A new member of staff should be able to complete a basic booking using the system without any training beyond a brief introduction. All buttons and menu options should use clear plain English labels. The system should never reach a state where the user cannot navigate back to the main menu.</w:t>
       </w:r>
     </w:p>
@@ -4085,16 +4737,12 @@
         </w:tabs>
       </w:pPr>
     </w:p>
+    <w:p/>
     <w:p/>
     <w:sectPr>
-      <w:headerReference w:type="even" r:id="rId15"/>
-      <w:headerReference w:type="default" r:id="rId16"/>
-      <w:footerReference w:type="even" r:id="rId17"/>
-      <w:footerReference w:type="default" r:id="rId18"/>
-      <w:headerReference w:type="first" r:id="rId19"/>
-      <w:footerReference w:type="first" r:id="rId20"/>
-      <w:pgSz w:w="11906" w:h="16838"/>
-      <w:pgMar w:top="1440" w:right="1440" w:bottom="1440" w:left="1440" w:header="708" w:footer="708" w:gutter="0"/>
+      <w:headerReference w:type="default" r:id="rId12"/>
+      <w:pgSz w:w="11906" w:h="16838" w:code="9"/>
+      <w:pgMar w:top="720" w:right="720" w:bottom="720" w:left="720" w:header="708" w:footer="708" w:gutter="0"/>
       <w:cols w:space="708"/>
       <w:docGrid w:linePitch="360"/>
     </w:sectPr>
@@ -4102,97 +4750,7 @@
 </w:document>
 </file>
 
-<file path=word/endnotes.xml><?xml version="1.0" encoding="utf-8"?>
-<w:endnotes xmlns:wpc="http://schemas.microsoft.com/office/word/2010/wordprocessingCanvas" xmlns:cx="http://schemas.microsoft.com/office/drawing/2014/chartex" xmlns:cx1="http://schemas.microsoft.com/office/drawing/2015/9/8/chartex" xmlns:cx2="http://schemas.microsoft.com/office/drawing/2015/10/21/chartex" xmlns:cx3="http://schemas.microsoft.com/office/drawing/2016/5/9/chartex" xmlns:cx4="http://schemas.microsoft.com/office/drawing/2016/5/10/chartex" xmlns:cx5="http://schemas.microsoft.com/office/drawing/2016/5/11/chartex" xmlns:cx6="http://schemas.microsoft.com/office/drawing/2016/5/12/chartex" xmlns:cx7="http://schemas.microsoft.com/office/drawing/2016/5/13/chartex" xmlns:cx8="http://schemas.microsoft.com/office/drawing/2016/5/14/chartex" xmlns:mc="http://schemas.openxmlformats.org/markup-compatibility/2006" xmlns:aink="http://schemas.microsoft.com/office/drawing/2016/ink" xmlns:am3d="http://schemas.microsoft.com/office/drawing/2017/model3d" xmlns:o="urn:schemas-microsoft-com:office:office" xmlns:oel="http://schemas.microsoft.com/office/2019/extlst" xmlns:r="http://schemas.openxmlformats.org/officeDocument/2006/relationships" xmlns:m="http://schemas.openxmlformats.org/officeDocument/2006/math" xmlns:v="urn:schemas-microsoft-com:vml" xmlns:wp14="http://schemas.microsoft.com/office/word/2010/wordprocessingDrawing" xmlns:wp="http://schemas.openxmlformats.org/drawingml/2006/wordprocessingDrawing" xmlns:w10="urn:schemas-microsoft-com:office:word" xmlns:w="http://schemas.openxmlformats.org/wordprocessingml/2006/main" xmlns:w14="http://schemas.microsoft.com/office/word/2010/wordml" xmlns:w15="http://schemas.microsoft.com/office/word/2012/wordml" xmlns:w16cex="http://schemas.microsoft.com/office/word/2018/wordml/cex" xmlns:w16cid="http://schemas.microsoft.com/office/word/2016/wordml/cid" xmlns:w16="http://schemas.microsoft.com/office/word/2018/wordml" xmlns:w16du="http://schemas.microsoft.com/office/word/2023/wordml/word16du" xmlns:w16sdtdh="http://schemas.microsoft.com/office/word/2020/wordml/sdtdatahash" xmlns:w16sdtfl="http://schemas.microsoft.com/office/word/2024/wordml/sdtformatlock" xmlns:w16se="http://schemas.microsoft.com/office/word/2015/wordml/symex" xmlns:wpg="http://schemas.microsoft.com/office/word/2010/wordprocessingGroup" xmlns:wpi="http://schemas.microsoft.com/office/word/2010/wordprocessingInk" xmlns:wne="http://schemas.microsoft.com/office/word/2006/wordml" xmlns:wps="http://schemas.microsoft.com/office/word/2010/wordprocessingShape" mc:Ignorable="w14 w15 w16se w16cid w16 w16cex w16sdtdh w16sdtfl w16du wp14">
-  <w:endnote w:type="separator" w:id="-1">
-    <w:p>
-      <w:pPr>
-        <w:spacing w:after="0"/>
-      </w:pPr>
-      <w:r>
-        <w:separator/>
-      </w:r>
-    </w:p>
-  </w:endnote>
-  <w:endnote w:type="continuationSeparator" w:id="0">
-    <w:p>
-      <w:pPr>
-        <w:spacing w:after="0"/>
-      </w:pPr>
-      <w:r>
-        <w:continuationSeparator/>
-      </w:r>
-    </w:p>
-  </w:endnote>
-</w:endnotes>
-</file>
-
-<file path=word/footer1.xml><?xml version="1.0" encoding="utf-8"?>
-<w:ftr xmlns:wpc="http://schemas.microsoft.com/office/word/2010/wordprocessingCanvas" xmlns:cx="http://schemas.microsoft.com/office/drawing/2014/chartex" xmlns:cx1="http://schemas.microsoft.com/office/drawing/2015/9/8/chartex" xmlns:cx2="http://schemas.microsoft.com/office/drawing/2015/10/21/chartex" xmlns:cx3="http://schemas.microsoft.com/office/drawing/2016/5/9/chartex" xmlns:cx4="http://schemas.microsoft.com/office/drawing/2016/5/10/chartex" xmlns:cx5="http://schemas.microsoft.com/office/drawing/2016/5/11/chartex" xmlns:cx6="http://schemas.microsoft.com/office/drawing/2016/5/12/chartex" xmlns:cx7="http://schemas.microsoft.com/office/drawing/2016/5/13/chartex" xmlns:cx8="http://schemas.microsoft.com/office/drawing/2016/5/14/chartex" xmlns:mc="http://schemas.openxmlformats.org/markup-compatibility/2006" xmlns:aink="http://schemas.microsoft.com/office/drawing/2016/ink" xmlns:am3d="http://schemas.microsoft.com/office/drawing/2017/model3d" xmlns:o="urn:schemas-microsoft-com:office:office" xmlns:oel="http://schemas.microsoft.com/office/2019/extlst" xmlns:r="http://schemas.openxmlformats.org/officeDocument/2006/relationships" xmlns:m="http://schemas.openxmlformats.org/officeDocument/2006/math" xmlns:v="urn:schemas-microsoft-com:vml" xmlns:wp14="http://schemas.microsoft.com/office/word/2010/wordprocessingDrawing" xmlns:wp="http://schemas.openxmlformats.org/drawingml/2006/wordprocessingDrawing" xmlns:w10="urn:schemas-microsoft-com:office:word" xmlns:w="http://schemas.openxmlformats.org/wordprocessingml/2006/main" xmlns:w14="http://schemas.microsoft.com/office/word/2010/wordml" xmlns:w15="http://schemas.microsoft.com/office/word/2012/wordml" xmlns:w16cex="http://schemas.microsoft.com/office/word/2018/wordml/cex" xmlns:w16cid="http://schemas.microsoft.com/office/word/2016/wordml/cid" xmlns:w16="http://schemas.microsoft.com/office/word/2018/wordml" xmlns:w16du="http://schemas.microsoft.com/office/word/2023/wordml/word16du" xmlns:w16sdtdh="http://schemas.microsoft.com/office/word/2020/wordml/sdtdatahash" xmlns:w16sdtfl="http://schemas.microsoft.com/office/word/2024/wordml/sdtformatlock" xmlns:w16se="http://schemas.microsoft.com/office/word/2015/wordml/symex" xmlns:wpg="http://schemas.microsoft.com/office/word/2010/wordprocessingGroup" xmlns:wpi="http://schemas.microsoft.com/office/word/2010/wordprocessingInk" xmlns:wne="http://schemas.microsoft.com/office/word/2006/wordml" xmlns:wps="http://schemas.microsoft.com/office/word/2010/wordprocessingShape" mc:Ignorable="w14 w15 w16se w16cid w16 w16cex w16sdtdh w16sdtfl w16du wp14">
-  <w:p>
-    <w:pPr>
-      <w:pStyle w:val="Footer"/>
-    </w:pPr>
-  </w:p>
-</w:ftr>
-</file>
-
-<file path=word/footer2.xml><?xml version="1.0" encoding="utf-8"?>
-<w:ftr xmlns:wpc="http://schemas.microsoft.com/office/word/2010/wordprocessingCanvas" xmlns:cx="http://schemas.microsoft.com/office/drawing/2014/chartex" xmlns:cx1="http://schemas.microsoft.com/office/drawing/2015/9/8/chartex" xmlns:cx2="http://schemas.microsoft.com/office/drawing/2015/10/21/chartex" xmlns:cx3="http://schemas.microsoft.com/office/drawing/2016/5/9/chartex" xmlns:cx4="http://schemas.microsoft.com/office/drawing/2016/5/10/chartex" xmlns:cx5="http://schemas.microsoft.com/office/drawing/2016/5/11/chartex" xmlns:cx6="http://schemas.microsoft.com/office/drawing/2016/5/12/chartex" xmlns:cx7="http://schemas.microsoft.com/office/drawing/2016/5/13/chartex" xmlns:cx8="http://schemas.microsoft.com/office/drawing/2016/5/14/chartex" xmlns:mc="http://schemas.openxmlformats.org/markup-compatibility/2006" xmlns:aink="http://schemas.microsoft.com/office/drawing/2016/ink" xmlns:am3d="http://schemas.microsoft.com/office/drawing/2017/model3d" xmlns:o="urn:schemas-microsoft-com:office:office" xmlns:oel="http://schemas.microsoft.com/office/2019/extlst" xmlns:r="http://schemas.openxmlformats.org/officeDocument/2006/relationships" xmlns:m="http://schemas.openxmlformats.org/officeDocument/2006/math" xmlns:v="urn:schemas-microsoft-com:vml" xmlns:wp14="http://schemas.microsoft.com/office/word/2010/wordprocessingDrawing" xmlns:wp="http://schemas.openxmlformats.org/drawingml/2006/wordprocessingDrawing" xmlns:w10="urn:schemas-microsoft-com:office:word" xmlns:w="http://schemas.openxmlformats.org/wordprocessingml/2006/main" xmlns:w14="http://schemas.microsoft.com/office/word/2010/wordml" xmlns:w15="http://schemas.microsoft.com/office/word/2012/wordml" xmlns:w16cex="http://schemas.microsoft.com/office/word/2018/wordml/cex" xmlns:w16cid="http://schemas.microsoft.com/office/word/2016/wordml/cid" xmlns:w16="http://schemas.microsoft.com/office/word/2018/wordml" xmlns:w16du="http://schemas.microsoft.com/office/word/2023/wordml/word16du" xmlns:w16sdtdh="http://schemas.microsoft.com/office/word/2020/wordml/sdtdatahash" xmlns:w16sdtfl="http://schemas.microsoft.com/office/word/2024/wordml/sdtformatlock" xmlns:w16se="http://schemas.microsoft.com/office/word/2015/wordml/symex" xmlns:wpg="http://schemas.microsoft.com/office/word/2010/wordprocessingGroup" xmlns:wpi="http://schemas.microsoft.com/office/word/2010/wordprocessingInk" xmlns:wne="http://schemas.microsoft.com/office/word/2006/wordml" xmlns:wps="http://schemas.microsoft.com/office/word/2010/wordprocessingShape" mc:Ignorable="w14 w15 w16se w16cid w16 w16cex w16sdtdh w16sdtfl w16du wp14">
-  <w:p>
-    <w:pPr>
-      <w:pStyle w:val="Footer"/>
-    </w:pPr>
-  </w:p>
-</w:ftr>
-</file>
-
-<file path=word/footer3.xml><?xml version="1.0" encoding="utf-8"?>
-<w:ftr xmlns:wpc="http://schemas.microsoft.com/office/word/2010/wordprocessingCanvas" xmlns:cx="http://schemas.microsoft.com/office/drawing/2014/chartex" xmlns:cx1="http://schemas.microsoft.com/office/drawing/2015/9/8/chartex" xmlns:cx2="http://schemas.microsoft.com/office/drawing/2015/10/21/chartex" xmlns:cx3="http://schemas.microsoft.com/office/drawing/2016/5/9/chartex" xmlns:cx4="http://schemas.microsoft.com/office/drawing/2016/5/10/chartex" xmlns:cx5="http://schemas.microsoft.com/office/drawing/2016/5/11/chartex" xmlns:cx6="http://schemas.microsoft.com/office/drawing/2016/5/12/chartex" xmlns:cx7="http://schemas.microsoft.com/office/drawing/2016/5/13/chartex" xmlns:cx8="http://schemas.microsoft.com/office/drawing/2016/5/14/chartex" xmlns:mc="http://schemas.openxmlformats.org/markup-compatibility/2006" xmlns:aink="http://schemas.microsoft.com/office/drawing/2016/ink" xmlns:am3d="http://schemas.microsoft.com/office/drawing/2017/model3d" xmlns:o="urn:schemas-microsoft-com:office:office" xmlns:oel="http://schemas.microsoft.com/office/2019/extlst" xmlns:r="http://schemas.openxmlformats.org/officeDocument/2006/relationships" xmlns:m="http://schemas.openxmlformats.org/officeDocument/2006/math" xmlns:v="urn:schemas-microsoft-com:vml" xmlns:wp14="http://schemas.microsoft.com/office/word/2010/wordprocessingDrawing" xmlns:wp="http://schemas.openxmlformats.org/drawingml/2006/wordprocessingDrawing" xmlns:w10="urn:schemas-microsoft-com:office:word" xmlns:w="http://schemas.openxmlformats.org/wordprocessingml/2006/main" xmlns:w14="http://schemas.microsoft.com/office/word/2010/wordml" xmlns:w15="http://schemas.microsoft.com/office/word/2012/wordml" xmlns:w16cex="http://schemas.microsoft.com/office/word/2018/wordml/cex" xmlns:w16cid="http://schemas.microsoft.com/office/word/2016/wordml/cid" xmlns:w16="http://schemas.microsoft.com/office/word/2018/wordml" xmlns:w16du="http://schemas.microsoft.com/office/word/2023/wordml/word16du" xmlns:w16sdtdh="http://schemas.microsoft.com/office/word/2020/wordml/sdtdatahash" xmlns:w16sdtfl="http://schemas.microsoft.com/office/word/2024/wordml/sdtformatlock" xmlns:w16se="http://schemas.microsoft.com/office/word/2015/wordml/symex" xmlns:wpg="http://schemas.microsoft.com/office/word/2010/wordprocessingGroup" xmlns:wpi="http://schemas.microsoft.com/office/word/2010/wordprocessingInk" xmlns:wne="http://schemas.microsoft.com/office/word/2006/wordml" xmlns:wps="http://schemas.microsoft.com/office/word/2010/wordprocessingShape" mc:Ignorable="w14 w15 w16se w16cid w16 w16cex w16sdtdh w16sdtfl w16du wp14">
-  <w:p>
-    <w:pPr>
-      <w:pStyle w:val="Footer"/>
-    </w:pPr>
-  </w:p>
-</w:ftr>
-</file>
-
-<file path=word/footnotes.xml><?xml version="1.0" encoding="utf-8"?>
-<w:footnotes xmlns:wpc="http://schemas.microsoft.com/office/word/2010/wordprocessingCanvas" xmlns:cx="http://schemas.microsoft.com/office/drawing/2014/chartex" xmlns:cx1="http://schemas.microsoft.com/office/drawing/2015/9/8/chartex" xmlns:cx2="http://schemas.microsoft.com/office/drawing/2015/10/21/chartex" xmlns:cx3="http://schemas.microsoft.com/office/drawing/2016/5/9/chartex" xmlns:cx4="http://schemas.microsoft.com/office/drawing/2016/5/10/chartex" xmlns:cx5="http://schemas.microsoft.com/office/drawing/2016/5/11/chartex" xmlns:cx6="http://schemas.microsoft.com/office/drawing/2016/5/12/chartex" xmlns:cx7="http://schemas.microsoft.com/office/drawing/2016/5/13/chartex" xmlns:cx8="http://schemas.microsoft.com/office/drawing/2016/5/14/chartex" xmlns:mc="http://schemas.openxmlformats.org/markup-compatibility/2006" xmlns:aink="http://schemas.microsoft.com/office/drawing/2016/ink" xmlns:am3d="http://schemas.microsoft.com/office/drawing/2017/model3d" xmlns:o="urn:schemas-microsoft-com:office:office" xmlns:oel="http://schemas.microsoft.com/office/2019/extlst" xmlns:r="http://schemas.openxmlformats.org/officeDocument/2006/relationships" xmlns:m="http://schemas.openxmlformats.org/officeDocument/2006/math" xmlns:v="urn:schemas-microsoft-com:vml" xmlns:wp14="http://schemas.microsoft.com/office/word/2010/wordprocessingDrawing" xmlns:wp="http://schemas.openxmlformats.org/drawingml/2006/wordprocessingDrawing" xmlns:w10="urn:schemas-microsoft-com:office:word" xmlns:w="http://schemas.openxmlformats.org/wordprocessingml/2006/main" xmlns:w14="http://schemas.microsoft.com/office/word/2010/wordml" xmlns:w15="http://schemas.microsoft.com/office/word/2012/wordml" xmlns:w16cex="http://schemas.microsoft.com/office/word/2018/wordml/cex" xmlns:w16cid="http://schemas.microsoft.com/office/word/2016/wordml/cid" xmlns:w16="http://schemas.microsoft.com/office/word/2018/wordml" xmlns:w16du="http://schemas.microsoft.com/office/word/2023/wordml/word16du" xmlns:w16sdtdh="http://schemas.microsoft.com/office/word/2020/wordml/sdtdatahash" xmlns:w16sdtfl="http://schemas.microsoft.com/office/word/2024/wordml/sdtformatlock" xmlns:w16se="http://schemas.microsoft.com/office/word/2015/wordml/symex" xmlns:wpg="http://schemas.microsoft.com/office/word/2010/wordprocessingGroup" xmlns:wpi="http://schemas.microsoft.com/office/word/2010/wordprocessingInk" xmlns:wne="http://schemas.microsoft.com/office/word/2006/wordml" xmlns:wps="http://schemas.microsoft.com/office/word/2010/wordprocessingShape" mc:Ignorable="w14 w15 w16se w16cid w16 w16cex w16sdtdh w16sdtfl w16du wp14">
-  <w:footnote w:type="separator" w:id="-1">
-    <w:p>
-      <w:pPr>
-        <w:spacing w:after="0"/>
-      </w:pPr>
-      <w:r>
-        <w:separator/>
-      </w:r>
-    </w:p>
-  </w:footnote>
-  <w:footnote w:type="continuationSeparator" w:id="0">
-    <w:p>
-      <w:pPr>
-        <w:spacing w:after="0"/>
-      </w:pPr>
-      <w:r>
-        <w:continuationSeparator/>
-      </w:r>
-    </w:p>
-  </w:footnote>
-</w:footnotes>
-</file>
-
 <file path=word/header1.xml><?xml version="1.0" encoding="utf-8"?>
-<w:hdr xmlns:wpc="http://schemas.microsoft.com/office/word/2010/wordprocessingCanvas" xmlns:cx="http://schemas.microsoft.com/office/drawing/2014/chartex" xmlns:cx1="http://schemas.microsoft.com/office/drawing/2015/9/8/chartex" xmlns:cx2="http://schemas.microsoft.com/office/drawing/2015/10/21/chartex" xmlns:cx3="http://schemas.microsoft.com/office/drawing/2016/5/9/chartex" xmlns:cx4="http://schemas.microsoft.com/office/drawing/2016/5/10/chartex" xmlns:cx5="http://schemas.microsoft.com/office/drawing/2016/5/11/chartex" xmlns:cx6="http://schemas.microsoft.com/office/drawing/2016/5/12/chartex" xmlns:cx7="http://schemas.microsoft.com/office/drawing/2016/5/13/chartex" xmlns:cx8="http://schemas.microsoft.com/office/drawing/2016/5/14/chartex" xmlns:mc="http://schemas.openxmlformats.org/markup-compatibility/2006" xmlns:aink="http://schemas.microsoft.com/office/drawing/2016/ink" xmlns:am3d="http://schemas.microsoft.com/office/drawing/2017/model3d" xmlns:o="urn:schemas-microsoft-com:office:office" xmlns:oel="http://schemas.microsoft.com/office/2019/extlst" xmlns:r="http://schemas.openxmlformats.org/officeDocument/2006/relationships" xmlns:m="http://schemas.openxmlformats.org/officeDocument/2006/math" xmlns:v="urn:schemas-microsoft-com:vml" xmlns:wp14="http://schemas.microsoft.com/office/word/2010/wordprocessingDrawing" xmlns:wp="http://schemas.openxmlformats.org/drawingml/2006/wordprocessingDrawing" xmlns:w10="urn:schemas-microsoft-com:office:word" xmlns:w="http://schemas.openxmlformats.org/wordprocessingml/2006/main" xmlns:w14="http://schemas.microsoft.com/office/word/2010/wordml" xmlns:w15="http://schemas.microsoft.com/office/word/2012/wordml" xmlns:w16cex="http://schemas.microsoft.com/office/word/2018/wordml/cex" xmlns:w16cid="http://schemas.microsoft.com/office/word/2016/wordml/cid" xmlns:w16="http://schemas.microsoft.com/office/word/2018/wordml" xmlns:w16du="http://schemas.microsoft.com/office/word/2023/wordml/word16du" xmlns:w16sdtdh="http://schemas.microsoft.com/office/word/2020/wordml/sdtdatahash" xmlns:w16sdtfl="http://schemas.microsoft.com/office/word/2024/wordml/sdtformatlock" xmlns:w16se="http://schemas.microsoft.com/office/word/2015/wordml/symex" xmlns:wpg="http://schemas.microsoft.com/office/word/2010/wordprocessingGroup" xmlns:wpi="http://schemas.microsoft.com/office/word/2010/wordprocessingInk" xmlns:wne="http://schemas.microsoft.com/office/word/2006/wordml" xmlns:wps="http://schemas.microsoft.com/office/word/2010/wordprocessingShape" mc:Ignorable="w14 w15 w16se w16cid w16 w16cex w16sdtdh w16sdtfl w16du wp14">
-  <w:p>
-    <w:pPr>
-      <w:pStyle w:val="Header"/>
-    </w:pPr>
-  </w:p>
-</w:hdr>
-</file>
-
-<file path=word/header2.xml><?xml version="1.0" encoding="utf-8"?>
 <w:hdr xmlns:wpc="http://schemas.microsoft.com/office/word/2010/wordprocessingCanvas" xmlns:cx="http://schemas.microsoft.com/office/drawing/2014/chartex" xmlns:cx1="http://schemas.microsoft.com/office/drawing/2015/9/8/chartex" xmlns:cx2="http://schemas.microsoft.com/office/drawing/2015/10/21/chartex" xmlns:cx3="http://schemas.microsoft.com/office/drawing/2016/5/9/chartex" xmlns:cx4="http://schemas.microsoft.com/office/drawing/2016/5/10/chartex" xmlns:cx5="http://schemas.microsoft.com/office/drawing/2016/5/11/chartex" xmlns:cx6="http://schemas.microsoft.com/office/drawing/2016/5/12/chartex" xmlns:cx7="http://schemas.microsoft.com/office/drawing/2016/5/13/chartex" xmlns:cx8="http://schemas.microsoft.com/office/drawing/2016/5/14/chartex" xmlns:mc="http://schemas.openxmlformats.org/markup-compatibility/2006" xmlns:aink="http://schemas.microsoft.com/office/drawing/2016/ink" xmlns:am3d="http://schemas.microsoft.com/office/drawing/2017/model3d" xmlns:o="urn:schemas-microsoft-com:office:office" xmlns:oel="http://schemas.microsoft.com/office/2019/extlst" xmlns:r="http://schemas.openxmlformats.org/officeDocument/2006/relationships" xmlns:m="http://schemas.openxmlformats.org/officeDocument/2006/math" xmlns:v="urn:schemas-microsoft-com:vml" xmlns:wp14="http://schemas.microsoft.com/office/word/2010/wordprocessingDrawing" xmlns:wp="http://schemas.openxmlformats.org/drawingml/2006/wordprocessingDrawing" xmlns:w10="urn:schemas-microsoft-com:office:word" xmlns:w="http://schemas.openxmlformats.org/wordprocessingml/2006/main" xmlns:w14="http://schemas.microsoft.com/office/word/2010/wordml" xmlns:w15="http://schemas.microsoft.com/office/word/2012/wordml" xmlns:w16cex="http://schemas.microsoft.com/office/word/2018/wordml/cex" xmlns:w16cid="http://schemas.microsoft.com/office/word/2016/wordml/cid" xmlns:w16="http://schemas.microsoft.com/office/word/2018/wordml" xmlns:w16du="http://schemas.microsoft.com/office/word/2023/wordml/word16du" xmlns:w16sdtdh="http://schemas.microsoft.com/office/word/2020/wordml/sdtdatahash" xmlns:w16sdtfl="http://schemas.microsoft.com/office/word/2024/wordml/sdtformatlock" xmlns:w16se="http://schemas.microsoft.com/office/word/2015/wordml/symex" xmlns:wpg="http://schemas.microsoft.com/office/word/2010/wordprocessingGroup" xmlns:wpi="http://schemas.microsoft.com/office/word/2010/wordprocessingInk" xmlns:wne="http://schemas.microsoft.com/office/word/2006/wordml" xmlns:wps="http://schemas.microsoft.com/office/word/2010/wordprocessingShape" mc:Ignorable="w14 w15 w16se w16cid w16 w16cex w16sdtdh w16sdtfl w16du wp14">
   <w:p>
     <w:pPr>
@@ -4209,7 +4767,7 @@
       <w:sdtEndPr/>
       <w:sdtContent>
         <w:r>
-          <w:pict w14:anchorId="2D6D8023">
+          <w:pict w14:anchorId="5CC8E183">
             <v:shapetype id="_x0000_t136" coordsize="21600,21600" o:spt="136" adj="10800" path="m@7,l@8,m@5,21600l@6,21600e">
               <v:formulas>
                 <v:f eqn="sum #0 0 10800"/>
@@ -4234,7 +4792,7 @@
               </v:handles>
               <o:lock v:ext="edit" text="t" shapetype="t"/>
             </v:shapetype>
-            <v:shape id="PowerPlusWaterMarkObject379970" o:spid="_x0000_s1025" type="#_x0000_t136" style="position:absolute;margin-left:0;margin-top:0;width:489.45pt;height:146.8pt;rotation:315;z-index:-251658240;mso-position-horizontal:center;mso-position-horizontal-relative:margin;mso-position-vertical:center;mso-position-vertical-relative:margin" o:allowincell="f" fillcolor="#d8d8d8 [2732]" stroked="f">
+            <v:shape id="PowerPlusWaterMarkObject379970" o:spid="_x0000_s1025" type="#_x0000_t136" style="position:absolute;margin-left:0;margin-top:0;width:489.45pt;height:146.8pt;rotation:315;z-index:-251656192;mso-position-horizontal:center;mso-position-horizontal-relative:margin;mso-position-vertical:center;mso-position-vertical-relative:margin" o:allowincell="f" fillcolor="#d8d8d8 [2732]" stroked="f">
               <v:fill opacity=".5"/>
               <v:textpath style="font-family:&quot;calibri&quot;;font-size:1pt" string="FILMTOPIA"/>
               <w10:wrap anchorx="margin" anchory="margin"/>
@@ -4254,13 +4812,10 @@
       <w:sdtEndPr/>
       <w:sdtContent>
         <w:r>
-          <w:rPr>
-            <w:noProof/>
-          </w:rPr>
           <mc:AlternateContent>
             <mc:Choice Requires="wps">
               <w:drawing>
-                <wp:anchor distT="0" distB="0" distL="114300" distR="114300" simplePos="0" relativeHeight="251657216" behindDoc="0" locked="0" layoutInCell="0" allowOverlap="1" wp14:anchorId="7847BDF5" wp14:editId="3786FD71">
+                <wp:anchor distT="0" distB="0" distL="114300" distR="114300" simplePos="0" relativeHeight="251659264" behindDoc="0" locked="0" layoutInCell="0" allowOverlap="1" wp14:anchorId="74431925" wp14:editId="4D288EA9">
                   <wp:simplePos x="0" y="0"/>
                   <mc:AlternateContent>
                     <mc:Choice Requires="wp14">
@@ -4270,7 +4825,7 @@
                     </mc:Choice>
                     <mc:Fallback>
                       <wp:positionH relativeFrom="page">
-                        <wp:posOffset>5499100</wp:posOffset>
+                        <wp:posOffset>5773420</wp:posOffset>
                       </wp:positionH>
                     </mc:Fallback>
                   </mc:AlternateContent>
@@ -4380,7 +4935,7 @@
             </mc:Choice>
             <mc:Fallback>
               <w:pict>
-                <v:rect w14:anchorId="7847BDF5" id="Rectangle 1" o:spid="_x0000_s1026" style="position:absolute;margin-left:0;margin-top:28.8pt;width:142.65pt;height:106.05pt;z-index:251657216;visibility:visible;mso-wrap-style:square;mso-width-percent:0;mso-height-percent:0;mso-left-percent:800;mso-wrap-distance-left:9pt;mso-wrap-distance-top:0;mso-wrap-distance-right:9pt;mso-wrap-distance-bottom:0;mso-position-horizontal-relative:margin;mso-position-vertical:absolute;mso-position-vertical-relative:page;mso-width-percent:0;mso-height-percent:0;mso-left-percent:800;mso-width-relative:page;mso-height-relative:page;v-text-anchor:top" o:gfxdata="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" o:allowincell="f" stroked="f">
+                <v:rect w14:anchorId="74431925" id="Rectangle 1" o:spid="_x0000_s1026" style="position:absolute;margin-left:0;margin-top:28.8pt;width:142.65pt;height:106.05pt;z-index:251659264;visibility:visible;mso-wrap-style:square;mso-width-percent:0;mso-height-percent:0;mso-left-percent:800;mso-wrap-distance-left:9pt;mso-wrap-distance-top:0;mso-wrap-distance-right:9pt;mso-wrap-distance-bottom:0;mso-position-horizontal-relative:margin;mso-position-vertical:absolute;mso-position-vertical-relative:page;mso-width-percent:0;mso-height-percent:0;mso-left-percent:800;mso-width-relative:page;mso-height-relative:page;v-text-anchor:top" o:gfxdata="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" o:allowincell="f" stroked="f">
                   <v:textbox>
                     <w:txbxContent>
                       <w:p>
@@ -4439,158 +4994,9 @@
 </w:hdr>
 </file>
 
-<file path=word/header3.xml><?xml version="1.0" encoding="utf-8"?>
-<w:hdr xmlns:wpc="http://schemas.microsoft.com/office/word/2010/wordprocessingCanvas" xmlns:cx="http://schemas.microsoft.com/office/drawing/2014/chartex" xmlns:cx1="http://schemas.microsoft.com/office/drawing/2015/9/8/chartex" xmlns:cx2="http://schemas.microsoft.com/office/drawing/2015/10/21/chartex" xmlns:cx3="http://schemas.microsoft.com/office/drawing/2016/5/9/chartex" xmlns:cx4="http://schemas.microsoft.com/office/drawing/2016/5/10/chartex" xmlns:cx5="http://schemas.microsoft.com/office/drawing/2016/5/11/chartex" xmlns:cx6="http://schemas.microsoft.com/office/drawing/2016/5/12/chartex" xmlns:cx7="http://schemas.microsoft.com/office/drawing/2016/5/13/chartex" xmlns:cx8="http://schemas.microsoft.com/office/drawing/2016/5/14/chartex" xmlns:mc="http://schemas.openxmlformats.org/markup-compatibility/2006" xmlns:aink="http://schemas.microsoft.com/office/drawing/2016/ink" xmlns:am3d="http://schemas.microsoft.com/office/drawing/2017/model3d" xmlns:o="urn:schemas-microsoft-com:office:office" xmlns:oel="http://schemas.microsoft.com/office/2019/extlst" xmlns:r="http://schemas.openxmlformats.org/officeDocument/2006/relationships" xmlns:m="http://schemas.openxmlformats.org/officeDocument/2006/math" xmlns:v="urn:schemas-microsoft-com:vml" xmlns:wp14="http://schemas.microsoft.com/office/word/2010/wordprocessingDrawing" xmlns:wp="http://schemas.openxmlformats.org/drawingml/2006/wordprocessingDrawing" xmlns:w10="urn:schemas-microsoft-com:office:word" xmlns:w="http://schemas.openxmlformats.org/wordprocessingml/2006/main" xmlns:w14="http://schemas.microsoft.com/office/word/2010/wordml" xmlns:w15="http://schemas.microsoft.com/office/word/2012/wordml" xmlns:w16cex="http://schemas.microsoft.com/office/word/2018/wordml/cex" xmlns:w16cid="http://schemas.microsoft.com/office/word/2016/wordml/cid" xmlns:w16="http://schemas.microsoft.com/office/word/2018/wordml" xmlns:w16du="http://schemas.microsoft.com/office/word/2023/wordml/word16du" xmlns:w16sdtdh="http://schemas.microsoft.com/office/word/2020/wordml/sdtdatahash" xmlns:w16sdtfl="http://schemas.microsoft.com/office/word/2024/wordml/sdtformatlock" xmlns:w16se="http://schemas.microsoft.com/office/word/2015/wordml/symex" xmlns:wpg="http://schemas.microsoft.com/office/word/2010/wordprocessingGroup" xmlns:wpi="http://schemas.microsoft.com/office/word/2010/wordprocessingInk" xmlns:wne="http://schemas.microsoft.com/office/word/2006/wordml" xmlns:wps="http://schemas.microsoft.com/office/word/2010/wordprocessingShape" mc:Ignorable="w14 w15 w16se w16cid w16 w16cex w16sdtdh w16sdtfl w16du wp14">
-  <w:p>
-    <w:pPr>
-      <w:pStyle w:val="Header"/>
-    </w:pPr>
-  </w:p>
-</w:hdr>
-</file>
-
 <file path=word/numbering.xml><?xml version="1.0" encoding="utf-8"?>
 <w:numbering xmlns:wpc="http://schemas.microsoft.com/office/word/2010/wordprocessingCanvas" xmlns:cx="http://schemas.microsoft.com/office/drawing/2014/chartex" xmlns:cx1="http://schemas.microsoft.com/office/drawing/2015/9/8/chartex" xmlns:cx2="http://schemas.microsoft.com/office/drawing/2015/10/21/chartex" xmlns:cx3="http://schemas.microsoft.com/office/drawing/2016/5/9/chartex" xmlns:cx4="http://schemas.microsoft.com/office/drawing/2016/5/10/chartex" xmlns:cx5="http://schemas.microsoft.com/office/drawing/2016/5/11/chartex" xmlns:cx6="http://schemas.microsoft.com/office/drawing/2016/5/12/chartex" xmlns:cx7="http://schemas.microsoft.com/office/drawing/2016/5/13/chartex" xmlns:cx8="http://schemas.microsoft.com/office/drawing/2016/5/14/chartex" xmlns:mc="http://schemas.openxmlformats.org/markup-compatibility/2006" xmlns:aink="http://schemas.microsoft.com/office/drawing/2016/ink" xmlns:am3d="http://schemas.microsoft.com/office/drawing/2017/model3d" xmlns:o="urn:schemas-microsoft-com:office:office" xmlns:oel="http://schemas.microsoft.com/office/2019/extlst" xmlns:r="http://schemas.openxmlformats.org/officeDocument/2006/relationships" xmlns:m="http://schemas.openxmlformats.org/officeDocument/2006/math" xmlns:v="urn:schemas-microsoft-com:vml" xmlns:wp14="http://schemas.microsoft.com/office/word/2010/wordprocessingDrawing" xmlns:wp="http://schemas.openxmlformats.org/drawingml/2006/wordprocessingDrawing" xmlns:w10="urn:schemas-microsoft-com:office:word" xmlns:w="http://schemas.openxmlformats.org/wordprocessingml/2006/main" xmlns:w14="http://schemas.microsoft.com/office/word/2010/wordml" xmlns:w15="http://schemas.microsoft.com/office/word/2012/wordml" xmlns:w16cex="http://schemas.microsoft.com/office/word/2018/wordml/cex" xmlns:w16cid="http://schemas.microsoft.com/office/word/2016/wordml/cid" xmlns:w16="http://schemas.microsoft.com/office/word/2018/wordml" xmlns:w16du="http://schemas.microsoft.com/office/word/2023/wordml/word16du" xmlns:w16sdtdh="http://schemas.microsoft.com/office/word/2020/wordml/sdtdatahash" xmlns:w16sdtfl="http://schemas.microsoft.com/office/word/2024/wordml/sdtformatlock" xmlns:w16se="http://schemas.microsoft.com/office/word/2015/wordml/symex" xmlns:wpg="http://schemas.microsoft.com/office/word/2010/wordprocessingGroup" xmlns:wpi="http://schemas.microsoft.com/office/word/2010/wordprocessingInk" xmlns:wne="http://schemas.microsoft.com/office/word/2006/wordml" xmlns:wps="http://schemas.microsoft.com/office/word/2010/wordprocessingShape" mc:Ignorable="w14 w15 w16se w16cid w16 w16cex w16sdtdh w16sdtfl w16du wp14">
   <w:abstractNum w:abstractNumId="0" w15:restartNumberingAfterBreak="0">
-    <w:nsid w:val="4B780047"/>
-    <w:multiLevelType w:val="hybridMultilevel"/>
-    <w:tmpl w:val="6FEC1ABA"/>
-    <w:lvl w:ilvl="0" w:tplc="CC56B290">
-      <w:start w:val="1"/>
-      <w:numFmt w:val="bullet"/>
-      <w:lvlText w:val=""/>
-      <w:lvlJc w:val="left"/>
-      <w:pPr>
-        <w:tabs>
-          <w:tab w:val="num" w:pos="360"/>
-        </w:tabs>
-        <w:ind w:left="360" w:hanging="360"/>
-      </w:pPr>
-      <w:rPr>
-        <w:rFonts w:ascii="Wingdings" w:hAnsi="Wingdings" w:hint="default"/>
-      </w:rPr>
-    </w:lvl>
-    <w:lvl w:ilvl="1" w:tplc="AFB8C766">
-      <w:numFmt w:val="bullet"/>
-      <w:lvlText w:val=""/>
-      <w:lvlJc w:val="left"/>
-      <w:pPr>
-        <w:tabs>
-          <w:tab w:val="num" w:pos="1080"/>
-        </w:tabs>
-        <w:ind w:left="1080" w:hanging="360"/>
-      </w:pPr>
-      <w:rPr>
-        <w:rFonts w:ascii="Wingdings 2" w:hAnsi="Wingdings 2" w:hint="default"/>
-      </w:rPr>
-    </w:lvl>
-    <w:lvl w:ilvl="2" w:tplc="49E65AE6" w:tentative="1">
-      <w:start w:val="1"/>
-      <w:numFmt w:val="bullet"/>
-      <w:lvlText w:val=""/>
-      <w:lvlJc w:val="left"/>
-      <w:pPr>
-        <w:tabs>
-          <w:tab w:val="num" w:pos="1800"/>
-        </w:tabs>
-        <w:ind w:left="1800" w:hanging="360"/>
-      </w:pPr>
-      <w:rPr>
-        <w:rFonts w:ascii="Wingdings" w:hAnsi="Wingdings" w:hint="default"/>
-      </w:rPr>
-    </w:lvl>
-    <w:lvl w:ilvl="3" w:tplc="BC56A2CC" w:tentative="1">
-      <w:start w:val="1"/>
-      <w:numFmt w:val="bullet"/>
-      <w:lvlText w:val=""/>
-      <w:lvlJc w:val="left"/>
-      <w:pPr>
-        <w:tabs>
-          <w:tab w:val="num" w:pos="2520"/>
-        </w:tabs>
-        <w:ind w:left="2520" w:hanging="360"/>
-      </w:pPr>
-      <w:rPr>
-        <w:rFonts w:ascii="Wingdings" w:hAnsi="Wingdings" w:hint="default"/>
-      </w:rPr>
-    </w:lvl>
-    <w:lvl w:ilvl="4" w:tplc="DB96A0DC" w:tentative="1">
-      <w:start w:val="1"/>
-      <w:numFmt w:val="bullet"/>
-      <w:lvlText w:val=""/>
-      <w:lvlJc w:val="left"/>
-      <w:pPr>
-        <w:tabs>
-          <w:tab w:val="num" w:pos="3240"/>
-        </w:tabs>
-        <w:ind w:left="3240" w:hanging="360"/>
-      </w:pPr>
-      <w:rPr>
-        <w:rFonts w:ascii="Wingdings" w:hAnsi="Wingdings" w:hint="default"/>
-      </w:rPr>
-    </w:lvl>
-    <w:lvl w:ilvl="5" w:tplc="BE6CAA10" w:tentative="1">
-      <w:start w:val="1"/>
-      <w:numFmt w:val="bullet"/>
-      <w:lvlText w:val=""/>
-      <w:lvlJc w:val="left"/>
-      <w:pPr>
-        <w:tabs>
-          <w:tab w:val="num" w:pos="3960"/>
-        </w:tabs>
-        <w:ind w:left="3960" w:hanging="360"/>
-      </w:pPr>
-      <w:rPr>
-        <w:rFonts w:ascii="Wingdings" w:hAnsi="Wingdings" w:hint="default"/>
-      </w:rPr>
-    </w:lvl>
-    <w:lvl w:ilvl="6" w:tplc="9BD4B00A" w:tentative="1">
-      <w:start w:val="1"/>
-      <w:numFmt w:val="bullet"/>
-      <w:lvlText w:val=""/>
-      <w:lvlJc w:val="left"/>
-      <w:pPr>
-        <w:tabs>
-          <w:tab w:val="num" w:pos="4680"/>
-        </w:tabs>
-        <w:ind w:left="4680" w:hanging="360"/>
-      </w:pPr>
-      <w:rPr>
-        <w:rFonts w:ascii="Wingdings" w:hAnsi="Wingdings" w:hint="default"/>
-      </w:rPr>
-    </w:lvl>
-    <w:lvl w:ilvl="7" w:tplc="F6D4BF0A" w:tentative="1">
-      <w:start w:val="1"/>
-      <w:numFmt w:val="bullet"/>
-      <w:lvlText w:val=""/>
-      <w:lvlJc w:val="left"/>
-      <w:pPr>
-        <w:tabs>
-          <w:tab w:val="num" w:pos="5400"/>
-        </w:tabs>
-        <w:ind w:left="5400" w:hanging="360"/>
-      </w:pPr>
-      <w:rPr>
-        <w:rFonts w:ascii="Wingdings" w:hAnsi="Wingdings" w:hint="default"/>
-      </w:rPr>
-    </w:lvl>
-    <w:lvl w:ilvl="8" w:tplc="8AEE68F2" w:tentative="1">
-      <w:start w:val="1"/>
-      <w:numFmt w:val="bullet"/>
-      <w:lvlText w:val=""/>
-      <w:lvlJc w:val="left"/>
-      <w:pPr>
-        <w:tabs>
-          <w:tab w:val="num" w:pos="6120"/>
-        </w:tabs>
-        <w:ind w:left="6120" w:hanging="360"/>
-      </w:pPr>
-      <w:rPr>
-        <w:rFonts w:ascii="Wingdings" w:hAnsi="Wingdings" w:hint="default"/>
-      </w:rPr>
-    </w:lvl>
-  </w:abstractNum>
-  <w:abstractNum w:abstractNumId="1" w15:restartNumberingAfterBreak="0">
     <w:nsid w:val="5047057B"/>
     <w:multiLevelType w:val="multilevel"/>
     <w:tmpl w:val="FF10AEFA"/>
@@ -4739,7 +5145,7 @@
       </w:rPr>
     </w:lvl>
   </w:abstractNum>
-  <w:abstractNum w:abstractNumId="2" w15:restartNumberingAfterBreak="0">
+  <w:abstractNum w:abstractNumId="1" w15:restartNumberingAfterBreak="0">
     <w:nsid w:val="5F2552D3"/>
     <w:multiLevelType w:val="multilevel"/>
     <w:tmpl w:val="66C2B382"/>
@@ -4888,14 +5294,11 @@
       </w:rPr>
     </w:lvl>
   </w:abstractNum>
-  <w:num w:numId="1" w16cid:durableId="1156187300">
+  <w:num w:numId="1" w16cid:durableId="297339460">
     <w:abstractNumId w:val="0"/>
   </w:num>
-  <w:num w:numId="2" w16cid:durableId="297339460">
+  <w:num w:numId="2" w16cid:durableId="2108963924">
     <w:abstractNumId w:val="1"/>
-  </w:num>
-  <w:num w:numId="3" w16cid:durableId="2108963924">
-    <w:abstractNumId w:val="2"/>
   </w:num>
 </w:numbering>
 </file>
@@ -4909,13 +5312,13 @@
         <w:kern w:val="2"/>
         <w:sz w:val="24"/>
         <w:szCs w:val="24"/>
-        <w:lang w:val="en-GB" w:eastAsia="en-US" w:bidi="ar-SA"/>
+        <w:lang w:val="en-US" w:eastAsia="en-US" w:bidi="ar-SA"/>
         <w14:ligatures w14:val="standardContextual"/>
       </w:rPr>
     </w:rPrDefault>
     <w:pPrDefault>
       <w:pPr>
-        <w:spacing w:after="80"/>
+        <w:spacing w:after="160" w:line="278" w:lineRule="auto"/>
       </w:pPr>
     </w:pPrDefault>
   </w:docDefaults>
@@ -5300,6 +5703,10 @@
   <w:style w:type="paragraph" w:default="1" w:styleId="Normal">
     <w:name w:val="Normal"/>
     <w:qFormat/>
+    <w:rsid w:val="00A4628D"/>
+    <w:rPr>
+      <w:lang w:val="en-GB"/>
+    </w:rPr>
   </w:style>
   <w:style w:type="paragraph" w:styleId="Heading1">
     <w:name w:val="heading 1"/>
@@ -5308,11 +5715,11 @@
     <w:link w:val="Heading1Char"/>
     <w:uiPriority w:val="9"/>
     <w:qFormat/>
-    <w:rsid w:val="007808C9"/>
+    <w:rsid w:val="00237A39"/>
     <w:pPr>
       <w:keepNext/>
       <w:keepLines/>
-      <w:spacing w:before="360"/>
+      <w:spacing w:before="360" w:after="80"/>
       <w:outlineLvl w:val="0"/>
     </w:pPr>
     <w:rPr>
@@ -5331,11 +5738,11 @@
     <w:semiHidden/>
     <w:unhideWhenUsed/>
     <w:qFormat/>
-    <w:rsid w:val="007808C9"/>
+    <w:rsid w:val="00237A39"/>
     <w:pPr>
       <w:keepNext/>
       <w:keepLines/>
-      <w:spacing w:before="160"/>
+      <w:spacing w:before="160" w:after="80"/>
       <w:outlineLvl w:val="1"/>
     </w:pPr>
     <w:rPr>
@@ -5354,11 +5761,11 @@
     <w:semiHidden/>
     <w:unhideWhenUsed/>
     <w:qFormat/>
-    <w:rsid w:val="007808C9"/>
+    <w:rsid w:val="00237A39"/>
     <w:pPr>
       <w:keepNext/>
       <w:keepLines/>
-      <w:spacing w:before="160"/>
+      <w:spacing w:before="160" w:after="80"/>
       <w:outlineLvl w:val="2"/>
     </w:pPr>
     <w:rPr>
@@ -5377,7 +5784,7 @@
     <w:semiHidden/>
     <w:unhideWhenUsed/>
     <w:qFormat/>
-    <w:rsid w:val="007808C9"/>
+    <w:rsid w:val="00237A39"/>
     <w:pPr>
       <w:keepNext/>
       <w:keepLines/>
@@ -5400,7 +5807,7 @@
     <w:semiHidden/>
     <w:unhideWhenUsed/>
     <w:qFormat/>
-    <w:rsid w:val="007808C9"/>
+    <w:rsid w:val="00237A39"/>
     <w:pPr>
       <w:keepNext/>
       <w:keepLines/>
@@ -5421,7 +5828,7 @@
     <w:semiHidden/>
     <w:unhideWhenUsed/>
     <w:qFormat/>
-    <w:rsid w:val="007808C9"/>
+    <w:rsid w:val="00237A39"/>
     <w:pPr>
       <w:keepNext/>
       <w:keepLines/>
@@ -5444,7 +5851,7 @@
     <w:semiHidden/>
     <w:unhideWhenUsed/>
     <w:qFormat/>
-    <w:rsid w:val="007808C9"/>
+    <w:rsid w:val="00237A39"/>
     <w:pPr>
       <w:keepNext/>
       <w:keepLines/>
@@ -5465,7 +5872,7 @@
     <w:semiHidden/>
     <w:unhideWhenUsed/>
     <w:qFormat/>
-    <w:rsid w:val="007808C9"/>
+    <w:rsid w:val="00237A39"/>
     <w:pPr>
       <w:keepNext/>
       <w:keepLines/>
@@ -5488,7 +5895,7 @@
     <w:semiHidden/>
     <w:unhideWhenUsed/>
     <w:qFormat/>
-    <w:rsid w:val="007808C9"/>
+    <w:rsid w:val="00237A39"/>
     <w:pPr>
       <w:keepNext/>
       <w:keepLines/>
@@ -5532,12 +5939,13 @@
     <w:basedOn w:val="DefaultParagraphFont"/>
     <w:link w:val="Heading1"/>
     <w:uiPriority w:val="9"/>
-    <w:rsid w:val="007808C9"/>
+    <w:rsid w:val="00237A39"/>
     <w:rPr>
       <w:rFonts w:asciiTheme="majorHAnsi" w:eastAsiaTheme="majorEastAsia" w:hAnsiTheme="majorHAnsi" w:cstheme="majorBidi"/>
       <w:color w:val="0F4761" w:themeColor="accent1" w:themeShade="BF"/>
       <w:sz w:val="40"/>
       <w:szCs w:val="40"/>
+      <w:lang w:val="en-GB"/>
     </w:rPr>
   </w:style>
   <w:style w:type="character" w:customStyle="1" w:styleId="Heading2Char">
@@ -5546,12 +5954,13 @@
     <w:link w:val="Heading2"/>
     <w:uiPriority w:val="9"/>
     <w:semiHidden/>
-    <w:rsid w:val="007808C9"/>
+    <w:rsid w:val="00237A39"/>
     <w:rPr>
       <w:rFonts w:asciiTheme="majorHAnsi" w:eastAsiaTheme="majorEastAsia" w:hAnsiTheme="majorHAnsi" w:cstheme="majorBidi"/>
       <w:color w:val="0F4761" w:themeColor="accent1" w:themeShade="BF"/>
       <w:sz w:val="32"/>
       <w:szCs w:val="32"/>
+      <w:lang w:val="en-GB"/>
     </w:rPr>
   </w:style>
   <w:style w:type="character" w:customStyle="1" w:styleId="Heading3Char">
@@ -5560,12 +5969,13 @@
     <w:link w:val="Heading3"/>
     <w:uiPriority w:val="9"/>
     <w:semiHidden/>
-    <w:rsid w:val="007808C9"/>
+    <w:rsid w:val="00237A39"/>
     <w:rPr>
       <w:rFonts w:eastAsiaTheme="majorEastAsia" w:cstheme="majorBidi"/>
       <w:color w:val="0F4761" w:themeColor="accent1" w:themeShade="BF"/>
       <w:sz w:val="28"/>
       <w:szCs w:val="28"/>
+      <w:lang w:val="en-GB"/>
     </w:rPr>
   </w:style>
   <w:style w:type="character" w:customStyle="1" w:styleId="Heading4Char">
@@ -5574,12 +5984,13 @@
     <w:link w:val="Heading4"/>
     <w:uiPriority w:val="9"/>
     <w:semiHidden/>
-    <w:rsid w:val="007808C9"/>
+    <w:rsid w:val="00237A39"/>
     <w:rPr>
       <w:rFonts w:eastAsiaTheme="majorEastAsia" w:cstheme="majorBidi"/>
       <w:i/>
       <w:iCs/>
       <w:color w:val="0F4761" w:themeColor="accent1" w:themeShade="BF"/>
+      <w:lang w:val="en-GB"/>
     </w:rPr>
   </w:style>
   <w:style w:type="character" w:customStyle="1" w:styleId="Heading5Char">
@@ -5588,10 +5999,11 @@
     <w:link w:val="Heading5"/>
     <w:uiPriority w:val="9"/>
     <w:semiHidden/>
-    <w:rsid w:val="007808C9"/>
+    <w:rsid w:val="00237A39"/>
     <w:rPr>
       <w:rFonts w:eastAsiaTheme="majorEastAsia" w:cstheme="majorBidi"/>
       <w:color w:val="0F4761" w:themeColor="accent1" w:themeShade="BF"/>
+      <w:lang w:val="en-GB"/>
     </w:rPr>
   </w:style>
   <w:style w:type="character" w:customStyle="1" w:styleId="Heading6Char">
@@ -5600,12 +6012,13 @@
     <w:link w:val="Heading6"/>
     <w:uiPriority w:val="9"/>
     <w:semiHidden/>
-    <w:rsid w:val="007808C9"/>
+    <w:rsid w:val="00237A39"/>
     <w:rPr>
       <w:rFonts w:eastAsiaTheme="majorEastAsia" w:cstheme="majorBidi"/>
       <w:i/>
       <w:iCs/>
       <w:color w:val="595959" w:themeColor="text1" w:themeTint="A6"/>
+      <w:lang w:val="en-GB"/>
     </w:rPr>
   </w:style>
   <w:style w:type="character" w:customStyle="1" w:styleId="Heading7Char">
@@ -5614,10 +6027,11 @@
     <w:link w:val="Heading7"/>
     <w:uiPriority w:val="9"/>
     <w:semiHidden/>
-    <w:rsid w:val="007808C9"/>
+    <w:rsid w:val="00237A39"/>
     <w:rPr>
       <w:rFonts w:eastAsiaTheme="majorEastAsia" w:cstheme="majorBidi"/>
       <w:color w:val="595959" w:themeColor="text1" w:themeTint="A6"/>
+      <w:lang w:val="en-GB"/>
     </w:rPr>
   </w:style>
   <w:style w:type="character" w:customStyle="1" w:styleId="Heading8Char">
@@ -5626,12 +6040,13 @@
     <w:link w:val="Heading8"/>
     <w:uiPriority w:val="9"/>
     <w:semiHidden/>
-    <w:rsid w:val="007808C9"/>
+    <w:rsid w:val="00237A39"/>
     <w:rPr>
       <w:rFonts w:eastAsiaTheme="majorEastAsia" w:cstheme="majorBidi"/>
       <w:i/>
       <w:iCs/>
       <w:color w:val="272727" w:themeColor="text1" w:themeTint="D8"/>
+      <w:lang w:val="en-GB"/>
     </w:rPr>
   </w:style>
   <w:style w:type="character" w:customStyle="1" w:styleId="Heading9Char">
@@ -5640,10 +6055,11 @@
     <w:link w:val="Heading9"/>
     <w:uiPriority w:val="9"/>
     <w:semiHidden/>
-    <w:rsid w:val="007808C9"/>
+    <w:rsid w:val="00237A39"/>
     <w:rPr>
       <w:rFonts w:eastAsiaTheme="majorEastAsia" w:cstheme="majorBidi"/>
       <w:color w:val="272727" w:themeColor="text1" w:themeTint="D8"/>
+      <w:lang w:val="en-GB"/>
     </w:rPr>
   </w:style>
   <w:style w:type="paragraph" w:styleId="Title">
@@ -5653,8 +6069,9 @@
     <w:link w:val="TitleChar"/>
     <w:uiPriority w:val="10"/>
     <w:qFormat/>
-    <w:rsid w:val="007808C9"/>
+    <w:rsid w:val="00237A39"/>
     <w:pPr>
+      <w:spacing w:after="80" w:line="240" w:lineRule="auto"/>
       <w:contextualSpacing/>
     </w:pPr>
     <w:rPr>
@@ -5670,13 +6087,14 @@
     <w:basedOn w:val="DefaultParagraphFont"/>
     <w:link w:val="Title"/>
     <w:uiPriority w:val="10"/>
-    <w:rsid w:val="007808C9"/>
+    <w:rsid w:val="00237A39"/>
     <w:rPr>
       <w:rFonts w:asciiTheme="majorHAnsi" w:eastAsiaTheme="majorEastAsia" w:hAnsiTheme="majorHAnsi" w:cstheme="majorBidi"/>
       <w:spacing w:val="-10"/>
       <w:kern w:val="28"/>
       <w:sz w:val="56"/>
       <w:szCs w:val="56"/>
+      <w:lang w:val="en-GB"/>
     </w:rPr>
   </w:style>
   <w:style w:type="paragraph" w:styleId="Subtitle">
@@ -5686,7 +6104,7 @@
     <w:link w:val="SubtitleChar"/>
     <w:uiPriority w:val="11"/>
     <w:qFormat/>
-    <w:rsid w:val="007808C9"/>
+    <w:rsid w:val="00237A39"/>
     <w:pPr>
       <w:numPr>
         <w:ilvl w:val="1"/>
@@ -5705,13 +6123,14 @@
     <w:basedOn w:val="DefaultParagraphFont"/>
     <w:link w:val="Subtitle"/>
     <w:uiPriority w:val="11"/>
-    <w:rsid w:val="007808C9"/>
+    <w:rsid w:val="00237A39"/>
     <w:rPr>
       <w:rFonts w:eastAsiaTheme="majorEastAsia" w:cstheme="majorBidi"/>
       <w:color w:val="595959" w:themeColor="text1" w:themeTint="A6"/>
       <w:spacing w:val="15"/>
       <w:sz w:val="28"/>
       <w:szCs w:val="28"/>
+      <w:lang w:val="en-GB"/>
     </w:rPr>
   </w:style>
   <w:style w:type="paragraph" w:styleId="Quote">
@@ -5721,7 +6140,7 @@
     <w:link w:val="QuoteChar"/>
     <w:uiPriority w:val="29"/>
     <w:qFormat/>
-    <w:rsid w:val="007808C9"/>
+    <w:rsid w:val="00237A39"/>
     <w:pPr>
       <w:spacing w:before="160"/>
       <w:jc w:val="center"/>
@@ -5737,11 +6156,12 @@
     <w:basedOn w:val="DefaultParagraphFont"/>
     <w:link w:val="Quote"/>
     <w:uiPriority w:val="29"/>
-    <w:rsid w:val="007808C9"/>
+    <w:rsid w:val="00237A39"/>
     <w:rPr>
       <w:i/>
       <w:iCs/>
       <w:color w:val="404040" w:themeColor="text1" w:themeTint="BF"/>
+      <w:lang w:val="en-GB"/>
     </w:rPr>
   </w:style>
   <w:style w:type="paragraph" w:styleId="ListParagraph">
@@ -5749,7 +6169,7 @@
     <w:basedOn w:val="Normal"/>
     <w:uiPriority w:val="34"/>
     <w:qFormat/>
-    <w:rsid w:val="007808C9"/>
+    <w:rsid w:val="00237A39"/>
     <w:pPr>
       <w:ind w:left="720"/>
       <w:contextualSpacing/>
@@ -5760,7 +6180,7 @@
     <w:basedOn w:val="DefaultParagraphFont"/>
     <w:uiPriority w:val="21"/>
     <w:qFormat/>
-    <w:rsid w:val="007808C9"/>
+    <w:rsid w:val="00237A39"/>
     <w:rPr>
       <w:i/>
       <w:iCs/>
@@ -5774,7 +6194,7 @@
     <w:link w:val="IntenseQuoteChar"/>
     <w:uiPriority w:val="30"/>
     <w:qFormat/>
-    <w:rsid w:val="007808C9"/>
+    <w:rsid w:val="00237A39"/>
     <w:pPr>
       <w:pBdr>
         <w:top w:val="single" w:sz="4" w:space="10" w:color="0F4761" w:themeColor="accent1" w:themeShade="BF"/>
@@ -5795,11 +6215,12 @@
     <w:basedOn w:val="DefaultParagraphFont"/>
     <w:link w:val="IntenseQuote"/>
     <w:uiPriority w:val="30"/>
-    <w:rsid w:val="007808C9"/>
+    <w:rsid w:val="00237A39"/>
     <w:rPr>
       <w:i/>
       <w:iCs/>
       <w:color w:val="0F4761" w:themeColor="accent1" w:themeShade="BF"/>
+      <w:lang w:val="en-GB"/>
     </w:rPr>
   </w:style>
   <w:style w:type="character" w:styleId="IntenseReference">
@@ -5807,7 +6228,7 @@
     <w:basedOn w:val="DefaultParagraphFont"/>
     <w:uiPriority w:val="32"/>
     <w:qFormat/>
-    <w:rsid w:val="007808C9"/>
+    <w:rsid w:val="00237A39"/>
     <w:rPr>
       <w:b/>
       <w:bCs/>
@@ -5820,10 +6241,13 @@
     <w:name w:val="Table Grid"/>
     <w:basedOn w:val="TableNormal"/>
     <w:uiPriority w:val="39"/>
-    <w:rsid w:val="006B6E9E"/>
+    <w:rsid w:val="00A4628D"/>
     <w:pPr>
-      <w:spacing w:after="0"/>
+      <w:spacing w:after="0" w:line="240" w:lineRule="auto"/>
     </w:pPr>
+    <w:rPr>
+      <w:lang w:val="en-GB"/>
+    </w:rPr>
     <w:tblPr>
       <w:tblBorders>
         <w:top w:val="single" w:sz="4" w:space="0" w:color="auto"/>
@@ -5838,7 +6262,7 @@
   <w:style w:type="paragraph" w:customStyle="1" w:styleId="font-claude-response-body">
     <w:name w:val="font-claude-response-body"/>
     <w:basedOn w:val="Normal"/>
-    <w:rsid w:val="00FD5B77"/>
+    <w:rsid w:val="00A4628D"/>
     <w:pPr>
       <w:spacing w:before="100" w:beforeAutospacing="1" w:after="100" w:afterAutospacing="1"/>
     </w:pPr>
@@ -5854,21 +6278,10 @@
     <w:basedOn w:val="DefaultParagraphFont"/>
     <w:uiPriority w:val="22"/>
     <w:qFormat/>
-    <w:rsid w:val="00FD5B77"/>
+    <w:rsid w:val="00A4628D"/>
     <w:rPr>
       <w:b/>
       <w:bCs/>
-    </w:rPr>
-  </w:style>
-  <w:style w:type="character" w:styleId="Emphasis">
-    <w:name w:val="Emphasis"/>
-    <w:basedOn w:val="DefaultParagraphFont"/>
-    <w:uiPriority w:val="20"/>
-    <w:qFormat/>
-    <w:rsid w:val="00FD5B77"/>
-    <w:rPr>
-      <w:i/>
-      <w:iCs/>
     </w:rPr>
   </w:style>
   <w:style w:type="paragraph" w:styleId="Header">
@@ -5877,7 +6290,7 @@
     <w:link w:val="HeaderChar"/>
     <w:uiPriority w:val="99"/>
     <w:unhideWhenUsed/>
-    <w:rsid w:val="00BE1E91"/>
+    <w:rsid w:val="00A4628D"/>
     <w:pPr>
       <w:tabs>
         <w:tab w:val="center" w:pos="4680"/>
@@ -5891,61 +6304,9 @@
     <w:basedOn w:val="DefaultParagraphFont"/>
     <w:link w:val="Header"/>
     <w:uiPriority w:val="99"/>
-    <w:rsid w:val="00BE1E91"/>
-  </w:style>
-  <w:style w:type="paragraph" w:styleId="Footer">
-    <w:name w:val="footer"/>
-    <w:basedOn w:val="Normal"/>
-    <w:link w:val="FooterChar"/>
-    <w:uiPriority w:val="99"/>
-    <w:unhideWhenUsed/>
-    <w:rsid w:val="00BE1E91"/>
-    <w:pPr>
-      <w:tabs>
-        <w:tab w:val="center" w:pos="4680"/>
-        <w:tab w:val="right" w:pos="9360"/>
-      </w:tabs>
-      <w:spacing w:after="0"/>
-    </w:pPr>
-  </w:style>
-  <w:style w:type="character" w:customStyle="1" w:styleId="FooterChar">
-    <w:name w:val="Footer Char"/>
-    <w:basedOn w:val="DefaultParagraphFont"/>
-    <w:link w:val="Footer"/>
-    <w:uiPriority w:val="99"/>
-    <w:rsid w:val="00BE1E91"/>
-  </w:style>
-  <w:style w:type="paragraph" w:styleId="NoSpacing">
-    <w:name w:val="No Spacing"/>
-    <w:link w:val="NoSpacingChar"/>
-    <w:uiPriority w:val="1"/>
-    <w:qFormat/>
-    <w:rsid w:val="00E36065"/>
-    <w:pPr>
-      <w:spacing w:after="0"/>
-    </w:pPr>
+    <w:rsid w:val="00A4628D"/>
     <w:rPr>
-      <w:rFonts w:eastAsiaTheme="minorEastAsia"/>
-      <w:kern w:val="0"/>
-      <w:sz w:val="22"/>
-      <w:szCs w:val="22"/>
-      <w:lang w:eastAsia="en-GB"/>
-      <w14:ligatures w14:val="none"/>
-    </w:rPr>
-  </w:style>
-  <w:style w:type="character" w:customStyle="1" w:styleId="NoSpacingChar">
-    <w:name w:val="No Spacing Char"/>
-    <w:basedOn w:val="DefaultParagraphFont"/>
-    <w:link w:val="NoSpacing"/>
-    <w:uiPriority w:val="1"/>
-    <w:rsid w:val="00E36065"/>
-    <w:rPr>
-      <w:rFonts w:eastAsiaTheme="minorEastAsia"/>
-      <w:kern w:val="0"/>
-      <w:sz w:val="22"/>
-      <w:szCs w:val="22"/>
-      <w:lang w:eastAsia="en-GB"/>
-      <w14:ligatures w14:val="none"/>
+      <w:lang w:val="en-GB"/>
     </w:rPr>
   </w:style>
 </w:styles>
@@ -6157,6 +6518,13 @@
         </a:gradFill>
       </a:fillStyleLst>
       <a:lnStyleLst>
+        <a:ln w="6350" cap="flat" cmpd="sng" algn="ctr">
+          <a:solidFill>
+            <a:schemeClr val="phClr"/>
+          </a:solidFill>
+          <a:prstDash val="solid"/>
+          <a:miter lim="800000"/>
+        </a:ln>
         <a:ln w="12700" cap="flat" cmpd="sng" algn="ctr">
           <a:solidFill>
             <a:schemeClr val="phClr"/>
@@ -6165,13 +6533,6 @@
           <a:miter lim="800000"/>
         </a:ln>
         <a:ln w="19050" cap="flat" cmpd="sng" algn="ctr">
-          <a:solidFill>
-            <a:schemeClr val="phClr"/>
-          </a:solidFill>
-          <a:prstDash val="solid"/>
-          <a:miter lim="800000"/>
-        </a:ln>
-        <a:ln w="25400" cap="flat" cmpd="sng" algn="ctr">
           <a:solidFill>
             <a:schemeClr val="phClr"/>
           </a:solidFill>
@@ -6236,27 +6597,7 @@
       </a:bgFillStyleLst>
     </a:fmtScheme>
   </a:themeElements>
-  <a:objectDefaults>
-    <a:lnDef>
-      <a:spPr/>
-      <a:bodyPr/>
-      <a:lstStyle/>
-      <a:style>
-        <a:lnRef idx="2">
-          <a:schemeClr val="accent1"/>
-        </a:lnRef>
-        <a:fillRef idx="0">
-          <a:schemeClr val="accent1"/>
-        </a:fillRef>
-        <a:effectRef idx="1">
-          <a:schemeClr val="accent1"/>
-        </a:effectRef>
-        <a:fontRef idx="minor">
-          <a:schemeClr val="tx1"/>
-        </a:fontRef>
-      </a:style>
-    </a:lnDef>
-  </a:objectDefaults>
+  <a:objectDefaults/>
   <a:extraClrSchemeLst/>
   <a:extLst>
     <a:ext uri="{05A4C25C-085E-4340-85A3-A5531E510DB2}">
@@ -6264,16 +6605,4 @@
     </a:ext>
   </a:extLst>
 </a:theme>
-</file>
-
-<file path=customXml/item1.xml><?xml version="1.0" encoding="utf-8"?>
-<b:Sources xmlns:b="http://schemas.openxmlformats.org/officeDocument/2006/bibliography" xmlns="http://schemas.openxmlformats.org/officeDocument/2006/bibliography" SelectedStyle="\APASixthEditionOfficeOnline.xsl" StyleName="APA" Version="6"/>
-</file>
-
-<file path=customXml/itemProps1.xml><?xml version="1.0" encoding="utf-8"?>
-<ds:datastoreItem xmlns:ds="http://schemas.openxmlformats.org/officeDocument/2006/customXml" ds:itemID="{8CB45FE1-5DF5-483E-B83B-4708DF8D3E7C}">
-  <ds:schemaRefs>
-    <ds:schemaRef ds:uri="http://schemas.openxmlformats.org/officeDocument/2006/bibliography"/>
-  </ds:schemaRefs>
-</ds:datastoreItem>
 </file>
</xml_diff>

<commit_message>
fixed one of the modSettings stubs
</commit_message>
<xml_diff>
--- a/Investigation.docx
+++ b/Investigation.docx
@@ -12,7 +12,6 @@
           <w:szCs w:val="72"/>
         </w:rPr>
       </w:pPr>
-      <w:proofErr w:type="spellStart"/>
       <w:r>
         <w:rPr>
           <w:b/>
@@ -20,17 +19,7 @@
           <w:sz w:val="72"/>
           <w:szCs w:val="72"/>
         </w:rPr>
-        <w:t>Filmtopia</w:t>
-      </w:r>
-      <w:proofErr w:type="spellEnd"/>
-      <w:r>
-        <w:rPr>
-          <w:b/>
-          <w:bCs/>
-          <w:sz w:val="72"/>
-          <w:szCs w:val="72"/>
-        </w:rPr>
-        <w:t xml:space="preserve"> Project Investigation</w:t>
+        <w:t>Filmtopia Project Investigation</w:t>
       </w:r>
     </w:p>
     <w:p>
@@ -54,29 +43,8 @@
       </w:r>
     </w:p>
     <w:p>
-      <w:proofErr w:type="spellStart"/>
-      <w:r>
-        <w:t>Filmtopia</w:t>
-      </w:r>
-      <w:proofErr w:type="spellEnd"/>
-      <w:r>
-        <w:t xml:space="preserve"> is a small independent cinema theatre who is currently managing all business data using spreadsheets and paper. They sell food drinks and tickets using a variety of means such as a touchscreen kiosk which can only handle food and drinks and a concessions area where employees handle the business. The management of </w:t>
-      </w:r>
-      <w:proofErr w:type="spellStart"/>
-      <w:r>
-        <w:t>filmtopia</w:t>
-      </w:r>
-      <w:proofErr w:type="spellEnd"/>
-      <w:r>
-        <w:t xml:space="preserve"> has come to notice that they are falling back on managing and analysing the cinema, this means keeping track of sales records, screening analytics and a customer interest evaluation. I am now going to investigate further on how </w:t>
-      </w:r>
-      <w:proofErr w:type="spellStart"/>
-      <w:r>
-        <w:t>filmtopia</w:t>
-      </w:r>
-      <w:proofErr w:type="spellEnd"/>
-      <w:r>
-        <w:t xml:space="preserve"> functions to get a better understanding of how I should move with this project.</w:t>
+      <w:r>
+        <w:t>Filmtopia is a small independent cinema theatre who is currently managing all business data using spreadsheets and paper. They sell food drinks and tickets using a variety of means such as a touchscreen kiosk which can only handle food and drinks and a concessions area where employees handle the business. The management of filmtopia has come to notice that they are falling back on managing and analysing the cinema, this means keeping track of sales records, screening analytics and a customer interest evaluation. I am now going to investigate further on how filmtopia functions to get a better understanding of how I should move with this project.</w:t>
       </w:r>
     </w:p>
     <w:p>
@@ -113,15 +81,7 @@
         <w:spacing w:after="80"/>
       </w:pPr>
       <w:r>
-        <w:t xml:space="preserve">For the </w:t>
-      </w:r>
-      <w:proofErr w:type="spellStart"/>
-      <w:r>
-        <w:t>Filmtopia</w:t>
-      </w:r>
-      <w:proofErr w:type="spellEnd"/>
-      <w:r>
-        <w:t xml:space="preserve"> system the stakeholders can be split into two groups, primary and secondary. Primary stakeholders are those who will interact with the system directly on a regular basis. Secondary stakeholders are those who are affected by the system indirectly or whose work is influenced by it without them necessarily using it themselves.</w:t>
+        <w:t>For the Filmtopia system the stakeholders can be split into two groups, primary and secondary. Primary stakeholders are those who will interact with the system directly on a regular basis. Secondary stakeholders are those who are affected by the system indirectly or whose work is influenced by it without them necessarily using it themselves.</w:t>
       </w:r>
     </w:p>
     <w:p>
@@ -145,31 +105,7 @@
         <w:spacing w:after="80"/>
       </w:pPr>
       <w:r>
-        <w:t xml:space="preserve">The third primary stakeholder is the customer base of </w:t>
-      </w:r>
-      <w:proofErr w:type="spellStart"/>
-      <w:r>
-        <w:t>Filmtopia</w:t>
-      </w:r>
-      <w:proofErr w:type="spellEnd"/>
-      <w:r>
-        <w:t xml:space="preserve">. Customers interact with the system either directly through the proposed </w:t>
-      </w:r>
-      <w:proofErr w:type="spellStart"/>
-      <w:r>
-        <w:t>self service</w:t>
-      </w:r>
-      <w:proofErr w:type="spellEnd"/>
-      <w:r>
-        <w:t xml:space="preserve"> kiosk or indirectly when staff process their bookings on their behalf. Their main interests are convenience, short queue times and the assurance that the seat they have been allocated will actually be available when they arrive. The questionnaire results discussed later in this investigation show that a large majority of customers would prefer </w:t>
-      </w:r>
-      <w:proofErr w:type="spellStart"/>
-      <w:r>
-        <w:t>self service</w:t>
-      </w:r>
-      <w:proofErr w:type="spellEnd"/>
-      <w:r>
-        <w:t xml:space="preserve"> ticketing and that seat selection is considered important by most respondents. This means the bar for </w:t>
+        <w:t xml:space="preserve">The third primary stakeholder is the customer base of Filmtopia. Customers interact with the system either directly through the proposed self service kiosk or indirectly when staff process their bookings on their behalf. Their main interests are convenience, short queue times and the assurance that the seat they have been allocated will actually be available when they arrive. The questionnaire results discussed later in this investigation show that a large majority of customers would prefer self service ticketing and that seat selection is considered important by most respondents. This means the bar for </w:t>
       </w:r>
       <w:r>
         <w:lastRenderedPageBreak/>
@@ -189,15 +125,7 @@
         <w:spacing w:after="80"/>
       </w:pPr>
       <w:r>
-        <w:t xml:space="preserve">Another secondary stakeholder is any external IT support that </w:t>
-      </w:r>
-      <w:proofErr w:type="spellStart"/>
-      <w:r>
-        <w:t>Filmtopia</w:t>
-      </w:r>
-      <w:proofErr w:type="spellEnd"/>
-      <w:r>
-        <w:t xml:space="preserve"> uses. As a small independent cinema there is no dedicated IT department meaning the system must be robust and straightforward to maintain. Complex setups that require specialist knowledge to troubleshoot would be impractical for a business of this size.</w:t>
+        <w:t>Another secondary stakeholder is any external IT support that Filmtopia uses. As a small independent cinema there is no dedicated IT department meaning the system must be robust and straightforward to maintain. Complex setups that require specialist knowledge to troubleshoot would be impractical for a business of this size.</w:t>
       </w:r>
     </w:p>
     <w:p>
@@ -205,23 +133,7 @@
         <w:spacing w:after="80"/>
       </w:pPr>
       <w:r>
-        <w:t>Finally it is worth briefly noting the tertiary stakeholders. Film distributors have an indirect interest in the system because accurate sales data for their titles may need to be reported back to them. HMRC and other regulatory bodies also have an indirect interest given that the system will record financial transactions which form part of the cinema's business records. These stakeholders do not influence the day to day design of the system but they do place constraints on it, particularly around data accuracy and record keeping.</w:t>
-      </w:r>
-    </w:p>
-    <w:p>
-      <w:pPr>
-        <w:spacing w:after="80"/>
-      </w:pPr>
-      <w:r>
-        <w:t xml:space="preserve">In summary the stakeholder analysis makes clear that the </w:t>
-      </w:r>
-      <w:proofErr w:type="spellStart"/>
-      <w:r>
-        <w:t>Filmtopia</w:t>
-      </w:r>
-      <w:proofErr w:type="spellEnd"/>
-      <w:r>
-        <w:t xml:space="preserve"> system needs to serve a wide range of users with different levels of technical confidence and different priorities. The investigation that follows has been designed to gather requirements from as many of these stakeholders as possible to ensure the final system genuinely reflects the needs of everyone who will be affected by it.</w:t>
+        <w:t>In summary the stakeholder analysis makes clear that the Filmtopia system needs to serve a wide range of users with different levels of technical confidence and different priorities. The investigation that follows has been designed to gather requirements from as many of these stakeholders as possible to ensure the final system genuinely reflects the needs of everyone who will be affected by it.</w:t>
       </w:r>
     </w:p>
     <w:p/>
@@ -569,7 +481,6 @@
                 <w:b/>
                 <w:bCs/>
               </w:rPr>
-              <w:lastRenderedPageBreak/>
               <w:t xml:space="preserve">Customer questionnaire analysis </w:t>
             </w:r>
           </w:p>
@@ -608,44 +519,8 @@
               <w:rPr>
                 <w:lang w:val="fr-FR"/>
               </w:rPr>
-              <w:t xml:space="preserve"> </w:t>
-            </w:r>
-            <w:proofErr w:type="spellStart"/>
-            <w:r>
-              <w:rPr>
-                <w:lang w:val="fr-FR"/>
-              </w:rPr>
-              <w:t>Summarise</w:t>
-            </w:r>
-            <w:proofErr w:type="spellEnd"/>
-            <w:r>
-              <w:rPr>
-                <w:lang w:val="fr-FR"/>
-              </w:rPr>
-              <w:t xml:space="preserve"> and </w:t>
-            </w:r>
-            <w:proofErr w:type="spellStart"/>
-            <w:r>
-              <w:rPr>
-                <w:lang w:val="fr-FR"/>
-              </w:rPr>
-              <w:t>interpret</w:t>
-            </w:r>
-            <w:proofErr w:type="spellEnd"/>
-            <w:r>
-              <w:rPr>
-                <w:lang w:val="fr-FR"/>
-              </w:rPr>
-              <w:t xml:space="preserve"> questionnaire </w:t>
-            </w:r>
-            <w:proofErr w:type="spellStart"/>
-            <w:r>
-              <w:rPr>
-                <w:lang w:val="fr-FR"/>
-              </w:rPr>
-              <w:t>responses</w:t>
-            </w:r>
-            <w:proofErr w:type="spellEnd"/>
+              <w:t xml:space="preserve"> Summarise and interpret questionnaire responses</w:t>
+            </w:r>
           </w:p>
         </w:tc>
       </w:tr>
@@ -718,6 +593,7 @@
                 <w:b/>
                 <w:bCs/>
               </w:rPr>
+              <w:lastRenderedPageBreak/>
               <w:t xml:space="preserve">Desk based research — Vue Cinema (myvue.com) </w:t>
             </w:r>
           </w:p>
@@ -1109,30 +985,22 @@
         <w:spacing w:after="80"/>
       </w:pPr>
       <w:r>
-        <w:t xml:space="preserve">Starting with interviews, these were chosen as the main method for gathering requirements from the key stakeholders. The reason for this is that an interview allows open ended questions to be asked and the conversation can naturally go in directions that were not planned in advance. This is important because some of the most useful information gathered during an investigation comes from things that the person being interviewed mentions without being directly asked. A written survey would not allow for this kind of flexibility. The limitation of interviews however is that they are time consuming and the quality of what comes out of them depends heavily on how well the questions are prepared. To address this the questions were written in advance and kept open ended to avoid leading the person being interviewed towards a particular answer. Two interviews were conducted for this </w:t>
+        <w:t>Starting with interviews, these were chosen as the main method for gathering requirements from the key stakeholders. The reason for this is that an interview allows open ended questions to be asked and the conversation can naturally go in directions that were not planned in advance. This is important because some of the most useful information gathered during an investigation comes from things that the person being interviewed mentions without being directly asked. A written survey would not allow for this kind of flexibility. The limitation of interviews however is that they are time consuming and the quality of what comes out of them depends heavily on how well the questions are prepared. To address this the questions were written in advance and kept open ended to avoid leading the person being interviewed towards a particular answer. Two interviews were conducted for this investigation, one with the cinema manager and one with a member of the box office staff, as these two stakeholders gave the most complete view of how the existing system operates day to day.</w:t>
+      </w:r>
+    </w:p>
+    <w:p>
+      <w:pPr>
+        <w:tabs>
+          <w:tab w:val="num" w:pos="1440"/>
+        </w:tabs>
+        <w:spacing w:after="80"/>
+      </w:pPr>
+      <w:r>
+        <w:t xml:space="preserve">Moving on to the customer questionnaire, this was chosen because it allowed a much larger group of stakeholders to contribute to the investigation than would have been possible through interviews alone. Interviewing every customer individually would not be realistic, so a questionnaire was the </w:t>
       </w:r>
       <w:r>
         <w:lastRenderedPageBreak/>
-        <w:t>investigation, one with the cinema manager and one with a member of the box office staff, as these two stakeholders gave the most complete view of how the existing system operates day to day.</w:t>
-      </w:r>
-    </w:p>
-    <w:p>
-      <w:pPr>
-        <w:tabs>
-          <w:tab w:val="num" w:pos="1440"/>
-        </w:tabs>
-        <w:spacing w:after="80"/>
-      </w:pPr>
-      <w:r>
-        <w:t xml:space="preserve">Moving on to the customer questionnaire, this was chosen because it allowed a much larger group of stakeholders to contribute to the investigation than would have been possible through interviews alone. Interviewing every customer individually would not be realistic, so a questionnaire was the most practical way to gather their views. The key advantage of a questionnaire is that it produces quantitative data which is easier to summarise and use as justification for design decisions. For example knowing that a large majority of customers would prefer a </w:t>
-      </w:r>
-      <w:proofErr w:type="spellStart"/>
-      <w:r>
-        <w:t>self service</w:t>
-      </w:r>
-      <w:proofErr w:type="spellEnd"/>
-      <w:r>
-        <w:t xml:space="preserve"> kiosk is a much stronger argument for including that feature than one person mentioning it in an interview. The limitation of a questionnaire is that the questions are fixed which means there is no opportunity to follow up on responses or ask for more detail. To partially work around this some of the questions included a list of options rather than just a yes or no answer which produced more useful and specific data.</w:t>
+        <w:t>most practical way to gather their views. The key advantage of a questionnaire is that it produces quantitative data which is easier to summarise and use as justification for design decisions. For example knowing that a large majority of customers would prefer a self service kiosk is a much stronger argument for including that feature than one person mentioning it in an interview. The limitation of a questionnaire is that the questions are fixed which means there is no opportunity to follow up on responses or ask for more detail. To partially work around this some of the questions included a list of options rather than just a yes or no answer which produced more useful and specific data.</w:t>
       </w:r>
     </w:p>
     <w:p>
@@ -1220,62 +1088,34 @@
         <w:rPr>
           <w:rStyle w:val="Strong"/>
         </w:rPr>
-        <w:t xml:space="preserve">Q: Can you describe how </w:t>
-      </w:r>
-      <w:proofErr w:type="spellStart"/>
+        <w:t>Q: Can you describe how Filmtopia currently manages its ticketing and bookings?</w:t>
+      </w:r>
+    </w:p>
+    <w:p>
+      <w:r>
+        <w:t>A: At the moment everything is done manually. When a customer comes in, staff write their booking down in a paper diary. We have a touchscreen kiosk but it can only handle food and drink orders. It cannot sell tickets at all which is a real problem during busy periods because customers have to queue twice.</w:t>
+      </w:r>
+    </w:p>
+    <w:p>
       <w:r>
         <w:rPr>
           <w:rStyle w:val="Strong"/>
         </w:rPr>
-        <w:t>Filmtopia</w:t>
-      </w:r>
-      <w:proofErr w:type="spellEnd"/>
+        <w:t>Q: What are the biggest problems you face with the current system?</w:t>
+      </w:r>
+    </w:p>
+    <w:p>
+      <w:r>
+        <w:lastRenderedPageBreak/>
+        <w:t>A: Double bookings are a nightmare. Because everything is written on paper, if two members of staff take a booking for the same screening at the same time we do not find out until the customer arrives. We have had some very unhappy customers because of this. Also I have no real way of seeing how well the cinema is doing without physically going through every piece of paper we have.</w:t>
+      </w:r>
+    </w:p>
+    <w:p>
       <w:r>
         <w:rPr>
           <w:rStyle w:val="Strong"/>
         </w:rPr>
-        <w:t xml:space="preserve"> currently manages its ticketing and bookings?</w:t>
-      </w:r>
-    </w:p>
-    <w:p>
-      <w:r>
-        <w:lastRenderedPageBreak/>
-        <w:t>A: At the moment everything is done manually. When a customer comes in, staff write their booking down in a paper diary. We have a touchscreen kiosk but it can only handle food and drink orders. It cannot sell tickets at all which is a real problem during busy periods because customers have to queue twice.</w:t>
-      </w:r>
-    </w:p>
-    <w:p>
-      <w:r>
-        <w:rPr>
-          <w:rStyle w:val="Strong"/>
-        </w:rPr>
-        <w:t>Q: What are the biggest problems you face with the current system?</w:t>
-      </w:r>
-    </w:p>
-    <w:p>
-      <w:r>
-        <w:t>A: Double bookings are a nightmare. Because everything is written on paper, if two members of staff take a booking for the same screening at the same time we do not find out until the customer arrives. We have had some very unhappy customers because of this. Also I have no real way of seeing how well the cinema is doing without physically going through every piece of paper we have.</w:t>
-      </w:r>
-    </w:p>
-    <w:p>
-      <w:r>
-        <w:rPr>
-          <w:rStyle w:val="Strong"/>
-        </w:rPr>
-        <w:t xml:space="preserve">Q: What data does </w:t>
-      </w:r>
-      <w:proofErr w:type="spellStart"/>
-      <w:r>
-        <w:rPr>
-          <w:rStyle w:val="Strong"/>
-        </w:rPr>
-        <w:t>Filmtopia</w:t>
-      </w:r>
-      <w:proofErr w:type="spellEnd"/>
-      <w:r>
-        <w:rPr>
-          <w:rStyle w:val="Strong"/>
-        </w:rPr>
-        <w:t xml:space="preserve"> currently store and how?</w:t>
+        <w:t>Q: What data does Filmtopia currently store and how?</w:t>
       </w:r>
     </w:p>
     <w:p>
@@ -1405,21 +1245,21 @@
         </w:tabs>
       </w:pPr>
       <w:r>
+        <w:t>A: The biggest one is not knowing if a seat is already taken. Sometimes a customer picks a specific seat and we say yes, then another member of staff has already given that seat to someone else and we do not know until they both turn up. It causes a lot of awkward situations. Also finding information takes too long. If someone asks what time a film starts or how many seats are left I have to physically look through the diary.</w:t>
+      </w:r>
+    </w:p>
+    <w:p>
+      <w:pPr>
+        <w:tabs>
+          <w:tab w:val="num" w:pos="1440"/>
+        </w:tabs>
+      </w:pPr>
+      <w:r>
+        <w:rPr>
+          <w:b/>
+          <w:bCs/>
+        </w:rPr>
         <w:lastRenderedPageBreak/>
-        <w:t>A: The biggest one is not knowing if a seat is already taken. Sometimes a customer picks a specific seat and we say yes, then another member of staff has already given that seat to someone else and we do not know until they both turn up. It causes a lot of awkward situations. Also finding information takes too long. If someone asks what time a film starts or how many seats are left I have to physically look through the diary.</w:t>
-      </w:r>
-    </w:p>
-    <w:p>
-      <w:pPr>
-        <w:tabs>
-          <w:tab w:val="num" w:pos="1440"/>
-        </w:tabs>
-      </w:pPr>
-      <w:r>
-        <w:rPr>
-          <w:b/>
-          <w:bCs/>
-        </w:rPr>
         <w:t>Q: How do you currently handle food and drink orders alongside ticketing?</w:t>
       </w:r>
     </w:p>
@@ -1526,23 +1366,7 @@
           <w:b/>
           <w:bCs/>
         </w:rPr>
-        <w:t xml:space="preserve">Questionnaire – </w:t>
-      </w:r>
-      <w:proofErr w:type="spellStart"/>
-      <w:r>
-        <w:rPr>
-          <w:b/>
-          <w:bCs/>
-        </w:rPr>
-        <w:t>Filmtopia</w:t>
-      </w:r>
-      <w:proofErr w:type="spellEnd"/>
-      <w:r>
-        <w:rPr>
-          <w:b/>
-          <w:bCs/>
-        </w:rPr>
-        <w:t xml:space="preserve"> Customer Survey</w:t>
+        <w:t>Questionnaire – Filmtopia Customer Survey</w:t>
       </w:r>
     </w:p>
     <w:p>
@@ -1582,49 +1406,25 @@
         </w:tabs>
       </w:pPr>
       <w:r>
-        <w:t xml:space="preserve">A questionnaire was distributed to customers visiting </w:t>
-      </w:r>
-      <w:proofErr w:type="spellStart"/>
-      <w:r>
-        <w:t>Filmtopia</w:t>
-      </w:r>
-      <w:proofErr w:type="spellEnd"/>
-      <w:r>
-        <w:t xml:space="preserve"> in order to gather feedback on their experience with the current system and to understand what they would want from a new one. The questions and summarised responses are as follows.</w:t>
-      </w:r>
-    </w:p>
-    <w:p>
-      <w:pPr>
-        <w:tabs>
-          <w:tab w:val="num" w:pos="1440"/>
-        </w:tabs>
-        <w:rPr>
-          <w:b/>
-          <w:bCs/>
-        </w:rPr>
-      </w:pPr>
-      <w:r>
-        <w:rPr>
-          <w:b/>
-          <w:bCs/>
-        </w:rPr>
-        <w:t xml:space="preserve">Q1: How do you currently purchase your tickets at </w:t>
-      </w:r>
-      <w:proofErr w:type="spellStart"/>
-      <w:r>
-        <w:rPr>
-          <w:b/>
-          <w:bCs/>
-        </w:rPr>
-        <w:t>Filmtopia</w:t>
-      </w:r>
-      <w:proofErr w:type="spellEnd"/>
-      <w:r>
-        <w:rPr>
-          <w:b/>
-          <w:bCs/>
-        </w:rPr>
-        <w:t>?</w:t>
+        <w:t>A questionnaire was distributed to customers visiting Filmtopia in order to gather feedback on their experience with the current system and to understand what they would want from a new one. The questions and summarised responses are as follows.</w:t>
+      </w:r>
+    </w:p>
+    <w:p>
+      <w:pPr>
+        <w:tabs>
+          <w:tab w:val="num" w:pos="1440"/>
+        </w:tabs>
+        <w:rPr>
+          <w:b/>
+          <w:bCs/>
+        </w:rPr>
+      </w:pPr>
+      <w:r>
+        <w:rPr>
+          <w:b/>
+          <w:bCs/>
+        </w:rPr>
+        <w:t>Q1: How do you currently purchase your tickets at Filmtopia?</w:t>
       </w:r>
     </w:p>
     <w:tbl>
@@ -1771,23 +1571,7 @@
           <w:b/>
           <w:bCs/>
         </w:rPr>
-        <w:t xml:space="preserve">Q2: Have you ever experienced a problem when booking tickets at </w:t>
-      </w:r>
-      <w:proofErr w:type="spellStart"/>
-      <w:r>
-        <w:rPr>
-          <w:b/>
-          <w:bCs/>
-        </w:rPr>
-        <w:t>Filmtopia</w:t>
-      </w:r>
-      <w:proofErr w:type="spellEnd"/>
-      <w:r>
-        <w:rPr>
-          <w:b/>
-          <w:bCs/>
-        </w:rPr>
-        <w:t>?</w:t>
+        <w:t>Q2: Have you ever experienced a problem when booking tickets at Filmtopia?</w:t>
       </w:r>
     </w:p>
     <w:tbl>
@@ -1817,7 +1601,6 @@
                 <w:b/>
                 <w:bCs/>
               </w:rPr>
-              <w:lastRenderedPageBreak/>
               <w:t xml:space="preserve">Response </w:t>
             </w:r>
           </w:p>
@@ -1913,6 +1696,7 @@
           <w:b/>
           <w:bCs/>
         </w:rPr>
+        <w:lastRenderedPageBreak/>
         <w:t>Q3: If yes, what was the problem you experienced?</w:t>
       </w:r>
     </w:p>
@@ -2380,15 +2164,7 @@
         </w:tabs>
       </w:pPr>
       <w:r>
-        <w:t xml:space="preserve">85% of customers felt seat selection was at least quite important. This supports the planned graphical seat selection feature in the </w:t>
-      </w:r>
-      <w:proofErr w:type="spellStart"/>
-      <w:r>
-        <w:t>Filmtopia</w:t>
-      </w:r>
-      <w:proofErr w:type="spellEnd"/>
-      <w:r>
-        <w:t xml:space="preserve"> system.</w:t>
+        <w:t>85% of customers felt seat selection was at least quite important. This supports the planned graphical seat selection feature in the Filmtopia system.</w:t>
       </w:r>
     </w:p>
     <w:p>
@@ -2548,19 +2324,7 @@
         </w:tabs>
       </w:pPr>
       <w:r>
-        <w:t xml:space="preserve">The questionnaire results clearly show that customers are experiencing real problems with the current system at </w:t>
-      </w:r>
-      <w:proofErr w:type="spellStart"/>
-      <w:r>
-        <w:t>Filmtopia</w:t>
-      </w:r>
-      <w:proofErr w:type="spellEnd"/>
-      <w:r>
-        <w:t xml:space="preserve">. The most significant issues are long queues at the box office, errors with seat allocation and the inability to book tickets through the kiosk. The results also show strong </w:t>
-      </w:r>
-      <w:r>
-        <w:lastRenderedPageBreak/>
-        <w:t>demand for a self-service ticketing kiosk, graphical seat selection and combined food and drink ordering. These findings have directly informed the objectives set out later in this investigation.</w:t>
+        <w:t>The questionnaire results clearly show that customers are experiencing real problems with the current system at Filmtopia. The most significant issues are long queues at the box office, errors with seat allocation and the inability to book tickets through the kiosk. The results also show strong demand for a self-service ticketing kiosk, graphical seat selection and combined food and drink ordering. These findings have directly informed the objectives set out later in this investigation.</w:t>
       </w:r>
     </w:p>
     <w:p>
@@ -2597,6 +2361,7 @@
           <w:sz w:val="36"/>
           <w:szCs w:val="36"/>
         </w:rPr>
+        <w:lastRenderedPageBreak/>
         <w:t>Direct Observation</w:t>
       </w:r>
     </w:p>
@@ -2608,15 +2373,7 @@
         <w:spacing w:after="80"/>
       </w:pPr>
       <w:r>
-        <w:t xml:space="preserve">As part of the investigation I visited </w:t>
-      </w:r>
-      <w:proofErr w:type="spellStart"/>
-      <w:r>
-        <w:t>Filmtopia</w:t>
-      </w:r>
-      <w:proofErr w:type="spellEnd"/>
-      <w:r>
-        <w:t xml:space="preserve"> during an evening showing to observe how the current system operates in practice. Rather than asking questions or interrupting the workflow I simply watched how staff handled customers during the pre-screening period when the cinema was at its busiest. The aim was to see the existing system in action and to identify any problems that might not have come up during the interviews or questionnaire.</w:t>
+        <w:t>As part of the investigation I visited Filmtopia during an evening showing to observe how the current system operates in practice. Rather than asking questions or interrupting the workflow I simply watched how staff handled customers during the pre-screening period when the cinema was at its busiest. The aim was to see the existing system in action and to identify any problems that might not have come up during the interviews or questionnaire.</w:t>
       </w:r>
     </w:p>
     <w:p>
@@ -2721,38 +2478,38 @@
         </w:tabs>
       </w:pPr>
       <w:r>
-        <w:t xml:space="preserve">As part of my investigation, I researched the Vue Cinema booking system, which is one of the largest cinema chains in the UK. Vue operates 94 cinemas across the UK and Ireland and their online booking </w:t>
-      </w:r>
-      <w:r>
+        <w:t>As part of my investigation, I researched the Vue Cinema booking system, which is one of the largest cinema chains in the UK. Vue operates 94 cinemas across the UK and Ireland and their online booking system provides a useful reference point for what a professional cinema management system should look like.</w:t>
+      </w:r>
+    </w:p>
+    <w:p>
+      <w:pPr>
+        <w:tabs>
+          <w:tab w:val="num" w:pos="1440"/>
+        </w:tabs>
+        <w:rPr>
+          <w:b/>
+          <w:bCs/>
+        </w:rPr>
+      </w:pPr>
+      <w:r>
+        <w:rPr>
+          <w:b/>
+          <w:bCs/>
+        </w:rPr>
+        <w:t>Film Listings Page</w:t>
+      </w:r>
+    </w:p>
+    <w:p>
+      <w:pPr>
+        <w:tabs>
+          <w:tab w:val="num" w:pos="1440"/>
+        </w:tabs>
+      </w:pPr>
+      <w:r>
+        <w:rPr>
+          <w:noProof/>
+        </w:rPr>
         <w:lastRenderedPageBreak/>
-        <w:t>system provides a useful reference point for what a professional cinema management system should look like.</w:t>
-      </w:r>
-    </w:p>
-    <w:p>
-      <w:pPr>
-        <w:tabs>
-          <w:tab w:val="num" w:pos="1440"/>
-        </w:tabs>
-        <w:rPr>
-          <w:b/>
-          <w:bCs/>
-        </w:rPr>
-      </w:pPr>
-      <w:r>
-        <w:rPr>
-          <w:b/>
-          <w:bCs/>
-        </w:rPr>
-        <w:t>Film Listings Page</w:t>
-      </w:r>
-    </w:p>
-    <w:p>
-      <w:pPr>
-        <w:tabs>
-          <w:tab w:val="num" w:pos="1440"/>
-        </w:tabs>
-      </w:pPr>
-      <w:r>
         <w:drawing>
           <wp:inline distT="0" distB="0" distL="0" distR="0" wp14:anchorId="5F3958F4" wp14:editId="3616646E">
             <wp:extent cx="7549827" cy="3467100"/>
@@ -2769,7 +2526,7 @@
                     <pic:cNvPicPr/>
                   </pic:nvPicPr>
                   <pic:blipFill>
-                    <a:blip r:embed="rId5"/>
+                    <a:blip r:embed="rId7"/>
                     <a:stretch>
                       <a:fillRect/>
                     </a:stretch>
@@ -2797,15 +2554,7 @@
         </w:tabs>
       </w:pPr>
       <w:r>
-        <w:t xml:space="preserve">The Vue homepage presents films visually using large poster images organised under a "Top Films" heading. Each film is displayed with its title clearly beneath it and the page includes a Quick Book bar at the bottom allowing users to search by venue, film, date and time simultaneously. This is a clean and intuitive way of presenting information that allows customers to find what they want quickly without having to navigate through multiple pages. For the </w:t>
-      </w:r>
-      <w:proofErr w:type="spellStart"/>
-      <w:r>
-        <w:t>Filmtopia</w:t>
-      </w:r>
-      <w:proofErr w:type="spellEnd"/>
-      <w:r>
-        <w:t xml:space="preserve"> system I will incorporate a similar visual approach to displaying films on the customer kiosk, ensuring that screenings are easy to browse and select.</w:t>
+        <w:t>The Vue homepage presents films visually using large poster images organised under a "Top Films" heading. Each film is displayed with its title clearly beneath it and the page includes a Quick Book bar at the bottom allowing users to search by venue, film, date and time simultaneously. This is a clean and intuitive way of presenting information that allows customers to find what they want quickly without having to navigate through multiple pages. For the Filmtopia system I will incorporate a similar visual approach to displaying films on the customer kiosk, ensuring that screenings are easy to browse and select.</w:t>
       </w:r>
     </w:p>
     <w:p>
@@ -2833,6 +2582,9 @@
         </w:tabs>
       </w:pPr>
       <w:r>
+        <w:rPr>
+          <w:noProof/>
+        </w:rPr>
         <w:lastRenderedPageBreak/>
         <w:drawing>
           <wp:inline distT="0" distB="0" distL="0" distR="0" wp14:anchorId="141796FF" wp14:editId="68086F9A">
@@ -2850,7 +2602,7 @@
                     <pic:cNvPicPr/>
                   </pic:nvPicPr>
                   <pic:blipFill>
-                    <a:blip r:embed="rId6"/>
+                    <a:blip r:embed="rId8"/>
                     <a:stretch>
                       <a:fillRect/>
                     </a:stretch>
@@ -2878,15 +2630,7 @@
         </w:tabs>
       </w:pPr>
       <w:r>
-        <w:t xml:space="preserve">When a film is selected Vue displays all upcoming showings for that film at the chosen venue, organised by date and time. Each screening card shows the start and end time, the screen number and the ticket price. Accessibility information such as audio description and wheelchair access is also clearly displayed. This level of detail is something I aim to replicate in </w:t>
-      </w:r>
-      <w:proofErr w:type="spellStart"/>
-      <w:r>
-        <w:t>Filmtopia</w:t>
-      </w:r>
-      <w:proofErr w:type="spellEnd"/>
-      <w:r>
-        <w:t>, where staff and customers should be able to see all relevant information about a screening at a glance without having to search through multiple menus.</w:t>
+        <w:t>When a film is selected Vue displays all upcoming showings for that film at the chosen venue, organised by date and time. Each screening card shows the start and end time, the screen number and the ticket price. Accessibility information such as audio description and wheelchair access is also clearly displayed. This level of detail is something I aim to replicate in Filmtopia, where staff and customers should be able to see all relevant information about a screening at a glance without having to search through multiple menus.</w:t>
       </w:r>
     </w:p>
     <w:p>
@@ -2914,6 +2658,9 @@
         </w:tabs>
       </w:pPr>
       <w:r>
+        <w:rPr>
+          <w:noProof/>
+        </w:rPr>
         <w:lastRenderedPageBreak/>
         <w:drawing>
           <wp:inline distT="0" distB="0" distL="0" distR="0" wp14:anchorId="26AE6547" wp14:editId="0B7011B7">
@@ -2931,7 +2678,7 @@
                     <pic:cNvPicPr/>
                   </pic:nvPicPr>
                   <pic:blipFill>
-                    <a:blip r:embed="rId7"/>
+                    <a:blip r:embed="rId9"/>
                     <a:stretch>
                       <a:fillRect/>
                     </a:stretch>
@@ -2959,56 +2706,31 @@
         </w:tabs>
       </w:pPr>
       <w:r>
-        <w:t xml:space="preserve">Vue's seat selection interface is a standout feature of their system. It displays a graphical layout of the screen showing every seat as a coloured icon, with different colours representing different seat types and prices. VIP seats are shown in orange at £8.49, Regular seats in black at £7.49, Saver seats in green at £6.49 and Super Saver seats in red at £4.99. Occupied seats are shown in grey so customers can immediately see what is available. Rows are labelled alphabetically on the left hand side. This graphical seat selection is a key feature I plan to implement in </w:t>
-      </w:r>
-      <w:proofErr w:type="spellStart"/>
-      <w:r>
-        <w:t>Filmtopia</w:t>
-      </w:r>
-      <w:proofErr w:type="spellEnd"/>
-      <w:r>
-        <w:t xml:space="preserve"> as it directly addresses the double booking problem identified in the interviews. By showing customers and staff exactly which seats are taken in real time the system eliminates the risk of two people being assigned the same seat.</w:t>
-      </w:r>
-    </w:p>
-    <w:p>
-      <w:pPr>
-        <w:tabs>
-          <w:tab w:val="num" w:pos="1440"/>
-        </w:tabs>
-      </w:pPr>
-      <w:r>
-        <w:rPr>
-          <w:b/>
-          <w:bCs/>
-        </w:rPr>
-        <w:t xml:space="preserve">Features Identified for </w:t>
-      </w:r>
-      <w:proofErr w:type="spellStart"/>
-      <w:r>
-        <w:rPr>
-          <w:b/>
-          <w:bCs/>
-        </w:rPr>
-        <w:t>Filmtopia</w:t>
-      </w:r>
-      <w:proofErr w:type="spellEnd"/>
-    </w:p>
-    <w:p>
-      <w:pPr>
-        <w:tabs>
-          <w:tab w:val="num" w:pos="1440"/>
-        </w:tabs>
-      </w:pPr>
-      <w:r>
-        <w:t xml:space="preserve">From researching Vue's system I have identified the following features that I will incorporate into the </w:t>
-      </w:r>
-      <w:proofErr w:type="spellStart"/>
-      <w:r>
-        <w:t>Filmtopia</w:t>
-      </w:r>
-      <w:proofErr w:type="spellEnd"/>
-      <w:r>
-        <w:t xml:space="preserve"> system:</w:t>
+        <w:t>Vue's seat selection interface is a standout feature of their system. It displays a graphical layout of the screen showing every seat as a coloured icon, with different colours representing different seat types and prices. VIP seats are shown in orange at £8.49, Regular seats in black at £7.49, Saver seats in green at £6.49 and Super Saver seats in red at £4.99. Occupied seats are shown in grey so customers can immediately see what is available. Rows are labelled alphabetically on the left hand side. This graphical seat selection is a key feature I plan to implement in Filmtopia as it directly addresses the double booking problem identified in the interviews. By showing customers and staff exactly which seats are taken in real time the system eliminates the risk of two people being assigned the same seat.</w:t>
+      </w:r>
+    </w:p>
+    <w:p>
+      <w:pPr>
+        <w:tabs>
+          <w:tab w:val="num" w:pos="1440"/>
+        </w:tabs>
+      </w:pPr>
+      <w:r>
+        <w:rPr>
+          <w:b/>
+          <w:bCs/>
+        </w:rPr>
+        <w:t>Features Identified for Filmtopia</w:t>
+      </w:r>
+    </w:p>
+    <w:p>
+      <w:pPr>
+        <w:tabs>
+          <w:tab w:val="num" w:pos="1440"/>
+        </w:tabs>
+      </w:pPr>
+      <w:r>
+        <w:t>From researching Vue's system I have identified the following features that I will incorporate into the Filmtopia system:</w:t>
       </w:r>
     </w:p>
     <w:p>
@@ -3114,15 +2836,7 @@
       </w:pPr>
       <w:r>
         <w:lastRenderedPageBreak/>
-        <w:t xml:space="preserve">The second system I researched was Odeon, which is the largest cinema chain in the UK. Odeon operates over 120 cinemas across the UK and Ireland and their online booking system offered several useful features to compare against Vue and to inform the design of </w:t>
-      </w:r>
-      <w:proofErr w:type="spellStart"/>
-      <w:r>
-        <w:t>Filmtopia</w:t>
-      </w:r>
-      <w:proofErr w:type="spellEnd"/>
-      <w:r>
-        <w:t>.</w:t>
+        <w:t>The second system I researched was Odeon, which is the largest cinema chain in the UK. Odeon operates over 120 cinemas across the UK and Ireland and their online booking system offered several useful features to compare against Vue and to inform the design of Filmtopia.</w:t>
       </w:r>
     </w:p>
     <w:p>
@@ -3150,6 +2864,9 @@
         </w:tabs>
       </w:pPr>
       <w:r>
+        <w:rPr>
+          <w:noProof/>
+        </w:rPr>
         <w:drawing>
           <wp:inline distT="0" distB="0" distL="0" distR="0" wp14:anchorId="65644071" wp14:editId="52091A46">
             <wp:extent cx="5731510" cy="5603875"/>
@@ -3166,7 +2883,7 @@
                     <pic:cNvPicPr/>
                   </pic:nvPicPr>
                   <pic:blipFill>
-                    <a:blip r:embed="rId8"/>
+                    <a:blip r:embed="rId10"/>
                     <a:stretch>
                       <a:fillRect/>
                     </a:stretch>
@@ -3194,15 +2911,7 @@
         </w:tabs>
       </w:pPr>
       <w:r>
-        <w:t xml:space="preserve">Similar to Vue, Odeon presents films using large poster images organised under a Top Films heading. However Odeon includes additional information directly on the film page such as the director, cast, runtime, release date and genre tags. This richer level of detail gives customers more context before making a booking decision. Odeon also includes a quick search bar at the bottom of the page allowing users to filter by cinema, film, date and time. One notable difference from Vue is that Odeon uses a darker navy blue colour scheme throughout which creates a more premium feel. For </w:t>
-      </w:r>
-      <w:proofErr w:type="spellStart"/>
-      <w:r>
-        <w:t>Filmtopia</w:t>
-      </w:r>
-      <w:proofErr w:type="spellEnd"/>
-      <w:r>
-        <w:t xml:space="preserve"> I will aim to display key film information clearly on the customer kiosk so customers can make informed decisions quickly.</w:t>
+        <w:t>Similar to Vue, Odeon presents films using large poster images organised under a Top Films heading. However Odeon includes additional information directly on the film page such as the director, cast, runtime, release date and genre tags. This richer level of detail gives customers more context before making a booking decision. Odeon also includes a quick search bar at the bottom of the page allowing users to filter by cinema, film, date and time. One notable difference from Vue is that Odeon uses a darker navy blue colour scheme throughout which creates a more premium feel. For Filmtopia I will aim to display key film information clearly on the customer kiosk so customers can make informed decisions quickly.</w:t>
       </w:r>
     </w:p>
     <w:p>
@@ -3230,6 +2939,9 @@
         </w:tabs>
       </w:pPr>
       <w:r>
+        <w:rPr>
+          <w:noProof/>
+        </w:rPr>
         <w:lastRenderedPageBreak/>
         <w:drawing>
           <wp:inline distT="0" distB="0" distL="0" distR="0" wp14:anchorId="4241C67F" wp14:editId="7068D285">
@@ -3247,7 +2959,7 @@
                     <pic:cNvPicPr/>
                   </pic:nvPicPr>
                   <pic:blipFill>
-                    <a:blip r:embed="rId9"/>
+                    <a:blip r:embed="rId11"/>
                     <a:stretch>
                       <a:fillRect/>
                     </a:stretch>
@@ -3275,15 +2987,7 @@
         </w:tabs>
       </w:pPr>
       <w:r>
-        <w:t xml:space="preserve">Odeon's screening times page clearly displays the film title, runtime, release date and genre alongside all available showtimes. Screenings are organised by date across the top of the page and grouped by cinema location below. Each screening card shows the start time, screen number and format such as 3D. A "Book Now" button is displayed prominently on each card making the next action immediately obvious. This clear layout is something I will replicate in </w:t>
-      </w:r>
-      <w:proofErr w:type="spellStart"/>
-      <w:r>
-        <w:t>Filmtopia</w:t>
-      </w:r>
-      <w:proofErr w:type="spellEnd"/>
-      <w:r>
-        <w:t xml:space="preserve"> where staff should be able to see all screenings for a given film at a glance.</w:t>
+        <w:t>Odeon's screening times page clearly displays the film title, runtime, release date and genre alongside all available showtimes. Screenings are organised by date across the top of the page and grouped by cinema location below. Each screening card shows the start time, screen number and format such as 3D. A "Book Now" button is displayed prominently on each card making the next action immediately obvious. This clear layout is something I will replicate in Filmtopia where staff should be able to see all screenings for a given film at a glance.</w:t>
       </w:r>
     </w:p>
     <w:p>
@@ -3311,6 +3015,9 @@
         </w:tabs>
       </w:pPr>
       <w:r>
+        <w:rPr>
+          <w:noProof/>
+        </w:rPr>
         <w:lastRenderedPageBreak/>
         <w:drawing>
           <wp:inline distT="0" distB="0" distL="0" distR="0" wp14:anchorId="00613719" wp14:editId="2C8B7A72">
@@ -3328,7 +3035,7 @@
                     <pic:cNvPicPr/>
                   </pic:nvPicPr>
                   <pic:blipFill>
-                    <a:blip r:embed="rId10"/>
+                    <a:blip r:embed="rId12"/>
                     <a:stretch>
                       <a:fillRect/>
                     </a:stretch>
@@ -3356,64 +3063,31 @@
         </w:tabs>
       </w:pPr>
       <w:r>
-        <w:t xml:space="preserve">Odeon's seat selection screen is particularly well designed and shows several features worth incorporating into </w:t>
-      </w:r>
-      <w:proofErr w:type="spellStart"/>
-      <w:r>
-        <w:t>Filmtopia</w:t>
-      </w:r>
-      <w:proofErr w:type="spellEnd"/>
-      <w:r>
-        <w:t xml:space="preserve">. The screen displays a graphical layout of the entire auditorium with seats colour coded by type and price. Green seats represent Classic Saver at £14.99, cream seats represent Classic at £16.49 and orange seats represent Classic Popular at £17.99. Unavailable seats are shown with an X so it is immediately clear which seats cannot be booked. A seat key at the bottom explains the colour coding including wheelchair and companion seat options. The booking process is also clearly structured using a step by step tab navigation at the top showing Seats, Sign In, Tickets, Food, Summary and Payment. This staged approach guides the user through the process logically and reduces confusion. For </w:t>
-      </w:r>
-      <w:proofErr w:type="spellStart"/>
-      <w:r>
-        <w:t>Filmtopia</w:t>
-      </w:r>
-      <w:proofErr w:type="spellEnd"/>
-      <w:r>
-        <w:t xml:space="preserve"> I will incorporate a similar colour coded seat map and a clear step by step flow for the customer kiosk booking process.</w:t>
-      </w:r>
-    </w:p>
-    <w:p>
-      <w:pPr>
-        <w:tabs>
-          <w:tab w:val="num" w:pos="1440"/>
-        </w:tabs>
-      </w:pPr>
-      <w:r>
-        <w:rPr>
-          <w:b/>
-          <w:bCs/>
-        </w:rPr>
-        <w:t xml:space="preserve">Features Identified for </w:t>
-      </w:r>
-      <w:proofErr w:type="spellStart"/>
-      <w:r>
-        <w:rPr>
-          <w:b/>
-          <w:bCs/>
-        </w:rPr>
-        <w:t>Filmtopia</w:t>
-      </w:r>
-      <w:proofErr w:type="spellEnd"/>
-    </w:p>
-    <w:p>
-      <w:pPr>
-        <w:tabs>
-          <w:tab w:val="num" w:pos="1440"/>
-        </w:tabs>
-      </w:pPr>
-      <w:r>
-        <w:t xml:space="preserve">From researching Odeon's system I have identified the following additional features to incorporate into </w:t>
-      </w:r>
-      <w:proofErr w:type="spellStart"/>
-      <w:r>
-        <w:t>Filmtopia</w:t>
-      </w:r>
-      <w:proofErr w:type="spellEnd"/>
-      <w:r>
-        <w:t>:</w:t>
+        <w:t>Odeon's seat selection screen is particularly well designed and shows several features worth incorporating into Filmtopia. The screen displays a graphical layout of the entire auditorium with seats colour coded by type and price. Green seats represent Classic Saver at £14.99, cream seats represent Classic at £16.49 and orange seats represent Classic Popular at £17.99. Unavailable seats are shown with an X so it is immediately clear which seats cannot be booked. A seat key at the bottom explains the colour coding including wheelchair and companion seat options. The booking process is also clearly structured using a step by step tab navigation at the top showing Seats, Sign In, Tickets, Food, Summary and Payment. This staged approach guides the user through the process logically and reduces confusion. For Filmtopia I will incorporate a similar colour coded seat map and a clear step by step flow for the customer kiosk booking process.</w:t>
+      </w:r>
+    </w:p>
+    <w:p>
+      <w:pPr>
+        <w:tabs>
+          <w:tab w:val="num" w:pos="1440"/>
+        </w:tabs>
+      </w:pPr>
+      <w:r>
+        <w:rPr>
+          <w:b/>
+          <w:bCs/>
+        </w:rPr>
+        <w:t>Features Identified for Filmtopia</w:t>
+      </w:r>
+    </w:p>
+    <w:p>
+      <w:pPr>
+        <w:tabs>
+          <w:tab w:val="num" w:pos="1440"/>
+        </w:tabs>
+      </w:pPr>
+      <w:r>
+        <w:t>From researching Odeon's system I have identified the following additional features to incorporate into Filmtopia:</w:t>
       </w:r>
     </w:p>
     <w:p>
@@ -3519,6 +3193,9 @@
         <w:jc w:val="center"/>
       </w:pPr>
       <w:r>
+        <w:rPr>
+          <w:noProof/>
+        </w:rPr>
         <w:drawing>
           <wp:inline distT="0" distB="0" distL="0" distR="0" wp14:anchorId="7DE54260" wp14:editId="5F3058BB">
             <wp:extent cx="6066867" cy="4791075"/>
@@ -3535,7 +3212,7 @@
                     <pic:cNvPicPr/>
                   </pic:nvPicPr>
                   <pic:blipFill rotWithShape="1">
-                    <a:blip r:embed="rId11"/>
+                    <a:blip r:embed="rId13"/>
                     <a:srcRect b="7067"/>
                     <a:stretch>
                       <a:fillRect/>
@@ -3630,15 +3307,7 @@
         <w:spacing w:after="80"/>
       </w:pPr>
       <w:r>
-        <w:t xml:space="preserve">The existing system at </w:t>
-      </w:r>
-      <w:proofErr w:type="spellStart"/>
-      <w:r>
-        <w:t>Filmtopia</w:t>
-      </w:r>
-      <w:proofErr w:type="spellEnd"/>
-      <w:r>
-        <w:t xml:space="preserve"> receives several types of input, all of which are entered manually by staff or the manager. When a customer arrives to book tickets a member of staff writes the customer's name, chosen film, screening time, number of tickets and preferred seats into a paper booking diary. There is no digital record of this at the point of entry meaning the accuracy of the data depends entirely on the staff member's handwriting and attention to detail.</w:t>
+        <w:t>The existing system at Filmtopia receives several types of input, all of which are entered manually by staff or the manager. When a customer arrives to book tickets a member of staff writes the customer's name, chosen film, screening time, number of tickets and preferred seats into a paper booking diary. There is no digital record of this at the point of entry meaning the accuracy of the data depends entirely on the staff member's handwriting and attention to detail.</w:t>
       </w:r>
     </w:p>
     <w:p>
@@ -3865,19 +3534,28 @@
           <w:lang w:val="en-US"/>
         </w:rPr>
       </w:pPr>
-      <w:proofErr w:type="spellStart"/>
       <w:r>
         <w:rPr>
           <w:lang w:val="en-US"/>
         </w:rPr>
-        <w:t>Filmtopia</w:t>
-      </w:r>
-      <w:proofErr w:type="spellEnd"/>
-      <w:r>
+        <w:t>Filmtopia is a small independent cinema that is currently managing all of its operations using a combination of paper records and disconnected spreadsheets. This approach may have been adequate when the cinema first opened but it has become increasingly problematic as the demands on the system have grown. The core problem is that the existing system is unreliable, slow and disconnected, and this is having a direct negative impact on both staff and customers.</w:t>
+      </w:r>
+    </w:p>
+    <w:p>
+      <w:pPr>
+        <w:tabs>
+          <w:tab w:val="num" w:pos="1440"/>
+        </w:tabs>
+        <w:spacing w:after="80"/>
         <w:rPr>
           <w:lang w:val="en-US"/>
         </w:rPr>
-        <w:t xml:space="preserve"> is a small independent cinema that is currently managing all of its operations using a combination of paper records and disconnected spreadsheets. This approach may have been adequate when the cinema first opened but it has become increasingly problematic as the demands on the system have grown. The core problem is that the existing system is unreliable, slow and disconnected, and this is having a direct negative impact on both staff and customers.</w:t>
+      </w:pPr>
+      <w:r>
+        <w:rPr>
+          <w:lang w:val="en-US"/>
+        </w:rPr>
+        <w:t>The most critical issue identified through the investigation is the risk of double bookings. Because seat allocations are recorded manually in a paper diary with no real time updating, two members of staff can independently assign the same seat to different customers for the same screening without either being aware of it. This was confirmed by both members of staff interviewed and by 65% of customers in the questionnaire who reported having experienced a problem when booking at Filmtopia. It was also directly observed during the site visit. This is not an occasional or minor issue but a fundamental flaw in how the existing system manages booking data. A relational database with referential integrity enforced between the relevant tables will directly address this by ensuring that once a seat is recorded as booked for a particular screening it cannot be booked again.</w:t>
       </w:r>
     </w:p>
     <w:p>
@@ -3894,52 +3572,7 @@
         <w:rPr>
           <w:lang w:val="en-US"/>
         </w:rPr>
-        <w:t xml:space="preserve">The most critical issue identified through the investigation is the risk of double bookings. Because seat allocations are recorded manually in a paper diary with no real time updating, two members of staff can independently assign the same seat to different customers for the same screening without either being aware of it. This was confirmed by both members of staff interviewed and by 65% of customers in the questionnaire who reported having experienced a problem when booking at </w:t>
-      </w:r>
-      <w:proofErr w:type="spellStart"/>
-      <w:r>
-        <w:rPr>
-          <w:lang w:val="en-US"/>
-        </w:rPr>
-        <w:t>Filmtopia</w:t>
-      </w:r>
-      <w:proofErr w:type="spellEnd"/>
-      <w:r>
-        <w:rPr>
-          <w:lang w:val="en-US"/>
-        </w:rPr>
-        <w:t>. It was also directly observed during the site visit. This is not an occasional or minor issue but a fundamental flaw in how the existing system manages booking data. A relational database with referential integrity enforced between the relevant tables will directly address this by ensuring that once a seat is recorded as booked for a particular screening it cannot be booked again.</w:t>
-      </w:r>
-    </w:p>
-    <w:p>
-      <w:pPr>
-        <w:tabs>
-          <w:tab w:val="num" w:pos="1440"/>
-        </w:tabs>
-        <w:spacing w:after="80"/>
-        <w:rPr>
-          <w:lang w:val="en-US"/>
-        </w:rPr>
-      </w:pPr>
-      <w:r>
-        <w:rPr>
-          <w:lang w:val="en-US"/>
-        </w:rPr>
-        <w:t xml:space="preserve">The second major problem is the disconnected nature of the existing system. Ticketing, food and drink ordering, stock management and staff scheduling are all handled through separate paper or spreadsheet based systems that do not communicate with each other in any way. This means the manager has no way of viewing a complete picture of the cinema's operations without manually compiling data from multiple sources which is both time consuming and prone to error. A </w:t>
-      </w:r>
-      <w:proofErr w:type="spellStart"/>
-      <w:r>
-        <w:rPr>
-          <w:lang w:val="en-US"/>
-        </w:rPr>
-        <w:t>centralised</w:t>
-      </w:r>
-      <w:proofErr w:type="spellEnd"/>
-      <w:r>
-        <w:rPr>
-          <w:lang w:val="en-US"/>
-        </w:rPr>
-        <w:t xml:space="preserve"> relational database will resolve this by storing all of the cinema's operational data in one place with clearly defined relationships between tables, making it possible to retrieve and cross reference data quickly and accurately.</w:t>
+        <w:t>The second major problem is the disconnected nature of the existing system. Ticketing, food and drink ordering, stock management and staff scheduling are all handled through separate paper or spreadsheet based systems that do not communicate with each other in any way. This means the manager has no way of viewing a complete picture of the cinema's operations without manually compiling data from multiple sources which is both time consuming and prone to error. A centralised relational database will resolve this by storing all of the cinema's operational data in one place with clearly defined relationships between tables, making it possible to retrieve and cross reference data quickly and accurately.</w:t>
       </w:r>
     </w:p>
     <w:p>
@@ -4016,21 +3649,24 @@
         <w:rPr>
           <w:lang w:val="en-US"/>
         </w:rPr>
-        <w:t xml:space="preserve">Functional requirements are the specific things the system must be able to do. For </w:t>
-      </w:r>
-      <w:proofErr w:type="spellStart"/>
-      <w:r>
+        <w:t>Functional requirements are the specific things the system must be able to do. For Filmtopia these include the ability to add and manage films and screenings, to display a graphical seat map showing which seats are available and which are already booked, to process customer bookings and link them to specific seats and screenings, to allow food and drink orders to be added to a booking and to generate sales reports for the manager. These requirements map directly to the objectives set out later in this investigation.</w:t>
+      </w:r>
+    </w:p>
+    <w:p>
+      <w:pPr>
+        <w:tabs>
+          <w:tab w:val="num" w:pos="1440"/>
+        </w:tabs>
+        <w:spacing w:after="80"/>
         <w:rPr>
           <w:lang w:val="en-US"/>
         </w:rPr>
-        <w:t>Filmtopia</w:t>
-      </w:r>
-      <w:proofErr w:type="spellEnd"/>
+      </w:pPr>
       <w:r>
         <w:rPr>
           <w:lang w:val="en-US"/>
         </w:rPr>
-        <w:t xml:space="preserve"> these include the ability to add and manage films and screenings, to display a graphical seat map showing which seats are available and which are already booked, to process customer bookings and link them to specific seats and screenings, to allow food and drink orders to be added to a booking and to generate sales reports for the manager. These requirements map directly to the objectives set out later in this investigation.</w:t>
+        <w:t>Non-functional requirements are the qualities the system must have rather than the specific things it must do. For Filmtopia the most important non-functional requirements are reliability, usability and data integrity. The system must be reliable enough to be used continuously during opening hours without crashing or producing errors. It must be usable by staff with varying levels of technical confidence without extensive training. And it must maintain data integrity at all times, meaning it should never be possible for the database to reach a state where bookings are duplicated, records are incomplete or data is inconsistent between tables.</w:t>
       </w:r>
     </w:p>
     <w:p>
@@ -4045,23 +3681,28 @@
       </w:pPr>
       <w:r>
         <w:rPr>
+          <w:b/>
+          <w:bCs/>
           <w:lang w:val="en-US"/>
         </w:rPr>
-        <w:t xml:space="preserve">Non-functional requirements are the qualities the system must have rather than the specific things it must do. For </w:t>
-      </w:r>
-      <w:proofErr w:type="spellStart"/>
-      <w:r>
+        <w:t>Proposed Solution</w:t>
+      </w:r>
+    </w:p>
+    <w:p>
+      <w:pPr>
+        <w:tabs>
+          <w:tab w:val="num" w:pos="1440"/>
+        </w:tabs>
+        <w:spacing w:after="80"/>
         <w:rPr>
           <w:lang w:val="en-US"/>
         </w:rPr>
-        <w:t>Filmtopia</w:t>
-      </w:r>
-      <w:proofErr w:type="spellEnd"/>
+      </w:pPr>
       <w:r>
         <w:rPr>
           <w:lang w:val="en-US"/>
         </w:rPr>
-        <w:t xml:space="preserve"> the most important non-functional requirements are reliability, usability and data integrity. The system must be reliable enough to be used continuously during opening hours without crashing or producing errors. It must be usable by staff with varying levels of technical confidence without extensive training. And it must maintain data integrity at all times, meaning it should never be possible for the database to reach a state where bookings are duplicated, records are incomplete or data is inconsistent between tables.</w:t>
+        <w:t>The proposed solution is a Visual Basic .NET Windows Forms application built in Visual Studio, using OleDb to manage the connection between the application and a Microsoft Access database stored in the Access 2002 to 2003 .mdb format. Visual Basic .NET has been chosen because it is the language used throughout this course and it allows the rapid development of graphical Windows applications with a professional user interface. OleDb has been chosen as the database connectivity method because it provides a straightforward and reliable way of connecting a Visual Basic .NET application to a Microsoft Access database, allowing SQL queries to be executed directly from the application code to insert, update, delete and retrieve records. Microsoft Access has been chosen as the database because it supports a full relational structure with primary keys, foreign keys and referential integrity which directly addresses the data management problems identified in the investigation.</w:t>
       </w:r>
     </w:p>
     <w:p>
@@ -4076,101 +3717,9 @@
       </w:pPr>
       <w:r>
         <w:rPr>
-          <w:b/>
-          <w:bCs/>
           <w:lang w:val="en-US"/>
         </w:rPr>
-        <w:t>Proposed Solution</w:t>
-      </w:r>
-    </w:p>
-    <w:p>
-      <w:pPr>
-        <w:tabs>
-          <w:tab w:val="num" w:pos="1440"/>
-        </w:tabs>
-        <w:spacing w:after="80"/>
-        <w:rPr>
-          <w:lang w:val="en-US"/>
-        </w:rPr>
-      </w:pPr>
-      <w:r>
-        <w:rPr>
-          <w:lang w:val="en-US"/>
-        </w:rPr>
-        <w:t xml:space="preserve">The proposed solution is a Visual Basic .NET Windows Forms application built in Visual Studio, using </w:t>
-      </w:r>
-      <w:proofErr w:type="spellStart"/>
-      <w:r>
-        <w:rPr>
-          <w:lang w:val="en-US"/>
-        </w:rPr>
-        <w:t>OleDb</w:t>
-      </w:r>
-      <w:proofErr w:type="spellEnd"/>
-      <w:r>
-        <w:rPr>
-          <w:lang w:val="en-US"/>
-        </w:rPr>
-        <w:t xml:space="preserve"> to manage the connection between the application and a Microsoft Access database stored in the Access 2002 to 2003 .</w:t>
-      </w:r>
-      <w:proofErr w:type="spellStart"/>
-      <w:r>
-        <w:rPr>
-          <w:lang w:val="en-US"/>
-        </w:rPr>
-        <w:t>mdb</w:t>
-      </w:r>
-      <w:proofErr w:type="spellEnd"/>
-      <w:r>
-        <w:rPr>
-          <w:lang w:val="en-US"/>
-        </w:rPr>
-        <w:t xml:space="preserve"> format. Visual Basic .NET has been chosen because it is the language used throughout this course and it allows the rapid development of graphical Windows applications with a professional user interface. </w:t>
-      </w:r>
-      <w:proofErr w:type="spellStart"/>
-      <w:r>
-        <w:rPr>
-          <w:lang w:val="en-US"/>
-        </w:rPr>
-        <w:t>OleDb</w:t>
-      </w:r>
-      <w:proofErr w:type="spellEnd"/>
-      <w:r>
-        <w:rPr>
-          <w:lang w:val="en-US"/>
-        </w:rPr>
-        <w:t xml:space="preserve"> has been chosen as the database connectivity method because it provides a straightforward and reliable way of connecting a Visual Basic .NET application to a Microsoft Access database, allowing SQL queries to be executed directly from the application code to insert, update, delete and retrieve records. Microsoft Access has been chosen as the database because it supports a full relational structure with primary keys, foreign keys and referential integrity which directly addresses the data management problems identified in the investigation.</w:t>
-      </w:r>
-    </w:p>
-    <w:p>
-      <w:pPr>
-        <w:tabs>
-          <w:tab w:val="num" w:pos="1440"/>
-        </w:tabs>
-        <w:spacing w:after="80"/>
-        <w:rPr>
-          <w:lang w:val="en-US"/>
-        </w:rPr>
-      </w:pPr>
-      <w:r>
-        <w:rPr>
-          <w:lang w:val="en-US"/>
-        </w:rPr>
-        <w:t xml:space="preserve">The system will support three distinct user types each with their own interface and access level. Customers will access the system through a </w:t>
-      </w:r>
-      <w:proofErr w:type="spellStart"/>
-      <w:r>
-        <w:rPr>
-          <w:lang w:val="en-US"/>
-        </w:rPr>
-        <w:t>self service</w:t>
-      </w:r>
-      <w:proofErr w:type="spellEnd"/>
-      <w:r>
-        <w:rPr>
-          <w:lang w:val="en-US"/>
-        </w:rPr>
-        <w:t xml:space="preserve"> kiosk interface. Staff will be able to log in to manage bookings and screenings. The manager will have full access to all areas of the system including film management and sales reporting. Access levels will be enforced through the login system to ensure that users can only access the parts of the system that are relevant to their role.</w:t>
+        <w:t>The system will support three distinct user types each with their own interface and access level. Customers will access the system through a self service kiosk interface. Staff will be able to log in to manage bookings and screenings. The manager will have full access to all areas of the system including film management and sales reporting. Access levels will be enforced through the login system to ensure that users can only access the parts of the system that are relevant to their role.</w:t>
       </w:r>
     </w:p>
     <w:p>
@@ -4221,15 +3770,7 @@
       </w:pPr>
       <w:r>
         <w:lastRenderedPageBreak/>
-        <w:t xml:space="preserve">Whilst the proposed </w:t>
-      </w:r>
-      <w:proofErr w:type="spellStart"/>
-      <w:r>
-        <w:t>Filmtopia</w:t>
-      </w:r>
-      <w:proofErr w:type="spellEnd"/>
-      <w:r>
-        <w:t xml:space="preserve"> system will address the core problems identified in the investigation, there are several areas that will not be included in the solution due to constraints of time, scope and available hardware and software. These limitations are outlined below.</w:t>
+        <w:t>Whilst the proposed Filmtopia system will address the core problems identified in the investigation, there are several areas that will not be included in the solution due to constraints of time, scope and available hardware and software. These limitations are outlined below.</w:t>
       </w:r>
     </w:p>
     <w:p>
@@ -4269,23 +3810,7 @@
         </w:tabs>
       </w:pPr>
       <w:r>
-        <w:t xml:space="preserve">The system will not support multiple simultaneous users over a network. Whilst </w:t>
-      </w:r>
-      <w:proofErr w:type="spellStart"/>
-      <w:r>
-        <w:t>OleDb</w:t>
-      </w:r>
-      <w:proofErr w:type="spellEnd"/>
-      <w:r>
-        <w:t xml:space="preserve"> connections to a Microsoft Access database can technically support multiple users, developing a fully networked multi-user system with appropriate concurrency controls and conflict resolution is beyond the scope of this project. The system will be designed for use on a single machine or a small number of machines accessing the same .</w:t>
-      </w:r>
-      <w:proofErr w:type="spellStart"/>
-      <w:r>
-        <w:t>mdb</w:t>
-      </w:r>
-      <w:proofErr w:type="spellEnd"/>
-      <w:r>
-        <w:t xml:space="preserve"> database file locally.</w:t>
+        <w:t>The system will not support multiple simultaneous users over a network. Whilst OleDb connections to a Microsoft Access database can technically support multiple users, developing a fully networked multi-user system with appropriate concurrency controls and conflict resolution is beyond the scope of this project. The system will be designed for use on a single machine or a small number of machines accessing the same .mdb database file locally.</w:t>
       </w:r>
     </w:p>
     <w:p>
@@ -4538,15 +4063,7 @@
         </w:tabs>
       </w:pPr>
       <w:r>
-        <w:t xml:space="preserve">Success Criteria: The report should be generated using an SQL query through the </w:t>
-      </w:r>
-      <w:proofErr w:type="spellStart"/>
-      <w:r>
-        <w:t>OleDb</w:t>
-      </w:r>
-      <w:proofErr w:type="spellEnd"/>
-      <w:r>
-        <w:t xml:space="preserve"> connection and displayed on screen within 5 seconds of the date range being selected. The report should show </w:t>
+        <w:t xml:space="preserve">Success Criteria: The report should be generated using an SQL query through the OleDb connection and displayed on screen within 5 seconds of the date range being selected. The report should show </w:t>
       </w:r>
       <w:r>
         <w:lastRenderedPageBreak/>
@@ -4694,15 +4211,7 @@
         </w:tabs>
       </w:pPr>
       <w:r>
-        <w:t xml:space="preserve">Success Criteria: All forms should use the same colour scheme, font and button placement. Navigation buttons should appear in consistent positions across all forms. The system should look professional and be immediately recognisable as a </w:t>
-      </w:r>
-      <w:proofErr w:type="spellStart"/>
-      <w:r>
-        <w:t>Filmtopia</w:t>
-      </w:r>
-      <w:proofErr w:type="spellEnd"/>
-      <w:r>
-        <w:t xml:space="preserve"> branded application.</w:t>
+        <w:t>Success Criteria: All forms should use the same colour scheme, font and button placement. Navigation buttons should appear in consistent positions across all forms. The system should look professional and be immediately recognisable as a Filmtopia branded application.</w:t>
       </w:r>
     </w:p>
     <w:p>
@@ -4740,7 +4249,7 @@
     <w:p/>
     <w:p/>
     <w:sectPr>
-      <w:headerReference w:type="default" r:id="rId12"/>
+      <w:headerReference w:type="default" r:id="rId14"/>
       <w:pgSz w:w="11906" w:h="16838" w:code="9"/>
       <w:pgMar w:top="720" w:right="720" w:bottom="720" w:left="720" w:header="708" w:footer="708" w:gutter="0"/>
       <w:cols w:space="708"/>
@@ -4748,6 +4257,56 @@
     </w:sectPr>
   </w:body>
 </w:document>
+</file>
+
+<file path=word/endnotes.xml><?xml version="1.0" encoding="utf-8"?>
+<w:endnotes xmlns:wpc="http://schemas.microsoft.com/office/word/2010/wordprocessingCanvas" xmlns:cx="http://schemas.microsoft.com/office/drawing/2014/chartex" xmlns:cx1="http://schemas.microsoft.com/office/drawing/2015/9/8/chartex" xmlns:cx2="http://schemas.microsoft.com/office/drawing/2015/10/21/chartex" xmlns:cx3="http://schemas.microsoft.com/office/drawing/2016/5/9/chartex" xmlns:cx4="http://schemas.microsoft.com/office/drawing/2016/5/10/chartex" xmlns:cx5="http://schemas.microsoft.com/office/drawing/2016/5/11/chartex" xmlns:cx6="http://schemas.microsoft.com/office/drawing/2016/5/12/chartex" xmlns:cx7="http://schemas.microsoft.com/office/drawing/2016/5/13/chartex" xmlns:cx8="http://schemas.microsoft.com/office/drawing/2016/5/14/chartex" xmlns:mc="http://schemas.openxmlformats.org/markup-compatibility/2006" xmlns:aink="http://schemas.microsoft.com/office/drawing/2016/ink" xmlns:am3d="http://schemas.microsoft.com/office/drawing/2017/model3d" xmlns:o="urn:schemas-microsoft-com:office:office" xmlns:oel="http://schemas.microsoft.com/office/2019/extlst" xmlns:r="http://schemas.openxmlformats.org/officeDocument/2006/relationships" xmlns:m="http://schemas.openxmlformats.org/officeDocument/2006/math" xmlns:v="urn:schemas-microsoft-com:vml" xmlns:wp14="http://schemas.microsoft.com/office/word/2010/wordprocessingDrawing" xmlns:wp="http://schemas.openxmlformats.org/drawingml/2006/wordprocessingDrawing" xmlns:w10="urn:schemas-microsoft-com:office:word" xmlns:w="http://schemas.openxmlformats.org/wordprocessingml/2006/main" xmlns:w14="http://schemas.microsoft.com/office/word/2010/wordml" xmlns:w15="http://schemas.microsoft.com/office/word/2012/wordml" xmlns:w16cex="http://schemas.microsoft.com/office/word/2018/wordml/cex" xmlns:w16cid="http://schemas.microsoft.com/office/word/2016/wordml/cid" xmlns:w16="http://schemas.microsoft.com/office/word/2018/wordml" xmlns:w16du="http://schemas.microsoft.com/office/word/2023/wordml/word16du" xmlns:w16sdtdh="http://schemas.microsoft.com/office/word/2020/wordml/sdtdatahash" xmlns:w16sdtfl="http://schemas.microsoft.com/office/word/2024/wordml/sdtformatlock" xmlns:w16se="http://schemas.microsoft.com/office/word/2015/wordml/symex" xmlns:wpg="http://schemas.microsoft.com/office/word/2010/wordprocessingGroup" xmlns:wpi="http://schemas.microsoft.com/office/word/2010/wordprocessingInk" xmlns:wne="http://schemas.microsoft.com/office/word/2006/wordml" xmlns:wps="http://schemas.microsoft.com/office/word/2010/wordprocessingShape" mc:Ignorable="w14 w15 w16se w16cid w16 w16cex w16sdtdh w16sdtfl w16du wp14">
+  <w:endnote w:type="separator" w:id="-1">
+    <w:p>
+      <w:pPr>
+        <w:spacing w:after="0" w:line="240" w:lineRule="auto"/>
+      </w:pPr>
+      <w:r>
+        <w:separator/>
+      </w:r>
+    </w:p>
+  </w:endnote>
+  <w:endnote w:type="continuationSeparator" w:id="0">
+    <w:p>
+      <w:pPr>
+        <w:spacing w:after="0" w:line="240" w:lineRule="auto"/>
+      </w:pPr>
+      <w:r>
+        <w:continuationSeparator/>
+      </w:r>
+    </w:p>
+  </w:endnote>
+</w:endnotes>
+</file>
+
+<file path=word/footnotes.xml><?xml version="1.0" encoding="utf-8"?>
+<w:footnotes xmlns:wpc="http://schemas.microsoft.com/office/word/2010/wordprocessingCanvas" xmlns:cx="http://schemas.microsoft.com/office/drawing/2014/chartex" xmlns:cx1="http://schemas.microsoft.com/office/drawing/2015/9/8/chartex" xmlns:cx2="http://schemas.microsoft.com/office/drawing/2015/10/21/chartex" xmlns:cx3="http://schemas.microsoft.com/office/drawing/2016/5/9/chartex" xmlns:cx4="http://schemas.microsoft.com/office/drawing/2016/5/10/chartex" xmlns:cx5="http://schemas.microsoft.com/office/drawing/2016/5/11/chartex" xmlns:cx6="http://schemas.microsoft.com/office/drawing/2016/5/12/chartex" xmlns:cx7="http://schemas.microsoft.com/office/drawing/2016/5/13/chartex" xmlns:cx8="http://schemas.microsoft.com/office/drawing/2016/5/14/chartex" xmlns:mc="http://schemas.openxmlformats.org/markup-compatibility/2006" xmlns:aink="http://schemas.microsoft.com/office/drawing/2016/ink" xmlns:am3d="http://schemas.microsoft.com/office/drawing/2017/model3d" xmlns:o="urn:schemas-microsoft-com:office:office" xmlns:oel="http://schemas.microsoft.com/office/2019/extlst" xmlns:r="http://schemas.openxmlformats.org/officeDocument/2006/relationships" xmlns:m="http://schemas.openxmlformats.org/officeDocument/2006/math" xmlns:v="urn:schemas-microsoft-com:vml" xmlns:wp14="http://schemas.microsoft.com/office/word/2010/wordprocessingDrawing" xmlns:wp="http://schemas.openxmlformats.org/drawingml/2006/wordprocessingDrawing" xmlns:w10="urn:schemas-microsoft-com:office:word" xmlns:w="http://schemas.openxmlformats.org/wordprocessingml/2006/main" xmlns:w14="http://schemas.microsoft.com/office/word/2010/wordml" xmlns:w15="http://schemas.microsoft.com/office/word/2012/wordml" xmlns:w16cex="http://schemas.microsoft.com/office/word/2018/wordml/cex" xmlns:w16cid="http://schemas.microsoft.com/office/word/2016/wordml/cid" xmlns:w16="http://schemas.microsoft.com/office/word/2018/wordml" xmlns:w16du="http://schemas.microsoft.com/office/word/2023/wordml/word16du" xmlns:w16sdtdh="http://schemas.microsoft.com/office/word/2020/wordml/sdtdatahash" xmlns:w16sdtfl="http://schemas.microsoft.com/office/word/2024/wordml/sdtformatlock" xmlns:w16se="http://schemas.microsoft.com/office/word/2015/wordml/symex" xmlns:wpg="http://schemas.microsoft.com/office/word/2010/wordprocessingGroup" xmlns:wpi="http://schemas.microsoft.com/office/word/2010/wordprocessingInk" xmlns:wne="http://schemas.microsoft.com/office/word/2006/wordml" xmlns:wps="http://schemas.microsoft.com/office/word/2010/wordprocessingShape" mc:Ignorable="w14 w15 w16se w16cid w16 w16cex w16sdtdh w16sdtfl w16du wp14">
+  <w:footnote w:type="separator" w:id="-1">
+    <w:p>
+      <w:pPr>
+        <w:spacing w:after="0" w:line="240" w:lineRule="auto"/>
+      </w:pPr>
+      <w:r>
+        <w:separator/>
+      </w:r>
+    </w:p>
+  </w:footnote>
+  <w:footnote w:type="continuationSeparator" w:id="0">
+    <w:p>
+      <w:pPr>
+        <w:spacing w:after="0" w:line="240" w:lineRule="auto"/>
+      </w:pPr>
+      <w:r>
+        <w:continuationSeparator/>
+      </w:r>
+    </w:p>
+  </w:footnote>
+</w:footnotes>
 </file>
 
 <file path=word/header1.xml><?xml version="1.0" encoding="utf-8"?>
@@ -4764,7 +4323,6 @@
           <w:docPartUnique/>
         </w:docPartObj>
       </w:sdtPr>
-      <w:sdtEndPr/>
       <w:sdtContent>
         <w:r>
           <w:pict w14:anchorId="5CC8E183">
@@ -4792,7 +4350,7 @@
               </v:handles>
               <o:lock v:ext="edit" text="t" shapetype="t"/>
             </v:shapetype>
-            <v:shape id="PowerPlusWaterMarkObject379970" o:spid="_x0000_s1025" type="#_x0000_t136" style="position:absolute;margin-left:0;margin-top:0;width:489.45pt;height:146.8pt;rotation:315;z-index:-251656192;mso-position-horizontal:center;mso-position-horizontal-relative:margin;mso-position-vertical:center;mso-position-vertical-relative:margin" o:allowincell="f" fillcolor="#d8d8d8 [2732]" stroked="f">
+            <v:shape id="PowerPlusWaterMarkObject379970" o:spid="_x0000_s1025" type="#_x0000_t136" style="position:absolute;margin-left:0;margin-top:0;width:489.45pt;height:146.8pt;rotation:315;z-index:-251658240;mso-position-horizontal:center;mso-position-horizontal-relative:margin;mso-position-vertical:center;mso-position-vertical-relative:margin" o:allowincell="f" fillcolor="#d8d8d8 [2732]" stroked="f">
               <v:fill opacity=".5"/>
               <v:textpath style="font-family:&quot;calibri&quot;;font-size:1pt" string="FILMTOPIA"/>
               <w10:wrap anchorx="margin" anchory="margin"/>
@@ -4809,13 +4367,15 @@
           <w:docPartUnique/>
         </w:docPartObj>
       </w:sdtPr>
-      <w:sdtEndPr/>
       <w:sdtContent>
         <w:r>
+          <w:rPr>
+            <w:noProof/>
+          </w:rPr>
           <mc:AlternateContent>
             <mc:Choice Requires="wps">
               <w:drawing>
-                <wp:anchor distT="0" distB="0" distL="114300" distR="114300" simplePos="0" relativeHeight="251659264" behindDoc="0" locked="0" layoutInCell="0" allowOverlap="1" wp14:anchorId="74431925" wp14:editId="4D288EA9">
+                <wp:anchor distT="0" distB="0" distL="114300" distR="114300" simplePos="0" relativeHeight="251657216" behindDoc="0" locked="0" layoutInCell="0" allowOverlap="1" wp14:anchorId="74431925" wp14:editId="4D288EA9">
                   <wp:simplePos x="0" y="0"/>
                   <mc:AlternateContent>
                     <mc:Choice Requires="wp14">

</xml_diff>

<commit_message>
added introduciton to investigation.
</commit_message>
<xml_diff>
--- a/Investigation.docx
+++ b/Investigation.docx
@@ -2,7 +2,82 @@
 <file path=word/document.xml><?xml version="1.0" encoding="utf-8"?>
 <w:document xmlns:wpc="http://schemas.microsoft.com/office/word/2010/wordprocessingCanvas" xmlns:cx="http://schemas.microsoft.com/office/drawing/2014/chartex" xmlns:cx1="http://schemas.microsoft.com/office/drawing/2015/9/8/chartex" xmlns:cx2="http://schemas.microsoft.com/office/drawing/2015/10/21/chartex" xmlns:cx3="http://schemas.microsoft.com/office/drawing/2016/5/9/chartex" xmlns:cx4="http://schemas.microsoft.com/office/drawing/2016/5/10/chartex" xmlns:cx5="http://schemas.microsoft.com/office/drawing/2016/5/11/chartex" xmlns:cx6="http://schemas.microsoft.com/office/drawing/2016/5/12/chartex" xmlns:cx7="http://schemas.microsoft.com/office/drawing/2016/5/13/chartex" xmlns:cx8="http://schemas.microsoft.com/office/drawing/2016/5/14/chartex" xmlns:mc="http://schemas.openxmlformats.org/markup-compatibility/2006" xmlns:aink="http://schemas.microsoft.com/office/drawing/2016/ink" xmlns:am3d="http://schemas.microsoft.com/office/drawing/2017/model3d" xmlns:o="urn:schemas-microsoft-com:office:office" xmlns:oel="http://schemas.microsoft.com/office/2019/extlst" xmlns:r="http://schemas.openxmlformats.org/officeDocument/2006/relationships" xmlns:m="http://schemas.openxmlformats.org/officeDocument/2006/math" xmlns:v="urn:schemas-microsoft-com:vml" xmlns:wp14="http://schemas.microsoft.com/office/word/2010/wordprocessingDrawing" xmlns:wp="http://schemas.openxmlformats.org/drawingml/2006/wordprocessingDrawing" xmlns:w10="urn:schemas-microsoft-com:office:word" xmlns:w="http://schemas.openxmlformats.org/wordprocessingml/2006/main" xmlns:w14="http://schemas.microsoft.com/office/word/2010/wordml" xmlns:w15="http://schemas.microsoft.com/office/word/2012/wordml" xmlns:w16cex="http://schemas.microsoft.com/office/word/2018/wordml/cex" xmlns:w16cid="http://schemas.microsoft.com/office/word/2016/wordml/cid" xmlns:w16="http://schemas.microsoft.com/office/word/2018/wordml" xmlns:w16du="http://schemas.microsoft.com/office/word/2023/wordml/word16du" xmlns:w16sdtdh="http://schemas.microsoft.com/office/word/2020/wordml/sdtdatahash" xmlns:w16sdtfl="http://schemas.microsoft.com/office/word/2024/wordml/sdtformatlock" xmlns:w16se="http://schemas.microsoft.com/office/word/2015/wordml/symex" xmlns:wpg="http://schemas.microsoft.com/office/word/2010/wordprocessingGroup" xmlns:wpi="http://schemas.microsoft.com/office/word/2010/wordprocessingInk" xmlns:wne="http://schemas.microsoft.com/office/word/2006/wordml" xmlns:wps="http://schemas.microsoft.com/office/word/2010/wordprocessingShape" mc:Ignorable="w14 w15 w16se w16cid w16 w16cex w16sdtdh w16sdtfl w16du wp14">
   <w:body>
-    <w:p/>
+    <w:p>
+      <w:pPr>
+        <w:pStyle w:val="Heading1"/>
+        <w:rPr>
+          <w:b/>
+          <w:color w:val="000000" w:themeColor="text1"/>
+        </w:rPr>
+      </w:pPr>
+      <w:proofErr w:type="spellStart"/>
+      <w:r>
+        <w:rPr>
+          <w:b/>
+          <w:color w:val="000000" w:themeColor="text1"/>
+        </w:rPr>
+        <w:t>Filmtopia</w:t>
+      </w:r>
+      <w:proofErr w:type="spellEnd"/>
+      <w:r>
+        <w:rPr>
+          <w:b/>
+          <w:color w:val="000000" w:themeColor="text1"/>
+        </w:rPr>
+        <w:t xml:space="preserve"> Project Investigation</w:t>
+      </w:r>
+    </w:p>
+    <w:p>
+      <w:pPr>
+        <w:pStyle w:val="Heading2"/>
+        <w:rPr>
+          <w:b/>
+          <w:color w:val="000000" w:themeColor="text1"/>
+        </w:rPr>
+      </w:pPr>
+      <w:r>
+        <w:rPr>
+          <w:b/>
+          <w:color w:val="000000" w:themeColor="text1"/>
+        </w:rPr>
+        <w:t>Introduction</w:t>
+      </w:r>
+    </w:p>
+    <w:p>
+      <w:pPr>
+        <w:spacing w:line="276" w:lineRule="auto"/>
+      </w:pPr>
+      <w:proofErr w:type="spellStart"/>
+      <w:r>
+        <w:t>Filmtopia</w:t>
+      </w:r>
+      <w:proofErr w:type="spellEnd"/>
+      <w:r>
+        <w:t xml:space="preserve"> is a small independent cinema theatre who is currently managing all business data using spreadsheets and paper. They sell food drinks and tickets using a variety of means such as a touchscreen kiosk which can only handle food and drinks and a concessions area where employees handle the business. The management of </w:t>
+      </w:r>
+      <w:proofErr w:type="spellStart"/>
+      <w:r>
+        <w:t>Filmtopia</w:t>
+      </w:r>
+      <w:proofErr w:type="spellEnd"/>
+      <w:r>
+        <w:t xml:space="preserve"> has come to notice that they are falling back on managing and analysing the cinema, this means keeping track of sales records, screening analytics and a customer interest evaluation. I am now going to investigate further on how </w:t>
+      </w:r>
+      <w:proofErr w:type="spellStart"/>
+      <w:r>
+        <w:t>Filmtopia</w:t>
+      </w:r>
+      <w:proofErr w:type="spellEnd"/>
+      <w:r>
+        <w:t xml:space="preserve"> functions to get a better understanding of how I should move with this project.</w:t>
+      </w:r>
+    </w:p>
+    <w:p>
+      <w:pPr>
+        <w:pStyle w:val="Heading1mine"/>
+        <w:ind w:left="0"/>
+      </w:pPr>
+    </w:p>
     <w:sectPr>
       <w:headerReference w:type="even" r:id="rId7"/>
       <w:headerReference w:type="default" r:id="rId8"/>
@@ -125,7 +200,6 @@
         <w:docPartUnique/>
       </w:docPartObj>
     </w:sdtPr>
-    <w:sdtEndPr/>
     <w:sdtContent>
       <w:p>
         <w:pPr>
@@ -614,7 +688,6 @@
     <w:next w:val="Normal"/>
     <w:link w:val="Heading2Char"/>
     <w:uiPriority w:val="9"/>
-    <w:semiHidden/>
     <w:unhideWhenUsed/>
     <w:qFormat/>
     <w:rsid w:val="00D55B24"/>
@@ -832,7 +905,6 @@
     <w:basedOn w:val="DefaultParagraphFont"/>
     <w:link w:val="Heading2"/>
     <w:uiPriority w:val="9"/>
-    <w:semiHidden/>
     <w:rsid w:val="00D55B24"/>
     <w:rPr>
       <w:rFonts w:asciiTheme="majorHAnsi" w:eastAsiaTheme="majorEastAsia" w:hAnsiTheme="majorHAnsi" w:cstheme="majorBidi"/>
@@ -1163,6 +1235,35 @@
     <w:uiPriority w:val="99"/>
     <w:rsid w:val="00533093"/>
     <w:rPr>
+      <w:lang w:val="en-GB"/>
+    </w:rPr>
+  </w:style>
+  <w:style w:type="paragraph" w:customStyle="1" w:styleId="Heading1mine">
+    <w:name w:val="Heading 1 (mine)"/>
+    <w:basedOn w:val="Heading1"/>
+    <w:link w:val="Heading1mineChar"/>
+    <w:qFormat/>
+    <w:rsid w:val="00E9012A"/>
+    <w:pPr>
+      <w:spacing w:line="240" w:lineRule="auto"/>
+      <w:ind w:left="720"/>
+    </w:pPr>
+    <w:rPr>
+      <w:b/>
+      <w:color w:val="000000" w:themeColor="text1"/>
+    </w:rPr>
+  </w:style>
+  <w:style w:type="character" w:customStyle="1" w:styleId="Heading1mineChar">
+    <w:name w:val="Heading 1 (mine) Char"/>
+    <w:basedOn w:val="Heading1Char"/>
+    <w:link w:val="Heading1mine"/>
+    <w:rsid w:val="00E9012A"/>
+    <w:rPr>
+      <w:rFonts w:asciiTheme="majorHAnsi" w:eastAsiaTheme="majorEastAsia" w:hAnsiTheme="majorHAnsi" w:cstheme="majorBidi"/>
+      <w:b/>
+      <w:color w:val="000000" w:themeColor="text1"/>
+      <w:sz w:val="40"/>
+      <w:szCs w:val="40"/>
       <w:lang w:val="en-GB"/>
     </w:rPr>
   </w:style>

</xml_diff>

<commit_message>
added methodology for investating
</commit_message>
<xml_diff>
--- a/Investigation.docx
+++ b/Investigation.docx
@@ -1556,8 +1556,94 @@
     <w:p>
       <w:pPr>
         <w:pStyle w:val="Heading2"/>
+        <w:rPr>
+          <w:b/>
+          <w:bCs/>
+          <w:color w:val="000000" w:themeColor="text1"/>
+        </w:rPr>
       </w:pPr>
+      <w:r>
+        <w:rPr>
+          <w:b/>
+          <w:bCs/>
+          <w:color w:val="000000" w:themeColor="text1"/>
+        </w:rPr>
+        <w:t>Methodology for Investigating</w:t>
+      </w:r>
     </w:p>
+    <w:p>
+      <w:pPr>
+        <w:spacing w:line="276" w:lineRule="auto"/>
+      </w:pPr>
+      <w:r>
+        <w:t>Before carrying out the investigation it is important to think carefully about which methods to use to gather information. Different methods have different strengths and weaknesses and relying on just one would not give a complete enough picture of the existing system or what the new one needs to do. For this investigation the methods chosen were face-to-face interviews, a customer questionnaire, direct observation, an examination of the records and documents the cinema uses and desk based research.</w:t>
+      </w:r>
+    </w:p>
+    <w:p>
+      <w:pPr>
+        <w:spacing w:line="276" w:lineRule="auto"/>
+      </w:pPr>
+      <w:r>
+        <w:t xml:space="preserve">Starting with interviews, these were chosen as the main method for gathering requirements from the key stakeholders. The reason for this is that an interview allows open ended questions to be asked and the conversation can naturally go in directions that were not planned in advance. This is important because some of the most useful information gathered during an investigation comes from things that the person being interviewed mentions without being directly asked. A written survey would not allow for this kind of flexibility. The limitation of interviews however is that they are time consuming and the quality of what comes out of them depends heavily on how well the questions are prepared. To address this the questions were written in advance and kept open ended to avoid leading the person being interviewed towards a particular answer. Two interviews were conducted for this investigation, one with the cinema manager and one with a </w:t>
+      </w:r>
+      <w:r>
+        <w:lastRenderedPageBreak/>
+        <w:t>member of the box office staff, as these two stakeholders gave the most complete view of how the existing system operates day to day.</w:t>
+      </w:r>
+    </w:p>
+    <w:p>
+      <w:pPr>
+        <w:spacing w:line="276" w:lineRule="auto"/>
+      </w:pPr>
+      <w:r>
+        <w:t xml:space="preserve">Moving on to the customer questionnaire, this was chosen because it allowed a much larger group of stakeholders to contribute to the investigation than would have been possible through interviews alone. Interviewing every customer individually would not be realistic, so a questionnaire was the most practical way to gather their views. The key advantage of a questionnaire is that it produces quantitative data which is easier to summarise and use as justification for design decisions. For example knowing that a large majority of customers would prefer a </w:t>
+      </w:r>
+      <w:proofErr w:type="spellStart"/>
+      <w:r>
+        <w:t>self service</w:t>
+      </w:r>
+      <w:proofErr w:type="spellEnd"/>
+      <w:r>
+        <w:t xml:space="preserve"> kiosk is a much stronger argument for including that feature than one person mentioning it in an interview. The limitation of a questionnaire is that the questions are fixed which means there is no opportunity to follow up on responses or ask for more detail. To partially work around this some of the questions included a list of options rather than just a yes or no answer which produced more useful and specific data.</w:t>
+      </w:r>
+    </w:p>
+    <w:p>
+      <w:pPr>
+        <w:spacing w:line="276" w:lineRule="auto"/>
+      </w:pPr>
+      <w:r>
+        <w:t>Transitioning to direct observation, this was included because interviews and questionnaires rely on people describing the system from memory which is not always accurate. Watching the system being used in real time makes it possible to see problems that the people involved might not even be aware of because they have become used to working around them. The observation was carried out during a busy evening period deliberately, since the existing system's weaknesses are most likely to show up under pressure rather than during a quiet period. The main limitation of observation is the Hawthorne Effect, which is the tendency for people to change their behaviour when they know they are being watched. This was minimised by keeping the observation as low key as possible.</w:t>
+      </w:r>
+    </w:p>
+    <w:p>
+      <w:pPr>
+        <w:spacing w:line="276" w:lineRule="auto"/>
+      </w:pPr>
+      <w:r>
+        <w:t>I also examined the actual records and documents the cinema relies on, such as the paper booking diary and the spreadsheets used for stock and staff rotas. Looking at the real paperwork was worthwhile because it shows exactly what data is being captured at the moment rather than what people remember being captured, and it tends to reveal small but important details that nobody thinks to mention in an interview because they are so used to them.</w:t>
+      </w:r>
+    </w:p>
+    <w:p>
+      <w:pPr>
+        <w:spacing w:line="276" w:lineRule="auto"/>
+      </w:pPr>
+      <w:r>
+        <w:t xml:space="preserve">Finally, desk based research was used to look at how similar systems are designed in the real world. By researching the booking systems of established cinema chains it is possible to identify features and design patterns that set the standard for what customers already expect. This is useful because stakeholders do not always know what to ask for, particularly if they have not seen what is possible. The limitation of this method is that the systems being researched are built by large commercial teams with significant resources, </w:t>
+      </w:r>
+      <w:r>
+        <w:lastRenderedPageBreak/>
+        <w:t>so not everything observed will be feasible within the scope of this project. The research has therefore been used to inform and inspire the design rather than to copy it directly.</w:t>
+      </w:r>
+    </w:p>
+    <w:p>
+      <w:pPr>
+        <w:spacing w:line="276" w:lineRule="auto"/>
+      </w:pPr>
+      <w:r>
+        <w:t>The reason all of these methods were used together is that each one compensates for the weaknesses of the others. Interviews provide depth, the questionnaire provides breadth, observation and the documents provide real world evidence and desk based research provides industry context. Where the same issue or requirement appears across multiple methods it can be treated with much greater confidence than if it had only come from one source.</w:t>
+      </w:r>
+    </w:p>
+    <w:p/>
     <w:sectPr>
       <w:headerReference w:type="even" r:id="rId7"/>
       <w:headerReference w:type="default" r:id="rId8"/>

</xml_diff>

<commit_message>
trying to redo DFD
</commit_message>
<xml_diff>
--- a/Investigation.docx
+++ b/Investigation.docx
@@ -4504,13 +4504,89 @@
         <w:t>Data Flow Diagram</w:t>
       </w:r>
     </w:p>
+    <w:p>
+      <w:pPr>
+        <w:spacing w:line="276" w:lineRule="auto"/>
+      </w:pPr>
+      <w:r>
+        <w:t>The data flow diagram below shows how data currently moves through the existing system. It identifies the external entities involved, namely the customer, the staff member and the manager, the processes that act on the data, and the data stores where information ends up such as the paper booking diary and the stock and rota spreadsheets. The labelled arrows show the data that passes between them.</w:t>
+      </w:r>
+    </w:p>
+    <w:p>
+      <w:pPr>
+        <w:spacing w:before="120"/>
+        <w:jc w:val="center"/>
+      </w:pPr>
+      <w:r>
+        <w:rPr>
+          <w:noProof/>
+        </w:rPr>
+        <w:lastRenderedPageBreak/>
+        <w:drawing>
+          <wp:inline distT="0" distB="0" distL="0" distR="0" wp14:anchorId="694FBE44" wp14:editId="33432AEB">
+            <wp:extent cx="5524500" cy="4714875"/>
+            <wp:effectExtent l="0" t="0" r="0" b="0"/>
+            <wp:docPr id="1931937112" name="Picture 1931937112"/>
+            <wp:cNvGraphicFramePr>
+              <a:graphicFrameLocks xmlns:a="http://schemas.openxmlformats.org/drawingml/2006/main" noChangeAspect="1"/>
+            </wp:cNvGraphicFramePr>
+            <a:graphic xmlns:a="http://schemas.openxmlformats.org/drawingml/2006/main">
+              <a:graphicData uri="http://schemas.openxmlformats.org/drawingml/2006/picture">
+                <pic:pic xmlns:pic="http://schemas.openxmlformats.org/drawingml/2006/picture">
+                  <pic:nvPicPr>
+                    <pic:cNvPr id="0" name=""/>
+                    <pic:cNvPicPr>
+                      <a:picLocks noChangeAspect="1" noChangeArrowheads="1"/>
+                    </pic:cNvPicPr>
+                  </pic:nvPicPr>
+                  <pic:blipFill>
+                    <a:blip r:embed="rId14"/>
+                    <a:srcRect/>
+                    <a:stretch>
+                      <a:fillRect/>
+                    </a:stretch>
+                  </pic:blipFill>
+                  <pic:spPr bwMode="auto">
+                    <a:xfrm>
+                      <a:off x="0" y="0"/>
+                      <a:ext cx="5524500" cy="4714875"/>
+                    </a:xfrm>
+                    <a:prstGeom prst="rect">
+                      <a:avLst/>
+                    </a:prstGeom>
+                  </pic:spPr>
+                </pic:pic>
+              </a:graphicData>
+            </a:graphic>
+          </wp:inline>
+        </w:drawing>
+      </w:r>
+    </w:p>
+    <w:p>
+      <w:pPr>
+        <w:spacing w:after="200"/>
+        <w:jc w:val="center"/>
+        <w:rPr>
+          <w:color w:val="000000" w:themeColor="text1"/>
+        </w:rPr>
+      </w:pPr>
+      <w:r>
+        <w:rPr>
+          <w:color w:val="000000" w:themeColor="text1"/>
+          <w:sz w:val="20"/>
+          <w:szCs w:val="20"/>
+        </w:rPr>
+        <w:t>Figure 7: Data flow diagram of the existing system</w:t>
+      </w:r>
+    </w:p>
+    <w:p/>
     <w:sectPr>
-      <w:headerReference w:type="even" r:id="rId14"/>
-      <w:headerReference w:type="default" r:id="rId15"/>
-      <w:footerReference w:type="even" r:id="rId16"/>
-      <w:footerReference w:type="default" r:id="rId17"/>
-      <w:headerReference w:type="first" r:id="rId18"/>
-      <w:footerReference w:type="first" r:id="rId19"/>
+      <w:headerReference w:type="even" r:id="rId15"/>
+      <w:headerReference w:type="default" r:id="rId16"/>
+      <w:footerReference w:type="even" r:id="rId17"/>
+      <w:footerReference w:type="default" r:id="rId18"/>
+      <w:headerReference w:type="first" r:id="rId19"/>
+      <w:footerReference w:type="first" r:id="rId20"/>
       <w:pgSz w:w="12240" w:h="15840"/>
       <w:pgMar w:top="1440" w:right="1440" w:bottom="1440" w:left="1440" w:header="720" w:footer="720" w:gutter="0"/>
       <w:pgBorders w:offsetFrom="page">

</xml_diff>

<commit_message>
Overview of the existing system added
</commit_message>
<xml_diff>
--- a/Investigation.docx
+++ b/Investigation.docx
@@ -4579,6 +4579,235 @@
           <w:szCs w:val="20"/>
         </w:rPr>
         <w:t>Figure 7: Data flow diagram of the existing system</w:t>
+      </w:r>
+    </w:p>
+    <w:p/>
+    <w:p>
+      <w:pPr>
+        <w:pStyle w:val="Heading2"/>
+        <w:rPr>
+          <w:b/>
+          <w:bCs/>
+          <w:color w:val="000000" w:themeColor="text1"/>
+        </w:rPr>
+      </w:pPr>
+      <w:r>
+        <w:rPr>
+          <w:b/>
+          <w:bCs/>
+          <w:color w:val="000000" w:themeColor="text1"/>
+        </w:rPr>
+        <w:t>Overview of the Existing System</w:t>
+      </w:r>
+    </w:p>
+    <w:p>
+      <w:pPr>
+        <w:spacing w:line="276" w:lineRule="auto"/>
+      </w:pPr>
+      <w:r>
+        <w:t>Before designing and building a new system it is important to fully understand how the existing one works. This includes looking at what data goes into the system, what comes out of it, how that data is processed in between and where the system falls short. Without this understanding there is a risk of building something that solves the wrong problems or misses important requirements entirely.</w:t>
+      </w:r>
+    </w:p>
+    <w:p>
+      <w:pPr>
+        <w:pStyle w:val="Heading3"/>
+        <w:rPr>
+          <w:b/>
+          <w:bCs/>
+          <w:color w:val="000000" w:themeColor="text1"/>
+        </w:rPr>
+      </w:pPr>
+      <w:r>
+        <w:rPr>
+          <w:b/>
+          <w:bCs/>
+          <w:color w:val="000000" w:themeColor="text1"/>
+        </w:rPr>
+        <w:t>Inputs</w:t>
+      </w:r>
+    </w:p>
+    <w:p>
+      <w:pPr>
+        <w:spacing w:line="276" w:lineRule="auto"/>
+      </w:pPr>
+      <w:r>
+        <w:t xml:space="preserve">The existing system at </w:t>
+      </w:r>
+      <w:proofErr w:type="spellStart"/>
+      <w:r>
+        <w:t>Filmtopia</w:t>
+      </w:r>
+      <w:proofErr w:type="spellEnd"/>
+      <w:r>
+        <w:t xml:space="preserve"> receives several types of input, all of which are entered manually by staff or the manager. When a customer arrives to book tickets a member of staff writes the customer's name, chosen film, screening time, number of tickets and preferred seats into a paper booking diary. There is no digital record of this at the point of entry meaning the accuracy of the data depends entirely on the staff member's handwriting and attention to detail.</w:t>
+      </w:r>
+    </w:p>
+    <w:p>
+      <w:pPr>
+        <w:spacing w:line="276" w:lineRule="auto"/>
+      </w:pPr>
+      <w:r>
+        <w:t>When a customer purchases food or drinks at the concessions area their order is written on a notepad by a staff member and passed to the kitchen team. This is a completely separate process from the ticket booking and the two are never linked together in any way. If a customer wants to book tickets and order food at the same time they have to interact with two different systems and two different members of staff.</w:t>
+      </w:r>
+    </w:p>
+    <w:p>
+      <w:pPr>
+        <w:spacing w:line="276" w:lineRule="auto"/>
+      </w:pPr>
+      <w:r>
+        <w:t>When a new film is added to the schedule or a screening time changes the manager updates a paper schedule kept at the box office. There is no automated way of notifying staff of changes which means it is possible for staff to be working from outdated information without realising. Stock levels for food and drink are updated on a spreadsheet periodically by the manager, meaning the data is never truly up to date and relies on manual stock counts being carried out regularly.</w:t>
+      </w:r>
+    </w:p>
+    <w:p>
+      <w:pPr>
+        <w:pStyle w:val="Heading3"/>
+        <w:rPr>
+          <w:b/>
+          <w:bCs/>
+          <w:color w:val="000000" w:themeColor="text1"/>
+        </w:rPr>
+      </w:pPr>
+      <w:r>
+        <w:rPr>
+          <w:b/>
+          <w:bCs/>
+          <w:color w:val="000000" w:themeColor="text1"/>
+        </w:rPr>
+        <w:t>Processing</w:t>
+      </w:r>
+    </w:p>
+    <w:p>
+      <w:pPr>
+        <w:spacing w:line="276" w:lineRule="auto"/>
+      </w:pPr>
+      <w:r>
+        <w:t>The processing that takes place in the existing system is carried out entirely by hand rather than by any software. When a customer asks for a specific seat a staff member must physically look through the paper booking diary to check whether that seat has already been assigned for that screening. This process is slow and becomes increasingly unreliable during busy periods when multiple staff members are taking bookings at the same time. Because there is no central record that updates in real time two members of staff can independently assign the same seat to different customers without either being aware of it until the customers arrive.</w:t>
+      </w:r>
+    </w:p>
+    <w:p>
+      <w:pPr>
+        <w:spacing w:line="276" w:lineRule="auto"/>
+      </w:pPr>
+      <w:r>
+        <w:t>When a customer books tickets the total cost is calculated manually by the staff member based on the number of tickets and the price for that screening. There is no automated pricing system meaning human error in the calculation is possible. At the end of a trading period the manager must manually count through all entries in the booking diary and cross reference with till receipts to produce any kind of sales summary. This is a time consuming process that the manager has described as unreliable because it depends on the handwritten records being complete and legible.</w:t>
+      </w:r>
+    </w:p>
+    <w:p>
+      <w:pPr>
+        <w:pStyle w:val="Heading3"/>
+        <w:rPr>
+          <w:b/>
+          <w:bCs/>
+          <w:color w:val="000000" w:themeColor="text1"/>
+        </w:rPr>
+      </w:pPr>
+      <w:r>
+        <w:rPr>
+          <w:b/>
+          <w:bCs/>
+          <w:color w:val="000000" w:themeColor="text1"/>
+        </w:rPr>
+        <w:t>Outputs</w:t>
+      </w:r>
+    </w:p>
+    <w:p>
+      <w:pPr>
+        <w:spacing w:line="276" w:lineRule="auto"/>
+      </w:pPr>
+      <w:r>
+        <w:t>The outputs from the existing system are limited and almost entirely paper based. When a customer completes a ticket booking a staff member prints a ticket stub from a basic template on a computer and hands it to the customer. This ticket stub is not linked to any database and contains only the information that the staff member manually entered into the template at the time of printing.</w:t>
+      </w:r>
+    </w:p>
+    <w:p>
+      <w:pPr>
+        <w:spacing w:line="276" w:lineRule="auto"/>
+      </w:pPr>
+      <w:r>
+        <w:t>At the end of each week the manager produces a handwritten or basic spreadsheet summary of sales figures by counting through the booking diary. This is the only form of reporting available to the manager and it provides no breakdown by film, screening time or seat type. Staff rotas are produced by the manager in a spreadsheet and printed out for staff to view. There is no digital way for staff to check their rota without physically being at the cinema.</w:t>
+      </w:r>
+    </w:p>
+    <w:p>
+      <w:pPr>
+        <w:pStyle w:val="Heading3"/>
+        <w:rPr>
+          <w:b/>
+          <w:bCs/>
+          <w:color w:val="000000" w:themeColor="text1"/>
+        </w:rPr>
+      </w:pPr>
+      <w:r>
+        <w:rPr>
+          <w:b/>
+          <w:bCs/>
+          <w:color w:val="000000" w:themeColor="text1"/>
+        </w:rPr>
+        <w:t>Strengths of the Existing System</w:t>
+      </w:r>
+    </w:p>
+    <w:p>
+      <w:pPr>
+        <w:spacing w:line="276" w:lineRule="auto"/>
+      </w:pPr>
+      <w:r>
+        <w:t>It would be unfair to look only at what is wrong with the existing system without acknowledging that it does have some genuine strengths, and understanding these matters because the new system needs to hold on to them rather than lose them. The first strength is that it is extremely cheap to run. Paper diaries and spreadsheets cost almost nothing and there are no licensing fees or special hardware requirements beyond the computer the cinema already owns. The second strength is that the staff are completely familiar with it. Because there is nothing technical about writing in a diary, a new member of staff can be shown how it works in a couple of minutes and there is no real training overhead at all. The third strength is that it keeps working when technology does not. A paper system cannot crash, it does not depend on a database connection and it carries on functioning during a power cut or a computer fault.</w:t>
+      </w:r>
+    </w:p>
+    <w:p>
+      <w:pPr>
+        <w:spacing w:line="276" w:lineRule="auto"/>
+      </w:pPr>
+      <w:r>
+        <w:t>These are real advantages and they set a standard the proposed system has to meet rather than ignore. The new system needs to run on the existing hardware so it stays cheap, it needs to be easy enough to use that staff need almost no training, and it needs to be reliable enough that staff trust it as much as they currently trust the diary. This is part of the reason Objectives 14 and 15, which deal with a consistent professional interface and easy navigation, are included later in this investigation.</w:t>
+      </w:r>
+    </w:p>
+    <w:p>
+      <w:pPr>
+        <w:pStyle w:val="Heading3"/>
+        <w:rPr>
+          <w:b/>
+          <w:bCs/>
+          <w:color w:val="000000" w:themeColor="text1"/>
+        </w:rPr>
+      </w:pPr>
+      <w:r>
+        <w:rPr>
+          <w:b/>
+          <w:bCs/>
+          <w:color w:val="000000" w:themeColor="text1"/>
+        </w:rPr>
+        <w:t>Limitations</w:t>
+      </w:r>
+    </w:p>
+    <w:p>
+      <w:pPr>
+        <w:spacing w:line="276" w:lineRule="auto"/>
+      </w:pPr>
+      <w:r>
+        <w:t>The existing system has several significant limitations that have been clearly identified through the investigation. The most serious of these is the risk of double bookings. Because there is no centralised real time record of seat allocations the same seat can be assigned to two different customers for the same screening. This has happened on multiple occasions and has resulted in customers arriving to find their seat already occupied. Not only is this a poor experience for the customer but it reflects badly on the cinema and undermines trust in the booking process.</w:t>
+      </w:r>
+    </w:p>
+    <w:p>
+      <w:pPr>
+        <w:spacing w:line="276" w:lineRule="auto"/>
+      </w:pPr>
+      <w:r>
+        <w:t>Another significant limitation is the complete lack of meaningful reporting. The manager currently has no way of knowing how many tickets have been sold for a particular film, which screenings are most popular or what the cinema's total revenue is for a given period without manually processing a large amount of paper records. This makes it very difficult to make informed business decisions.</w:t>
+      </w:r>
+    </w:p>
+    <w:p>
+      <w:pPr>
+        <w:spacing w:line="276" w:lineRule="auto"/>
+      </w:pPr>
+      <w:r>
+        <w:t>The customer facing experience is also heavily limited by the current setup. The touchscreen kiosk that is already installed in the cinema can handle food and drink orders but cannot sell tickets. This forces customers to queue at both the kiosk and the box office which is inefficient and frustrating. Several customers raised this issue in the questionnaire and it was also clearly visible during the observation visit.</w:t>
+      </w:r>
+    </w:p>
+    <w:p>
+      <w:pPr>
+        <w:spacing w:line="276" w:lineRule="auto"/>
+      </w:pPr>
+      <w:r>
+        <w:t>Finally the data in the existing system is spread across multiple completely disconnected sources including the paper booking diary, a food and drink stock spreadsheet and a staff rota spreadsheet. None of these communicate with each other which makes it impossible to get a complete and accurate picture of the cinema's operations in one place. This disconnection is at the root of many of the other problems identified in the investigation.</w:t>
       </w:r>
     </w:p>
     <w:p/>

</xml_diff>

<commit_message>
added limitations of proposed solution
</commit_message>
<xml_diff>
--- a/Investigation.docx
+++ b/Investigation.docx
@@ -10,12 +10,21 @@
           <w:color w:val="000000" w:themeColor="text1"/>
         </w:rPr>
       </w:pPr>
-      <w:r>
-        <w:rPr>
-          <w:b/>
-          <w:color w:val="000000" w:themeColor="text1"/>
-        </w:rPr>
-        <w:t>Filmtopia Project Investigation</w:t>
+      <w:proofErr w:type="spellStart"/>
+      <w:r>
+        <w:rPr>
+          <w:b/>
+          <w:color w:val="000000" w:themeColor="text1"/>
+        </w:rPr>
+        <w:t>Filmtopia</w:t>
+      </w:r>
+      <w:proofErr w:type="spellEnd"/>
+      <w:r>
+        <w:rPr>
+          <w:b/>
+          <w:color w:val="000000" w:themeColor="text1"/>
+        </w:rPr>
+        <w:t xml:space="preserve"> Project Investigation</w:t>
       </w:r>
     </w:p>
     <w:p>
@@ -38,8 +47,29 @@
       <w:pPr>
         <w:spacing w:line="276" w:lineRule="auto"/>
       </w:pPr>
-      <w:r>
-        <w:t>Filmtopia is a small independent cinema theatre who is currently managing all business data using spreadsheets and paper. They sell food drinks and tickets using a variety of means such as a touchscreen kiosk which can only handle food and drinks and a concessions area where employees handle the business. The management of Filmtopia has come to notice that they are falling back on managing and analysing the cinema, this means keeping track of sales records, screening analytics and a customer interest evaluation. I am now going to investigate further on how Filmtopia functions to get a better understanding of how I should move with this project.</w:t>
+      <w:proofErr w:type="spellStart"/>
+      <w:r>
+        <w:t>Filmtopia</w:t>
+      </w:r>
+      <w:proofErr w:type="spellEnd"/>
+      <w:r>
+        <w:t xml:space="preserve"> is a small independent cinema theatre who is currently managing all business data using spreadsheets and paper. They sell food drinks and tickets using a variety of means such as a touchscreen kiosk which can only handle food and drinks and a concessions area where employees handle the business. The management of </w:t>
+      </w:r>
+      <w:proofErr w:type="spellStart"/>
+      <w:r>
+        <w:t>Filmtopia</w:t>
+      </w:r>
+      <w:proofErr w:type="spellEnd"/>
+      <w:r>
+        <w:t xml:space="preserve"> has come to notice that they are falling back on managing and analysing the cinema, this means keeping track of sales records, screening analytics and a customer interest evaluation. I am now going to investigate further on how </w:t>
+      </w:r>
+      <w:proofErr w:type="spellStart"/>
+      <w:r>
+        <w:t>Filmtopia</w:t>
+      </w:r>
+      <w:proofErr w:type="spellEnd"/>
+      <w:r>
+        <w:t xml:space="preserve"> functions to get a better understanding of how I should move with this project.</w:t>
       </w:r>
       <w:r>
         <w:tab/>
@@ -76,7 +106,15 @@
         <w:spacing w:line="276" w:lineRule="auto"/>
       </w:pPr>
       <w:r>
-        <w:t>For the Filmtopia system the stakeholders can be split into two groups, primary and secondary. Primary stakeholders are those who will interact with the system directly on a regular basis. Secondary stakeholders are those who are affected by the system indirectly or whose work is influenced by it without them necessarily using it themselves.</w:t>
+        <w:t xml:space="preserve">For the </w:t>
+      </w:r>
+      <w:proofErr w:type="spellStart"/>
+      <w:r>
+        <w:t>Filmtopia</w:t>
+      </w:r>
+      <w:proofErr w:type="spellEnd"/>
+      <w:r>
+        <w:t xml:space="preserve"> system the stakeholders can be split into two groups, primary and secondary. Primary stakeholders are those who will interact with the system directly on a regular basis. Secondary stakeholders are those who are affected by the system indirectly or whose work is influenced by it without them necessarily using it themselves.</w:t>
       </w:r>
     </w:p>
     <w:p>
@@ -100,7 +138,31 @@
         <w:spacing w:line="276" w:lineRule="auto"/>
       </w:pPr>
       <w:r>
-        <w:t>The third primary stakeholder is the customer base of Filmtopia. Customers interact with the system either directly through the proposed self service kiosk or indirectly when staff process their bookings on their behalf. Their main interests are convenience, short queue times and the assurance that the seat they have been allocated will actually be available when they arrive. The questionnaire results discussed later in this investigation show that a large majority of customers would prefer self service ticketing and that seat selection is considered important by most respondents. This means the bar for the kiosk interface is high and it needs to be clean and simple enough for any customer to use without assistance.</w:t>
+        <w:t xml:space="preserve">The third primary stakeholder is the customer base of </w:t>
+      </w:r>
+      <w:proofErr w:type="spellStart"/>
+      <w:r>
+        <w:t>Filmtopia</w:t>
+      </w:r>
+      <w:proofErr w:type="spellEnd"/>
+      <w:r>
+        <w:t xml:space="preserve">. Customers interact with the system either directly through the proposed </w:t>
+      </w:r>
+      <w:proofErr w:type="spellStart"/>
+      <w:r>
+        <w:t>self service</w:t>
+      </w:r>
+      <w:proofErr w:type="spellEnd"/>
+      <w:r>
+        <w:t xml:space="preserve"> kiosk or indirectly when staff process their bookings on their behalf. Their main interests are convenience, short queue times and the assurance that the seat they have been allocated will actually be available when they arrive. The questionnaire results discussed later in this investigation show that a large majority of customers would prefer </w:t>
+      </w:r>
+      <w:proofErr w:type="spellStart"/>
+      <w:r>
+        <w:t>self service</w:t>
+      </w:r>
+      <w:proofErr w:type="spellEnd"/>
+      <w:r>
+        <w:t xml:space="preserve"> ticketing and that seat selection is considered important by most respondents. This means the bar for the kiosk interface is high and it needs to be clean and simple enough for any customer to use without assistance.</w:t>
       </w:r>
     </w:p>
     <w:p>
@@ -116,12 +178,28 @@
         <w:spacing w:line="276" w:lineRule="auto"/>
       </w:pPr>
       <w:r>
-        <w:t>Another secondary stakeholder is any external IT support that Filmtopia uses. As a small independent cinema there is no dedicated IT department meaning the system must be robust and straightforward to maintain. Complex setups that require specialist knowledge to troubleshoot would be impractical for a business of this size.</w:t>
-      </w:r>
-    </w:p>
-    <w:p>
-      <w:r>
-        <w:t>In summary the stakeholder analysis makes clear that the Filmtopia system needs to serve a wide range of users with different levels of technical confidence and different priorities. The investigation that follows has been designed to gather requirements from as many of these stakeholders as possible to ensure the final system genuinely reflects the needs of everyone who will be affected by it.</w:t>
+        <w:t xml:space="preserve">Another secondary stakeholder is any external IT support that </w:t>
+      </w:r>
+      <w:proofErr w:type="spellStart"/>
+      <w:r>
+        <w:t>Filmtopia</w:t>
+      </w:r>
+      <w:proofErr w:type="spellEnd"/>
+      <w:r>
+        <w:t xml:space="preserve"> uses. As a small independent cinema there is no dedicated IT department meaning the system must be robust and straightforward to maintain. Complex setups that require specialist knowledge to troubleshoot would be impractical for a business of this size.</w:t>
+      </w:r>
+    </w:p>
+    <w:p>
+      <w:r>
+        <w:t xml:space="preserve">In summary the stakeholder analysis makes clear that the </w:t>
+      </w:r>
+      <w:proofErr w:type="spellStart"/>
+      <w:r>
+        <w:t>Filmtopia</w:t>
+      </w:r>
+      <w:proofErr w:type="spellEnd"/>
+      <w:r>
+        <w:t xml:space="preserve"> system needs to serve a wide range of users with different levels of technical confidence and different priorities. The investigation that follows has been designed to gather requirements from as many of these stakeholders as possible to ensure the final system genuinely reflects the needs of everyone who will be affected by it.</w:t>
       </w:r>
     </w:p>
     <w:p>
@@ -672,14 +750,52 @@
                 <w:lang w:val="fr-FR"/>
               </w:rPr>
             </w:pPr>
+            <w:proofErr w:type="spellStart"/>
             <w:r>
               <w:rPr>
                 <w:sz w:val="20"/>
                 <w:szCs w:val="20"/>
                 <w:lang w:val="fr-FR"/>
               </w:rPr>
-              <w:t>Summarise and interpret questionnaire responses</w:t>
-            </w:r>
+              <w:t>Summarise</w:t>
+            </w:r>
+            <w:proofErr w:type="spellEnd"/>
+            <w:r>
+              <w:rPr>
+                <w:sz w:val="20"/>
+                <w:szCs w:val="20"/>
+                <w:lang w:val="fr-FR"/>
+              </w:rPr>
+              <w:t xml:space="preserve"> and </w:t>
+            </w:r>
+            <w:proofErr w:type="spellStart"/>
+            <w:r>
+              <w:rPr>
+                <w:sz w:val="20"/>
+                <w:szCs w:val="20"/>
+                <w:lang w:val="fr-FR"/>
+              </w:rPr>
+              <w:t>interpret</w:t>
+            </w:r>
+            <w:proofErr w:type="spellEnd"/>
+            <w:r>
+              <w:rPr>
+                <w:sz w:val="20"/>
+                <w:szCs w:val="20"/>
+                <w:lang w:val="fr-FR"/>
+              </w:rPr>
+              <w:t xml:space="preserve"> questionnaire </w:t>
+            </w:r>
+            <w:proofErr w:type="spellStart"/>
+            <w:r>
+              <w:rPr>
+                <w:sz w:val="20"/>
+                <w:szCs w:val="20"/>
+                <w:lang w:val="fr-FR"/>
+              </w:rPr>
+              <w:t>responses</w:t>
+            </w:r>
+            <w:proofErr w:type="spellEnd"/>
           </w:p>
         </w:tc>
       </w:tr>
@@ -1462,7 +1578,15 @@
         <w:spacing w:line="276" w:lineRule="auto"/>
       </w:pPr>
       <w:r>
-        <w:t>Moving on to the customer questionnaire, this was chosen because it allowed a much larger group of stakeholders to contribute to the investigation than would have been possible through interviews alone. Interviewing every customer individually would not be realistic, so a questionnaire was the most practical way to gather their views. The key advantage of a questionnaire is that it produces quantitative data which is easier to summarise and use as justification for design decisions. For example knowing that a large majority of customers would prefer a self service kiosk is a much stronger argument for including that feature than one person mentioning it in an interview. The limitation of a questionnaire is that the questions are fixed which means there is no opportunity to follow up on responses or ask for more detail. To partially work around this some of the questions included a list of options rather than just a yes or no answer which produced more useful and specific data.</w:t>
+        <w:t xml:space="preserve">Moving on to the customer questionnaire, this was chosen because it allowed a much larger group of stakeholders to contribute to the investigation than would have been possible through interviews alone. Interviewing every customer individually would not be realistic, so a questionnaire was the most practical way to gather their views. The key advantage of a questionnaire is that it produces quantitative data which is easier to summarise and use as justification for design decisions. For example knowing that a large majority of customers would prefer a </w:t>
+      </w:r>
+      <w:proofErr w:type="spellStart"/>
+      <w:r>
+        <w:t>self service</w:t>
+      </w:r>
+      <w:proofErr w:type="spellEnd"/>
+      <w:r>
+        <w:t xml:space="preserve"> kiosk is a much stronger argument for including that feature than one person mentioning it in an interview. The limitation of a questionnaire is that the questions are fixed which means there is no opportunity to follow up on responses or ask for more detail. To partially work around this some of the questions included a list of options rather than just a yes or no answer which produced more useful and specific data.</w:t>
       </w:r>
     </w:p>
     <w:p>
@@ -1561,7 +1685,23 @@
           <w:b/>
           <w:bCs/>
         </w:rPr>
-        <w:t>Q: Can you describe how Filmtopia currently manages its ticketing and bookings?</w:t>
+        <w:t xml:space="preserve">Q: Can you describe how </w:t>
+      </w:r>
+      <w:proofErr w:type="spellStart"/>
+      <w:r>
+        <w:rPr>
+          <w:b/>
+          <w:bCs/>
+        </w:rPr>
+        <w:t>Filmtopia</w:t>
+      </w:r>
+      <w:proofErr w:type="spellEnd"/>
+      <w:r>
+        <w:rPr>
+          <w:b/>
+          <w:bCs/>
+        </w:rPr>
+        <w:t xml:space="preserve"> currently manages its ticketing and bookings?</w:t>
       </w:r>
     </w:p>
     <w:p>
@@ -1601,7 +1741,23 @@
           <w:b/>
           <w:bCs/>
         </w:rPr>
-        <w:t>Q: What data does Filmtopia currently store and how?</w:t>
+        <w:t xml:space="preserve">Q: What data does </w:t>
+      </w:r>
+      <w:proofErr w:type="spellStart"/>
+      <w:r>
+        <w:rPr>
+          <w:b/>
+          <w:bCs/>
+        </w:rPr>
+        <w:t>Filmtopia</w:t>
+      </w:r>
+      <w:proofErr w:type="spellEnd"/>
+      <w:r>
+        <w:rPr>
+          <w:b/>
+          <w:bCs/>
+        </w:rPr>
+        <w:t xml:space="preserve"> currently store and how?</w:t>
       </w:r>
     </w:p>
     <w:p>
@@ -1814,7 +1970,15 @@
         <w:spacing w:line="276" w:lineRule="auto"/>
       </w:pPr>
       <w:r>
-        <w:t>A questionnaire was distributed to customers visiting Filmtopia in order to gather feedback on their experience with the current system and to understand what they would want from a new one. It was administered on the 15th of January 2026 as a paper questionnaire handed to customers at the cinema, and 20 responses were collected. The questions and summarised responses are as follows.</w:t>
+        <w:t xml:space="preserve">A questionnaire was distributed to customers visiting </w:t>
+      </w:r>
+      <w:proofErr w:type="spellStart"/>
+      <w:r>
+        <w:t>Filmtopia</w:t>
+      </w:r>
+      <w:proofErr w:type="spellEnd"/>
+      <w:r>
+        <w:t xml:space="preserve"> in order to gather feedback on their experience with the current system and to understand what they would want from a new one. It was administered on the 15th of January 2026 as a paper questionnaire handed to customers at the cinema, and 20 responses were collected. The questions and summarised responses are as follows.</w:t>
       </w:r>
     </w:p>
     <w:p>
@@ -1832,7 +1996,25 @@
           <w:bCs/>
           <w:color w:val="000000" w:themeColor="text1"/>
         </w:rPr>
-        <w:t>Q1: How do you currently purchase your tickets at Filmtopia?</w:t>
+        <w:t xml:space="preserve">Q1: How do you currently purchase your tickets at </w:t>
+      </w:r>
+      <w:proofErr w:type="spellStart"/>
+      <w:r>
+        <w:rPr>
+          <w:b/>
+          <w:bCs/>
+          <w:color w:val="000000" w:themeColor="text1"/>
+        </w:rPr>
+        <w:t>Filmtopia</w:t>
+      </w:r>
+      <w:proofErr w:type="spellEnd"/>
+      <w:r>
+        <w:rPr>
+          <w:b/>
+          <w:bCs/>
+          <w:color w:val="000000" w:themeColor="text1"/>
+        </w:rPr>
+        <w:t>?</w:t>
       </w:r>
     </w:p>
     <w:tbl>
@@ -2054,7 +2236,25 @@
           <w:bCs/>
           <w:color w:val="000000" w:themeColor="text1"/>
         </w:rPr>
-        <w:t>Q2: Have you ever experienced a problem when booking tickets at Filmtopia?</w:t>
+        <w:t xml:space="preserve">Q2: Have you ever experienced a problem when booking tickets at </w:t>
+      </w:r>
+      <w:proofErr w:type="spellStart"/>
+      <w:r>
+        <w:rPr>
+          <w:b/>
+          <w:bCs/>
+          <w:color w:val="000000" w:themeColor="text1"/>
+        </w:rPr>
+        <w:t>Filmtopia</w:t>
+      </w:r>
+      <w:proofErr w:type="spellEnd"/>
+      <w:r>
+        <w:rPr>
+          <w:b/>
+          <w:bCs/>
+          <w:color w:val="000000" w:themeColor="text1"/>
+        </w:rPr>
+        <w:t>?</w:t>
       </w:r>
     </w:p>
     <w:tbl>
@@ -2966,7 +3166,15 @@
         <w:spacing w:line="276" w:lineRule="auto"/>
       </w:pPr>
       <w:r>
-        <w:t>85% of customers felt seat selection was at least quite important. This supports the planned graphical seat selection feature in the Filmtopia system.</w:t>
+        <w:t xml:space="preserve">85% of customers felt seat selection was at least quite important. This supports the planned graphical seat selection feature in the </w:t>
+      </w:r>
+      <w:proofErr w:type="spellStart"/>
+      <w:r>
+        <w:t>Filmtopia</w:t>
+      </w:r>
+      <w:proofErr w:type="spellEnd"/>
+      <w:r>
+        <w:t xml:space="preserve"> system.</w:t>
       </w:r>
     </w:p>
     <w:p>
@@ -3172,7 +3380,15 @@
         <w:spacing w:line="276" w:lineRule="auto"/>
       </w:pPr>
       <w:r>
-        <w:t>The questionnaire results clearly show that customers are experiencing real problems with the current system at Filmtopia. The most significant issues are long queues at the box office, errors with seat allocation and the inability to book tickets through the kiosk. The results also show strong demand for a self-service ticketing kiosk, graphical seat selection and combined food and drink ordering. These findings have directly informed the objectives set out later in this investigation.</w:t>
+        <w:t xml:space="preserve">The questionnaire results clearly show that customers are experiencing real problems with the current system at </w:t>
+      </w:r>
+      <w:proofErr w:type="spellStart"/>
+      <w:r>
+        <w:t>Filmtopia</w:t>
+      </w:r>
+      <w:proofErr w:type="spellEnd"/>
+      <w:r>
+        <w:t>. The most significant issues are long queues at the box office, errors with seat allocation and the inability to book tickets through the kiosk. The results also show strong demand for a self-service ticketing kiosk, graphical seat selection and combined food and drink ordering. These findings have directly informed the objectives set out later in this investigation.</w:t>
       </w:r>
     </w:p>
     <w:p>
@@ -3198,7 +3414,15 @@
         <w:spacing w:line="276" w:lineRule="auto"/>
       </w:pPr>
       <w:r>
-        <w:t>As part of the investigation I visited Filmtopia during an evening showing to observe how the current system operates in practice. Rather than asking questions or interrupting the workflow I simply watched how staff handled customers during the pre-screening period when the cinema was at its busiest. The aim was to see the existing system in action and to identify any problems that might not have come up during the interviews or questionnaire.</w:t>
+        <w:t xml:space="preserve">As part of the investigation I visited </w:t>
+      </w:r>
+      <w:proofErr w:type="spellStart"/>
+      <w:r>
+        <w:t>Filmtopia</w:t>
+      </w:r>
+      <w:proofErr w:type="spellEnd"/>
+      <w:r>
+        <w:t xml:space="preserve"> during an evening showing to observe how the current system operates in practice. Rather than asking questions or interrupting the workflow I simply watched how staff handled customers during the pre-screening period when the cinema was at its busiest. The aim was to see the existing system in action and to identify any problems that might not have come up during the interviews or questionnaire.</w:t>
       </w:r>
     </w:p>
     <w:p>
@@ -3557,7 +3781,15 @@
         <w:spacing w:line="276" w:lineRule="auto"/>
       </w:pPr>
       <w:r>
-        <w:t>The Vue homepage presents films visually using large poster images organised under a Top Films heading. Each film is displayed with its title clearly beneath it and the page includes a Quick Book bar at the bottom allowing users to search by venue, film, date and time simultaneously. This is a clean and intuitive way of presenting information that allows customers to find what they want quickly without having to navigate through multiple pages. For the Filmtopia system I will incorporate a similar visual approach to displaying films on the customer kiosk, ensuring that screenings are easy to browse and select.</w:t>
+        <w:t xml:space="preserve">The Vue homepage presents films visually using large poster images organised under a Top Films heading. Each film is displayed with its title clearly beneath it and the page includes a Quick Book bar at the bottom allowing users to search by venue, film, date and time simultaneously. This is a clean and intuitive way of presenting information that allows customers to find what they want quickly without having to navigate through multiple pages. For the </w:t>
+      </w:r>
+      <w:proofErr w:type="spellStart"/>
+      <w:r>
+        <w:t>Filmtopia</w:t>
+      </w:r>
+      <w:proofErr w:type="spellEnd"/>
+      <w:r>
+        <w:t xml:space="preserve"> system I will incorporate a similar visual approach to displaying films on the customer kiosk, ensuring that screenings are easy to browse and select.</w:t>
       </w:r>
     </w:p>
     <w:p>
@@ -3642,7 +3874,15 @@
         <w:spacing w:line="276" w:lineRule="auto"/>
       </w:pPr>
       <w:r>
-        <w:t>When a film is selected Vue displays all upcoming showings for that film at the chosen venue, organised by date and time. Each screening card shows the start and end time, the screen number and the ticket price. Accessibility information such as audio description and wheelchair access is also clearly displayed. This level of detail is something I aim to replicate in Filmtopia, where staff and customers should be able to see all relevant information about a screening at a glance without having to search through multiple menus.</w:t>
+        <w:t xml:space="preserve">When a film is selected Vue displays all upcoming showings for that film at the chosen venue, organised by date and time. Each screening card shows the start and end time, the screen number and the ticket price. Accessibility information such as audio description and wheelchair access is also clearly displayed. This level of detail is something I aim to replicate in </w:t>
+      </w:r>
+      <w:proofErr w:type="spellStart"/>
+      <w:r>
+        <w:t>Filmtopia</w:t>
+      </w:r>
+      <w:proofErr w:type="spellEnd"/>
+      <w:r>
+        <w:t>, where staff and customers should be able to see all relevant information about a screening at a glance without having to search through multiple menus.</w:t>
       </w:r>
     </w:p>
     <w:p>
@@ -3727,7 +3967,15 @@
         <w:spacing w:line="276" w:lineRule="auto"/>
       </w:pPr>
       <w:r>
-        <w:t>Vue's seat selection interface is a standout feature of their system. It displays a graphical layout of the screen showing every seat as a coloured icon, with different colours representing different seat types and prices. VIP seats are shown in orange at £8.49, Regular seats in black at £7.49, Saver seats in green at £6.49 and Super Saver seats in red at £4.99. Occupied seats are shown in grey so customers can immediately see what is available. Rows are labelled alphabetically on the left hand side. This graphical seat selection is a key feature I plan to implement in Filmtopia as it directly addresses the double booking problem identified in the interviews. By showing customers and staff exactly which seats are taken in real time the system eliminates the risk of two people being assigned the same seat.</w:t>
+        <w:t xml:space="preserve">Vue's seat selection interface is a standout feature of their system. It displays a graphical layout of the screen showing every seat as a coloured icon, with different colours representing different seat types and prices. VIP seats are shown in orange at £8.49, Regular seats in black at £7.49, Saver seats in green at £6.49 and Super Saver seats in red at £4.99. Occupied seats are shown in grey so customers can immediately see what is available. Rows are labelled alphabetically on the left hand side. This graphical seat selection is a key feature I plan to implement in </w:t>
+      </w:r>
+      <w:proofErr w:type="spellStart"/>
+      <w:r>
+        <w:t>Filmtopia</w:t>
+      </w:r>
+      <w:proofErr w:type="spellEnd"/>
+      <w:r>
+        <w:t xml:space="preserve"> as it directly addresses the double booking problem identified in the interviews. By showing customers and staff exactly which seats are taken in real time the system eliminates the risk of two people being assigned the same seat.</w:t>
       </w:r>
     </w:p>
     <w:p>
@@ -3739,8 +3987,17 @@
           <w:b/>
           <w:bCs/>
         </w:rPr>
-        <w:t>Features Identified for Filmtopia</w:t>
-      </w:r>
+        <w:t xml:space="preserve">Features Identified for </w:t>
+      </w:r>
+      <w:proofErr w:type="spellStart"/>
+      <w:r>
+        <w:rPr>
+          <w:b/>
+          <w:bCs/>
+        </w:rPr>
+        <w:t>Filmtopia</w:t>
+      </w:r>
+      <w:proofErr w:type="spellEnd"/>
     </w:p>
     <w:p>
       <w:pPr>
@@ -3835,7 +4092,15 @@
         <w:spacing w:line="276" w:lineRule="auto"/>
       </w:pPr>
       <w:r>
-        <w:t>The second system I researched was Odeon, which is the largest cinema chain in the UK. Odeon operates over 120 cinemas across the UK and Ireland and their online booking system offered several useful features to compare against Vue and to inform the design of Filmtopia.</w:t>
+        <w:t xml:space="preserve">The second system I researched was Odeon, which is the largest cinema chain in the UK. Odeon operates over 120 cinemas across the UK and Ireland and their online booking system offered several useful features to compare against Vue and to inform the design of </w:t>
+      </w:r>
+      <w:proofErr w:type="spellStart"/>
+      <w:r>
+        <w:t>Filmtopia</w:t>
+      </w:r>
+      <w:proofErr w:type="spellEnd"/>
+      <w:r>
+        <w:t>.</w:t>
       </w:r>
     </w:p>
     <w:p>
@@ -3920,7 +4185,15 @@
         <w:spacing w:line="276" w:lineRule="auto"/>
       </w:pPr>
       <w:r>
-        <w:t>Similar to Vue, Odeon presents films using large poster images organised under a Top Films heading. However Odeon includes additional information directly on the film page such as the director, cast, runtime, release date and genre tags. This richer level of detail gives customers more context before making a booking decision. Odeon also includes a quick search bar at the bottom of the page allowing users to filter by cinema, film, date and time. One notable difference from Vue is that Odeon uses a darker navy blue colour scheme throughout which creates a more premium feel. For Filmtopia I will aim to display key film information clearly on the customer kiosk so customers can make informed decisions quickly.</w:t>
+        <w:t xml:space="preserve">Similar to Vue, Odeon presents films using large poster images organised under a Top Films heading. However Odeon includes additional information directly on the film page such as the director, cast, runtime, release date and genre tags. This richer level of detail gives customers more context before making a booking decision. Odeon also includes a quick search bar at the bottom of the page allowing users to filter by cinema, film, date and time. One notable difference from Vue is that Odeon uses a darker navy blue colour scheme throughout which creates a more premium feel. For </w:t>
+      </w:r>
+      <w:proofErr w:type="spellStart"/>
+      <w:r>
+        <w:t>Filmtopia</w:t>
+      </w:r>
+      <w:proofErr w:type="spellEnd"/>
+      <w:r>
+        <w:t xml:space="preserve"> I will aim to display key film information clearly on the customer kiosk so customers can make informed decisions quickly.</w:t>
       </w:r>
     </w:p>
     <w:p>
@@ -4005,7 +4278,15 @@
         <w:spacing w:line="276" w:lineRule="auto"/>
       </w:pPr>
       <w:r>
-        <w:t>Odeon's screening times page clearly displays the film title, runtime, release date and genre alongside all available showtimes. Screenings are organised by date across the top of the page and grouped by cinema location below. Each screening card shows the start time, screen number and format such as 3D. A Book Now button is displayed prominently on each card making the next action immediately obvious. This clear layout is something I will replicate in Filmtopia where staff should be able to see all screenings for a given film at a glance.</w:t>
+        <w:t xml:space="preserve">Odeon's screening times page clearly displays the film title, runtime, release date and genre alongside all available showtimes. Screenings are organised by date across the top of the page and grouped by cinema location below. Each screening card shows the start time, screen number and format such as 3D. A Book Now button is displayed prominently on each card making the next action immediately obvious. This clear layout is something I will replicate in </w:t>
+      </w:r>
+      <w:proofErr w:type="spellStart"/>
+      <w:r>
+        <w:t>Filmtopia</w:t>
+      </w:r>
+      <w:proofErr w:type="spellEnd"/>
+      <w:r>
+        <w:t xml:space="preserve"> where staff should be able to see all screenings for a given film at a glance.</w:t>
       </w:r>
     </w:p>
     <w:p>
@@ -4090,7 +4371,23 @@
         <w:spacing w:line="276" w:lineRule="auto"/>
       </w:pPr>
       <w:r>
-        <w:t>Odeon's seat selection screen is particularly well designed and shows several features worth incorporating into Filmtopia. The screen displays a graphical layout of the entire auditorium with seats colour coded by type and price. Green seats represent Classic Saver at £14.99, cream seats represent Classic at £16.49 and orange seats represent Classic Popular at £17.99. Unavailable seats are shown with an X so it is immediately clear which seats cannot be booked. A seat key at the bottom explains the colour coding including wheelchair and companion seat options. The booking process is also clearly structured using a step by step tab navigation at the top showing Seats, Sign In, Tickets, Food, Summary and Payment. This staged approach guides the user through the process logically and reduces confusion. For Filmtopia I will incorporate a similar colour coded seat map and a clear step by step flow for the customer kiosk booking process.</w:t>
+        <w:t xml:space="preserve">Odeon's seat selection screen is particularly well designed and shows several features worth incorporating into </w:t>
+      </w:r>
+      <w:proofErr w:type="spellStart"/>
+      <w:r>
+        <w:t>Filmtopia</w:t>
+      </w:r>
+      <w:proofErr w:type="spellEnd"/>
+      <w:r>
+        <w:t xml:space="preserve">. The screen displays a graphical layout of the entire auditorium with seats colour coded by type and price. Green seats represent Classic Saver at £14.99, cream seats represent Classic at £16.49 and orange seats represent Classic Popular at £17.99. Unavailable seats are shown with an X so it is immediately clear which seats cannot be booked. A seat key at the bottom explains the colour coding including wheelchair and companion seat options. The booking process is also clearly structured using a step by step tab navigation at the top showing Seats, Sign In, Tickets, Food, Summary and Payment. This staged approach guides the user through the process logically and reduces confusion. For </w:t>
+      </w:r>
+      <w:proofErr w:type="spellStart"/>
+      <w:r>
+        <w:t>Filmtopia</w:t>
+      </w:r>
+      <w:proofErr w:type="spellEnd"/>
+      <w:r>
+        <w:t xml:space="preserve"> I will incorporate a similar colour coded seat map and a clear step by step flow for the customer kiosk booking process.</w:t>
       </w:r>
     </w:p>
     <w:p>
@@ -4102,8 +4399,17 @@
           <w:b/>
           <w:bCs/>
         </w:rPr>
-        <w:t>Features Identified for Filmtopia</w:t>
-      </w:r>
+        <w:t xml:space="preserve">Features Identified for </w:t>
+      </w:r>
+      <w:proofErr w:type="spellStart"/>
+      <w:r>
+        <w:rPr>
+          <w:b/>
+          <w:bCs/>
+        </w:rPr>
+        <w:t>Filmtopia</w:t>
+      </w:r>
+      <w:proofErr w:type="spellEnd"/>
     </w:p>
     <w:p>
       <w:pPr>
@@ -4325,7 +4631,15 @@
         <w:spacing w:line="276" w:lineRule="auto"/>
       </w:pPr>
       <w:r>
-        <w:t>The existing system at Filmtopia receives several types of input, all of which are entered manually by staff or the manager. When a customer arrives to book tickets a member of staff writes the customer's name, chosen film, screening time, number of tickets and preferred seats into a paper booking diary. There is no digital record of this at the point of entry meaning the accuracy of the data depends entirely on the staff member's handwriting and attention to detail.</w:t>
+        <w:t xml:space="preserve">The existing system at </w:t>
+      </w:r>
+      <w:proofErr w:type="spellStart"/>
+      <w:r>
+        <w:t>Filmtopia</w:t>
+      </w:r>
+      <w:proofErr w:type="spellEnd"/>
+      <w:r>
+        <w:t xml:space="preserve"> receives several types of input, all of which are entered manually by staff or the manager. When a customer arrives to book tickets a member of staff writes the customer's name, chosen film, screening time, number of tickets and preferred seats into a paper booking diary. There is no digital record of this at the point of entry meaning the accuracy of the data depends entirely on the staff member's handwriting and attention to detail.</w:t>
       </w:r>
     </w:p>
     <w:p>
@@ -4527,16 +4841,29 @@
       <w:pPr>
         <w:spacing w:line="276" w:lineRule="auto"/>
       </w:pPr>
-      <w:r>
-        <w:t>Filmtopia is a small independent cinema that is currently managing all of its operations using a combination of paper records and disconnected spreadsheets. This approach may have been adequate when the cinema first opened but it has become increasingly problematic as the demands on the system have grown. The core problem is that the existing system is unreliable, slow and disconnected, and this is having a direct negative impact on both staff and customers.</w:t>
-      </w:r>
-    </w:p>
-    <w:p>
-      <w:pPr>
-        <w:spacing w:line="276" w:lineRule="auto"/>
-      </w:pPr>
-      <w:r>
-        <w:t>The most critical issue identified through the investigation is the risk of double bookings. Because seat allocations are recorded manually in a paper diary with no real time updating, two members of staff can independently assign the same seat to different customers for the same screening without either being aware of it. This was confirmed by both members of staff interviewed and by 65% of customers in the questionnaire who reported having experienced a problem when booking at Filmtopia. It was also directly observed during the site visit. This is not an occasional or minor issue but a fundamental flaw in how the existing system manages booking data. A relational database with referential integrity enforced between the relevant tables will directly address this by ensuring that once a seat is recorded as booked for a particular screening it cannot be booked again. This is dealt with by Objective 2 in the next section and supported by Objective 3, which covers the graphical seat map that makes taken seats visible at a glance.</w:t>
+      <w:proofErr w:type="spellStart"/>
+      <w:r>
+        <w:t>Filmtopia</w:t>
+      </w:r>
+      <w:proofErr w:type="spellEnd"/>
+      <w:r>
+        <w:t xml:space="preserve"> is a small independent cinema that is currently managing all of its operations using a combination of paper records and disconnected spreadsheets. This approach may have been adequate when the cinema first opened but it has become increasingly problematic as the demands on the system have grown. The core problem is that the existing system is unreliable, slow and disconnected, and this is having a direct negative impact on both staff and customers.</w:t>
+      </w:r>
+    </w:p>
+    <w:p>
+      <w:pPr>
+        <w:spacing w:line="276" w:lineRule="auto"/>
+      </w:pPr>
+      <w:r>
+        <w:t xml:space="preserve">The most critical issue identified through the investigation is the risk of double bookings. Because seat allocations are recorded manually in a paper diary with no real time updating, two members of staff can independently assign the same seat to different customers for the same screening without either being aware of it. This was confirmed by both members of staff interviewed and by 65% of customers in the questionnaire who reported having experienced a problem when booking at </w:t>
+      </w:r>
+      <w:proofErr w:type="spellStart"/>
+      <w:r>
+        <w:t>Filmtopia</w:t>
+      </w:r>
+      <w:proofErr w:type="spellEnd"/>
+      <w:r>
+        <w:t>. It was also directly observed during the site visit. This is not an occasional or minor issue but a fundamental flaw in how the existing system manages booking data. A relational database with referential integrity enforced between the relevant tables will directly address this by ensuring that once a seat is recorded as booked for a particular screening it cannot be booked again. This is dealt with by Objective 2 in the next section and supported by Objective 3, which covers the graphical seat map that makes taken seats visible at a glance.</w:t>
       </w:r>
     </w:p>
     <w:p>
@@ -4552,7 +4879,15 @@
         <w:spacing w:line="276" w:lineRule="auto"/>
       </w:pPr>
       <w:r>
-        <w:t>The third significant problem is the poor customer facing experience. The kiosk currently installed in the cinema can only handle food and drink orders and cannot sell tickets, which forces customers to queue at both the kiosk and the box office. This was raised by multiple customers in the questionnaire and observed directly during the site visit. The proposed solution will address this by providing a customer kiosk interface through which customers can browse films, select a screening, choose their seats and add food and drink items to their order in a single joined up process. This is dealt with by Objective 4, which covers the self service kiosk, and Objective 5, which covers adding food and drink to a booking.</w:t>
+        <w:t xml:space="preserve">The third significant problem is the poor customer facing experience. The kiosk currently installed in the cinema can only handle food and drink orders and cannot sell tickets, which forces customers to queue at both the kiosk and the box office. This was raised by multiple customers in the questionnaire and observed directly during the site visit. The proposed solution will address this by providing a customer kiosk interface through which customers can browse films, select a screening, choose their seats and add food and drink items to their order in a single joined up process. This is dealt with by Objective 4, which covers the </w:t>
+      </w:r>
+      <w:proofErr w:type="spellStart"/>
+      <w:r>
+        <w:t>self service</w:t>
+      </w:r>
+      <w:proofErr w:type="spellEnd"/>
+      <w:r>
+        <w:t xml:space="preserve"> kiosk, and Objective 5, which covers adding food and drink to a booking.</w:t>
       </w:r>
     </w:p>
     <w:p>
@@ -4586,15 +4921,31 @@
         <w:spacing w:line="276" w:lineRule="auto"/>
       </w:pPr>
       <w:r>
-        <w:t>Functional requirements are the specific things the system must be able to do. For Filmtopia these include the ability to add and manage films and screenings (Objectives 6 and 7), to display a graphical seat map showing which seats are available and which are already booked (Objective 3), to process customer bookings and link them to specific seats and screenings (Objectives 1 and 2), to allow food and drink orders to be added to a booking (Objective 5) and to generate sales reports for the manager (Objective 8). These requirements map directly to the objectives set out later in this investigation.</w:t>
-      </w:r>
-    </w:p>
-    <w:p>
-      <w:pPr>
-        <w:spacing w:line="276" w:lineRule="auto"/>
-      </w:pPr>
-      <w:r>
-        <w:t>Non-functional requirements are the qualities the system must have rather than the specific things it must do. For Filmtopia the most important non-functional requirements are reliability, usability and data integrity. The system must be reliable enough to be used continuously during opening hours without crashing or producing errors. It must be usable by staff with varying levels of technical confidence without extensive training, which is reflected in Objectives 14 and 15. And it must maintain data integrity at all times, meaning it should never be possible for the database to reach a state where bookings are duplicated, records are incomplete or data is inconsistent between tables, which is reflected in Objectives 2 and 13.</w:t>
+        <w:t xml:space="preserve">Functional requirements are the specific things the system must be able to do. For </w:t>
+      </w:r>
+      <w:proofErr w:type="spellStart"/>
+      <w:r>
+        <w:t>Filmtopia</w:t>
+      </w:r>
+      <w:proofErr w:type="spellEnd"/>
+      <w:r>
+        <w:t xml:space="preserve"> these include the ability to add and manage films and screenings (Objectives 6 and 7), to display a graphical seat map showing which seats are available and which are already booked (Objective 3), to process customer bookings and link them to specific seats and screenings (Objectives 1 and 2), to allow food and drink orders to be added to a booking (Objective 5) and to generate sales reports for the manager (Objective 8). These requirements map directly to the objectives set out later in this investigation.</w:t>
+      </w:r>
+    </w:p>
+    <w:p>
+      <w:pPr>
+        <w:spacing w:line="276" w:lineRule="auto"/>
+      </w:pPr>
+      <w:r>
+        <w:t xml:space="preserve">Non-functional requirements are the qualities the system must have rather than the specific things it must do. For </w:t>
+      </w:r>
+      <w:proofErr w:type="spellStart"/>
+      <w:r>
+        <w:t>Filmtopia</w:t>
+      </w:r>
+      <w:proofErr w:type="spellEnd"/>
+      <w:r>
+        <w:t xml:space="preserve"> the most important non-functional requirements are reliability, usability and data integrity. The system must be reliable enough to be used continuously during opening hours without crashing or producing errors. It must be usable by staff with varying levels of technical confidence without extensive training, which is reflected in Objectives 14 and 15. And it must maintain data integrity at all times, meaning it should never be possible for the database to reach a state where bookings are duplicated, records are incomplete or data is inconsistent between tables, which is reflected in Objectives 2 and 13.</w:t>
       </w:r>
     </w:p>
     <w:p>
@@ -4620,26 +4971,157 @@
         <w:spacing w:line="276" w:lineRule="auto"/>
       </w:pPr>
       <w:r>
-        <w:t>The proposed solution is a Visual Basic .NET Windows Forms application built in Visual Studio, using OleDb to manage the connection between the application and a Microsoft Access database stored in the Access 2002 to 2003 .mdb format. Visual Basic .NET has been chosen because it is the language used throughout this course and it allows the rapid development of graphical Windows applications with a professional user interface. OleDb has been chosen as the database connectivity method because it provides a straightforward and reliable way of connecting a Visual Basic .NET application to a Microsoft Access database, allowing SQL queries to be executed directly from the application code to insert, update, delete and retrieve records. Microsoft Access has been chosen as the database because it supports a full relational structure with primary keys, foreign keys and referential integrity which directly addresses the data management problems identified in the investigation.</w:t>
-      </w:r>
-    </w:p>
-    <w:p>
-      <w:pPr>
-        <w:spacing w:line="276" w:lineRule="auto"/>
-      </w:pPr>
-      <w:r>
-        <w:t>The system will support three distinct user types each with their own interface and access level. Customers will access the system through a self service kiosk interface. Staff will be able to log in to manage bookings and screenings. The manager will have full access to all areas of the system including film management and sales reporting. Access levels will be enforced through the login system to ensure that users can only access the parts of the system that are relevant to their role, which is dealt with by Objective 10.</w:t>
+        <w:t xml:space="preserve">The proposed solution is a Visual Basic .NET Windows Forms application built in Visual Studio, using </w:t>
+      </w:r>
+      <w:proofErr w:type="spellStart"/>
+      <w:r>
+        <w:t>OleDb</w:t>
+      </w:r>
+      <w:proofErr w:type="spellEnd"/>
+      <w:r>
+        <w:t xml:space="preserve"> to manage the connection between the application and a Microsoft Access database stored in the Access 2002 to 2003 .</w:t>
+      </w:r>
+      <w:proofErr w:type="spellStart"/>
+      <w:r>
+        <w:t>mdb</w:t>
+      </w:r>
+      <w:proofErr w:type="spellEnd"/>
+      <w:r>
+        <w:t xml:space="preserve"> format. Visual Basic .NET has been chosen because it is the language used throughout this course and it allows the rapid development of graphical Windows applications with a professional user interface. </w:t>
+      </w:r>
+      <w:proofErr w:type="spellStart"/>
+      <w:r>
+        <w:t>OleDb</w:t>
+      </w:r>
+      <w:proofErr w:type="spellEnd"/>
+      <w:r>
+        <w:t xml:space="preserve"> has been chosen as the database connectivity method because it provides a straightforward and reliable way of connecting a Visual Basic .NET application to a Microsoft Access database, allowing SQL queries to be executed directly from the application code to insert, update, delete and retrieve records. Microsoft Access has been chosen as the database because it supports a full relational structure with primary keys, foreign keys and referential integrity which directly addresses the data management problems identified in the investigation.</w:t>
+      </w:r>
+    </w:p>
+    <w:p>
+      <w:pPr>
+        <w:spacing w:line="276" w:lineRule="auto"/>
+      </w:pPr>
+      <w:r>
+        <w:t xml:space="preserve">The system will support three distinct user types each with their own interface and access level. Customers will access the system through a </w:t>
+      </w:r>
+      <w:proofErr w:type="spellStart"/>
+      <w:r>
+        <w:t>self service</w:t>
+      </w:r>
+      <w:proofErr w:type="spellEnd"/>
+      <w:r>
+        <w:t xml:space="preserve"> kiosk interface. Staff will be able to log in to manage bookings and screenings. The manager will have full access to all areas of the system including film management and sales reporting. Access levels will be enforced through the login system to ensure that users can only access the parts of the system that are relevant to their role, which is dealt with by Objective 10.</w:t>
       </w:r>
     </w:p>
     <w:p/>
     <w:p>
       <w:pPr>
         <w:pStyle w:val="Heading2"/>
-      </w:pPr>
-      <w:r>
+        <w:rPr>
+          <w:b/>
+          <w:bCs/>
+          <w:color w:val="000000" w:themeColor="text1"/>
+        </w:rPr>
+      </w:pPr>
+      <w:r>
+        <w:rPr>
+          <w:b/>
+          <w:bCs/>
+          <w:color w:val="000000" w:themeColor="text1"/>
+        </w:rPr>
         <w:t>L</w:t>
       </w:r>
-    </w:p>
+      <w:r>
+        <w:rPr>
+          <w:b/>
+          <w:bCs/>
+          <w:color w:val="000000" w:themeColor="text1"/>
+        </w:rPr>
+        <w:t>imitations of Proposed Solution</w:t>
+      </w:r>
+    </w:p>
+    <w:p>
+      <w:pPr>
+        <w:spacing w:line="276" w:lineRule="auto"/>
+      </w:pPr>
+      <w:r>
+        <w:t xml:space="preserve">Whilst the proposed </w:t>
+      </w:r>
+      <w:proofErr w:type="spellStart"/>
+      <w:r>
+        <w:t>Filmtopia</w:t>
+      </w:r>
+      <w:proofErr w:type="spellEnd"/>
+      <w:r>
+        <w:t xml:space="preserve"> system will address the core problems identified in the investigation, there are several areas that will not be included in the solution due to constraints of time, scope and available hardware and software. These limitations are outlined below.</w:t>
+      </w:r>
+    </w:p>
+    <w:p>
+      <w:pPr>
+        <w:spacing w:line="276" w:lineRule="auto"/>
+      </w:pPr>
+      <w:r>
+        <w:t>The system will not include online booking functionality. Developing a web based booking system that allows customers to purchase tickets remotely would require a web server, a publicly accessible database and a payment processing integration, all of which are beyond the scope of an A Level project. The system will instead focus on in-cinema operations at the box office and customer kiosk.</w:t>
+      </w:r>
+    </w:p>
+    <w:p>
+      <w:pPr>
+        <w:spacing w:line="276" w:lineRule="auto"/>
+      </w:pPr>
+      <w:r>
+        <w:t>The system will not include a real payment processing system. Taking card or cash payments involves integration with chip and pin hardware and payment gateway APIs which are not available for this project. Payment will be simulated within the system and the process of actually collecting money from the customer will be assumed to happen separately.</w:t>
+      </w:r>
+    </w:p>
+    <w:p>
+      <w:pPr>
+        <w:spacing w:line="276" w:lineRule="auto"/>
+      </w:pPr>
+      <w:r>
+        <w:t>The system will not include a mobile application. Developing iOS or Android applications would require additional software, hardware and significant development time beyond what is available for this project.</w:t>
+      </w:r>
+    </w:p>
+    <w:p>
+      <w:pPr>
+        <w:spacing w:line="276" w:lineRule="auto"/>
+      </w:pPr>
+      <w:r>
+        <w:t xml:space="preserve">The system will not support multiple simultaneous users over a network. Whilst </w:t>
+      </w:r>
+      <w:proofErr w:type="spellStart"/>
+      <w:r>
+        <w:t>OleDb</w:t>
+      </w:r>
+      <w:proofErr w:type="spellEnd"/>
+      <w:r>
+        <w:t xml:space="preserve"> connections to a Microsoft Access database can technically support multiple users, developing a fully networked multi-user system with appropriate concurrency controls and conflict resolution is beyond the scope of this project. The system will be designed for use on a single machine or a small number of machines accessing the same .</w:t>
+      </w:r>
+      <w:proofErr w:type="spellStart"/>
+      <w:r>
+        <w:t>mdb</w:t>
+      </w:r>
+      <w:proofErr w:type="spellEnd"/>
+      <w:r>
+        <w:t xml:space="preserve"> database file locally.</w:t>
+      </w:r>
+    </w:p>
+    <w:p>
+      <w:pPr>
+        <w:spacing w:line="276" w:lineRule="auto"/>
+      </w:pPr>
+      <w:r>
+        <w:t>The system will not include automated staff scheduling or payroll functionality. Managing staff rotas and wages involves complex business logic and legal considerations that are outside the scope of this project. Staff management features will be limited to basic record keeping.</w:t>
+      </w:r>
+    </w:p>
+    <w:p>
+      <w:pPr>
+        <w:spacing w:line="276" w:lineRule="auto"/>
+      </w:pPr>
+      <w:r>
+        <w:t>The system will not send automated notifications or emails to customers. Whilst it would be useful to send booking confirmation emails or screening reminders, this would require email server integration and SMTP configuration which is not available within the Visual Studio development environment used for this project.</w:t>
+      </w:r>
+    </w:p>
+    <w:p/>
     <w:sectPr>
       <w:headerReference w:type="even" r:id="rId16"/>
       <w:headerReference w:type="default" r:id="rId17"/>

</xml_diff>

<commit_message>
added objectives and evaluation criteria
</commit_message>
<xml_diff>
--- a/Investigation.docx
+++ b/Investigation.docx
@@ -130,7 +130,11 @@
         <w:spacing w:line="276" w:lineRule="auto"/>
       </w:pPr>
       <w:r>
-        <w:t>The next primary stakeholder group is the box office staff. These are the people who handle ticket sales and customer enquiries on a day to day basis and who will use the booking interface most frequently. Their priorities are speed and simplicity. During busy periods a member of staff cannot afford to spend several minutes navigating a complicated interface to add a single booking. The system therefore needs to be designed with efficiency in mind so that even a brand new member of staff could use it confidently with minimal training.</w:t>
+        <w:t xml:space="preserve">The next primary stakeholder group is the box office staff. These are the people who handle ticket sales and customer enquiries on a day to day basis and who will use the booking interface most frequently. Their priorities are speed and simplicity. During busy periods a member of staff cannot afford to spend several minutes navigating a complicated interface </w:t>
+      </w:r>
+      <w:r>
+        <w:lastRenderedPageBreak/>
+        <w:t>to add a single booking. The system therefore needs to be designed with efficiency in mind so that even a brand new member of staff could use it confidently with minimal training.</w:t>
       </w:r>
     </w:p>
     <w:p>
@@ -362,6 +366,7 @@
                 <w:sz w:val="20"/>
                 <w:szCs w:val="20"/>
               </w:rPr>
+              <w:lastRenderedPageBreak/>
               <w:t>Initial meeting with client (Sarah Henshaw) to discuss project scope</w:t>
             </w:r>
           </w:p>
@@ -1204,7 +1209,15 @@
                 <w:sz w:val="20"/>
                 <w:szCs w:val="20"/>
               </w:rPr>
-              <w:t>Produce a DFD showing how data moves through the current paper based system</w:t>
+              <w:t xml:space="preserve">Produce a DFD showing how data moves through </w:t>
+            </w:r>
+            <w:r>
+              <w:rPr>
+                <w:sz w:val="20"/>
+                <w:szCs w:val="20"/>
+              </w:rPr>
+              <w:lastRenderedPageBreak/>
+              <w:t>the current paper based system</w:t>
             </w:r>
           </w:p>
         </w:tc>
@@ -1226,6 +1239,7 @@
                 <w:sz w:val="20"/>
                 <w:szCs w:val="20"/>
               </w:rPr>
+              <w:lastRenderedPageBreak/>
               <w:t>Overview of existing system</w:t>
             </w:r>
           </w:p>
@@ -1570,7 +1584,11 @@
         <w:spacing w:line="276" w:lineRule="auto"/>
       </w:pPr>
       <w:r>
-        <w:t>Starting with interviews, these were chosen as the main method for gathering requirements from the key stakeholders. The reason for this is that an interview allows open ended questions to be asked and the conversation can naturally go in directions that were not planned in advance. This is important because some of the most useful information gathered during an investigation comes from things that the person being interviewed mentions without being directly asked. A written survey would not allow for this kind of flexibility. The limitation of interviews however is that they are time consuming and the quality of what comes out of them depends heavily on how well the questions are prepared. To address this the questions were written in advance and kept open ended to avoid leading the person being interviewed towards a particular answer. Two interviews were conducted for this investigation, one with the cinema manager and one with a member of the box office staff, as these two stakeholders gave the most complete view of how the existing system operates day to day.</w:t>
+        <w:t xml:space="preserve">Starting with interviews, these were chosen as the main method for gathering requirements from the key stakeholders. The reason for this is that an interview allows open ended questions to be asked and the conversation can naturally go in directions that were not planned in advance. This is important because some of the most useful information gathered during an investigation comes from things that the person being interviewed mentions without being directly asked. A written survey would not allow for this kind of flexibility. The limitation of interviews however is that they are time consuming and the quality of what comes out of them depends heavily on how well the questions are prepared. To address this the questions were written in advance and kept open ended to avoid leading the person being interviewed towards a particular answer. Two interviews were conducted for this investigation, one with the cinema manager and one with a </w:t>
+      </w:r>
+      <w:r>
+        <w:lastRenderedPageBreak/>
+        <w:t>member of the box office staff, as these two stakeholders gave the most complete view of how the existing system operates day to day.</w:t>
       </w:r>
     </w:p>
     <w:p>
@@ -1610,7 +1628,11 @@
         <w:spacing w:line="276" w:lineRule="auto"/>
       </w:pPr>
       <w:r>
-        <w:t>Finally, desk based research was used to look at how similar systems are designed in the real world. By researching the booking systems of established cinema chains it is possible to identify features and design patterns that set the standard for what customers already expect. This is useful because stakeholders do not always know what to ask for, particularly if they have not seen what is possible. The limitation of this method is that the systems being researched are built by large commercial teams with significant resources, so not everything observed will be feasible within the scope of this project. The research has therefore been used to inform and inspire the design rather than to copy it directly.</w:t>
+        <w:t xml:space="preserve">Finally, desk based research was used to look at how similar systems are designed in the real world. By researching the booking systems of established cinema chains it is possible to identify features and design patterns that set the standard for what customers already expect. This is useful because stakeholders do not always know what to ask for, particularly if they have not seen what is possible. The limitation of this method is that the systems being researched are built by large commercial teams with significant resources, </w:t>
+      </w:r>
+      <w:r>
+        <w:lastRenderedPageBreak/>
+        <w:t>so not everything observed will be feasible within the scope of this project. The research has therefore been used to inform and inspire the design rather than to copy it directly.</w:t>
       </w:r>
     </w:p>
     <w:p>
@@ -1785,7 +1807,11 @@
         <w:spacing w:after="120" w:line="276" w:lineRule="auto"/>
       </w:pPr>
       <w:r>
-        <w:t>A: The most important thing for me is being able to see everything in one place. I want to know how many seats are available for any screening at a glance, see sales figures without digging through paperwork and be able to add new films and screenings quickly and easily. I also want customers to be able to buy tickets through the kiosk rather than having to come to the desk.</w:t>
+        <w:t xml:space="preserve">A: The most important thing for me is being able to see everything in one place. I want to know how many seats are available for any screening at a glance, see sales figures without digging through paperwork and be able to add new films and screenings quickly and easily. </w:t>
+      </w:r>
+      <w:r>
+        <w:lastRenderedPageBreak/>
+        <w:t>I also want customers to be able to buy tickets through the kiosk rather than having to come to the desk.</w:t>
       </w:r>
     </w:p>
     <w:p>
@@ -1935,6 +1961,7 @@
           <w:b/>
           <w:bCs/>
         </w:rPr>
+        <w:lastRenderedPageBreak/>
         <w:t>Q: Do you have any concerns about moving to a computerised system?</w:t>
       </w:r>
     </w:p>
@@ -2565,6 +2592,7 @@
                 <w:sz w:val="20"/>
                 <w:szCs w:val="20"/>
               </w:rPr>
+              <w:lastRenderedPageBreak/>
               <w:t>Seat already taken when I arrived / same seat number given to others</w:t>
             </w:r>
           </w:p>
@@ -3354,6 +3382,7 @@
         <w:spacing w:line="276" w:lineRule="auto"/>
       </w:pPr>
       <w:r>
+        <w:lastRenderedPageBreak/>
         <w:t>80% of customers would find combined ticketing and food ordering useful. This confirms that integrating food and drink ordering with ticket booking is a worthwhile feature.</w:t>
       </w:r>
     </w:p>
@@ -3454,6 +3483,7 @@
         <w:spacing w:line="276" w:lineRule="auto"/>
       </w:pPr>
       <w:r>
+        <w:lastRenderedPageBreak/>
         <w:t>Overall the observation confirmed and added detail to the problems that had already been identified through the interviews and questionnaire. Seeing the existing system in action made it clear that the issues are not occasional or minor but are a regular feature of how the cinema operates during busy periods. The findings from this observation have directly informed the objectives set out later in this investigation.</w:t>
       </w:r>
     </w:p>
@@ -3600,7 +3630,11 @@
         <w:spacing w:line="276" w:lineRule="auto"/>
       </w:pPr>
       <w:r>
-        <w:t>The third document was the staff rota spreadsheet, which the manager fills in and prints out for the team. It is kept completely separate from the booking and stock records, and the only way for a member of staff to check when they are working is to be physically at the cinema where the printout is pinned up. While staff scheduling is not a core part of the problem this project is solving, looking at the rota helped confirm just how scattered the cinema's information is across separate files that do not talk to each other.</w:t>
+        <w:t xml:space="preserve">The third document was the staff rota spreadsheet, which the manager fills in and prints out for the team. It is kept completely separate from the booking and stock records, and the only way for a member of staff to check when they are working is to be physically at the </w:t>
+      </w:r>
+      <w:r>
+        <w:lastRenderedPageBreak/>
+        <w:t>cinema where the printout is pinned up. While staff scheduling is not a core part of the problem this project is solving, looking at the rota helped confirm just how scattered the cinema's information is across separate files that do not talk to each other.</w:t>
       </w:r>
     </w:p>
     <w:p>
@@ -3773,6 +3807,7 @@
           <w:szCs w:val="20"/>
           <w:lang w:val="fr-FR"/>
         </w:rPr>
+        <w:lastRenderedPageBreak/>
         <w:t>Figure 1: Vue film listings page (myvue.com)</w:t>
       </w:r>
     </w:p>
@@ -3894,6 +3929,7 @@
           <w:b/>
           <w:bCs/>
         </w:rPr>
+        <w:lastRenderedPageBreak/>
         <w:t>Seat Selection Screen</w:t>
       </w:r>
     </w:p>
@@ -4092,7 +4128,11 @@
         <w:spacing w:line="276" w:lineRule="auto"/>
       </w:pPr>
       <w:r>
-        <w:t xml:space="preserve">The second system I researched was Odeon, which is the largest cinema chain in the UK. Odeon operates over 120 cinemas across the UK and Ireland and their online booking system offered several useful features to compare against Vue and to inform the design of </w:t>
+        <w:t xml:space="preserve">The second system I researched was Odeon, which is the largest cinema chain in the UK. Odeon operates over 120 cinemas across the UK and Ireland and their online booking </w:t>
+      </w:r>
+      <w:r>
+        <w:lastRenderedPageBreak/>
+        <w:t xml:space="preserve">system offered several useful features to compare against Vue and to inform the design of </w:t>
       </w:r>
       <w:proofErr w:type="spellStart"/>
       <w:r>
@@ -4217,6 +4257,7 @@
         <w:rPr>
           <w:noProof/>
         </w:rPr>
+        <w:lastRenderedPageBreak/>
         <w:drawing>
           <wp:inline distT="0" distB="0" distL="0" distR="0" wp14:anchorId="1E91FEA3" wp14:editId="61E265F1">
             <wp:extent cx="4286250" cy="4343400"/>
@@ -4310,6 +4351,7 @@
         <w:rPr>
           <w:noProof/>
         </w:rPr>
+        <w:lastRenderedPageBreak/>
         <w:drawing>
           <wp:inline distT="0" distB="0" distL="0" distR="0" wp14:anchorId="456DA744" wp14:editId="1AB6B7F1">
             <wp:extent cx="5143500" cy="4038600"/>
@@ -4464,6 +4506,7 @@
         <w:contextualSpacing w:val="0"/>
       </w:pPr>
       <w:r>
+        <w:lastRenderedPageBreak/>
         <w:t>A stepped booking process guiding users through each stage in order</w:t>
       </w:r>
     </w:p>
@@ -4605,7 +4648,11 @@
         <w:spacing w:line="276" w:lineRule="auto"/>
       </w:pPr>
       <w:r>
-        <w:t>Before designing and building a new system it is important to fully understand how the existing one works. This includes looking at what data goes into the system, what comes out of it, how that data is processed in between and where the system falls short. Without this understanding there is a risk of building something that solves the wrong problems or misses important requirements entirely.</w:t>
+        <w:t xml:space="preserve">Before designing and building a new system it is important to fully understand how the existing one works. This includes looking at what data goes into the system, what comes out of it, how that data is processed in between and where the system falls short. Without </w:t>
+      </w:r>
+      <w:r>
+        <w:lastRenderedPageBreak/>
+        <w:t>this understanding there is a risk of building something that solves the wrong problems or misses important requirements entirely.</w:t>
       </w:r>
     </w:p>
     <w:p>
@@ -4689,7 +4736,11 @@
         <w:spacing w:line="276" w:lineRule="auto"/>
       </w:pPr>
       <w:r>
-        <w:t>When a customer books tickets the total cost is calculated manually by the staff member based on the number of tickets and the price for that screening. There is no automated pricing system meaning human error in the calculation is possible. At the end of a trading period the manager must manually count through all entries in the booking diary and cross reference with till receipts to produce any kind of sales summary. This is a time consuming process that the manager has described as unreliable because it depends on the handwritten records being complete and legible.</w:t>
+        <w:t xml:space="preserve">When a customer books tickets the total cost is calculated manually by the staff member based on the number of tickets and the price for that screening. There is no automated pricing system meaning human error in the calculation is possible. At the end of a trading period the manager must manually count through all entries in the booking diary and cross reference with till receipts to produce any kind of sales summary. This is a time consuming </w:t>
+      </w:r>
+      <w:r>
+        <w:lastRenderedPageBreak/>
+        <w:t>process that the manager has described as unreliable because it depends on the handwritten records being complete and legible.</w:t>
       </w:r>
     </w:p>
     <w:p>
@@ -4775,6 +4826,7 @@
           <w:bCs/>
           <w:color w:val="000000" w:themeColor="text1"/>
         </w:rPr>
+        <w:lastRenderedPageBreak/>
         <w:t>Limitations</w:t>
       </w:r>
     </w:p>
@@ -4847,7 +4899,11 @@
       </w:r>
       <w:proofErr w:type="spellEnd"/>
       <w:r>
-        <w:t xml:space="preserve"> is a small independent cinema that is currently managing all of its operations using a combination of paper records and disconnected spreadsheets. This approach may have been adequate when the cinema first opened but it has become increasingly problematic as the demands on the system have grown. The core problem is that the existing system is unreliable, slow and disconnected, and this is having a direct negative impact on both staff and customers.</w:t>
+        <w:t xml:space="preserve"> is a small independent cinema that is currently managing all of its operations using a combination of paper records and disconnected spreadsheets. This approach may have been adequate when the cinema first opened but it has become increasingly </w:t>
+      </w:r>
+      <w:r>
+        <w:lastRenderedPageBreak/>
+        <w:t>problematic as the demands on the system have grown. The core problem is that the existing system is unreliable, slow and disconnected, and this is having a direct negative impact on both staff and customers.</w:t>
       </w:r>
     </w:p>
     <w:p>
@@ -4905,6 +4961,7 @@
           <w:bCs/>
           <w:color w:val="000000" w:themeColor="text1"/>
         </w:rPr>
+        <w:lastRenderedPageBreak/>
         <w:t>Requirements Analysis</w:t>
       </w:r>
     </w:p>
@@ -5011,7 +5068,11 @@
       </w:r>
       <w:proofErr w:type="spellEnd"/>
       <w:r>
-        <w:t xml:space="preserve"> kiosk interface. Staff will be able to log in to manage bookings and screenings. The manager will have full access to all areas of the system including film management and sales reporting. Access levels will be enforced through the login system to ensure that users can only access the parts of the system that are relevant to their role, which is dealt with by Objective 10.</w:t>
+        <w:t xml:space="preserve"> kiosk interface. Staff will be </w:t>
+      </w:r>
+      <w:r>
+        <w:lastRenderedPageBreak/>
+        <w:t>able to log in to manage bookings and screenings. The manager will have full access to all areas of the system including film management and sales reporting. Access levels will be enforced through the login system to ensure that users can only access the parts of the system that are relevant to their role, which is dealt with by Objective 10.</w:t>
       </w:r>
     </w:p>
     <w:p/>
@@ -5118,7 +5179,462 @@
         <w:spacing w:line="276" w:lineRule="auto"/>
       </w:pPr>
       <w:r>
+        <w:lastRenderedPageBreak/>
         <w:t>The system will not send automated notifications or emails to customers. Whilst it would be useful to send booking confirmation emails or screening reminders, this would require email server integration and SMTP configuration which is not available within the Visual Studio development environment used for this project.</w:t>
+      </w:r>
+    </w:p>
+    <w:p/>
+    <w:p>
+      <w:pPr>
+        <w:pStyle w:val="Heading2"/>
+        <w:rPr>
+          <w:b/>
+          <w:bCs/>
+          <w:color w:val="000000" w:themeColor="text1"/>
+        </w:rPr>
+      </w:pPr>
+      <w:r>
+        <w:rPr>
+          <w:b/>
+          <w:bCs/>
+          <w:color w:val="000000" w:themeColor="text1"/>
+        </w:rPr>
+        <w:t>Objectives and Evaluation Criteria</w:t>
+      </w:r>
+    </w:p>
+    <w:p>
+      <w:pPr>
+        <w:spacing w:line="276" w:lineRule="auto"/>
+      </w:pPr>
+      <w:r>
+        <w:t>The following objectives have been produced based on the findings of the investigation. Each objective is numbered and includes a success criteria which will be used to evaluate whether the objective has been met when the project is complete.</w:t>
+      </w:r>
+    </w:p>
+    <w:p>
+      <w:pPr>
+        <w:spacing w:before="200" w:after="40"/>
+      </w:pPr>
+      <w:r>
+        <w:rPr>
+          <w:b/>
+          <w:bCs/>
+        </w:rPr>
+        <w:t>Objective 1: The system must allow staff to add new customer ticket bookings for a selected screening, recording the customer name, chosen seats and number of tickets.</w:t>
+      </w:r>
+    </w:p>
+    <w:p>
+      <w:pPr>
+        <w:spacing w:after="80" w:line="276" w:lineRule="auto"/>
+      </w:pPr>
+      <w:r>
+        <w:rPr>
+          <w:b/>
+          <w:bCs/>
+        </w:rPr>
+        <w:t xml:space="preserve">Success Criteria: </w:t>
+      </w:r>
+      <w:r>
+        <w:t>A new booking should be added to the Microsoft Access database in under 30 seconds. The booking record should appear immediately in the database with the correct customer name, screening, seat numbers and ticket quantity. Validation should prevent a booking being saved without all required fields completed.</w:t>
+      </w:r>
+    </w:p>
+    <w:p>
+      <w:pPr>
+        <w:spacing w:before="200" w:after="40"/>
+      </w:pPr>
+      <w:r>
+        <w:rPr>
+          <w:b/>
+          <w:bCs/>
+        </w:rPr>
+        <w:t>Objective 2: The system must prevent double bookings by ensuring that a seat which has already been allocated to a customer cannot be selected by another customer for the same screening.</w:t>
+      </w:r>
+    </w:p>
+    <w:p>
+      <w:pPr>
+        <w:spacing w:after="80" w:line="276" w:lineRule="auto"/>
+      </w:pPr>
+      <w:r>
+        <w:rPr>
+          <w:b/>
+          <w:bCs/>
+        </w:rPr>
+        <w:t xml:space="preserve">Success Criteria: </w:t>
+      </w:r>
+      <w:r>
+        <w:t>When a seat is already booked for a screening it should be visually marked as unavailable on the seat selection interface and it should be impossible to select or book it. Attempting to book an already taken seat should display a clear error message.</w:t>
+      </w:r>
+    </w:p>
+    <w:p>
+      <w:pPr>
+        <w:spacing w:before="200" w:after="40"/>
+      </w:pPr>
+      <w:r>
+        <w:rPr>
+          <w:b/>
+          <w:bCs/>
+        </w:rPr>
+        <w:t>Objective 3: The system must display a graphical seat map for each screening showing which seats are available and which are already booked.</w:t>
+      </w:r>
+    </w:p>
+    <w:p>
+      <w:pPr>
+        <w:spacing w:after="80" w:line="276" w:lineRule="auto"/>
+      </w:pPr>
+      <w:r>
+        <w:rPr>
+          <w:b/>
+          <w:bCs/>
+        </w:rPr>
+        <w:t xml:space="preserve">Success Criteria: </w:t>
+      </w:r>
+      <w:r>
+        <w:t>The seat map should load within 3 seconds of a screening being selected. Available seats and booked seats should be displayed in clearly distinguishable colours. The seat map should accurately reflect the current state of the database at the time of loading.</w:t>
+      </w:r>
+    </w:p>
+    <w:p>
+      <w:pPr>
+        <w:spacing w:before="200" w:after="40"/>
+      </w:pPr>
+      <w:r>
+        <w:rPr>
+          <w:b/>
+          <w:bCs/>
+        </w:rPr>
+        <w:t>Objective 4: The system must allow customers to purchase tickets through a self-service kiosk interface, selecting a film, screening time, seats and completing their booking without staff assistance.</w:t>
+      </w:r>
+    </w:p>
+    <w:p>
+      <w:pPr>
+        <w:spacing w:after="80" w:line="276" w:lineRule="auto"/>
+      </w:pPr>
+      <w:r>
+        <w:rPr>
+          <w:b/>
+          <w:bCs/>
+        </w:rPr>
+        <w:t xml:space="preserve">Success Criteria: </w:t>
+      </w:r>
+      <w:r>
+        <w:t xml:space="preserve">A customer should be able to complete a full ticket booking through the kiosk interface in under 2 minutes. The kiosk should guide the customer through each </w:t>
+      </w:r>
+      <w:r>
+        <w:lastRenderedPageBreak/>
+        <w:t>stage clearly using buttons and on screen instructions. The completed booking should be recorded in the database correctly.</w:t>
+      </w:r>
+    </w:p>
+    <w:p>
+      <w:pPr>
+        <w:spacing w:before="200" w:after="40"/>
+      </w:pPr>
+      <w:r>
+        <w:rPr>
+          <w:b/>
+          <w:bCs/>
+        </w:rPr>
+        <w:t>Objective 5: The system must allow customers to add food and drink items to their order at the same time as booking tickets, with the combined order saved to the database.</w:t>
+      </w:r>
+    </w:p>
+    <w:p>
+      <w:pPr>
+        <w:spacing w:after="80" w:line="276" w:lineRule="auto"/>
+      </w:pPr>
+      <w:r>
+        <w:rPr>
+          <w:b/>
+          <w:bCs/>
+        </w:rPr>
+        <w:t xml:space="preserve">Success Criteria: </w:t>
+      </w:r>
+      <w:r>
+        <w:t>Food and drink items should be displayed on a clearly navigable menu during the booking process. A customer should be able to add multiple items to their order. The food and drink order should be saved to the database linked to the correct booking record.</w:t>
+      </w:r>
+    </w:p>
+    <w:p>
+      <w:pPr>
+        <w:spacing w:before="200" w:after="40"/>
+      </w:pPr>
+      <w:r>
+        <w:rPr>
+          <w:b/>
+          <w:bCs/>
+        </w:rPr>
+        <w:t>Objective 6: The system must allow staff and managers to add new films to the system, including the film title, age rating, duration and description.</w:t>
+      </w:r>
+    </w:p>
+    <w:p>
+      <w:pPr>
+        <w:spacing w:after="80" w:line="276" w:lineRule="auto"/>
+      </w:pPr>
+      <w:r>
+        <w:rPr>
+          <w:b/>
+          <w:bCs/>
+        </w:rPr>
+        <w:t xml:space="preserve">Success Criteria: </w:t>
+      </w:r>
+      <w:r>
+        <w:t>A new film record should be saved to the database in under 20 seconds with all required fields validated. The film should immediately appear in the list of available films when adding a new screening. Duplicate film titles should be prevented through validation.</w:t>
+      </w:r>
+    </w:p>
+    <w:p>
+      <w:pPr>
+        <w:spacing w:before="200" w:after="40"/>
+      </w:pPr>
+      <w:r>
+        <w:rPr>
+          <w:b/>
+          <w:bCs/>
+        </w:rPr>
+        <w:t>Objective 7: The system must allow staff and managers to add new screenings for existing films, specifying the screen, date, time and ticket price.</w:t>
+      </w:r>
+    </w:p>
+    <w:p>
+      <w:pPr>
+        <w:spacing w:after="80" w:line="276" w:lineRule="auto"/>
+      </w:pPr>
+      <w:r>
+        <w:rPr>
+          <w:b/>
+          <w:bCs/>
+        </w:rPr>
+        <w:t xml:space="preserve">Success Criteria: </w:t>
+      </w:r>
+      <w:r>
+        <w:t>A new screening record should be saved to the database correctly linked to the selected film. The screening should immediately appear in the list of available screenings on the customer kiosk. Validation should prevent a screening being added without a valid date, time, screen and ticket price.</w:t>
+      </w:r>
+    </w:p>
+    <w:p>
+      <w:pPr>
+        <w:spacing w:before="200" w:after="40"/>
+      </w:pPr>
+      <w:r>
+        <w:rPr>
+          <w:b/>
+          <w:bCs/>
+        </w:rPr>
+        <w:t>Objective 8: The system must allow the manager to view a sales report showing total ticket sales and revenue for a selected date range.</w:t>
+      </w:r>
+    </w:p>
+    <w:p>
+      <w:pPr>
+        <w:spacing w:after="80" w:line="276" w:lineRule="auto"/>
+      </w:pPr>
+      <w:r>
+        <w:rPr>
+          <w:b/>
+          <w:bCs/>
+        </w:rPr>
+        <w:t xml:space="preserve">Success Criteria: </w:t>
+      </w:r>
+      <w:r>
+        <w:t xml:space="preserve">The report should be generated using an SQL query through the </w:t>
+      </w:r>
+      <w:proofErr w:type="spellStart"/>
+      <w:r>
+        <w:t>OleDb</w:t>
+      </w:r>
+      <w:proofErr w:type="spellEnd"/>
+      <w:r>
+        <w:t xml:space="preserve"> connection and displayed on screen within 5 seconds of the date range being selected. The report should show the correct total number of tickets sold and total revenue for the selected period, calculated directly from the bookings in the database.</w:t>
+      </w:r>
+    </w:p>
+    <w:p>
+      <w:pPr>
+        <w:spacing w:before="200" w:after="40"/>
+      </w:pPr>
+      <w:r>
+        <w:rPr>
+          <w:b/>
+          <w:bCs/>
+        </w:rPr>
+        <w:t>Objective 9: The system must allow the manager to view a list of all bookings for a selected screening, showing customer names, seat numbers and the number of tickets booked.</w:t>
+      </w:r>
+    </w:p>
+    <w:p>
+      <w:pPr>
+        <w:spacing w:after="80" w:line="276" w:lineRule="auto"/>
+      </w:pPr>
+      <w:r>
+        <w:rPr>
+          <w:b/>
+          <w:bCs/>
+        </w:rPr>
+        <w:t xml:space="preserve">Success Criteria: </w:t>
+      </w:r>
+      <w:r>
+        <w:t>The booking list should load within 3 seconds of a screening being selected. All bookings for that screening should be displayed accurately. The list should be printable or exportable for use as a physical register.</w:t>
+      </w:r>
+    </w:p>
+    <w:p>
+      <w:pPr>
+        <w:spacing w:before="200" w:after="40"/>
+      </w:pPr>
+      <w:r>
+        <w:rPr>
+          <w:b/>
+          <w:bCs/>
+        </w:rPr>
+        <w:lastRenderedPageBreak/>
+        <w:t>Objective 10: The system must enforce access levels so that customers using the kiosk can only access booking functions, whilst staff can access management functions and managers can access all areas of the system.</w:t>
+      </w:r>
+    </w:p>
+    <w:p>
+      <w:pPr>
+        <w:spacing w:after="80" w:line="276" w:lineRule="auto"/>
+      </w:pPr>
+      <w:r>
+        <w:rPr>
+          <w:b/>
+          <w:bCs/>
+        </w:rPr>
+        <w:t xml:space="preserve">Success Criteria: </w:t>
+      </w:r>
+      <w:r>
+        <w:t>The kiosk interface should not display any staff or manager options. Staff should be able to log in with a username and password and access staff functions only. The manager login should provide access to all areas of the system. Attempting to access a restricted area without the correct login should be prevented.</w:t>
+      </w:r>
+    </w:p>
+    <w:p>
+      <w:pPr>
+        <w:spacing w:before="200" w:after="40"/>
+      </w:pPr>
+      <w:r>
+        <w:rPr>
+          <w:b/>
+          <w:bCs/>
+        </w:rPr>
+        <w:t>Objective 11: The system must allow staff to search for an existing booking by customer name or booking reference.</w:t>
+      </w:r>
+    </w:p>
+    <w:p>
+      <w:pPr>
+        <w:spacing w:after="80" w:line="276" w:lineRule="auto"/>
+      </w:pPr>
+      <w:r>
+        <w:rPr>
+          <w:b/>
+          <w:bCs/>
+        </w:rPr>
+        <w:t xml:space="preserve">Success Criteria: </w:t>
+      </w:r>
+      <w:r>
+        <w:t>A search by customer surname should return all matching bookings within 2 seconds. The search should work with partial name entries. The correct booking record should be displayed with all associated details including film, screening, seats and food order.</w:t>
+      </w:r>
+    </w:p>
+    <w:p>
+      <w:pPr>
+        <w:spacing w:before="200" w:after="40"/>
+      </w:pPr>
+      <w:r>
+        <w:rPr>
+          <w:b/>
+          <w:bCs/>
+        </w:rPr>
+        <w:t>Objective 12: The system must allow staff to cancel an existing booking, removing the seat allocation from the database and making those seats available again.</w:t>
+      </w:r>
+    </w:p>
+    <w:p>
+      <w:pPr>
+        <w:spacing w:after="80" w:line="276" w:lineRule="auto"/>
+      </w:pPr>
+      <w:r>
+        <w:rPr>
+          <w:b/>
+          <w:bCs/>
+        </w:rPr>
+        <w:t xml:space="preserve">Success Criteria: </w:t>
+      </w:r>
+      <w:r>
+        <w:t>Cancelling a booking should update the database immediately so the seats become available for other customers. A confirmation prompt should be displayed before any booking is deleted. The cancelled booking should no longer appear in the active bookings list.</w:t>
+      </w:r>
+    </w:p>
+    <w:p>
+      <w:pPr>
+        <w:spacing w:before="200" w:after="40"/>
+      </w:pPr>
+      <w:r>
+        <w:rPr>
+          <w:b/>
+          <w:bCs/>
+        </w:rPr>
+        <w:t>Objective 13: The system must validate all data entered by users to prevent invalid or incomplete records being saved to the database.</w:t>
+      </w:r>
+    </w:p>
+    <w:p>
+      <w:pPr>
+        <w:spacing w:after="80" w:line="276" w:lineRule="auto"/>
+      </w:pPr>
+      <w:r>
+        <w:rPr>
+          <w:b/>
+          <w:bCs/>
+        </w:rPr>
+        <w:t xml:space="preserve">Success Criteria: </w:t>
+      </w:r>
+      <w:r>
+        <w:t>All required fields should be validated before a record is saved. Numeric fields should only accept numbers. Date fields should only accept valid dates. Text fields should have appropriate maximum lengths enforced. An informative error message should be displayed for each validation failure explaining what needs to be corrected.</w:t>
+      </w:r>
+    </w:p>
+    <w:p>
+      <w:pPr>
+        <w:spacing w:before="200" w:after="40"/>
+      </w:pPr>
+      <w:r>
+        <w:rPr>
+          <w:b/>
+          <w:bCs/>
+        </w:rPr>
+        <w:t>Objective 14: The system must have a consistent and professional user interface across all forms, using a uniform colour scheme, layout and naming convention throughout.</w:t>
+      </w:r>
+    </w:p>
+    <w:p>
+      <w:pPr>
+        <w:spacing w:after="80" w:line="276" w:lineRule="auto"/>
+      </w:pPr>
+      <w:r>
+        <w:rPr>
+          <w:b/>
+          <w:bCs/>
+        </w:rPr>
+        <w:t xml:space="preserve">Success Criteria: </w:t>
+      </w:r>
+      <w:r>
+        <w:t xml:space="preserve">All forms should use the same colour scheme, font and button placement. Navigation buttons should appear in consistent positions across all forms. The system should look professional and be immediately recognisable as a </w:t>
+      </w:r>
+      <w:proofErr w:type="spellStart"/>
+      <w:r>
+        <w:t>Filmtopia</w:t>
+      </w:r>
+      <w:proofErr w:type="spellEnd"/>
+      <w:r>
+        <w:t xml:space="preserve"> branded application.</w:t>
+      </w:r>
+    </w:p>
+    <w:p>
+      <w:pPr>
+        <w:spacing w:before="200" w:after="40"/>
+      </w:pPr>
+      <w:r>
+        <w:rPr>
+          <w:b/>
+          <w:bCs/>
+        </w:rPr>
+        <w:lastRenderedPageBreak/>
+        <w:t>Objective 15: The system must be easy to navigate, with clearly labelled menus and buttons that allow staff and customers to find the function they need without requiring technical knowledge.</w:t>
+      </w:r>
+    </w:p>
+    <w:p>
+      <w:pPr>
+        <w:spacing w:after="80" w:line="276" w:lineRule="auto"/>
+      </w:pPr>
+      <w:r>
+        <w:rPr>
+          <w:b/>
+          <w:bCs/>
+        </w:rPr>
+        <w:t xml:space="preserve">Success Criteria: </w:t>
+      </w:r>
+      <w:r>
+        <w:t>A new member of staff should be able to complete a basic booking using the system without any training beyond a brief introduction. All buttons and menu options should use clear plain English labels. The system should never reach a state where the user cannot navigate back to the main menu.</w:t>
       </w:r>
     </w:p>
     <w:p/>

</xml_diff>

<commit_message>
added the diary from existing stuff
</commit_message>
<xml_diff>
--- a/Investigation.docx
+++ b/Investigation.docx
@@ -10,21 +10,12 @@
           <w:color w:val="000000" w:themeColor="text1"/>
         </w:rPr>
       </w:pPr>
-      <w:proofErr w:type="spellStart"/>
-      <w:r>
-        <w:rPr>
-          <w:b/>
-          <w:color w:val="000000" w:themeColor="text1"/>
-        </w:rPr>
-        <w:t>Filmtopia</w:t>
-      </w:r>
-      <w:proofErr w:type="spellEnd"/>
-      <w:r>
-        <w:rPr>
-          <w:b/>
-          <w:color w:val="000000" w:themeColor="text1"/>
-        </w:rPr>
-        <w:t xml:space="preserve"> Project Investigation</w:t>
+      <w:r>
+        <w:rPr>
+          <w:b/>
+          <w:color w:val="000000" w:themeColor="text1"/>
+        </w:rPr>
+        <w:t>Filmtopia Project Investigation</w:t>
       </w:r>
     </w:p>
     <w:p>
@@ -47,29 +38,8 @@
       <w:pPr>
         <w:spacing w:line="276" w:lineRule="auto"/>
       </w:pPr>
-      <w:proofErr w:type="spellStart"/>
-      <w:r>
-        <w:t>Filmtopia</w:t>
-      </w:r>
-      <w:proofErr w:type="spellEnd"/>
-      <w:r>
-        <w:t xml:space="preserve"> is a small independent cinema theatre who is currently managing all business data using spreadsheets and paper. They sell food drinks and tickets using a variety of means such as a touchscreen kiosk which can only handle food and drinks and a concessions area where employees handle the business. The management of </w:t>
-      </w:r>
-      <w:proofErr w:type="spellStart"/>
-      <w:r>
-        <w:t>Filmtopia</w:t>
-      </w:r>
-      <w:proofErr w:type="spellEnd"/>
-      <w:r>
-        <w:t xml:space="preserve"> has come to notice that they are falling back on managing and analysing the cinema, this means keeping track of sales records, screening analytics and a customer interest evaluation. I am now going to investigate further on how </w:t>
-      </w:r>
-      <w:proofErr w:type="spellStart"/>
-      <w:r>
-        <w:t>Filmtopia</w:t>
-      </w:r>
-      <w:proofErr w:type="spellEnd"/>
-      <w:r>
-        <w:t xml:space="preserve"> functions to get a better understanding of how I should move with this project.</w:t>
+      <w:r>
+        <w:t>Filmtopia is a small independent cinema theatre who is currently managing all business data using spreadsheets and paper. They sell food drinks and tickets using a variety of means such as a touchscreen kiosk which can only handle food and drinks and a concessions area where employees handle the business. The management of Filmtopia has come to notice that they are falling back on managing and analysing the cinema, this means keeping track of sales records, screening analytics and a customer interest evaluation. I am now going to investigate further on how Filmtopia functions to get a better understanding of how I should move with this project.</w:t>
       </w:r>
       <w:r>
         <w:tab/>
@@ -106,15 +76,7 @@
         <w:spacing w:line="276" w:lineRule="auto"/>
       </w:pPr>
       <w:r>
-        <w:t xml:space="preserve">For the </w:t>
-      </w:r>
-      <w:proofErr w:type="spellStart"/>
-      <w:r>
-        <w:t>Filmtopia</w:t>
-      </w:r>
-      <w:proofErr w:type="spellEnd"/>
-      <w:r>
-        <w:t xml:space="preserve"> system the stakeholders can be split into two groups, primary and secondary. Primary stakeholders are those who will interact with the system directly on a regular basis. Secondary stakeholders are those who are affected by the system indirectly or whose work is influenced by it without them necessarily using it themselves.</w:t>
+        <w:t>For the Filmtopia system the stakeholders can be split into two groups, primary and secondary. Primary stakeholders are those who will interact with the system directly on a regular basis. Secondary stakeholders are those who are affected by the system indirectly or whose work is influenced by it without them necessarily using it themselves.</w:t>
       </w:r>
     </w:p>
     <w:p>
@@ -142,31 +104,7 @@
         <w:spacing w:line="276" w:lineRule="auto"/>
       </w:pPr>
       <w:r>
-        <w:t xml:space="preserve">The third primary stakeholder is the customer base of </w:t>
-      </w:r>
-      <w:proofErr w:type="spellStart"/>
-      <w:r>
-        <w:t>Filmtopia</w:t>
-      </w:r>
-      <w:proofErr w:type="spellEnd"/>
-      <w:r>
-        <w:t xml:space="preserve">. Customers interact with the system either directly through the proposed </w:t>
-      </w:r>
-      <w:proofErr w:type="spellStart"/>
-      <w:r>
-        <w:t>self service</w:t>
-      </w:r>
-      <w:proofErr w:type="spellEnd"/>
-      <w:r>
-        <w:t xml:space="preserve"> kiosk or indirectly when staff process their bookings on their behalf. Their main interests are convenience, short queue times and the assurance that the seat they have been allocated will actually be available when they arrive. The questionnaire results discussed later in this investigation show that a large majority of customers would prefer </w:t>
-      </w:r>
-      <w:proofErr w:type="spellStart"/>
-      <w:r>
-        <w:t>self service</w:t>
-      </w:r>
-      <w:proofErr w:type="spellEnd"/>
-      <w:r>
-        <w:t xml:space="preserve"> ticketing and that seat selection is considered important by most respondents. This means the bar for the kiosk interface is high and it needs to be clean and simple enough for any customer to use without assistance.</w:t>
+        <w:t>The third primary stakeholder is the customer base of Filmtopia. Customers interact with the system either directly through the proposed self service kiosk or indirectly when staff process their bookings on their behalf. Their main interests are convenience, short queue times and the assurance that the seat they have been allocated will actually be available when they arrive. The questionnaire results discussed later in this investigation show that a large majority of customers would prefer self service ticketing and that seat selection is considered important by most respondents. This means the bar for the kiosk interface is high and it needs to be clean and simple enough for any customer to use without assistance.</w:t>
       </w:r>
     </w:p>
     <w:p>
@@ -182,28 +120,12 @@
         <w:spacing w:line="276" w:lineRule="auto"/>
       </w:pPr>
       <w:r>
-        <w:t xml:space="preserve">Another secondary stakeholder is any external IT support that </w:t>
-      </w:r>
-      <w:proofErr w:type="spellStart"/>
-      <w:r>
-        <w:t>Filmtopia</w:t>
-      </w:r>
-      <w:proofErr w:type="spellEnd"/>
-      <w:r>
-        <w:t xml:space="preserve"> uses. As a small independent cinema there is no dedicated IT department meaning the system must be robust and straightforward to maintain. Complex setups that require specialist knowledge to troubleshoot would be impractical for a business of this size.</w:t>
-      </w:r>
-    </w:p>
-    <w:p>
-      <w:r>
-        <w:t xml:space="preserve">In summary the stakeholder analysis makes clear that the </w:t>
-      </w:r>
-      <w:proofErr w:type="spellStart"/>
-      <w:r>
-        <w:t>Filmtopia</w:t>
-      </w:r>
-      <w:proofErr w:type="spellEnd"/>
-      <w:r>
-        <w:t xml:space="preserve"> system needs to serve a wide range of users with different levels of technical confidence and different priorities. The investigation that follows has been designed to gather requirements from as many of these stakeholders as possible to ensure the final system genuinely reflects the needs of everyone who will be affected by it.</w:t>
+        <w:t>Another secondary stakeholder is any external IT support that Filmtopia uses. As a small independent cinema there is no dedicated IT department meaning the system must be robust and straightforward to maintain. Complex setups that require specialist knowledge to troubleshoot would be impractical for a business of this size.</w:t>
+      </w:r>
+    </w:p>
+    <w:p>
+      <w:r>
+        <w:t>In summary the stakeholder analysis makes clear that the Filmtopia system needs to serve a wide range of users with different levels of technical confidence and different priorities. The investigation that follows has been designed to gather requirements from as many of these stakeholders as possible to ensure the final system genuinely reflects the needs of everyone who will be affected by it.</w:t>
       </w:r>
     </w:p>
     <w:p>
@@ -755,52 +677,14 @@
                 <w:lang w:val="fr-FR"/>
               </w:rPr>
             </w:pPr>
-            <w:proofErr w:type="spellStart"/>
             <w:r>
               <w:rPr>
                 <w:sz w:val="20"/>
                 <w:szCs w:val="20"/>
                 <w:lang w:val="fr-FR"/>
               </w:rPr>
-              <w:t>Summarise</w:t>
-            </w:r>
-            <w:proofErr w:type="spellEnd"/>
-            <w:r>
-              <w:rPr>
-                <w:sz w:val="20"/>
-                <w:szCs w:val="20"/>
-                <w:lang w:val="fr-FR"/>
-              </w:rPr>
-              <w:t xml:space="preserve"> and </w:t>
-            </w:r>
-            <w:proofErr w:type="spellStart"/>
-            <w:r>
-              <w:rPr>
-                <w:sz w:val="20"/>
-                <w:szCs w:val="20"/>
-                <w:lang w:val="fr-FR"/>
-              </w:rPr>
-              <w:t>interpret</w:t>
-            </w:r>
-            <w:proofErr w:type="spellEnd"/>
-            <w:r>
-              <w:rPr>
-                <w:sz w:val="20"/>
-                <w:szCs w:val="20"/>
-                <w:lang w:val="fr-FR"/>
-              </w:rPr>
-              <w:t xml:space="preserve"> questionnaire </w:t>
-            </w:r>
-            <w:proofErr w:type="spellStart"/>
-            <w:r>
-              <w:rPr>
-                <w:sz w:val="20"/>
-                <w:szCs w:val="20"/>
-                <w:lang w:val="fr-FR"/>
-              </w:rPr>
-              <w:t>responses</w:t>
-            </w:r>
-            <w:proofErr w:type="spellEnd"/>
+              <w:t>Summarise and interpret questionnaire responses</w:t>
+            </w:r>
           </w:p>
         </w:tc>
       </w:tr>
@@ -1596,15 +1480,7 @@
         <w:spacing w:line="276" w:lineRule="auto"/>
       </w:pPr>
       <w:r>
-        <w:t xml:space="preserve">Moving on to the customer questionnaire, this was chosen because it allowed a much larger group of stakeholders to contribute to the investigation than would have been possible through interviews alone. Interviewing every customer individually would not be realistic, so a questionnaire was the most practical way to gather their views. The key advantage of a questionnaire is that it produces quantitative data which is easier to summarise and use as justification for design decisions. For example knowing that a large majority of customers would prefer a </w:t>
-      </w:r>
-      <w:proofErr w:type="spellStart"/>
-      <w:r>
-        <w:t>self service</w:t>
-      </w:r>
-      <w:proofErr w:type="spellEnd"/>
-      <w:r>
-        <w:t xml:space="preserve"> kiosk is a much stronger argument for including that feature than one person mentioning it in an interview. The limitation of a questionnaire is that the questions are fixed which means there is no opportunity to follow up on responses or ask for more detail. To partially work around this some of the questions included a list of options rather than just a yes or no answer which produced more useful and specific data.</w:t>
+        <w:t>Moving on to the customer questionnaire, this was chosen because it allowed a much larger group of stakeholders to contribute to the investigation than would have been possible through interviews alone. Interviewing every customer individually would not be realistic, so a questionnaire was the most practical way to gather their views. The key advantage of a questionnaire is that it produces quantitative data which is easier to summarise and use as justification for design decisions. For example knowing that a large majority of customers would prefer a self service kiosk is a much stronger argument for including that feature than one person mentioning it in an interview. The limitation of a questionnaire is that the questions are fixed which means there is no opportunity to follow up on responses or ask for more detail. To partially work around this some of the questions included a list of options rather than just a yes or no answer which produced more useful and specific data.</w:t>
       </w:r>
     </w:p>
     <w:p>
@@ -1707,23 +1583,7 @@
           <w:b/>
           <w:bCs/>
         </w:rPr>
-        <w:t xml:space="preserve">Q: Can you describe how </w:t>
-      </w:r>
-      <w:proofErr w:type="spellStart"/>
-      <w:r>
-        <w:rPr>
-          <w:b/>
-          <w:bCs/>
-        </w:rPr>
-        <w:t>Filmtopia</w:t>
-      </w:r>
-      <w:proofErr w:type="spellEnd"/>
-      <w:r>
-        <w:rPr>
-          <w:b/>
-          <w:bCs/>
-        </w:rPr>
-        <w:t xml:space="preserve"> currently manages its ticketing and bookings?</w:t>
+        <w:t>Q: Can you describe how Filmtopia currently manages its ticketing and bookings?</w:t>
       </w:r>
     </w:p>
     <w:p>
@@ -1763,23 +1623,7 @@
           <w:b/>
           <w:bCs/>
         </w:rPr>
-        <w:t xml:space="preserve">Q: What data does </w:t>
-      </w:r>
-      <w:proofErr w:type="spellStart"/>
-      <w:r>
-        <w:rPr>
-          <w:b/>
-          <w:bCs/>
-        </w:rPr>
-        <w:t>Filmtopia</w:t>
-      </w:r>
-      <w:proofErr w:type="spellEnd"/>
-      <w:r>
-        <w:rPr>
-          <w:b/>
-          <w:bCs/>
-        </w:rPr>
-        <w:t xml:space="preserve"> currently store and how?</w:t>
+        <w:t>Q: What data does Filmtopia currently store and how?</w:t>
       </w:r>
     </w:p>
     <w:p>
@@ -1997,15 +1841,7 @@
         <w:spacing w:line="276" w:lineRule="auto"/>
       </w:pPr>
       <w:r>
-        <w:t xml:space="preserve">A questionnaire was distributed to customers visiting </w:t>
-      </w:r>
-      <w:proofErr w:type="spellStart"/>
-      <w:r>
-        <w:t>Filmtopia</w:t>
-      </w:r>
-      <w:proofErr w:type="spellEnd"/>
-      <w:r>
-        <w:t xml:space="preserve"> in order to gather feedback on their experience with the current system and to understand what they would want from a new one. It was administered on the 15th of January 2026 as a paper questionnaire handed to customers at the cinema, and 20 responses were collected. The questions and summarised responses are as follows.</w:t>
+        <w:t>A questionnaire was distributed to customers visiting Filmtopia in order to gather feedback on their experience with the current system and to understand what they would want from a new one. It was administered on the 15th of January 2026 as a paper questionnaire handed to customers at the cinema, and 20 responses were collected. The questions and summarised responses are as follows.</w:t>
       </w:r>
     </w:p>
     <w:p>
@@ -2023,25 +1859,7 @@
           <w:bCs/>
           <w:color w:val="000000" w:themeColor="text1"/>
         </w:rPr>
-        <w:t xml:space="preserve">Q1: How do you currently purchase your tickets at </w:t>
-      </w:r>
-      <w:proofErr w:type="spellStart"/>
-      <w:r>
-        <w:rPr>
-          <w:b/>
-          <w:bCs/>
-          <w:color w:val="000000" w:themeColor="text1"/>
-        </w:rPr>
-        <w:t>Filmtopia</w:t>
-      </w:r>
-      <w:proofErr w:type="spellEnd"/>
-      <w:r>
-        <w:rPr>
-          <w:b/>
-          <w:bCs/>
-          <w:color w:val="000000" w:themeColor="text1"/>
-        </w:rPr>
-        <w:t>?</w:t>
+        <w:t>Q1: How do you currently purchase your tickets at Filmtopia?</w:t>
       </w:r>
     </w:p>
     <w:tbl>
@@ -2263,25 +2081,7 @@
           <w:bCs/>
           <w:color w:val="000000" w:themeColor="text1"/>
         </w:rPr>
-        <w:t xml:space="preserve">Q2: Have you ever experienced a problem when booking tickets at </w:t>
-      </w:r>
-      <w:proofErr w:type="spellStart"/>
-      <w:r>
-        <w:rPr>
-          <w:b/>
-          <w:bCs/>
-          <w:color w:val="000000" w:themeColor="text1"/>
-        </w:rPr>
-        <w:t>Filmtopia</w:t>
-      </w:r>
-      <w:proofErr w:type="spellEnd"/>
-      <w:r>
-        <w:rPr>
-          <w:b/>
-          <w:bCs/>
-          <w:color w:val="000000" w:themeColor="text1"/>
-        </w:rPr>
-        <w:t>?</w:t>
+        <w:t>Q2: Have you ever experienced a problem when booking tickets at Filmtopia?</w:t>
       </w:r>
     </w:p>
     <w:tbl>
@@ -3194,15 +2994,7 @@
         <w:spacing w:line="276" w:lineRule="auto"/>
       </w:pPr>
       <w:r>
-        <w:t xml:space="preserve">85% of customers felt seat selection was at least quite important. This supports the planned graphical seat selection feature in the </w:t>
-      </w:r>
-      <w:proofErr w:type="spellStart"/>
-      <w:r>
-        <w:t>Filmtopia</w:t>
-      </w:r>
-      <w:proofErr w:type="spellEnd"/>
-      <w:r>
-        <w:t xml:space="preserve"> system.</w:t>
+        <w:t>85% of customers felt seat selection was at least quite important. This supports the planned graphical seat selection feature in the Filmtopia system.</w:t>
       </w:r>
     </w:p>
     <w:p>
@@ -3382,7 +3174,30 @@
         <w:spacing w:line="276" w:lineRule="auto"/>
       </w:pPr>
       <w:r>
+        <w:rPr>
+          <w:noProof/>
+        </w:rPr>
         <w:lastRenderedPageBreak/>
+        <w:drawing>
+          <wp:inline distT="0" distB="0" distL="0" distR="0" wp14:anchorId="2A379110" wp14:editId="2221F54E">
+            <wp:extent cx="5486400" cy="3200400"/>
+            <wp:effectExtent l="0" t="0" r="0" b="0"/>
+            <wp:docPr id="901803336" name="Chart 5"/>
+            <wp:cNvGraphicFramePr/>
+            <a:graphic xmlns:a="http://schemas.openxmlformats.org/drawingml/2006/main">
+              <a:graphicData uri="http://schemas.openxmlformats.org/drawingml/2006/chart">
+                <c:chart xmlns:c="http://schemas.openxmlformats.org/drawingml/2006/chart" xmlns:r="http://schemas.openxmlformats.org/officeDocument/2006/relationships" r:id="rId8"/>
+              </a:graphicData>
+            </a:graphic>
+          </wp:inline>
+        </w:drawing>
+      </w:r>
+    </w:p>
+    <w:p>
+      <w:pPr>
+        <w:spacing w:line="276" w:lineRule="auto"/>
+      </w:pPr>
+      <w:r>
         <w:t>80% of customers would find combined ticketing and food ordering useful. This confirms that integrating food and drink ordering with ticket booking is a worthwhile feature.</w:t>
       </w:r>
     </w:p>
@@ -3409,15 +3224,7 @@
         <w:spacing w:line="276" w:lineRule="auto"/>
       </w:pPr>
       <w:r>
-        <w:t xml:space="preserve">The questionnaire results clearly show that customers are experiencing real problems with the current system at </w:t>
-      </w:r>
-      <w:proofErr w:type="spellStart"/>
-      <w:r>
-        <w:t>Filmtopia</w:t>
-      </w:r>
-      <w:proofErr w:type="spellEnd"/>
-      <w:r>
-        <w:t>. The most significant issues are long queues at the box office, errors with seat allocation and the inability to book tickets through the kiosk. The results also show strong demand for a self-service ticketing kiosk, graphical seat selection and combined food and drink ordering. These findings have directly informed the objectives set out later in this investigation.</w:t>
+        <w:t>The questionnaire results clearly show that customers are experiencing real problems with the current system at Filmtopia. The most significant issues are long queues at the box office, errors with seat allocation and the inability to book tickets through the kiosk. The results also show strong demand for a self-service ticketing kiosk, graphical seat selection and combined food and drink ordering. These findings have directly informed the objectives set out later in this investigation.</w:t>
       </w:r>
     </w:p>
     <w:p>
@@ -3443,15 +3250,7 @@
         <w:spacing w:line="276" w:lineRule="auto"/>
       </w:pPr>
       <w:r>
-        <w:t xml:space="preserve">As part of the investigation I visited </w:t>
-      </w:r>
-      <w:proofErr w:type="spellStart"/>
-      <w:r>
-        <w:t>Filmtopia</w:t>
-      </w:r>
-      <w:proofErr w:type="spellEnd"/>
-      <w:r>
-        <w:t xml:space="preserve"> during an evening showing to observe how the current system operates in practice. Rather than asking questions or interrupting the workflow I simply watched how staff handled customers during the pre-screening period when the cinema was at its busiest. The aim was to see the existing system in action and to identify any problems that might not have come up during the interviews or questionnaire.</w:t>
+        <w:t>As part of the investigation I visited Filmtopia during an evening showing to observe how the current system operates in practice. Rather than asking questions or interrupting the workflow I simply watched how staff handled customers during the pre-screening period when the cinema was at its busiest. The aim was to see the existing system in action and to identify any problems that might not have come up during the interviews or questionnaire.</w:t>
       </w:r>
     </w:p>
     <w:p>
@@ -3467,6 +3266,7 @@
         <w:spacing w:line="276" w:lineRule="auto"/>
       </w:pPr>
       <w:r>
+        <w:lastRenderedPageBreak/>
         <w:t>It was also clear that customers who had already used the kiosk to order food and drinks were then joining the box office queue to buy their tickets separately. This meant some customers were effectively queuing twice before they could take their seat. During the observation period this happened repeatedly and on a couple of occasions customers waiting in the box office queue made comments about having already waited at the kiosk. This confirmed what the staff interviews had suggested about the kiosk and ticketing systems being completely disconnected from each other.</w:t>
       </w:r>
     </w:p>
@@ -3483,278 +3283,76 @@
         <w:spacing w:line="276" w:lineRule="auto"/>
       </w:pPr>
       <w:r>
+        <w:t>Overall the observation confirmed and added detail to the problems that had already been identified through the interviews and questionnaire. Seeing the existing system in action made it clear that the issues are not occasional or minor but are a regular feature of how the cinema operates during busy periods. The findings from this observation have directly informed the objectives set out later in this investigation.</w:t>
+      </w:r>
+    </w:p>
+    <w:p>
+      <w:pPr>
+        <w:pStyle w:val="Heading3"/>
+        <w:rPr>
+          <w:b/>
+          <w:bCs/>
+          <w:color w:val="000000" w:themeColor="text1"/>
+        </w:rPr>
+      </w:pPr>
+      <w:r>
+        <w:rPr>
+          <w:b/>
+          <w:bCs/>
+          <w:color w:val="000000" w:themeColor="text1"/>
+        </w:rPr>
+        <w:t>Records and Documents Examined</w:t>
+      </w:r>
+    </w:p>
+    <w:p>
+      <w:pPr>
+        <w:spacing w:line="276" w:lineRule="auto"/>
+      </w:pPr>
+      <w:r>
+        <w:t>Alongside the interviews, questionnaire and observation I also asked to look at the actual records and documents that the cinema uses day to day. Looking at the real paperwork is useful because it shows exactly what data is being captured at the moment, and it often reveals small details that nobody thinks to mention in an interview simply because they are so used to them. Four documents were examined and each one is described below.</w:t>
+      </w:r>
+    </w:p>
+    <w:p>
+      <w:pPr>
+        <w:pStyle w:val="Heading4"/>
+        <w:rPr>
+          <w:b/>
+          <w:bCs/>
+          <w:color w:val="000000" w:themeColor="text1"/>
+        </w:rPr>
+      </w:pPr>
+      <w:r>
+        <w:rPr>
+          <w:b/>
+          <w:bCs/>
+          <w:color w:val="000000" w:themeColor="text1"/>
+        </w:rPr>
         <w:lastRenderedPageBreak/>
-        <w:t>Overall the observation confirmed and added detail to the problems that had already been identified through the interviews and questionnaire. Seeing the existing system in action made it clear that the issues are not occasional or minor but are a regular feature of how the cinema operates during busy periods. The findings from this observation have directly informed the objectives set out later in this investigation.</w:t>
-      </w:r>
-    </w:p>
-    <w:p>
-      <w:pPr>
-        <w:pStyle w:val="Heading3"/>
-        <w:rPr>
-          <w:b/>
-          <w:bCs/>
-          <w:color w:val="000000" w:themeColor="text1"/>
-        </w:rPr>
-      </w:pPr>
-      <w:r>
-        <w:rPr>
-          <w:b/>
-          <w:bCs/>
-          <w:color w:val="000000" w:themeColor="text1"/>
-        </w:rPr>
-        <w:t>Records and Documents Examined</w:t>
-      </w:r>
-    </w:p>
-    <w:p>
-      <w:pPr>
-        <w:spacing w:line="276" w:lineRule="auto"/>
-      </w:pPr>
-      <w:r>
-        <w:t>Alongside the interviews, questionnaire and observation I also asked to look at the actual records and documents that the cinema uses day to day. Looking at the real paperwork is useful because it shows exactly what data is being captured at the moment, and it often reveals small details that nobody thinks to mention in an interview simply because they are so used to them. Four documents were examined and each one is described below.</w:t>
-      </w:r>
-    </w:p>
-    <w:p>
-      <w:pPr>
-        <w:pStyle w:val="Heading4"/>
-        <w:rPr>
-          <w:b/>
-          <w:bCs/>
-          <w:color w:val="000000" w:themeColor="text1"/>
-        </w:rPr>
-      </w:pPr>
-      <w:r>
-        <w:rPr>
-          <w:b/>
-          <w:bCs/>
-          <w:color w:val="000000" w:themeColor="text1"/>
-        </w:rPr>
         <w:t>The Paper Booking Diary</w:t>
       </w:r>
     </w:p>
     <w:p>
       <w:pPr>
-        <w:shd w:val="clear" w:color="auto" w:fill="F2F2F2"/>
-        <w:spacing w:before="100" w:after="140"/>
-      </w:pPr>
-      <w:r>
+        <w:spacing w:line="276" w:lineRule="auto"/>
+        <w:jc w:val="center"/>
         <w:rPr>
           <w:i/>
           <w:iCs/>
           <w:color w:val="666666"/>
         </w:rPr>
-        <w:t>[ Insert photo of the paper booking diary, ideally a page showing a day's bookings ]</w:t>
-      </w:r>
-    </w:p>
-    <w:p>
-      <w:pPr>
-        <w:spacing w:line="276" w:lineRule="auto"/>
-      </w:pPr>
-      <w:r>
-        <w:t>The first document I examined was the paper booking diary. Each day is given its own page and bookings are written in by hand as customers arrive, with the customer name, the film, the screening time and the number of tickets noted down, and a seat number sometimes squeezed into the margin. There is no fixed structure to how a booking is recorded, so the level of detail varies from one entry to the next depending on which member of staff took it. This immediately showed me why seat clashes happen, because there is no clear column or layout showing which seats have already gone for a particular screening, so a member of staff has no quick way of checking before promising a seat to a customer.</w:t>
-      </w:r>
-    </w:p>
-    <w:p>
-      <w:pPr>
-        <w:pStyle w:val="Heading4"/>
-        <w:rPr>
-          <w:b/>
-          <w:bCs/>
-          <w:color w:val="000000" w:themeColor="text1"/>
-        </w:rPr>
-      </w:pPr>
-      <w:r>
-        <w:rPr>
-          <w:b/>
-          <w:bCs/>
-          <w:color w:val="000000" w:themeColor="text1"/>
-        </w:rPr>
-        <w:t>The Food and Drink Stock Spreadsheet</w:t>
-      </w:r>
-    </w:p>
-    <w:p>
-      <w:pPr>
-        <w:shd w:val="clear" w:color="auto" w:fill="F2F2F2"/>
-        <w:spacing w:before="100" w:after="140"/>
       </w:pPr>
       <w:r>
         <w:rPr>
           <w:i/>
           <w:iCs/>
+          <w:noProof/>
           <w:color w:val="666666"/>
         </w:rPr>
-        <w:t>[ Insert screenshot or photo of the stock spreadsheet ]</w:t>
-      </w:r>
-    </w:p>
-    <w:p>
-      <w:pPr>
-        <w:spacing w:line="276" w:lineRule="auto"/>
-      </w:pPr>
-      <w:r>
-        <w:t>The second document was the spreadsheet used to track food and drink stock. It lists each item alongside a quantity that the manager updates by hand after a manual stock count. Because the figures are only correct as of the last time someone counted, the spreadsheet is rarely an accurate picture of what is actually in the building, and nothing about it is linked to what gets sold at the concessions area or the kiosk. Seeing it confirmed how disconnected the stock side of the business is from everything else.</w:t>
-      </w:r>
-    </w:p>
-    <w:p>
-      <w:pPr>
-        <w:pStyle w:val="Heading4"/>
-        <w:rPr>
-          <w:b/>
-          <w:bCs/>
-          <w:color w:val="000000" w:themeColor="text1"/>
-        </w:rPr>
-      </w:pPr>
-      <w:r>
-        <w:rPr>
-          <w:b/>
-          <w:bCs/>
-          <w:color w:val="000000" w:themeColor="text1"/>
-        </w:rPr>
-        <w:t>The Staff Rota Spreadsheet</w:t>
-      </w:r>
-    </w:p>
-    <w:p>
-      <w:pPr>
-        <w:shd w:val="clear" w:color="auto" w:fill="F2F2F2"/>
-        <w:spacing w:before="100" w:after="140"/>
-      </w:pPr>
-      <w:r>
-        <w:rPr>
-          <w:i/>
-          <w:iCs/>
-          <w:color w:val="666666"/>
-        </w:rPr>
-        <w:t>[ Insert screenshot or photo of the staff rota spreadsheet ]</w:t>
-      </w:r>
-    </w:p>
-    <w:p>
-      <w:pPr>
-        <w:spacing w:line="276" w:lineRule="auto"/>
-      </w:pPr>
-      <w:r>
-        <w:t xml:space="preserve">The third document was the staff rota spreadsheet, which the manager fills in and prints out for the team. It is kept completely separate from the booking and stock records, and the only way for a member of staff to check when they are working is to be physically at the </w:t>
-      </w:r>
-      <w:r>
-        <w:lastRenderedPageBreak/>
-        <w:t>cinema where the printout is pinned up. While staff scheduling is not a core part of the problem this project is solving, looking at the rota helped confirm just how scattered the cinema's information is across separate files that do not talk to each other.</w:t>
-      </w:r>
-    </w:p>
-    <w:p>
-      <w:pPr>
-        <w:pStyle w:val="Heading4"/>
-        <w:rPr>
-          <w:b/>
-          <w:bCs/>
-          <w:color w:val="000000" w:themeColor="text1"/>
-        </w:rPr>
-      </w:pPr>
-      <w:r>
-        <w:rPr>
-          <w:b/>
-          <w:bCs/>
-          <w:color w:val="000000" w:themeColor="text1"/>
-        </w:rPr>
-        <w:t>The Ticket Stub</w:t>
-      </w:r>
-    </w:p>
-    <w:p>
-      <w:pPr>
-        <w:shd w:val="clear" w:color="auto" w:fill="F2F2F2"/>
-        <w:spacing w:before="100" w:after="140"/>
-      </w:pPr>
-      <w:r>
-        <w:rPr>
-          <w:i/>
-          <w:iCs/>
-          <w:color w:val="666666"/>
-        </w:rPr>
-        <w:t>[ Insert photo or scan of a printed ticket stub ]</w:t>
-      </w:r>
-    </w:p>
-    <w:p>
-      <w:pPr>
-        <w:spacing w:line="276" w:lineRule="auto"/>
-      </w:pPr>
-      <w:r>
-        <w:t>Finally I looked at the ticket stub that customers are given when they book. It is printed from a basic template on the box office computer, and a member of staff types the details in by hand each time before printing. The stub is not connected to any stored record, so once it has been printed there is no link between the piece of paper the customer is holding and any data the cinema keeps. This means a lost or disputed ticket cannot easily be checked against anything, which is another consequence of there being no central record of bookings.</w:t>
-      </w:r>
-    </w:p>
-    <w:p>
-      <w:pPr>
-        <w:spacing w:line="276" w:lineRule="auto"/>
-      </w:pPr>
-      <w:r>
-        <w:t>Taken together these documents painted a clear picture of a business whose data lives in several separate places, none of which are joined up. This directly supports the case for a single central database made later in this investigation, and it reinforces the double booking problem that the seat handling in Objectives 2 and 3 is designed to solve.</w:t>
-      </w:r>
-    </w:p>
-    <w:p>
-      <w:pPr>
-        <w:pStyle w:val="Heading3"/>
-        <w:rPr>
-          <w:b/>
-          <w:bCs/>
-          <w:color w:val="000000" w:themeColor="text1"/>
-        </w:rPr>
-      </w:pPr>
-      <w:r>
-        <w:rPr>
-          <w:b/>
-          <w:bCs/>
-          <w:color w:val="000000" w:themeColor="text1"/>
-        </w:rPr>
-        <w:t>Desk-based Research</w:t>
-      </w:r>
-    </w:p>
-    <w:p>
-      <w:pPr>
-        <w:pStyle w:val="Heading4"/>
-        <w:rPr>
-          <w:b/>
-          <w:bCs/>
-          <w:color w:val="000000" w:themeColor="text1"/>
-        </w:rPr>
-      </w:pPr>
-      <w:r>
-        <w:rPr>
-          <w:b/>
-          <w:bCs/>
-          <w:color w:val="000000" w:themeColor="text1"/>
-        </w:rPr>
-        <w:t>Desk Based Research - Vue Cinema (myvue.com)</w:t>
-      </w:r>
-    </w:p>
-    <w:p>
-      <w:pPr>
-        <w:spacing w:line="276" w:lineRule="auto"/>
-      </w:pPr>
-      <w:r>
-        <w:t>As part of my investigation I researched the Vue Cinema booking system, which is one of the largest cinema chains in the UK. Vue operates 94 cinemas across the UK and Ireland and their online booking system provides a useful reference point for what a professional cinema management system should look like.</w:t>
-      </w:r>
-    </w:p>
-    <w:p>
-      <w:pPr>
-        <w:spacing w:before="80" w:after="40"/>
-      </w:pPr>
-      <w:r>
-        <w:rPr>
-          <w:b/>
-          <w:bCs/>
-        </w:rPr>
-        <w:t>Film Listings Page</w:t>
-      </w:r>
-    </w:p>
-    <w:p>
-      <w:pPr>
-        <w:spacing w:before="120"/>
-        <w:jc w:val="center"/>
-      </w:pPr>
-      <w:r>
-        <w:rPr>
-          <w:noProof/>
-        </w:rPr>
         <w:drawing>
-          <wp:inline distT="0" distB="0" distL="0" distR="0" wp14:anchorId="1D0AA7F7" wp14:editId="3CDA7A8F">
-            <wp:extent cx="5524500" cy="2533650"/>
-            <wp:effectExtent l="0" t="0" r="0" b="0"/>
-            <wp:docPr id="1" name="Picture 1"/>
+          <wp:inline distT="0" distB="0" distL="0" distR="0" wp14:anchorId="3A21A1BE" wp14:editId="45B62F6F">
+            <wp:extent cx="2468880" cy="3291840"/>
+            <wp:effectExtent l="0" t="0" r="7620" b="3810"/>
+            <wp:docPr id="1849664123" name="Picture 2"/>
             <wp:cNvGraphicFramePr>
               <a:graphicFrameLocks xmlns:a="http://schemas.openxmlformats.org/drawingml/2006/main" noChangeAspect="1"/>
             </wp:cNvGraphicFramePr>
@@ -3762,13 +3360,19 @@
               <a:graphicData uri="http://schemas.openxmlformats.org/drawingml/2006/picture">
                 <pic:pic xmlns:pic="http://schemas.openxmlformats.org/drawingml/2006/picture">
                   <pic:nvPicPr>
-                    <pic:cNvPr id="0" name=""/>
+                    <pic:cNvPr id="0" name="Picture 3"/>
                     <pic:cNvPicPr>
                       <a:picLocks noChangeAspect="1" noChangeArrowheads="1"/>
                     </pic:cNvPicPr>
                   </pic:nvPicPr>
                   <pic:blipFill>
-                    <a:blip r:embed="rId8"/>
+                    <a:blip r:embed="rId9" cstate="print">
+                      <a:extLst>
+                        <a:ext uri="{28A0092B-C50C-407E-A947-70E740481C1C}">
+                          <a14:useLocalDpi xmlns:a14="http://schemas.microsoft.com/office/drawing/2010/main" val="0"/>
+                        </a:ext>
+                      </a:extLst>
+                    </a:blip>
                     <a:srcRect/>
                     <a:stretch>
                       <a:fillRect/>
@@ -3777,11 +3381,15 @@
                   <pic:spPr bwMode="auto">
                     <a:xfrm>
                       <a:off x="0" y="0"/>
-                      <a:ext cx="5524500" cy="2533650"/>
+                      <a:ext cx="2468880" cy="3291840"/>
                     </a:xfrm>
                     <a:prstGeom prst="rect">
                       <a:avLst/>
                     </a:prstGeom>
+                    <a:noFill/>
+                    <a:ln>
+                      <a:noFill/>
+                    </a:ln>
                   </pic:spPr>
                 </pic:pic>
               </a:graphicData>
@@ -3792,39 +3400,183 @@
     </w:p>
     <w:p>
       <w:pPr>
-        <w:spacing w:after="200"/>
-        <w:jc w:val="center"/>
-        <w:rPr>
-          <w:lang w:val="fr-FR"/>
-        </w:rPr>
+        <w:spacing w:line="276" w:lineRule="auto"/>
+      </w:pPr>
+      <w:r>
+        <w:t>The first document I examined was the paper booking diary. Each day is given its own page and bookings are written in by hand as customers arrive, with the customer name, the film, the screening time and the number of tickets noted down, and a seat number sometimes squeezed into the margin. There is no fixed structure to how a booking is recorded, so the level of detail varies from one entry to the next depending on which member of staff took it. This immediately showed me why seat clashes happen, because there is no clear column or layout showing which seats have already gone for a particular screening, so a member of staff has no quick way of checking before promising a seat to a customer.</w:t>
+      </w:r>
+    </w:p>
+    <w:p>
+      <w:pPr>
+        <w:pStyle w:val="Heading4"/>
+        <w:rPr>
+          <w:b/>
+          <w:bCs/>
+          <w:color w:val="000000" w:themeColor="text1"/>
+        </w:rPr>
+      </w:pPr>
+      <w:r>
+        <w:rPr>
+          <w:b/>
+          <w:bCs/>
+          <w:color w:val="000000" w:themeColor="text1"/>
+        </w:rPr>
+        <w:t>The Food and Drink Stock Spreadsheet</w:t>
+      </w:r>
+    </w:p>
+    <w:p>
+      <w:pPr>
+        <w:shd w:val="clear" w:color="auto" w:fill="F2F2F2"/>
+        <w:spacing w:before="100" w:after="140"/>
       </w:pPr>
       <w:r>
         <w:rPr>
           <w:i/>
           <w:iCs/>
-          <w:color w:val="595959"/>
-          <w:sz w:val="20"/>
-          <w:szCs w:val="20"/>
-          <w:lang w:val="fr-FR"/>
-        </w:rPr>
+          <w:color w:val="666666"/>
+        </w:rPr>
+        <w:t>[ Insert screenshot or photo of the stock spreadsheet ]</w:t>
+      </w:r>
+    </w:p>
+    <w:p>
+      <w:pPr>
+        <w:spacing w:line="276" w:lineRule="auto"/>
+      </w:pPr>
+      <w:r>
+        <w:t>The second document was the spreadsheet used to track food and drink stock. It lists each item alongside a quantity that the manager updates by hand after a manual stock count. Because the figures are only correct as of the last time someone counted, the spreadsheet is rarely an accurate picture of what is actually in the building, and nothing about it is linked to what gets sold at the concessions area or the kiosk. Seeing it confirmed how disconnected the stock side of the business is from everything else.</w:t>
+      </w:r>
+    </w:p>
+    <w:p>
+      <w:pPr>
+        <w:pStyle w:val="Heading4"/>
+        <w:rPr>
+          <w:b/>
+          <w:bCs/>
+          <w:color w:val="000000" w:themeColor="text1"/>
+        </w:rPr>
+      </w:pPr>
+      <w:r>
+        <w:rPr>
+          <w:b/>
+          <w:bCs/>
+          <w:color w:val="000000" w:themeColor="text1"/>
+        </w:rPr>
+        <w:t>The Staff Rota Spreadsheet</w:t>
+      </w:r>
+    </w:p>
+    <w:p>
+      <w:pPr>
+        <w:shd w:val="clear" w:color="auto" w:fill="F2F2F2"/>
+        <w:spacing w:before="100" w:after="140"/>
+      </w:pPr>
+      <w:r>
+        <w:rPr>
+          <w:i/>
+          <w:iCs/>
+          <w:color w:val="666666"/>
+        </w:rPr>
+        <w:t>[ Insert screenshot or photo of the staff rota spreadsheet ]</w:t>
+      </w:r>
+    </w:p>
+    <w:p>
+      <w:pPr>
+        <w:spacing w:line="276" w:lineRule="auto"/>
+      </w:pPr>
+      <w:r>
         <w:lastRenderedPageBreak/>
-        <w:t>Figure 1: Vue film listings page (myvue.com)</w:t>
-      </w:r>
-    </w:p>
-    <w:p>
-      <w:pPr>
-        <w:spacing w:line="276" w:lineRule="auto"/>
-      </w:pPr>
-      <w:r>
-        <w:t xml:space="preserve">The Vue homepage presents films visually using large poster images organised under a Top Films heading. Each film is displayed with its title clearly beneath it and the page includes a Quick Book bar at the bottom allowing users to search by venue, film, date and time simultaneously. This is a clean and intuitive way of presenting information that allows customers to find what they want quickly without having to navigate through multiple pages. For the </w:t>
-      </w:r>
-      <w:proofErr w:type="spellStart"/>
-      <w:r>
-        <w:t>Filmtopia</w:t>
-      </w:r>
-      <w:proofErr w:type="spellEnd"/>
-      <w:r>
-        <w:t xml:space="preserve"> system I will incorporate a similar visual approach to displaying films on the customer kiosk, ensuring that screenings are easy to browse and select.</w:t>
+        <w:t>The third document was the staff rota spreadsheet, which the manager fills in and prints out for the team. It is kept completely separate from the booking and stock records, and the only way for a member of staff to check when they are working is to be physically at the cinema where the printout is pinned up. While staff scheduling is not a core part of the problem this project is solving, looking at the rota helped confirm just how scattered the cinema's information is across separate files that do not talk to each other.</w:t>
+      </w:r>
+    </w:p>
+    <w:p>
+      <w:pPr>
+        <w:pStyle w:val="Heading4"/>
+        <w:rPr>
+          <w:b/>
+          <w:bCs/>
+          <w:color w:val="000000" w:themeColor="text1"/>
+        </w:rPr>
+      </w:pPr>
+      <w:r>
+        <w:rPr>
+          <w:b/>
+          <w:bCs/>
+          <w:color w:val="000000" w:themeColor="text1"/>
+        </w:rPr>
+        <w:t>The Ticket Stub</w:t>
+      </w:r>
+    </w:p>
+    <w:p>
+      <w:pPr>
+        <w:shd w:val="clear" w:color="auto" w:fill="F2F2F2"/>
+        <w:spacing w:before="100" w:after="140"/>
+      </w:pPr>
+      <w:r>
+        <w:rPr>
+          <w:i/>
+          <w:iCs/>
+          <w:color w:val="666666"/>
+        </w:rPr>
+        <w:t>[ Insert photo or scan of a printed ticket stub ]</w:t>
+      </w:r>
+    </w:p>
+    <w:p>
+      <w:pPr>
+        <w:spacing w:line="276" w:lineRule="auto"/>
+      </w:pPr>
+      <w:r>
+        <w:t>Finally I looked at the ticket stub that customers are given when they book. It is printed from a basic template on the box office computer, and a member of staff types the details in by hand each time before printing. The stub is not connected to any stored record, so once it has been printed there is no link between the piece of paper the customer is holding and any data the cinema keeps. This means a lost or disputed ticket cannot easily be checked against anything, which is another consequence of there being no central record of bookings.</w:t>
+      </w:r>
+    </w:p>
+    <w:p>
+      <w:pPr>
+        <w:spacing w:line="276" w:lineRule="auto"/>
+      </w:pPr>
+      <w:r>
+        <w:t>Taken together these documents painted a clear picture of a business whose data lives in several separate places, none of which are joined up. This directly supports the case for a single central database made later in this investigation, and it reinforces the double booking problem that the seat handling in Objectives 2 and 3 is designed to solve.</w:t>
+      </w:r>
+    </w:p>
+    <w:p>
+      <w:pPr>
+        <w:pStyle w:val="Heading3"/>
+        <w:rPr>
+          <w:b/>
+          <w:bCs/>
+          <w:color w:val="000000" w:themeColor="text1"/>
+        </w:rPr>
+      </w:pPr>
+      <w:r>
+        <w:rPr>
+          <w:b/>
+          <w:bCs/>
+          <w:color w:val="000000" w:themeColor="text1"/>
+        </w:rPr>
+        <w:t>Desk-based Research</w:t>
+      </w:r>
+    </w:p>
+    <w:p>
+      <w:pPr>
+        <w:pStyle w:val="Heading4"/>
+        <w:rPr>
+          <w:b/>
+          <w:bCs/>
+          <w:color w:val="000000" w:themeColor="text1"/>
+        </w:rPr>
+      </w:pPr>
+      <w:r>
+        <w:rPr>
+          <w:b/>
+          <w:bCs/>
+          <w:color w:val="000000" w:themeColor="text1"/>
+        </w:rPr>
+        <w:t>Desk Based Research - Vue Cinema (myvue.com)</w:t>
+      </w:r>
+    </w:p>
+    <w:p>
+      <w:pPr>
+        <w:spacing w:line="276" w:lineRule="auto"/>
+      </w:pPr>
+      <w:r>
+        <w:t>As part of my investigation I researched the Vue Cinema booking system, which is one of the largest cinema chains in the UK. Vue operates 94 cinemas across the UK and Ireland and their online booking system provides a useful reference point for what a professional cinema management system should look like.</w:t>
       </w:r>
     </w:p>
     <w:p>
@@ -3836,7 +3588,7 @@
           <w:b/>
           <w:bCs/>
         </w:rPr>
-        <w:t>Screening Times Page</w:t>
+        <w:t>Film Listings Page</w:t>
       </w:r>
     </w:p>
     <w:p>
@@ -3848,105 +3600,12 @@
         <w:rPr>
           <w:noProof/>
         </w:rPr>
+        <w:lastRenderedPageBreak/>
         <w:drawing>
-          <wp:inline distT="0" distB="0" distL="0" distR="0" wp14:anchorId="249C92E6" wp14:editId="25BC37F4">
-            <wp:extent cx="4381500" cy="3914775"/>
+          <wp:inline distT="0" distB="0" distL="0" distR="0" wp14:anchorId="1D0AA7F7" wp14:editId="3CDA7A8F">
+            <wp:extent cx="5524500" cy="2533650"/>
             <wp:effectExtent l="0" t="0" r="0" b="0"/>
-            <wp:docPr id="1144634544" name="Picture 1144634544"/>
-            <wp:cNvGraphicFramePr>
-              <a:graphicFrameLocks xmlns:a="http://schemas.openxmlformats.org/drawingml/2006/main" noChangeAspect="1"/>
-            </wp:cNvGraphicFramePr>
-            <a:graphic xmlns:a="http://schemas.openxmlformats.org/drawingml/2006/main">
-              <a:graphicData uri="http://schemas.openxmlformats.org/drawingml/2006/picture">
-                <pic:pic xmlns:pic="http://schemas.openxmlformats.org/drawingml/2006/picture">
-                  <pic:nvPicPr>
-                    <pic:cNvPr id="0" name=""/>
-                    <pic:cNvPicPr>
-                      <a:picLocks noChangeAspect="1" noChangeArrowheads="1"/>
-                    </pic:cNvPicPr>
-                  </pic:nvPicPr>
-                  <pic:blipFill>
-                    <a:blip r:embed="rId9"/>
-                    <a:srcRect/>
-                    <a:stretch>
-                      <a:fillRect/>
-                    </a:stretch>
-                  </pic:blipFill>
-                  <pic:spPr bwMode="auto">
-                    <a:xfrm>
-                      <a:off x="0" y="0"/>
-                      <a:ext cx="4381500" cy="3914775"/>
-                    </a:xfrm>
-                    <a:prstGeom prst="rect">
-                      <a:avLst/>
-                    </a:prstGeom>
-                  </pic:spPr>
-                </pic:pic>
-              </a:graphicData>
-            </a:graphic>
-          </wp:inline>
-        </w:drawing>
-      </w:r>
-    </w:p>
-    <w:p>
-      <w:pPr>
-        <w:spacing w:after="200"/>
-        <w:jc w:val="center"/>
-      </w:pPr>
-      <w:r>
-        <w:rPr>
-          <w:i/>
-          <w:iCs/>
-          <w:color w:val="595959"/>
-          <w:sz w:val="20"/>
-          <w:szCs w:val="20"/>
-        </w:rPr>
-        <w:t>Figure 2: Vue screening times page (myvue.com)</w:t>
-      </w:r>
-    </w:p>
-    <w:p>
-      <w:pPr>
-        <w:spacing w:line="276" w:lineRule="auto"/>
-      </w:pPr>
-      <w:r>
-        <w:t xml:space="preserve">When a film is selected Vue displays all upcoming showings for that film at the chosen venue, organised by date and time. Each screening card shows the start and end time, the screen number and the ticket price. Accessibility information such as audio description and wheelchair access is also clearly displayed. This level of detail is something I aim to replicate in </w:t>
-      </w:r>
-      <w:proofErr w:type="spellStart"/>
-      <w:r>
-        <w:t>Filmtopia</w:t>
-      </w:r>
-      <w:proofErr w:type="spellEnd"/>
-      <w:r>
-        <w:t>, where staff and customers should be able to see all relevant information about a screening at a glance without having to search through multiple menus.</w:t>
-      </w:r>
-    </w:p>
-    <w:p>
-      <w:pPr>
-        <w:spacing w:before="80" w:after="40"/>
-      </w:pPr>
-      <w:r>
-        <w:rPr>
-          <w:b/>
-          <w:bCs/>
-        </w:rPr>
-        <w:lastRenderedPageBreak/>
-        <w:t>Seat Selection Screen</w:t>
-      </w:r>
-    </w:p>
-    <w:p>
-      <w:pPr>
-        <w:spacing w:before="120"/>
-        <w:jc w:val="center"/>
-      </w:pPr>
-      <w:r>
-        <w:rPr>
-          <w:noProof/>
-        </w:rPr>
-        <w:drawing>
-          <wp:inline distT="0" distB="0" distL="0" distR="0" wp14:anchorId="40BB6089" wp14:editId="6F7339E3">
-            <wp:extent cx="5524500" cy="2809875"/>
-            <wp:effectExtent l="0" t="0" r="0" b="0"/>
-            <wp:docPr id="1968098163" name="Picture 1968098163"/>
+            <wp:docPr id="1" name="Picture 1"/>
             <wp:cNvGraphicFramePr>
               <a:graphicFrameLocks xmlns:a="http://schemas.openxmlformats.org/drawingml/2006/main" noChangeAspect="1"/>
             </wp:cNvGraphicFramePr>
@@ -3969,7 +3628,7 @@
                   <pic:spPr bwMode="auto">
                     <a:xfrm>
                       <a:off x="0" y="0"/>
-                      <a:ext cx="5524500" cy="2809875"/>
+                      <a:ext cx="5524500" cy="2533650"/>
                     </a:xfrm>
                     <a:prstGeom prst="rect">
                       <a:avLst/>
@@ -3986,6 +3645,9 @@
       <w:pPr>
         <w:spacing w:after="200"/>
         <w:jc w:val="center"/>
+        <w:rPr>
+          <w:lang w:val="fr-FR"/>
+        </w:rPr>
       </w:pPr>
       <w:r>
         <w:rPr>
@@ -3994,24 +3656,17 @@
           <w:color w:val="595959"/>
           <w:sz w:val="20"/>
           <w:szCs w:val="20"/>
-        </w:rPr>
-        <w:t>Figure 3: Vue graphical seat selection screen (myvue.com)</w:t>
-      </w:r>
-    </w:p>
-    <w:p>
-      <w:pPr>
-        <w:spacing w:line="276" w:lineRule="auto"/>
-      </w:pPr>
-      <w:r>
-        <w:t xml:space="preserve">Vue's seat selection interface is a standout feature of their system. It displays a graphical layout of the screen showing every seat as a coloured icon, with different colours representing different seat types and prices. VIP seats are shown in orange at £8.49, Regular seats in black at £7.49, Saver seats in green at £6.49 and Super Saver seats in red at £4.99. Occupied seats are shown in grey so customers can immediately see what is available. Rows are labelled alphabetically on the left hand side. This graphical seat selection is a key feature I plan to implement in </w:t>
-      </w:r>
-      <w:proofErr w:type="spellStart"/>
-      <w:r>
-        <w:t>Filmtopia</w:t>
-      </w:r>
-      <w:proofErr w:type="spellEnd"/>
-      <w:r>
-        <w:t xml:space="preserve"> as it directly addresses the double booking problem identified in the interviews. By showing customers and staff exactly which seats are taken in real time the system eliminates the risk of two people being assigned the same seat.</w:t>
+          <w:lang w:val="fr-FR"/>
+        </w:rPr>
+        <w:t>Figure 1: Vue film listings page (myvue.com)</w:t>
+      </w:r>
+    </w:p>
+    <w:p>
+      <w:pPr>
+        <w:spacing w:line="276" w:lineRule="auto"/>
+      </w:pPr>
+      <w:r>
+        <w:t>The Vue homepage presents films visually using large poster images organised under a Top Films heading. Each film is displayed with its title clearly beneath it and the page includes a Quick Book bar at the bottom allowing users to search by venue, film, date and time simultaneously. This is a clean and intuitive way of presenting information that allows customers to find what they want quickly without having to navigate through multiple pages. For the Filmtopia system I will incorporate a similar visual approach to displaying films on the customer kiosk, ensuring that screenings are easy to browse and select.</w:t>
       </w:r>
     </w:p>
     <w:p>
@@ -4023,136 +3678,7 @@
           <w:b/>
           <w:bCs/>
         </w:rPr>
-        <w:t xml:space="preserve">Features Identified for </w:t>
-      </w:r>
-      <w:proofErr w:type="spellStart"/>
-      <w:r>
-        <w:rPr>
-          <w:b/>
-          <w:bCs/>
-        </w:rPr>
-        <w:t>Filmtopia</w:t>
-      </w:r>
-      <w:proofErr w:type="spellEnd"/>
-    </w:p>
-    <w:p>
-      <w:pPr>
-        <w:pStyle w:val="ListParagraph"/>
-        <w:numPr>
-          <w:ilvl w:val="0"/>
-          <w:numId w:val="1"/>
-        </w:numPr>
-        <w:spacing w:after="60" w:line="276" w:lineRule="auto"/>
-        <w:contextualSpacing w:val="0"/>
-      </w:pPr>
-      <w:r>
-        <w:t>A visual film listings interface showing posters and screening times clearly</w:t>
-      </w:r>
-    </w:p>
-    <w:p>
-      <w:pPr>
-        <w:pStyle w:val="ListParagraph"/>
-        <w:numPr>
-          <w:ilvl w:val="0"/>
-          <w:numId w:val="1"/>
-        </w:numPr>
-        <w:spacing w:after="60" w:line="276" w:lineRule="auto"/>
-        <w:contextualSpacing w:val="0"/>
-      </w:pPr>
-      <w:r>
-        <w:t>A graphical seat map showing available and occupied seats in real time</w:t>
-      </w:r>
-    </w:p>
-    <w:p>
-      <w:pPr>
-        <w:pStyle w:val="ListParagraph"/>
-        <w:numPr>
-          <w:ilvl w:val="0"/>
-          <w:numId w:val="1"/>
-        </w:numPr>
-        <w:spacing w:after="60" w:line="276" w:lineRule="auto"/>
-        <w:contextualSpacing w:val="0"/>
-      </w:pPr>
-      <w:r>
-        <w:t>Colour coding to distinguish between different types of seats or statuses</w:t>
-      </w:r>
-    </w:p>
-    <w:p>
-      <w:pPr>
-        <w:pStyle w:val="ListParagraph"/>
-        <w:numPr>
-          <w:ilvl w:val="0"/>
-          <w:numId w:val="1"/>
-        </w:numPr>
-        <w:spacing w:after="60" w:line="276" w:lineRule="auto"/>
-        <w:contextualSpacing w:val="0"/>
-      </w:pPr>
-      <w:r>
-        <w:t>Clear display of screening information including screen number, time and date</w:t>
-      </w:r>
-    </w:p>
-    <w:p>
-      <w:pPr>
-        <w:pStyle w:val="ListParagraph"/>
-        <w:numPr>
-          <w:ilvl w:val="0"/>
-          <w:numId w:val="1"/>
-        </w:numPr>
-        <w:spacing w:after="60" w:line="276" w:lineRule="auto"/>
-        <w:contextualSpacing w:val="0"/>
-      </w:pPr>
-      <w:r>
-        <w:t>A quick search function allowing users to find screenings by film, date and time</w:t>
-      </w:r>
-    </w:p>
-    <w:p>
-      <w:pPr>
-        <w:pStyle w:val="Heading4"/>
-        <w:rPr>
-          <w:b/>
-          <w:bCs/>
-          <w:color w:val="000000" w:themeColor="text1"/>
-        </w:rPr>
-      </w:pPr>
-      <w:r>
-        <w:rPr>
-          <w:b/>
-          <w:bCs/>
-          <w:color w:val="000000" w:themeColor="text1"/>
-        </w:rPr>
-        <w:t>Desk Based Research - Odeon Cinema (odeon.co.uk)</w:t>
-      </w:r>
-    </w:p>
-    <w:p>
-      <w:pPr>
-        <w:spacing w:line="276" w:lineRule="auto"/>
-      </w:pPr>
-      <w:r>
-        <w:t xml:space="preserve">The second system I researched was Odeon, which is the largest cinema chain in the UK. Odeon operates over 120 cinemas across the UK and Ireland and their online booking </w:t>
-      </w:r>
-      <w:r>
-        <w:lastRenderedPageBreak/>
-        <w:t xml:space="preserve">system offered several useful features to compare against Vue and to inform the design of </w:t>
-      </w:r>
-      <w:proofErr w:type="spellStart"/>
-      <w:r>
-        <w:t>Filmtopia</w:t>
-      </w:r>
-      <w:proofErr w:type="spellEnd"/>
-      <w:r>
-        <w:t>.</w:t>
-      </w:r>
-    </w:p>
-    <w:p>
-      <w:pPr>
-        <w:spacing w:before="80" w:after="40"/>
-      </w:pPr>
-      <w:r>
-        <w:rPr>
-          <w:b/>
-          <w:bCs/>
-        </w:rPr>
-        <w:t>Film Listings Page</w:t>
+        <w:t>Screening Times Page</w:t>
       </w:r>
     </w:p>
     <w:p>
@@ -4164,11 +3690,12 @@
         <w:rPr>
           <w:noProof/>
         </w:rPr>
+        <w:lastRenderedPageBreak/>
         <w:drawing>
-          <wp:inline distT="0" distB="0" distL="0" distR="0" wp14:anchorId="3280BCAA" wp14:editId="0FD2A1B3">
-            <wp:extent cx="4476750" cy="4381500"/>
+          <wp:inline distT="0" distB="0" distL="0" distR="0" wp14:anchorId="249C92E6" wp14:editId="25BC37F4">
+            <wp:extent cx="4381500" cy="3914775"/>
             <wp:effectExtent l="0" t="0" r="0" b="0"/>
-            <wp:docPr id="2009319500" name="Picture 2009319500"/>
+            <wp:docPr id="1144634544" name="Picture 1144634544"/>
             <wp:cNvGraphicFramePr>
               <a:graphicFrameLocks xmlns:a="http://schemas.openxmlformats.org/drawingml/2006/main" noChangeAspect="1"/>
             </wp:cNvGraphicFramePr>
@@ -4191,7 +3718,7 @@
                   <pic:spPr bwMode="auto">
                     <a:xfrm>
                       <a:off x="0" y="0"/>
-                      <a:ext cx="4476750" cy="4381500"/>
+                      <a:ext cx="4381500" cy="3914775"/>
                     </a:xfrm>
                     <a:prstGeom prst="rect">
                       <a:avLst/>
@@ -4217,23 +3744,15 @@
           <w:sz w:val="20"/>
           <w:szCs w:val="20"/>
         </w:rPr>
-        <w:t>Figure 4: Odeon film listings page (odeon.co.uk)</w:t>
-      </w:r>
-    </w:p>
-    <w:p>
-      <w:pPr>
-        <w:spacing w:line="276" w:lineRule="auto"/>
-      </w:pPr>
-      <w:r>
-        <w:t xml:space="preserve">Similar to Vue, Odeon presents films using large poster images organised under a Top Films heading. However Odeon includes additional information directly on the film page such as the director, cast, runtime, release date and genre tags. This richer level of detail gives customers more context before making a booking decision. Odeon also includes a quick search bar at the bottom of the page allowing users to filter by cinema, film, date and time. One notable difference from Vue is that Odeon uses a darker navy blue colour scheme throughout which creates a more premium feel. For </w:t>
-      </w:r>
-      <w:proofErr w:type="spellStart"/>
-      <w:r>
-        <w:t>Filmtopia</w:t>
-      </w:r>
-      <w:proofErr w:type="spellEnd"/>
-      <w:r>
-        <w:t xml:space="preserve"> I will aim to display key film information clearly on the customer kiosk so customers can make informed decisions quickly.</w:t>
+        <w:t>Figure 2: Vue screening times page (myvue.com)</w:t>
+      </w:r>
+    </w:p>
+    <w:p>
+      <w:pPr>
+        <w:spacing w:line="276" w:lineRule="auto"/>
+      </w:pPr>
+      <w:r>
+        <w:t>When a film is selected Vue displays all upcoming showings for that film at the chosen venue, organised by date and time. Each screening card shows the start and end time, the screen number and the ticket price. Accessibility information such as audio description and wheelchair access is also clearly displayed. This level of detail is something I aim to replicate in Filmtopia, where staff and customers should be able to see all relevant information about a screening at a glance without having to search through multiple menus.</w:t>
       </w:r>
     </w:p>
     <w:p>
@@ -4245,7 +3764,7 @@
           <w:b/>
           <w:bCs/>
         </w:rPr>
-        <w:t>Screening Times Page</w:t>
+        <w:t>Seat Selection Screen</w:t>
       </w:r>
     </w:p>
     <w:p>
@@ -4259,10 +3778,10 @@
         </w:rPr>
         <w:lastRenderedPageBreak/>
         <w:drawing>
-          <wp:inline distT="0" distB="0" distL="0" distR="0" wp14:anchorId="1E91FEA3" wp14:editId="61E265F1">
-            <wp:extent cx="4286250" cy="4343400"/>
+          <wp:inline distT="0" distB="0" distL="0" distR="0" wp14:anchorId="40BB6089" wp14:editId="6F7339E3">
+            <wp:extent cx="5524500" cy="2809875"/>
             <wp:effectExtent l="0" t="0" r="0" b="0"/>
-            <wp:docPr id="1339000641" name="Picture 1339000641"/>
+            <wp:docPr id="1968098163" name="Picture 1968098163"/>
             <wp:cNvGraphicFramePr>
               <a:graphicFrameLocks xmlns:a="http://schemas.openxmlformats.org/drawingml/2006/main" noChangeAspect="1"/>
             </wp:cNvGraphicFramePr>
@@ -4285,7 +3804,7 @@
                   <pic:spPr bwMode="auto">
                     <a:xfrm>
                       <a:off x="0" y="0"/>
-                      <a:ext cx="4286250" cy="4343400"/>
+                      <a:ext cx="5524500" cy="2809875"/>
                     </a:xfrm>
                     <a:prstGeom prst="rect">
                       <a:avLst/>
@@ -4311,23 +3830,15 @@
           <w:sz w:val="20"/>
           <w:szCs w:val="20"/>
         </w:rPr>
-        <w:t>Figure 5: Odeon screening times page (odeon.co.uk)</w:t>
-      </w:r>
-    </w:p>
-    <w:p>
-      <w:pPr>
-        <w:spacing w:line="276" w:lineRule="auto"/>
-      </w:pPr>
-      <w:r>
-        <w:t xml:space="preserve">Odeon's screening times page clearly displays the film title, runtime, release date and genre alongside all available showtimes. Screenings are organised by date across the top of the page and grouped by cinema location below. Each screening card shows the start time, screen number and format such as 3D. A Book Now button is displayed prominently on each card making the next action immediately obvious. This clear layout is something I will replicate in </w:t>
-      </w:r>
-      <w:proofErr w:type="spellStart"/>
-      <w:r>
-        <w:t>Filmtopia</w:t>
-      </w:r>
-      <w:proofErr w:type="spellEnd"/>
-      <w:r>
-        <w:t xml:space="preserve"> where staff should be able to see all screenings for a given film at a glance.</w:t>
+        <w:t>Figure 3: Vue graphical seat selection screen (myvue.com)</w:t>
+      </w:r>
+    </w:p>
+    <w:p>
+      <w:pPr>
+        <w:spacing w:line="276" w:lineRule="auto"/>
+      </w:pPr>
+      <w:r>
+        <w:t>Vue's seat selection interface is a standout feature of their system. It displays a graphical layout of the screen showing every seat as a coloured icon, with different colours representing different seat types and prices. VIP seats are shown in orange at £8.49, Regular seats in black at £7.49, Saver seats in green at £6.49 and Super Saver seats in red at £4.99. Occupied seats are shown in grey so customers can immediately see what is available. Rows are labelled alphabetically on the left hand side. This graphical seat selection is a key feature I plan to implement in Filmtopia as it directly addresses the double booking problem identified in the interviews. By showing customers and staff exactly which seats are taken in real time the system eliminates the risk of two people being assigned the same seat.</w:t>
       </w:r>
     </w:p>
     <w:p>
@@ -4339,7 +3850,116 @@
           <w:b/>
           <w:bCs/>
         </w:rPr>
-        <w:t>Seat Selection Screen</w:t>
+        <w:t>Features Identified for Filmtopia</w:t>
+      </w:r>
+    </w:p>
+    <w:p>
+      <w:pPr>
+        <w:pStyle w:val="ListParagraph"/>
+        <w:numPr>
+          <w:ilvl w:val="0"/>
+          <w:numId w:val="1"/>
+        </w:numPr>
+        <w:spacing w:after="60" w:line="276" w:lineRule="auto"/>
+        <w:contextualSpacing w:val="0"/>
+      </w:pPr>
+      <w:r>
+        <w:t>A visual film listings interface showing posters and screening times clearly</w:t>
+      </w:r>
+    </w:p>
+    <w:p>
+      <w:pPr>
+        <w:pStyle w:val="ListParagraph"/>
+        <w:numPr>
+          <w:ilvl w:val="0"/>
+          <w:numId w:val="1"/>
+        </w:numPr>
+        <w:spacing w:after="60" w:line="276" w:lineRule="auto"/>
+        <w:contextualSpacing w:val="0"/>
+      </w:pPr>
+      <w:r>
+        <w:t>A graphical seat map showing available and occupied seats in real time</w:t>
+      </w:r>
+    </w:p>
+    <w:p>
+      <w:pPr>
+        <w:pStyle w:val="ListParagraph"/>
+        <w:numPr>
+          <w:ilvl w:val="0"/>
+          <w:numId w:val="1"/>
+        </w:numPr>
+        <w:spacing w:after="60" w:line="276" w:lineRule="auto"/>
+        <w:contextualSpacing w:val="0"/>
+      </w:pPr>
+      <w:r>
+        <w:t>Colour coding to distinguish between different types of seats or statuses</w:t>
+      </w:r>
+    </w:p>
+    <w:p>
+      <w:pPr>
+        <w:pStyle w:val="ListParagraph"/>
+        <w:numPr>
+          <w:ilvl w:val="0"/>
+          <w:numId w:val="1"/>
+        </w:numPr>
+        <w:spacing w:after="60" w:line="276" w:lineRule="auto"/>
+        <w:contextualSpacing w:val="0"/>
+      </w:pPr>
+      <w:r>
+        <w:t>Clear display of screening information including screen number, time and date</w:t>
+      </w:r>
+    </w:p>
+    <w:p>
+      <w:pPr>
+        <w:pStyle w:val="ListParagraph"/>
+        <w:numPr>
+          <w:ilvl w:val="0"/>
+          <w:numId w:val="1"/>
+        </w:numPr>
+        <w:spacing w:after="60" w:line="276" w:lineRule="auto"/>
+        <w:contextualSpacing w:val="0"/>
+      </w:pPr>
+      <w:r>
+        <w:t>A quick search function allowing users to find screenings by film, date and time</w:t>
+      </w:r>
+    </w:p>
+    <w:p>
+      <w:pPr>
+        <w:pStyle w:val="Heading4"/>
+        <w:rPr>
+          <w:b/>
+          <w:bCs/>
+          <w:color w:val="000000" w:themeColor="text1"/>
+        </w:rPr>
+      </w:pPr>
+      <w:r>
+        <w:rPr>
+          <w:b/>
+          <w:bCs/>
+          <w:color w:val="000000" w:themeColor="text1"/>
+        </w:rPr>
+        <w:t>Desk Based Research - Odeon Cinema (odeon.co.uk)</w:t>
+      </w:r>
+    </w:p>
+    <w:p>
+      <w:pPr>
+        <w:spacing w:line="276" w:lineRule="auto"/>
+      </w:pPr>
+      <w:r>
+        <w:t>The second system I researched was Odeon, which is the largest cinema chain in the UK. Odeon operates over 120 cinemas across the UK and Ireland and their online booking system offered several useful features to compare against Vue and to inform the design of Filmtopia.</w:t>
+      </w:r>
+    </w:p>
+    <w:p>
+      <w:pPr>
+        <w:spacing w:before="80" w:after="40"/>
+      </w:pPr>
+      <w:r>
+        <w:rPr>
+          <w:b/>
+          <w:bCs/>
+        </w:rPr>
+        <w:lastRenderedPageBreak/>
+        <w:t>Film Listings Page</w:t>
       </w:r>
     </w:p>
     <w:p>
@@ -4351,12 +3971,11 @@
         <w:rPr>
           <w:noProof/>
         </w:rPr>
-        <w:lastRenderedPageBreak/>
         <w:drawing>
-          <wp:inline distT="0" distB="0" distL="0" distR="0" wp14:anchorId="456DA744" wp14:editId="1AB6B7F1">
-            <wp:extent cx="5143500" cy="4038600"/>
+          <wp:inline distT="0" distB="0" distL="0" distR="0" wp14:anchorId="3280BCAA" wp14:editId="0FD2A1B3">
+            <wp:extent cx="4476750" cy="4381500"/>
             <wp:effectExtent l="0" t="0" r="0" b="0"/>
-            <wp:docPr id="899379480" name="Picture 899379480"/>
+            <wp:docPr id="2009319500" name="Picture 2009319500"/>
             <wp:cNvGraphicFramePr>
               <a:graphicFrameLocks xmlns:a="http://schemas.openxmlformats.org/drawingml/2006/main" noChangeAspect="1"/>
             </wp:cNvGraphicFramePr>
@@ -4379,6 +3998,178 @@
                   <pic:spPr bwMode="auto">
                     <a:xfrm>
                       <a:off x="0" y="0"/>
+                      <a:ext cx="4476750" cy="4381500"/>
+                    </a:xfrm>
+                    <a:prstGeom prst="rect">
+                      <a:avLst/>
+                    </a:prstGeom>
+                  </pic:spPr>
+                </pic:pic>
+              </a:graphicData>
+            </a:graphic>
+          </wp:inline>
+        </w:drawing>
+      </w:r>
+    </w:p>
+    <w:p>
+      <w:pPr>
+        <w:spacing w:after="200"/>
+        <w:jc w:val="center"/>
+      </w:pPr>
+      <w:r>
+        <w:rPr>
+          <w:i/>
+          <w:iCs/>
+          <w:color w:val="595959"/>
+          <w:sz w:val="20"/>
+          <w:szCs w:val="20"/>
+        </w:rPr>
+        <w:t>Figure 4: Odeon film listings page (odeon.co.uk)</w:t>
+      </w:r>
+    </w:p>
+    <w:p>
+      <w:pPr>
+        <w:spacing w:line="276" w:lineRule="auto"/>
+      </w:pPr>
+      <w:r>
+        <w:t>Similar to Vue, Odeon presents films using large poster images organised under a Top Films heading. However Odeon includes additional information directly on the film page such as the director, cast, runtime, release date and genre tags. This richer level of detail gives customers more context before making a booking decision. Odeon also includes a quick search bar at the bottom of the page allowing users to filter by cinema, film, date and time. One notable difference from Vue is that Odeon uses a darker navy blue colour scheme throughout which creates a more premium feel. For Filmtopia I will aim to display key film information clearly on the customer kiosk so customers can make informed decisions quickly.</w:t>
+      </w:r>
+    </w:p>
+    <w:p>
+      <w:pPr>
+        <w:spacing w:before="80" w:after="40"/>
+      </w:pPr>
+      <w:r>
+        <w:rPr>
+          <w:b/>
+          <w:bCs/>
+        </w:rPr>
+        <w:t>Screening Times Page</w:t>
+      </w:r>
+    </w:p>
+    <w:p>
+      <w:pPr>
+        <w:spacing w:before="120"/>
+        <w:jc w:val="center"/>
+      </w:pPr>
+      <w:r>
+        <w:rPr>
+          <w:noProof/>
+        </w:rPr>
+        <w:lastRenderedPageBreak/>
+        <w:drawing>
+          <wp:inline distT="0" distB="0" distL="0" distR="0" wp14:anchorId="1E91FEA3" wp14:editId="61E265F1">
+            <wp:extent cx="4286250" cy="4343400"/>
+            <wp:effectExtent l="0" t="0" r="0" b="0"/>
+            <wp:docPr id="1339000641" name="Picture 1339000641"/>
+            <wp:cNvGraphicFramePr>
+              <a:graphicFrameLocks xmlns:a="http://schemas.openxmlformats.org/drawingml/2006/main" noChangeAspect="1"/>
+            </wp:cNvGraphicFramePr>
+            <a:graphic xmlns:a="http://schemas.openxmlformats.org/drawingml/2006/main">
+              <a:graphicData uri="http://schemas.openxmlformats.org/drawingml/2006/picture">
+                <pic:pic xmlns:pic="http://schemas.openxmlformats.org/drawingml/2006/picture">
+                  <pic:nvPicPr>
+                    <pic:cNvPr id="0" name=""/>
+                    <pic:cNvPicPr>
+                      <a:picLocks noChangeAspect="1" noChangeArrowheads="1"/>
+                    </pic:cNvPicPr>
+                  </pic:nvPicPr>
+                  <pic:blipFill>
+                    <a:blip r:embed="rId14"/>
+                    <a:srcRect/>
+                    <a:stretch>
+                      <a:fillRect/>
+                    </a:stretch>
+                  </pic:blipFill>
+                  <pic:spPr bwMode="auto">
+                    <a:xfrm>
+                      <a:off x="0" y="0"/>
+                      <a:ext cx="4286250" cy="4343400"/>
+                    </a:xfrm>
+                    <a:prstGeom prst="rect">
+                      <a:avLst/>
+                    </a:prstGeom>
+                  </pic:spPr>
+                </pic:pic>
+              </a:graphicData>
+            </a:graphic>
+          </wp:inline>
+        </w:drawing>
+      </w:r>
+    </w:p>
+    <w:p>
+      <w:pPr>
+        <w:spacing w:after="200"/>
+        <w:jc w:val="center"/>
+      </w:pPr>
+      <w:r>
+        <w:rPr>
+          <w:i/>
+          <w:iCs/>
+          <w:color w:val="595959"/>
+          <w:sz w:val="20"/>
+          <w:szCs w:val="20"/>
+        </w:rPr>
+        <w:t>Figure 5: Odeon screening times page (odeon.co.uk)</w:t>
+      </w:r>
+    </w:p>
+    <w:p>
+      <w:pPr>
+        <w:spacing w:line="276" w:lineRule="auto"/>
+      </w:pPr>
+      <w:r>
+        <w:t>Odeon's screening times page clearly displays the film title, runtime, release date and genre alongside all available showtimes. Screenings are organised by date across the top of the page and grouped by cinema location below. Each screening card shows the start time, screen number and format such as 3D. A Book Now button is displayed prominently on each card making the next action immediately obvious. This clear layout is something I will replicate in Filmtopia where staff should be able to see all screenings for a given film at a glance.</w:t>
+      </w:r>
+    </w:p>
+    <w:p>
+      <w:pPr>
+        <w:spacing w:before="80" w:after="40"/>
+      </w:pPr>
+      <w:r>
+        <w:rPr>
+          <w:b/>
+          <w:bCs/>
+        </w:rPr>
+        <w:t>Seat Selection Screen</w:t>
+      </w:r>
+    </w:p>
+    <w:p>
+      <w:pPr>
+        <w:spacing w:before="120"/>
+        <w:jc w:val="center"/>
+      </w:pPr>
+      <w:r>
+        <w:rPr>
+          <w:noProof/>
+        </w:rPr>
+        <w:lastRenderedPageBreak/>
+        <w:drawing>
+          <wp:inline distT="0" distB="0" distL="0" distR="0" wp14:anchorId="456DA744" wp14:editId="1AB6B7F1">
+            <wp:extent cx="5143500" cy="4038600"/>
+            <wp:effectExtent l="0" t="0" r="0" b="0"/>
+            <wp:docPr id="899379480" name="Picture 899379480"/>
+            <wp:cNvGraphicFramePr>
+              <a:graphicFrameLocks xmlns:a="http://schemas.openxmlformats.org/drawingml/2006/main" noChangeAspect="1"/>
+            </wp:cNvGraphicFramePr>
+            <a:graphic xmlns:a="http://schemas.openxmlformats.org/drawingml/2006/main">
+              <a:graphicData uri="http://schemas.openxmlformats.org/drawingml/2006/picture">
+                <pic:pic xmlns:pic="http://schemas.openxmlformats.org/drawingml/2006/picture">
+                  <pic:nvPicPr>
+                    <pic:cNvPr id="0" name=""/>
+                    <pic:cNvPicPr>
+                      <a:picLocks noChangeAspect="1" noChangeArrowheads="1"/>
+                    </pic:cNvPicPr>
+                  </pic:nvPicPr>
+                  <pic:blipFill>
+                    <a:blip r:embed="rId15"/>
+                    <a:srcRect/>
+                    <a:stretch>
+                      <a:fillRect/>
+                    </a:stretch>
+                  </pic:blipFill>
+                  <pic:spPr bwMode="auto">
+                    <a:xfrm>
+                      <a:off x="0" y="0"/>
                       <a:ext cx="5143500" cy="4038600"/>
                     </a:xfrm>
                     <a:prstGeom prst="rect">
@@ -4413,23 +4204,7 @@
         <w:spacing w:line="276" w:lineRule="auto"/>
       </w:pPr>
       <w:r>
-        <w:t xml:space="preserve">Odeon's seat selection screen is particularly well designed and shows several features worth incorporating into </w:t>
-      </w:r>
-      <w:proofErr w:type="spellStart"/>
-      <w:r>
-        <w:t>Filmtopia</w:t>
-      </w:r>
-      <w:proofErr w:type="spellEnd"/>
-      <w:r>
-        <w:t xml:space="preserve">. The screen displays a graphical layout of the entire auditorium with seats colour coded by type and price. Green seats represent Classic Saver at £14.99, cream seats represent Classic at £16.49 and orange seats represent Classic Popular at £17.99. Unavailable seats are shown with an X so it is immediately clear which seats cannot be booked. A seat key at the bottom explains the colour coding including wheelchair and companion seat options. The booking process is also clearly structured using a step by step tab navigation at the top showing Seats, Sign In, Tickets, Food, Summary and Payment. This staged approach guides the user through the process logically and reduces confusion. For </w:t>
-      </w:r>
-      <w:proofErr w:type="spellStart"/>
-      <w:r>
-        <w:t>Filmtopia</w:t>
-      </w:r>
-      <w:proofErr w:type="spellEnd"/>
-      <w:r>
-        <w:t xml:space="preserve"> I will incorporate a similar colour coded seat map and a clear step by step flow for the customer kiosk booking process.</w:t>
+        <w:t>Odeon's seat selection screen is particularly well designed and shows several features worth incorporating into Filmtopia. The screen displays a graphical layout of the entire auditorium with seats colour coded by type and price. Green seats represent Classic Saver at £14.99, cream seats represent Classic at £16.49 and orange seats represent Classic Popular at £17.99. Unavailable seats are shown with an X so it is immediately clear which seats cannot be booked. A seat key at the bottom explains the colour coding including wheelchair and companion seat options. The booking process is also clearly structured using a step by step tab navigation at the top showing Seats, Sign In, Tickets, Food, Summary and Payment. This staged approach guides the user through the process logically and reduces confusion. For Filmtopia I will incorporate a similar colour coded seat map and a clear step by step flow for the customer kiosk booking process.</w:t>
       </w:r>
     </w:p>
     <w:p>
@@ -4441,17 +4216,8 @@
           <w:b/>
           <w:bCs/>
         </w:rPr>
-        <w:t xml:space="preserve">Features Identified for </w:t>
-      </w:r>
-      <w:proofErr w:type="spellStart"/>
-      <w:r>
-        <w:rPr>
-          <w:b/>
-          <w:bCs/>
-        </w:rPr>
-        <w:t>Filmtopia</w:t>
-      </w:r>
-      <w:proofErr w:type="spellEnd"/>
+        <w:t>Features Identified for Filmtopia</w:t>
+      </w:r>
     </w:p>
     <w:p>
       <w:pPr>
@@ -4580,10 +4346,10 @@
                     <pic:cNvPicPr/>
                   </pic:nvPicPr>
                   <pic:blipFill>
-                    <a:blip r:embed="rId14">
+                    <a:blip r:embed="rId16">
                       <a:extLst>
                         <a:ext uri="{96DAC541-7B7A-43D3-8B79-37D633B846F1}">
-                          <asvg:svgBlip xmlns:asvg="http://schemas.microsoft.com/office/drawing/2016/SVG/main" r:embed="rId15"/>
+                          <asvg:svgBlip xmlns:asvg="http://schemas.microsoft.com/office/drawing/2016/SVG/main" r:embed="rId17"/>
                         </a:ext>
                       </a:extLst>
                     </a:blip>
@@ -4678,15 +4444,7 @@
         <w:spacing w:line="276" w:lineRule="auto"/>
       </w:pPr>
       <w:r>
-        <w:t xml:space="preserve">The existing system at </w:t>
-      </w:r>
-      <w:proofErr w:type="spellStart"/>
-      <w:r>
-        <w:t>Filmtopia</w:t>
-      </w:r>
-      <w:proofErr w:type="spellEnd"/>
-      <w:r>
-        <w:t xml:space="preserve"> receives several types of input, all of which are entered manually by staff or the manager. When a customer arrives to book tickets a member of staff writes the customer's name, chosen film, screening time, number of tickets and preferred seats into a paper booking diary. There is no digital record of this at the point of entry meaning the accuracy of the data depends entirely on the staff member's handwriting and attention to detail.</w:t>
+        <w:t>The existing system at Filmtopia receives several types of input, all of which are entered manually by staff or the manager. When a customer arrives to book tickets a member of staff writes the customer's name, chosen film, screening time, number of tickets and preferred seats into a paper booking diary. There is no digital record of this at the point of entry meaning the accuracy of the data depends entirely on the staff member's handwriting and attention to detail.</w:t>
       </w:r>
     </w:p>
     <w:p>
@@ -4893,13 +4651,8 @@
       <w:pPr>
         <w:spacing w:line="276" w:lineRule="auto"/>
       </w:pPr>
-      <w:proofErr w:type="spellStart"/>
-      <w:r>
-        <w:t>Filmtopia</w:t>
-      </w:r>
-      <w:proofErr w:type="spellEnd"/>
-      <w:r>
-        <w:t xml:space="preserve"> is a small independent cinema that is currently managing all of its operations using a combination of paper records and disconnected spreadsheets. This approach may have been adequate when the cinema first opened but it has become increasingly </w:t>
+      <w:r>
+        <w:t xml:space="preserve">Filmtopia is a small independent cinema that is currently managing all of its operations using a combination of paper records and disconnected spreadsheets. This approach may have been adequate when the cinema first opened but it has become increasingly </w:t>
       </w:r>
       <w:r>
         <w:lastRenderedPageBreak/>
@@ -4911,15 +4664,7 @@
         <w:spacing w:line="276" w:lineRule="auto"/>
       </w:pPr>
       <w:r>
-        <w:t xml:space="preserve">The most critical issue identified through the investigation is the risk of double bookings. Because seat allocations are recorded manually in a paper diary with no real time updating, two members of staff can independently assign the same seat to different customers for the same screening without either being aware of it. This was confirmed by both members of staff interviewed and by 65% of customers in the questionnaire who reported having experienced a problem when booking at </w:t>
-      </w:r>
-      <w:proofErr w:type="spellStart"/>
-      <w:r>
-        <w:t>Filmtopia</w:t>
-      </w:r>
-      <w:proofErr w:type="spellEnd"/>
-      <w:r>
-        <w:t>. It was also directly observed during the site visit. This is not an occasional or minor issue but a fundamental flaw in how the existing system manages booking data. A relational database with referential integrity enforced between the relevant tables will directly address this by ensuring that once a seat is recorded as booked for a particular screening it cannot be booked again. This is dealt with by Objective 2 in the next section and supported by Objective 3, which covers the graphical seat map that makes taken seats visible at a glance.</w:t>
+        <w:t>The most critical issue identified through the investigation is the risk of double bookings. Because seat allocations are recorded manually in a paper diary with no real time updating, two members of staff can independently assign the same seat to different customers for the same screening without either being aware of it. This was confirmed by both members of staff interviewed and by 65% of customers in the questionnaire who reported having experienced a problem when booking at Filmtopia. It was also directly observed during the site visit. This is not an occasional or minor issue but a fundamental flaw in how the existing system manages booking data. A relational database with referential integrity enforced between the relevant tables will directly address this by ensuring that once a seat is recorded as booked for a particular screening it cannot be booked again. This is dealt with by Objective 2 in the next section and supported by Objective 3, which covers the graphical seat map that makes taken seats visible at a glance.</w:t>
       </w:r>
     </w:p>
     <w:p>
@@ -4935,15 +4680,7 @@
         <w:spacing w:line="276" w:lineRule="auto"/>
       </w:pPr>
       <w:r>
-        <w:t xml:space="preserve">The third significant problem is the poor customer facing experience. The kiosk currently installed in the cinema can only handle food and drink orders and cannot sell tickets, which forces customers to queue at both the kiosk and the box office. This was raised by multiple customers in the questionnaire and observed directly during the site visit. The proposed solution will address this by providing a customer kiosk interface through which customers can browse films, select a screening, choose their seats and add food and drink items to their order in a single joined up process. This is dealt with by Objective 4, which covers the </w:t>
-      </w:r>
-      <w:proofErr w:type="spellStart"/>
-      <w:r>
-        <w:t>self service</w:t>
-      </w:r>
-      <w:proofErr w:type="spellEnd"/>
-      <w:r>
-        <w:t xml:space="preserve"> kiosk, and Objective 5, which covers adding food and drink to a booking.</w:t>
+        <w:t>The third significant problem is the poor customer facing experience. The kiosk currently installed in the cinema can only handle food and drink orders and cannot sell tickets, which forces customers to queue at both the kiosk and the box office. This was raised by multiple customers in the questionnaire and observed directly during the site visit. The proposed solution will address this by providing a customer kiosk interface through which customers can browse films, select a screening, choose their seats and add food and drink items to their order in a single joined up process. This is dealt with by Objective 4, which covers the self service kiosk, and Objective 5, which covers adding food and drink to a booking.</w:t>
       </w:r>
     </w:p>
     <w:p>
@@ -4978,31 +4715,15 @@
         <w:spacing w:line="276" w:lineRule="auto"/>
       </w:pPr>
       <w:r>
-        <w:t xml:space="preserve">Functional requirements are the specific things the system must be able to do. For </w:t>
-      </w:r>
-      <w:proofErr w:type="spellStart"/>
-      <w:r>
-        <w:t>Filmtopia</w:t>
-      </w:r>
-      <w:proofErr w:type="spellEnd"/>
-      <w:r>
-        <w:t xml:space="preserve"> these include the ability to add and manage films and screenings (Objectives 6 and 7), to display a graphical seat map showing which seats are available and which are already booked (Objective 3), to process customer bookings and link them to specific seats and screenings (Objectives 1 and 2), to allow food and drink orders to be added to a booking (Objective 5) and to generate sales reports for the manager (Objective 8). These requirements map directly to the objectives set out later in this investigation.</w:t>
-      </w:r>
-    </w:p>
-    <w:p>
-      <w:pPr>
-        <w:spacing w:line="276" w:lineRule="auto"/>
-      </w:pPr>
-      <w:r>
-        <w:t xml:space="preserve">Non-functional requirements are the qualities the system must have rather than the specific things it must do. For </w:t>
-      </w:r>
-      <w:proofErr w:type="spellStart"/>
-      <w:r>
-        <w:t>Filmtopia</w:t>
-      </w:r>
-      <w:proofErr w:type="spellEnd"/>
-      <w:r>
-        <w:t xml:space="preserve"> the most important non-functional requirements are reliability, usability and data integrity. The system must be reliable enough to be used continuously during opening hours without crashing or producing errors. It must be usable by staff with varying levels of technical confidence without extensive training, which is reflected in Objectives 14 and 15. And it must maintain data integrity at all times, meaning it should never be possible for the database to reach a state where bookings are duplicated, records are incomplete or data is inconsistent between tables, which is reflected in Objectives 2 and 13.</w:t>
+        <w:t>Functional requirements are the specific things the system must be able to do. For Filmtopia these include the ability to add and manage films and screenings (Objectives 6 and 7), to display a graphical seat map showing which seats are available and which are already booked (Objective 3), to process customer bookings and link them to specific seats and screenings (Objectives 1 and 2), to allow food and drink orders to be added to a booking (Objective 5) and to generate sales reports for the manager (Objective 8). These requirements map directly to the objectives set out later in this investigation.</w:t>
+      </w:r>
+    </w:p>
+    <w:p>
+      <w:pPr>
+        <w:spacing w:line="276" w:lineRule="auto"/>
+      </w:pPr>
+      <w:r>
+        <w:t>Non-functional requirements are the qualities the system must have rather than the specific things it must do. For Filmtopia the most important non-functional requirements are reliability, usability and data integrity. The system must be reliable enough to be used continuously during opening hours without crashing or producing errors. It must be usable by staff with varying levels of technical confidence without extensive training, which is reflected in Objectives 14 and 15. And it must maintain data integrity at all times, meaning it should never be possible for the database to reach a state where bookings are duplicated, records are incomplete or data is inconsistent between tables, which is reflected in Objectives 2 and 13.</w:t>
       </w:r>
     </w:p>
     <w:p>
@@ -5028,47 +4749,15 @@
         <w:spacing w:line="276" w:lineRule="auto"/>
       </w:pPr>
       <w:r>
-        <w:t xml:space="preserve">The proposed solution is a Visual Basic .NET Windows Forms application built in Visual Studio, using </w:t>
-      </w:r>
-      <w:proofErr w:type="spellStart"/>
-      <w:r>
-        <w:t>OleDb</w:t>
-      </w:r>
-      <w:proofErr w:type="spellEnd"/>
-      <w:r>
-        <w:t xml:space="preserve"> to manage the connection between the application and a Microsoft Access database stored in the Access 2002 to 2003 .</w:t>
-      </w:r>
-      <w:proofErr w:type="spellStart"/>
-      <w:r>
-        <w:t>mdb</w:t>
-      </w:r>
-      <w:proofErr w:type="spellEnd"/>
-      <w:r>
-        <w:t xml:space="preserve"> format. Visual Basic .NET has been chosen because it is the language used throughout this course and it allows the rapid development of graphical Windows applications with a professional user interface. </w:t>
-      </w:r>
-      <w:proofErr w:type="spellStart"/>
-      <w:r>
-        <w:t>OleDb</w:t>
-      </w:r>
-      <w:proofErr w:type="spellEnd"/>
-      <w:r>
-        <w:t xml:space="preserve"> has been chosen as the database connectivity method because it provides a straightforward and reliable way of connecting a Visual Basic .NET application to a Microsoft Access database, allowing SQL queries to be executed directly from the application code to insert, update, delete and retrieve records. Microsoft Access has been chosen as the database because it supports a full relational structure with primary keys, foreign keys and referential integrity which directly addresses the data management problems identified in the investigation.</w:t>
-      </w:r>
-    </w:p>
-    <w:p>
-      <w:pPr>
-        <w:spacing w:line="276" w:lineRule="auto"/>
-      </w:pPr>
-      <w:r>
-        <w:t xml:space="preserve">The system will support three distinct user types each with their own interface and access level. Customers will access the system through a </w:t>
-      </w:r>
-      <w:proofErr w:type="spellStart"/>
-      <w:r>
-        <w:t>self service</w:t>
-      </w:r>
-      <w:proofErr w:type="spellEnd"/>
-      <w:r>
-        <w:t xml:space="preserve"> kiosk interface. Staff will be </w:t>
+        <w:t>The proposed solution is a Visual Basic .NET Windows Forms application built in Visual Studio, using OleDb to manage the connection between the application and a Microsoft Access database stored in the Access 2002 to 2003 .mdb format. Visual Basic .NET has been chosen because it is the language used throughout this course and it allows the rapid development of graphical Windows applications with a professional user interface. OleDb has been chosen as the database connectivity method because it provides a straightforward and reliable way of connecting a Visual Basic .NET application to a Microsoft Access database, allowing SQL queries to be executed directly from the application code to insert, update, delete and retrieve records. Microsoft Access has been chosen as the database because it supports a full relational structure with primary keys, foreign keys and referential integrity which directly addresses the data management problems identified in the investigation.</w:t>
+      </w:r>
+    </w:p>
+    <w:p>
+      <w:pPr>
+        <w:spacing w:line="276" w:lineRule="auto"/>
+      </w:pPr>
+      <w:r>
+        <w:t xml:space="preserve">The system will support three distinct user types each with their own interface and access level. Customers will access the system through a self service kiosk interface. Staff will be </w:t>
       </w:r>
       <w:r>
         <w:lastRenderedPageBreak/>
@@ -5107,15 +4796,7 @@
         <w:spacing w:line="276" w:lineRule="auto"/>
       </w:pPr>
       <w:r>
-        <w:t xml:space="preserve">Whilst the proposed </w:t>
-      </w:r>
-      <w:proofErr w:type="spellStart"/>
-      <w:r>
-        <w:t>Filmtopia</w:t>
-      </w:r>
-      <w:proofErr w:type="spellEnd"/>
-      <w:r>
-        <w:t xml:space="preserve"> system will address the core problems identified in the investigation, there are several areas that will not be included in the solution due to constraints of time, scope and available hardware and software. These limitations are outlined below.</w:t>
+        <w:t>Whilst the proposed Filmtopia system will address the core problems identified in the investigation, there are several areas that will not be included in the solution due to constraints of time, scope and available hardware and software. These limitations are outlined below.</w:t>
       </w:r>
     </w:p>
     <w:p>
@@ -5147,23 +4828,7 @@
         <w:spacing w:line="276" w:lineRule="auto"/>
       </w:pPr>
       <w:r>
-        <w:t xml:space="preserve">The system will not support multiple simultaneous users over a network. Whilst </w:t>
-      </w:r>
-      <w:proofErr w:type="spellStart"/>
-      <w:r>
-        <w:t>OleDb</w:t>
-      </w:r>
-      <w:proofErr w:type="spellEnd"/>
-      <w:r>
-        <w:t xml:space="preserve"> connections to a Microsoft Access database can technically support multiple users, developing a fully networked multi-user system with appropriate concurrency controls and conflict resolution is beyond the scope of this project. The system will be designed for use on a single machine or a small number of machines accessing the same .</w:t>
-      </w:r>
-      <w:proofErr w:type="spellStart"/>
-      <w:r>
-        <w:t>mdb</w:t>
-      </w:r>
-      <w:proofErr w:type="spellEnd"/>
-      <w:r>
-        <w:t xml:space="preserve"> database file locally.</w:t>
+        <w:t>The system will not support multiple simultaneous users over a network. Whilst OleDb connections to a Microsoft Access database can technically support multiple users, developing a fully networked multi-user system with appropriate concurrency controls and conflict resolution is beyond the scope of this project. The system will be designed for use on a single machine or a small number of machines accessing the same .mdb database file locally.</w:t>
       </w:r>
     </w:p>
     <w:p>
@@ -5427,15 +5092,7 @@
         <w:t xml:space="preserve">Success Criteria: </w:t>
       </w:r>
       <w:r>
-        <w:t xml:space="preserve">The report should be generated using an SQL query through the </w:t>
-      </w:r>
-      <w:proofErr w:type="spellStart"/>
-      <w:r>
-        <w:t>OleDb</w:t>
-      </w:r>
-      <w:proofErr w:type="spellEnd"/>
-      <w:r>
-        <w:t xml:space="preserve"> connection and displayed on screen within 5 seconds of the date range being selected. The report should show the correct total number of tickets sold and total revenue for the selected period, calculated directly from the bookings in the database.</w:t>
+        <w:t>The report should be generated using an SQL query through the OleDb connection and displayed on screen within 5 seconds of the date range being selected. The report should show the correct total number of tickets sold and total revenue for the selected period, calculated directly from the bookings in the database.</w:t>
       </w:r>
     </w:p>
     <w:p>
@@ -5598,15 +5255,7 @@
         <w:t xml:space="preserve">Success Criteria: </w:t>
       </w:r>
       <w:r>
-        <w:t xml:space="preserve">All forms should use the same colour scheme, font and button placement. Navigation buttons should appear in consistent positions across all forms. The system should look professional and be immediately recognisable as a </w:t>
-      </w:r>
-      <w:proofErr w:type="spellStart"/>
-      <w:r>
-        <w:t>Filmtopia</w:t>
-      </w:r>
-      <w:proofErr w:type="spellEnd"/>
-      <w:r>
-        <w:t xml:space="preserve"> branded application.</w:t>
+        <w:t>All forms should use the same colour scheme, font and button placement. Navigation buttons should appear in consistent positions across all forms. The system should look professional and be immediately recognisable as a Filmtopia branded application.</w:t>
       </w:r>
     </w:p>
     <w:p>
@@ -5639,12 +5288,12 @@
     </w:p>
     <w:p/>
     <w:sectPr>
-      <w:headerReference w:type="even" r:id="rId16"/>
-      <w:headerReference w:type="default" r:id="rId17"/>
-      <w:footerReference w:type="even" r:id="rId18"/>
-      <w:footerReference w:type="default" r:id="rId19"/>
-      <w:headerReference w:type="first" r:id="rId20"/>
-      <w:footerReference w:type="first" r:id="rId21"/>
+      <w:headerReference w:type="even" r:id="rId18"/>
+      <w:headerReference w:type="default" r:id="rId19"/>
+      <w:footerReference w:type="even" r:id="rId20"/>
+      <w:footerReference w:type="default" r:id="rId21"/>
+      <w:headerReference w:type="first" r:id="rId22"/>
+      <w:footerReference w:type="first" r:id="rId23"/>
       <w:pgSz w:w="12240" w:h="15840"/>
       <w:pgMar w:top="1440" w:right="1440" w:bottom="1440" w:left="1440" w:header="720" w:footer="720" w:gutter="0"/>
       <w:pgBorders w:offsetFrom="page">
@@ -6890,6 +6539,795 @@
 </w:styles>
 </file>
 
+<file path=word/charts/chart1.xml><?xml version="1.0" encoding="utf-8"?>
+<c:chartSpace xmlns:c="http://schemas.openxmlformats.org/drawingml/2006/chart" xmlns:a="http://schemas.openxmlformats.org/drawingml/2006/main" xmlns:r="http://schemas.openxmlformats.org/officeDocument/2006/relationships" xmlns:c16r2="http://schemas.microsoft.com/office/drawing/2015/06/chart">
+  <c:date1904 val="0"/>
+  <c:lang val="en-US"/>
+  <c:roundedCorners val="0"/>
+  <mc:AlternateContent xmlns:mc="http://schemas.openxmlformats.org/markup-compatibility/2006">
+    <mc:Choice xmlns:c14="http://schemas.microsoft.com/office/drawing/2007/8/2/chart" Requires="c14">
+      <c14:style val="102"/>
+    </mc:Choice>
+    <mc:Fallback>
+      <c:style val="2"/>
+    </mc:Fallback>
+  </mc:AlternateContent>
+  <c:chart>
+    <c:title>
+      <c:overlay val="0"/>
+      <c:spPr>
+        <a:noFill/>
+        <a:ln>
+          <a:noFill/>
+        </a:ln>
+        <a:effectLst/>
+      </c:spPr>
+      <c:txPr>
+        <a:bodyPr rot="0" spcFirstLastPara="1" vertOverflow="ellipsis" vert="horz" wrap="square" anchor="ctr" anchorCtr="1"/>
+        <a:lstStyle/>
+        <a:p>
+          <a:pPr>
+            <a:defRPr sz="1400" b="0" i="0" u="none" strike="noStrike" kern="1200" spc="0" baseline="0">
+              <a:solidFill>
+                <a:schemeClr val="tx1">
+                  <a:lumMod val="65000"/>
+                  <a:lumOff val="35000"/>
+                </a:schemeClr>
+              </a:solidFill>
+              <a:latin typeface="+mn-lt"/>
+              <a:ea typeface="+mn-ea"/>
+              <a:cs typeface="+mn-cs"/>
+            </a:defRPr>
+          </a:pPr>
+          <a:endParaRPr lang="en-US"/>
+        </a:p>
+      </c:txPr>
+    </c:title>
+    <c:autoTitleDeleted val="0"/>
+    <c:plotArea>
+      <c:layout/>
+      <c:pieChart>
+        <c:varyColors val="1"/>
+        <c:ser>
+          <c:idx val="0"/>
+          <c:order val="0"/>
+          <c:tx>
+            <c:strRef>
+              <c:f>Sheet1!$B$1</c:f>
+              <c:strCache>
+                <c:ptCount val="1"/>
+                <c:pt idx="0">
+                  <c:v>Responses</c:v>
+                </c:pt>
+              </c:strCache>
+            </c:strRef>
+          </c:tx>
+          <c:dPt>
+            <c:idx val="0"/>
+            <c:bubble3D val="0"/>
+            <c:spPr>
+              <a:solidFill>
+                <a:schemeClr val="accent1"/>
+              </a:solidFill>
+              <a:ln w="19050">
+                <a:solidFill>
+                  <a:schemeClr val="lt1"/>
+                </a:solidFill>
+              </a:ln>
+              <a:effectLst/>
+            </c:spPr>
+            <c:extLst>
+              <c:ext xmlns:c16="http://schemas.microsoft.com/office/drawing/2014/chart" uri="{C3380CC4-5D6E-409C-BE32-E72D297353CC}">
+                <c16:uniqueId val="{00000001-6DAC-4C62-B5D1-84FFDB1AEECE}"/>
+              </c:ext>
+            </c:extLst>
+          </c:dPt>
+          <c:dPt>
+            <c:idx val="1"/>
+            <c:bubble3D val="0"/>
+            <c:spPr>
+              <a:solidFill>
+                <a:schemeClr val="accent2"/>
+              </a:solidFill>
+              <a:ln w="19050">
+                <a:solidFill>
+                  <a:schemeClr val="lt1"/>
+                </a:solidFill>
+              </a:ln>
+              <a:effectLst/>
+            </c:spPr>
+            <c:extLst>
+              <c:ext xmlns:c16="http://schemas.microsoft.com/office/drawing/2014/chart" uri="{C3380CC4-5D6E-409C-BE32-E72D297353CC}">
+                <c16:uniqueId val="{00000003-6DAC-4C62-B5D1-84FFDB1AEECE}"/>
+              </c:ext>
+            </c:extLst>
+          </c:dPt>
+          <c:cat>
+            <c:strRef>
+              <c:f>Sheet1!$A$2:$A$3</c:f>
+              <c:strCache>
+                <c:ptCount val="2"/>
+                <c:pt idx="0">
+                  <c:v>Yes</c:v>
+                </c:pt>
+                <c:pt idx="1">
+                  <c:v>No</c:v>
+                </c:pt>
+              </c:strCache>
+            </c:strRef>
+          </c:cat>
+          <c:val>
+            <c:numRef>
+              <c:f>Sheet1!$B$2:$B$3</c:f>
+              <c:numCache>
+                <c:formatCode>General</c:formatCode>
+                <c:ptCount val="2"/>
+                <c:pt idx="0">
+                  <c:v>16</c:v>
+                </c:pt>
+                <c:pt idx="1">
+                  <c:v>4</c:v>
+                </c:pt>
+              </c:numCache>
+            </c:numRef>
+          </c:val>
+          <c:extLst>
+            <c:ext xmlns:c16="http://schemas.microsoft.com/office/drawing/2014/chart" uri="{C3380CC4-5D6E-409C-BE32-E72D297353CC}">
+              <c16:uniqueId val="{00000000-2419-4409-BC0D-90986D9D4CAB}"/>
+            </c:ext>
+          </c:extLst>
+        </c:ser>
+        <c:dLbls>
+          <c:showLegendKey val="0"/>
+          <c:showVal val="0"/>
+          <c:showCatName val="0"/>
+          <c:showSerName val="0"/>
+          <c:showPercent val="0"/>
+          <c:showBubbleSize val="0"/>
+          <c:showLeaderLines val="1"/>
+        </c:dLbls>
+        <c:firstSliceAng val="0"/>
+      </c:pieChart>
+      <c:spPr>
+        <a:noFill/>
+        <a:ln>
+          <a:noFill/>
+        </a:ln>
+        <a:effectLst/>
+      </c:spPr>
+    </c:plotArea>
+    <c:legend>
+      <c:legendPos val="b"/>
+      <c:overlay val="0"/>
+      <c:spPr>
+        <a:noFill/>
+        <a:ln>
+          <a:noFill/>
+        </a:ln>
+        <a:effectLst/>
+      </c:spPr>
+      <c:txPr>
+        <a:bodyPr rot="0" spcFirstLastPara="1" vertOverflow="ellipsis" vert="horz" wrap="square" anchor="ctr" anchorCtr="1"/>
+        <a:lstStyle/>
+        <a:p>
+          <a:pPr>
+            <a:defRPr sz="900" b="0" i="0" u="none" strike="noStrike" kern="1200" baseline="0">
+              <a:solidFill>
+                <a:schemeClr val="tx1">
+                  <a:lumMod val="65000"/>
+                  <a:lumOff val="35000"/>
+                </a:schemeClr>
+              </a:solidFill>
+              <a:latin typeface="+mn-lt"/>
+              <a:ea typeface="+mn-ea"/>
+              <a:cs typeface="+mn-cs"/>
+            </a:defRPr>
+          </a:pPr>
+          <a:endParaRPr lang="en-US"/>
+        </a:p>
+      </c:txPr>
+    </c:legend>
+    <c:plotVisOnly val="1"/>
+    <c:dispBlanksAs val="gap"/>
+    <c:showDLblsOverMax val="0"/>
+    <c:extLst>
+      <c:ext xmlns:c16r3="http://schemas.microsoft.com/office/drawing/2017/03/chart" uri="{56B9EC1D-385E-4148-901F-78D8002777C0}">
+        <c16r3:dataDisplayOptions16>
+          <c16r3:dispNaAsBlank val="1"/>
+        </c16r3:dataDisplayOptions16>
+      </c:ext>
+    </c:extLst>
+  </c:chart>
+  <c:spPr>
+    <a:solidFill>
+      <a:schemeClr val="bg1"/>
+    </a:solidFill>
+    <a:ln w="9525" cap="flat" cmpd="sng" algn="ctr">
+      <a:solidFill>
+        <a:schemeClr val="tx1">
+          <a:lumMod val="15000"/>
+          <a:lumOff val="85000"/>
+        </a:schemeClr>
+      </a:solidFill>
+      <a:round/>
+    </a:ln>
+    <a:effectLst/>
+  </c:spPr>
+  <c:txPr>
+    <a:bodyPr/>
+    <a:lstStyle/>
+    <a:p>
+      <a:pPr>
+        <a:defRPr/>
+      </a:pPr>
+      <a:endParaRPr lang="en-US"/>
+    </a:p>
+  </c:txPr>
+  <c:externalData r:id="rId3">
+    <c:autoUpdate val="0"/>
+  </c:externalData>
+</c:chartSpace>
+</file>
+
+<file path=word/charts/colors1.xml><?xml version="1.0" encoding="utf-8"?>
+<cs:colorStyle xmlns:cs="http://schemas.microsoft.com/office/drawing/2012/chartStyle" xmlns:a="http://schemas.openxmlformats.org/drawingml/2006/main" meth="cycle" id="10">
+  <a:schemeClr val="accent1"/>
+  <a:schemeClr val="accent2"/>
+  <a:schemeClr val="accent3"/>
+  <a:schemeClr val="accent4"/>
+  <a:schemeClr val="accent5"/>
+  <a:schemeClr val="accent6"/>
+  <cs:variation/>
+  <cs:variation>
+    <a:lumMod val="60000"/>
+  </cs:variation>
+  <cs:variation>
+    <a:lumMod val="80000"/>
+    <a:lumOff val="20000"/>
+  </cs:variation>
+  <cs:variation>
+    <a:lumMod val="80000"/>
+  </cs:variation>
+  <cs:variation>
+    <a:lumMod val="60000"/>
+    <a:lumOff val="40000"/>
+  </cs:variation>
+  <cs:variation>
+    <a:lumMod val="50000"/>
+  </cs:variation>
+  <cs:variation>
+    <a:lumMod val="70000"/>
+    <a:lumOff val="30000"/>
+  </cs:variation>
+  <cs:variation>
+    <a:lumMod val="70000"/>
+  </cs:variation>
+  <cs:variation>
+    <a:lumMod val="50000"/>
+    <a:lumOff val="50000"/>
+  </cs:variation>
+</cs:colorStyle>
+</file>
+
+<file path=word/charts/style1.xml><?xml version="1.0" encoding="utf-8"?>
+<cs:chartStyle xmlns:cs="http://schemas.microsoft.com/office/drawing/2012/chartStyle" xmlns:a="http://schemas.openxmlformats.org/drawingml/2006/main" id="251">
+  <cs:axisTitle>
+    <cs:lnRef idx="0"/>
+    <cs:fillRef idx="0"/>
+    <cs:effectRef idx="0"/>
+    <cs:fontRef idx="minor">
+      <a:schemeClr val="tx1">
+        <a:lumMod val="65000"/>
+        <a:lumOff val="35000"/>
+      </a:schemeClr>
+    </cs:fontRef>
+    <cs:defRPr sz="1000" kern="1200"/>
+  </cs:axisTitle>
+  <cs:categoryAxis>
+    <cs:lnRef idx="0"/>
+    <cs:fillRef idx="0"/>
+    <cs:effectRef idx="0"/>
+    <cs:fontRef idx="minor">
+      <a:schemeClr val="tx1">
+        <a:lumMod val="65000"/>
+        <a:lumOff val="35000"/>
+      </a:schemeClr>
+    </cs:fontRef>
+    <cs:spPr>
+      <a:ln w="9525" cap="flat" cmpd="sng" algn="ctr">
+        <a:solidFill>
+          <a:schemeClr val="tx1">
+            <a:lumMod val="15000"/>
+            <a:lumOff val="85000"/>
+          </a:schemeClr>
+        </a:solidFill>
+        <a:round/>
+      </a:ln>
+    </cs:spPr>
+    <cs:defRPr sz="900" kern="1200"/>
+  </cs:categoryAxis>
+  <cs:chartArea mods="allowNoFillOverride allowNoLineOverride">
+    <cs:lnRef idx="0"/>
+    <cs:fillRef idx="0"/>
+    <cs:effectRef idx="0"/>
+    <cs:fontRef idx="minor">
+      <a:schemeClr val="tx1"/>
+    </cs:fontRef>
+    <cs:spPr>
+      <a:solidFill>
+        <a:schemeClr val="bg1"/>
+      </a:solidFill>
+      <a:ln w="9525" cap="flat" cmpd="sng" algn="ctr">
+        <a:solidFill>
+          <a:schemeClr val="tx1">
+            <a:lumMod val="15000"/>
+            <a:lumOff val="85000"/>
+          </a:schemeClr>
+        </a:solidFill>
+        <a:round/>
+      </a:ln>
+    </cs:spPr>
+    <cs:defRPr sz="900" kern="1200"/>
+  </cs:chartArea>
+  <cs:dataLabel>
+    <cs:lnRef idx="0"/>
+    <cs:fillRef idx="0"/>
+    <cs:effectRef idx="0"/>
+    <cs:fontRef idx="minor">
+      <a:schemeClr val="tx1">
+        <a:lumMod val="75000"/>
+        <a:lumOff val="25000"/>
+      </a:schemeClr>
+    </cs:fontRef>
+    <cs:defRPr sz="900" kern="1200"/>
+  </cs:dataLabel>
+  <cs:dataLabelCallout>
+    <cs:lnRef idx="0"/>
+    <cs:fillRef idx="0"/>
+    <cs:effectRef idx="0"/>
+    <cs:fontRef idx="minor">
+      <a:schemeClr val="dk1">
+        <a:lumMod val="65000"/>
+        <a:lumOff val="35000"/>
+      </a:schemeClr>
+    </cs:fontRef>
+    <cs:spPr>
+      <a:solidFill>
+        <a:schemeClr val="lt1"/>
+      </a:solidFill>
+      <a:ln>
+        <a:solidFill>
+          <a:schemeClr val="dk1">
+            <a:lumMod val="25000"/>
+            <a:lumOff val="75000"/>
+          </a:schemeClr>
+        </a:solidFill>
+      </a:ln>
+    </cs:spPr>
+    <cs:defRPr sz="900" kern="1200"/>
+    <cs:bodyPr rot="0" spcFirstLastPara="1" vertOverflow="clip" horzOverflow="clip" vert="horz" wrap="square" lIns="36576" tIns="18288" rIns="36576" bIns="18288" anchor="ctr" anchorCtr="1">
+      <a:spAutoFit/>
+    </cs:bodyPr>
+  </cs:dataLabelCallout>
+  <cs:dataPoint>
+    <cs:lnRef idx="0"/>
+    <cs:fillRef idx="1">
+      <cs:styleClr val="auto"/>
+    </cs:fillRef>
+    <cs:effectRef idx="0"/>
+    <cs:fontRef idx="minor">
+      <a:schemeClr val="tx1"/>
+    </cs:fontRef>
+    <cs:spPr>
+      <a:ln w="19050">
+        <a:solidFill>
+          <a:schemeClr val="lt1"/>
+        </a:solidFill>
+      </a:ln>
+    </cs:spPr>
+  </cs:dataPoint>
+  <cs:dataPoint3D>
+    <cs:lnRef idx="0"/>
+    <cs:fillRef idx="1">
+      <cs:styleClr val="auto"/>
+    </cs:fillRef>
+    <cs:effectRef idx="0"/>
+    <cs:fontRef idx="minor">
+      <a:schemeClr val="tx1"/>
+    </cs:fontRef>
+    <cs:spPr>
+      <a:ln w="25400">
+        <a:solidFill>
+          <a:schemeClr val="lt1"/>
+        </a:solidFill>
+      </a:ln>
+    </cs:spPr>
+  </cs:dataPoint3D>
+  <cs:dataPointLine>
+    <cs:lnRef idx="0">
+      <cs:styleClr val="auto"/>
+    </cs:lnRef>
+    <cs:fillRef idx="0"/>
+    <cs:effectRef idx="0"/>
+    <cs:fontRef idx="minor">
+      <a:schemeClr val="tx1"/>
+    </cs:fontRef>
+    <cs:spPr>
+      <a:ln w="28575" cap="rnd">
+        <a:solidFill>
+          <a:schemeClr val="phClr"/>
+        </a:solidFill>
+        <a:round/>
+      </a:ln>
+    </cs:spPr>
+  </cs:dataPointLine>
+  <cs:dataPointMarker>
+    <cs:lnRef idx="0">
+      <cs:styleClr val="auto"/>
+    </cs:lnRef>
+    <cs:fillRef idx="1">
+      <cs:styleClr val="auto"/>
+    </cs:fillRef>
+    <cs:effectRef idx="0"/>
+    <cs:fontRef idx="minor">
+      <a:schemeClr val="tx1"/>
+    </cs:fontRef>
+    <cs:spPr>
+      <a:ln w="9525">
+        <a:solidFill>
+          <a:schemeClr val="phClr"/>
+        </a:solidFill>
+      </a:ln>
+    </cs:spPr>
+  </cs:dataPointMarker>
+  <cs:dataPointMarkerLayout symbol="circle" size="5"/>
+  <cs:dataPointWireframe>
+    <cs:lnRef idx="0">
+      <cs:styleClr val="auto"/>
+    </cs:lnRef>
+    <cs:fillRef idx="0"/>
+    <cs:effectRef idx="0"/>
+    <cs:fontRef idx="minor">
+      <a:schemeClr val="tx1"/>
+    </cs:fontRef>
+    <cs:spPr>
+      <a:ln w="9525" cap="rnd">
+        <a:solidFill>
+          <a:schemeClr val="phClr"/>
+        </a:solidFill>
+        <a:round/>
+      </a:ln>
+    </cs:spPr>
+  </cs:dataPointWireframe>
+  <cs:dataTable>
+    <cs:lnRef idx="0"/>
+    <cs:fillRef idx="0"/>
+    <cs:effectRef idx="0"/>
+    <cs:fontRef idx="minor">
+      <a:schemeClr val="tx1">
+        <a:lumMod val="65000"/>
+        <a:lumOff val="35000"/>
+      </a:schemeClr>
+    </cs:fontRef>
+    <cs:spPr>
+      <a:noFill/>
+      <a:ln w="9525" cap="flat" cmpd="sng" algn="ctr">
+        <a:solidFill>
+          <a:schemeClr val="tx1">
+            <a:lumMod val="15000"/>
+            <a:lumOff val="85000"/>
+          </a:schemeClr>
+        </a:solidFill>
+        <a:round/>
+      </a:ln>
+    </cs:spPr>
+    <cs:defRPr sz="900" kern="1200"/>
+  </cs:dataTable>
+  <cs:downBar>
+    <cs:lnRef idx="0"/>
+    <cs:fillRef idx="0"/>
+    <cs:effectRef idx="0"/>
+    <cs:fontRef idx="minor">
+      <a:schemeClr val="tx1"/>
+    </cs:fontRef>
+    <cs:spPr>
+      <a:solidFill>
+        <a:schemeClr val="dk1">
+          <a:lumMod val="75000"/>
+          <a:lumOff val="25000"/>
+        </a:schemeClr>
+      </a:solidFill>
+      <a:ln w="9525" cap="flat" cmpd="sng" algn="ctr">
+        <a:solidFill>
+          <a:schemeClr val="tx1">
+            <a:lumMod val="65000"/>
+            <a:lumOff val="35000"/>
+          </a:schemeClr>
+        </a:solidFill>
+        <a:round/>
+      </a:ln>
+    </cs:spPr>
+  </cs:downBar>
+  <cs:dropLine>
+    <cs:lnRef idx="0"/>
+    <cs:fillRef idx="0"/>
+    <cs:effectRef idx="0"/>
+    <cs:fontRef idx="minor">
+      <a:schemeClr val="tx1"/>
+    </cs:fontRef>
+    <cs:spPr>
+      <a:ln w="9525" cap="flat" cmpd="sng" algn="ctr">
+        <a:solidFill>
+          <a:schemeClr val="tx1">
+            <a:lumMod val="35000"/>
+            <a:lumOff val="65000"/>
+          </a:schemeClr>
+        </a:solidFill>
+        <a:round/>
+      </a:ln>
+    </cs:spPr>
+  </cs:dropLine>
+  <cs:errorBar>
+    <cs:lnRef idx="0"/>
+    <cs:fillRef idx="0"/>
+    <cs:effectRef idx="0"/>
+    <cs:fontRef idx="minor">
+      <a:schemeClr val="tx1"/>
+    </cs:fontRef>
+    <cs:spPr>
+      <a:ln w="9525" cap="flat" cmpd="sng" algn="ctr">
+        <a:solidFill>
+          <a:schemeClr val="tx1">
+            <a:lumMod val="65000"/>
+            <a:lumOff val="35000"/>
+          </a:schemeClr>
+        </a:solidFill>
+        <a:round/>
+      </a:ln>
+    </cs:spPr>
+  </cs:errorBar>
+  <cs:floor>
+    <cs:lnRef idx="0"/>
+    <cs:fillRef idx="0"/>
+    <cs:effectRef idx="0"/>
+    <cs:fontRef idx="minor">
+      <a:schemeClr val="tx1"/>
+    </cs:fontRef>
+    <cs:spPr>
+      <a:noFill/>
+      <a:ln>
+        <a:noFill/>
+      </a:ln>
+    </cs:spPr>
+  </cs:floor>
+  <cs:gridlineMajor>
+    <cs:lnRef idx="0"/>
+    <cs:fillRef idx="0"/>
+    <cs:effectRef idx="0"/>
+    <cs:fontRef idx="minor">
+      <a:schemeClr val="tx1"/>
+    </cs:fontRef>
+    <cs:spPr>
+      <a:ln w="9525" cap="flat" cmpd="sng" algn="ctr">
+        <a:solidFill>
+          <a:schemeClr val="tx1">
+            <a:lumMod val="15000"/>
+            <a:lumOff val="85000"/>
+          </a:schemeClr>
+        </a:solidFill>
+        <a:round/>
+      </a:ln>
+    </cs:spPr>
+  </cs:gridlineMajor>
+  <cs:gridlineMinor>
+    <cs:lnRef idx="0"/>
+    <cs:fillRef idx="0"/>
+    <cs:effectRef idx="0"/>
+    <cs:fontRef idx="minor">
+      <a:schemeClr val="tx1"/>
+    </cs:fontRef>
+    <cs:spPr>
+      <a:ln w="9525" cap="flat" cmpd="sng" algn="ctr">
+        <a:solidFill>
+          <a:schemeClr val="tx1">
+            <a:lumMod val="5000"/>
+            <a:lumOff val="95000"/>
+          </a:schemeClr>
+        </a:solidFill>
+        <a:round/>
+      </a:ln>
+    </cs:spPr>
+  </cs:gridlineMinor>
+  <cs:hiLoLine>
+    <cs:lnRef idx="0"/>
+    <cs:fillRef idx="0"/>
+    <cs:effectRef idx="0"/>
+    <cs:fontRef idx="minor">
+      <a:schemeClr val="tx1"/>
+    </cs:fontRef>
+    <cs:spPr>
+      <a:ln w="9525" cap="flat" cmpd="sng" algn="ctr">
+        <a:solidFill>
+          <a:schemeClr val="tx1">
+            <a:lumMod val="50000"/>
+            <a:lumOff val="50000"/>
+          </a:schemeClr>
+        </a:solidFill>
+        <a:round/>
+      </a:ln>
+    </cs:spPr>
+  </cs:hiLoLine>
+  <cs:leaderLine>
+    <cs:lnRef idx="0"/>
+    <cs:fillRef idx="0"/>
+    <cs:effectRef idx="0"/>
+    <cs:fontRef idx="minor">
+      <a:schemeClr val="tx1"/>
+    </cs:fontRef>
+    <cs:spPr>
+      <a:ln w="9525" cap="flat" cmpd="sng" algn="ctr">
+        <a:solidFill>
+          <a:schemeClr val="tx1">
+            <a:lumMod val="35000"/>
+            <a:lumOff val="65000"/>
+          </a:schemeClr>
+        </a:solidFill>
+        <a:round/>
+      </a:ln>
+    </cs:spPr>
+  </cs:leaderLine>
+  <cs:legend>
+    <cs:lnRef idx="0"/>
+    <cs:fillRef idx="0"/>
+    <cs:effectRef idx="0"/>
+    <cs:fontRef idx="minor">
+      <a:schemeClr val="tx1">
+        <a:lumMod val="65000"/>
+        <a:lumOff val="35000"/>
+      </a:schemeClr>
+    </cs:fontRef>
+    <cs:defRPr sz="900" kern="1200"/>
+  </cs:legend>
+  <cs:plotArea mods="allowNoFillOverride allowNoLineOverride">
+    <cs:lnRef idx="0"/>
+    <cs:fillRef idx="0"/>
+    <cs:effectRef idx="0"/>
+    <cs:fontRef idx="minor">
+      <a:schemeClr val="tx1"/>
+    </cs:fontRef>
+  </cs:plotArea>
+  <cs:plotArea3D mods="allowNoFillOverride allowNoLineOverride">
+    <cs:lnRef idx="0"/>
+    <cs:fillRef idx="0"/>
+    <cs:effectRef idx="0"/>
+    <cs:fontRef idx="minor">
+      <a:schemeClr val="tx1"/>
+    </cs:fontRef>
+  </cs:plotArea3D>
+  <cs:seriesAxis>
+    <cs:lnRef idx="0"/>
+    <cs:fillRef idx="0"/>
+    <cs:effectRef idx="0"/>
+    <cs:fontRef idx="minor">
+      <a:schemeClr val="tx1">
+        <a:lumMod val="65000"/>
+        <a:lumOff val="35000"/>
+      </a:schemeClr>
+    </cs:fontRef>
+    <cs:defRPr sz="900" kern="1200"/>
+  </cs:seriesAxis>
+  <cs:seriesLine>
+    <cs:lnRef idx="0"/>
+    <cs:fillRef idx="0"/>
+    <cs:effectRef idx="0"/>
+    <cs:fontRef idx="minor">
+      <a:schemeClr val="tx1"/>
+    </cs:fontRef>
+    <cs:spPr>
+      <a:ln w="9525" cap="flat" cmpd="sng" algn="ctr">
+        <a:solidFill>
+          <a:schemeClr val="tx1">
+            <a:lumMod val="35000"/>
+            <a:lumOff val="65000"/>
+          </a:schemeClr>
+        </a:solidFill>
+        <a:round/>
+      </a:ln>
+    </cs:spPr>
+  </cs:seriesLine>
+  <cs:title>
+    <cs:lnRef idx="0"/>
+    <cs:fillRef idx="0"/>
+    <cs:effectRef idx="0"/>
+    <cs:fontRef idx="minor">
+      <a:schemeClr val="tx1">
+        <a:lumMod val="65000"/>
+        <a:lumOff val="35000"/>
+      </a:schemeClr>
+    </cs:fontRef>
+    <cs:defRPr sz="1400" b="0" kern="1200" spc="0" baseline="0"/>
+  </cs:title>
+  <cs:trendline>
+    <cs:lnRef idx="0">
+      <cs:styleClr val="auto"/>
+    </cs:lnRef>
+    <cs:fillRef idx="0"/>
+    <cs:effectRef idx="0"/>
+    <cs:fontRef idx="minor">
+      <a:schemeClr val="tx1"/>
+    </cs:fontRef>
+    <cs:spPr>
+      <a:ln w="19050" cap="rnd">
+        <a:solidFill>
+          <a:schemeClr val="phClr"/>
+        </a:solidFill>
+        <a:prstDash val="sysDot"/>
+      </a:ln>
+    </cs:spPr>
+  </cs:trendline>
+  <cs:trendlineLabel>
+    <cs:lnRef idx="0"/>
+    <cs:fillRef idx="0"/>
+    <cs:effectRef idx="0"/>
+    <cs:fontRef idx="minor">
+      <a:schemeClr val="tx1">
+        <a:lumMod val="65000"/>
+        <a:lumOff val="35000"/>
+      </a:schemeClr>
+    </cs:fontRef>
+    <cs:defRPr sz="900" kern="1200"/>
+  </cs:trendlineLabel>
+  <cs:upBar>
+    <cs:lnRef idx="0"/>
+    <cs:fillRef idx="0"/>
+    <cs:effectRef idx="0"/>
+    <cs:fontRef idx="minor">
+      <a:schemeClr val="tx1"/>
+    </cs:fontRef>
+    <cs:spPr>
+      <a:solidFill>
+        <a:schemeClr val="lt1"/>
+      </a:solidFill>
+      <a:ln w="9525" cap="flat" cmpd="sng" algn="ctr">
+        <a:solidFill>
+          <a:schemeClr val="tx1">
+            <a:lumMod val="65000"/>
+            <a:lumOff val="35000"/>
+          </a:schemeClr>
+        </a:solidFill>
+        <a:round/>
+      </a:ln>
+    </cs:spPr>
+  </cs:upBar>
+  <cs:valueAxis>
+    <cs:lnRef idx="0"/>
+    <cs:fillRef idx="0"/>
+    <cs:effectRef idx="0"/>
+    <cs:fontRef idx="minor">
+      <a:schemeClr val="tx1">
+        <a:lumMod val="65000"/>
+        <a:lumOff val="35000"/>
+      </a:schemeClr>
+    </cs:fontRef>
+    <cs:defRPr sz="900" kern="1200"/>
+  </cs:valueAxis>
+  <cs:wall>
+    <cs:lnRef idx="0"/>
+    <cs:fillRef idx="0"/>
+    <cs:effectRef idx="0"/>
+    <cs:fontRef idx="minor">
+      <a:schemeClr val="tx1"/>
+    </cs:fontRef>
+    <cs:spPr>
+      <a:noFill/>
+      <a:ln>
+        <a:noFill/>
+      </a:ln>
+    </cs:spPr>
+  </cs:wall>
+</cs:chartStyle>
+</file>
+
 <file path=word/theme/theme1.xml><?xml version="1.0" encoding="utf-8"?>
 <a:theme xmlns:a="http://schemas.openxmlformats.org/drawingml/2006/main" name="Office Theme">
   <a:themeElements>

</xml_diff>

<commit_message>
Data Structures and methods of access cus UI is too hard to do im confused on how to do it
</commit_message>
<xml_diff>
--- a/Investigation.docx
+++ b/Investigation.docx
@@ -7,6 +7,31 @@
         <w:pStyle w:val="Heading1"/>
         <w:rPr>
           <w:b/>
+          <w:color w:val="A02B93" w:themeColor="accent5"/>
+        </w:rPr>
+      </w:pPr>
+      <w:proofErr w:type="spellStart"/>
+      <w:r>
+        <w:rPr>
+          <w:b/>
+          <w:color w:val="A02B93" w:themeColor="accent5"/>
+        </w:rPr>
+        <w:t>Filmtopia</w:t>
+      </w:r>
+      <w:proofErr w:type="spellEnd"/>
+      <w:r>
+        <w:rPr>
+          <w:b/>
+          <w:color w:val="A02B93" w:themeColor="accent5"/>
+        </w:rPr>
+        <w:t xml:space="preserve"> Project Investigation</w:t>
+      </w:r>
+    </w:p>
+    <w:p>
+      <w:pPr>
+        <w:pStyle w:val="Heading2"/>
+        <w:rPr>
+          <w:b/>
           <w:color w:val="000000" w:themeColor="text1"/>
         </w:rPr>
       </w:pPr>
@@ -15,7 +40,39 @@
           <w:b/>
           <w:color w:val="000000" w:themeColor="text1"/>
         </w:rPr>
-        <w:t>Filmtopia Project Investigation</w:t>
+        <w:t>Introduction</w:t>
+      </w:r>
+    </w:p>
+    <w:p>
+      <w:pPr>
+        <w:spacing w:line="276" w:lineRule="auto"/>
+      </w:pPr>
+      <w:proofErr w:type="spellStart"/>
+      <w:r>
+        <w:t>Filmtopia</w:t>
+      </w:r>
+      <w:proofErr w:type="spellEnd"/>
+      <w:r>
+        <w:t xml:space="preserve"> is a small independent cinema theatre who is currently managing all business data using spreadsheets and paper. They sell food drinks and tickets using a variety of means such as a touchscreen kiosk which can only handle food and drinks and a concessions area where employees handle the business. The management of </w:t>
+      </w:r>
+      <w:proofErr w:type="spellStart"/>
+      <w:r>
+        <w:t>Filmtopia</w:t>
+      </w:r>
+      <w:proofErr w:type="spellEnd"/>
+      <w:r>
+        <w:t xml:space="preserve"> has come to notice that they are falling back on managing and analysing the cinema, this means keeping track of sales records, screening analytics and a customer interest evaluation. I am now going to investigate further on how </w:t>
+      </w:r>
+      <w:proofErr w:type="spellStart"/>
+      <w:r>
+        <w:t>Filmtopia</w:t>
+      </w:r>
+      <w:proofErr w:type="spellEnd"/>
+      <w:r>
+        <w:t xml:space="preserve"> functions to get a better understanding of how I should move with this project.</w:t>
+      </w:r>
+      <w:r>
+        <w:tab/>
       </w:r>
     </w:p>
     <w:p>
@@ -23,15 +80,17 @@
         <w:pStyle w:val="Heading2"/>
         <w:rPr>
           <w:b/>
+          <w:bCs/>
           <w:color w:val="000000" w:themeColor="text1"/>
         </w:rPr>
       </w:pPr>
       <w:r>
         <w:rPr>
           <w:b/>
+          <w:bCs/>
           <w:color w:val="000000" w:themeColor="text1"/>
         </w:rPr>
-        <w:t>Introduction</w:t>
+        <w:t>Stakeholder Analysis</w:t>
       </w:r>
     </w:p>
     <w:p>
@@ -39,28 +98,7 @@
         <w:spacing w:line="276" w:lineRule="auto"/>
       </w:pPr>
       <w:r>
-        <w:t>Filmtopia is a small independent cinema theatre who is currently managing all business data using spreadsheets and paper. They sell food drinks and tickets using a variety of means such as a touchscreen kiosk which can only handle food and drinks and a concessions area where employees handle the business. The management of Filmtopia has come to notice that they are falling back on managing and analysing the cinema, this means keeping track of sales records, screening analytics and a customer interest evaluation. I am now going to investigate further on how Filmtopia functions to get a better understanding of how I should move with this project.</w:t>
-      </w:r>
-      <w:r>
-        <w:tab/>
-      </w:r>
-    </w:p>
-    <w:p>
-      <w:pPr>
-        <w:pStyle w:val="Heading2"/>
-        <w:rPr>
-          <w:b/>
-          <w:bCs/>
-          <w:color w:val="000000" w:themeColor="text1"/>
-        </w:rPr>
-      </w:pPr>
-      <w:r>
-        <w:rPr>
-          <w:b/>
-          <w:bCs/>
-          <w:color w:val="000000" w:themeColor="text1"/>
-        </w:rPr>
-        <w:t>Stakeholder Analysis</w:t>
+        <w:t>Before beginning the investigation it is important to identify who the stakeholders are for this project. A stakeholder is any individual or group who has an interest in the system, will be affected by it or has the power to influence how it is developed. Identifying stakeholders early on ensures that the requirements gathered throughout the investigation reflect the needs of everyone involved rather than just one person.</w:t>
       </w:r>
     </w:p>
     <w:p>
@@ -68,15 +106,15 @@
         <w:spacing w:line="276" w:lineRule="auto"/>
       </w:pPr>
       <w:r>
-        <w:t>Before beginning the investigation it is important to identify who the stakeholders are for this project. A stakeholder is any individual or group who has an interest in the system, will be affected by it or has the power to influence how it is developed. Identifying stakeholders early on ensures that the requirements gathered throughout the investigation reflect the needs of everyone involved rather than just one person.</w:t>
-      </w:r>
-    </w:p>
-    <w:p>
-      <w:pPr>
-        <w:spacing w:line="276" w:lineRule="auto"/>
-      </w:pPr>
-      <w:r>
-        <w:t>For the Filmtopia system the stakeholders can be split into two groups, primary and secondary. Primary stakeholders are those who will interact with the system directly on a regular basis. Secondary stakeholders are those who are affected by the system indirectly or whose work is influenced by it without them necessarily using it themselves.</w:t>
+        <w:t xml:space="preserve">For the </w:t>
+      </w:r>
+      <w:proofErr w:type="spellStart"/>
+      <w:r>
+        <w:t>Filmtopia</w:t>
+      </w:r>
+      <w:proofErr w:type="spellEnd"/>
+      <w:r>
+        <w:t xml:space="preserve"> system the stakeholders can be split into two groups, primary and secondary. Primary stakeholders are those who will interact with the system directly on a regular basis. Secondary stakeholders are those who are affected by the system indirectly or whose work is influenced by it without them necessarily using it themselves.</w:t>
       </w:r>
     </w:p>
     <w:p>
@@ -104,7 +142,31 @@
         <w:spacing w:line="276" w:lineRule="auto"/>
       </w:pPr>
       <w:r>
-        <w:t>The third primary stakeholder is the customer base of Filmtopia. Customers interact with the system either directly through the proposed self service kiosk or indirectly when staff process their bookings on their behalf. Their main interests are convenience, short queue times and the assurance that the seat they have been allocated will actually be available when they arrive. The questionnaire results discussed later in this investigation show that a large majority of customers would prefer self service ticketing and that seat selection is considered important by most respondents. This means the bar for the kiosk interface is high and it needs to be clean and simple enough for any customer to use without assistance.</w:t>
+        <w:t xml:space="preserve">The third primary stakeholder is the customer base of </w:t>
+      </w:r>
+      <w:proofErr w:type="spellStart"/>
+      <w:r>
+        <w:t>Filmtopia</w:t>
+      </w:r>
+      <w:proofErr w:type="spellEnd"/>
+      <w:r>
+        <w:t xml:space="preserve">. Customers interact with the system either directly through the proposed </w:t>
+      </w:r>
+      <w:proofErr w:type="spellStart"/>
+      <w:r>
+        <w:t>self service</w:t>
+      </w:r>
+      <w:proofErr w:type="spellEnd"/>
+      <w:r>
+        <w:t xml:space="preserve"> kiosk or indirectly when staff process their bookings on their behalf. Their main interests are convenience, short queue times and the assurance that the seat they have been allocated will actually be available when they arrive. The questionnaire results discussed later in this investigation show that a large majority of customers would prefer </w:t>
+      </w:r>
+      <w:proofErr w:type="spellStart"/>
+      <w:r>
+        <w:t>self service</w:t>
+      </w:r>
+      <w:proofErr w:type="spellEnd"/>
+      <w:r>
+        <w:t xml:space="preserve"> ticketing and that seat selection is considered important by most respondents. This means the bar for the kiosk interface is high and it needs to be clean and simple enough for any customer to use without assistance.</w:t>
       </w:r>
     </w:p>
     <w:p>
@@ -120,12 +182,28 @@
         <w:spacing w:line="276" w:lineRule="auto"/>
       </w:pPr>
       <w:r>
-        <w:t>Another secondary stakeholder is any external IT support that Filmtopia uses. As a small independent cinema there is no dedicated IT department meaning the system must be robust and straightforward to maintain. Complex setups that require specialist knowledge to troubleshoot would be impractical for a business of this size.</w:t>
-      </w:r>
-    </w:p>
-    <w:p>
-      <w:r>
-        <w:t>In summary the stakeholder analysis makes clear that the Filmtopia system needs to serve a wide range of users with different levels of technical confidence and different priorities. The investigation that follows has been designed to gather requirements from as many of these stakeholders as possible to ensure the final system genuinely reflects the needs of everyone who will be affected by it.</w:t>
+        <w:t xml:space="preserve">Another secondary stakeholder is any external IT support that </w:t>
+      </w:r>
+      <w:proofErr w:type="spellStart"/>
+      <w:r>
+        <w:t>Filmtopia</w:t>
+      </w:r>
+      <w:proofErr w:type="spellEnd"/>
+      <w:r>
+        <w:t xml:space="preserve"> uses. As a small independent cinema there is no dedicated IT department meaning the system must be robust and straightforward to maintain. Complex setups that require specialist knowledge to troubleshoot would be impractical for a business of this size.</w:t>
+      </w:r>
+    </w:p>
+    <w:p>
+      <w:r>
+        <w:t xml:space="preserve">In summary the stakeholder analysis makes clear that the </w:t>
+      </w:r>
+      <w:proofErr w:type="spellStart"/>
+      <w:r>
+        <w:t>Filmtopia</w:t>
+      </w:r>
+      <w:proofErr w:type="spellEnd"/>
+      <w:r>
+        <w:t xml:space="preserve"> system needs to serve a wide range of users with different levels of technical confidence and different priorities. The investigation that follows has been designed to gather requirements from as many of these stakeholders as possible to ensure the final system genuinely reflects the needs of everyone who will be affected by it.</w:t>
       </w:r>
     </w:p>
     <w:p>
@@ -677,14 +755,52 @@
                 <w:lang w:val="fr-FR"/>
               </w:rPr>
             </w:pPr>
+            <w:proofErr w:type="spellStart"/>
             <w:r>
               <w:rPr>
                 <w:sz w:val="20"/>
                 <w:szCs w:val="20"/>
                 <w:lang w:val="fr-FR"/>
               </w:rPr>
-              <w:t>Summarise and interpret questionnaire responses</w:t>
-            </w:r>
+              <w:t>Summarise</w:t>
+            </w:r>
+            <w:proofErr w:type="spellEnd"/>
+            <w:r>
+              <w:rPr>
+                <w:sz w:val="20"/>
+                <w:szCs w:val="20"/>
+                <w:lang w:val="fr-FR"/>
+              </w:rPr>
+              <w:t xml:space="preserve"> and </w:t>
+            </w:r>
+            <w:proofErr w:type="spellStart"/>
+            <w:r>
+              <w:rPr>
+                <w:sz w:val="20"/>
+                <w:szCs w:val="20"/>
+                <w:lang w:val="fr-FR"/>
+              </w:rPr>
+              <w:t>interpret</w:t>
+            </w:r>
+            <w:proofErr w:type="spellEnd"/>
+            <w:r>
+              <w:rPr>
+                <w:sz w:val="20"/>
+                <w:szCs w:val="20"/>
+                <w:lang w:val="fr-FR"/>
+              </w:rPr>
+              <w:t xml:space="preserve"> questionnaire </w:t>
+            </w:r>
+            <w:proofErr w:type="spellStart"/>
+            <w:r>
+              <w:rPr>
+                <w:sz w:val="20"/>
+                <w:szCs w:val="20"/>
+                <w:lang w:val="fr-FR"/>
+              </w:rPr>
+              <w:t>responses</w:t>
+            </w:r>
+            <w:proofErr w:type="spellEnd"/>
           </w:p>
         </w:tc>
       </w:tr>
@@ -1480,7 +1596,15 @@
         <w:spacing w:line="276" w:lineRule="auto"/>
       </w:pPr>
       <w:r>
-        <w:t>Moving on to the customer questionnaire, this was chosen because it allowed a much larger group of stakeholders to contribute to the investigation than would have been possible through interviews alone. Interviewing every customer individually would not be realistic, so a questionnaire was the most practical way to gather their views. The key advantage of a questionnaire is that it produces quantitative data which is easier to summarise and use as justification for design decisions. For example knowing that a large majority of customers would prefer a self service kiosk is a much stronger argument for including that feature than one person mentioning it in an interview. The limitation of a questionnaire is that the questions are fixed which means there is no opportunity to follow up on responses or ask for more detail. To partially work around this some of the questions included a list of options rather than just a yes or no answer which produced more useful and specific data.</w:t>
+        <w:t xml:space="preserve">Moving on to the customer questionnaire, this was chosen because it allowed a much larger group of stakeholders to contribute to the investigation than would have been possible through interviews alone. Interviewing every customer individually would not be realistic, so a questionnaire was the most practical way to gather their views. The key advantage of a questionnaire is that it produces quantitative data which is easier to summarise and use as justification for design decisions. For example knowing that a large majority of customers would prefer a </w:t>
+      </w:r>
+      <w:proofErr w:type="spellStart"/>
+      <w:r>
+        <w:t>self service</w:t>
+      </w:r>
+      <w:proofErr w:type="spellEnd"/>
+      <w:r>
+        <w:t xml:space="preserve"> kiosk is a much stronger argument for including that feature than one person mentioning it in an interview. The limitation of a questionnaire is that the questions are fixed which means there is no opportunity to follow up on responses or ask for more detail. To partially work around this some of the questions included a list of options rather than just a yes or no answer which produced more useful and specific data.</w:t>
       </w:r>
     </w:p>
     <w:p>
@@ -1583,7 +1707,23 @@
           <w:b/>
           <w:bCs/>
         </w:rPr>
-        <w:t>Q: Can you describe how Filmtopia currently manages its ticketing and bookings?</w:t>
+        <w:t xml:space="preserve">Q: Can you describe how </w:t>
+      </w:r>
+      <w:proofErr w:type="spellStart"/>
+      <w:r>
+        <w:rPr>
+          <w:b/>
+          <w:bCs/>
+        </w:rPr>
+        <w:t>Filmtopia</w:t>
+      </w:r>
+      <w:proofErr w:type="spellEnd"/>
+      <w:r>
+        <w:rPr>
+          <w:b/>
+          <w:bCs/>
+        </w:rPr>
+        <w:t xml:space="preserve"> currently manages its ticketing and bookings?</w:t>
       </w:r>
     </w:p>
     <w:p>
@@ -1623,7 +1763,23 @@
           <w:b/>
           <w:bCs/>
         </w:rPr>
-        <w:t>Q: What data does Filmtopia currently store and how?</w:t>
+        <w:t xml:space="preserve">Q: What data does </w:t>
+      </w:r>
+      <w:proofErr w:type="spellStart"/>
+      <w:r>
+        <w:rPr>
+          <w:b/>
+          <w:bCs/>
+        </w:rPr>
+        <w:t>Filmtopia</w:t>
+      </w:r>
+      <w:proofErr w:type="spellEnd"/>
+      <w:r>
+        <w:rPr>
+          <w:b/>
+          <w:bCs/>
+        </w:rPr>
+        <w:t xml:space="preserve"> currently store and how?</w:t>
       </w:r>
     </w:p>
     <w:p>
@@ -1841,7 +1997,15 @@
         <w:spacing w:line="276" w:lineRule="auto"/>
       </w:pPr>
       <w:r>
-        <w:t>A questionnaire was distributed to customers visiting Filmtopia in order to gather feedback on their experience with the current system and to understand what they would want from a new one. It was administered on the 15th of January 2026 as a paper questionnaire handed to customers at the cinema, and 20 responses were collected. The questions and summarised responses are as follows.</w:t>
+        <w:t xml:space="preserve">A questionnaire was distributed to customers visiting </w:t>
+      </w:r>
+      <w:proofErr w:type="spellStart"/>
+      <w:r>
+        <w:t>Filmtopia</w:t>
+      </w:r>
+      <w:proofErr w:type="spellEnd"/>
+      <w:r>
+        <w:t xml:space="preserve"> in order to gather feedback on their experience with the current system and to understand what they would want from a new one. It was administered on the 15th of January 2026 as a paper questionnaire handed to customers at the cinema, and 20 responses were collected. The questions and summarised responses are as follows.</w:t>
       </w:r>
     </w:p>
     <w:p>
@@ -1859,7 +2023,25 @@
           <w:bCs/>
           <w:color w:val="000000" w:themeColor="text1"/>
         </w:rPr>
-        <w:t>Q1: How do you currently purchase your tickets at Filmtopia?</w:t>
+        <w:t xml:space="preserve">Q1: How do you currently purchase your tickets at </w:t>
+      </w:r>
+      <w:proofErr w:type="spellStart"/>
+      <w:r>
+        <w:rPr>
+          <w:b/>
+          <w:bCs/>
+          <w:color w:val="000000" w:themeColor="text1"/>
+        </w:rPr>
+        <w:t>Filmtopia</w:t>
+      </w:r>
+      <w:proofErr w:type="spellEnd"/>
+      <w:r>
+        <w:rPr>
+          <w:b/>
+          <w:bCs/>
+          <w:color w:val="000000" w:themeColor="text1"/>
+        </w:rPr>
+        <w:t>?</w:t>
       </w:r>
     </w:p>
     <w:tbl>
@@ -2081,7 +2263,25 @@
           <w:bCs/>
           <w:color w:val="000000" w:themeColor="text1"/>
         </w:rPr>
-        <w:t>Q2: Have you ever experienced a problem when booking tickets at Filmtopia?</w:t>
+        <w:t xml:space="preserve">Q2: Have you ever experienced a problem when booking tickets at </w:t>
+      </w:r>
+      <w:proofErr w:type="spellStart"/>
+      <w:r>
+        <w:rPr>
+          <w:b/>
+          <w:bCs/>
+          <w:color w:val="000000" w:themeColor="text1"/>
+        </w:rPr>
+        <w:t>Filmtopia</w:t>
+      </w:r>
+      <w:proofErr w:type="spellEnd"/>
+      <w:r>
+        <w:rPr>
+          <w:b/>
+          <w:bCs/>
+          <w:color w:val="000000" w:themeColor="text1"/>
+        </w:rPr>
+        <w:t>?</w:t>
       </w:r>
     </w:p>
     <w:tbl>
@@ -2994,7 +3194,15 @@
         <w:spacing w:line="276" w:lineRule="auto"/>
       </w:pPr>
       <w:r>
-        <w:t>85% of customers felt seat selection was at least quite important. This supports the planned graphical seat selection feature in the Filmtopia system.</w:t>
+        <w:t xml:space="preserve">85% of customers felt seat selection was at least quite important. This supports the planned graphical seat selection feature in the </w:t>
+      </w:r>
+      <w:proofErr w:type="spellStart"/>
+      <w:r>
+        <w:t>Filmtopia</w:t>
+      </w:r>
+      <w:proofErr w:type="spellEnd"/>
+      <w:r>
+        <w:t xml:space="preserve"> system.</w:t>
       </w:r>
     </w:p>
     <w:p>
@@ -3224,7 +3432,15 @@
         <w:spacing w:line="276" w:lineRule="auto"/>
       </w:pPr>
       <w:r>
-        <w:t>The questionnaire results clearly show that customers are experiencing real problems with the current system at Filmtopia. The most significant issues are long queues at the box office, errors with seat allocation and the inability to book tickets through the kiosk. The results also show strong demand for a self-service ticketing kiosk, graphical seat selection and combined food and drink ordering. These findings have directly informed the objectives set out later in this investigation.</w:t>
+        <w:t xml:space="preserve">The questionnaire results clearly show that customers are experiencing real problems with the current system at </w:t>
+      </w:r>
+      <w:proofErr w:type="spellStart"/>
+      <w:r>
+        <w:t>Filmtopia</w:t>
+      </w:r>
+      <w:proofErr w:type="spellEnd"/>
+      <w:r>
+        <w:t>. The most significant issues are long queues at the box office, errors with seat allocation and the inability to book tickets through the kiosk. The results also show strong demand for a self-service ticketing kiosk, graphical seat selection and combined food and drink ordering. These findings have directly informed the objectives set out later in this investigation.</w:t>
       </w:r>
     </w:p>
     <w:p>
@@ -3250,7 +3466,15 @@
         <w:spacing w:line="276" w:lineRule="auto"/>
       </w:pPr>
       <w:r>
-        <w:t>As part of the investigation I visited Filmtopia during an evening showing to observe how the current system operates in practice. Rather than asking questions or interrupting the workflow I simply watched how staff handled customers during the pre-screening period when the cinema was at its busiest. The aim was to see the existing system in action and to identify any problems that might not have come up during the interviews or questionnaire.</w:t>
+        <w:t xml:space="preserve">As part of the investigation I visited </w:t>
+      </w:r>
+      <w:proofErr w:type="spellStart"/>
+      <w:r>
+        <w:t>Filmtopia</w:t>
+      </w:r>
+      <w:proofErr w:type="spellEnd"/>
+      <w:r>
+        <w:t xml:space="preserve"> during an evening showing to observe how the current system operates in practice. Rather than asking questions or interrupting the workflow I simply watched how staff handled customers during the pre-screening period when the cinema was at its busiest. The aim was to see the existing system in action and to identify any problems that might not have come up during the interviews or questionnaire.</w:t>
       </w:r>
     </w:p>
     <w:p>
@@ -3791,7 +4015,15 @@
         <w:spacing w:line="276" w:lineRule="auto"/>
       </w:pPr>
       <w:r>
-        <w:t>The Vue homepage presents films visually using large poster images organised under a Top Films heading. Each film is displayed with its title clearly beneath it and the page includes a Quick Book bar at the bottom allowing users to search by venue, film, date and time simultaneously. This is a clean and intuitive way of presenting information that allows customers to find what they want quickly without having to navigate through multiple pages. For the Filmtopia system I will incorporate a similar visual approach to displaying films on the customer kiosk, ensuring that screenings are easy to browse and select.</w:t>
+        <w:t xml:space="preserve">The Vue homepage presents films visually using large poster images organised under a Top Films heading. Each film is displayed with its title clearly beneath it and the page includes a Quick Book bar at the bottom allowing users to search by venue, film, date and time simultaneously. This is a clean and intuitive way of presenting information that allows customers to find what they want quickly without having to navigate through multiple pages. For the </w:t>
+      </w:r>
+      <w:proofErr w:type="spellStart"/>
+      <w:r>
+        <w:t>Filmtopia</w:t>
+      </w:r>
+      <w:proofErr w:type="spellEnd"/>
+      <w:r>
+        <w:t xml:space="preserve"> system I will incorporate a similar visual approach to displaying films on the customer kiosk, ensuring that screenings are easy to browse and select.</w:t>
       </w:r>
     </w:p>
     <w:p>
@@ -3877,7 +4109,15 @@
         <w:spacing w:line="276" w:lineRule="auto"/>
       </w:pPr>
       <w:r>
-        <w:t>When a film is selected Vue displays all upcoming showings for that film at the chosen venue, organised by date and time. Each screening card shows the start and end time, the screen number and the ticket price. Accessibility information such as audio description and wheelchair access is also clearly displayed. This level of detail is something I aim to replicate in Filmtopia, where staff and customers should be able to see all relevant information about a screening at a glance without having to search through multiple menus.</w:t>
+        <w:t xml:space="preserve">When a film is selected Vue displays all upcoming showings for that film at the chosen venue, organised by date and time. Each screening card shows the start and end time, the screen number and the ticket price. Accessibility information such as audio description and wheelchair access is also clearly displayed. This level of detail is something I aim to replicate in </w:t>
+      </w:r>
+      <w:proofErr w:type="spellStart"/>
+      <w:r>
+        <w:t>Filmtopia</w:t>
+      </w:r>
+      <w:proofErr w:type="spellEnd"/>
+      <w:r>
+        <w:t>, where staff and customers should be able to see all relevant information about a screening at a glance without having to search through multiple menus.</w:t>
       </w:r>
     </w:p>
     <w:p>
@@ -3963,7 +4203,15 @@
         <w:spacing w:line="276" w:lineRule="auto"/>
       </w:pPr>
       <w:r>
-        <w:t>Vue's seat selection interface is a standout feature of their system. It displays a graphical layout of the screen showing every seat as a coloured icon, with different colours representing different seat types and prices. VIP seats are shown in orange at £8.49, Regular seats in black at £7.49, Saver seats in green at £6.49 and Super Saver seats in red at £4.99. Occupied seats are shown in grey so customers can immediately see what is available. Rows are labelled alphabetically on the left hand side. This graphical seat selection is a key feature I plan to implement in Filmtopia as it directly addresses the double booking problem identified in the interviews. By showing customers and staff exactly which seats are taken in real time the system eliminates the risk of two people being assigned the same seat.</w:t>
+        <w:t xml:space="preserve">Vue's seat selection interface is a standout feature of their system. It displays a graphical layout of the screen showing every seat as a coloured icon, with different colours representing different seat types and prices. VIP seats are shown in orange at £8.49, Regular seats in black at £7.49, Saver seats in green at £6.49 and Super Saver seats in red at £4.99. Occupied seats are shown in grey so customers can immediately see what is available. Rows are labelled alphabetically on the left hand side. This graphical seat selection is a key feature I plan to implement in </w:t>
+      </w:r>
+      <w:proofErr w:type="spellStart"/>
+      <w:r>
+        <w:t>Filmtopia</w:t>
+      </w:r>
+      <w:proofErr w:type="spellEnd"/>
+      <w:r>
+        <w:t xml:space="preserve"> as it directly addresses the double booking problem identified in the interviews. By showing customers and staff exactly which seats are taken in real time the system eliminates the risk of two people being assigned the same seat.</w:t>
       </w:r>
     </w:p>
     <w:p>
@@ -3975,8 +4223,17 @@
           <w:b/>
           <w:bCs/>
         </w:rPr>
-        <w:t>Features Identified for Filmtopia</w:t>
-      </w:r>
+        <w:t xml:space="preserve">Features Identified for </w:t>
+      </w:r>
+      <w:proofErr w:type="spellStart"/>
+      <w:r>
+        <w:rPr>
+          <w:b/>
+          <w:bCs/>
+        </w:rPr>
+        <w:t>Filmtopia</w:t>
+      </w:r>
+      <w:proofErr w:type="spellEnd"/>
     </w:p>
     <w:p>
       <w:pPr>
@@ -4071,7 +4328,15 @@
         <w:spacing w:line="276" w:lineRule="auto"/>
       </w:pPr>
       <w:r>
-        <w:t>The second system I researched was Odeon, which is the largest cinema chain in the UK. Odeon operates over 120 cinemas across the UK and Ireland and their online booking system offered several useful features to compare against Vue and to inform the design of Filmtopia.</w:t>
+        <w:t xml:space="preserve">The second system I researched was Odeon, which is the largest cinema chain in the UK. Odeon operates over 120 cinemas across the UK and Ireland and their online booking system offered several useful features to compare against Vue and to inform the design of </w:t>
+      </w:r>
+      <w:proofErr w:type="spellStart"/>
+      <w:r>
+        <w:t>Filmtopia</w:t>
+      </w:r>
+      <w:proofErr w:type="spellEnd"/>
+      <w:r>
+        <w:t>.</w:t>
       </w:r>
     </w:p>
     <w:p>
@@ -4157,7 +4422,15 @@
         <w:spacing w:line="276" w:lineRule="auto"/>
       </w:pPr>
       <w:r>
-        <w:t>Similar to Vue, Odeon presents films using large poster images organised under a Top Films heading. However Odeon includes additional information directly on the film page such as the director, cast, runtime, release date and genre tags. This richer level of detail gives customers more context before making a booking decision. Odeon also includes a quick search bar at the bottom of the page allowing users to filter by cinema, film, date and time. One notable difference from Vue is that Odeon uses a darker navy blue colour scheme throughout which creates a more premium feel. For Filmtopia I will aim to display key film information clearly on the customer kiosk so customers can make informed decisions quickly.</w:t>
+        <w:t xml:space="preserve">Similar to Vue, Odeon presents films using large poster images organised under a Top Films heading. However Odeon includes additional information directly on the film page such as the director, cast, runtime, release date and genre tags. This richer level of detail gives customers more context before making a booking decision. Odeon also includes a quick search bar at the bottom of the page allowing users to filter by cinema, film, date and time. One notable difference from Vue is that Odeon uses a darker navy blue colour scheme throughout which creates a more premium feel. For </w:t>
+      </w:r>
+      <w:proofErr w:type="spellStart"/>
+      <w:r>
+        <w:t>Filmtopia</w:t>
+      </w:r>
+      <w:proofErr w:type="spellEnd"/>
+      <w:r>
+        <w:t xml:space="preserve"> I will aim to display key film information clearly on the customer kiosk so customers can make informed decisions quickly.</w:t>
       </w:r>
     </w:p>
     <w:p>
@@ -4243,7 +4516,15 @@
         <w:spacing w:line="276" w:lineRule="auto"/>
       </w:pPr>
       <w:r>
-        <w:t>Odeon's screening times page clearly displays the film title, runtime, release date and genre alongside all available showtimes. Screenings are organised by date across the top of the page and grouped by cinema location below. Each screening card shows the start time, screen number and format such as 3D. A Book Now button is displayed prominently on each card making the next action immediately obvious. This clear layout is something I will replicate in Filmtopia where staff should be able to see all screenings for a given film at a glance.</w:t>
+        <w:t xml:space="preserve">Odeon's screening times page clearly displays the film title, runtime, release date and genre alongside all available showtimes. Screenings are organised by date across the top of the page and grouped by cinema location below. Each screening card shows the start time, screen number and format such as 3D. A Book Now button is displayed prominently on each card making the next action immediately obvious. This clear layout is something I will replicate in </w:t>
+      </w:r>
+      <w:proofErr w:type="spellStart"/>
+      <w:r>
+        <w:t>Filmtopia</w:t>
+      </w:r>
+      <w:proofErr w:type="spellEnd"/>
+      <w:r>
+        <w:t xml:space="preserve"> where staff should be able to see all screenings for a given film at a glance.</w:t>
       </w:r>
     </w:p>
     <w:p>
@@ -4329,7 +4610,23 @@
         <w:spacing w:line="276" w:lineRule="auto"/>
       </w:pPr>
       <w:r>
-        <w:t>Odeon's seat selection screen is particularly well designed and shows several features worth incorporating into Filmtopia. The screen displays a graphical layout of the entire auditorium with seats colour coded by type and price. Green seats represent Classic Saver at £14.99, cream seats represent Classic at £16.49 and orange seats represent Classic Popular at £17.99. Unavailable seats are shown with an X so it is immediately clear which seats cannot be booked. A seat key at the bottom explains the colour coding including wheelchair and companion seat options. The booking process is also clearly structured using a step by step tab navigation at the top showing Seats, Sign In, Tickets, Food, Summary and Payment. This staged approach guides the user through the process logically and reduces confusion. For Filmtopia I will incorporate a similar colour coded seat map and a clear step by step flow for the customer kiosk booking process.</w:t>
+        <w:t xml:space="preserve">Odeon's seat selection screen is particularly well designed and shows several features worth incorporating into </w:t>
+      </w:r>
+      <w:proofErr w:type="spellStart"/>
+      <w:r>
+        <w:t>Filmtopia</w:t>
+      </w:r>
+      <w:proofErr w:type="spellEnd"/>
+      <w:r>
+        <w:t xml:space="preserve">. The screen displays a graphical layout of the entire auditorium with seats colour coded by type and price. Green seats represent Classic Saver at £14.99, cream seats represent Classic at £16.49 and orange seats represent Classic Popular at £17.99. Unavailable seats are shown with an X so it is immediately clear which seats cannot be booked. A seat key at the bottom explains the colour coding including wheelchair and companion seat options. The booking process is also clearly structured using a step by step tab navigation at the top showing Seats, Sign In, Tickets, Food, Summary and Payment. This staged approach guides the user through the process logically and reduces confusion. For </w:t>
+      </w:r>
+      <w:proofErr w:type="spellStart"/>
+      <w:r>
+        <w:t>Filmtopia</w:t>
+      </w:r>
+      <w:proofErr w:type="spellEnd"/>
+      <w:r>
+        <w:t xml:space="preserve"> I will incorporate a similar colour coded seat map and a clear step by step flow for the customer kiosk booking process.</w:t>
       </w:r>
     </w:p>
     <w:p>
@@ -4341,8 +4638,17 @@
           <w:b/>
           <w:bCs/>
         </w:rPr>
-        <w:t>Features Identified for Filmtopia</w:t>
-      </w:r>
+        <w:t xml:space="preserve">Features Identified for </w:t>
+      </w:r>
+      <w:proofErr w:type="spellStart"/>
+      <w:r>
+        <w:rPr>
+          <w:b/>
+          <w:bCs/>
+        </w:rPr>
+        <w:t>Filmtopia</w:t>
+      </w:r>
+      <w:proofErr w:type="spellEnd"/>
     </w:p>
     <w:p>
       <w:pPr>
@@ -4561,7 +4867,15 @@
         <w:spacing w:line="276" w:lineRule="auto"/>
       </w:pPr>
       <w:r>
-        <w:t>The existing system at Filmtopia receives several types of input, all of which are entered manually by staff or the manager. When a customer arrives to book tickets a member of staff writes the customer's name, chosen film, screening time, number of tickets and preferred seats into a paper booking diary. There is no digital record of this at the point of entry meaning the accuracy of the data depends entirely on the staff member's handwriting and attention to detail.</w:t>
+        <w:t xml:space="preserve">The existing system at </w:t>
+      </w:r>
+      <w:proofErr w:type="spellStart"/>
+      <w:r>
+        <w:t>Filmtopia</w:t>
+      </w:r>
+      <w:proofErr w:type="spellEnd"/>
+      <w:r>
+        <w:t xml:space="preserve"> receives several types of input, all of which are entered manually by staff or the manager. When a customer arrives to book tickets a member of staff writes the customer's name, chosen film, screening time, number of tickets and preferred seats into a paper booking diary. There is no digital record of this at the point of entry meaning the accuracy of the data depends entirely on the staff member's handwriting and attention to detail.</w:t>
       </w:r>
     </w:p>
     <w:p>
@@ -4767,8 +5081,13 @@
       <w:pPr>
         <w:spacing w:line="276" w:lineRule="auto"/>
       </w:pPr>
-      <w:r>
-        <w:t>Filmtopia is a small independent cinema that is currently managing all of its operations using a combination of paper records and disconnected spreadsheets. This approach may have been adequate when the cinema first opened but it has become increasingly problematic as the demands on the system have grown. The core problem is that the existing system is unreliable, slow and disconnected, and this is having a direct negative impact on both staff and customers.</w:t>
+      <w:proofErr w:type="spellStart"/>
+      <w:r>
+        <w:t>Filmtopia</w:t>
+      </w:r>
+      <w:proofErr w:type="spellEnd"/>
+      <w:r>
+        <w:t xml:space="preserve"> is a small independent cinema that is currently managing all of its operations using a combination of paper records and disconnected spreadsheets. This approach may have been adequate when the cinema first opened but it has become increasingly problematic as the demands on the system have grown. The core problem is that the existing system is unreliable, slow and disconnected, and this is having a direct negative impact on both staff and customers.</w:t>
       </w:r>
     </w:p>
     <w:p>
@@ -4780,7 +5099,15 @@
       </w:r>
       <w:r>
         <w:lastRenderedPageBreak/>
-        <w:t>both members of staff interviewed and by 65% of customers in the questionnaire who reported having experienced a problem when booking at Filmtopia. It was also directly observed during the site visit. This is not an occasional or minor issue but a fundamental flaw in how the existing system manages booking data. A relational database with referential integrity enforced between the relevant tables will directly address this by ensuring that once a seat is recorded as booked for a particular screening it cannot be booked again. This is dealt with by Objective 2 in the next section and supported by Objective 3, which covers the graphical seat map that makes taken seats visible at a glance.</w:t>
+        <w:t xml:space="preserve">both members of staff interviewed and by 65% of customers in the questionnaire who reported having experienced a problem when booking at </w:t>
+      </w:r>
+      <w:proofErr w:type="spellStart"/>
+      <w:r>
+        <w:t>Filmtopia</w:t>
+      </w:r>
+      <w:proofErr w:type="spellEnd"/>
+      <w:r>
+        <w:t>. It was also directly observed during the site visit. This is not an occasional or minor issue but a fundamental flaw in how the existing system manages booking data. A relational database with referential integrity enforced between the relevant tables will directly address this by ensuring that once a seat is recorded as booked for a particular screening it cannot be booked again. This is dealt with by Objective 2 in the next section and supported by Objective 3, which covers the graphical seat map that makes taken seats visible at a glance.</w:t>
       </w:r>
     </w:p>
     <w:p>
@@ -4796,7 +5123,15 @@
         <w:spacing w:line="276" w:lineRule="auto"/>
       </w:pPr>
       <w:r>
-        <w:t>The third significant problem is the poor customer facing experience. The kiosk currently installed in the cinema can only handle food and drink orders and cannot sell tickets, which forces customers to queue at both the kiosk and the box office. This was raised by multiple customers in the questionnaire and observed directly during the site visit. The proposed solution will address this by providing a customer kiosk interface through which customers can browse films, select a screening, choose their seats and add food and drink items to their order in a single joined up process. This is dealt with by Objective 4, which covers the self service kiosk, and Objective 5, which covers adding food and drink to a booking.</w:t>
+        <w:t xml:space="preserve">The third significant problem is the poor customer facing experience. The kiosk currently installed in the cinema can only handle food and drink orders and cannot sell tickets, which forces customers to queue at both the kiosk and the box office. This was raised by multiple customers in the questionnaire and observed directly during the site visit. The proposed solution will address this by providing a customer kiosk interface through which customers can browse films, select a screening, choose their seats and add food and drink items to their order in a single joined up process. This is dealt with by Objective 4, which covers the </w:t>
+      </w:r>
+      <w:proofErr w:type="spellStart"/>
+      <w:r>
+        <w:t>self service</w:t>
+      </w:r>
+      <w:proofErr w:type="spellEnd"/>
+      <w:r>
+        <w:t xml:space="preserve"> kiosk, and Objective 5, which covers adding food and drink to a booking.</w:t>
       </w:r>
     </w:p>
     <w:p>
@@ -4830,7 +5165,15 @@
         <w:spacing w:line="276" w:lineRule="auto"/>
       </w:pPr>
       <w:r>
-        <w:t xml:space="preserve">Functional requirements are the specific things the system must be able to do. For Filmtopia these include the ability to add and manage films and screenings (Objectives 6 and 7), to display a graphical seat map showing which seats are available and which are already booked (Objective 3), to process customer bookings and link them to specific seats </w:t>
+        <w:t xml:space="preserve">Functional requirements are the specific things the system must be able to do. For </w:t>
+      </w:r>
+      <w:proofErr w:type="spellStart"/>
+      <w:r>
+        <w:t>Filmtopia</w:t>
+      </w:r>
+      <w:proofErr w:type="spellEnd"/>
+      <w:r>
+        <w:t xml:space="preserve"> these include the ability to add and manage films and screenings (Objectives 6 and 7), to display a graphical seat map showing which seats are available and which are already booked (Objective 3), to process customer bookings and link them to specific seats </w:t>
       </w:r>
       <w:r>
         <w:lastRenderedPageBreak/>
@@ -4842,7 +5185,15 @@
         <w:spacing w:line="276" w:lineRule="auto"/>
       </w:pPr>
       <w:r>
-        <w:t>Non-functional requirements are the qualities the system must have rather than the specific things it must do. For Filmtopia the most important non-functional requirements are reliability, usability and data integrity. The system must be reliable enough to be used continuously during opening hours without crashing or producing errors. It must be usable by staff with varying levels of technical confidence without extensive training, which is reflected in Objectives 14 and 15. And it must maintain data integrity at all times, meaning it should never be possible for the database to reach a state where bookings are duplicated, records are incomplete or data is inconsistent between tables, which is reflected in Objectives 2 and 13.</w:t>
+        <w:t xml:space="preserve">Non-functional requirements are the qualities the system must have rather than the specific things it must do. For </w:t>
+      </w:r>
+      <w:proofErr w:type="spellStart"/>
+      <w:r>
+        <w:t>Filmtopia</w:t>
+      </w:r>
+      <w:proofErr w:type="spellEnd"/>
+      <w:r>
+        <w:t xml:space="preserve"> the most important non-functional requirements are reliability, usability and data integrity. The system must be reliable enough to be used continuously during opening hours without crashing or producing errors. It must be usable by staff with varying levels of technical confidence without extensive training, which is reflected in Objectives 14 and 15. And it must maintain data integrity at all times, meaning it should never be possible for the database to reach a state where bookings are duplicated, records are incomplete or data is inconsistent between tables, which is reflected in Objectives 2 and 13.</w:t>
       </w:r>
     </w:p>
     <w:p>
@@ -4868,7 +5219,31 @@
         <w:spacing w:line="276" w:lineRule="auto"/>
       </w:pPr>
       <w:r>
-        <w:t>The proposed solution is a Visual Basic .NET Windows Forms application built in Visual Studio, using OleDb to manage the connection between the application and a Microsoft Access database stored in the Access 2002 to 2003 .mdb format. Visual Basic .NET has been chosen because it is the language used throughout this course and it allows the rapid development of graphical Windows applications with a professional user interface. OleDb has been chosen as the database connectivity method because it provides a straightforward and reliable way of connecting a Visual Basic .NET application to a Microsoft Access database, allowing SQL queries to be executed directly from the application code to insert, update, delete and retrieve records. Microsoft Access has been chosen as the database because it supports a full relational structure with primary keys, foreign keys and referential integrity which directly addresses the data management problems identified in the investigation.</w:t>
+        <w:t xml:space="preserve">The proposed solution is a Visual Basic .NET Windows Forms application built in Visual Studio, using </w:t>
+      </w:r>
+      <w:proofErr w:type="spellStart"/>
+      <w:r>
+        <w:t>OleDb</w:t>
+      </w:r>
+      <w:proofErr w:type="spellEnd"/>
+      <w:r>
+        <w:t xml:space="preserve"> to manage the connection between the application and a Microsoft Access database stored in the Access 2002 to 2003 .</w:t>
+      </w:r>
+      <w:proofErr w:type="spellStart"/>
+      <w:r>
+        <w:t>mdb</w:t>
+      </w:r>
+      <w:proofErr w:type="spellEnd"/>
+      <w:r>
+        <w:t xml:space="preserve"> format. Visual Basic .NET has been chosen because it is the language used throughout this course and it allows the rapid development of graphical Windows applications with a professional user interface. </w:t>
+      </w:r>
+      <w:proofErr w:type="spellStart"/>
+      <w:r>
+        <w:t>OleDb</w:t>
+      </w:r>
+      <w:proofErr w:type="spellEnd"/>
+      <w:r>
+        <w:t xml:space="preserve"> has been chosen as the database connectivity method because it provides a straightforward and reliable way of connecting a Visual Basic .NET application to a Microsoft Access database, allowing SQL queries to be executed directly from the application code to insert, update, delete and retrieve records. Microsoft Access has been chosen as the database because it supports a full relational structure with primary keys, foreign keys and referential integrity which directly addresses the data management problems identified in the investigation.</w:t>
       </w:r>
     </w:p>
     <w:p>
@@ -4876,7 +5251,15 @@
         <w:spacing w:line="276" w:lineRule="auto"/>
       </w:pPr>
       <w:r>
-        <w:t>The system will support three distinct user types each with their own interface and access level. Customers will access the system through a self service kiosk interface. Staff will be able to log in to manage bookings and screenings. The manager will have full access to all areas of the system including film management and sales reporting. Access levels will be enforced through the login system to ensure that users can only access the parts of the system that are relevant to their role, which is dealt with by Objective 10.</w:t>
+        <w:t xml:space="preserve">The system will support three distinct user types each with their own interface and access level. Customers will access the system through a </w:t>
+      </w:r>
+      <w:proofErr w:type="spellStart"/>
+      <w:r>
+        <w:t>self service</w:t>
+      </w:r>
+      <w:proofErr w:type="spellEnd"/>
+      <w:r>
+        <w:t xml:space="preserve"> kiosk interface. Staff will be able to log in to manage bookings and screenings. The manager will have full access to all areas of the system including film management and sales reporting. Access levels will be enforced through the login system to ensure that users can only access the parts of the system that are relevant to their role, which is dealt with by Objective 10.</w:t>
       </w:r>
     </w:p>
     <w:p>
@@ -4910,7 +5293,15 @@
         <w:spacing w:line="276" w:lineRule="auto"/>
       </w:pPr>
       <w:r>
-        <w:t xml:space="preserve">Whilst the proposed Filmtopia system will address the core problems identified in the investigation, there are several areas that will not be included in the solution due to </w:t>
+        <w:t xml:space="preserve">Whilst the proposed </w:t>
+      </w:r>
+      <w:proofErr w:type="spellStart"/>
+      <w:r>
+        <w:t>Filmtopia</w:t>
+      </w:r>
+      <w:proofErr w:type="spellEnd"/>
+      <w:r>
+        <w:t xml:space="preserve"> system will address the core problems identified in the investigation, there are several areas that will not be included in the solution due to </w:t>
       </w:r>
       <w:r>
         <w:lastRenderedPageBreak/>
@@ -4946,7 +5337,23 @@
         <w:spacing w:line="276" w:lineRule="auto"/>
       </w:pPr>
       <w:r>
-        <w:t>The system will not support multiple simultaneous users over a network. Whilst OleDb connections to a Microsoft Access database can technically support multiple users, developing a fully networked multi-user system with appropriate concurrency controls and conflict resolution is beyond the scope of this project. The system will be designed for use on a single machine or a small number of machines accessing the same .mdb database file locally.</w:t>
+        <w:t xml:space="preserve">The system will not support multiple simultaneous users over a network. Whilst </w:t>
+      </w:r>
+      <w:proofErr w:type="spellStart"/>
+      <w:r>
+        <w:t>OleDb</w:t>
+      </w:r>
+      <w:proofErr w:type="spellEnd"/>
+      <w:r>
+        <w:t xml:space="preserve"> connections to a Microsoft Access database can technically support multiple users, developing a fully networked multi-user system with appropriate concurrency controls and conflict resolution is beyond the scope of this project. The system will be designed for use on a single machine or a small number of machines accessing the same .</w:t>
+      </w:r>
+      <w:proofErr w:type="spellStart"/>
+      <w:r>
+        <w:t>mdb</w:t>
+      </w:r>
+      <w:proofErr w:type="spellEnd"/>
+      <w:r>
+        <w:t xml:space="preserve"> database file locally.</w:t>
       </w:r>
     </w:p>
     <w:p>
@@ -5223,7 +5630,15 @@
         <w:t xml:space="preserve">Success Criteria: </w:t>
       </w:r>
       <w:r>
-        <w:t>The report should be generated using an SQL query through the OleDb connection and displayed on screen within 5 seconds of the date range being selected. The report should show the correct total number of tickets sold and total revenue for the selected period, calculated directly from the bookings in the database.</w:t>
+        <w:t xml:space="preserve">The report should be generated using an SQL query through the </w:t>
+      </w:r>
+      <w:proofErr w:type="spellStart"/>
+      <w:r>
+        <w:t>OleDb</w:t>
+      </w:r>
+      <w:proofErr w:type="spellEnd"/>
+      <w:r>
+        <w:t xml:space="preserve"> connection and displayed on screen within 5 seconds of the date range being selected. The report should show the correct total number of tickets sold and total revenue for the selected period, calculated directly from the bookings in the database.</w:t>
       </w:r>
     </w:p>
     <w:p>
@@ -5389,7 +5804,15 @@
         <w:t xml:space="preserve">Success Criteria: </w:t>
       </w:r>
       <w:r>
-        <w:t>All forms should use the same colour scheme, font and button placement. Navigation buttons should appear in consistent positions across all forms. The system should look professional and be immediately recognisable as a Filmtopia branded application.</w:t>
+        <w:t xml:space="preserve">All forms should use the same colour scheme, font and button placement. Navigation buttons should appear in consistent positions across all forms. The system should look professional and be immediately recognisable as a </w:t>
+      </w:r>
+      <w:proofErr w:type="spellStart"/>
+      <w:r>
+        <w:t>Filmtopia</w:t>
+      </w:r>
+      <w:proofErr w:type="spellEnd"/>
+      <w:r>
+        <w:t xml:space="preserve"> branded application.</w:t>
       </w:r>
     </w:p>
     <w:p>
@@ -5542,7 +5965,6 @@
         <w:docPartUnique/>
       </w:docPartObj>
     </w:sdtPr>
-    <w:sdtEndPr/>
     <w:sdtContent>
       <w:p>
         <w:pPr>
@@ -6268,6 +6690,7 @@
   <w:style w:type="character" w:default="1" w:styleId="DefaultParagraphFont">
     <w:name w:val="Default Paragraph Font"/>
     <w:uiPriority w:val="1"/>
+    <w:semiHidden/>
     <w:unhideWhenUsed/>
   </w:style>
   <w:style w:type="table" w:default="1" w:styleId="TableNormal">

</xml_diff>

<commit_message>
back from a small break, maths was overwhelming, but back on track to finish NEA asap.
just filled up the objectives that i added into the investigation from a couple of weeks ago
</commit_message>
<xml_diff>
--- a/Investigation.docx
+++ b/Investigation.docx
@@ -10,12 +10,21 @@
           <w:color w:val="A02B93" w:themeColor="accent5"/>
         </w:rPr>
       </w:pPr>
+      <w:proofErr w:type="spellStart"/>
       <w:r>
         <w:rPr>
           <w:b/>
           <w:color w:val="A02B93" w:themeColor="accent5"/>
         </w:rPr>
-        <w:t>Filmtopia Project Investigation</w:t>
+        <w:t>Filmtopia</w:t>
+      </w:r>
+      <w:proofErr w:type="spellEnd"/>
+      <w:r>
+        <w:rPr>
+          <w:b/>
+          <w:color w:val="A02B93" w:themeColor="accent5"/>
+        </w:rPr>
+        <w:t xml:space="preserve"> Project Investigation</w:t>
       </w:r>
     </w:p>
     <w:p>
@@ -38,8 +47,29 @@
       <w:pPr>
         <w:spacing w:line="276" w:lineRule="auto"/>
       </w:pPr>
-      <w:r>
-        <w:t>Filmtopia is a small independent cinema theatre who is currently managing all business data using spreadsheets and paper. They sell food drinks and tickets using a variety of means such as a touchscreen kiosk which can only handle food and drinks and a concessions area where employees handle the business. The management of Filmtopia has come to notice that they are falling back on managing and analysing the cinema, this means keeping track of sales records, screening analytics and a customer interest evaluation. I am now going to investigate further on how Filmtopia functions to get a better understanding of how I should move with this project.</w:t>
+      <w:proofErr w:type="spellStart"/>
+      <w:r>
+        <w:t>Filmtopia</w:t>
+      </w:r>
+      <w:proofErr w:type="spellEnd"/>
+      <w:r>
+        <w:t xml:space="preserve"> is a small independent cinema theatre who is currently managing all business data using spreadsheets and paper. They sell food drinks and tickets using a variety of means such as a touchscreen kiosk which can only handle food and drinks and a concessions area where employees handle the business. The management of </w:t>
+      </w:r>
+      <w:proofErr w:type="spellStart"/>
+      <w:r>
+        <w:t>Filmtopia</w:t>
+      </w:r>
+      <w:proofErr w:type="spellEnd"/>
+      <w:r>
+        <w:t xml:space="preserve"> has come to notice that they are falling back on managing and analysing the cinema, this means keeping track of sales records, screening analytics and a customer interest evaluation. I am now going to investigate further on how </w:t>
+      </w:r>
+      <w:proofErr w:type="spellStart"/>
+      <w:r>
+        <w:t>Filmtopia</w:t>
+      </w:r>
+      <w:proofErr w:type="spellEnd"/>
+      <w:r>
+        <w:t xml:space="preserve"> functions to get a better understanding of how I should move with this project.</w:t>
       </w:r>
       <w:r>
         <w:tab/>
@@ -76,7 +106,15 @@
         <w:spacing w:line="276" w:lineRule="auto"/>
       </w:pPr>
       <w:r>
-        <w:t>For the Filmtopia system the stakeholders can be split into two groups, primary and secondary. Primary stakeholders are those who will interact with the system directly on a regular basis. Secondary stakeholders are those who are affected by the system indirectly or whose work is influenced by it without them necessarily using it themselves.</w:t>
+        <w:t xml:space="preserve">For the </w:t>
+      </w:r>
+      <w:proofErr w:type="spellStart"/>
+      <w:r>
+        <w:t>Filmtopia</w:t>
+      </w:r>
+      <w:proofErr w:type="spellEnd"/>
+      <w:r>
+        <w:t xml:space="preserve"> system the stakeholders can be split into two groups, primary and secondary. Primary stakeholders are those who will interact with the system directly on a regular basis. Secondary stakeholders are those who are affected by the system indirectly or whose work is influenced by it without them necessarily using it themselves.</w:t>
       </w:r>
     </w:p>
     <w:p>
@@ -104,7 +142,31 @@
         <w:spacing w:line="276" w:lineRule="auto"/>
       </w:pPr>
       <w:r>
-        <w:t>The third primary stakeholder is the customer base of Filmtopia. Customers interact with the system either directly through the proposed self service kiosk or indirectly when staff process their bookings on their behalf. Their main interests are convenience, short queue times and the assurance that the seat they have been allocated will actually be available when they arrive. The questionnaire results discussed later in this investigation show that a large majority of customers would prefer self service ticketing and that seat selection is considered important by most respondents. This means the bar for the kiosk interface is high and it needs to be clean and simple enough for any customer to use without assistance.</w:t>
+        <w:t xml:space="preserve">The third primary stakeholder is the customer base of </w:t>
+      </w:r>
+      <w:proofErr w:type="spellStart"/>
+      <w:r>
+        <w:t>Filmtopia</w:t>
+      </w:r>
+      <w:proofErr w:type="spellEnd"/>
+      <w:r>
+        <w:t xml:space="preserve">. Customers interact with the system either directly through the proposed </w:t>
+      </w:r>
+      <w:proofErr w:type="spellStart"/>
+      <w:r>
+        <w:t>self service</w:t>
+      </w:r>
+      <w:proofErr w:type="spellEnd"/>
+      <w:r>
+        <w:t xml:space="preserve"> kiosk or indirectly when staff process their bookings on their behalf. Their main interests are convenience, short queue times and the assurance that the seat they have been allocated will actually be available when they arrive. The questionnaire results discussed later in this investigation show that a large majority of customers would prefer </w:t>
+      </w:r>
+      <w:proofErr w:type="spellStart"/>
+      <w:r>
+        <w:t>self service</w:t>
+      </w:r>
+      <w:proofErr w:type="spellEnd"/>
+      <w:r>
+        <w:t xml:space="preserve"> ticketing and that seat selection is considered important by most respondents. This means the bar for the kiosk interface is high and it needs to be clean and simple enough for any customer to use without assistance.</w:t>
       </w:r>
     </w:p>
     <w:p>
@@ -120,12 +182,28 @@
         <w:spacing w:line="276" w:lineRule="auto"/>
       </w:pPr>
       <w:r>
-        <w:t>Another secondary stakeholder is any external IT support that Filmtopia uses. As a small independent cinema there is no dedicated IT department meaning the system must be robust and straightforward to maintain. Complex setups that require specialist knowledge to troubleshoot would be impractical for a business of this size.</w:t>
-      </w:r>
-    </w:p>
-    <w:p>
-      <w:r>
-        <w:t>In summary the stakeholder analysis makes clear that the Filmtopia system needs to serve a wide range of users with different levels of technical confidence and different priorities. The investigation that follows has been designed to gather requirements from as many of these stakeholders as possible to ensure the final system genuinely reflects the needs of everyone who will be affected by it.</w:t>
+        <w:t xml:space="preserve">Another secondary stakeholder is any external IT support that </w:t>
+      </w:r>
+      <w:proofErr w:type="spellStart"/>
+      <w:r>
+        <w:t>Filmtopia</w:t>
+      </w:r>
+      <w:proofErr w:type="spellEnd"/>
+      <w:r>
+        <w:t xml:space="preserve"> uses. As a small independent cinema there is no dedicated IT department meaning the system must be robust and straightforward to maintain. Complex setups that require specialist knowledge to troubleshoot would be impractical for a business of this size.</w:t>
+      </w:r>
+    </w:p>
+    <w:p>
+      <w:r>
+        <w:t xml:space="preserve">In summary the stakeholder analysis makes clear that the </w:t>
+      </w:r>
+      <w:proofErr w:type="spellStart"/>
+      <w:r>
+        <w:t>Filmtopia</w:t>
+      </w:r>
+      <w:proofErr w:type="spellEnd"/>
+      <w:r>
+        <w:t xml:space="preserve"> system needs to serve a wide range of users with different levels of technical confidence and different priorities. The investigation that follows has been designed to gather requirements from as many of these stakeholders as possible to ensure the final system genuinely reflects the needs of everyone who will be affected by it.</w:t>
       </w:r>
     </w:p>
     <w:p>
@@ -677,14 +755,52 @@
                 <w:lang w:val="fr-FR"/>
               </w:rPr>
             </w:pPr>
+            <w:proofErr w:type="spellStart"/>
             <w:r>
               <w:rPr>
                 <w:sz w:val="20"/>
                 <w:szCs w:val="20"/>
                 <w:lang w:val="fr-FR"/>
               </w:rPr>
-              <w:t>Summarise and interpret questionnaire responses</w:t>
+              <w:t>Summarise</w:t>
             </w:r>
+            <w:proofErr w:type="spellEnd"/>
+            <w:r>
+              <w:rPr>
+                <w:sz w:val="20"/>
+                <w:szCs w:val="20"/>
+                <w:lang w:val="fr-FR"/>
+              </w:rPr>
+              <w:t xml:space="preserve"> and </w:t>
+            </w:r>
+            <w:proofErr w:type="spellStart"/>
+            <w:r>
+              <w:rPr>
+                <w:sz w:val="20"/>
+                <w:szCs w:val="20"/>
+                <w:lang w:val="fr-FR"/>
+              </w:rPr>
+              <w:t>interpret</w:t>
+            </w:r>
+            <w:proofErr w:type="spellEnd"/>
+            <w:r>
+              <w:rPr>
+                <w:sz w:val="20"/>
+                <w:szCs w:val="20"/>
+                <w:lang w:val="fr-FR"/>
+              </w:rPr>
+              <w:t xml:space="preserve"> questionnaire </w:t>
+            </w:r>
+            <w:proofErr w:type="spellStart"/>
+            <w:r>
+              <w:rPr>
+                <w:sz w:val="20"/>
+                <w:szCs w:val="20"/>
+                <w:lang w:val="fr-FR"/>
+              </w:rPr>
+              <w:t>responses</w:t>
+            </w:r>
+            <w:proofErr w:type="spellEnd"/>
           </w:p>
         </w:tc>
       </w:tr>
@@ -1480,7 +1596,15 @@
         <w:spacing w:line="276" w:lineRule="auto"/>
       </w:pPr>
       <w:r>
-        <w:t>Moving on to the customer questionnaire, this was chosen because it allowed a much larger group of stakeholders to contribute to the investigation than would have been possible through interviews alone. Interviewing every customer individually would not be realistic, so a questionnaire was the most practical way to gather their views. The key advantage of a questionnaire is that it produces quantitative data which is easier to summarise and use as justification for design decisions. For example knowing that a large majority of customers would prefer a self service kiosk is a much stronger argument for including that feature than one person mentioning it in an interview. The limitation of a questionnaire is that the questions are fixed which means there is no opportunity to follow up on responses or ask for more detail. To partially work around this some of the questions included a list of options rather than just a yes or no answer which produced more useful and specific data.</w:t>
+        <w:t xml:space="preserve">Moving on to the customer questionnaire, this was chosen because it allowed a much larger group of stakeholders to contribute to the investigation than would have been possible through interviews alone. Interviewing every customer individually would not be realistic, so a questionnaire was the most practical way to gather their views. The key advantage of a questionnaire is that it produces quantitative data which is easier to summarise and use as justification for design decisions. For example knowing that a large majority of customers would prefer a </w:t>
+      </w:r>
+      <w:proofErr w:type="spellStart"/>
+      <w:r>
+        <w:t>self service</w:t>
+      </w:r>
+      <w:proofErr w:type="spellEnd"/>
+      <w:r>
+        <w:t xml:space="preserve"> kiosk is a much stronger argument for including that feature than one person mentioning it in an interview. The limitation of a questionnaire is that the questions are fixed which means there is no opportunity to follow up on responses or ask for more detail. To partially work around this some of the questions included a list of options rather than just a yes or no answer which produced more useful and specific data.</w:t>
       </w:r>
     </w:p>
     <w:p>
@@ -1583,7 +1707,23 @@
           <w:b/>
           <w:bCs/>
         </w:rPr>
-        <w:t>Q: Can you describe how Filmtopia currently manages its ticketing and bookings?</w:t>
+        <w:t xml:space="preserve">Q: Can you describe how </w:t>
+      </w:r>
+      <w:proofErr w:type="spellStart"/>
+      <w:r>
+        <w:rPr>
+          <w:b/>
+          <w:bCs/>
+        </w:rPr>
+        <w:t>Filmtopia</w:t>
+      </w:r>
+      <w:proofErr w:type="spellEnd"/>
+      <w:r>
+        <w:rPr>
+          <w:b/>
+          <w:bCs/>
+        </w:rPr>
+        <w:t xml:space="preserve"> currently manages its ticketing and bookings?</w:t>
       </w:r>
     </w:p>
     <w:p>
@@ -1623,7 +1763,23 @@
           <w:b/>
           <w:bCs/>
         </w:rPr>
-        <w:t>Q: What data does Filmtopia currently store and how?</w:t>
+        <w:t xml:space="preserve">Q: What data does </w:t>
+      </w:r>
+      <w:proofErr w:type="spellStart"/>
+      <w:r>
+        <w:rPr>
+          <w:b/>
+          <w:bCs/>
+        </w:rPr>
+        <w:t>Filmtopia</w:t>
+      </w:r>
+      <w:proofErr w:type="spellEnd"/>
+      <w:r>
+        <w:rPr>
+          <w:b/>
+          <w:bCs/>
+        </w:rPr>
+        <w:t xml:space="preserve"> currently store and how?</w:t>
       </w:r>
     </w:p>
     <w:p>
@@ -1841,7 +1997,15 @@
         <w:spacing w:line="276" w:lineRule="auto"/>
       </w:pPr>
       <w:r>
-        <w:t>A questionnaire was distributed to customers visiting Filmtopia in order to gather feedback on their experience with the current system and to understand what they would want from a new one. It was administered on the 15th of January 2026 as a paper questionnaire handed to customers at the cinema, and 20 responses were collected. The questions and summarised responses are as follows.</w:t>
+        <w:t xml:space="preserve">A questionnaire was distributed to customers visiting </w:t>
+      </w:r>
+      <w:proofErr w:type="spellStart"/>
+      <w:r>
+        <w:t>Filmtopia</w:t>
+      </w:r>
+      <w:proofErr w:type="spellEnd"/>
+      <w:r>
+        <w:t xml:space="preserve"> in order to gather feedback on their experience with the current system and to understand what they would want from a new one. It was administered on the 15th of January 2026 as a paper questionnaire handed to customers at the cinema, and 20 responses were collected. The questions and summarised responses are as follows.</w:t>
       </w:r>
     </w:p>
     <w:p>
@@ -1906,7 +2070,25 @@
           <w:color w:val="000000" w:themeColor="text1"/>
         </w:rPr>
         <w:lastRenderedPageBreak/>
-        <w:t>Q1: How do you currently purchase your tickets at Filmtopia?</w:t>
+        <w:t xml:space="preserve">Q1: How do you currently purchase your tickets at </w:t>
+      </w:r>
+      <w:proofErr w:type="spellStart"/>
+      <w:r>
+        <w:rPr>
+          <w:b/>
+          <w:bCs/>
+          <w:color w:val="000000" w:themeColor="text1"/>
+        </w:rPr>
+        <w:t>Filmtopia</w:t>
+      </w:r>
+      <w:proofErr w:type="spellEnd"/>
+      <w:r>
+        <w:rPr>
+          <w:b/>
+          <w:bCs/>
+          <w:color w:val="000000" w:themeColor="text1"/>
+        </w:rPr>
+        <w:t>?</w:t>
       </w:r>
     </w:p>
     <w:tbl>
@@ -2151,7 +2333,25 @@
           <w:bCs/>
           <w:color w:val="000000" w:themeColor="text1"/>
         </w:rPr>
-        <w:t>Q2: Have you ever experienced a problem when booking tickets at Filmtopia?</w:t>
+        <w:t xml:space="preserve">Q2: Have you ever experienced a problem when booking tickets at </w:t>
+      </w:r>
+      <w:proofErr w:type="spellStart"/>
+      <w:r>
+        <w:rPr>
+          <w:b/>
+          <w:bCs/>
+          <w:color w:val="000000" w:themeColor="text1"/>
+        </w:rPr>
+        <w:t>Filmtopia</w:t>
+      </w:r>
+      <w:proofErr w:type="spellEnd"/>
+      <w:r>
+        <w:rPr>
+          <w:b/>
+          <w:bCs/>
+          <w:color w:val="000000" w:themeColor="text1"/>
+        </w:rPr>
+        <w:t>?</w:t>
       </w:r>
     </w:p>
     <w:tbl>
@@ -3164,7 +3364,15 @@
         <w:spacing w:line="276" w:lineRule="auto"/>
       </w:pPr>
       <w:r>
-        <w:t>85% of customers felt seat selection was at least quite important. This supports the planned graphical seat selection feature in the Filmtopia system.</w:t>
+        <w:t xml:space="preserve">85% of customers felt seat selection was at least quite important. This supports the planned graphical seat selection feature in the </w:t>
+      </w:r>
+      <w:proofErr w:type="spellStart"/>
+      <w:r>
+        <w:t>Filmtopia</w:t>
+      </w:r>
+      <w:proofErr w:type="spellEnd"/>
+      <w:r>
+        <w:t xml:space="preserve"> system.</w:t>
       </w:r>
     </w:p>
     <w:p>
@@ -3394,7 +3602,15 @@
         <w:spacing w:line="276" w:lineRule="auto"/>
       </w:pPr>
       <w:r>
-        <w:t>The questionnaire results clearly show that customers are experiencing real problems with the current system at Filmtopia. The most significant issues are long queues at the box office, errors with seat allocation and the inability to book tickets through the kiosk. The results also show strong demand for a self-service ticketing kiosk, graphical seat selection and combined food and drink ordering. These findings have directly informed the objectives set out later in this investigation.</w:t>
+        <w:t xml:space="preserve">The questionnaire results clearly show that customers are experiencing real problems with the current system at </w:t>
+      </w:r>
+      <w:proofErr w:type="spellStart"/>
+      <w:r>
+        <w:t>Filmtopia</w:t>
+      </w:r>
+      <w:proofErr w:type="spellEnd"/>
+      <w:r>
+        <w:t>. The most significant issues are long queues at the box office, errors with seat allocation and the inability to book tickets through the kiosk. The results also show strong demand for a self-service ticketing kiosk, graphical seat selection and combined food and drink ordering. These findings have directly informed the objectives set out later in this investigation.</w:t>
       </w:r>
     </w:p>
     <w:p>
@@ -3420,7 +3636,15 @@
         <w:spacing w:line="276" w:lineRule="auto"/>
       </w:pPr>
       <w:r>
-        <w:t>As part of the investigation I visited Filmtopia during an evening showing to observe how the current system operates in practice. Rather than asking questions or interrupting the workflow I simply watched how staff handled customers during the pre-screening period when the cinema was at its busiest. The aim was to see the existing system in action and to identify any problems that might not have come up during the interviews or questionnaire.</w:t>
+        <w:t xml:space="preserve">As part of the investigation I visited </w:t>
+      </w:r>
+      <w:proofErr w:type="spellStart"/>
+      <w:r>
+        <w:t>Filmtopia</w:t>
+      </w:r>
+      <w:proofErr w:type="spellEnd"/>
+      <w:r>
+        <w:t xml:space="preserve"> during an evening showing to observe how the current system operates in practice. Rather than asking questions or interrupting the workflow I simply watched how staff handled customers during the pre-screening period when the cinema was at its busiest. The aim was to see the existing system in action and to identify any problems that might not have come up during the interviews or questionnaire.</w:t>
       </w:r>
     </w:p>
     <w:p>
@@ -3961,7 +4185,15 @@
         <w:spacing w:line="276" w:lineRule="auto"/>
       </w:pPr>
       <w:r>
-        <w:t>The Vue homepage presents films visually using large poster images organised under a Top Films heading. Each film is displayed with its title clearly beneath it and the page includes a Quick Book bar at the bottom allowing users to search by venue, film, date and time simultaneously. This is a clean and intuitive way of presenting information that allows customers to find what they want quickly without having to navigate through multiple pages. For the Filmtopia system I will incorporate a similar visual approach to displaying films on the customer kiosk, ensuring that screenings are easy to browse and select.</w:t>
+        <w:t xml:space="preserve">The Vue homepage presents films visually using large poster images organised under a Top Films heading. Each film is displayed with its title clearly beneath it and the page includes a Quick Book bar at the bottom allowing users to search by venue, film, date and time simultaneously. This is a clean and intuitive way of presenting information that allows customers to find what they want quickly without having to navigate through multiple pages. For the </w:t>
+      </w:r>
+      <w:proofErr w:type="spellStart"/>
+      <w:r>
+        <w:t>Filmtopia</w:t>
+      </w:r>
+      <w:proofErr w:type="spellEnd"/>
+      <w:r>
+        <w:t xml:space="preserve"> system I will incorporate a similar visual approach to displaying films on the customer kiosk, ensuring that screenings are easy to browse and select.</w:t>
       </w:r>
     </w:p>
     <w:p>
@@ -4047,7 +4279,15 @@
         <w:spacing w:line="276" w:lineRule="auto"/>
       </w:pPr>
       <w:r>
-        <w:t>When a film is selected Vue displays all upcoming showings for that film at the chosen venue, organised by date and time. Each screening card shows the start and end time, the screen number and the ticket price. Accessibility information such as audio description and wheelchair access is also clearly displayed. This level of detail is something I aim to replicate in Filmtopia, where staff and customers should be able to see all relevant information about a screening at a glance without having to search through multiple menus.</w:t>
+        <w:t xml:space="preserve">When a film is selected Vue displays all upcoming showings for that film at the chosen venue, organised by date and time. Each screening card shows the start and end time, the screen number and the ticket price. Accessibility information such as audio description and wheelchair access is also clearly displayed. This level of detail is something I aim to replicate in </w:t>
+      </w:r>
+      <w:proofErr w:type="spellStart"/>
+      <w:r>
+        <w:t>Filmtopia</w:t>
+      </w:r>
+      <w:proofErr w:type="spellEnd"/>
+      <w:r>
+        <w:t>, where staff and customers should be able to see all relevant information about a screening at a glance without having to search through multiple menus.</w:t>
       </w:r>
     </w:p>
     <w:p>
@@ -4133,7 +4373,15 @@
         <w:spacing w:line="276" w:lineRule="auto"/>
       </w:pPr>
       <w:r>
-        <w:t>Vue's seat selection interface is a standout feature of their system. It displays a graphical layout of the screen showing every seat as a coloured icon, with different colours representing different seat types and prices. VIP seats are shown in orange at £8.49, Regular seats in black at £7.49, Saver seats in green at £6.49 and Super Saver seats in red at £4.99. Occupied seats are shown in grey so customers can immediately see what is available. Rows are labelled alphabetically on the left hand side. This graphical seat selection is a key feature I plan to implement in Filmtopia as it directly addresses the double booking problem identified in the interviews. By showing customers and staff exactly which seats are taken in real time the system eliminates the risk of two people being assigned the same seat.</w:t>
+        <w:t xml:space="preserve">Vue's seat selection interface is a standout feature of their system. It displays a graphical layout of the screen showing every seat as a coloured icon, with different colours representing different seat types and prices. VIP seats are shown in orange at £8.49, Regular seats in black at £7.49, Saver seats in green at £6.49 and Super Saver seats in red at £4.99. Occupied seats are shown in grey so customers can immediately see what is available. Rows are labelled alphabetically on the left hand side. This graphical seat selection is a key feature I plan to implement in </w:t>
+      </w:r>
+      <w:proofErr w:type="spellStart"/>
+      <w:r>
+        <w:t>Filmtopia</w:t>
+      </w:r>
+      <w:proofErr w:type="spellEnd"/>
+      <w:r>
+        <w:t xml:space="preserve"> as it directly addresses the double booking problem identified in the interviews. By showing customers and staff exactly which seats are taken in real time the system eliminates the risk of two people being assigned the same seat.</w:t>
       </w:r>
     </w:p>
     <w:p>
@@ -4145,8 +4393,17 @@
           <w:b/>
           <w:bCs/>
         </w:rPr>
-        <w:t>Features Identified for Filmtopia</w:t>
-      </w:r>
+        <w:t xml:space="preserve">Features Identified for </w:t>
+      </w:r>
+      <w:proofErr w:type="spellStart"/>
+      <w:r>
+        <w:rPr>
+          <w:b/>
+          <w:bCs/>
+        </w:rPr>
+        <w:t>Filmtopia</w:t>
+      </w:r>
+      <w:proofErr w:type="spellEnd"/>
     </w:p>
     <w:p>
       <w:pPr>
@@ -4241,7 +4498,15 @@
         <w:spacing w:line="276" w:lineRule="auto"/>
       </w:pPr>
       <w:r>
-        <w:t>The second system I researched was Odeon, which is the largest cinema chain in the UK. Odeon operates over 120 cinemas across the UK and Ireland and their online booking system offered several useful features to compare against Vue and to inform the design of Filmtopia.</w:t>
+        <w:t xml:space="preserve">The second system I researched was Odeon, which is the largest cinema chain in the UK. Odeon operates over 120 cinemas across the UK and Ireland and their online booking system offered several useful features to compare against Vue and to inform the design of </w:t>
+      </w:r>
+      <w:proofErr w:type="spellStart"/>
+      <w:r>
+        <w:t>Filmtopia</w:t>
+      </w:r>
+      <w:proofErr w:type="spellEnd"/>
+      <w:r>
+        <w:t>.</w:t>
       </w:r>
     </w:p>
     <w:p>
@@ -4323,7 +4588,79 @@
           <w:szCs w:val="20"/>
           <w:lang w:val="de-DE"/>
         </w:rPr>
-        <w:t>Odeon film listings page (odeon.co.uk)</w:t>
+        <w:t xml:space="preserve">Odeon </w:t>
+      </w:r>
+      <w:proofErr w:type="spellStart"/>
+      <w:r>
+        <w:rPr>
+          <w:i/>
+          <w:iCs/>
+          <w:color w:val="595959"/>
+          <w:sz w:val="20"/>
+          <w:szCs w:val="20"/>
+          <w:lang w:val="de-DE"/>
+        </w:rPr>
+        <w:t>film</w:t>
+      </w:r>
+      <w:proofErr w:type="spellEnd"/>
+      <w:r>
+        <w:rPr>
+          <w:i/>
+          <w:iCs/>
+          <w:color w:val="595959"/>
+          <w:sz w:val="20"/>
+          <w:szCs w:val="20"/>
+          <w:lang w:val="de-DE"/>
+        </w:rPr>
+        <w:t xml:space="preserve"> </w:t>
+      </w:r>
+      <w:proofErr w:type="spellStart"/>
+      <w:r>
+        <w:rPr>
+          <w:i/>
+          <w:iCs/>
+          <w:color w:val="595959"/>
+          <w:sz w:val="20"/>
+          <w:szCs w:val="20"/>
+          <w:lang w:val="de-DE"/>
+        </w:rPr>
+        <w:t>listings</w:t>
+      </w:r>
+      <w:proofErr w:type="spellEnd"/>
+      <w:r>
+        <w:rPr>
+          <w:i/>
+          <w:iCs/>
+          <w:color w:val="595959"/>
+          <w:sz w:val="20"/>
+          <w:szCs w:val="20"/>
+          <w:lang w:val="de-DE"/>
+        </w:rPr>
+        <w:t xml:space="preserve"> </w:t>
+      </w:r>
+      <w:proofErr w:type="spellStart"/>
+      <w:r>
+        <w:rPr>
+          <w:i/>
+          <w:iCs/>
+          <w:color w:val="595959"/>
+          <w:sz w:val="20"/>
+          <w:szCs w:val="20"/>
+          <w:lang w:val="de-DE"/>
+        </w:rPr>
+        <w:t>page</w:t>
+      </w:r>
+      <w:proofErr w:type="spellEnd"/>
+      <w:r>
+        <w:rPr>
+          <w:i/>
+          <w:iCs/>
+          <w:color w:val="595959"/>
+          <w:sz w:val="20"/>
+          <w:szCs w:val="20"/>
+          <w:lang w:val="de-DE"/>
+        </w:rPr>
+        <w:t xml:space="preserve"> (odeon.co.uk)</w:t>
       </w:r>
     </w:p>
     <w:p>
@@ -4331,7 +4668,15 @@
         <w:spacing w:line="276" w:lineRule="auto"/>
       </w:pPr>
       <w:r>
-        <w:t>Similar to Vue, Odeon presents films using large poster images organised under a Top Films heading. However Odeon includes additional information directly on the film page such as the director, cast, runtime, release date and genre tags. This richer level of detail gives customers more context before making a booking decision. Odeon also includes a quick search bar at the bottom of the page allowing users to filter by cinema, film, date and time. One notable difference from Vue is that Odeon uses a darker navy blue colour scheme throughout which creates a more premium feel. For Filmtopia I will aim to display key film information clearly on the customer kiosk so customers can make informed decisions quickly.</w:t>
+        <w:t xml:space="preserve">Similar to Vue, Odeon presents films using large poster images organised under a Top Films heading. However Odeon includes additional information directly on the film page such as the director, cast, runtime, release date and genre tags. This richer level of detail gives customers more context before making a booking decision. Odeon also includes a quick search bar at the bottom of the page allowing users to filter by cinema, film, date and time. One notable difference from Vue is that Odeon uses a darker navy blue colour scheme throughout which creates a more premium feel. For </w:t>
+      </w:r>
+      <w:proofErr w:type="spellStart"/>
+      <w:r>
+        <w:t>Filmtopia</w:t>
+      </w:r>
+      <w:proofErr w:type="spellEnd"/>
+      <w:r>
+        <w:t xml:space="preserve"> I will aim to display key film information clearly on the customer kiosk so customers can make informed decisions quickly.</w:t>
       </w:r>
     </w:p>
     <w:p>
@@ -4417,7 +4762,15 @@
         <w:spacing w:line="276" w:lineRule="auto"/>
       </w:pPr>
       <w:r>
-        <w:t>Odeon's screening times page clearly displays the film title, runtime, release date and genre alongside all available showtimes. Screenings are organised by date across the top of the page and grouped by cinema location below. Each screening card shows the start time, screen number and format such as 3D. A Book Now button is displayed prominently on each card making the next action immediately obvious. This clear layout is something I will replicate in Filmtopia where staff should be able to see all screenings for a given film at a glance.</w:t>
+        <w:t xml:space="preserve">Odeon's screening times page clearly displays the film title, runtime, release date and genre alongside all available showtimes. Screenings are organised by date across the top of the page and grouped by cinema location below. Each screening card shows the start time, screen number and format such as 3D. A Book Now button is displayed prominently on each card making the next action immediately obvious. This clear layout is something I will replicate in </w:t>
+      </w:r>
+      <w:proofErr w:type="spellStart"/>
+      <w:r>
+        <w:t>Filmtopia</w:t>
+      </w:r>
+      <w:proofErr w:type="spellEnd"/>
+      <w:r>
+        <w:t xml:space="preserve"> where staff should be able to see all screenings for a given film at a glance.</w:t>
       </w:r>
     </w:p>
     <w:p>
@@ -4503,7 +4856,23 @@
         <w:spacing w:line="276" w:lineRule="auto"/>
       </w:pPr>
       <w:r>
-        <w:t>Odeon's seat selection screen is particularly well designed and shows several features worth incorporating into Filmtopia. The screen displays a graphical layout of the entire auditorium with seats colour coded by type and price. Green seats represent Classic Saver at £14.99, cream seats represent Classic at £16.49 and orange seats represent Classic Popular at £17.99. Unavailable seats are shown with an X so it is immediately clear which seats cannot be booked. A seat key at the bottom explains the colour coding including wheelchair and companion seat options. The booking process is also clearly structured using a step by step tab navigation at the top showing Seats, Sign In, Tickets, Food, Summary and Payment. This staged approach guides the user through the process logically and reduces confusion. For Filmtopia I will incorporate a similar colour coded seat map and a clear step by step flow for the customer kiosk booking process.</w:t>
+        <w:t xml:space="preserve">Odeon's seat selection screen is particularly well designed and shows several features worth incorporating into </w:t>
+      </w:r>
+      <w:proofErr w:type="spellStart"/>
+      <w:r>
+        <w:t>Filmtopia</w:t>
+      </w:r>
+      <w:proofErr w:type="spellEnd"/>
+      <w:r>
+        <w:t xml:space="preserve">. The screen displays a graphical layout of the entire auditorium with seats colour coded by type and price. Green seats represent Classic Saver at £14.99, cream seats represent Classic at £16.49 and orange seats represent Classic Popular at £17.99. Unavailable seats are shown with an X so it is immediately clear which seats cannot be booked. A seat key at the bottom explains the colour coding including wheelchair and companion seat options. The booking process is also clearly structured using a step by step tab navigation at the top showing Seats, Sign In, Tickets, Food, Summary and Payment. This staged approach guides the user through the process logically and reduces confusion. For </w:t>
+      </w:r>
+      <w:proofErr w:type="spellStart"/>
+      <w:r>
+        <w:t>Filmtopia</w:t>
+      </w:r>
+      <w:proofErr w:type="spellEnd"/>
+      <w:r>
+        <w:t xml:space="preserve"> I will incorporate a similar colour coded seat map and a clear step by step flow for the customer kiosk booking process.</w:t>
       </w:r>
     </w:p>
     <w:p>
@@ -4515,8 +4884,17 @@
           <w:b/>
           <w:bCs/>
         </w:rPr>
-        <w:t>Features Identified for Filmtopia</w:t>
-      </w:r>
+        <w:t xml:space="preserve">Features Identified for </w:t>
+      </w:r>
+      <w:proofErr w:type="spellStart"/>
+      <w:r>
+        <w:rPr>
+          <w:b/>
+          <w:bCs/>
+        </w:rPr>
+        <w:t>Filmtopia</w:t>
+      </w:r>
+      <w:proofErr w:type="spellEnd"/>
     </w:p>
     <w:p>
       <w:pPr>
@@ -4739,7 +5117,15 @@
         <w:spacing w:line="276" w:lineRule="auto"/>
       </w:pPr>
       <w:r>
-        <w:t>The existing system at Filmtopia receives several types of input, all of which are entered manually by staff or the manager. When a customer arrives to book tickets a member of staff writes the customer's name, chosen film, screening time, number of tickets and preferred seats into a paper booking diary. There is no digital record of this at the point of entry meaning the accuracy of the data depends entirely on the staff member's handwriting and attention to detail.</w:t>
+        <w:t xml:space="preserve">The existing system at </w:t>
+      </w:r>
+      <w:proofErr w:type="spellStart"/>
+      <w:r>
+        <w:t>Filmtopia</w:t>
+      </w:r>
+      <w:proofErr w:type="spellEnd"/>
+      <w:r>
+        <w:t xml:space="preserve"> receives several types of input, all of which are entered manually by staff or the manager. When a customer arrives to book tickets a member of staff writes the customer's name, chosen film, screening time, number of tickets and preferred seats into a paper booking diary. There is no digital record of this at the point of entry meaning the accuracy of the data depends entirely on the staff member's handwriting and attention to detail.</w:t>
       </w:r>
     </w:p>
     <w:p>
@@ -4945,8 +5331,13 @@
       <w:pPr>
         <w:spacing w:line="276" w:lineRule="auto"/>
       </w:pPr>
-      <w:r>
-        <w:t>Filmtopia is a small independent cinema that is currently managing all of its operations using a combination of paper records and disconnected spreadsheets. This approach may have been adequate when the cinema first opened but it has become increasingly problematic as the demands on the system have grown. The core problem is that the existing system is unreliable, slow and disconnected, and this is having a direct negative impact on both staff and customers.</w:t>
+      <w:proofErr w:type="spellStart"/>
+      <w:r>
+        <w:t>Filmtopia</w:t>
+      </w:r>
+      <w:proofErr w:type="spellEnd"/>
+      <w:r>
+        <w:t xml:space="preserve"> is a small independent cinema that is currently managing all of its operations using a combination of paper records and disconnected spreadsheets. This approach may have been adequate when the cinema first opened but it has become increasingly problematic as the demands on the system have grown. The core problem is that the existing system is unreliable, slow and disconnected, and this is having a direct negative impact on both staff and customers.</w:t>
       </w:r>
     </w:p>
     <w:p>
@@ -4958,7 +5349,15 @@
       </w:r>
       <w:r>
         <w:lastRenderedPageBreak/>
-        <w:t>both members of staff interviewed and by 65% of customers in the questionnaire who reported having experienced a problem when booking at Filmtopia. It was also directly observed during the site visit. This is not an occasional or minor issue but a fundamental flaw in how the existing system manages booking data. A relational database with referential integrity enforced between the relevant tables will directly address this by ensuring that once a seat is recorded as booked for a particular screening it cannot be booked again. This is dealt with by Objective 2 in the next section and supported by Objective 3, which covers the graphical seat map that makes taken seats visible at a glance.</w:t>
+        <w:t xml:space="preserve">both members of staff interviewed and by 65% of customers in the questionnaire who reported having experienced a problem when booking at </w:t>
+      </w:r>
+      <w:proofErr w:type="spellStart"/>
+      <w:r>
+        <w:t>Filmtopia</w:t>
+      </w:r>
+      <w:proofErr w:type="spellEnd"/>
+      <w:r>
+        <w:t>. It was also directly observed during the site visit. This is not an occasional or minor issue but a fundamental flaw in how the existing system manages booking data. A relational database with referential integrity enforced between the relevant tables will directly address this by ensuring that once a seat is recorded as booked for a particular screening it cannot be booked again. This is dealt with by Objective 2 in the next section and supported by Objective 3, which covers the graphical seat map that makes taken seats visible at a glance.</w:t>
       </w:r>
     </w:p>
     <w:p>
@@ -4974,7 +5373,15 @@
         <w:spacing w:line="276" w:lineRule="auto"/>
       </w:pPr>
       <w:r>
-        <w:t>The third significant problem is the poor customer facing experience. The kiosk currently installed in the cinema can only handle food and drink orders and cannot sell tickets, which forces customers to queue at both the kiosk and the box office. This was raised by multiple customers in the questionnaire and observed directly during the site visit. The proposed solution will address this by providing a customer kiosk interface through which customers can browse films, select a screening, choose their seats and add food and drink items to their order in a single joined up process. This is dealt with by Objective 4, which covers the self service kiosk, and Objective 5, which covers adding food and drink to a booking.</w:t>
+        <w:t xml:space="preserve">The third significant problem is the poor customer facing experience. The kiosk currently installed in the cinema can only handle food and drink orders and cannot sell tickets, which forces customers to queue at both the kiosk and the box office. This was raised by multiple customers in the questionnaire and observed directly during the site visit. The proposed solution will address this by providing a customer kiosk interface through which customers can browse films, select a screening, choose their seats and add food and drink items to their order in a single joined up process. This is dealt with by Objective 4, which covers the </w:t>
+      </w:r>
+      <w:proofErr w:type="spellStart"/>
+      <w:r>
+        <w:t>self service</w:t>
+      </w:r>
+      <w:proofErr w:type="spellEnd"/>
+      <w:r>
+        <w:t xml:space="preserve"> kiosk, and Objective 5, which covers adding food and drink to a booking.</w:t>
       </w:r>
     </w:p>
     <w:p>
@@ -5008,7 +5415,15 @@
         <w:spacing w:line="276" w:lineRule="auto"/>
       </w:pPr>
       <w:r>
-        <w:t xml:space="preserve">Functional requirements are the specific things the system must be able to do. For Filmtopia these include the ability to add and manage films and screenings (Objectives 6 and 7), to display a graphical seat map showing which seats are available and which are already booked (Objective 3), to process customer bookings and link them to specific seats </w:t>
+        <w:t xml:space="preserve">Functional requirements are the specific things the system must be able to do. For </w:t>
+      </w:r>
+      <w:proofErr w:type="spellStart"/>
+      <w:r>
+        <w:t>Filmtopia</w:t>
+      </w:r>
+      <w:proofErr w:type="spellEnd"/>
+      <w:r>
+        <w:t xml:space="preserve"> these include the ability to add and manage films and screenings (Objectives 6 and 7), to display a graphical seat map showing which seats are available and which are already booked (Objective 3), to process customer bookings and link them to specific seats </w:t>
       </w:r>
       <w:r>
         <w:lastRenderedPageBreak/>
@@ -5020,7 +5435,15 @@
         <w:spacing w:line="276" w:lineRule="auto"/>
       </w:pPr>
       <w:r>
-        <w:t>Non-functional requirements are the qualities the system must have rather than the specific things it must do. For Filmtopia the most important non-functional requirements are reliability, usability and data integrity. The system must be reliable enough to be used continuously during opening hours without crashing or producing errors. It must be usable by staff with varying levels of technical confidence without extensive training, which is reflected in Objectives 14 and 15. And it must maintain data integrity at all times, meaning it should never be possible for the database to reach a state where bookings are duplicated, records are incomplete or data is inconsistent between tables, which is reflected in Objectives 2 and 13.</w:t>
+        <w:t xml:space="preserve">Non-functional requirements are the qualities the system must have rather than the specific things it must do. For </w:t>
+      </w:r>
+      <w:proofErr w:type="spellStart"/>
+      <w:r>
+        <w:t>Filmtopia</w:t>
+      </w:r>
+      <w:proofErr w:type="spellEnd"/>
+      <w:r>
+        <w:t xml:space="preserve"> the most important non-functional requirements are reliability, usability and data integrity. The system must be reliable enough to be used continuously during opening hours without crashing or producing errors. It must be usable by staff with varying levels of technical confidence without extensive training, which is reflected in Objectives 14 and 15. And it must maintain data integrity at all times, meaning it should never be possible for the database to reach a state where bookings are duplicated, records are incomplete or data is inconsistent between tables, which is reflected in Objectives 2 and 13.</w:t>
       </w:r>
     </w:p>
     <w:p>
@@ -5046,7 +5469,31 @@
         <w:spacing w:line="276" w:lineRule="auto"/>
       </w:pPr>
       <w:r>
-        <w:t>The proposed solution is a Visual Basic .NET Windows Forms application built in Visual Studio, using OleDb to manage the connection between the application and a Microsoft Access database stored in the Access 2002 to 2003 .mdb format. Visual Basic .NET has been chosen because it is the language used throughout this course and it allows the rapid development of graphical Windows applications with a professional user interface. OleDb has been chosen as the database connectivity method because it provides a straightforward and reliable way of connecting a Visual Basic .NET application to a Microsoft Access database, allowing SQL queries to be executed directly from the application code to insert, update, delete and retrieve records. Microsoft Access has been chosen as the database because it supports a full relational structure with primary keys, foreign keys and referential integrity which directly addresses the data management problems identified in the investigation.</w:t>
+        <w:t xml:space="preserve">The proposed solution is a Visual Basic .NET Windows Forms application built in Visual Studio, using </w:t>
+      </w:r>
+      <w:proofErr w:type="spellStart"/>
+      <w:r>
+        <w:t>OleDb</w:t>
+      </w:r>
+      <w:proofErr w:type="spellEnd"/>
+      <w:r>
+        <w:t xml:space="preserve"> to manage the connection between the application and a Microsoft Access database stored in the Access 2002 to 2003 .</w:t>
+      </w:r>
+      <w:proofErr w:type="spellStart"/>
+      <w:r>
+        <w:t>mdb</w:t>
+      </w:r>
+      <w:proofErr w:type="spellEnd"/>
+      <w:r>
+        <w:t xml:space="preserve"> format. Visual Basic .NET has been chosen because it is the language used throughout this course and it allows the rapid development of graphical Windows applications with a professional user interface. </w:t>
+      </w:r>
+      <w:proofErr w:type="spellStart"/>
+      <w:r>
+        <w:t>OleDb</w:t>
+      </w:r>
+      <w:proofErr w:type="spellEnd"/>
+      <w:r>
+        <w:t xml:space="preserve"> has been chosen as the database connectivity method because it provides a straightforward and reliable way of connecting a Visual Basic .NET application to a Microsoft Access database, allowing SQL queries to be executed directly from the application code to insert, update, delete and retrieve records. Microsoft Access has been chosen as the database because it supports a full relational structure with primary keys, foreign keys and referential integrity which directly addresses the data management problems identified in the investigation.</w:t>
       </w:r>
     </w:p>
     <w:p>
@@ -5054,7 +5501,15 @@
         <w:spacing w:line="276" w:lineRule="auto"/>
       </w:pPr>
       <w:r>
-        <w:t>The system will support three distinct user types each with their own interface and access level. Customers will access the system through a self service kiosk interface. Staff will be able to log in to manage bookings and screenings. The manager will have full access to all areas of the system including film management and sales reporting. Access levels will be enforced through the login system to ensure that users can only access the parts of the system that are relevant to their role, which is dealt with by Objective 10.</w:t>
+        <w:t xml:space="preserve">The system will support three distinct user types each with their own interface and access level. Customers will access the system through a </w:t>
+      </w:r>
+      <w:proofErr w:type="spellStart"/>
+      <w:r>
+        <w:t>self service</w:t>
+      </w:r>
+      <w:proofErr w:type="spellEnd"/>
+      <w:r>
+        <w:t xml:space="preserve"> kiosk interface. Staff will be able to log in to manage bookings and screenings. The manager will have full access to all areas of the system including film management and sales reporting. Access levels will be enforced through the login system to ensure that users can only access the parts of the system that are relevant to their role, which is dealt with by Objective 10.</w:t>
       </w:r>
     </w:p>
     <w:p>
@@ -5088,7 +5543,15 @@
         <w:spacing w:line="276" w:lineRule="auto"/>
       </w:pPr>
       <w:r>
-        <w:t xml:space="preserve">Whilst the proposed Filmtopia system will address the core problems identified in the investigation, there are several areas that will not be included in the solution due to </w:t>
+        <w:t xml:space="preserve">Whilst the proposed </w:t>
+      </w:r>
+      <w:proofErr w:type="spellStart"/>
+      <w:r>
+        <w:t>Filmtopia</w:t>
+      </w:r>
+      <w:proofErr w:type="spellEnd"/>
+      <w:r>
+        <w:t xml:space="preserve"> system will address the core problems identified in the investigation, there are several areas that will not be included in the solution due to </w:t>
       </w:r>
       <w:r>
         <w:lastRenderedPageBreak/>
@@ -5124,7 +5587,23 @@
         <w:spacing w:line="276" w:lineRule="auto"/>
       </w:pPr>
       <w:r>
-        <w:t>The system will not support multiple simultaneous users over a network. Whilst OleDb connections to a Microsoft Access database can technically support multiple users, developing a fully networked multi-user system with appropriate concurrency controls and conflict resolution is beyond the scope of this project. The system will be designed for use on a single machine or a small number of machines accessing the same .mdb database file locally.</w:t>
+        <w:t xml:space="preserve">The system will not support multiple simultaneous users over a network. Whilst </w:t>
+      </w:r>
+      <w:proofErr w:type="spellStart"/>
+      <w:r>
+        <w:t>OleDb</w:t>
+      </w:r>
+      <w:proofErr w:type="spellEnd"/>
+      <w:r>
+        <w:t xml:space="preserve"> connections to a Microsoft Access database can technically support multiple users, developing a fully networked multi-user system with appropriate concurrency controls and conflict resolution is beyond the scope of this project. The system will be designed for use on a single machine or a small number of machines accessing the same .</w:t>
+      </w:r>
+      <w:proofErr w:type="spellStart"/>
+      <w:r>
+        <w:t>mdb</w:t>
+      </w:r>
+      <w:proofErr w:type="spellEnd"/>
+      <w:r>
+        <w:t xml:space="preserve"> database file locally.</w:t>
       </w:r>
     </w:p>
     <w:p>
@@ -5499,7 +5978,15 @@
         <w:t xml:space="preserve">Success Criteria: </w:t>
       </w:r>
       <w:r>
-        <w:t>The report should be generated using an SQL query through the OleDb connection and displayed on screen within 5 seconds of the date range being selected. The report should show the correct total number of tickets sold and total revenue for the selected period, calculated directly from the bookings in the database.</w:t>
+        <w:t xml:space="preserve">The report should be generated using an SQL query through the </w:t>
+      </w:r>
+      <w:proofErr w:type="spellStart"/>
+      <w:r>
+        <w:t>OleDb</w:t>
+      </w:r>
+      <w:proofErr w:type="spellEnd"/>
+      <w:r>
+        <w:t xml:space="preserve"> connection and displayed on screen within 5 seconds of the date range being selected. The report should show the correct total number of tickets sold and total revenue for the selected period, calculated directly from the bookings in the database.</w:t>
       </w:r>
     </w:p>
     <w:p>
@@ -5735,7 +6222,15 @@
         <w:t xml:space="preserve">Success Criteria: </w:t>
       </w:r>
       <w:r>
-        <w:t>All forms should use the same colour scheme, font and button placement. Navigation buttons should appear in consistent positions across all forms. The system should look professional and be immediately recognisable as a Filmtopia branded application.</w:t>
+        <w:t xml:space="preserve">All forms should use the same colour scheme, font and button placement. Navigation buttons should appear in consistent positions across all forms. The system should look professional and be immediately recognisable as a </w:t>
+      </w:r>
+      <w:proofErr w:type="spellStart"/>
+      <w:r>
+        <w:t>Filmtopia</w:t>
+      </w:r>
+      <w:proofErr w:type="spellEnd"/>
+      <w:r>
+        <w:t xml:space="preserve"> branded application.</w:t>
       </w:r>
     </w:p>
     <w:p>
@@ -5771,23 +6266,30 @@
         <w:rPr>
           <w:b/>
           <w:bCs/>
-          <w:lang w:val="nl-NL"/>
-        </w:rPr>
-      </w:pPr>
-      <w:r>
-        <w:rPr>
-          <w:b/>
-          <w:bCs/>
-          <w:lang w:val="nl-NL"/>
+        </w:rPr>
+      </w:pPr>
+      <w:r>
+        <w:rPr>
+          <w:b/>
+          <w:bCs/>
+          <w:lang w:val="en-US"/>
         </w:rPr>
         <w:lastRenderedPageBreak/>
-        <w:t>Obj 16</w:t>
-      </w:r>
-      <w:r>
-        <w:rPr>
-          <w:b/>
-          <w:bCs/>
-          <w:lang w:val="nl-NL"/>
+        <w:t>Objective</w:t>
+      </w:r>
+      <w:r>
+        <w:rPr>
+          <w:b/>
+          <w:bCs/>
+          <w:lang w:val="en-US"/>
+        </w:rPr>
+        <w:t xml:space="preserve"> 16</w:t>
+      </w:r>
+      <w:r>
+        <w:rPr>
+          <w:b/>
+          <w:bCs/>
+          <w:lang w:val="en-US"/>
         </w:rPr>
         <w:t xml:space="preserve"> (P)</w:t>
       </w:r>
@@ -5795,41 +6297,73 @@
         <w:rPr>
           <w:b/>
           <w:bCs/>
-          <w:lang w:val="nl-NL"/>
-        </w:rPr>
-        <w:t>: screens</w:t>
-      </w:r>
-      <w:r>
-        <w:rPr>
-          <w:b/>
-          <w:bCs/>
-          <w:lang w:val="nl-NL"/>
-        </w:rPr>
-        <w:t xml:space="preserve"> algorithm</w:t>
+          <w:lang w:val="en-US"/>
+        </w:rPr>
+        <w:t xml:space="preserve">: </w:t>
+      </w:r>
+      <w:r>
+        <w:rPr>
+          <w:b/>
+          <w:bCs/>
+        </w:rPr>
+        <w:t>The system must allow a manager to create a new screen by entering a total number of seats, with the system automatically generating the corresponding seat map and seat records for that screen.</w:t>
       </w:r>
     </w:p>
     <w:p>
       <w:pPr>
         <w:spacing w:after="80" w:line="276" w:lineRule="auto"/>
         <w:rPr>
-          <w:b/>
-          <w:bCs/>
-          <w:lang w:val="nl-NL"/>
-        </w:rPr>
-      </w:pPr>
-      <w:r>
-        <w:rPr>
-          <w:b/>
-          <w:bCs/>
-          <w:lang w:val="nl-NL"/>
-        </w:rPr>
-        <w:t>Obj 17</w:t>
-      </w:r>
-      <w:r>
-        <w:rPr>
-          <w:b/>
-          <w:bCs/>
-          <w:lang w:val="nl-NL"/>
+          <w:lang w:val="en-US"/>
+        </w:rPr>
+      </w:pPr>
+      <w:r>
+        <w:rPr>
+          <w:b/>
+          <w:bCs/>
+        </w:rPr>
+        <w:t>Success Criteria:</w:t>
+      </w:r>
+      <w:r>
+        <w:t xml:space="preserve"> Entering a seat count when creating a screen should generate the correct number of seat records in the database, arranged into rows and columns for a usable seat map. The generated seat map should display correctly when a screening for that screen is selected. Creating a screen with an invalid or missing seat count should be prevented through validation.</w:t>
+      </w:r>
+    </w:p>
+    <w:p>
+      <w:pPr>
+        <w:spacing w:after="80" w:line="276" w:lineRule="auto"/>
+        <w:rPr>
+          <w:b/>
+          <w:bCs/>
+        </w:rPr>
+      </w:pPr>
+      <w:r>
+        <w:rPr>
+          <w:b/>
+          <w:bCs/>
+          <w:lang w:val="en-US"/>
+        </w:rPr>
+        <w:t>Objective</w:t>
+      </w:r>
+      <w:r>
+        <w:rPr>
+          <w:b/>
+          <w:bCs/>
+          <w:lang w:val="en-US"/>
+        </w:rPr>
+        <w:t xml:space="preserve"> </w:t>
+      </w:r>
+      <w:r>
+        <w:rPr>
+          <w:b/>
+          <w:bCs/>
+          <w:lang w:val="en-US"/>
+        </w:rPr>
+        <w:t>17</w:t>
+      </w:r>
+      <w:r>
+        <w:rPr>
+          <w:b/>
+          <w:bCs/>
+          <w:lang w:val="en-US"/>
         </w:rPr>
         <w:t xml:space="preserve"> (P)</w:t>
       </w:r>
@@ -5837,9 +6371,42 @@
         <w:rPr>
           <w:b/>
           <w:bCs/>
-          <w:lang w:val="nl-NL"/>
-        </w:rPr>
-        <w:t>: Audit logs</w:t>
+          <w:lang w:val="en-US"/>
+        </w:rPr>
+        <w:t xml:space="preserve">: </w:t>
+      </w:r>
+      <w:r>
+        <w:rPr>
+          <w:b/>
+          <w:bCs/>
+        </w:rPr>
+        <w:t>The system must maintain an audit log recording key actions carried out by staff and managers, including creating a booking, cancelling a booking and adding a new film or screening record.</w:t>
+      </w:r>
+    </w:p>
+    <w:p>
+      <w:pPr>
+        <w:spacing w:after="80" w:line="276" w:lineRule="auto"/>
+        <w:rPr>
+          <w:lang w:val="en-US"/>
+        </w:rPr>
+      </w:pPr>
+      <w:r>
+        <w:rPr>
+          <w:b/>
+          <w:bCs/>
+        </w:rPr>
+        <w:t>Success Criteria:</w:t>
+      </w:r>
+      <w:r>
+        <w:t xml:space="preserve"> Every booking created, cancelled or amended should generate a log entry showing the username of the staff member responsible along with the date and time of the action. The audit log should be viewable by the manager but should not be editable or </w:t>
+      </w:r>
+      <w:proofErr w:type="spellStart"/>
+      <w:r>
+        <w:t>deletable</w:t>
+      </w:r>
+      <w:proofErr w:type="spellEnd"/>
+      <w:r>
+        <w:t xml:space="preserve"> by staff. The log should accurately reflect every relevant action carried out in the system during normal operation.</w:t>
       </w:r>
     </w:p>
     <w:p>
@@ -5855,15 +6422,47 @@
         <w:rPr>
           <w:b/>
           <w:bCs/>
-        </w:rPr>
-        <w:t>Obj</w:t>
-      </w:r>
-      <w:r>
-        <w:rPr>
-          <w:b/>
-          <w:bCs/>
-        </w:rPr>
-        <w:t xml:space="preserve"> 18: refunds</w:t>
+          <w:lang w:val="en-US"/>
+        </w:rPr>
+        <w:t>Objective</w:t>
+      </w:r>
+      <w:r>
+        <w:rPr>
+          <w:b/>
+          <w:bCs/>
+          <w:lang w:val="en-US"/>
+        </w:rPr>
+        <w:t xml:space="preserve"> </w:t>
+      </w:r>
+      <w:r>
+        <w:rPr>
+          <w:b/>
+          <w:bCs/>
+        </w:rPr>
+        <w:t xml:space="preserve">18: </w:t>
+      </w:r>
+      <w:r>
+        <w:rPr>
+          <w:b/>
+          <w:bCs/>
+        </w:rPr>
+        <w:t>The system must allow staff to process a refund for a cancelled booking, recording the refunded amount against the original booking record.</w:t>
+      </w:r>
+    </w:p>
+    <w:p>
+      <w:pPr>
+        <w:spacing w:after="80" w:line="276" w:lineRule="auto"/>
+        <w:jc w:val="both"/>
+      </w:pPr>
+      <w:r>
+        <w:rPr>
+          <w:b/>
+          <w:bCs/>
+        </w:rPr>
+        <w:t>Success Criteria:</w:t>
+      </w:r>
+      <w:r>
+        <w:t xml:space="preserve"> A refund should only be processable for a booking that has already been cancelled. The refunded amount should be calculated automatically from the ticket price and any food and drink items originally recorded against the booking. The refund should be saved to the database with a timestamp and should be visible when the booking is looked up afterwards.</w:t>
       </w:r>
     </w:p>
     <w:p>
@@ -6723,7 +7322,6 @@
   <w:style w:type="character" w:default="1" w:styleId="DefaultParagraphFont">
     <w:name w:val="Default Paragraph Font"/>
     <w:uiPriority w:val="1"/>
-    <w:semiHidden/>
     <w:unhideWhenUsed/>
   </w:style>
   <w:style w:type="table" w:default="1" w:styleId="TableNormal">

</xml_diff>

<commit_message>
added a disclamer in the invdstigation about kiosk objective.
</commit_message>
<xml_diff>
--- a/Investigation.docx
+++ b/Investigation.docx
@@ -6033,6 +6033,9 @@
     <w:p>
       <w:pPr>
         <w:spacing w:before="200" w:after="40"/>
+        <w:rPr>
+          <w:color w:val="EE0000"/>
+        </w:rPr>
       </w:pPr>
       <w:r>
         <w:rPr>
@@ -6055,6 +6058,21 @@
         </w:rPr>
         <w:t>: The system must enforce access levels so that customers using the kiosk can only access booking functions, whilst staff can access management functions and managers can access all areas of the system.</w:t>
       </w:r>
+      <w:r>
+        <w:rPr>
+          <w:b/>
+          <w:bCs/>
+        </w:rPr>
+        <w:t xml:space="preserve"> </w:t>
+      </w:r>
+      <w:r>
+        <w:rPr>
+          <w:b/>
+          <w:bCs/>
+          <w:color w:val="EE0000"/>
+        </w:rPr>
+        <w:t>(*Note: the kiosk is strictly post-prototype material. However, access levels need to be enforced from the prototype.)</w:t>
+      </w:r>
     </w:p>
     <w:p>
       <w:pPr>
@@ -6065,204 +6083,205 @@
           <w:b/>
           <w:bCs/>
         </w:rPr>
+        <w:lastRenderedPageBreak/>
         <w:t xml:space="preserve">Success Criteria: </w:t>
       </w:r>
       <w:r>
-        <w:t xml:space="preserve">The kiosk interface should not display any staff or manager options. Staff should be able to log in with a username and password and access staff functions </w:t>
+        <w:t>The kiosk interface should not display any staff or manager options. Staff should be able to log in with a username and password and access staff functions only. The manager login should provide access to all areas of the system. Attempting to access a restricted area without the correct login should be prevented.</w:t>
+      </w:r>
+    </w:p>
+    <w:p>
+      <w:pPr>
+        <w:spacing w:before="200" w:after="40"/>
+      </w:pPr>
+      <w:r>
+        <w:rPr>
+          <w:b/>
+          <w:bCs/>
+        </w:rPr>
+        <w:t>Objective 11</w:t>
+      </w:r>
+      <w:r>
+        <w:rPr>
+          <w:b/>
+          <w:bCs/>
+        </w:rPr>
+        <w:t xml:space="preserve"> (P)</w:t>
+      </w:r>
+      <w:r>
+        <w:rPr>
+          <w:b/>
+          <w:bCs/>
+        </w:rPr>
+        <w:t>: The system must allow staff to search for an existing booking by customer name or booking reference.</w:t>
+      </w:r>
+    </w:p>
+    <w:p>
+      <w:pPr>
+        <w:spacing w:after="80" w:line="276" w:lineRule="auto"/>
+      </w:pPr>
+      <w:r>
+        <w:rPr>
+          <w:b/>
+          <w:bCs/>
+        </w:rPr>
+        <w:t xml:space="preserve">Success Criteria: </w:t>
+      </w:r>
+      <w:r>
+        <w:t>A search by customer surname should return all matching bookings within 2 seconds. The search should work with partial name entries. The correct booking record should be displayed with all associated details including film, screening, seats and food order.</w:t>
+      </w:r>
+    </w:p>
+    <w:p>
+      <w:pPr>
+        <w:spacing w:before="200" w:after="40"/>
+      </w:pPr>
+      <w:r>
+        <w:rPr>
+          <w:b/>
+          <w:bCs/>
+        </w:rPr>
+        <w:t>Objective 12</w:t>
+      </w:r>
+      <w:r>
+        <w:rPr>
+          <w:b/>
+          <w:bCs/>
+        </w:rPr>
+        <w:t xml:space="preserve"> (P)</w:t>
+      </w:r>
+      <w:r>
+        <w:rPr>
+          <w:b/>
+          <w:bCs/>
+        </w:rPr>
+        <w:t>: The system must allow staff to cancel an existing booking, removing the seat allocation from the database and making those seats available again.</w:t>
+      </w:r>
+    </w:p>
+    <w:p>
+      <w:pPr>
+        <w:spacing w:after="80" w:line="276" w:lineRule="auto"/>
+      </w:pPr>
+      <w:r>
+        <w:rPr>
+          <w:b/>
+          <w:bCs/>
+        </w:rPr>
+        <w:t xml:space="preserve">Success Criteria: </w:t>
+      </w:r>
+      <w:r>
+        <w:t>Cancelling a booking should update the database immediately so the seats become available for other customers. A confirmation prompt should be displayed before any booking is deleted. The cancelled booking should no longer appear in the active bookings list.</w:t>
+      </w:r>
+    </w:p>
+    <w:p>
+      <w:pPr>
+        <w:spacing w:before="200" w:after="40"/>
+      </w:pPr>
+      <w:r>
+        <w:rPr>
+          <w:b/>
+          <w:bCs/>
+        </w:rPr>
+        <w:t>Objective 13</w:t>
+      </w:r>
+      <w:r>
+        <w:rPr>
+          <w:b/>
+          <w:bCs/>
+        </w:rPr>
+        <w:t xml:space="preserve"> (P)</w:t>
+      </w:r>
+      <w:r>
+        <w:rPr>
+          <w:b/>
+          <w:bCs/>
+        </w:rPr>
+        <w:t>: The system must validate data entered by users to prevent invalid or incomplete records being saved to the database.</w:t>
+      </w:r>
+    </w:p>
+    <w:p>
+      <w:pPr>
+        <w:spacing w:after="80" w:line="276" w:lineRule="auto"/>
+      </w:pPr>
+      <w:r>
+        <w:rPr>
+          <w:b/>
+          <w:bCs/>
+        </w:rPr>
+        <w:t xml:space="preserve">Success Criteria: </w:t>
+      </w:r>
+      <w:r>
+        <w:t>All required fields should be validated before a record is saved. Numeric fields should only accept numbers. Date fields should only accept valid dates. Text fields should have appropriate maximum lengths enforced. An informative error message should be displayed for each validation failure explaining what needs to be corrected.</w:t>
+      </w:r>
+    </w:p>
+    <w:p>
+      <w:pPr>
+        <w:spacing w:before="200" w:after="40"/>
+      </w:pPr>
+      <w:r>
+        <w:rPr>
+          <w:b/>
+          <w:bCs/>
+        </w:rPr>
+        <w:t>Objective 14: The system must have a consistent and professional user interface across all forms, using a uniform colour scheme, layout and naming convention throughout.</w:t>
+      </w:r>
+    </w:p>
+    <w:p>
+      <w:pPr>
+        <w:spacing w:after="80" w:line="276" w:lineRule="auto"/>
+      </w:pPr>
+      <w:r>
+        <w:rPr>
+          <w:b/>
+          <w:bCs/>
+        </w:rPr>
+        <w:t xml:space="preserve">Success Criteria: </w:t>
+      </w:r>
+      <w:r>
+        <w:t xml:space="preserve">All forms should use the same colour scheme, font and button placement. Navigation buttons should appear in consistent positions across all forms. The system should look professional and be immediately recognisable as a </w:t>
+      </w:r>
+      <w:proofErr w:type="spellStart"/>
+      <w:r>
+        <w:t>Filmtopia</w:t>
+      </w:r>
+      <w:proofErr w:type="spellEnd"/>
+      <w:r>
+        <w:t xml:space="preserve"> branded application.</w:t>
+      </w:r>
+    </w:p>
+    <w:p>
+      <w:pPr>
+        <w:spacing w:before="200" w:after="40"/>
+      </w:pPr>
+      <w:r>
+        <w:rPr>
+          <w:b/>
+          <w:bCs/>
+        </w:rPr>
+        <w:t>Objective 15: The system must be easy to navigate, with clearly labelled menus and buttons that allow staff and customers to find the function they need without requiring technical knowledge.</w:t>
+      </w:r>
+    </w:p>
+    <w:p>
+      <w:pPr>
+        <w:spacing w:after="80" w:line="276" w:lineRule="auto"/>
+      </w:pPr>
+      <w:r>
+        <w:rPr>
+          <w:b/>
+          <w:bCs/>
+        </w:rPr>
+        <w:t xml:space="preserve">Success Criteria: </w:t>
+      </w:r>
+      <w:r>
+        <w:t xml:space="preserve">A new member of staff should be able to complete a basic booking using the system without any training beyond a brief introduction. All buttons and menu options </w:t>
       </w:r>
       <w:r>
         <w:lastRenderedPageBreak/>
-        <w:t>only. The manager login should provide access to all areas of the system. Attempting to access a restricted area without the correct login should be prevented.</w:t>
-      </w:r>
-    </w:p>
-    <w:p>
-      <w:pPr>
-        <w:spacing w:before="200" w:after="40"/>
-      </w:pPr>
-      <w:r>
-        <w:rPr>
-          <w:b/>
-          <w:bCs/>
-        </w:rPr>
-        <w:t>Objective 11</w:t>
-      </w:r>
-      <w:r>
-        <w:rPr>
-          <w:b/>
-          <w:bCs/>
-        </w:rPr>
-        <w:t xml:space="preserve"> (P)</w:t>
-      </w:r>
-      <w:r>
-        <w:rPr>
-          <w:b/>
-          <w:bCs/>
-        </w:rPr>
-        <w:t>: The system must allow staff to search for an existing booking by customer name or booking reference.</w:t>
+        <w:t>should use clear plain English labels. The system should never reach a state where the user cannot navigate back to the main menu.</w:t>
       </w:r>
     </w:p>
     <w:p>
       <w:pPr>
         <w:spacing w:after="80" w:line="276" w:lineRule="auto"/>
-      </w:pPr>
-      <w:r>
-        <w:rPr>
-          <w:b/>
-          <w:bCs/>
-        </w:rPr>
-        <w:t xml:space="preserve">Success Criteria: </w:t>
-      </w:r>
-      <w:r>
-        <w:t>A search by customer surname should return all matching bookings within 2 seconds. The search should work with partial name entries. The correct booking record should be displayed with all associated details including film, screening, seats and food order.</w:t>
-      </w:r>
-    </w:p>
-    <w:p>
-      <w:pPr>
-        <w:spacing w:before="200" w:after="40"/>
-      </w:pPr>
-      <w:r>
-        <w:rPr>
-          <w:b/>
-          <w:bCs/>
-        </w:rPr>
-        <w:t>Objective 12</w:t>
-      </w:r>
-      <w:r>
-        <w:rPr>
-          <w:b/>
-          <w:bCs/>
-        </w:rPr>
-        <w:t xml:space="preserve"> (P)</w:t>
-      </w:r>
-      <w:r>
-        <w:rPr>
-          <w:b/>
-          <w:bCs/>
-        </w:rPr>
-        <w:t>: The system must allow staff to cancel an existing booking, removing the seat allocation from the database and making those seats available again.</w:t>
-      </w:r>
-    </w:p>
-    <w:p>
-      <w:pPr>
-        <w:spacing w:after="80" w:line="276" w:lineRule="auto"/>
-      </w:pPr>
-      <w:r>
-        <w:rPr>
-          <w:b/>
-          <w:bCs/>
-        </w:rPr>
-        <w:t xml:space="preserve">Success Criteria: </w:t>
-      </w:r>
-      <w:r>
-        <w:t>Cancelling a booking should update the database immediately so the seats become available for other customers. A confirmation prompt should be displayed before any booking is deleted. The cancelled booking should no longer appear in the active bookings list.</w:t>
-      </w:r>
-    </w:p>
-    <w:p>
-      <w:pPr>
-        <w:spacing w:before="200" w:after="40"/>
-      </w:pPr>
-      <w:r>
-        <w:rPr>
-          <w:b/>
-          <w:bCs/>
-        </w:rPr>
-        <w:t>Objective 13</w:t>
-      </w:r>
-      <w:r>
-        <w:rPr>
-          <w:b/>
-          <w:bCs/>
-        </w:rPr>
-        <w:t xml:space="preserve"> (P)</w:t>
-      </w:r>
-      <w:r>
-        <w:rPr>
-          <w:b/>
-          <w:bCs/>
-        </w:rPr>
-        <w:t>: The system must validate data entered by users to prevent invalid or incomplete records being saved to the database.</w:t>
-      </w:r>
-    </w:p>
-    <w:p>
-      <w:pPr>
-        <w:spacing w:after="80" w:line="276" w:lineRule="auto"/>
-      </w:pPr>
-      <w:r>
-        <w:rPr>
-          <w:b/>
-          <w:bCs/>
-        </w:rPr>
-        <w:t xml:space="preserve">Success Criteria: </w:t>
-      </w:r>
-      <w:r>
-        <w:t>All required fields should be validated before a record is saved. Numeric fields should only accept numbers. Date fields should only accept valid dates. Text fields should have appropriate maximum lengths enforced. An informative error message should be displayed for each validation failure explaining what needs to be corrected.</w:t>
-      </w:r>
-    </w:p>
-    <w:p>
-      <w:pPr>
-        <w:spacing w:before="200" w:after="40"/>
-      </w:pPr>
-      <w:r>
-        <w:rPr>
-          <w:b/>
-          <w:bCs/>
-        </w:rPr>
-        <w:t>Objective 14: The system must have a consistent and professional user interface across all forms, using a uniform colour scheme, layout and naming convention throughout.</w:t>
-      </w:r>
-    </w:p>
-    <w:p>
-      <w:pPr>
-        <w:spacing w:after="80" w:line="276" w:lineRule="auto"/>
-      </w:pPr>
-      <w:r>
-        <w:rPr>
-          <w:b/>
-          <w:bCs/>
-        </w:rPr>
-        <w:t xml:space="preserve">Success Criteria: </w:t>
-      </w:r>
-      <w:r>
-        <w:t xml:space="preserve">All forms should use the same colour scheme, font and button placement. Navigation buttons should appear in consistent positions across all forms. The system should look professional and be immediately recognisable as a </w:t>
-      </w:r>
-      <w:proofErr w:type="spellStart"/>
-      <w:r>
-        <w:t>Filmtopia</w:t>
-      </w:r>
-      <w:proofErr w:type="spellEnd"/>
-      <w:r>
-        <w:t xml:space="preserve"> branded application.</w:t>
-      </w:r>
-    </w:p>
-    <w:p>
-      <w:pPr>
-        <w:spacing w:before="200" w:after="40"/>
-      </w:pPr>
-      <w:r>
-        <w:rPr>
-          <w:b/>
-          <w:bCs/>
-        </w:rPr>
-        <w:t>Objective 15: The system must be easy to navigate, with clearly labelled menus and buttons that allow staff and customers to find the function they need without requiring technical knowledge.</w:t>
-      </w:r>
-    </w:p>
-    <w:p>
-      <w:pPr>
-        <w:spacing w:after="80" w:line="276" w:lineRule="auto"/>
-      </w:pPr>
-      <w:r>
-        <w:rPr>
-          <w:b/>
-          <w:bCs/>
-        </w:rPr>
-        <w:t xml:space="preserve">Success Criteria: </w:t>
-      </w:r>
-      <w:r>
-        <w:t>A new member of staff should be able to complete a basic booking using the system without any training beyond a brief introduction. All buttons and menu options should use clear plain English labels. The system should never reach a state where the user cannot navigate back to the main menu.</w:t>
-      </w:r>
-    </w:p>
-    <w:p>
-      <w:pPr>
-        <w:spacing w:after="80" w:line="276" w:lineRule="auto"/>
         <w:rPr>
           <w:b/>
           <w:bCs/>
@@ -6274,7 +6293,6 @@
           <w:bCs/>
           <w:lang w:val="en-US"/>
         </w:rPr>
-        <w:lastRenderedPageBreak/>
         <w:t>Objective</w:t>
       </w:r>
       <w:r>
@@ -7322,6 +7340,7 @@
   <w:style w:type="character" w:default="1" w:styleId="DefaultParagraphFont">
     <w:name w:val="Default Paragraph Font"/>
     <w:uiPriority w:val="1"/>
+    <w:semiHidden/>
     <w:unhideWhenUsed/>
   </w:style>
   <w:style w:type="table" w:default="1" w:styleId="TableNormal">

</xml_diff>

<commit_message>
adding new objectives for everything after the prototype into the investigation doc
</commit_message>
<xml_diff>
--- a/Investigation.docx
+++ b/Investigation.docx
@@ -3800,18 +3800,7 @@
           <w:sz w:val="22"/>
           <w:szCs w:val="22"/>
         </w:rPr>
-        <w:t>Paper booking diary</w:t>
-      </w:r>
-      <w:r>
-        <w:rPr>
-          <w:rFonts w:ascii="Aptos" w:eastAsia="Aptos" w:hAnsi="Aptos" w:cs="Aptos"/>
-          <w:b/>
-          <w:bCs/>
-          <w:color w:val="A02B93"/>
-          <w:sz w:val="22"/>
-          <w:szCs w:val="22"/>
-        </w:rPr>
-        <w:t>:</w:t>
+        <w:t>Paper booking diary:</w:t>
       </w:r>
     </w:p>
     <w:p>
@@ -3948,18 +3937,7 @@
           <w:sz w:val="22"/>
           <w:szCs w:val="22"/>
         </w:rPr>
-        <w:t xml:space="preserve">Food and drinks stock </w:t>
-      </w:r>
-      <w:r>
-        <w:rPr>
-          <w:rFonts w:ascii="Aptos" w:eastAsia="Aptos" w:hAnsi="Aptos" w:cs="Aptos"/>
-          <w:b/>
-          <w:bCs/>
-          <w:color w:val="A02B93"/>
-          <w:sz w:val="22"/>
-          <w:szCs w:val="22"/>
-        </w:rPr>
-        <w:t>spreadsheet:</w:t>
+        <w:t>Food and drinks stock spreadsheet:</w:t>
       </w:r>
     </w:p>
     <w:p>
@@ -4081,18 +4059,7 @@
           <w:sz w:val="22"/>
           <w:szCs w:val="22"/>
         </w:rPr>
-        <w:t>Staff rota spreadsheet</w:t>
-      </w:r>
-      <w:r>
-        <w:rPr>
-          <w:rFonts w:ascii="Aptos" w:eastAsia="Aptos" w:hAnsi="Aptos" w:cs="Aptos"/>
-          <w:b/>
-          <w:bCs/>
-          <w:color w:val="A02B93"/>
-          <w:sz w:val="22"/>
-          <w:szCs w:val="22"/>
-        </w:rPr>
-        <w:t>:</w:t>
+        <w:t>Staff rota spreadsheet:</w:t>
       </w:r>
     </w:p>
     <w:p>
@@ -4227,18 +4194,7 @@
           <w:sz w:val="22"/>
           <w:szCs w:val="22"/>
         </w:rPr>
-        <w:t xml:space="preserve"> ticket stub</w:t>
-      </w:r>
-      <w:r>
-        <w:rPr>
-          <w:rFonts w:ascii="Aptos" w:eastAsia="Aptos" w:hAnsi="Aptos" w:cs="Aptos"/>
-          <w:b/>
-          <w:bCs/>
-          <w:color w:val="A02B93"/>
-          <w:sz w:val="22"/>
-          <w:szCs w:val="22"/>
-        </w:rPr>
-        <w:t>:</w:t>
+        <w:t xml:space="preserve"> ticket stub:</w:t>
       </w:r>
     </w:p>
     <w:p>
@@ -4416,29 +4372,7 @@
           <w:sz w:val="22"/>
           <w:szCs w:val="22"/>
         </w:rPr>
-        <w:t>Vue</w:t>
-      </w:r>
-      <w:r>
-        <w:rPr>
-          <w:rFonts w:ascii="Aptos" w:eastAsia="Aptos" w:hAnsi="Aptos" w:cs="Aptos"/>
-          <w:b/>
-          <w:bCs/>
-          <w:color w:val="A02B93"/>
-          <w:sz w:val="22"/>
-          <w:szCs w:val="22"/>
-        </w:rPr>
-        <w:t xml:space="preserve"> film listings p</w:t>
-      </w:r>
-      <w:r>
-        <w:rPr>
-          <w:rFonts w:ascii="Aptos" w:eastAsia="Aptos" w:hAnsi="Aptos" w:cs="Aptos"/>
-          <w:b/>
-          <w:bCs/>
-          <w:color w:val="A02B93"/>
-          <w:sz w:val="22"/>
-          <w:szCs w:val="22"/>
-        </w:rPr>
-        <w:t>age:</w:t>
+        <w:t>Vue film listings page:</w:t>
       </w:r>
     </w:p>
     <w:p>
@@ -4573,29 +4507,7 @@
           <w:sz w:val="22"/>
           <w:szCs w:val="22"/>
         </w:rPr>
-        <w:t>Vue</w:t>
-      </w:r>
-      <w:r>
-        <w:rPr>
-          <w:rFonts w:ascii="Aptos" w:eastAsia="Aptos" w:hAnsi="Aptos" w:cs="Aptos"/>
-          <w:b/>
-          <w:bCs/>
-          <w:color w:val="A02B93"/>
-          <w:sz w:val="22"/>
-          <w:szCs w:val="22"/>
-        </w:rPr>
-        <w:t xml:space="preserve"> screening times </w:t>
-      </w:r>
-      <w:r>
-        <w:rPr>
-          <w:rFonts w:ascii="Aptos" w:eastAsia="Aptos" w:hAnsi="Aptos" w:cs="Aptos"/>
-          <w:b/>
-          <w:bCs/>
-          <w:color w:val="A02B93"/>
-          <w:sz w:val="22"/>
-          <w:szCs w:val="22"/>
-        </w:rPr>
-        <w:t>page:</w:t>
+        <w:t>Vue screening times page:</w:t>
       </w:r>
     </w:p>
     <w:p>
@@ -4727,18 +4639,7 @@
           <w:sz w:val="22"/>
           <w:szCs w:val="22"/>
         </w:rPr>
-        <w:t>Vue graphical seat selection</w:t>
-      </w:r>
-      <w:r>
-        <w:rPr>
-          <w:rFonts w:ascii="Aptos" w:eastAsia="Aptos" w:hAnsi="Aptos" w:cs="Aptos"/>
-          <w:b/>
-          <w:bCs/>
-          <w:color w:val="A02B93"/>
-          <w:sz w:val="22"/>
-          <w:szCs w:val="22"/>
-        </w:rPr>
-        <w:t xml:space="preserve"> page:</w:t>
+        <w:t>Vue graphical seat selection page:</w:t>
       </w:r>
     </w:p>
     <w:p>
@@ -4996,29 +4897,7 @@
           <w:sz w:val="22"/>
           <w:szCs w:val="22"/>
         </w:rPr>
-        <w:t xml:space="preserve">Odeon </w:t>
-      </w:r>
-      <w:r>
-        <w:rPr>
-          <w:rFonts w:ascii="Aptos" w:eastAsia="Aptos" w:hAnsi="Aptos" w:cs="Aptos"/>
-          <w:b/>
-          <w:bCs/>
-          <w:color w:val="A02B93"/>
-          <w:sz w:val="22"/>
-          <w:szCs w:val="22"/>
-        </w:rPr>
-        <w:t xml:space="preserve">film listings </w:t>
-      </w:r>
-      <w:r>
-        <w:rPr>
-          <w:rFonts w:ascii="Aptos" w:eastAsia="Aptos" w:hAnsi="Aptos" w:cs="Aptos"/>
-          <w:b/>
-          <w:bCs/>
-          <w:color w:val="A02B93"/>
-          <w:sz w:val="22"/>
-          <w:szCs w:val="22"/>
-        </w:rPr>
-        <w:t>page:</w:t>
+        <w:t>Odeon film listings page:</w:t>
       </w:r>
     </w:p>
     <w:p>
@@ -5154,29 +5033,7 @@
           <w:sz w:val="22"/>
           <w:szCs w:val="22"/>
         </w:rPr>
-        <w:t xml:space="preserve">Odeon </w:t>
-      </w:r>
-      <w:r>
-        <w:rPr>
-          <w:rFonts w:ascii="Aptos" w:eastAsia="Aptos" w:hAnsi="Aptos" w:cs="Aptos"/>
-          <w:b/>
-          <w:bCs/>
-          <w:color w:val="A02B93"/>
-          <w:sz w:val="22"/>
-          <w:szCs w:val="22"/>
-        </w:rPr>
-        <w:t>screening times page</w:t>
-      </w:r>
-      <w:r>
-        <w:rPr>
-          <w:rFonts w:ascii="Aptos" w:eastAsia="Aptos" w:hAnsi="Aptos" w:cs="Aptos"/>
-          <w:b/>
-          <w:bCs/>
-          <w:color w:val="A02B93"/>
-          <w:sz w:val="22"/>
-          <w:szCs w:val="22"/>
-        </w:rPr>
-        <w:t>:</w:t>
+        <w:t>Odeon screening times page:</w:t>
       </w:r>
     </w:p>
     <w:p>
@@ -10961,6 +10818,65 @@
         </w:rPr>
       </w:pPr>
     </w:p>
+    <w:p>
+      <w:pPr>
+        <w:spacing w:after="80" w:line="276" w:lineRule="auto"/>
+        <w:jc w:val="both"/>
+        <w:rPr>
+          <w:b/>
+          <w:bCs/>
+          <w:color w:val="EE0000"/>
+        </w:rPr>
+      </w:pPr>
+      <w:r>
+        <w:rPr>
+          <w:b/>
+          <w:bCs/>
+          <w:color w:val="EE0000"/>
+        </w:rPr>
+        <w:t xml:space="preserve">The eighteen objectives above were written before any of </w:t>
+      </w:r>
+      <w:proofErr w:type="spellStart"/>
+      <w:r>
+        <w:rPr>
+          <w:b/>
+          <w:bCs/>
+          <w:color w:val="EE0000"/>
+        </w:rPr>
+        <w:t>Filmtopia</w:t>
+      </w:r>
+      <w:proofErr w:type="spellEnd"/>
+      <w:r>
+        <w:rPr>
+          <w:b/>
+          <w:bCs/>
+          <w:color w:val="EE0000"/>
+        </w:rPr>
+        <w:t xml:space="preserve"> existed, and building the prototype showed that they did not cover the whole problem. Some of the gaps came out of the feedback sessions, some came out of using the prototype myself for a few weeks, and a few came out of faults that only appeared once there was real data in the database. Rather than quietly widen the original objectives so that whatever I happened to build would satisfy them, which would make the evaluation worthless, I have written the additional requirements down as a second set of objectives with their own success criteria. Everything from Objective 19 onwards was identified after the prototype was finished, and none of it was part of the prototype build.</w:t>
+      </w:r>
+    </w:p>
+    <w:p>
+      <w:pPr>
+        <w:spacing w:after="80" w:line="276" w:lineRule="auto"/>
+        <w:jc w:val="both"/>
+        <w:rPr>
+          <w:b/>
+          <w:bCs/>
+          <w:color w:val="EE0000"/>
+        </w:rPr>
+      </w:pPr>
+    </w:p>
+    <w:p>
+      <w:pPr>
+        <w:spacing w:after="80" w:line="276" w:lineRule="auto"/>
+        <w:jc w:val="both"/>
+        <w:rPr>
+          <w:b/>
+          <w:bCs/>
+          <w:color w:val="EE0000"/>
+        </w:rPr>
+      </w:pPr>
+    </w:p>
     <w:sectPr>
       <w:headerReference w:type="even" r:id="rId26"/>
       <w:headerReference w:type="default" r:id="rId27"/>

</xml_diff>

<commit_message>
added objective 19 to investiagtion doc
</commit_message>
<xml_diff>
--- a/Investigation.docx
+++ b/Investigation.docx
@@ -10868,6 +10868,46 @@
     </w:p>
     <w:p>
       <w:pPr>
+        <w:spacing w:before="200" w:after="40"/>
+      </w:pPr>
+      <w:r>
+        <w:rPr>
+          <w:b/>
+          <w:bCs/>
+        </w:rPr>
+        <w:t xml:space="preserve">Objective 19: The system must support more than one </w:t>
+      </w:r>
+      <w:r>
+        <w:rPr>
+          <w:b/>
+          <w:bCs/>
+        </w:rPr>
+        <w:t>type</w:t>
+      </w:r>
+      <w:r>
+        <w:rPr>
+          <w:b/>
+          <w:bCs/>
+        </w:rPr>
+        <w:t xml:space="preserve"> of seat within a screen, with each </w:t>
+      </w:r>
+      <w:r>
+        <w:rPr>
+          <w:b/>
+          <w:bCs/>
+        </w:rPr>
+        <w:t>type</w:t>
+      </w:r>
+      <w:r>
+        <w:rPr>
+          <w:b/>
+          <w:bCs/>
+        </w:rPr>
+        <w:t xml:space="preserve"> carrying its own price multiplier so that a premium seat costs more than a standard seat for the same screening.</w:t>
+      </w:r>
+    </w:p>
+    <w:p>
+      <w:pPr>
         <w:spacing w:after="80" w:line="276" w:lineRule="auto"/>
         <w:jc w:val="both"/>
         <w:rPr>
@@ -10876,6 +10916,40 @@
           <w:color w:val="EE0000"/>
         </w:rPr>
       </w:pPr>
+      <w:r>
+        <w:rPr>
+          <w:b/>
+          <w:bCs/>
+        </w:rPr>
+        <w:t xml:space="preserve">Success Criteria: </w:t>
+      </w:r>
+      <w:r>
+        <w:t xml:space="preserve">Seat </w:t>
+      </w:r>
+      <w:r>
+        <w:t>types</w:t>
+      </w:r>
+      <w:r>
+        <w:t xml:space="preserve"> should be stored in the database with a multiplier against each one rather than being fixed in the program code, so that the price of a </w:t>
+      </w:r>
+      <w:r>
+        <w:t>type</w:t>
+      </w:r>
+      <w:r>
+        <w:t xml:space="preserve"> can be changed without the system being rebuilt. The price of an individual seat should be calculated as the screening ticket price multiplied by the multiplier for that seat's </w:t>
+      </w:r>
+      <w:r>
+        <w:t>type</w:t>
+      </w:r>
+      <w:r>
+        <w:t xml:space="preserve">. Booking three seats of mixed </w:t>
+      </w:r>
+      <w:r>
+        <w:t>types</w:t>
+      </w:r>
+      <w:r>
+        <w:t xml:space="preserve"> should produce a total that matches the sum of the individual seat prices to the penny, and the same total should appear on the booking screen, in the stored booking record and on the sales report.</w:t>
+      </w:r>
     </w:p>
     <w:sectPr>
       <w:headerReference w:type="even" r:id="rId26"/>

</xml_diff>

<commit_message>
added objective 20 into the investigation doc
</commit_message>
<xml_diff>
--- a/Investigation.docx
+++ b/Investigation.docx
@@ -10951,6 +10951,33 @@
         <w:t xml:space="preserve"> should produce a total that matches the sum of the individual seat prices to the penny, and the same total should appear on the booking screen, in the stored booking record and on the sales report.</w:t>
       </w:r>
     </w:p>
+    <w:p>
+      <w:pPr>
+        <w:spacing w:before="200" w:after="40"/>
+      </w:pPr>
+      <w:r>
+        <w:rPr>
+          <w:b/>
+          <w:bCs/>
+        </w:rPr>
+        <w:t xml:space="preserve">Objective 20: The system must allow a manager to decide which individual seats in a screen are premium, standard or accessible, rather than the layout being fixed by the program.</w:t>
+      </w:r>
+    </w:p>
+    <w:p>
+      <w:pPr>
+        <w:spacing w:after="80" w:line="276" w:lineRule="auto"/>
+      </w:pPr>
+      <w:r>
+        <w:rPr>
+          <w:b/>
+          <w:bCs/>
+        </w:rPr>
+        <w:t xml:space="preserve">Success Criteria: </w:t>
+      </w:r>
+      <w:r>
+        <w:t xml:space="preserve">A manager should be able to open a plan of any screen and change the class of a single seat or a whole row. The plan should show at least three classes distinguishably, and should remain readable when printed in black and white. Saving a plan for a screen that already has bookings against it should change only the class of each seat and must not delete and recreate the seat records, since existing bookings point at them. The system should warn before changing the class of a seat in a screen that is already selling.</w:t>
+      </w:r>
+    </w:p>
     <w:sectPr>
       <w:headerReference w:type="even" r:id="rId26"/>
       <w:headerReference w:type="default" r:id="rId27"/>

</xml_diff>

<commit_message>
added objective 21 into the investigation doc
</commit_message>
<xml_diff>
--- a/Investigation.docx
+++ b/Investigation.docx
@@ -10978,6 +10978,33 @@
         <w:t xml:space="preserve">A manager should be able to open a plan of any screen and change the class of a single seat or a whole row. The plan should show at least three classes distinguishably, and should remain readable when printed in black and white. Saving a plan for a screen that already has bookings against it should change only the class of each seat and must not delete and recreate the seat records, since existing bookings point at them. The system should warn before changing the class of a seat in a screen that is already selling.</w:t>
       </w:r>
     </w:p>
+    <w:p>
+      <w:pPr>
+        <w:spacing w:before="200" w:after="40"/>
+      </w:pPr>
+      <w:r>
+        <w:rPr>
+          <w:b/>
+          <w:bCs/>
+        </w:rPr>
+        <w:t xml:space="preserve">Objective 21: The system must record the price actually charged for every ticket and every food item at the moment of sale, so that a later change to a price cannot alter the value of a sale that has already been taken.</w:t>
+      </w:r>
+    </w:p>
+    <w:p>
+      <w:pPr>
+        <w:spacing w:after="80" w:line="276" w:lineRule="auto"/>
+      </w:pPr>
+      <w:r>
+        <w:rPr>
+          <w:b/>
+          <w:bCs/>
+        </w:rPr>
+        <w:t xml:space="preserve">Success Criteria: </w:t>
+      </w:r>
+      <w:r>
+        <w:t xml:space="preserve">Each booked seat and each food line should store the amount it was charged. Increasing the price of a screening or a menu item afterwards must leave the total of every existing booking completely unchanged, and the sales report must return the same figure for a past date range before and after that price change. Recalculating a booking total should never alter the ticket element of a sale that has already been completed.</w:t>
+      </w:r>
+    </w:p>
     <w:sectPr>
       <w:headerReference w:type="even" r:id="rId26"/>
       <w:headerReference w:type="default" r:id="rId27"/>

</xml_diff>

<commit_message>
added objective 22 into the investigation doc
</commit_message>
<xml_diff>
--- a/Investigation.docx
+++ b/Investigation.docx
@@ -11005,6 +11005,33 @@
         <w:t xml:space="preserve">Each booked seat and each food line should store the amount it was charged. Increasing the price of a screening or a menu item afterwards must leave the total of every existing booking completely unchanged, and the sales report must return the same figure for a past date range before and after that price change. Recalculating a booking total should never alter the ticket element of a sale that has already been completed.</w:t>
       </w:r>
     </w:p>
+    <w:p>
+      <w:pPr>
+        <w:spacing w:before="200" w:after="40"/>
+      </w:pPr>
+      <w:r>
+        <w:rPr>
+          <w:b/>
+          <w:bCs/>
+        </w:rPr>
+        <w:t xml:space="preserve">Objective 22: The system must allow a member of staff to refund part of a booking, handing back individual seats or a quantity of a food item without cancelling the entire sale.</w:t>
+      </w:r>
+    </w:p>
+    <w:p>
+      <w:pPr>
+        <w:spacing w:after="80" w:line="276" w:lineRule="auto"/>
+      </w:pPr>
+      <w:r>
+        <w:rPr>
+          <w:b/>
+          <w:bCs/>
+        </w:rPr>
+        <w:t xml:space="preserve">Success Criteria: </w:t>
+      </w:r>
+      <w:r>
+        <w:t xml:space="preserve">It should be possible to refund one seat out of several and leave the rest of the booking active, and to refund one item out of a quantity of the same item. Every refund should be recorded as its own record with the date, the total handed back, the reason and the member of staff who authorised it, broken down into one line per thing refunded. A refunded seat should return to sale immediately. Refunding everything left on a booking should cancel that booking automatically. Attempting to refund the same seat twice should be refused.</w:t>
+      </w:r>
+    </w:p>
     <w:sectPr>
       <w:headerReference w:type="even" r:id="rId26"/>
       <w:headerReference w:type="default" r:id="rId27"/>

</xml_diff>

<commit_message>
added objective 23 into the investigation doc
</commit_message>
<xml_diff>
--- a/Investigation.docx
+++ b/Investigation.docx
@@ -11032,6 +11032,33 @@
         <w:t xml:space="preserve">It should be possible to refund one seat out of several and leave the rest of the booking active, and to refund one item out of a quantity of the same item. Every refund should be recorded as its own record with the date, the total handed back, the reason and the member of staff who authorised it, broken down into one line per thing refunded. A refunded seat should return to sale immediately. Refunding everything left on a booking should cancel that booking automatically. Attempting to refund the same seat twice should be refused.</w:t>
       </w:r>
     </w:p>
+    <w:p>
+      <w:pPr>
+        <w:spacing w:before="200" w:after="40"/>
+      </w:pPr>
+      <w:r>
+        <w:rPr>
+          <w:b/>
+          <w:bCs/>
+        </w:rPr>
+        <w:t xml:space="preserve">Objective 23: The system must allow a sale to be taken for food and drink alone, with no screening and no seats attached to it.</w:t>
+      </w:r>
+    </w:p>
+    <w:p>
+      <w:pPr>
+        <w:spacing w:after="80" w:line="276" w:lineRule="auto"/>
+      </w:pPr>
+      <w:r>
+        <w:rPr>
+          <w:b/>
+          <w:bCs/>
+        </w:rPr>
+        <w:t xml:space="preserve">Success Criteria: </w:t>
+      </w:r>
+      <w:r>
+        <w:t xml:space="preserve">A counter sale should complete and save without a screening being selected. The sale should then appear correctly in the booking search, in the sales report and on the main menu takings figure, and must not be silently dropped by any query that reaches a film through the screening. The sales report should return the same concessions total whether it is measured on the booking date or on the screening date.</w:t>
+      </w:r>
+    </w:p>
     <w:sectPr>
       <w:headerReference w:type="even" r:id="rId26"/>
       <w:headerReference w:type="default" r:id="rId27"/>

</xml_diff>

<commit_message>
added objective 24 into the investigation doc
</commit_message>
<xml_diff>
--- a/Investigation.docx
+++ b/Investigation.docx
@@ -11059,6 +11059,33 @@
         <w:t xml:space="preserve">A counter sale should complete and save without a screening being selected. The sale should then appear correctly in the booking search, in the sales report and on the main menu takings figure, and must not be silently dropped by any query that reaches a film through the screening. The sales report should return the same concessions total whether it is measured on the booking date or on the screening date.</w:t>
       </w:r>
     </w:p>
+    <w:p>
+      <w:pPr>
+        <w:spacing w:before="200" w:after="40"/>
+      </w:pPr>
+      <w:r>
+        <w:rPr>
+          <w:b/>
+          <w:bCs/>
+        </w:rPr>
+        <w:t xml:space="preserve">Objective 24: The system must account for advertising and turnaround time when deciding how long a screening occupies a screen, rather than using the running time of the film alone.</w:t>
+      </w:r>
+    </w:p>
+    <w:p>
+      <w:pPr>
+        <w:spacing w:after="80" w:line="276" w:lineRule="auto"/>
+      </w:pPr>
+      <w:r>
+        <w:rPr>
+          <w:b/>
+          <w:bCs/>
+        </w:rPr>
+        <w:t xml:space="preserve">Success Criteria: </w:t>
+      </w:r>
+      <w:r>
+        <w:t xml:space="preserve">The time a screening occupies a screen should be the advertising allowance plus the film duration plus the turnaround allowance. Two screenings which would overlap once those allowances are included should be refused, and the message should state which existing screening is in the way. The finishing time displayed to the user should match the time the screen actually becomes free. Both allowances should be held as settings rather than being fixed in the code, and should be able to be overridden for an individual screening.</w:t>
+      </w:r>
+    </w:p>
     <w:sectPr>
       <w:headerReference w:type="even" r:id="rId26"/>
       <w:headerReference w:type="default" r:id="rId27"/>

</xml_diff>

<commit_message>
added objective 25 into the investigation doc
</commit_message>
<xml_diff>
--- a/Investigation.docx
+++ b/Investigation.docx
@@ -11086,6 +11086,33 @@
         <w:t xml:space="preserve">The time a screening occupies a screen should be the advertising allowance plus the film duration plus the turnaround allowance. Two screenings which would overlap once those allowances are included should be refused, and the message should state which existing screening is in the way. The finishing time displayed to the user should match the time the screen actually becomes free. Both allowances should be held as settings rather than being fixed in the code, and should be able to be overridden for an individual screening.</w:t>
       </w:r>
     </w:p>
+    <w:p>
+      <w:pPr>
+        <w:spacing w:before="200" w:after="40"/>
+      </w:pPr>
+      <w:r>
+        <w:rPr>
+          <w:b/>
+          <w:bCs/>
+        </w:rPr>
+        <w:t xml:space="preserve">Objective 25: The system must be able to suggest the next available start time for a film on a chosen screen, rather than only rejecting a time after the user has already entered one.</w:t>
+      </w:r>
+    </w:p>
+    <w:p>
+      <w:pPr>
+        <w:spacing w:after="80" w:line="276" w:lineRule="auto"/>
+      </w:pPr>
+      <w:r>
+        <w:rPr>
+          <w:b/>
+          <w:bCs/>
+        </w:rPr>
+        <w:t xml:space="preserve">Success Criteria: </w:t>
+      </w:r>
+      <w:r>
+        <w:t xml:space="preserve">Requesting a suggested time should return the earliest start on that day at which the film would fit without overlapping anything already scheduled, taking the advertising and turnaround allowances into account. A gap that is exactly large enough should be accepted and a gap one minute too small should be rejected. Where no gap exists before the last permitted start time, the system should say so rather than offering a time that will not work. A screen that is out of service should not be offered at all.</w:t>
+      </w:r>
+    </w:p>
     <w:sectPr>
       <w:headerReference w:type="even" r:id="rId26"/>
       <w:headerReference w:type="default" r:id="rId27"/>

</xml_diff>

<commit_message>
added objective 26 into the investigation doc
</commit_message>
<xml_diff>
--- a/Investigation.docx
+++ b/Investigation.docx
@@ -11113,6 +11113,33 @@
         <w:t xml:space="preserve">Requesting a suggested time should return the earliest start on that day at which the film would fit without overlapping anything already scheduled, taking the advertising and turnaround allowances into account. A gap that is exactly large enough should be accepted and a gap one minute too small should be rejected. Where no gap exists before the last permitted start time, the system should say so rather than offering a time that will not work. A screen that is out of service should not be offered at all.</w:t>
       </w:r>
     </w:p>
+    <w:p>
+      <w:pPr>
+        <w:spacing w:before="200" w:after="40"/>
+      </w:pPr>
+      <w:r>
+        <w:rPr>
+          <w:b/>
+          <w:bCs/>
+        </w:rPr>
+        <w:t xml:space="preserve">Objective 26: The system must round the start times it generates up to a sensible interval so that scheduled screenings begin on times a cinema would advertise.</w:t>
+      </w:r>
+    </w:p>
+    <w:p>
+      <w:pPr>
+        <w:spacing w:after="80" w:line="276" w:lineRule="auto"/>
+      </w:pPr>
+      <w:r>
+        <w:rPr>
+          <w:b/>
+          <w:bCs/>
+        </w:rPr>
+        <w:t xml:space="preserve">Success Criteria: </w:t>
+      </w:r>
+      <w:r>
+        <w:t xml:space="preserve">Generated start times should be rounded up to an interval held as a setting, and only intervals which divide evenly into an hour should be accepted. The rounding must be applied before the system checks whether the screening fits, so that a gap which is no longer large enough once the time has been rounded is correctly rejected. A time entered by hand should be left exactly as it was typed.</w:t>
+      </w:r>
+    </w:p>
     <w:sectPr>
       <w:headerReference w:type="even" r:id="rId26"/>
       <w:headerReference w:type="default" r:id="rId27"/>

</xml_diff>

<commit_message>
added objective 27 into the investigation doc
</commit_message>
<xml_diff>
--- a/Investigation.docx
+++ b/Investigation.docx
@@ -11138,6 +11138,33 @@
       </w:r>
       <w:r>
         <w:t xml:space="preserve">Generated start times should be rounded up to an interval held as a setting, and only intervals which divide evenly into an hour should be accepted. The rounding must be applied before the system checks whether the screening fits, so that a gap which is no longer large enough once the time has been rounded is correctly rejected. A time entered by hand should be left exactly as it was typed.</w:t>
+      </w:r>
+    </w:p>
+    <w:p>
+      <w:pPr>
+        <w:spacing w:before="200" w:after="40"/>
+      </w:pPr>
+      <w:r>
+        <w:rPr>
+          <w:b/>
+          <w:bCs/>
+        </w:rPr>
+        <w:t xml:space="preserve">Objective 27: The system must allow a film to be scheduled across a range of dates, or repeatedly across a single day, without the user entering each screening individually.</w:t>
+      </w:r>
+    </w:p>
+    <w:p>
+      <w:pPr>
+        <w:spacing w:after="80" w:line="276" w:lineRule="auto"/>
+      </w:pPr>
+      <w:r>
+        <w:rPr>
+          <w:b/>
+          <w:bCs/>
+        </w:rPr>
+        <w:t xml:space="preserve">Success Criteria: </w:t>
+      </w:r>
+      <w:r>
+        <w:t xml:space="preserve">Scheduling a run should create one screening per day across the chosen range, skipping any day where the screen is already occupied and reporting which days were skipped rather than stopping. Filling a day should create as many screenings as genuinely fit around what is already scheduled. In both cases the proposed times should be displayed for confirmation before anything is written, and the whole run should be saved inside a single transaction so that a partially created run is impossible.</w:t>
       </w:r>
     </w:p>
     <w:sectPr>

</xml_diff>

<commit_message>
added objective 28 into the investigation doc
</commit_message>
<xml_diff>
--- a/Investigation.docx
+++ b/Investigation.docx
@@ -11165,6 +11165,33 @@
       </w:r>
       <w:r>
         <w:t xml:space="preserve">Scheduling a run should create one screening per day across the chosen range, skipping any day where the screen is already occupied and reporting which days were skipped rather than stopping. Filling a day should create as many screenings as genuinely fit around what is already scheduled. In both cases the proposed times should be displayed for confirmation before anything is written, and the whole run should be saved inside a single transaction so that a partially created run is impossible.</w:t>
+      </w:r>
+    </w:p>
+    <w:p>
+      <w:pPr>
+        <w:spacing w:before="200" w:after="40"/>
+      </w:pPr>
+      <w:r>
+        <w:rPr>
+          <w:b/>
+          <w:bCs/>
+        </w:rPr>
+        <w:t xml:space="preserve">Objective 28: The system must allow a screening that has already sold tickets to be cancelled, keeping the record of the screening and the sales rather than deleting them.</w:t>
+      </w:r>
+    </w:p>
+    <w:p>
+      <w:pPr>
+        <w:spacing w:after="80" w:line="276" w:lineRule="auto"/>
+      </w:pPr>
+      <w:r>
+        <w:rPr>
+          <w:b/>
+          <w:bCs/>
+        </w:rPr>
+        <w:t xml:space="preserve">Success Criteria: </w:t>
+      </w:r>
+      <w:r>
+        <w:t xml:space="preserve">Cancelling a screening should require a reason and should state how many bookings and seats will be affected before it proceeds. The screening record should be kept and marked as cancelled, the bookings against it should be cancelled, and the seats should return to sale. A cancelled screening should no longer appear on the kiosk, the booking screen or the main menu, but should remain findable on the screenings list, and the time it occupied should become available to schedule again.</w:t>
       </w:r>
     </w:p>
     <w:sectPr>

</xml_diff>

<commit_message>
added objective 29 into the investigation doc
</commit_message>
<xml_diff>
--- a/Investigation.docx
+++ b/Investigation.docx
@@ -11192,6 +11192,33 @@
       </w:r>
       <w:r>
         <w:t xml:space="preserve">Cancelling a screening should require a reason and should state how many bookings and seats will be affected before it proceeds. The screening record should be kept and marked as cancelled, the bookings against it should be cancelled, and the seats should return to sale. A cancelled screening should no longer appear on the kiosk, the booking screen or the main menu, but should remain findable on the screenings list, and the time it occupied should become available to schedule again.</w:t>
+      </w:r>
+    </w:p>
+    <w:p>
+      <w:pPr>
+        <w:spacing w:before="200" w:after="40"/>
+      </w:pPr>
+      <w:r>
+        <w:rPr>
+          <w:b/>
+          <w:bCs/>
+        </w:rPr>
+        <w:t xml:space="preserve">Objective 29: The system must allow a screen to be taken out of service and a food or drink item to be withdrawn from sale, in both cases keeping the record and its sales history rather than deleting it.</w:t>
+      </w:r>
+    </w:p>
+    <w:p>
+      <w:pPr>
+        <w:spacing w:after="80" w:line="276" w:lineRule="auto"/>
+      </w:pPr>
+      <w:r>
+        <w:rPr>
+          <w:b/>
+          <w:bCs/>
+        </w:rPr>
+        <w:t xml:space="preserve">Success Criteria: </w:t>
+      </w:r>
+      <w:r>
+        <w:t xml:space="preserve">Marking a screen out of service should require a reason and should be refused while tickets are held for future screenings in it. A screen that is out of service should be refused when scheduling a new screening. A withdrawn menu item should no longer be offered on the till, the booking screen or the kiosk, but bookings that already include it should continue to display and report correctly. In both cases nothing that has previously been sold should disappear from the sales report.</w:t>
       </w:r>
     </w:p>
     <w:sectPr>

</xml_diff>

<commit_message>
added objective 30 into the investigation doc
</commit_message>
<xml_diff>
--- a/Investigation.docx
+++ b/Investigation.docx
@@ -11219,6 +11219,33 @@
       </w:r>
       <w:r>
         <w:t xml:space="preserve">Marking a screen out of service should require a reason and should be refused while tickets are held for future screenings in it. A screen that is out of service should be refused when scheduling a new screening. A withdrawn menu item should no longer be offered on the till, the booking screen or the kiosk, but bookings that already include it should continue to display and report correctly. In both cases nothing that has previously been sold should disappear from the sales report.</w:t>
+      </w:r>
+    </w:p>
+    <w:p>
+      <w:pPr>
+        <w:spacing w:before="200" w:after="40"/>
+      </w:pPr>
+      <w:r>
+        <w:rPr>
+          <w:b/>
+          <w:bCs/>
+        </w:rPr>
+        <w:t xml:space="preserve">Objective 30: The system must allow the manager to break sales down by film, by screening, by screen, by day, by food item and by member of staff, in addition to the overall totals.</w:t>
+      </w:r>
+    </w:p>
+    <w:p>
+      <w:pPr>
+        <w:spacing w:after="80" w:line="276" w:lineRule="auto"/>
+      </w:pPr>
+      <w:r>
+        <w:rPr>
+          <w:b/>
+          <w:bCs/>
+        </w:rPr>
+        <w:t xml:space="preserve">Success Criteria: </w:t>
+      </w:r>
+      <w:r>
+        <w:t xml:space="preserve">Each breakdown should be selectable from the sales report screen and should return within five seconds. The totals of every breakdown should agree with each other and with the takings figure shown on the main menu for the same period. A day with no sales should still appear in the daily breakdown with a total of zero rather than being omitted.</w:t>
       </w:r>
     </w:p>
     <w:sectPr>

</xml_diff>

<commit_message>
added objective 31 into the investigation doc
</commit_message>
<xml_diff>
--- a/Investigation.docx
+++ b/Investigation.docx
@@ -11246,6 +11246,33 @@
       </w:r>
       <w:r>
         <w:t xml:space="preserve">Each breakdown should be selectable from the sales report screen and should return within five seconds. The totals of every breakdown should agree with each other and with the takings figure shown on the main menu for the same period. A day with no sales should still appear in the daily breakdown with a total of zero rather than being omitted.</w:t>
+      </w:r>
+    </w:p>
+    <w:p>
+      <w:pPr>
+        <w:spacing w:before="200" w:after="40"/>
+      </w:pPr>
+      <w:r>
+        <w:rPr>
+          <w:b/>
+          <w:bCs/>
+        </w:rPr>
+        <w:t xml:space="preserve">Objective 31: The system must allow a sales report date range to be measured either by the date a booking was taken or by the date the screening took place, since those produce different figures whenever a customer books in advance.</w:t>
+      </w:r>
+    </w:p>
+    <w:p>
+      <w:pPr>
+        <w:spacing w:after="80" w:line="276" w:lineRule="auto"/>
+      </w:pPr>
+      <w:r>
+        <w:rPr>
+          <w:b/>
+          <w:bCs/>
+        </w:rPr>
+        <w:t xml:space="preserve">Success Criteria: </w:t>
+      </w:r>
+      <w:r>
+        <w:t xml:space="preserve">The report should offer both bases and switching between them should change the figures where advance bookings exist within the range. The occupancy figure should always be measured against the screenings that took place in the range regardless of the basis selected. A date range should include sales made at any time on the final day of the range.</w:t>
       </w:r>
     </w:p>
     <w:sectPr>

</xml_diff>

<commit_message>
added objective 32 into the investigation doc
</commit_message>
<xml_diff>
--- a/Investigation.docx
+++ b/Investigation.docx
@@ -11273,6 +11273,33 @@
       </w:r>
       <w:r>
         <w:t xml:space="preserve">The report should offer both bases and switching between them should change the figures where advance bookings exist within the range. The occupancy figure should always be measured against the screenings that took place in the range regardless of the basis selected. A date range should include sales made at any time on the final day of the range.</w:t>
+      </w:r>
+    </w:p>
+    <w:p>
+      <w:pPr>
+        <w:spacing w:before="200" w:after="40"/>
+      </w:pPr>
+      <w:r>
+        <w:rPr>
+          <w:b/>
+          <w:bCs/>
+        </w:rPr>
+        <w:t xml:space="preserve">Objective 32: The system must allow the contents of any list or report to be exported to a file that can be opened in a spreadsheet.</w:t>
+      </w:r>
+    </w:p>
+    <w:p>
+      <w:pPr>
+        <w:spacing w:after="80" w:line="276" w:lineRule="auto"/>
+      </w:pPr>
+      <w:r>
+        <w:rPr>
+          <w:b/>
+          <w:bCs/>
+        </w:rPr>
+        <w:t xml:space="preserve">Success Criteria: </w:t>
+      </w:r>
+      <w:r>
+        <w:t xml:space="preserve">Export should be available from the films, customers, screenings, audit log, door list and sales report screens. The exported file should take its column headings from the grid so that a column added later is included automatically. Values containing commas or quotation marks should be written so that the file still opens correctly. Monetary values in the sales report export should be written as numbers a spreadsheet can total rather than as text.</w:t>
       </w:r>
     </w:p>
     <w:sectPr>

</xml_diff>

<commit_message>
added objective 33 into the investigation doc
</commit_message>
<xml_diff>
--- a/Investigation.docx
+++ b/Investigation.docx
@@ -11300,6 +11300,33 @@
       </w:r>
       <w:r>
         <w:t xml:space="preserve">Export should be available from the films, customers, screenings, audit log, door list and sales report screens. The exported file should take its column headings from the grid so that a column added later is included automatically. Values containing commas or quotation marks should be written so that the file still opens correctly. Monetary values in the sales report export should be written as numbers a spreadsheet can total rather than as text.</w:t>
+      </w:r>
+    </w:p>
+    <w:p>
+      <w:pPr>
+        <w:spacing w:before="200" w:after="40"/>
+      </w:pPr>
+      <w:r>
+        <w:rPr>
+          <w:b/>
+          <w:bCs/>
+        </w:rPr>
+        <w:t xml:space="preserve">Objective 33: The system must allow film records to be imported in bulk from an external data file, so that the catalogue does not have to be typed in by hand.</w:t>
+      </w:r>
+    </w:p>
+    <w:p>
+      <w:pPr>
+        <w:spacing w:after="80" w:line="276" w:lineRule="auto"/>
+      </w:pPr>
+      <w:r>
+        <w:rPr>
+          <w:b/>
+          <w:bCs/>
+        </w:rPr>
+        <w:t xml:space="preserve">Success Criteria: </w:t>
+      </w:r>
+      <w:r>
+        <w:t xml:space="preserve">The user should be able to search a data file by part of a title and a starting year, and should be shown the matching films with a tick box against each so that only the chosen records are imported. A film already held on the system, matched on both title and year, should be identified and prevented from being imported a second time. Importing should record how many records were added and how many were skipped, and a damaged line in the file should be skipped rather than causing the import to fail.</w:t>
       </w:r>
     </w:p>
     <w:sectPr>

</xml_diff>

<commit_message>
added objective 34 into the investigation doc
</commit_message>
<xml_diff>
--- a/Investigation.docx
+++ b/Investigation.docx
@@ -11327,6 +11327,33 @@
       </w:r>
       <w:r>
         <w:t xml:space="preserve">The user should be able to search a data file by part of a title and a starting year, and should be shown the matching films with a tick box against each so that only the chosen records are imported. A film already held on the system, matched on both title and year, should be identified and prevented from being imported a second time. Importing should record how many records were added and how many were skipped, and a damaged line in the file should be skipped rather than causing the import to fail.</w:t>
+      </w:r>
+    </w:p>
+    <w:p>
+      <w:pPr>
+        <w:spacing w:before="200" w:after="40"/>
+      </w:pPr>
+      <w:r>
+        <w:rPr>
+          <w:b/>
+          <w:bCs/>
+        </w:rPr>
+        <w:t xml:space="preserve">Objective 34: The system must allow a poster image to be stored against a film and displayed wherever that film is presented to a customer.</w:t>
+      </w:r>
+    </w:p>
+    <w:p>
+      <w:pPr>
+        <w:spacing w:after="80" w:line="276" w:lineRule="auto"/>
+      </w:pPr>
+      <w:r>
+        <w:rPr>
+          <w:b/>
+          <w:bCs/>
+        </w:rPr>
+        <w:t xml:space="preserve">Success Criteria: </w:t>
+      </w:r>
+      <w:r>
+        <w:t xml:space="preserve">A poster should be selectable from a file on the computer or retrievable automatically by searching an online film database on the title and year. The image file itself should be stored outside the database with only its file name held in the film record. The poster should appear on the film management screen and at every stage of the kiosk where that film is shown. A film with no poster should display correctly rather than showing an empty frame, and image resources should be released when a list is rebuilt so that repeated use does not exhaust them.</w:t>
       </w:r>
     </w:p>
     <w:sectPr>

</xml_diff>

<commit_message>
added objective 35 into the investigation doc
</commit_message>
<xml_diff>
--- a/Investigation.docx
+++ b/Investigation.docx
@@ -11354,6 +11354,33 @@
       </w:r>
       <w:r>
         <w:t xml:space="preserve">A poster should be selectable from a file on the computer or retrievable automatically by searching an online film database on the title and year. The image file itself should be stored outside the database with only its file name held in the film record. The poster should appear on the film management screen and at every stage of the kiosk where that film is shown. A film with no poster should display correctly rather than showing an empty frame, and image resources should be released when a list is rebuilt so that repeated use does not exhaust them.</w:t>
+      </w:r>
+    </w:p>
+    <w:p>
+      <w:pPr>
+        <w:spacing w:before="200" w:after="40"/>
+      </w:pPr>
+      <w:r>
+        <w:rPr>
+          <w:b/>
+          <w:bCs/>
+        </w:rPr>
+        <w:t xml:space="preserve">Objective 35: The system must allow a user to change their own password from within the program without the database being opened directly.</w:t>
+      </w:r>
+    </w:p>
+    <w:p>
+      <w:pPr>
+        <w:spacing w:after="80" w:line="276" w:lineRule="auto"/>
+      </w:pPr>
+      <w:r>
+        <w:rPr>
+          <w:b/>
+          <w:bCs/>
+        </w:rPr>
+        <w:t xml:space="preserve">Success Criteria: </w:t>
+      </w:r>
+      <w:r>
+        <w:t xml:space="preserve">Changing a password should require the current password to be entered correctly, should require the new password to be typed twice identically, should enforce a minimum length held as a setting, and should refuse a new password identical to the old one. The new password should be stored using the same method as the existing login system. Both successful and failed attempts should be written to the audit log.</w:t>
       </w:r>
     </w:p>
     <w:sectPr>

</xml_diff>

<commit_message>
added objective 36 into the investigation doc
</commit_message>
<xml_diff>
--- a/Investigation.docx
+++ b/Investigation.docx
@@ -11381,6 +11381,33 @@
       </w:r>
       <w:r>
         <w:t xml:space="preserve">Changing a password should require the current password to be entered correctly, should require the new password to be typed twice identically, should enforce a minimum length held as a setting, and should refuse a new password identical to the old one. The new password should be stored using the same method as the existing login system. Both successful and failed attempts should be written to the audit log.</w:t>
+      </w:r>
+    </w:p>
+    <w:p>
+      <w:pPr>
+        <w:spacing w:before="200" w:after="40"/>
+      </w:pPr>
+      <w:r>
+        <w:rPr>
+          <w:b/>
+          <w:bCs/>
+        </w:rPr>
+        <w:t xml:space="preserve">Objective 36: The system must allow a manager to create a backup copy of the database from within the program, and must prevent a member of staff from doing so.</w:t>
+      </w:r>
+    </w:p>
+    <w:p>
+      <w:pPr>
+        <w:spacing w:after="80" w:line="276" w:lineRule="auto"/>
+      </w:pPr>
+      <w:r>
+        <w:rPr>
+          <w:b/>
+          <w:bCs/>
+        </w:rPr>
+        <w:t xml:space="preserve">Success Criteria: </w:t>
+      </w:r>
+      <w:r>
+        <w:t xml:space="preserve">A manager should be able to choose a destination folder and create a backup, with the file named so that it includes the date and time and therefore cannot overwrite an earlier backup. The backup option should be disabled for a user below manager level, with an explanation shown rather than the option simply disappearing. Every backup should be recorded in the audit log.</w:t>
       </w:r>
     </w:p>
     <w:sectPr>

</xml_diff>

<commit_message>
added objective 37 into the investigation doc
</commit_message>
<xml_diff>
--- a/Investigation.docx
+++ b/Investigation.docx
@@ -11408,6 +11408,33 @@
       </w:r>
       <w:r>
         <w:t xml:space="preserve">A manager should be able to choose a destination folder and create a backup, with the file named so that it includes the date and time and therefore cannot overwrite an earlier backup. The backup option should be disabled for a user below manager level, with an explanation shown rather than the option simply disappearing. Every backup should be recorded in the audit log.</w:t>
+      </w:r>
+    </w:p>
+    <w:p>
+      <w:pPr>
+        <w:spacing w:before="200" w:after="40"/>
+      </w:pPr>
+      <w:r>
+        <w:rPr>
+          <w:b/>
+          <w:bCs/>
+        </w:rPr>
+        <w:t xml:space="preserve">Objective 37: The system must record which member of staff took each sale, and must allow any user to review their own activity and their own sales without being able to see anybody else's.</w:t>
+      </w:r>
+    </w:p>
+    <w:p>
+      <w:pPr>
+        <w:spacing w:after="80" w:line="276" w:lineRule="auto"/>
+      </w:pPr>
+      <w:r>
+        <w:rPr>
+          <w:b/>
+          <w:bCs/>
+        </w:rPr>
+        <w:t xml:space="preserve">Success Criteria: </w:t>
+      </w:r>
+      <w:r>
+        <w:t xml:space="preserve">Every booking taken at the till should record the login of the member of staff who took it, while a sale completed at the kiosk should record no member of staff at all. A user of any access level should be able to view their own audit entries, their own sales and their own sign in history, filtered to their own account only with no facility to select another user. Monetary totals should be visible to a manager and withheld from a member of staff. Failed sign in attempts against that account should be reported to the user.</w:t>
       </w:r>
     </w:p>
     <w:sectPr>

</xml_diff>

<commit_message>
added objective 38 into the investigation doc
</commit_message>
<xml_diff>
--- a/Investigation.docx
+++ b/Investigation.docx
@@ -11435,6 +11435,33 @@
       </w:r>
       <w:r>
         <w:t xml:space="preserve">Every booking taken at the till should record the login of the member of staff who took it, while a sale completed at the kiosk should record no member of staff at all. A user of any access level should be able to view their own audit entries, their own sales and their own sign in history, filtered to their own account only with no facility to select another user. Monetary totals should be visible to a manager and withheld from a member of staff. Failed sign in attempts against that account should be reported to the user.</w:t>
+      </w:r>
+    </w:p>
+    <w:p>
+      <w:pPr>
+        <w:spacing w:before="200" w:after="40"/>
+      </w:pPr>
+      <w:r>
+        <w:rPr>
+          <w:b/>
+          <w:bCs/>
+        </w:rPr>
+        <w:t xml:space="preserve">Objective 38: The system must prevent a customer at the kiosk from leaving kiosk mode and reaching staff functions without re-entering the password of the account that started it.</w:t>
+      </w:r>
+    </w:p>
+    <w:p>
+      <w:pPr>
+        <w:spacing w:after="80" w:line="276" w:lineRule="auto"/>
+      </w:pPr>
+      <w:r>
+        <w:rPr>
+          <w:b/>
+          <w:bCs/>
+        </w:rPr>
+        <w:t xml:space="preserve">Success Criteria: </w:t>
+      </w:r>
+      <w:r>
+        <w:t xml:space="preserve">Exiting kiosk mode should require the password of the logged in account rather than a simple confirmation. The kiosk should return to its opening screen automatically after a period of inactivity held as a setting, discarding any part completed order. No staff or management function should be reachable from the kiosk at any point.</w:t>
       </w:r>
     </w:p>
     <w:sectPr>

</xml_diff>

<commit_message>
added objective 39 into the investigation doc
</commit_message>
<xml_diff>
--- a/Investigation.docx
+++ b/Investigation.docx
@@ -11462,6 +11462,33 @@
       </w:r>
       <w:r>
         <w:t xml:space="preserve">Exiting kiosk mode should require the password of the logged in account rather than a simple confirmation. The kiosk should return to its opening screen automatically after a period of inactivity held as a setting, discarding any part completed order. No staff or management function should be reachable from the kiosk at any point.</w:t>
+      </w:r>
+    </w:p>
+    <w:p>
+      <w:pPr>
+        <w:spacing w:before="200" w:after="40"/>
+      </w:pPr>
+      <w:r>
+        <w:rPr>
+          <w:b/>
+          <w:bCs/>
+        </w:rPr>
+        <w:t xml:space="preserve">Objective 39: The audit log must record the user responsible for every entry and grade each entry by severity, and must be searchable so that it remains usable as the number of entries grows.</w:t>
+      </w:r>
+    </w:p>
+    <w:p>
+      <w:pPr>
+        <w:spacing w:after="80" w:line="276" w:lineRule="auto"/>
+      </w:pPr>
+      <w:r>
+        <w:rPr>
+          <w:b/>
+          <w:bCs/>
+        </w:rPr>
+        <w:t xml:space="preserve">Success Criteria: </w:t>
+      </w:r>
+      <w:r>
+        <w:t xml:space="preserve">Every entry should record the user automatically rather than the user being supplied by the calling routine. Entries should be graded so that routine activity, data changes, refused actions and security events can be told apart. The log screen should filter by date range, area, severity, user and free text, colour entries by severity, state how many entries match, and remain responsive with several thousand entries held. Refused actions such as a rejected deletion or a failed sign in should be recorded, not only successful ones.</w:t>
       </w:r>
     </w:p>
     <w:sectPr>

</xml_diff>

<commit_message>
added objective 40 into the investigation doc
</commit_message>
<xml_diff>
--- a/Investigation.docx
+++ b/Investigation.docx
@@ -11489,6 +11489,33 @@
       </w:r>
       <w:r>
         <w:t xml:space="preserve">Every entry should record the user automatically rather than the user being supplied by the calling routine. Entries should be graded so that routine activity, data changes, refused actions and security events can be told apart. The log screen should filter by date range, area, severity, user and free text, colour entries by severity, state how many entries match, and remain responsive with several thousand entries held. Refused actions such as a rejected deletion or a failed sign in should be recorded, not only successful ones.</w:t>
+      </w:r>
+    </w:p>
+    <w:p>
+      <w:pPr>
+        <w:spacing w:before="200" w:after="40"/>
+      </w:pPr>
+      <w:r>
+        <w:rPr>
+          <w:b/>
+          <w:bCs/>
+        </w:rPr>
+        <w:t xml:space="preserve">Objective 40: The system must hold its configurable values in the database rather than in the program code, so that a manager can change them without the system being rebuilt.</w:t>
+      </w:r>
+    </w:p>
+    <w:p>
+      <w:pPr>
+        <w:spacing w:after="80" w:line="276" w:lineRule="auto"/>
+      </w:pPr>
+      <w:r>
+        <w:rPr>
+          <w:b/>
+          <w:bCs/>
+        </w:rPr>
+        <w:t xml:space="preserve">Success Criteria: </w:t>
+      </w:r>
+      <w:r>
+        <w:t xml:space="preserve">Values including the advertising and turnaround allowances, the opening and closing times, the rounding interval, the default ticket price, the maximum seats per sale, the kiosk timeouts, the permitted login attempts and the minimum password length should all be stored in the database and editable through a settings screen. Changing a value should take effect without the program being restarted. An invalid or missing value should fall back to a sensible default rather than causing a failure.</w:t>
       </w:r>
     </w:p>
     <w:sectPr>

</xml_diff>

<commit_message>
added objective 41 into the investigation doc
</commit_message>
<xml_diff>
--- a/Investigation.docx
+++ b/Investigation.docx
@@ -11516,6 +11516,33 @@
       </w:r>
       <w:r>
         <w:t xml:space="preserve">Values including the advertising and turnaround allowances, the opening and closing times, the rounding interval, the default ticket price, the maximum seats per sale, the kiosk timeouts, the permitted login attempts and the minimum password length should all be stored in the database and editable through a settings screen. Changing a value should take effect without the program being restarted. An invalid or missing value should fall back to a sensible default rather than causing a failure.</w:t>
+      </w:r>
+    </w:p>
+    <w:p>
+      <w:pPr>
+        <w:spacing w:before="200" w:after="40"/>
+      </w:pPr>
+      <w:r>
+        <w:rPr>
+          <w:b/>
+          <w:bCs/>
+        </w:rPr>
+        <w:t xml:space="preserve">Objective 41: The system must offer a light and a dark colour scheme, applied consistently across every form and remembered against the individual user account rather than the machine.</w:t>
+      </w:r>
+    </w:p>
+    <w:p>
+      <w:pPr>
+        <w:spacing w:after="80" w:line="276" w:lineRule="auto"/>
+      </w:pPr>
+      <w:r>
+        <w:rPr>
+          <w:b/>
+          <w:bCs/>
+        </w:rPr>
+        <w:t xml:space="preserve">Success Criteria: </w:t>
+      </w:r>
+      <w:r>
+        <w:t xml:space="preserve">Selecting a scheme should recolour every open form immediately. The chosen scheme should be stored against the user's login so that two members of staff sharing a machine each keep their own preference, and should be cleared on logout so the next user does not inherit it. Every form should take its colours from a single shared definition rather than holding its own. Changing scheme while a booking is in progress must not alter or lose the seats already selected.</w:t>
       </w:r>
     </w:p>
     <w:sectPr>

</xml_diff>

<commit_message>
added objective 42 into the investigation doc
</commit_message>
<xml_diff>
--- a/Investigation.docx
+++ b/Investigation.docx
@@ -11543,6 +11543,33 @@
       </w:r>
       <w:r>
         <w:t xml:space="preserve">Selecting a scheme should recolour every open form immediately. The chosen scheme should be stored against the user's login so that two members of staff sharing a machine each keep their own preference, and should be cleared on logout so the next user does not inherit it. Every form should take its colours from a single shared definition rather than holding its own. Changing scheme while a booking is in progress must not alter or lose the seats already selected.</w:t>
+      </w:r>
+    </w:p>
+    <w:p>
+      <w:pPr>
+        <w:spacing w:before="200" w:after="40"/>
+      </w:pPr>
+      <w:r>
+        <w:rPr>
+          <w:b/>
+          <w:bCs/>
+        </w:rPr>
+        <w:t xml:space="preserve">Objective 42: The main menu must present the manager and the member of staff with the information relevant to their role at the start of a shift, rather than presenting only a list of buttons.</w:t>
+      </w:r>
+    </w:p>
+    <w:p>
+      <w:pPr>
+        <w:spacing w:after="80" w:line="276" w:lineRule="auto"/>
+      </w:pPr>
+      <w:r>
+        <w:rPr>
+          <w:b/>
+          <w:bCs/>
+        </w:rPr>
+        <w:t xml:space="preserve">Success Criteria: </w:t>
+      </w:r>
+      <w:r>
+        <w:t xml:space="preserve">The menu should display live figures read from the database when it opens and should refresh them automatically. A manager should see takings and overall occupancy, while a member of staff should see seats sold, items sold and seats remaining, with no monetary figures displayed anywhere. Screenings approaching capacity should be highlighted. The navigation should be grouped by area and should close up correctly when options are hidden for a lower access level.</w:t>
       </w:r>
     </w:p>
     <w:sectPr>

</xml_diff>

<commit_message>
added objective 43 into the investigation doc
</commit_message>
<xml_diff>
--- a/Investigation.docx
+++ b/Investigation.docx
@@ -11570,6 +11570,33 @@
       </w:r>
       <w:r>
         <w:t xml:space="preserve">The menu should display live figures read from the database when it opens and should refresh them automatically. A manager should see takings and overall occupancy, while a member of staff should see seats sold, items sold and seats remaining, with no monetary figures displayed anywhere. Screenings approaching capacity should be highlighted. The navigation should be grouped by area and should close up correctly when options are hidden for a lower access level.</w:t>
+      </w:r>
+    </w:p>
+    <w:p>
+      <w:pPr>
+        <w:spacing w:before="200" w:after="40"/>
+      </w:pPr>
+      <w:r>
+        <w:rPr>
+          <w:b/>
+          <w:bCs/>
+        </w:rPr>
+        <w:t xml:space="preserve">Objective 43: The system must warn a user before unsaved data entry is discarded, and must confirm before any action that destroys data, with the safe option selected by default.</w:t>
+      </w:r>
+    </w:p>
+    <w:p>
+      <w:pPr>
+        <w:spacing w:after="80" w:line="276" w:lineRule="auto"/>
+      </w:pPr>
+      <w:r>
+        <w:rPr>
+          <w:b/>
+          <w:bCs/>
+        </w:rPr>
+        <w:t xml:space="preserve">Success Criteria: </w:t>
+      </w:r>
+      <w:r>
+        <w:t xml:space="preserve">Selecting a different record while data has been typed into the entry fields should prompt before the typed data is replaced, and should not prompt when nothing has been typed. Every confirmation which deletes, cancels or refunds should open with the negative option selected so that pressing Enter does not destroy anything. No record screen should report a successful save when the underlying database operation has failed.</w:t>
       </w:r>
     </w:p>
     <w:sectPr>

</xml_diff>

<commit_message>
added objective 44 into the investigation doc
</commit_message>
<xml_diff>
--- a/Investigation.docx
+++ b/Investigation.docx
@@ -11597,6 +11597,33 @@
       </w:r>
       <w:r>
         <w:t xml:space="preserve">Selecting a different record while data has been typed into the entry fields should prompt before the typed data is replaced, and should not prompt when nothing has been typed. Every confirmation which deletes, cancels or refunds should open with the negative option selected so that pressing Enter does not destroy anything. No record screen should report a successful save when the underlying database operation has failed.</w:t>
+      </w:r>
+    </w:p>
+    <w:p>
+      <w:pPr>
+        <w:spacing w:before="200" w:after="40"/>
+      </w:pPr>
+      <w:r>
+        <w:rPr>
+          <w:b/>
+          <w:bCs/>
+        </w:rPr>
+        <w:t xml:space="preserve">Objective 44: The system must prevent duplicate records being created where a duplicate would be genuinely ambiguous, and must prevent deletion of any record that other records depend upon.</w:t>
+      </w:r>
+    </w:p>
+    <w:p>
+      <w:pPr>
+        <w:spacing w:after="80" w:line="276" w:lineRule="auto"/>
+      </w:pPr>
+      <w:r>
+        <w:rPr>
+          <w:b/>
+          <w:bCs/>
+        </w:rPr>
+        <w:t xml:space="preserve">Success Criteria: </w:t>
+      </w:r>
+      <w:r>
+        <w:t xml:space="preserve">Two screens, two films of the same title and year, or two menu items of the same name should be refused. Two customers of the same name should be permitted but should prompt for confirmation, since two people genuinely can share a name. A film with screenings, a customer with bookings, a menu item on an existing order, a screen with screenings or booked seats and a screening with seats sold should all be refused deletion, and the message should state what must be dealt with first. In every case the record being edited should be excluded from its own duplicate check.</w:t>
       </w:r>
     </w:p>
     <w:sectPr>

</xml_diff>

<commit_message>
started the post prototype refinement doc
</commit_message>
<xml_diff>
--- a/Investigation.docx
+++ b/Investigation.docx
@@ -9856,7 +9856,7 @@
       </w:r>
       <w:proofErr w:type="spellEnd"/>
       <w:r>
-        <w:t xml:space="preserve"> kiosk interface. Staff will be able to log in to manage bookings and screenings. The manager will have full access to all areas of the system including film management and sales reporting. Access levels will be enforced through the login system to ensure that users can only access the parts of the system that are relevant to their role, which is dealt with by Objective 10.</w:t>
+        <w:t xml:space="preserve"> kiosk interface. Staff will be able to log in to take bookings and serve customers at the counter. The manager will have full access to all areas of the system including film management and sales reporting. Access levels will be enforced through the login system to ensure that users can only access the parts of the system that are relevant to their role, which is dealt with by Objective 10.</w:t>
       </w:r>
     </w:p>
     <w:p>
@@ -10265,7 +10265,7 @@
           <w:b/>
           <w:bCs/>
         </w:rPr>
-        <w:t>: The system must allow staff and managers to add new screenings for existing films, specifying the screen, date, time and ticket price.</w:t>
+        <w:t>: The system must allow managers to add new screenings for existing films, specifying the screen, date, time and ticket price.</w:t>
       </w:r>
     </w:p>
     <w:p>
@@ -10400,7 +10400,7 @@
           <w:b/>
           <w:bCs/>
         </w:rPr>
-        <w:t>: The system must enforce access levels so that customers using the kiosk can only access booking functions, whilst staff can access management functions and managers can access all areas of the system.</w:t>
+        <w:t>: The system must enforce access levels so that customers using the kiosk can only access booking functions, whilst staff can access the booking and counter functions and managers can access all areas of the system.</w:t>
       </w:r>
       <w:r>
         <w:rPr>

</xml_diff>

<commit_message>
fixed buying tickets on its own at kiosk
</commit_message>
<xml_diff>
--- a/Investigation.docx
+++ b/Investigation.docx
@@ -9914,11 +9914,11 @@
         <w:spacing w:line="276" w:lineRule="auto"/>
       </w:pPr>
       <w:r>
-        <w:t xml:space="preserve">The system will not include a real payment processing system. Taking card or cash payments involves integration with chip and pin hardware and payment gateway APIs which are not available for this project. Payment will be simulated within the system and </w:t>
+        <w:t xml:space="preserve">The system will not include a real payment processing system. Taking card or cash payments involves integration with chip and pin hardware and payment gateway APIs </w:t>
       </w:r>
       <w:r>
         <w:lastRenderedPageBreak/>
-        <w:t>the process of actually collecting money from the customer will be assumed to happen separately.</w:t>
+        <w:t>which are not available for this project. Payment will be simulated within the system and the process of actually collecting money from the customer will be assumed to happen separately.</w:t>
       </w:r>
     </w:p>
     <w:p>
@@ -10047,7 +10047,11 @@
         <w:t xml:space="preserve">Success Criteria: </w:t>
       </w:r>
       <w:r>
-        <w:t>A new booking should be added to the Microsoft Access database in under 30 seconds. The booking record should appear immediately in the database with the correct customer name, screening, seat numbers and ticket quantity. Validation should prevent a booking being saved without all required fields completed.</w:t>
+        <w:t xml:space="preserve">A new booking should be added to the Microsoft Access database in under 30 seconds. The booking record should appear immediately in the database with the </w:t>
+      </w:r>
+      <w:r>
+        <w:lastRenderedPageBreak/>
+        <w:t>correct customer name, screening, seat numbers and ticket quantity. Validation should prevent a booking being saved without all required fields completed.</w:t>
       </w:r>
     </w:p>
     <w:p>
@@ -10059,8 +10063,199 @@
           <w:b/>
           <w:bCs/>
         </w:rPr>
+        <w:t>Objective 2</w:t>
+      </w:r>
+      <w:r>
+        <w:rPr>
+          <w:b/>
+          <w:bCs/>
+        </w:rPr>
+        <w:t xml:space="preserve"> (P)</w:t>
+      </w:r>
+      <w:r>
+        <w:rPr>
+          <w:b/>
+          <w:bCs/>
+        </w:rPr>
+        <w:t>: The system must prevent double bookings by ensuring that a seat which has already been allocated to a customer cannot be selected by another customer for the same screening.</w:t>
+      </w:r>
+    </w:p>
+    <w:p>
+      <w:pPr>
+        <w:spacing w:after="80" w:line="276" w:lineRule="auto"/>
+      </w:pPr>
+      <w:r>
+        <w:rPr>
+          <w:b/>
+          <w:bCs/>
+        </w:rPr>
+        <w:t xml:space="preserve">Success Criteria: </w:t>
+      </w:r>
+      <w:r>
+        <w:t>When a seat is already booked for a screening it should be visually marked as unavailable on the seat selection interface and it should be impossible to select or book it. Attempting to book an already taken seat should display a clear error message.</w:t>
+      </w:r>
+    </w:p>
+    <w:p>
+      <w:pPr>
+        <w:spacing w:before="200" w:after="40"/>
+      </w:pPr>
+      <w:r>
+        <w:rPr>
+          <w:b/>
+          <w:bCs/>
+        </w:rPr>
+        <w:t>Objective 3</w:t>
+      </w:r>
+      <w:r>
+        <w:rPr>
+          <w:b/>
+          <w:bCs/>
+        </w:rPr>
+        <w:t xml:space="preserve"> (P)</w:t>
+      </w:r>
+      <w:r>
+        <w:rPr>
+          <w:b/>
+          <w:bCs/>
+        </w:rPr>
+        <w:t>: The system must display a graphical seat map for each screening showing which seats are available and which are already booked.</w:t>
+      </w:r>
+    </w:p>
+    <w:p>
+      <w:pPr>
+        <w:spacing w:after="80" w:line="276" w:lineRule="auto"/>
+      </w:pPr>
+      <w:r>
+        <w:rPr>
+          <w:b/>
+          <w:bCs/>
+        </w:rPr>
+        <w:t xml:space="preserve">Success Criteria: </w:t>
+      </w:r>
+      <w:r>
+        <w:t>The seat map should load within 3 seconds of a screening being selected. Available seats and booked seats should be displayed in clearly distinguishable colours. The seat map should accurately reflect the current state of the database at the time of loading.</w:t>
+      </w:r>
+    </w:p>
+    <w:p>
+      <w:pPr>
+        <w:spacing w:before="200" w:after="40"/>
+      </w:pPr>
+      <w:r>
+        <w:rPr>
+          <w:b/>
+          <w:bCs/>
+        </w:rPr>
+        <w:t>Objective 4: The system must allow customers to purchase tickets through a self-service kiosk interface, selecting a film, screening time, seats and completing their booking without staff assistance.</w:t>
+      </w:r>
+    </w:p>
+    <w:p>
+      <w:pPr>
+        <w:spacing w:after="80" w:line="276" w:lineRule="auto"/>
+      </w:pPr>
+      <w:r>
+        <w:rPr>
+          <w:b/>
+          <w:bCs/>
+        </w:rPr>
+        <w:t xml:space="preserve">Success Criteria: </w:t>
+      </w:r>
+      <w:r>
+        <w:t>A customer should be able to complete a full ticket booking through the kiosk interface in under 2 minutes. The kiosk should guide the customer through each stage clearly using buttons and on screen instructions. The completed booking should be recorded in the database correctly.</w:t>
+      </w:r>
+    </w:p>
+    <w:p>
+      <w:pPr>
+        <w:spacing w:before="200" w:after="40"/>
+      </w:pPr>
+      <w:r>
+        <w:rPr>
+          <w:b/>
+          <w:bCs/>
+        </w:rPr>
+        <w:t>Objective 5</w:t>
+      </w:r>
+      <w:r>
+        <w:rPr>
+          <w:b/>
+          <w:bCs/>
+        </w:rPr>
+        <w:t xml:space="preserve"> (P)</w:t>
+      </w:r>
+      <w:r>
+        <w:rPr>
+          <w:b/>
+          <w:bCs/>
+        </w:rPr>
+        <w:t>: The system must allow customers to add food and drink items to their order at the same time as booking tickets, with the combined order saved to the database.</w:t>
+      </w:r>
+    </w:p>
+    <w:p>
+      <w:pPr>
+        <w:spacing w:after="80" w:line="276" w:lineRule="auto"/>
+      </w:pPr>
+      <w:r>
+        <w:rPr>
+          <w:b/>
+          <w:bCs/>
+        </w:rPr>
+        <w:t xml:space="preserve">Success Criteria: </w:t>
+      </w:r>
+      <w:r>
+        <w:t>Food and drink items should be displayed on a clearly navigable menu during the booking process. A customer should be able to add multiple items to their order. The food and drink order should be saved to the database linked to the correct booking record.</w:t>
+      </w:r>
+    </w:p>
+    <w:p>
+      <w:pPr>
+        <w:spacing w:before="200" w:after="40"/>
+      </w:pPr>
+      <w:r>
+        <w:rPr>
+          <w:b/>
+          <w:bCs/>
+        </w:rPr>
+        <w:t>Objective 6</w:t>
+      </w:r>
+      <w:r>
+        <w:rPr>
+          <w:b/>
+          <w:bCs/>
+        </w:rPr>
+        <w:t xml:space="preserve"> (P)</w:t>
+      </w:r>
+      <w:r>
+        <w:rPr>
+          <w:b/>
+          <w:bCs/>
+        </w:rPr>
+        <w:t>: The system must allow staff and managers to add new films to the system, including the film title, age rating, duration and description.</w:t>
+      </w:r>
+    </w:p>
+    <w:p>
+      <w:pPr>
+        <w:spacing w:after="80" w:line="276" w:lineRule="auto"/>
+      </w:pPr>
+      <w:r>
+        <w:rPr>
+          <w:b/>
+          <w:bCs/>
+        </w:rPr>
+        <w:t xml:space="preserve">Success Criteria: </w:t>
+      </w:r>
+      <w:r>
+        <w:t>A new film record should be saved to the database in under 20 seconds with all required fields validated. The film should immediately appear in the list of available films when adding a new screening. Duplicate film titles should be prevented through validation.</w:t>
+      </w:r>
+    </w:p>
+    <w:p>
+      <w:pPr>
+        <w:spacing w:before="200" w:after="40"/>
+      </w:pPr>
+      <w:r>
+        <w:rPr>
+          <w:b/>
+          <w:bCs/>
+        </w:rPr>
         <w:lastRenderedPageBreak/>
-        <w:t>Objective 2</w:t>
+        <w:t>Objective 7</w:t>
       </w:r>
       <w:r>
         <w:rPr>
@@ -10074,7 +10269,7 @@
           <w:b/>
           <w:bCs/>
         </w:rPr>
-        <w:t>: The system must prevent double bookings by ensuring that a seat which has already been allocated to a customer cannot be selected by another customer for the same screening.</w:t>
+        <w:t>: The system must allow managers to add new screenings for existing films, specifying the screen, date, time and ticket price.</w:t>
       </w:r>
     </w:p>
     <w:p>
@@ -10089,7 +10284,7 @@
         <w:t xml:space="preserve">Success Criteria: </w:t>
       </w:r>
       <w:r>
-        <w:t>When a seat is already booked for a screening it should be visually marked as unavailable on the seat selection interface and it should be impossible to select or book it. Attempting to book an already taken seat should display a clear error message.</w:t>
+        <w:t>A new screening record should be saved to the database correctly linked to the selected film. The screening should immediately appear in the list of available screenings on the customer kiosk. Validation should prevent a screening being added without a valid date, time, screen and ticket price.</w:t>
       </w:r>
     </w:p>
     <w:p>
@@ -10101,7 +10296,7 @@
           <w:b/>
           <w:bCs/>
         </w:rPr>
-        <w:t>Objective 3</w:t>
+        <w:t>Objective 8</w:t>
       </w:r>
       <w:r>
         <w:rPr>
@@ -10115,7 +10310,7 @@
           <w:b/>
           <w:bCs/>
         </w:rPr>
-        <w:t>: The system must display a graphical seat map for each screening showing which seats are available and which are already booked.</w:t>
+        <w:t>: The system must allow the manager to view a sales report showing total ticket sales and revenue for a selected date range.</w:t>
       </w:r>
     </w:p>
     <w:p>
@@ -10130,7 +10325,15 @@
         <w:t xml:space="preserve">Success Criteria: </w:t>
       </w:r>
       <w:r>
-        <w:t>The seat map should load within 3 seconds of a screening being selected. Available seats and booked seats should be displayed in clearly distinguishable colours. The seat map should accurately reflect the current state of the database at the time of loading.</w:t>
+        <w:t xml:space="preserve">The report should be generated using an SQL query through the </w:t>
+      </w:r>
+      <w:proofErr w:type="spellStart"/>
+      <w:r>
+        <w:t>OleDb</w:t>
+      </w:r>
+      <w:proofErr w:type="spellEnd"/>
+      <w:r>
+        <w:t xml:space="preserve"> connection and displayed on screen within 5 seconds of the date range being selected. The report should show the correct total number of tickets sold and total revenue for the selected period, calculated directly from the bookings in the database.</w:t>
       </w:r>
     </w:p>
     <w:p>
@@ -10142,7 +10345,21 @@
           <w:b/>
           <w:bCs/>
         </w:rPr>
-        <w:t>Objective 4: The system must allow customers to purchase tickets through a self-service kiosk interface, selecting a film, screening time, seats and completing their booking without staff assistance.</w:t>
+        <w:t>Objective 9</w:t>
+      </w:r>
+      <w:r>
+        <w:rPr>
+          <w:b/>
+          <w:bCs/>
+        </w:rPr>
+        <w:t xml:space="preserve"> (P)</w:t>
+      </w:r>
+      <w:r>
+        <w:rPr>
+          <w:b/>
+          <w:bCs/>
+        </w:rPr>
+        <w:t>: The system must allow the manager to view a list of all bookings for a selected screening, showing customer names, seat numbers and the number of tickets booked.</w:t>
       </w:r>
     </w:p>
     <w:p>
@@ -10157,19 +10374,22 @@
         <w:t xml:space="preserve">Success Criteria: </w:t>
       </w:r>
       <w:r>
-        <w:t>A customer should be able to complete a full ticket booking through the kiosk interface in under 2 minutes. The kiosk should guide the customer through each stage clearly using buttons and on screen instructions. The completed booking should be recorded in the database correctly.</w:t>
+        <w:t>The booking list should load within 3 seconds of a screening being selected. All bookings for that screening should be displayed accurately. The list should be printable or exportable for use as a physical register.</w:t>
       </w:r>
     </w:p>
     <w:p>
       <w:pPr>
         <w:spacing w:before="200" w:after="40"/>
-      </w:pPr>
-      <w:r>
-        <w:rPr>
-          <w:b/>
-          <w:bCs/>
-        </w:rPr>
-        <w:t>Objective 5</w:t>
+        <w:rPr>
+          <w:color w:val="EE0000"/>
+        </w:rPr>
+      </w:pPr>
+      <w:r>
+        <w:rPr>
+          <w:b/>
+          <w:bCs/>
+        </w:rPr>
+        <w:t>Objective 10</w:t>
       </w:r>
       <w:r>
         <w:rPr>
@@ -10183,7 +10403,22 @@
           <w:b/>
           <w:bCs/>
         </w:rPr>
-        <w:t>: The system must allow customers to add food and drink items to their order at the same time as booking tickets, with the combined order saved to the database.</w:t>
+        <w:t>: The system must enforce access levels so that customers using the kiosk can only access booking functions, whilst staff can access the booking and counter functions and managers can access all areas of the system.</w:t>
+      </w:r>
+      <w:r>
+        <w:rPr>
+          <w:b/>
+          <w:bCs/>
+        </w:rPr>
+        <w:t xml:space="preserve"> </w:t>
+      </w:r>
+      <w:r>
+        <w:rPr>
+          <w:b/>
+          <w:bCs/>
+          <w:color w:val="EE0000"/>
+        </w:rPr>
+        <w:t>(*Note: the kiosk is strictly post-prototype material. However, access levels need to be enforced from the prototype.)</w:t>
       </w:r>
     </w:p>
     <w:p>
@@ -10198,7 +10433,7 @@
         <w:t xml:space="preserve">Success Criteria: </w:t>
       </w:r>
       <w:r>
-        <w:t>Food and drink items should be displayed on a clearly navigable menu during the booking process. A customer should be able to add multiple items to their order. The food and drink order should be saved to the database linked to the correct booking record.</w:t>
+        <w:t>The kiosk interface should not display any staff or manager options. Staff should be able to log in with a username and password and access staff functions only. The manager login should provide access to all areas of the system. Attempting to access a restricted area without the correct login should be prevented.</w:t>
       </w:r>
     </w:p>
     <w:p>
@@ -10210,7 +10445,7 @@
           <w:b/>
           <w:bCs/>
         </w:rPr>
-        <w:t>Objective 6</w:t>
+        <w:t>Objective 11</w:t>
       </w:r>
       <w:r>
         <w:rPr>
@@ -10224,7 +10459,7 @@
           <w:b/>
           <w:bCs/>
         </w:rPr>
-        <w:t>: The system must allow staff and managers to add new films to the system, including the film title, age rating, duration and description.</w:t>
+        <w:t>: The system must allow staff to search for an existing booking by customer name or booking reference.</w:t>
       </w:r>
     </w:p>
     <w:p>
@@ -10239,7 +10474,7 @@
         <w:t xml:space="preserve">Success Criteria: </w:t>
       </w:r>
       <w:r>
-        <w:t>A new film record should be saved to the database in under 20 seconds with all required fields validated. The film should immediately appear in the list of available films when adding a new screening. Duplicate film titles should be prevented through validation.</w:t>
+        <w:t>A search by customer surname should return all matching bookings within 2 seconds. The search should work with partial name entries. The correct booking record should be displayed with all associated details including film, screening, seats and food order.</w:t>
       </w:r>
     </w:p>
     <w:p>
@@ -10251,7 +10486,8 @@
           <w:b/>
           <w:bCs/>
         </w:rPr>
-        <w:t>Objective 7</w:t>
+        <w:lastRenderedPageBreak/>
+        <w:t>Objective 12</w:t>
       </w:r>
       <w:r>
         <w:rPr>
@@ -10265,7 +10501,908 @@
           <w:b/>
           <w:bCs/>
         </w:rPr>
-        <w:t>: The system must allow managers to add new screenings for existing films, specifying the screen, date, time and ticket price.</w:t>
+        <w:t>: The system must allow staff to cancel an existing booking, removing the seat allocation from the database and making those seats available again.</w:t>
+      </w:r>
+    </w:p>
+    <w:p>
+      <w:pPr>
+        <w:spacing w:after="80" w:line="276" w:lineRule="auto"/>
+      </w:pPr>
+      <w:r>
+        <w:rPr>
+          <w:b/>
+          <w:bCs/>
+        </w:rPr>
+        <w:t xml:space="preserve">Success Criteria: </w:t>
+      </w:r>
+      <w:r>
+        <w:t>Cancelling a booking should update the database immediately so the seats become available for other customers. A confirmation prompt should be displayed before any booking is deleted. The cancelled booking should no longer appear in the active bookings list.</w:t>
+      </w:r>
+    </w:p>
+    <w:p>
+      <w:pPr>
+        <w:spacing w:before="200" w:after="40"/>
+      </w:pPr>
+      <w:r>
+        <w:rPr>
+          <w:b/>
+          <w:bCs/>
+        </w:rPr>
+        <w:t>Objective 13</w:t>
+      </w:r>
+      <w:r>
+        <w:rPr>
+          <w:b/>
+          <w:bCs/>
+        </w:rPr>
+        <w:t xml:space="preserve"> (P)</w:t>
+      </w:r>
+      <w:r>
+        <w:rPr>
+          <w:b/>
+          <w:bCs/>
+        </w:rPr>
+        <w:t>: The system must validate data entered by users to prevent invalid or incomplete records being saved to the database.</w:t>
+      </w:r>
+    </w:p>
+    <w:p>
+      <w:pPr>
+        <w:spacing w:after="80" w:line="276" w:lineRule="auto"/>
+      </w:pPr>
+      <w:r>
+        <w:rPr>
+          <w:b/>
+          <w:bCs/>
+        </w:rPr>
+        <w:t xml:space="preserve">Success Criteria: </w:t>
+      </w:r>
+      <w:r>
+        <w:t>All required fields should be validated before a record is saved. Numeric fields should only accept numbers. Date fields should only accept valid dates. Text fields should have appropriate maximum lengths enforced. An informative error message should be displayed for each validation failure explaining what needs to be corrected.</w:t>
+      </w:r>
+    </w:p>
+    <w:p>
+      <w:pPr>
+        <w:spacing w:before="200" w:after="40"/>
+      </w:pPr>
+      <w:r>
+        <w:rPr>
+          <w:b/>
+          <w:bCs/>
+        </w:rPr>
+        <w:t>Objective 14: The system must have a consistent and professional user interface across all forms, using a uniform colour scheme, layout and naming convention throughout.</w:t>
+      </w:r>
+    </w:p>
+    <w:p>
+      <w:pPr>
+        <w:spacing w:after="80" w:line="276" w:lineRule="auto"/>
+      </w:pPr>
+      <w:r>
+        <w:rPr>
+          <w:b/>
+          <w:bCs/>
+        </w:rPr>
+        <w:t xml:space="preserve">Success Criteria: </w:t>
+      </w:r>
+      <w:r>
+        <w:t xml:space="preserve">All forms should use the same colour scheme, font and button placement. Navigation buttons should appear in consistent positions across all forms. The system should look professional and be immediately recognisable as a </w:t>
+      </w:r>
+      <w:proofErr w:type="spellStart"/>
+      <w:r>
+        <w:t>Filmtopia</w:t>
+      </w:r>
+      <w:proofErr w:type="spellEnd"/>
+      <w:r>
+        <w:t xml:space="preserve"> branded application.</w:t>
+      </w:r>
+    </w:p>
+    <w:p>
+      <w:pPr>
+        <w:spacing w:before="200" w:after="40"/>
+      </w:pPr>
+      <w:r>
+        <w:rPr>
+          <w:b/>
+          <w:bCs/>
+        </w:rPr>
+        <w:t>Objective 15: The system must be easy to navigate, with clearly labelled menus and buttons that allow staff and customers to find the function they need without requiring technical knowledge.</w:t>
+      </w:r>
+    </w:p>
+    <w:p>
+      <w:pPr>
+        <w:spacing w:after="80" w:line="276" w:lineRule="auto"/>
+      </w:pPr>
+      <w:r>
+        <w:rPr>
+          <w:b/>
+          <w:bCs/>
+        </w:rPr>
+        <w:t xml:space="preserve">Success Criteria: </w:t>
+      </w:r>
+      <w:r>
+        <w:t>A new member of staff should be able to complete a basic booking using the system without any training beyond a brief introduction. All buttons and menu options should use clear plain English labels. The system should never reach a state where the user cannot navigate back to the main menu.</w:t>
+      </w:r>
+    </w:p>
+    <w:p>
+      <w:pPr>
+        <w:spacing w:after="80" w:line="276" w:lineRule="auto"/>
+        <w:rPr>
+          <w:b/>
+          <w:bCs/>
+        </w:rPr>
+      </w:pPr>
+      <w:r>
+        <w:rPr>
+          <w:b/>
+          <w:bCs/>
+          <w:lang w:val="en-US"/>
+        </w:rPr>
+        <w:t>Objective</w:t>
+      </w:r>
+      <w:r>
+        <w:rPr>
+          <w:b/>
+          <w:bCs/>
+          <w:lang w:val="en-US"/>
+        </w:rPr>
+        <w:t xml:space="preserve"> 16</w:t>
+      </w:r>
+      <w:r>
+        <w:rPr>
+          <w:b/>
+          <w:bCs/>
+          <w:lang w:val="en-US"/>
+        </w:rPr>
+        <w:t xml:space="preserve"> (P)</w:t>
+      </w:r>
+      <w:r>
+        <w:rPr>
+          <w:b/>
+          <w:bCs/>
+          <w:lang w:val="en-US"/>
+        </w:rPr>
+        <w:t xml:space="preserve">: </w:t>
+      </w:r>
+      <w:r>
+        <w:rPr>
+          <w:b/>
+          <w:bCs/>
+        </w:rPr>
+        <w:t>The system must allow a manager to create a new screen by entering a total number of seats, with the system automatically generating the corresponding seat map and seat records for that screen.</w:t>
+      </w:r>
+    </w:p>
+    <w:p>
+      <w:pPr>
+        <w:spacing w:after="80" w:line="276" w:lineRule="auto"/>
+        <w:rPr>
+          <w:lang w:val="en-US"/>
+        </w:rPr>
+      </w:pPr>
+      <w:r>
+        <w:rPr>
+          <w:b/>
+          <w:bCs/>
+        </w:rPr>
+        <w:t>Success Criteria:</w:t>
+      </w:r>
+      <w:r>
+        <w:t xml:space="preserve"> Entering a seat count when creating a screen should generate the correct number of seat records in the database, arranged into rows and columns for a usable seat map. The generated seat map should display correctly when a screening for that screen is selected. Creating a screen with an invalid or missing seat count should be prevented through validation.</w:t>
+      </w:r>
+    </w:p>
+    <w:p>
+      <w:pPr>
+        <w:spacing w:after="80" w:line="276" w:lineRule="auto"/>
+        <w:rPr>
+          <w:b/>
+          <w:bCs/>
+        </w:rPr>
+      </w:pPr>
+      <w:r>
+        <w:rPr>
+          <w:b/>
+          <w:bCs/>
+          <w:lang w:val="en-US"/>
+        </w:rPr>
+        <w:lastRenderedPageBreak/>
+        <w:t xml:space="preserve">Objective </w:t>
+      </w:r>
+      <w:r>
+        <w:rPr>
+          <w:b/>
+          <w:bCs/>
+          <w:lang w:val="en-US"/>
+        </w:rPr>
+        <w:t>17</w:t>
+      </w:r>
+      <w:r>
+        <w:rPr>
+          <w:b/>
+          <w:bCs/>
+          <w:lang w:val="en-US"/>
+        </w:rPr>
+        <w:t xml:space="preserve"> (P)</w:t>
+      </w:r>
+      <w:r>
+        <w:rPr>
+          <w:b/>
+          <w:bCs/>
+          <w:lang w:val="en-US"/>
+        </w:rPr>
+        <w:t xml:space="preserve">: </w:t>
+      </w:r>
+      <w:r>
+        <w:rPr>
+          <w:b/>
+          <w:bCs/>
+        </w:rPr>
+        <w:t>The system must maintain an audit log recording key actions carried out by staff and managers, including creating a booking, cancelling a booking and adding a new film or screening record.</w:t>
+      </w:r>
+    </w:p>
+    <w:p>
+      <w:pPr>
+        <w:spacing w:after="80" w:line="276" w:lineRule="auto"/>
+        <w:rPr>
+          <w:lang w:val="en-US"/>
+        </w:rPr>
+      </w:pPr>
+      <w:r>
+        <w:rPr>
+          <w:b/>
+          <w:bCs/>
+        </w:rPr>
+        <w:t>Success Criteria:</w:t>
+      </w:r>
+      <w:r>
+        <w:t xml:space="preserve"> Every booking created, cancelled or amended should generate a log entry showing the username of the staff member responsible along with the date and time of the action. The audit log should be viewable by the manager but should not be editable or </w:t>
+      </w:r>
+      <w:proofErr w:type="spellStart"/>
+      <w:r>
+        <w:t>deletable</w:t>
+      </w:r>
+      <w:proofErr w:type="spellEnd"/>
+      <w:r>
+        <w:t xml:space="preserve"> by staff. The log should accurately reflect every relevant action carried out in the system during normal operation.</w:t>
+      </w:r>
+    </w:p>
+    <w:p>
+      <w:pPr>
+        <w:spacing w:after="80" w:line="276" w:lineRule="auto"/>
+        <w:jc w:val="both"/>
+        <w:rPr>
+          <w:b/>
+          <w:bCs/>
+        </w:rPr>
+      </w:pPr>
+      <w:r>
+        <w:rPr>
+          <w:b/>
+          <w:bCs/>
+          <w:lang w:val="en-US"/>
+        </w:rPr>
+        <w:t xml:space="preserve">Objective </w:t>
+      </w:r>
+      <w:r>
+        <w:rPr>
+          <w:b/>
+          <w:bCs/>
+        </w:rPr>
+        <w:t xml:space="preserve">18: </w:t>
+      </w:r>
+      <w:r>
+        <w:rPr>
+          <w:b/>
+          <w:bCs/>
+        </w:rPr>
+        <w:t>The system must allow staff to process a refund for a cancelled booking, recording the refunded amount against the original booking record.</w:t>
+      </w:r>
+    </w:p>
+    <w:p>
+      <w:pPr>
+        <w:spacing w:after="80" w:line="276" w:lineRule="auto"/>
+        <w:jc w:val="both"/>
+      </w:pPr>
+      <w:r>
+        <w:rPr>
+          <w:b/>
+          <w:bCs/>
+        </w:rPr>
+        <w:t>Success Criteria:</w:t>
+      </w:r>
+      <w:r>
+        <w:t xml:space="preserve"> A refund should only be processable for a booking that has already been cancelled. The refunded amount should be calculated automatically from the ticket price and any food and drink items originally recorded against the booking. The refund should be saved to the database with a timestamp and should be visible when the booking is looked up afterwards.</w:t>
+      </w:r>
+    </w:p>
+    <w:p>
+      <w:pPr>
+        <w:spacing w:after="80" w:line="276" w:lineRule="auto"/>
+        <w:jc w:val="both"/>
+        <w:rPr>
+          <w:b/>
+          <w:bCs/>
+        </w:rPr>
+      </w:pPr>
+    </w:p>
+    <w:p>
+      <w:pPr>
+        <w:spacing w:after="80" w:line="276" w:lineRule="auto"/>
+        <w:jc w:val="both"/>
+        <w:rPr>
+          <w:b/>
+          <w:bCs/>
+          <w:color w:val="EE0000"/>
+        </w:rPr>
+      </w:pPr>
+      <w:r>
+        <w:rPr>
+          <w:b/>
+          <w:bCs/>
+          <w:color w:val="EE0000"/>
+          <w:highlight w:val="yellow"/>
+        </w:rPr>
+        <w:t xml:space="preserve">The eighteen objectives above were written before any of </w:t>
+      </w:r>
+      <w:proofErr w:type="spellStart"/>
+      <w:r>
+        <w:rPr>
+          <w:b/>
+          <w:bCs/>
+          <w:color w:val="EE0000"/>
+          <w:highlight w:val="yellow"/>
+        </w:rPr>
+        <w:t>Filmtopia</w:t>
+      </w:r>
+      <w:proofErr w:type="spellEnd"/>
+      <w:r>
+        <w:rPr>
+          <w:b/>
+          <w:bCs/>
+          <w:color w:val="EE0000"/>
+          <w:highlight w:val="yellow"/>
+        </w:rPr>
+        <w:t xml:space="preserve"> existed, and building the prototype showed that they did not cover the whole problem. Some of the gaps came out of the feedback sessions, some came out of using the prototype myself for a few weeks, and a few came out of faults that only appeared once there was real data in the database. Rather than quietly widen the original objectives so that whatever I happened to build would satisfy them, which would make the evaluation worthless, I have written the additional requirements down as a second set of objectives with their own success criteria. Everything from Objective 19 onwards was identified after the prototype was finished, and none of it was part of the prototype build.</w:t>
+      </w:r>
+    </w:p>
+    <w:p>
+      <w:pPr>
+        <w:spacing w:after="80" w:line="276" w:lineRule="auto"/>
+        <w:jc w:val="both"/>
+        <w:rPr>
+          <w:b/>
+          <w:bCs/>
+          <w:color w:val="EE0000"/>
+        </w:rPr>
+      </w:pPr>
+    </w:p>
+    <w:p>
+      <w:pPr>
+        <w:spacing w:before="200" w:after="40"/>
+      </w:pPr>
+      <w:r>
+        <w:rPr>
+          <w:b/>
+          <w:bCs/>
+        </w:rPr>
+        <w:t xml:space="preserve">Objective 19: The system must support more than one </w:t>
+      </w:r>
+      <w:r>
+        <w:rPr>
+          <w:b/>
+          <w:bCs/>
+        </w:rPr>
+        <w:t>type</w:t>
+      </w:r>
+      <w:r>
+        <w:rPr>
+          <w:b/>
+          <w:bCs/>
+        </w:rPr>
+        <w:t xml:space="preserve"> of seat within a screen, with each </w:t>
+      </w:r>
+      <w:r>
+        <w:rPr>
+          <w:b/>
+          <w:bCs/>
+        </w:rPr>
+        <w:t>type</w:t>
+      </w:r>
+      <w:r>
+        <w:rPr>
+          <w:b/>
+          <w:bCs/>
+        </w:rPr>
+        <w:t xml:space="preserve"> carrying its own price multiplier so that a premium seat costs more than a standard seat for the same screening.</w:t>
+      </w:r>
+    </w:p>
+    <w:p>
+      <w:pPr>
+        <w:spacing w:after="80" w:line="276" w:lineRule="auto"/>
+        <w:jc w:val="both"/>
+        <w:rPr>
+          <w:b/>
+          <w:bCs/>
+          <w:color w:val="EE0000"/>
+        </w:rPr>
+      </w:pPr>
+      <w:r>
+        <w:rPr>
+          <w:b/>
+          <w:bCs/>
+        </w:rPr>
+        <w:t xml:space="preserve">Success Criteria: </w:t>
+      </w:r>
+      <w:r>
+        <w:t xml:space="preserve">Seat </w:t>
+      </w:r>
+      <w:r>
+        <w:t>types</w:t>
+      </w:r>
+      <w:r>
+        <w:t xml:space="preserve"> should be stored in the database with a multiplier against each one rather than being fixed in the program code, so that the price of a </w:t>
+      </w:r>
+      <w:r>
+        <w:t>type</w:t>
+      </w:r>
+      <w:r>
+        <w:t xml:space="preserve"> can be changed without the system being rebuilt. The price of an individual seat should be calculated as the screening ticket price multiplied by the multiplier for that seat's </w:t>
+      </w:r>
+      <w:r>
+        <w:t>type</w:t>
+      </w:r>
+      <w:r>
+        <w:t xml:space="preserve">. Booking three seats of mixed </w:t>
+      </w:r>
+      <w:r>
+        <w:t>types</w:t>
+      </w:r>
+      <w:r>
+        <w:t xml:space="preserve"> should produce a total that matches the sum of the individual seat prices to the penny, and the same total should appear on the booking screen, in the stored booking record and on the sales report.</w:t>
+      </w:r>
+    </w:p>
+    <w:p>
+      <w:pPr>
+        <w:spacing w:before="200" w:after="40"/>
+      </w:pPr>
+      <w:r>
+        <w:rPr>
+          <w:b/>
+          <w:bCs/>
+        </w:rPr>
+        <w:lastRenderedPageBreak/>
+        <w:t>Objective 20: The system must allow a manager to decide which individual seats in a screen are premium, standard or accessible, rather than the layout being fixed by the program.</w:t>
+      </w:r>
+    </w:p>
+    <w:p>
+      <w:pPr>
+        <w:spacing w:after="80" w:line="276" w:lineRule="auto"/>
+      </w:pPr>
+      <w:r>
+        <w:rPr>
+          <w:b/>
+          <w:bCs/>
+        </w:rPr>
+        <w:t xml:space="preserve">Success Criteria: </w:t>
+      </w:r>
+      <w:r>
+        <w:t>A manager should be able to open a plan of any screen and change the class of a single seat or a whole row. The plan should show at least three classes distinguishably, and should remain readable when printed in black and white. Saving a plan for a screen that already has bookings against it should change only the class of each seat and must not delete and recreate the seat records, since existing bookings point at them. The system should warn before changing the class of a seat in a screen that is already selling.</w:t>
+      </w:r>
+    </w:p>
+    <w:p>
+      <w:pPr>
+        <w:spacing w:before="200" w:after="40"/>
+      </w:pPr>
+      <w:r>
+        <w:rPr>
+          <w:b/>
+          <w:bCs/>
+        </w:rPr>
+        <w:t>Objective 21: The system must record the price actually charged for every ticket and every food item at the moment of sale, so that a later change to a price cannot alter the value of a sale that has already been taken.</w:t>
+      </w:r>
+    </w:p>
+    <w:p>
+      <w:pPr>
+        <w:spacing w:after="80" w:line="276" w:lineRule="auto"/>
+      </w:pPr>
+      <w:r>
+        <w:rPr>
+          <w:b/>
+          <w:bCs/>
+        </w:rPr>
+        <w:t xml:space="preserve">Success Criteria: </w:t>
+      </w:r>
+      <w:r>
+        <w:t>Each booked seat and each food line should store the amount it was charged. Increasing the price of a screening or a menu item afterwards must leave the total of every existing booking completely unchanged, and the sales report must return the same figure for a past date range before and after that price change. Recalculating a booking total should never alter the ticket element of a sale that has already been completed.</w:t>
+      </w:r>
+    </w:p>
+    <w:p>
+      <w:pPr>
+        <w:spacing w:before="200" w:after="40"/>
+      </w:pPr>
+      <w:r>
+        <w:rPr>
+          <w:b/>
+          <w:bCs/>
+        </w:rPr>
+        <w:t>Objective 22: The system must allow a member of staff to refund part of a booking, handing back individual seats or a quantity of a food item without cancelling the entire sale.</w:t>
+      </w:r>
+    </w:p>
+    <w:p>
+      <w:pPr>
+        <w:spacing w:after="80" w:line="276" w:lineRule="auto"/>
+      </w:pPr>
+      <w:r>
+        <w:rPr>
+          <w:b/>
+          <w:bCs/>
+        </w:rPr>
+        <w:t xml:space="preserve">Success Criteria: </w:t>
+      </w:r>
+      <w:r>
+        <w:t>It should be possible to refund one seat out of several and leave the rest of the booking active, and to refund one item out of a quantity of the same item. Every refund should be recorded as its own record with the date, the total handed back, the reason and the member of staff who authorised it, broken down into one line per thing refunded. A refunded seat should return to sale immediately. Refunding everything left on a booking should cancel that booking automatically. Attempting to refund the same seat twice should be refused.</w:t>
+      </w:r>
+    </w:p>
+    <w:p>
+      <w:pPr>
+        <w:spacing w:before="200" w:after="40"/>
+      </w:pPr>
+      <w:r>
+        <w:rPr>
+          <w:b/>
+          <w:bCs/>
+        </w:rPr>
+        <w:t>Objective 23: The system must allow a sale to be taken for food and drink alone, with no screening and no seats attached to it.</w:t>
+      </w:r>
+    </w:p>
+    <w:p>
+      <w:pPr>
+        <w:spacing w:after="80" w:line="276" w:lineRule="auto"/>
+      </w:pPr>
+      <w:r>
+        <w:rPr>
+          <w:b/>
+          <w:bCs/>
+        </w:rPr>
+        <w:t xml:space="preserve">Success Criteria: </w:t>
+      </w:r>
+      <w:r>
+        <w:t>A counter sale should complete and save without a screening being selected. The sale should then appear correctly in the booking search, in the sales report and on the main menu takings figure, and must not be silently dropped by any query that reaches a film through the screening. The sales report should return the same concessions total whether it is measured on the booking date or on the screening date.</w:t>
+      </w:r>
+    </w:p>
+    <w:p>
+      <w:pPr>
+        <w:spacing w:before="200" w:after="40"/>
+      </w:pPr>
+      <w:r>
+        <w:rPr>
+          <w:b/>
+          <w:bCs/>
+        </w:rPr>
+        <w:lastRenderedPageBreak/>
+        <w:t>Objective 24: The system must account for advertising and turnaround time when deciding how long a screening occupies a screen, rather than using the running time of the film alone.</w:t>
+      </w:r>
+    </w:p>
+    <w:p>
+      <w:pPr>
+        <w:spacing w:after="80" w:line="276" w:lineRule="auto"/>
+      </w:pPr>
+      <w:r>
+        <w:rPr>
+          <w:b/>
+          <w:bCs/>
+        </w:rPr>
+        <w:t xml:space="preserve">Success Criteria: </w:t>
+      </w:r>
+      <w:r>
+        <w:t>The time a screening occupies a screen should be the advertising allowance plus the film duration plus the turnaround allowance. Two screenings which would overlap once those allowances are included should be refused, and the message should state which existing screening is in the way. The finishing time displayed to the user should match the time the screen actually becomes free. Both allowances should be held as settings rather than being fixed in the code, and should be able to be overridden for an individual screening.</w:t>
+      </w:r>
+    </w:p>
+    <w:p>
+      <w:pPr>
+        <w:spacing w:before="200" w:after="40"/>
+      </w:pPr>
+      <w:r>
+        <w:rPr>
+          <w:b/>
+          <w:bCs/>
+        </w:rPr>
+        <w:t>Objective 25: The system must be able to suggest the next available start time for a film on a chosen screen, rather than only rejecting a time after the user has already entered one.</w:t>
+      </w:r>
+    </w:p>
+    <w:p>
+      <w:pPr>
+        <w:spacing w:after="80" w:line="276" w:lineRule="auto"/>
+      </w:pPr>
+      <w:r>
+        <w:rPr>
+          <w:b/>
+          <w:bCs/>
+        </w:rPr>
+        <w:t xml:space="preserve">Success Criteria: </w:t>
+      </w:r>
+      <w:r>
+        <w:t>Requesting a suggested time should return the earliest start on that day at which the film would fit without overlapping anything already scheduled, taking the advertising and turnaround allowances into account. A gap that is exactly large enough should be accepted and a gap one minute too small should be rejected. Where no gap exists before the last permitted start time, the system should say so rather than offering a time that will not work. A screen that is out of service should not be offered at all.</w:t>
+      </w:r>
+    </w:p>
+    <w:p>
+      <w:pPr>
+        <w:spacing w:before="200" w:after="40"/>
+      </w:pPr>
+      <w:r>
+        <w:rPr>
+          <w:b/>
+          <w:bCs/>
+        </w:rPr>
+        <w:t>Objective 26: The system must round the start times it generates up to a sensible interval so that scheduled screenings begin on times a cinema would advertise.</w:t>
+      </w:r>
+    </w:p>
+    <w:p>
+      <w:pPr>
+        <w:spacing w:after="80" w:line="276" w:lineRule="auto"/>
+      </w:pPr>
+      <w:r>
+        <w:rPr>
+          <w:b/>
+          <w:bCs/>
+        </w:rPr>
+        <w:t xml:space="preserve">Success Criteria: </w:t>
+      </w:r>
+      <w:r>
+        <w:t>Generated start times should be rounded up to an interval held as a setting, and only intervals which divide evenly into an hour should be accepted. The rounding must be applied before the system checks whether the screening fits, so that a gap which is no longer large enough once the time has been rounded is correctly rejected. A time entered by hand should be left exactly as it was typed.</w:t>
+      </w:r>
+    </w:p>
+    <w:p>
+      <w:pPr>
+        <w:spacing w:before="200" w:after="40"/>
+      </w:pPr>
+      <w:r>
+        <w:rPr>
+          <w:b/>
+          <w:bCs/>
+        </w:rPr>
+        <w:t>Objective 27: The system must allow a film to be scheduled across a range of dates, or repeatedly across a single day, without the user entering each screening individually.</w:t>
+      </w:r>
+    </w:p>
+    <w:p>
+      <w:pPr>
+        <w:spacing w:after="80" w:line="276" w:lineRule="auto"/>
+      </w:pPr>
+      <w:r>
+        <w:rPr>
+          <w:b/>
+          <w:bCs/>
+        </w:rPr>
+        <w:t xml:space="preserve">Success Criteria: </w:t>
+      </w:r>
+      <w:r>
+        <w:t>Scheduling a run should create one screening per day across the chosen range, skipping any day where the screen is already occupied and reporting which days were skipped rather than stopping. Filling a day should create as many screenings as genuinely fit around what is already scheduled. In both cases the proposed times should be displayed for confirmation before anything is written, and the whole run should be saved inside a single transaction so that a partially created run is impossible.</w:t>
+      </w:r>
+    </w:p>
+    <w:p>
+      <w:pPr>
+        <w:spacing w:before="200" w:after="40"/>
+      </w:pPr>
+      <w:r>
+        <w:rPr>
+          <w:b/>
+          <w:bCs/>
+        </w:rPr>
+        <w:lastRenderedPageBreak/>
+        <w:t>Objective 28: The system must allow a screening that has already sold tickets to be cancelled, keeping the record of the screening and the sales rather than deleting them.</w:t>
+      </w:r>
+    </w:p>
+    <w:p>
+      <w:pPr>
+        <w:spacing w:after="80" w:line="276" w:lineRule="auto"/>
+      </w:pPr>
+      <w:r>
+        <w:rPr>
+          <w:b/>
+          <w:bCs/>
+        </w:rPr>
+        <w:t xml:space="preserve">Success Criteria: </w:t>
+      </w:r>
+      <w:r>
+        <w:t>Cancelling a screening should require a reason and should state how many bookings and seats will be affected before it proceeds. The screening record should be kept and marked as cancelled, the bookings against it should be cancelled, and the seats should return to sale. A cancelled screening should no longer appear on the kiosk, the booking screen or the main menu, but should remain findable on the screenings list, and the time it occupied should become available to schedule again.</w:t>
+      </w:r>
+    </w:p>
+    <w:p>
+      <w:pPr>
+        <w:spacing w:before="200" w:after="40"/>
+      </w:pPr>
+      <w:r>
+        <w:rPr>
+          <w:b/>
+          <w:bCs/>
+        </w:rPr>
+        <w:t>Objective 29: The system must allow a screen to be taken out of service and a food or drink item to be withdrawn from sale, in both cases keeping the record and its sales history rather than deleting it.</w:t>
+      </w:r>
+    </w:p>
+    <w:p>
+      <w:pPr>
+        <w:spacing w:after="80" w:line="276" w:lineRule="auto"/>
+      </w:pPr>
+      <w:r>
+        <w:rPr>
+          <w:b/>
+          <w:bCs/>
+        </w:rPr>
+        <w:t xml:space="preserve">Success Criteria: </w:t>
+      </w:r>
+      <w:r>
+        <w:t>Marking a screen out of service should require a reason and should be refused while tickets are held for future screenings in it. A screen that is out of service should be refused when scheduling a new screening. A withdrawn menu item should no longer be offered on the till, the booking screen or the kiosk, but bookings that already include it should continue to display and report correctly. In both cases nothing that has previously been sold should disappear from the sales report.</w:t>
+      </w:r>
+    </w:p>
+    <w:p>
+      <w:pPr>
+        <w:spacing w:before="200" w:after="40"/>
+      </w:pPr>
+      <w:r>
+        <w:rPr>
+          <w:b/>
+          <w:bCs/>
+        </w:rPr>
+        <w:t>Objective 30: The system must allow the manager to break sales down by film, by screening, by screen, by day, by food item and by member of staff, in addition to the overall totals.</w:t>
+      </w:r>
+    </w:p>
+    <w:p>
+      <w:pPr>
+        <w:spacing w:after="80" w:line="276" w:lineRule="auto"/>
+      </w:pPr>
+      <w:r>
+        <w:rPr>
+          <w:b/>
+          <w:bCs/>
+        </w:rPr>
+        <w:t xml:space="preserve">Success Criteria: </w:t>
+      </w:r>
+      <w:r>
+        <w:t>Each breakdown should be selectable from the sales report screen and should return within five seconds. The totals of every breakdown should agree with each other and with the takings figure shown on the main menu for the same period. A day with no sales should still appear in the daily breakdown with a total of zero rather than being omitted.</w:t>
+      </w:r>
+    </w:p>
+    <w:p>
+      <w:pPr>
+        <w:spacing w:before="200" w:after="40"/>
+      </w:pPr>
+      <w:r>
+        <w:rPr>
+          <w:b/>
+          <w:bCs/>
+        </w:rPr>
+        <w:t>Objective 31: The system must allow a sales report date range to be measured either by the date a booking was taken or by the date the screening took place, since those produce different figures whenever a customer books in advance.</w:t>
+      </w:r>
+    </w:p>
+    <w:p>
+      <w:pPr>
+        <w:spacing w:after="80" w:line="276" w:lineRule="auto"/>
+      </w:pPr>
+      <w:r>
+        <w:rPr>
+          <w:b/>
+          <w:bCs/>
+        </w:rPr>
+        <w:t xml:space="preserve">Success Criteria: </w:t>
+      </w:r>
+      <w:r>
+        <w:t>The report should offer both bases and switching between them should change the figures where advance bookings exist within the range. The occupancy figure should always be measured against the screenings that took place in the range regardless of the basis selected. A date range should include sales made at any time on the final day of the range.</w:t>
+      </w:r>
+    </w:p>
+    <w:p>
+      <w:pPr>
+        <w:spacing w:before="200" w:after="40"/>
+      </w:pPr>
+      <w:r>
+        <w:rPr>
+          <w:b/>
+          <w:bCs/>
+        </w:rPr>
+        <w:lastRenderedPageBreak/>
+        <w:t>Objective 32: The system must allow the contents of any list or report to be exported to a file that can be opened in a spreadsheet.</w:t>
+      </w:r>
+    </w:p>
+    <w:p>
+      <w:pPr>
+        <w:spacing w:after="80" w:line="276" w:lineRule="auto"/>
+      </w:pPr>
+      <w:r>
+        <w:rPr>
+          <w:b/>
+          <w:bCs/>
+        </w:rPr>
+        <w:t xml:space="preserve">Success Criteria: </w:t>
+      </w:r>
+      <w:r>
+        <w:t>Export should be available from the films, customers, screenings, audit log, door list and sales report screens. The exported file should take its column headings from the grid so that a column added later is included automatically. Values containing commas or quotation marks should be written so that the file still opens correctly. Monetary values in the sales report export should be written as numbers a spreadsheet can total rather than as text.</w:t>
+      </w:r>
+    </w:p>
+    <w:p>
+      <w:pPr>
+        <w:spacing w:before="200" w:after="40"/>
+      </w:pPr>
+      <w:r>
+        <w:rPr>
+          <w:b/>
+          <w:bCs/>
+        </w:rPr>
+        <w:t>Objective 33: The system must allow film records to be imported in bulk from an external data file, so that the catalogue does not have to be typed in by hand.</w:t>
+      </w:r>
+    </w:p>
+    <w:p>
+      <w:pPr>
+        <w:spacing w:after="80" w:line="276" w:lineRule="auto"/>
+      </w:pPr>
+      <w:r>
+        <w:rPr>
+          <w:b/>
+          <w:bCs/>
+        </w:rPr>
+        <w:t xml:space="preserve">Success Criteria: </w:t>
+      </w:r>
+      <w:r>
+        <w:t>The user should be able to search a data file by part of a title and a starting year, and should be shown the matching films with a tick box against each so that only the chosen records are imported. A film already held on the system, matched on both title and year, should be identified and prevented from being imported a second time. Importing should record how many records were added and how many were skipped, and a damaged line in the file should be skipped rather than causing the import to fail.</w:t>
+      </w:r>
+    </w:p>
+    <w:p>
+      <w:pPr>
+        <w:spacing w:before="200" w:after="40"/>
+      </w:pPr>
+      <w:r>
+        <w:rPr>
+          <w:b/>
+          <w:bCs/>
+        </w:rPr>
+        <w:t>Objective 34: The system must allow a poster image to be stored against a film and displayed wherever that film is presented to a customer.</w:t>
+      </w:r>
+    </w:p>
+    <w:p>
+      <w:pPr>
+        <w:spacing w:after="80" w:line="276" w:lineRule="auto"/>
+      </w:pPr>
+      <w:r>
+        <w:rPr>
+          <w:b/>
+          <w:bCs/>
+        </w:rPr>
+        <w:t xml:space="preserve">Success Criteria: </w:t>
+      </w:r>
+      <w:r>
+        <w:t>A poster should be selectable from a file on the computer or retrievable automatically by searching an online film database on the title and year. The image file itself should be stored outside the database with only its file name held in the film record. The poster should appear on the film management screen and at every stage of the kiosk where that film is shown. A film with no poster should display correctly rather than showing an empty frame, and image resources should be released when a list is rebuilt so that repeated use does not exhaust them.</w:t>
+      </w:r>
+    </w:p>
+    <w:p>
+      <w:pPr>
+        <w:spacing w:before="200" w:after="40"/>
+      </w:pPr>
+      <w:r>
+        <w:rPr>
+          <w:b/>
+          <w:bCs/>
+        </w:rPr>
+        <w:t>Objective 35: The system must allow a user to change their own password from within the program without the database being opened directly.</w:t>
+      </w:r>
+    </w:p>
+    <w:p>
+      <w:pPr>
+        <w:spacing w:after="80" w:line="276" w:lineRule="auto"/>
+      </w:pPr>
+      <w:r>
+        <w:rPr>
+          <w:b/>
+          <w:bCs/>
+        </w:rPr>
+        <w:t xml:space="preserve">Success Criteria: </w:t>
+      </w:r>
+      <w:r>
+        <w:t>Changing a password should require the current password to be entered correctly, should require the new password to be typed twice identically, should enforce a minimum length held as a setting, and should refuse a new password identical to the old one. The new password should be stored using the same method as the existing login system. Both successful and failed attempts should be written to the audit log.</w:t>
+      </w:r>
+    </w:p>
+    <w:p>
+      <w:pPr>
+        <w:spacing w:before="200" w:after="40"/>
+      </w:pPr>
+      <w:r>
+        <w:rPr>
+          <w:b/>
+          <w:bCs/>
+        </w:rPr>
+        <w:t>Objective 36: The system must allow a manager to create a backup copy of the database from within the program, and must prevent a member of staff from doing so.</w:t>
       </w:r>
     </w:p>
     <w:p>
@@ -10281,7 +11418,7 @@
         <w:t xml:space="preserve">Success Criteria: </w:t>
       </w:r>
       <w:r>
-        <w:t>A new screening record should be saved to the database correctly linked to the selected film. The screening should immediately appear in the list of available screenings on the customer kiosk. Validation should prevent a screening being added without a valid date, time, screen and ticket price.</w:t>
+        <w:t>A manager should be able to choose a destination folder and create a backup, with the file named so that it includes the date and time and therefore cannot overwrite an earlier backup. The backup option should be disabled for a user below manager level, with an explanation shown rather than the option simply disappearing. Every backup should be recorded in the audit log.</w:t>
       </w:r>
     </w:p>
     <w:p>
@@ -10293,21 +11430,7 @@
           <w:b/>
           <w:bCs/>
         </w:rPr>
-        <w:t>Objective 8</w:t>
-      </w:r>
-      <w:r>
-        <w:rPr>
-          <w:b/>
-          <w:bCs/>
-        </w:rPr>
-        <w:t xml:space="preserve"> (P)</w:t>
-      </w:r>
-      <w:r>
-        <w:rPr>
-          <w:b/>
-          <w:bCs/>
-        </w:rPr>
-        <w:t>: The system must allow the manager to view a sales report showing total ticket sales and revenue for a selected date range.</w:t>
+        <w:t>Objective 37: The system must record which member of staff took each sale, and must allow any user to review their own activity and their own sales without being able to see anybody else's.</w:t>
       </w:r>
     </w:p>
     <w:p>
@@ -10322,15 +11445,7 @@
         <w:t xml:space="preserve">Success Criteria: </w:t>
       </w:r>
       <w:r>
-        <w:t xml:space="preserve">The report should be generated using an SQL query through the </w:t>
-      </w:r>
-      <w:proofErr w:type="spellStart"/>
-      <w:r>
-        <w:t>OleDb</w:t>
-      </w:r>
-      <w:proofErr w:type="spellEnd"/>
-      <w:r>
-        <w:t xml:space="preserve"> connection and displayed on screen within 5 seconds of the date range being selected. The report should show the correct total number of tickets sold and total revenue for the selected period, calculated directly from the bookings in the database.</w:t>
+        <w:t>Every booking taken at the till should record the login of the member of staff who took it, while a sale completed at the kiosk should record no member of staff at all. A user of any access level should be able to view their own audit entries, their own sales and their own sign in history, filtered to their own account only with no facility to select another user. Monetary totals should be visible to a manager and withheld from a member of staff. Failed sign in attempts against that account should be reported to the user.</w:t>
       </w:r>
     </w:p>
     <w:p>
@@ -10342,21 +11457,7 @@
           <w:b/>
           <w:bCs/>
         </w:rPr>
-        <w:t>Objective 9</w:t>
-      </w:r>
-      <w:r>
-        <w:rPr>
-          <w:b/>
-          <w:bCs/>
-        </w:rPr>
-        <w:t xml:space="preserve"> (P)</w:t>
-      </w:r>
-      <w:r>
-        <w:rPr>
-          <w:b/>
-          <w:bCs/>
-        </w:rPr>
-        <w:t>: The system must allow the manager to view a list of all bookings for a selected screening, showing customer names, seat numbers and the number of tickets booked.</w:t>
+        <w:t>Objective 38: The system must prevent a customer at the kiosk from leaving kiosk mode and reaching staff functions without re-entering the password of the account that started it.</w:t>
       </w:r>
     </w:p>
     <w:p>
@@ -10371,51 +11472,19 @@
         <w:t xml:space="preserve">Success Criteria: </w:t>
       </w:r>
       <w:r>
-        <w:t>The booking list should load within 3 seconds of a screening being selected. All bookings for that screening should be displayed accurately. The list should be printable or exportable for use as a physical register.</w:t>
+        <w:t>Exiting kiosk mode should require the password of the logged in account rather than a simple confirmation. The kiosk should return to its opening screen automatically after a period of inactivity held as a setting, discarding any part completed order. No staff or management function should be reachable from the kiosk at any point.</w:t>
       </w:r>
     </w:p>
     <w:p>
       <w:pPr>
         <w:spacing w:before="200" w:after="40"/>
-        <w:rPr>
-          <w:color w:val="EE0000"/>
-        </w:rPr>
-      </w:pPr>
-      <w:r>
-        <w:rPr>
-          <w:b/>
-          <w:bCs/>
-        </w:rPr>
-        <w:t>Objective 10</w:t>
-      </w:r>
-      <w:r>
-        <w:rPr>
-          <w:b/>
-          <w:bCs/>
-        </w:rPr>
-        <w:t xml:space="preserve"> (P)</w:t>
-      </w:r>
-      <w:r>
-        <w:rPr>
-          <w:b/>
-          <w:bCs/>
-        </w:rPr>
-        <w:t>: The system must enforce access levels so that customers using the kiosk can only access booking functions, whilst staff can access the booking and counter functions and managers can access all areas of the system.</w:t>
-      </w:r>
-      <w:r>
-        <w:rPr>
-          <w:b/>
-          <w:bCs/>
-        </w:rPr>
-        <w:t xml:space="preserve"> </w:t>
-      </w:r>
-      <w:r>
-        <w:rPr>
-          <w:b/>
-          <w:bCs/>
-          <w:color w:val="EE0000"/>
-        </w:rPr>
-        <w:t>(*Note: the kiosk is strictly post-prototype material. However, access levels need to be enforced from the prototype.)</w:t>
+      </w:pPr>
+      <w:r>
+        <w:rPr>
+          <w:b/>
+          <w:bCs/>
+        </w:rPr>
+        <w:t>Objective 39: The audit log must record the user responsible for every entry and grade each entry by severity, and must be searchable so that it remains usable as the number of entries grows.</w:t>
       </w:r>
     </w:p>
     <w:p>
@@ -10430,7 +11499,7 @@
         <w:t xml:space="preserve">Success Criteria: </w:t>
       </w:r>
       <w:r>
-        <w:t>The kiosk interface should not display any staff or manager options. Staff should be able to log in with a username and password and access staff functions only. The manager login should provide access to all areas of the system. Attempting to access a restricted area without the correct login should be prevented.</w:t>
+        <w:t>Every entry should record the user automatically rather than the user being supplied by the calling routine. Entries should be graded so that routine activity, data changes, refused actions and security events can be told apart. The log screen should filter by date range, area, severity, user and free text, colour entries by severity, state how many entries match, and remain responsive with several thousand entries held. Refused actions such as a rejected deletion or a failed sign in should be recorded, not only successful ones.</w:t>
       </w:r>
     </w:p>
     <w:p>
@@ -10442,21 +11511,7 @@
           <w:b/>
           <w:bCs/>
         </w:rPr>
-        <w:t>Objective 11</w:t>
-      </w:r>
-      <w:r>
-        <w:rPr>
-          <w:b/>
-          <w:bCs/>
-        </w:rPr>
-        <w:t xml:space="preserve"> (P)</w:t>
-      </w:r>
-      <w:r>
-        <w:rPr>
-          <w:b/>
-          <w:bCs/>
-        </w:rPr>
-        <w:t>: The system must allow staff to search for an existing booking by customer name or booking reference.</w:t>
+        <w:t>Objective 40: The system must hold its configurable values in the database rather than in the program code, so that a manager can change them without the system being rebuilt.</w:t>
       </w:r>
     </w:p>
     <w:p>
@@ -10471,7 +11526,11 @@
         <w:t xml:space="preserve">Success Criteria: </w:t>
       </w:r>
       <w:r>
-        <w:t>A search by customer surname should return all matching bookings within 2 seconds. The search should work with partial name entries. The correct booking record should be displayed with all associated details including film, screening, seats and food order.</w:t>
+        <w:t xml:space="preserve">Values including the advertising and turnaround allowances, the opening and closing times, the rounding interval, the default ticket price, the maximum </w:t>
+      </w:r>
+      <w:r>
+        <w:lastRenderedPageBreak/>
+        <w:t>seats per sale, the kiosk timeouts, the permitted login attempts and the minimum password length should all be stored in the database and editable through a settings screen. Changing a value should take effect without the program being restarted. An invalid or missing value should fall back to a sensible default rather than causing a failure.</w:t>
       </w:r>
     </w:p>
     <w:p>
@@ -10483,21 +11542,88 @@
           <w:b/>
           <w:bCs/>
         </w:rPr>
-        <w:t>Objective 12</w:t>
-      </w:r>
-      <w:r>
-        <w:rPr>
-          <w:b/>
-          <w:bCs/>
-        </w:rPr>
-        <w:t xml:space="preserve"> (P)</w:t>
-      </w:r>
-      <w:r>
-        <w:rPr>
-          <w:b/>
-          <w:bCs/>
-        </w:rPr>
-        <w:t>: The system must allow staff to cancel an existing booking, removing the seat allocation from the database and making those seats available again.</w:t>
+        <w:t>Objective 41: The system must offer a light and a dark colour scheme, applied consistently across every form and remembered against the individual user account rather than the machine.</w:t>
+      </w:r>
+    </w:p>
+    <w:p>
+      <w:pPr>
+        <w:spacing w:after="80" w:line="276" w:lineRule="auto"/>
+      </w:pPr>
+      <w:r>
+        <w:rPr>
+          <w:b/>
+          <w:bCs/>
+        </w:rPr>
+        <w:t xml:space="preserve">Success Criteria: </w:t>
+      </w:r>
+      <w:r>
+        <w:t>Selecting a scheme should recolour every open form immediately. The chosen scheme should be stored against the user's login so that two members of staff sharing a machine each keep their own preference, and should be cleared on logout so the next user does not inherit it. Every form should take its colours from a single shared definition rather than holding its own. Changing scheme while a booking is in progress must not alter or lose the seats already selected.</w:t>
+      </w:r>
+    </w:p>
+    <w:p>
+      <w:pPr>
+        <w:spacing w:before="200" w:after="40"/>
+      </w:pPr>
+      <w:r>
+        <w:rPr>
+          <w:b/>
+          <w:bCs/>
+        </w:rPr>
+        <w:t>Objective 42: The main menu must present the manager and the member of staff with the information relevant to their role at the start of a shift, rather than presenting only a list of buttons.</w:t>
+      </w:r>
+    </w:p>
+    <w:p>
+      <w:pPr>
+        <w:spacing w:after="80" w:line="276" w:lineRule="auto"/>
+      </w:pPr>
+      <w:r>
+        <w:rPr>
+          <w:b/>
+          <w:bCs/>
+        </w:rPr>
+        <w:t xml:space="preserve">Success Criteria: </w:t>
+      </w:r>
+      <w:r>
+        <w:t>The menu should display live figures read from the database when it opens and should refresh them automatically. A manager should see takings and overall occupancy, while a member of staff should see seats sold, items sold and seats remaining, with no monetary figures displayed anywhere. Screenings approaching capacity should be highlighted. The navigation should be grouped by area and should close up correctly when options are hidden for a lower access level.</w:t>
+      </w:r>
+    </w:p>
+    <w:p>
+      <w:pPr>
+        <w:spacing w:before="200" w:after="40"/>
+      </w:pPr>
+      <w:r>
+        <w:rPr>
+          <w:b/>
+          <w:bCs/>
+        </w:rPr>
+        <w:t>Objective 43: The system must warn a user before unsaved data entry is discarded, and must confirm before any action that destroys data, with the safe option selected by default.</w:t>
+      </w:r>
+    </w:p>
+    <w:p>
+      <w:pPr>
+        <w:spacing w:after="80" w:line="276" w:lineRule="auto"/>
+      </w:pPr>
+      <w:r>
+        <w:rPr>
+          <w:b/>
+          <w:bCs/>
+        </w:rPr>
+        <w:t xml:space="preserve">Success Criteria: </w:t>
+      </w:r>
+      <w:r>
+        <w:t>Selecting a different record while data has been typed into the entry fields should prompt before the typed data is replaced, and should not prompt when nothing has been typed. Every confirmation which deletes, cancels or refunds should open with the negative option selected so that pressing Enter does not destroy anything. No record screen should report a successful save when the underlying database operation has failed.</w:t>
+      </w:r>
+    </w:p>
+    <w:p>
+      <w:pPr>
+        <w:spacing w:before="200" w:after="40"/>
+      </w:pPr>
+      <w:r>
+        <w:rPr>
+          <w:b/>
+          <w:bCs/>
+        </w:rPr>
+        <w:t>Objective 44: The system must prevent duplicate records being created where a duplicate would be genuinely ambiguous, and must prevent deletion of any record that other records depend upon.</w:t>
       </w:r>
     </w:p>
     <w:p>
@@ -10513,1117 +11639,7 @@
         <w:t xml:space="preserve">Success Criteria: </w:t>
       </w:r>
       <w:r>
-        <w:t>Cancelling a booking should update the database immediately so the seats become available for other customers. A confirmation prompt should be displayed before any booking is deleted. The cancelled booking should no longer appear in the active bookings list.</w:t>
-      </w:r>
-    </w:p>
-    <w:p>
-      <w:pPr>
-        <w:spacing w:before="200" w:after="40"/>
-      </w:pPr>
-      <w:r>
-        <w:rPr>
-          <w:b/>
-          <w:bCs/>
-        </w:rPr>
-        <w:t>Objective 13</w:t>
-      </w:r>
-      <w:r>
-        <w:rPr>
-          <w:b/>
-          <w:bCs/>
-        </w:rPr>
-        <w:t xml:space="preserve"> (P)</w:t>
-      </w:r>
-      <w:r>
-        <w:rPr>
-          <w:b/>
-          <w:bCs/>
-        </w:rPr>
-        <w:t>: The system must validate data entered by users to prevent invalid or incomplete records being saved to the database.</w:t>
-      </w:r>
-    </w:p>
-    <w:p>
-      <w:pPr>
-        <w:spacing w:after="80" w:line="276" w:lineRule="auto"/>
-      </w:pPr>
-      <w:r>
-        <w:rPr>
-          <w:b/>
-          <w:bCs/>
-        </w:rPr>
-        <w:t xml:space="preserve">Success Criteria: </w:t>
-      </w:r>
-      <w:r>
-        <w:t>All required fields should be validated before a record is saved. Numeric fields should only accept numbers. Date fields should only accept valid dates. Text fields should have appropriate maximum lengths enforced. An informative error message should be displayed for each validation failure explaining what needs to be corrected.</w:t>
-      </w:r>
-    </w:p>
-    <w:p>
-      <w:pPr>
-        <w:spacing w:before="200" w:after="40"/>
-      </w:pPr>
-      <w:r>
-        <w:rPr>
-          <w:b/>
-          <w:bCs/>
-        </w:rPr>
-        <w:t>Objective 14: The system must have a consistent and professional user interface across all forms, using a uniform colour scheme, layout and naming convention throughout.</w:t>
-      </w:r>
-    </w:p>
-    <w:p>
-      <w:pPr>
-        <w:spacing w:after="80" w:line="276" w:lineRule="auto"/>
-      </w:pPr>
-      <w:r>
-        <w:rPr>
-          <w:b/>
-          <w:bCs/>
-        </w:rPr>
-        <w:t xml:space="preserve">Success Criteria: </w:t>
-      </w:r>
-      <w:r>
-        <w:t xml:space="preserve">All forms should use the same colour scheme, font and button placement. Navigation buttons should appear in consistent positions across all forms. The system should look professional and be immediately recognisable as a </w:t>
-      </w:r>
-      <w:proofErr w:type="spellStart"/>
-      <w:r>
-        <w:t>Filmtopia</w:t>
-      </w:r>
-      <w:proofErr w:type="spellEnd"/>
-      <w:r>
-        <w:t xml:space="preserve"> branded application.</w:t>
-      </w:r>
-    </w:p>
-    <w:p>
-      <w:pPr>
-        <w:spacing w:before="200" w:after="40"/>
-      </w:pPr>
-      <w:r>
-        <w:rPr>
-          <w:b/>
-          <w:bCs/>
-        </w:rPr>
-        <w:t>Objective 15: The system must be easy to navigate, with clearly labelled menus and buttons that allow staff and customers to find the function they need without requiring technical knowledge.</w:t>
-      </w:r>
-    </w:p>
-    <w:p>
-      <w:pPr>
-        <w:spacing w:after="80" w:line="276" w:lineRule="auto"/>
-      </w:pPr>
-      <w:r>
-        <w:rPr>
-          <w:b/>
-          <w:bCs/>
-        </w:rPr>
-        <w:t xml:space="preserve">Success Criteria: </w:t>
-      </w:r>
-      <w:r>
-        <w:t>A new member of staff should be able to complete a basic booking using the system without any training beyond a brief introduction. All buttons and menu options should use clear plain English labels. The system should never reach a state where the user cannot navigate back to the main menu.</w:t>
-      </w:r>
-    </w:p>
-    <w:p>
-      <w:pPr>
-        <w:spacing w:after="80" w:line="276" w:lineRule="auto"/>
-        <w:rPr>
-          <w:b/>
-          <w:bCs/>
-        </w:rPr>
-      </w:pPr>
-      <w:r>
-        <w:rPr>
-          <w:b/>
-          <w:bCs/>
-          <w:lang w:val="en-US"/>
-        </w:rPr>
-        <w:t>Objective</w:t>
-      </w:r>
-      <w:r>
-        <w:rPr>
-          <w:b/>
-          <w:bCs/>
-          <w:lang w:val="en-US"/>
-        </w:rPr>
-        <w:t xml:space="preserve"> 16</w:t>
-      </w:r>
-      <w:r>
-        <w:rPr>
-          <w:b/>
-          <w:bCs/>
-          <w:lang w:val="en-US"/>
-        </w:rPr>
-        <w:t xml:space="preserve"> (P)</w:t>
-      </w:r>
-      <w:r>
-        <w:rPr>
-          <w:b/>
-          <w:bCs/>
-          <w:lang w:val="en-US"/>
-        </w:rPr>
-        <w:t xml:space="preserve">: </w:t>
-      </w:r>
-      <w:r>
-        <w:rPr>
-          <w:b/>
-          <w:bCs/>
-        </w:rPr>
-        <w:t>The system must allow a manager to create a new screen by entering a total number of seats, with the system automatically generating the corresponding seat map and seat records for that screen.</w:t>
-      </w:r>
-    </w:p>
-    <w:p>
-      <w:pPr>
-        <w:spacing w:after="80" w:line="276" w:lineRule="auto"/>
-        <w:rPr>
-          <w:lang w:val="en-US"/>
-        </w:rPr>
-      </w:pPr>
-      <w:r>
-        <w:rPr>
-          <w:b/>
-          <w:bCs/>
-        </w:rPr>
-        <w:t>Success Criteria:</w:t>
-      </w:r>
-      <w:r>
-        <w:t xml:space="preserve"> Entering a seat count when creating a screen should generate the correct number of seat records in the database, arranged into rows and columns for a usable seat map. The generated seat map should display correctly when a screening for that screen is selected. Creating a screen with an invalid or missing seat count should be prevented through validation.</w:t>
-      </w:r>
-    </w:p>
-    <w:p>
-      <w:pPr>
-        <w:spacing w:after="80" w:line="276" w:lineRule="auto"/>
-        <w:rPr>
-          <w:b/>
-          <w:bCs/>
-        </w:rPr>
-      </w:pPr>
-      <w:r>
-        <w:rPr>
-          <w:b/>
-          <w:bCs/>
-          <w:lang w:val="en-US"/>
-        </w:rPr>
-        <w:t xml:space="preserve">Objective </w:t>
-      </w:r>
-      <w:r>
-        <w:rPr>
-          <w:b/>
-          <w:bCs/>
-          <w:lang w:val="en-US"/>
-        </w:rPr>
-        <w:t>17</w:t>
-      </w:r>
-      <w:r>
-        <w:rPr>
-          <w:b/>
-          <w:bCs/>
-          <w:lang w:val="en-US"/>
-        </w:rPr>
-        <w:t xml:space="preserve"> (P)</w:t>
-      </w:r>
-      <w:r>
-        <w:rPr>
-          <w:b/>
-          <w:bCs/>
-          <w:lang w:val="en-US"/>
-        </w:rPr>
-        <w:t xml:space="preserve">: </w:t>
-      </w:r>
-      <w:r>
-        <w:rPr>
-          <w:b/>
-          <w:bCs/>
-        </w:rPr>
-        <w:t>The system must maintain an audit log recording key actions carried out by staff and managers, including creating a booking, cancelling a booking and adding a new film or screening record.</w:t>
-      </w:r>
-    </w:p>
-    <w:p>
-      <w:pPr>
-        <w:spacing w:after="80" w:line="276" w:lineRule="auto"/>
-        <w:rPr>
-          <w:lang w:val="en-US"/>
-        </w:rPr>
-      </w:pPr>
-      <w:r>
-        <w:rPr>
-          <w:b/>
-          <w:bCs/>
-        </w:rPr>
-        <w:lastRenderedPageBreak/>
-        <w:t>Success Criteria:</w:t>
-      </w:r>
-      <w:r>
-        <w:t xml:space="preserve"> Every booking created, cancelled or amended should generate a log entry showing the username of the staff member responsible along with the date and time of the action. The audit log should be viewable by the manager but should not be editable or </w:t>
-      </w:r>
-      <w:proofErr w:type="spellStart"/>
-      <w:r>
-        <w:t>deletable</w:t>
-      </w:r>
-      <w:proofErr w:type="spellEnd"/>
-      <w:r>
-        <w:t xml:space="preserve"> by staff. The log should accurately reflect every relevant action carried out in the system during normal operation.</w:t>
-      </w:r>
-    </w:p>
-    <w:p>
-      <w:pPr>
-        <w:spacing w:after="80" w:line="276" w:lineRule="auto"/>
-        <w:jc w:val="both"/>
-        <w:rPr>
-          <w:b/>
-          <w:bCs/>
-        </w:rPr>
-      </w:pPr>
-      <w:r>
-        <w:rPr>
-          <w:b/>
-          <w:bCs/>
-          <w:lang w:val="en-US"/>
-        </w:rPr>
-        <w:t xml:space="preserve">Objective </w:t>
-      </w:r>
-      <w:r>
-        <w:rPr>
-          <w:b/>
-          <w:bCs/>
-        </w:rPr>
-        <w:t xml:space="preserve">18: </w:t>
-      </w:r>
-      <w:r>
-        <w:rPr>
-          <w:b/>
-          <w:bCs/>
-        </w:rPr>
-        <w:t>The system must allow staff to process a refund for a cancelled booking, recording the refunded amount against the original booking record.</w:t>
-      </w:r>
-    </w:p>
-    <w:p>
-      <w:pPr>
-        <w:spacing w:after="80" w:line="276" w:lineRule="auto"/>
-        <w:jc w:val="both"/>
-      </w:pPr>
-      <w:r>
-        <w:rPr>
-          <w:b/>
-          <w:bCs/>
-        </w:rPr>
-        <w:t>Success Criteria:</w:t>
-      </w:r>
-      <w:r>
-        <w:t xml:space="preserve"> A refund should only be processable for a booking that has already been cancelled. The refunded amount should be calculated automatically from the ticket price and any food and drink items originally recorded against the booking. The refund should be saved to the database with a timestamp and should be visible when the booking is looked up afterwards.</w:t>
-      </w:r>
-    </w:p>
-    <w:p>
-      <w:pPr>
-        <w:spacing w:after="80" w:line="276" w:lineRule="auto"/>
-        <w:jc w:val="both"/>
-        <w:rPr>
-          <w:b/>
-          <w:bCs/>
-        </w:rPr>
-      </w:pPr>
-    </w:p>
-    <w:p>
-      <w:pPr>
-        <w:spacing w:after="80" w:line="276" w:lineRule="auto"/>
-        <w:jc w:val="both"/>
-        <w:rPr>
-          <w:b/>
-          <w:bCs/>
-          <w:color w:val="EE0000"/>
-        </w:rPr>
-      </w:pPr>
-      <w:r>
-        <w:rPr>
-          <w:b/>
-          <w:bCs/>
-          <w:color w:val="EE0000"/>
-        </w:rPr>
-        <w:t xml:space="preserve">The eighteen objectives above were written before any of </w:t>
-      </w:r>
-      <w:proofErr w:type="spellStart"/>
-      <w:r>
-        <w:rPr>
-          <w:b/>
-          <w:bCs/>
-          <w:color w:val="EE0000"/>
-        </w:rPr>
-        <w:t>Filmtopia</w:t>
-      </w:r>
-      <w:proofErr w:type="spellEnd"/>
-      <w:r>
-        <w:rPr>
-          <w:b/>
-          <w:bCs/>
-          <w:color w:val="EE0000"/>
-        </w:rPr>
-        <w:t xml:space="preserve"> existed, and building the prototype showed that they did not cover the whole problem. Some of the gaps came out of the feedback sessions, some came out of using the prototype myself for a few weeks, and a few came out of faults that only appeared once there was real data in the database. Rather than quietly widen the original objectives so that whatever I happened to build would satisfy them, which would make the evaluation worthless, I have written the additional requirements down as a second set of objectives with their own success criteria. Everything from Objective 19 onwards was identified after the prototype was finished, and none of it was part of the prototype build.</w:t>
-      </w:r>
-    </w:p>
-    <w:p>
-      <w:pPr>
-        <w:spacing w:after="80" w:line="276" w:lineRule="auto"/>
-        <w:jc w:val="both"/>
-        <w:rPr>
-          <w:b/>
-          <w:bCs/>
-          <w:color w:val="EE0000"/>
-        </w:rPr>
-      </w:pPr>
-    </w:p>
-    <w:p>
-      <w:pPr>
-        <w:spacing w:before="200" w:after="40"/>
-      </w:pPr>
-      <w:r>
-        <w:rPr>
-          <w:b/>
-          <w:bCs/>
-        </w:rPr>
-        <w:t xml:space="preserve">Objective 19: The system must support more than one </w:t>
-      </w:r>
-      <w:r>
-        <w:rPr>
-          <w:b/>
-          <w:bCs/>
-        </w:rPr>
-        <w:t>type</w:t>
-      </w:r>
-      <w:r>
-        <w:rPr>
-          <w:b/>
-          <w:bCs/>
-        </w:rPr>
-        <w:t xml:space="preserve"> of seat within a screen, with each </w:t>
-      </w:r>
-      <w:r>
-        <w:rPr>
-          <w:b/>
-          <w:bCs/>
-        </w:rPr>
-        <w:t>type</w:t>
-      </w:r>
-      <w:r>
-        <w:rPr>
-          <w:b/>
-          <w:bCs/>
-        </w:rPr>
-        <w:t xml:space="preserve"> carrying its own price multiplier so that a premium seat costs more than a standard seat for the same screening.</w:t>
-      </w:r>
-    </w:p>
-    <w:p>
-      <w:pPr>
-        <w:spacing w:after="80" w:line="276" w:lineRule="auto"/>
-        <w:jc w:val="both"/>
-        <w:rPr>
-          <w:b/>
-          <w:bCs/>
-          <w:color w:val="EE0000"/>
-        </w:rPr>
-      </w:pPr>
-      <w:r>
-        <w:rPr>
-          <w:b/>
-          <w:bCs/>
-        </w:rPr>
-        <w:t xml:space="preserve">Success Criteria: </w:t>
-      </w:r>
-      <w:r>
-        <w:t xml:space="preserve">Seat </w:t>
-      </w:r>
-      <w:r>
-        <w:t>types</w:t>
-      </w:r>
-      <w:r>
-        <w:t xml:space="preserve"> should be stored in the database with a multiplier against each one rather than being fixed in the program code, so that the price of a </w:t>
-      </w:r>
-      <w:r>
-        <w:t>type</w:t>
-      </w:r>
-      <w:r>
-        <w:t xml:space="preserve"> can be changed without the system being rebuilt. The price of an individual seat should be calculated as the screening ticket price multiplied by the multiplier for that seat's </w:t>
-      </w:r>
-      <w:r>
-        <w:t>type</w:t>
-      </w:r>
-      <w:r>
-        <w:t xml:space="preserve">. Booking three seats of mixed </w:t>
-      </w:r>
-      <w:r>
-        <w:t>types</w:t>
-      </w:r>
-      <w:r>
-        <w:t xml:space="preserve"> should produce a total that matches the sum of the individual seat prices to the penny, and the same total should appear on the booking screen, in the stored booking record and on the sales report.</w:t>
-      </w:r>
-    </w:p>
-    <w:p>
-      <w:pPr>
-        <w:spacing w:before="200" w:after="40"/>
-      </w:pPr>
-      <w:r>
-        <w:rPr>
-          <w:b/>
-          <w:bCs/>
-        </w:rPr>
-        <w:t xml:space="preserve">Objective 20: The system must allow a manager to decide which individual seats in a screen are premium, standard or accessible, rather than the layout being fixed by the program.</w:t>
-      </w:r>
-    </w:p>
-    <w:p>
-      <w:pPr>
-        <w:spacing w:after="80" w:line="276" w:lineRule="auto"/>
-      </w:pPr>
-      <w:r>
-        <w:rPr>
-          <w:b/>
-          <w:bCs/>
-        </w:rPr>
-        <w:t xml:space="preserve">Success Criteria: </w:t>
-      </w:r>
-      <w:r>
-        <w:t xml:space="preserve">A manager should be able to open a plan of any screen and change the class of a single seat or a whole row. The plan should show at least three classes distinguishably, and should remain readable when printed in black and white. Saving a plan for a screen that already has bookings against it should change only the class of each seat and must not delete and recreate the seat records, since existing bookings point at them. The system should warn before changing the class of a seat in a screen that is already selling.</w:t>
-      </w:r>
-    </w:p>
-    <w:p>
-      <w:pPr>
-        <w:spacing w:before="200" w:after="40"/>
-      </w:pPr>
-      <w:r>
-        <w:rPr>
-          <w:b/>
-          <w:bCs/>
-        </w:rPr>
-        <w:t xml:space="preserve">Objective 21: The system must record the price actually charged for every ticket and every food item at the moment of sale, so that a later change to a price cannot alter the value of a sale that has already been taken.</w:t>
-      </w:r>
-    </w:p>
-    <w:p>
-      <w:pPr>
-        <w:spacing w:after="80" w:line="276" w:lineRule="auto"/>
-      </w:pPr>
-      <w:r>
-        <w:rPr>
-          <w:b/>
-          <w:bCs/>
-        </w:rPr>
-        <w:t xml:space="preserve">Success Criteria: </w:t>
-      </w:r>
-      <w:r>
-        <w:t xml:space="preserve">Each booked seat and each food line should store the amount it was charged. Increasing the price of a screening or a menu item afterwards must leave the total of every existing booking completely unchanged, and the sales report must return the same figure for a past date range before and after that price change. Recalculating a booking total should never alter the ticket element of a sale that has already been completed.</w:t>
-      </w:r>
-    </w:p>
-    <w:p>
-      <w:pPr>
-        <w:spacing w:before="200" w:after="40"/>
-      </w:pPr>
-      <w:r>
-        <w:rPr>
-          <w:b/>
-          <w:bCs/>
-        </w:rPr>
-        <w:t xml:space="preserve">Objective 22: The system must allow a member of staff to refund part of a booking, handing back individual seats or a quantity of a food item without cancelling the entire sale.</w:t>
-      </w:r>
-    </w:p>
-    <w:p>
-      <w:pPr>
-        <w:spacing w:after="80" w:line="276" w:lineRule="auto"/>
-      </w:pPr>
-      <w:r>
-        <w:rPr>
-          <w:b/>
-          <w:bCs/>
-        </w:rPr>
-        <w:t xml:space="preserve">Success Criteria: </w:t>
-      </w:r>
-      <w:r>
-        <w:t xml:space="preserve">It should be possible to refund one seat out of several and leave the rest of the booking active, and to refund one item out of a quantity of the same item. Every refund should be recorded as its own record with the date, the total handed back, the reason and the member of staff who authorised it, broken down into one line per thing refunded. A refunded seat should return to sale immediately. Refunding everything left on a booking should cancel that booking automatically. Attempting to refund the same seat twice should be refused.</w:t>
-      </w:r>
-    </w:p>
-    <w:p>
-      <w:pPr>
-        <w:spacing w:before="200" w:after="40"/>
-      </w:pPr>
-      <w:r>
-        <w:rPr>
-          <w:b/>
-          <w:bCs/>
-        </w:rPr>
-        <w:t xml:space="preserve">Objective 23: The system must allow a sale to be taken for food and drink alone, with no screening and no seats attached to it.</w:t>
-      </w:r>
-    </w:p>
-    <w:p>
-      <w:pPr>
-        <w:spacing w:after="80" w:line="276" w:lineRule="auto"/>
-      </w:pPr>
-      <w:r>
-        <w:rPr>
-          <w:b/>
-          <w:bCs/>
-        </w:rPr>
-        <w:t xml:space="preserve">Success Criteria: </w:t>
-      </w:r>
-      <w:r>
-        <w:t xml:space="preserve">A counter sale should complete and save without a screening being selected. The sale should then appear correctly in the booking search, in the sales report and on the main menu takings figure, and must not be silently dropped by any query that reaches a film through the screening. The sales report should return the same concessions total whether it is measured on the booking date or on the screening date.</w:t>
-      </w:r>
-    </w:p>
-    <w:p>
-      <w:pPr>
-        <w:spacing w:before="200" w:after="40"/>
-      </w:pPr>
-      <w:r>
-        <w:rPr>
-          <w:b/>
-          <w:bCs/>
-        </w:rPr>
-        <w:t xml:space="preserve">Objective 24: The system must account for advertising and turnaround time when deciding how long a screening occupies a screen, rather than using the running time of the film alone.</w:t>
-      </w:r>
-    </w:p>
-    <w:p>
-      <w:pPr>
-        <w:spacing w:after="80" w:line="276" w:lineRule="auto"/>
-      </w:pPr>
-      <w:r>
-        <w:rPr>
-          <w:b/>
-          <w:bCs/>
-        </w:rPr>
-        <w:t xml:space="preserve">Success Criteria: </w:t>
-      </w:r>
-      <w:r>
-        <w:t xml:space="preserve">The time a screening occupies a screen should be the advertising allowance plus the film duration plus the turnaround allowance. Two screenings which would overlap once those allowances are included should be refused, and the message should state which existing screening is in the way. The finishing time displayed to the user should match the time the screen actually becomes free. Both allowances should be held as settings rather than being fixed in the code, and should be able to be overridden for an individual screening.</w:t>
-      </w:r>
-    </w:p>
-    <w:p>
-      <w:pPr>
-        <w:spacing w:before="200" w:after="40"/>
-      </w:pPr>
-      <w:r>
-        <w:rPr>
-          <w:b/>
-          <w:bCs/>
-        </w:rPr>
-        <w:t xml:space="preserve">Objective 25: The system must be able to suggest the next available start time for a film on a chosen screen, rather than only rejecting a time after the user has already entered one.</w:t>
-      </w:r>
-    </w:p>
-    <w:p>
-      <w:pPr>
-        <w:spacing w:after="80" w:line="276" w:lineRule="auto"/>
-      </w:pPr>
-      <w:r>
-        <w:rPr>
-          <w:b/>
-          <w:bCs/>
-        </w:rPr>
-        <w:t xml:space="preserve">Success Criteria: </w:t>
-      </w:r>
-      <w:r>
-        <w:t xml:space="preserve">Requesting a suggested time should return the earliest start on that day at which the film would fit without overlapping anything already scheduled, taking the advertising and turnaround allowances into account. A gap that is exactly large enough should be accepted and a gap one minute too small should be rejected. Where no gap exists before the last permitted start time, the system should say so rather than offering a time that will not work. A screen that is out of service should not be offered at all.</w:t>
-      </w:r>
-    </w:p>
-    <w:p>
-      <w:pPr>
-        <w:spacing w:before="200" w:after="40"/>
-      </w:pPr>
-      <w:r>
-        <w:rPr>
-          <w:b/>
-          <w:bCs/>
-        </w:rPr>
-        <w:t xml:space="preserve">Objective 26: The system must round the start times it generates up to a sensible interval so that scheduled screenings begin on times a cinema would advertise.</w:t>
-      </w:r>
-    </w:p>
-    <w:p>
-      <w:pPr>
-        <w:spacing w:after="80" w:line="276" w:lineRule="auto"/>
-      </w:pPr>
-      <w:r>
-        <w:rPr>
-          <w:b/>
-          <w:bCs/>
-        </w:rPr>
-        <w:t xml:space="preserve">Success Criteria: </w:t>
-      </w:r>
-      <w:r>
-        <w:t xml:space="preserve">Generated start times should be rounded up to an interval held as a setting, and only intervals which divide evenly into an hour should be accepted. The rounding must be applied before the system checks whether the screening fits, so that a gap which is no longer large enough once the time has been rounded is correctly rejected. A time entered by hand should be left exactly as it was typed.</w:t>
-      </w:r>
-    </w:p>
-    <w:p>
-      <w:pPr>
-        <w:spacing w:before="200" w:after="40"/>
-      </w:pPr>
-      <w:r>
-        <w:rPr>
-          <w:b/>
-          <w:bCs/>
-        </w:rPr>
-        <w:t xml:space="preserve">Objective 27: The system must allow a film to be scheduled across a range of dates, or repeatedly across a single day, without the user entering each screening individually.</w:t>
-      </w:r>
-    </w:p>
-    <w:p>
-      <w:pPr>
-        <w:spacing w:after="80" w:line="276" w:lineRule="auto"/>
-      </w:pPr>
-      <w:r>
-        <w:rPr>
-          <w:b/>
-          <w:bCs/>
-        </w:rPr>
-        <w:t xml:space="preserve">Success Criteria: </w:t>
-      </w:r>
-      <w:r>
-        <w:t xml:space="preserve">Scheduling a run should create one screening per day across the chosen range, skipping any day where the screen is already occupied and reporting which days were skipped rather than stopping. Filling a day should create as many screenings as genuinely fit around what is already scheduled. In both cases the proposed times should be displayed for confirmation before anything is written, and the whole run should be saved inside a single transaction so that a partially created run is impossible.</w:t>
-      </w:r>
-    </w:p>
-    <w:p>
-      <w:pPr>
-        <w:spacing w:before="200" w:after="40"/>
-      </w:pPr>
-      <w:r>
-        <w:rPr>
-          <w:b/>
-          <w:bCs/>
-        </w:rPr>
-        <w:t xml:space="preserve">Objective 28: The system must allow a screening that has already sold tickets to be cancelled, keeping the record of the screening and the sales rather than deleting them.</w:t>
-      </w:r>
-    </w:p>
-    <w:p>
-      <w:pPr>
-        <w:spacing w:after="80" w:line="276" w:lineRule="auto"/>
-      </w:pPr>
-      <w:r>
-        <w:rPr>
-          <w:b/>
-          <w:bCs/>
-        </w:rPr>
-        <w:t xml:space="preserve">Success Criteria: </w:t>
-      </w:r>
-      <w:r>
-        <w:t xml:space="preserve">Cancelling a screening should require a reason and should state how many bookings and seats will be affected before it proceeds. The screening record should be kept and marked as cancelled, the bookings against it should be cancelled, and the seats should return to sale. A cancelled screening should no longer appear on the kiosk, the booking screen or the main menu, but should remain findable on the screenings list, and the time it occupied should become available to schedule again.</w:t>
-      </w:r>
-    </w:p>
-    <w:p>
-      <w:pPr>
-        <w:spacing w:before="200" w:after="40"/>
-      </w:pPr>
-      <w:r>
-        <w:rPr>
-          <w:b/>
-          <w:bCs/>
-        </w:rPr>
-        <w:t xml:space="preserve">Objective 29: The system must allow a screen to be taken out of service and a food or drink item to be withdrawn from sale, in both cases keeping the record and its sales history rather than deleting it.</w:t>
-      </w:r>
-    </w:p>
-    <w:p>
-      <w:pPr>
-        <w:spacing w:after="80" w:line="276" w:lineRule="auto"/>
-      </w:pPr>
-      <w:r>
-        <w:rPr>
-          <w:b/>
-          <w:bCs/>
-        </w:rPr>
-        <w:t xml:space="preserve">Success Criteria: </w:t>
-      </w:r>
-      <w:r>
-        <w:t xml:space="preserve">Marking a screen out of service should require a reason and should be refused while tickets are held for future screenings in it. A screen that is out of service should be refused when scheduling a new screening. A withdrawn menu item should no longer be offered on the till, the booking screen or the kiosk, but bookings that already include it should continue to display and report correctly. In both cases nothing that has previously been sold should disappear from the sales report.</w:t>
-      </w:r>
-    </w:p>
-    <w:p>
-      <w:pPr>
-        <w:spacing w:before="200" w:after="40"/>
-      </w:pPr>
-      <w:r>
-        <w:rPr>
-          <w:b/>
-          <w:bCs/>
-        </w:rPr>
-        <w:t xml:space="preserve">Objective 30: The system must allow the manager to break sales down by film, by screening, by screen, by day, by food item and by member of staff, in addition to the overall totals.</w:t>
-      </w:r>
-    </w:p>
-    <w:p>
-      <w:pPr>
-        <w:spacing w:after="80" w:line="276" w:lineRule="auto"/>
-      </w:pPr>
-      <w:r>
-        <w:rPr>
-          <w:b/>
-          <w:bCs/>
-        </w:rPr>
-        <w:t xml:space="preserve">Success Criteria: </w:t>
-      </w:r>
-      <w:r>
-        <w:t xml:space="preserve">Each breakdown should be selectable from the sales report screen and should return within five seconds. The totals of every breakdown should agree with each other and with the takings figure shown on the main menu for the same period. A day with no sales should still appear in the daily breakdown with a total of zero rather than being omitted.</w:t>
-      </w:r>
-    </w:p>
-    <w:p>
-      <w:pPr>
-        <w:spacing w:before="200" w:after="40"/>
-      </w:pPr>
-      <w:r>
-        <w:rPr>
-          <w:b/>
-          <w:bCs/>
-        </w:rPr>
-        <w:t xml:space="preserve">Objective 31: The system must allow a sales report date range to be measured either by the date a booking was taken or by the date the screening took place, since those produce different figures whenever a customer books in advance.</w:t>
-      </w:r>
-    </w:p>
-    <w:p>
-      <w:pPr>
-        <w:spacing w:after="80" w:line="276" w:lineRule="auto"/>
-      </w:pPr>
-      <w:r>
-        <w:rPr>
-          <w:b/>
-          <w:bCs/>
-        </w:rPr>
-        <w:t xml:space="preserve">Success Criteria: </w:t>
-      </w:r>
-      <w:r>
-        <w:t xml:space="preserve">The report should offer both bases and switching between them should change the figures where advance bookings exist within the range. The occupancy figure should always be measured against the screenings that took place in the range regardless of the basis selected. A date range should include sales made at any time on the final day of the range.</w:t>
-      </w:r>
-    </w:p>
-    <w:p>
-      <w:pPr>
-        <w:spacing w:before="200" w:after="40"/>
-      </w:pPr>
-      <w:r>
-        <w:rPr>
-          <w:b/>
-          <w:bCs/>
-        </w:rPr>
-        <w:t xml:space="preserve">Objective 32: The system must allow the contents of any list or report to be exported to a file that can be opened in a spreadsheet.</w:t>
-      </w:r>
-    </w:p>
-    <w:p>
-      <w:pPr>
-        <w:spacing w:after="80" w:line="276" w:lineRule="auto"/>
-      </w:pPr>
-      <w:r>
-        <w:rPr>
-          <w:b/>
-          <w:bCs/>
-        </w:rPr>
-        <w:t xml:space="preserve">Success Criteria: </w:t>
-      </w:r>
-      <w:r>
-        <w:t xml:space="preserve">Export should be available from the films, customers, screenings, audit log, door list and sales report screens. The exported file should take its column headings from the grid so that a column added later is included automatically. Values containing commas or quotation marks should be written so that the file still opens correctly. Monetary values in the sales report export should be written as numbers a spreadsheet can total rather than as text.</w:t>
-      </w:r>
-    </w:p>
-    <w:p>
-      <w:pPr>
-        <w:spacing w:before="200" w:after="40"/>
-      </w:pPr>
-      <w:r>
-        <w:rPr>
-          <w:b/>
-          <w:bCs/>
-        </w:rPr>
-        <w:t xml:space="preserve">Objective 33: The system must allow film records to be imported in bulk from an external data file, so that the catalogue does not have to be typed in by hand.</w:t>
-      </w:r>
-    </w:p>
-    <w:p>
-      <w:pPr>
-        <w:spacing w:after="80" w:line="276" w:lineRule="auto"/>
-      </w:pPr>
-      <w:r>
-        <w:rPr>
-          <w:b/>
-          <w:bCs/>
-        </w:rPr>
-        <w:t xml:space="preserve">Success Criteria: </w:t>
-      </w:r>
-      <w:r>
-        <w:t xml:space="preserve">The user should be able to search a data file by part of a title and a starting year, and should be shown the matching films with a tick box against each so that only the chosen records are imported. A film already held on the system, matched on both title and year, should be identified and prevented from being imported a second time. Importing should record how many records were added and how many were skipped, and a damaged line in the file should be skipped rather than causing the import to fail.</w:t>
-      </w:r>
-    </w:p>
-    <w:p>
-      <w:pPr>
-        <w:spacing w:before="200" w:after="40"/>
-      </w:pPr>
-      <w:r>
-        <w:rPr>
-          <w:b/>
-          <w:bCs/>
-        </w:rPr>
-        <w:t xml:space="preserve">Objective 34: The system must allow a poster image to be stored against a film and displayed wherever that film is presented to a customer.</w:t>
-      </w:r>
-    </w:p>
-    <w:p>
-      <w:pPr>
-        <w:spacing w:after="80" w:line="276" w:lineRule="auto"/>
-      </w:pPr>
-      <w:r>
-        <w:rPr>
-          <w:b/>
-          <w:bCs/>
-        </w:rPr>
-        <w:t xml:space="preserve">Success Criteria: </w:t>
-      </w:r>
-      <w:r>
-        <w:t xml:space="preserve">A poster should be selectable from a file on the computer or retrievable automatically by searching an online film database on the title and year. The image file itself should be stored outside the database with only its file name held in the film record. The poster should appear on the film management screen and at every stage of the kiosk where that film is shown. A film with no poster should display correctly rather than showing an empty frame, and image resources should be released when a list is rebuilt so that repeated use does not exhaust them.</w:t>
-      </w:r>
-    </w:p>
-    <w:p>
-      <w:pPr>
-        <w:spacing w:before="200" w:after="40"/>
-      </w:pPr>
-      <w:r>
-        <w:rPr>
-          <w:b/>
-          <w:bCs/>
-        </w:rPr>
-        <w:t xml:space="preserve">Objective 35: The system must allow a user to change their own password from within the program without the database being opened directly.</w:t>
-      </w:r>
-    </w:p>
-    <w:p>
-      <w:pPr>
-        <w:spacing w:after="80" w:line="276" w:lineRule="auto"/>
-      </w:pPr>
-      <w:r>
-        <w:rPr>
-          <w:b/>
-          <w:bCs/>
-        </w:rPr>
-        <w:t xml:space="preserve">Success Criteria: </w:t>
-      </w:r>
-      <w:r>
-        <w:t xml:space="preserve">Changing a password should require the current password to be entered correctly, should require the new password to be typed twice identically, should enforce a minimum length held as a setting, and should refuse a new password identical to the old one. The new password should be stored using the same method as the existing login system. Both successful and failed attempts should be written to the audit log.</w:t>
-      </w:r>
-    </w:p>
-    <w:p>
-      <w:pPr>
-        <w:spacing w:before="200" w:after="40"/>
-      </w:pPr>
-      <w:r>
-        <w:rPr>
-          <w:b/>
-          <w:bCs/>
-        </w:rPr>
-        <w:t xml:space="preserve">Objective 36: The system must allow a manager to create a backup copy of the database from within the program, and must prevent a member of staff from doing so.</w:t>
-      </w:r>
-    </w:p>
-    <w:p>
-      <w:pPr>
-        <w:spacing w:after="80" w:line="276" w:lineRule="auto"/>
-      </w:pPr>
-      <w:r>
-        <w:rPr>
-          <w:b/>
-          <w:bCs/>
-        </w:rPr>
-        <w:t xml:space="preserve">Success Criteria: </w:t>
-      </w:r>
-      <w:r>
-        <w:t xml:space="preserve">A manager should be able to choose a destination folder and create a backup, with the file named so that it includes the date and time and therefore cannot overwrite an earlier backup. The backup option should be disabled for a user below manager level, with an explanation shown rather than the option simply disappearing. Every backup should be recorded in the audit log.</w:t>
-      </w:r>
-    </w:p>
-    <w:p>
-      <w:pPr>
-        <w:spacing w:before="200" w:after="40"/>
-      </w:pPr>
-      <w:r>
-        <w:rPr>
-          <w:b/>
-          <w:bCs/>
-        </w:rPr>
-        <w:t xml:space="preserve">Objective 37: The system must record which member of staff took each sale, and must allow any user to review their own activity and their own sales without being able to see anybody else's.</w:t>
-      </w:r>
-    </w:p>
-    <w:p>
-      <w:pPr>
-        <w:spacing w:after="80" w:line="276" w:lineRule="auto"/>
-      </w:pPr>
-      <w:r>
-        <w:rPr>
-          <w:b/>
-          <w:bCs/>
-        </w:rPr>
-        <w:t xml:space="preserve">Success Criteria: </w:t>
-      </w:r>
-      <w:r>
-        <w:t xml:space="preserve">Every booking taken at the till should record the login of the member of staff who took it, while a sale completed at the kiosk should record no member of staff at all. A user of any access level should be able to view their own audit entries, their own sales and their own sign in history, filtered to their own account only with no facility to select another user. Monetary totals should be visible to a manager and withheld from a member of staff. Failed sign in attempts against that account should be reported to the user.</w:t>
-      </w:r>
-    </w:p>
-    <w:p>
-      <w:pPr>
-        <w:spacing w:before="200" w:after="40"/>
-      </w:pPr>
-      <w:r>
-        <w:rPr>
-          <w:b/>
-          <w:bCs/>
-        </w:rPr>
-        <w:t xml:space="preserve">Objective 38: The system must prevent a customer at the kiosk from leaving kiosk mode and reaching staff functions without re-entering the password of the account that started it.</w:t>
-      </w:r>
-    </w:p>
-    <w:p>
-      <w:pPr>
-        <w:spacing w:after="80" w:line="276" w:lineRule="auto"/>
-      </w:pPr>
-      <w:r>
-        <w:rPr>
-          <w:b/>
-          <w:bCs/>
-        </w:rPr>
-        <w:t xml:space="preserve">Success Criteria: </w:t>
-      </w:r>
-      <w:r>
-        <w:t xml:space="preserve">Exiting kiosk mode should require the password of the logged in account rather than a simple confirmation. The kiosk should return to its opening screen automatically after a period of inactivity held as a setting, discarding any part completed order. No staff or management function should be reachable from the kiosk at any point.</w:t>
-      </w:r>
-    </w:p>
-    <w:p>
-      <w:pPr>
-        <w:spacing w:before="200" w:after="40"/>
-      </w:pPr>
-      <w:r>
-        <w:rPr>
-          <w:b/>
-          <w:bCs/>
-        </w:rPr>
-        <w:t xml:space="preserve">Objective 39: The audit log must record the user responsible for every entry and grade each entry by severity, and must be searchable so that it remains usable as the number of entries grows.</w:t>
-      </w:r>
-    </w:p>
-    <w:p>
-      <w:pPr>
-        <w:spacing w:after="80" w:line="276" w:lineRule="auto"/>
-      </w:pPr>
-      <w:r>
-        <w:rPr>
-          <w:b/>
-          <w:bCs/>
-        </w:rPr>
-        <w:t xml:space="preserve">Success Criteria: </w:t>
-      </w:r>
-      <w:r>
-        <w:t xml:space="preserve">Every entry should record the user automatically rather than the user being supplied by the calling routine. Entries should be graded so that routine activity, data changes, refused actions and security events can be told apart. The log screen should filter by date range, area, severity, user and free text, colour entries by severity, state how many entries match, and remain responsive with several thousand entries held. Refused actions such as a rejected deletion or a failed sign in should be recorded, not only successful ones.</w:t>
-      </w:r>
-    </w:p>
-    <w:p>
-      <w:pPr>
-        <w:spacing w:before="200" w:after="40"/>
-      </w:pPr>
-      <w:r>
-        <w:rPr>
-          <w:b/>
-          <w:bCs/>
-        </w:rPr>
-        <w:t xml:space="preserve">Objective 40: The system must hold its configurable values in the database rather than in the program code, so that a manager can change them without the system being rebuilt.</w:t>
-      </w:r>
-    </w:p>
-    <w:p>
-      <w:pPr>
-        <w:spacing w:after="80" w:line="276" w:lineRule="auto"/>
-      </w:pPr>
-      <w:r>
-        <w:rPr>
-          <w:b/>
-          <w:bCs/>
-        </w:rPr>
-        <w:t xml:space="preserve">Success Criteria: </w:t>
-      </w:r>
-      <w:r>
-        <w:t xml:space="preserve">Values including the advertising and turnaround allowances, the opening and closing times, the rounding interval, the default ticket price, the maximum seats per sale, the kiosk timeouts, the permitted login attempts and the minimum password length should all be stored in the database and editable through a settings screen. Changing a value should take effect without the program being restarted. An invalid or missing value should fall back to a sensible default rather than causing a failure.</w:t>
-      </w:r>
-    </w:p>
-    <w:p>
-      <w:pPr>
-        <w:spacing w:before="200" w:after="40"/>
-      </w:pPr>
-      <w:r>
-        <w:rPr>
-          <w:b/>
-          <w:bCs/>
-        </w:rPr>
-        <w:t xml:space="preserve">Objective 41: The system must offer a light and a dark colour scheme, applied consistently across every form and remembered against the individual user account rather than the machine.</w:t>
-      </w:r>
-    </w:p>
-    <w:p>
-      <w:pPr>
-        <w:spacing w:after="80" w:line="276" w:lineRule="auto"/>
-      </w:pPr>
-      <w:r>
-        <w:rPr>
-          <w:b/>
-          <w:bCs/>
-        </w:rPr>
-        <w:t xml:space="preserve">Success Criteria: </w:t>
-      </w:r>
-      <w:r>
-        <w:t xml:space="preserve">Selecting a scheme should recolour every open form immediately. The chosen scheme should be stored against the user's login so that two members of staff sharing a machine each keep their own preference, and should be cleared on logout so the next user does not inherit it. Every form should take its colours from a single shared definition rather than holding its own. Changing scheme while a booking is in progress must not alter or lose the seats already selected.</w:t>
-      </w:r>
-    </w:p>
-    <w:p>
-      <w:pPr>
-        <w:spacing w:before="200" w:after="40"/>
-      </w:pPr>
-      <w:r>
-        <w:rPr>
-          <w:b/>
-          <w:bCs/>
-        </w:rPr>
-        <w:t xml:space="preserve">Objective 42: The main menu must present the manager and the member of staff with the information relevant to their role at the start of a shift, rather than presenting only a list of buttons.</w:t>
-      </w:r>
-    </w:p>
-    <w:p>
-      <w:pPr>
-        <w:spacing w:after="80" w:line="276" w:lineRule="auto"/>
-      </w:pPr>
-      <w:r>
-        <w:rPr>
-          <w:b/>
-          <w:bCs/>
-        </w:rPr>
-        <w:t xml:space="preserve">Success Criteria: </w:t>
-      </w:r>
-      <w:r>
-        <w:t xml:space="preserve">The menu should display live figures read from the database when it opens and should refresh them automatically. A manager should see takings and overall occupancy, while a member of staff should see seats sold, items sold and seats remaining, with no monetary figures displayed anywhere. Screenings approaching capacity should be highlighted. The navigation should be grouped by area and should close up correctly when options are hidden for a lower access level.</w:t>
-      </w:r>
-    </w:p>
-    <w:p>
-      <w:pPr>
-        <w:spacing w:before="200" w:after="40"/>
-      </w:pPr>
-      <w:r>
-        <w:rPr>
-          <w:b/>
-          <w:bCs/>
-        </w:rPr>
-        <w:t xml:space="preserve">Objective 43: The system must warn a user before unsaved data entry is discarded, and must confirm before any action that destroys data, with the safe option selected by default.</w:t>
-      </w:r>
-    </w:p>
-    <w:p>
-      <w:pPr>
-        <w:spacing w:after="80" w:line="276" w:lineRule="auto"/>
-      </w:pPr>
-      <w:r>
-        <w:rPr>
-          <w:b/>
-          <w:bCs/>
-        </w:rPr>
-        <w:t xml:space="preserve">Success Criteria: </w:t>
-      </w:r>
-      <w:r>
-        <w:t xml:space="preserve">Selecting a different record while data has been typed into the entry fields should prompt before the typed data is replaced, and should not prompt when nothing has been typed. Every confirmation which deletes, cancels or refunds should open with the negative option selected so that pressing Enter does not destroy anything. No record screen should report a successful save when the underlying database operation has failed.</w:t>
-      </w:r>
-    </w:p>
-    <w:p>
-      <w:pPr>
-        <w:spacing w:before="200" w:after="40"/>
-      </w:pPr>
-      <w:r>
-        <w:rPr>
-          <w:b/>
-          <w:bCs/>
-        </w:rPr>
-        <w:t xml:space="preserve">Objective 44: The system must prevent duplicate records being created where a duplicate would be genuinely ambiguous, and must prevent deletion of any record that other records depend upon.</w:t>
-      </w:r>
-    </w:p>
-    <w:p>
-      <w:pPr>
-        <w:spacing w:after="80" w:line="276" w:lineRule="auto"/>
-      </w:pPr>
-      <w:r>
-        <w:rPr>
-          <w:b/>
-          <w:bCs/>
-        </w:rPr>
-        <w:t xml:space="preserve">Success Criteria: </w:t>
-      </w:r>
-      <w:r>
-        <w:t xml:space="preserve">Two screens, two films of the same title and year, or two menu items of the same name should be refused. Two customers of the same name should be permitted but should prompt for confirmation, since two people genuinely can share a name. A film with screenings, a customer with bookings, a menu item on an existing order, a screen with screenings or booked seats and a screening with seats sold should all be refused deletion, and the message should state what must be dealt with first. In every case the record being edited should be excluded from its own duplicate check.</w:t>
+        <w:t>Two screens, two films of the same title and year, or two menu items of the same name should be refused. Two customers of the same name should be permitted but should prompt for confirmation, since two people genuinely can share a name. A film with screenings, a customer with bookings, a menu item on an existing order, a screen with screenings or booked seats and a screening with seats sold should all be refused deletion, and the message should state what must be dealt with first. In every case the record being edited should be excluded from its own duplicate check.</w:t>
       </w:r>
     </w:p>
     <w:sectPr>

</xml_diff>